<commit_message>
Add use case diagram and priority object in doc
</commit_message>
<xml_diff>
--- a/specification_breakdown.docx
+++ b/specification_breakdown.docx
@@ -685,7 +685,7 @@
       <w:pPr>
         <w:pStyle w:val="ListParagraph"/>
         <w:numPr>
-          <w:ilvl w:val="0"/>
+          <w:ilvl w:val="1"/>
           <w:numId w:val="5"/>
         </w:numPr>
         <w:spacing w:before="100" w:beforeAutospacing="1" w:after="100" w:afterAutospacing="1"/>
@@ -693,18 +693,54 @@
           <w:rFonts w:eastAsia="Times New Roman"/>
         </w:rPr>
       </w:pPr>
-      <w:r>
-        <w:rPr>
-          <w:rFonts w:eastAsia="Times New Roman"/>
-        </w:rPr>
-        <w:t xml:space="preserve">Quản </w:t>
-      </w:r>
-      <w:proofErr w:type="spellStart"/>
-      <w:r>
-        <w:rPr>
-          <w:rFonts w:eastAsia="Times New Roman"/>
-        </w:rPr>
-        <w:t>trị</w:t>
+      <w:proofErr w:type="spellStart"/>
+      <w:r>
+        <w:rPr>
+          <w:rFonts w:eastAsia="Times New Roman"/>
+        </w:rPr>
+        <w:t>Thời</w:t>
+      </w:r>
+      <w:proofErr w:type="spellEnd"/>
+      <w:r>
+        <w:rPr>
+          <w:rFonts w:eastAsia="Times New Roman"/>
+        </w:rPr>
+        <w:t xml:space="preserve"> </w:t>
+      </w:r>
+      <w:proofErr w:type="spellStart"/>
+      <w:r>
+        <w:rPr>
+          <w:rFonts w:eastAsia="Times New Roman"/>
+        </w:rPr>
+        <w:t>gian</w:t>
+      </w:r>
+      <w:proofErr w:type="spellEnd"/>
+      <w:r>
+        <w:rPr>
+          <w:rFonts w:eastAsia="Times New Roman"/>
+        </w:rPr>
+        <w:t xml:space="preserve"> </w:t>
+      </w:r>
+      <w:proofErr w:type="spellStart"/>
+      <w:r>
+        <w:rPr>
+          <w:rFonts w:eastAsia="Times New Roman"/>
+        </w:rPr>
+        <w:t>tiếp</w:t>
+      </w:r>
+      <w:proofErr w:type="spellEnd"/>
+      <w:r>
+        <w:rPr>
+          <w:rFonts w:eastAsia="Times New Roman"/>
+        </w:rPr>
+        <w:t xml:space="preserve"> </w:t>
+      </w:r>
+      <w:proofErr w:type="spellStart"/>
+      <w:r>
+        <w:rPr>
+          <w:rFonts w:eastAsia="Times New Roman"/>
+        </w:rPr>
+        <w:t>nhận</w:t>
       </w:r>
       <w:proofErr w:type="spellEnd"/>
     </w:p>
@@ -725,35 +761,76 @@
         <w:rPr>
           <w:rFonts w:eastAsia="Times New Roman"/>
         </w:rPr>
-        <w:t>Người</w:t>
-      </w:r>
-      <w:proofErr w:type="spellEnd"/>
-      <w:r>
-        <w:rPr>
-          <w:rFonts w:eastAsia="Times New Roman"/>
-        </w:rPr>
-        <w:t xml:space="preserve"> </w:t>
-      </w:r>
-      <w:proofErr w:type="spellStart"/>
-      <w:r>
-        <w:rPr>
-          <w:rFonts w:eastAsia="Times New Roman"/>
-        </w:rPr>
-        <w:t>xử</w:t>
-      </w:r>
-      <w:proofErr w:type="spellEnd"/>
-      <w:r>
-        <w:rPr>
-          <w:rFonts w:eastAsia="Times New Roman"/>
-        </w:rPr>
-        <w:t xml:space="preserve"> </w:t>
-      </w:r>
-      <w:proofErr w:type="spellStart"/>
-      <w:r>
-        <w:rPr>
-          <w:rFonts w:eastAsia="Times New Roman"/>
-        </w:rPr>
-        <w:t>lí</w:t>
+        <w:t>Thời</w:t>
+      </w:r>
+      <w:proofErr w:type="spellEnd"/>
+      <w:r>
+        <w:rPr>
+          <w:rFonts w:eastAsia="Times New Roman"/>
+        </w:rPr>
+        <w:t xml:space="preserve"> </w:t>
+      </w:r>
+      <w:proofErr w:type="spellStart"/>
+      <w:r>
+        <w:rPr>
+          <w:rFonts w:eastAsia="Times New Roman"/>
+        </w:rPr>
+        <w:t>gian</w:t>
+      </w:r>
+      <w:proofErr w:type="spellEnd"/>
+      <w:r>
+        <w:rPr>
+          <w:rFonts w:eastAsia="Times New Roman"/>
+        </w:rPr>
+        <w:t xml:space="preserve"> </w:t>
+      </w:r>
+      <w:proofErr w:type="spellStart"/>
+      <w:r>
+        <w:rPr>
+          <w:rFonts w:eastAsia="Times New Roman"/>
+        </w:rPr>
+        <w:t>hoàn</w:t>
+      </w:r>
+      <w:proofErr w:type="spellEnd"/>
+      <w:r>
+        <w:rPr>
+          <w:rFonts w:eastAsia="Times New Roman"/>
+        </w:rPr>
+        <w:t xml:space="preserve"> </w:t>
+      </w:r>
+      <w:proofErr w:type="spellStart"/>
+      <w:r>
+        <w:rPr>
+          <w:rFonts w:eastAsia="Times New Roman"/>
+        </w:rPr>
+        <w:t>thành</w:t>
+      </w:r>
+      <w:proofErr w:type="spellEnd"/>
+    </w:p>
+    <w:p>
+      <w:pPr>
+        <w:pStyle w:val="ListParagraph"/>
+        <w:numPr>
+          <w:ilvl w:val="0"/>
+          <w:numId w:val="5"/>
+        </w:numPr>
+        <w:spacing w:before="100" w:beforeAutospacing="1" w:after="100" w:afterAutospacing="1"/>
+        <w:rPr>
+          <w:rFonts w:eastAsia="Times New Roman"/>
+        </w:rPr>
+      </w:pPr>
+      <w:r>
+        <w:rPr>
+          <w:rFonts w:eastAsia="Times New Roman"/>
+        </w:rPr>
+        <w:t xml:space="preserve">Quản </w:t>
+      </w:r>
+      <w:proofErr w:type="spellStart"/>
+      <w:r>
+        <w:rPr>
+          <w:rFonts w:eastAsia="Times New Roman"/>
+        </w:rPr>
+        <w:t>trị</w:t>
       </w:r>
       <w:proofErr w:type="spellEnd"/>
     </w:p>
@@ -769,18 +846,40 @@
           <w:rFonts w:eastAsia="Times New Roman"/>
         </w:rPr>
       </w:pPr>
-      <w:r>
-        <w:rPr>
-          <w:rFonts w:eastAsia="Times New Roman"/>
-        </w:rPr>
-        <w:t xml:space="preserve">Nguyên </w:t>
-      </w:r>
-      <w:proofErr w:type="spellStart"/>
-      <w:r>
-        <w:rPr>
-          <w:rFonts w:eastAsia="Times New Roman"/>
-        </w:rPr>
-        <w:t>nhân</w:t>
+      <w:proofErr w:type="spellStart"/>
+      <w:r>
+        <w:rPr>
+          <w:rFonts w:eastAsia="Times New Roman"/>
+        </w:rPr>
+        <w:t>Người</w:t>
+      </w:r>
+      <w:proofErr w:type="spellEnd"/>
+      <w:r>
+        <w:rPr>
+          <w:rFonts w:eastAsia="Times New Roman"/>
+        </w:rPr>
+        <w:t xml:space="preserve"> </w:t>
+      </w:r>
+      <w:proofErr w:type="spellStart"/>
+      <w:r>
+        <w:rPr>
+          <w:rFonts w:eastAsia="Times New Roman"/>
+        </w:rPr>
+        <w:t>xử</w:t>
+      </w:r>
+      <w:proofErr w:type="spellEnd"/>
+      <w:r>
+        <w:rPr>
+          <w:rFonts w:eastAsia="Times New Roman"/>
+        </w:rPr>
+        <w:t xml:space="preserve"> </w:t>
+      </w:r>
+      <w:proofErr w:type="spellStart"/>
+      <w:r>
+        <w:rPr>
+          <w:rFonts w:eastAsia="Times New Roman"/>
+        </w:rPr>
+        <w:t>lí</w:t>
       </w:r>
       <w:proofErr w:type="spellEnd"/>
     </w:p>
@@ -800,42 +899,14 @@
         <w:rPr>
           <w:rFonts w:eastAsia="Times New Roman"/>
         </w:rPr>
-        <w:t xml:space="preserve">Các </w:t>
-      </w:r>
-      <w:proofErr w:type="spellStart"/>
-      <w:r>
-        <w:rPr>
-          <w:rFonts w:eastAsia="Times New Roman"/>
-        </w:rPr>
-        <w:t>bước</w:t>
-      </w:r>
-      <w:proofErr w:type="spellEnd"/>
-      <w:r>
-        <w:rPr>
-          <w:rFonts w:eastAsia="Times New Roman"/>
-        </w:rPr>
-        <w:t xml:space="preserve"> </w:t>
-      </w:r>
-      <w:proofErr w:type="spellStart"/>
-      <w:r>
-        <w:rPr>
-          <w:rFonts w:eastAsia="Times New Roman"/>
-        </w:rPr>
-        <w:t>xử</w:t>
-      </w:r>
-      <w:proofErr w:type="spellEnd"/>
-      <w:r>
-        <w:rPr>
-          <w:rFonts w:eastAsia="Times New Roman"/>
-        </w:rPr>
-        <w:t xml:space="preserve"> </w:t>
-      </w:r>
-      <w:proofErr w:type="spellStart"/>
-      <w:r>
-        <w:rPr>
-          <w:rFonts w:eastAsia="Times New Roman"/>
-        </w:rPr>
-        <w:t>lí</w:t>
+        <w:t xml:space="preserve">Nguyên </w:t>
+      </w:r>
+      <w:proofErr w:type="spellStart"/>
+      <w:r>
+        <w:rPr>
+          <w:rFonts w:eastAsia="Times New Roman"/>
+        </w:rPr>
+        <w:t>nhân</w:t>
       </w:r>
       <w:proofErr w:type="spellEnd"/>
     </w:p>
@@ -851,6 +922,61 @@
           <w:rFonts w:eastAsia="Times New Roman"/>
         </w:rPr>
       </w:pPr>
+      <w:r>
+        <w:rPr>
+          <w:rFonts w:eastAsia="Times New Roman"/>
+        </w:rPr>
+        <w:t xml:space="preserve">Các </w:t>
+      </w:r>
+      <w:proofErr w:type="spellStart"/>
+      <w:r>
+        <w:rPr>
+          <w:rFonts w:eastAsia="Times New Roman"/>
+        </w:rPr>
+        <w:t>bước</w:t>
+      </w:r>
+      <w:proofErr w:type="spellEnd"/>
+      <w:r>
+        <w:rPr>
+          <w:rFonts w:eastAsia="Times New Roman"/>
+        </w:rPr>
+        <w:t xml:space="preserve"> </w:t>
+      </w:r>
+      <w:proofErr w:type="spellStart"/>
+      <w:r>
+        <w:rPr>
+          <w:rFonts w:eastAsia="Times New Roman"/>
+        </w:rPr>
+        <w:t>xử</w:t>
+      </w:r>
+      <w:proofErr w:type="spellEnd"/>
+      <w:r>
+        <w:rPr>
+          <w:rFonts w:eastAsia="Times New Roman"/>
+        </w:rPr>
+        <w:t xml:space="preserve"> </w:t>
+      </w:r>
+      <w:proofErr w:type="spellStart"/>
+      <w:r>
+        <w:rPr>
+          <w:rFonts w:eastAsia="Times New Roman"/>
+        </w:rPr>
+        <w:t>lí</w:t>
+      </w:r>
+      <w:proofErr w:type="spellEnd"/>
+    </w:p>
+    <w:p>
+      <w:pPr>
+        <w:pStyle w:val="ListParagraph"/>
+        <w:numPr>
+          <w:ilvl w:val="1"/>
+          <w:numId w:val="5"/>
+        </w:numPr>
+        <w:spacing w:before="100" w:beforeAutospacing="1" w:after="100" w:afterAutospacing="1"/>
+        <w:rPr>
+          <w:rFonts w:eastAsia="Times New Roman"/>
+        </w:rPr>
+      </w:pPr>
       <w:proofErr w:type="spellStart"/>
       <w:r>
         <w:rPr>
@@ -1543,21 +1669,7 @@
         <w:rPr>
           <w:rFonts w:eastAsia="Times New Roman"/>
         </w:rPr>
-        <w:t xml:space="preserve">Bình </w:t>
-      </w:r>
-      <w:proofErr w:type="spellStart"/>
-      <w:r>
-        <w:rPr>
-          <w:rFonts w:eastAsia="Times New Roman"/>
-        </w:rPr>
-        <w:t>luận</w:t>
-      </w:r>
-      <w:proofErr w:type="spellEnd"/>
-      <w:r>
-        <w:rPr>
-          <w:rFonts w:eastAsia="Times New Roman"/>
-        </w:rPr>
-        <w:t>:</w:t>
+        <w:t>Priority:</w:t>
       </w:r>
     </w:p>
     <w:p>
@@ -1618,15 +1730,37 @@
         <w:rPr>
           <w:rFonts w:eastAsia="Times New Roman"/>
         </w:rPr>
-        <w:t>Nội</w:t>
-      </w:r>
-      <w:proofErr w:type="spellEnd"/>
-      <w:r>
-        <w:rPr>
-          <w:rFonts w:eastAsia="Times New Roman"/>
-        </w:rPr>
-        <w:t xml:space="preserve"> dung</w:t>
-      </w:r>
+        <w:t>Mức</w:t>
+      </w:r>
+      <w:proofErr w:type="spellEnd"/>
+      <w:r>
+        <w:rPr>
+          <w:rFonts w:eastAsia="Times New Roman"/>
+        </w:rPr>
+        <w:t xml:space="preserve"> </w:t>
+      </w:r>
+      <w:proofErr w:type="spellStart"/>
+      <w:r>
+        <w:rPr>
+          <w:rFonts w:eastAsia="Times New Roman"/>
+        </w:rPr>
+        <w:t>ưu</w:t>
+      </w:r>
+      <w:proofErr w:type="spellEnd"/>
+      <w:r>
+        <w:rPr>
+          <w:rFonts w:eastAsia="Times New Roman"/>
+        </w:rPr>
+        <w:t xml:space="preserve"> </w:t>
+      </w:r>
+      <w:proofErr w:type="spellStart"/>
+      <w:r>
+        <w:rPr>
+          <w:rFonts w:eastAsia="Times New Roman"/>
+        </w:rPr>
+        <w:t>tiên</w:t>
+      </w:r>
+      <w:proofErr w:type="spellEnd"/>
     </w:p>
     <w:p>
       <w:pPr>
@@ -1640,67 +1774,147 @@
           <w:rFonts w:eastAsia="Times New Roman"/>
         </w:rPr>
       </w:pPr>
-      <w:r>
-        <w:rPr>
-          <w:rFonts w:eastAsia="Times New Roman"/>
-        </w:rPr>
-        <w:t xml:space="preserve">File </w:t>
-      </w:r>
-      <w:proofErr w:type="spellStart"/>
-      <w:r>
-        <w:rPr>
-          <w:rFonts w:eastAsia="Times New Roman"/>
-        </w:rPr>
-        <w:t>đính</w:t>
-      </w:r>
-      <w:proofErr w:type="spellEnd"/>
-      <w:r>
-        <w:rPr>
-          <w:rFonts w:eastAsia="Times New Roman"/>
-        </w:rPr>
-        <w:t xml:space="preserve"> </w:t>
-      </w:r>
-      <w:proofErr w:type="spellStart"/>
-      <w:r>
-        <w:rPr>
-          <w:rFonts w:eastAsia="Times New Roman"/>
-        </w:rPr>
-        <w:t>kèm</w:t>
-      </w:r>
-      <w:proofErr w:type="spellEnd"/>
-      <w:r>
-        <w:rPr>
-          <w:rFonts w:eastAsia="Times New Roman"/>
-        </w:rPr>
-        <w:t xml:space="preserve"> (</w:t>
-      </w:r>
-      <w:proofErr w:type="spellStart"/>
-      <w:r>
-        <w:rPr>
-          <w:rFonts w:eastAsia="Times New Roman"/>
-        </w:rPr>
-        <w:t>nếu</w:t>
-      </w:r>
-      <w:proofErr w:type="spellEnd"/>
-      <w:r>
-        <w:rPr>
-          <w:rFonts w:eastAsia="Times New Roman"/>
-        </w:rPr>
-        <w:t xml:space="preserve"> </w:t>
-      </w:r>
-      <w:proofErr w:type="spellStart"/>
-      <w:r>
-        <w:rPr>
-          <w:rFonts w:eastAsia="Times New Roman"/>
-        </w:rPr>
-        <w:t>có</w:t>
-      </w:r>
-      <w:proofErr w:type="spellEnd"/>
-      <w:r>
-        <w:rPr>
-          <w:rFonts w:eastAsia="Times New Roman"/>
-        </w:rPr>
-        <w:t>)</w:t>
+      <w:proofErr w:type="spellStart"/>
+      <w:r>
+        <w:rPr>
+          <w:rFonts w:eastAsia="Times New Roman"/>
+        </w:rPr>
+        <w:t>Thời</w:t>
+      </w:r>
+      <w:proofErr w:type="spellEnd"/>
+      <w:r>
+        <w:rPr>
+          <w:rFonts w:eastAsia="Times New Roman"/>
+        </w:rPr>
+        <w:t xml:space="preserve"> </w:t>
+      </w:r>
+      <w:proofErr w:type="spellStart"/>
+      <w:r>
+        <w:rPr>
+          <w:rFonts w:eastAsia="Times New Roman"/>
+        </w:rPr>
+        <w:t>gian</w:t>
+      </w:r>
+      <w:proofErr w:type="spellEnd"/>
+      <w:r>
+        <w:rPr>
+          <w:rFonts w:eastAsia="Times New Roman"/>
+        </w:rPr>
+        <w:t xml:space="preserve"> </w:t>
+      </w:r>
+      <w:proofErr w:type="spellStart"/>
+      <w:r>
+        <w:rPr>
+          <w:rFonts w:eastAsia="Times New Roman"/>
+        </w:rPr>
+        <w:t>thu</w:t>
+      </w:r>
+      <w:proofErr w:type="spellEnd"/>
+      <w:r>
+        <w:rPr>
+          <w:rFonts w:eastAsia="Times New Roman"/>
+        </w:rPr>
+        <w:t xml:space="preserve"> </w:t>
+      </w:r>
+      <w:proofErr w:type="spellStart"/>
+      <w:r>
+        <w:rPr>
+          <w:rFonts w:eastAsia="Times New Roman"/>
+        </w:rPr>
+        <w:t>hồi</w:t>
+      </w:r>
+      <w:proofErr w:type="spellEnd"/>
+    </w:p>
+    <w:p>
+      <w:pPr>
+        <w:pStyle w:val="ListParagraph"/>
+        <w:numPr>
+          <w:ilvl w:val="1"/>
+          <w:numId w:val="5"/>
+        </w:numPr>
+        <w:spacing w:before="100" w:beforeAutospacing="1" w:after="100" w:afterAutospacing="1"/>
+        <w:rPr>
+          <w:rFonts w:eastAsia="Times New Roman"/>
+        </w:rPr>
+      </w:pPr>
+      <w:proofErr w:type="spellStart"/>
+      <w:r>
+        <w:rPr>
+          <w:rFonts w:eastAsia="Times New Roman"/>
+        </w:rPr>
+        <w:t>Thời</w:t>
+      </w:r>
+      <w:proofErr w:type="spellEnd"/>
+      <w:r>
+        <w:rPr>
+          <w:rFonts w:eastAsia="Times New Roman"/>
+        </w:rPr>
+        <w:t xml:space="preserve"> </w:t>
+      </w:r>
+      <w:proofErr w:type="spellStart"/>
+      <w:r>
+        <w:rPr>
+          <w:rFonts w:eastAsia="Times New Roman"/>
+        </w:rPr>
+        <w:t>gian</w:t>
+      </w:r>
+      <w:proofErr w:type="spellEnd"/>
+      <w:r>
+        <w:rPr>
+          <w:rFonts w:eastAsia="Times New Roman"/>
+        </w:rPr>
+        <w:t xml:space="preserve"> </w:t>
+      </w:r>
+      <w:proofErr w:type="spellStart"/>
+      <w:r>
+        <w:rPr>
+          <w:rFonts w:eastAsia="Times New Roman"/>
+        </w:rPr>
+        <w:t>xử</w:t>
+      </w:r>
+      <w:proofErr w:type="spellEnd"/>
+      <w:r>
+        <w:rPr>
+          <w:rFonts w:eastAsia="Times New Roman"/>
+        </w:rPr>
+        <w:t xml:space="preserve"> </w:t>
+      </w:r>
+      <w:proofErr w:type="spellStart"/>
+      <w:r>
+        <w:rPr>
+          <w:rFonts w:eastAsia="Times New Roman"/>
+        </w:rPr>
+        <w:t>lí</w:t>
+      </w:r>
+      <w:proofErr w:type="spellEnd"/>
+    </w:p>
+    <w:p>
+      <w:pPr>
+        <w:spacing w:before="100" w:beforeAutospacing="1" w:after="100" w:afterAutospacing="1"/>
+        <w:rPr>
+          <w:rFonts w:eastAsia="Times New Roman"/>
+        </w:rPr>
+      </w:pPr>
+      <w:r>
+        <w:rPr>
+          <w:rFonts w:eastAsia="Times New Roman"/>
+        </w:rPr>
+        <w:lastRenderedPageBreak/>
+        <w:t xml:space="preserve">Bình </w:t>
+      </w:r>
+      <w:proofErr w:type="spellStart"/>
+      <w:r>
+        <w:rPr>
+          <w:rFonts w:eastAsia="Times New Roman"/>
+        </w:rPr>
+        <w:t>luận</w:t>
+      </w:r>
+      <w:proofErr w:type="spellEnd"/>
+      <w:r>
+        <w:rPr>
+          <w:rFonts w:eastAsia="Times New Roman"/>
+        </w:rPr>
+        <w:t>:</w:t>
       </w:r>
     </w:p>
     <w:p>
@@ -1720,21 +1934,21 @@
         <w:rPr>
           <w:rFonts w:eastAsia="Times New Roman"/>
         </w:rPr>
-        <w:t>Tự</w:t>
-      </w:r>
-      <w:proofErr w:type="spellEnd"/>
-      <w:r>
-        <w:rPr>
-          <w:rFonts w:eastAsia="Times New Roman"/>
-        </w:rPr>
-        <w:t xml:space="preserve"> </w:t>
-      </w:r>
-      <w:proofErr w:type="spellStart"/>
-      <w:r>
-        <w:rPr>
-          <w:rFonts w:eastAsia="Times New Roman"/>
-        </w:rPr>
-        <w:t>động</w:t>
+        <w:t>Thủ</w:t>
+      </w:r>
+      <w:proofErr w:type="spellEnd"/>
+      <w:r>
+        <w:rPr>
+          <w:rFonts w:eastAsia="Times New Roman"/>
+        </w:rPr>
+        <w:t xml:space="preserve"> </w:t>
+      </w:r>
+      <w:proofErr w:type="spellStart"/>
+      <w:r>
+        <w:rPr>
+          <w:rFonts w:eastAsia="Times New Roman"/>
+        </w:rPr>
+        <w:t>công</w:t>
       </w:r>
       <w:proofErr w:type="spellEnd"/>
       <w:r>
@@ -1761,9 +1975,15 @@
         <w:rPr>
           <w:rFonts w:eastAsia="Times New Roman"/>
         </w:rPr>
-        <w:t>CommentID</w:t>
-      </w:r>
-      <w:proofErr w:type="spellEnd"/>
+        <w:t>Nội</w:t>
+      </w:r>
+      <w:proofErr w:type="spellEnd"/>
+      <w:r>
+        <w:rPr>
+          <w:rFonts w:eastAsia="Times New Roman"/>
+        </w:rPr>
+        <w:t xml:space="preserve"> dung</w:t>
+      </w:r>
     </w:p>
     <w:p>
       <w:pPr>
@@ -1777,14 +1997,109 @@
           <w:rFonts w:eastAsia="Times New Roman"/>
         </w:rPr>
       </w:pPr>
-      <w:proofErr w:type="spellStart"/>
-      <w:r>
-        <w:rPr>
-          <w:rFonts w:eastAsia="Times New Roman"/>
-        </w:rPr>
-        <w:t>TicketID</w:t>
-      </w:r>
-      <w:proofErr w:type="spellEnd"/>
+      <w:r>
+        <w:rPr>
+          <w:rFonts w:eastAsia="Times New Roman"/>
+        </w:rPr>
+        <w:t xml:space="preserve">File </w:t>
+      </w:r>
+      <w:proofErr w:type="spellStart"/>
+      <w:r>
+        <w:rPr>
+          <w:rFonts w:eastAsia="Times New Roman"/>
+        </w:rPr>
+        <w:t>đính</w:t>
+      </w:r>
+      <w:proofErr w:type="spellEnd"/>
+      <w:r>
+        <w:rPr>
+          <w:rFonts w:eastAsia="Times New Roman"/>
+        </w:rPr>
+        <w:t xml:space="preserve"> </w:t>
+      </w:r>
+      <w:proofErr w:type="spellStart"/>
+      <w:r>
+        <w:rPr>
+          <w:rFonts w:eastAsia="Times New Roman"/>
+        </w:rPr>
+        <w:t>kèm</w:t>
+      </w:r>
+      <w:proofErr w:type="spellEnd"/>
+      <w:r>
+        <w:rPr>
+          <w:rFonts w:eastAsia="Times New Roman"/>
+        </w:rPr>
+        <w:t xml:space="preserve"> (</w:t>
+      </w:r>
+      <w:proofErr w:type="spellStart"/>
+      <w:r>
+        <w:rPr>
+          <w:rFonts w:eastAsia="Times New Roman"/>
+        </w:rPr>
+        <w:t>nếu</w:t>
+      </w:r>
+      <w:proofErr w:type="spellEnd"/>
+      <w:r>
+        <w:rPr>
+          <w:rFonts w:eastAsia="Times New Roman"/>
+        </w:rPr>
+        <w:t xml:space="preserve"> </w:t>
+      </w:r>
+      <w:proofErr w:type="spellStart"/>
+      <w:r>
+        <w:rPr>
+          <w:rFonts w:eastAsia="Times New Roman"/>
+        </w:rPr>
+        <w:t>có</w:t>
+      </w:r>
+      <w:proofErr w:type="spellEnd"/>
+      <w:r>
+        <w:rPr>
+          <w:rFonts w:eastAsia="Times New Roman"/>
+        </w:rPr>
+        <w:t>)</w:t>
+      </w:r>
+    </w:p>
+    <w:p>
+      <w:pPr>
+        <w:pStyle w:val="ListParagraph"/>
+        <w:numPr>
+          <w:ilvl w:val="0"/>
+          <w:numId w:val="5"/>
+        </w:numPr>
+        <w:spacing w:before="100" w:beforeAutospacing="1" w:after="100" w:afterAutospacing="1"/>
+        <w:rPr>
+          <w:rFonts w:eastAsia="Times New Roman"/>
+        </w:rPr>
+      </w:pPr>
+      <w:proofErr w:type="spellStart"/>
+      <w:r>
+        <w:rPr>
+          <w:rFonts w:eastAsia="Times New Roman"/>
+        </w:rPr>
+        <w:t>Tự</w:t>
+      </w:r>
+      <w:proofErr w:type="spellEnd"/>
+      <w:r>
+        <w:rPr>
+          <w:rFonts w:eastAsia="Times New Roman"/>
+        </w:rPr>
+        <w:t xml:space="preserve"> </w:t>
+      </w:r>
+      <w:proofErr w:type="spellStart"/>
+      <w:r>
+        <w:rPr>
+          <w:rFonts w:eastAsia="Times New Roman"/>
+        </w:rPr>
+        <w:t>động</w:t>
+      </w:r>
+      <w:proofErr w:type="spellEnd"/>
+      <w:r>
+        <w:rPr>
+          <w:rFonts w:eastAsia="Times New Roman"/>
+        </w:rPr>
+        <w:t>:</w:t>
+      </w:r>
     </w:p>
     <w:p>
       <w:pPr>
@@ -1803,22 +2118,7 @@
         <w:rPr>
           <w:rFonts w:eastAsia="Times New Roman"/>
         </w:rPr>
-        <w:lastRenderedPageBreak/>
-        <w:t>Người</w:t>
-      </w:r>
-      <w:proofErr w:type="spellEnd"/>
-      <w:r>
-        <w:rPr>
-          <w:rFonts w:eastAsia="Times New Roman"/>
-        </w:rPr>
-        <w:t xml:space="preserve"> </w:t>
-      </w:r>
-      <w:proofErr w:type="spellStart"/>
-      <w:r>
-        <w:rPr>
-          <w:rFonts w:eastAsia="Times New Roman"/>
-        </w:rPr>
-        <w:t>gửi</w:t>
+        <w:t>CommentID</w:t>
       </w:r>
       <w:proofErr w:type="spellEnd"/>
     </w:p>
@@ -1839,6 +2139,62 @@
         <w:rPr>
           <w:rFonts w:eastAsia="Times New Roman"/>
         </w:rPr>
+        <w:t>TicketID</w:t>
+      </w:r>
+      <w:proofErr w:type="spellEnd"/>
+    </w:p>
+    <w:p>
+      <w:pPr>
+        <w:pStyle w:val="ListParagraph"/>
+        <w:numPr>
+          <w:ilvl w:val="1"/>
+          <w:numId w:val="5"/>
+        </w:numPr>
+        <w:spacing w:before="100" w:beforeAutospacing="1" w:after="100" w:afterAutospacing="1"/>
+        <w:rPr>
+          <w:rFonts w:eastAsia="Times New Roman"/>
+        </w:rPr>
+      </w:pPr>
+      <w:proofErr w:type="spellStart"/>
+      <w:r>
+        <w:rPr>
+          <w:rFonts w:eastAsia="Times New Roman"/>
+        </w:rPr>
+        <w:t>Người</w:t>
+      </w:r>
+      <w:proofErr w:type="spellEnd"/>
+      <w:r>
+        <w:rPr>
+          <w:rFonts w:eastAsia="Times New Roman"/>
+        </w:rPr>
+        <w:t xml:space="preserve"> </w:t>
+      </w:r>
+      <w:proofErr w:type="spellStart"/>
+      <w:r>
+        <w:rPr>
+          <w:rFonts w:eastAsia="Times New Roman"/>
+        </w:rPr>
+        <w:t>gửi</w:t>
+      </w:r>
+      <w:proofErr w:type="spellEnd"/>
+    </w:p>
+    <w:p>
+      <w:pPr>
+        <w:pStyle w:val="ListParagraph"/>
+        <w:numPr>
+          <w:ilvl w:val="1"/>
+          <w:numId w:val="5"/>
+        </w:numPr>
+        <w:spacing w:before="100" w:beforeAutospacing="1" w:after="100" w:afterAutospacing="1"/>
+        <w:rPr>
+          <w:rFonts w:eastAsia="Times New Roman"/>
+        </w:rPr>
+      </w:pPr>
+      <w:proofErr w:type="spellStart"/>
+      <w:r>
+        <w:rPr>
+          <w:rFonts w:eastAsia="Times New Roman"/>
+        </w:rPr>
         <w:t>Thời</w:t>
       </w:r>
       <w:proofErr w:type="spellEnd"/>
@@ -1951,165 +2307,6 @@
         <w:rPr>
           <w:rFonts w:eastAsia="Times New Roman"/>
         </w:rPr>
-        <w:t>SLA (Service level agreement):</w:t>
-      </w:r>
-    </w:p>
-    <w:p>
-      <w:pPr>
-        <w:pStyle w:val="ListParagraph"/>
-        <w:numPr>
-          <w:ilvl w:val="0"/>
-          <w:numId w:val="5"/>
-        </w:numPr>
-        <w:spacing w:before="100" w:beforeAutospacing="1" w:after="100" w:afterAutospacing="1"/>
-        <w:rPr>
-          <w:rFonts w:eastAsia="Times New Roman"/>
-        </w:rPr>
-      </w:pPr>
-      <w:r>
-        <w:rPr>
-          <w:rFonts w:eastAsia="Times New Roman"/>
-        </w:rPr>
-        <w:t>Ticket ID</w:t>
-      </w:r>
-    </w:p>
-    <w:p>
-      <w:pPr>
-        <w:pStyle w:val="ListParagraph"/>
-        <w:numPr>
-          <w:ilvl w:val="0"/>
-          <w:numId w:val="5"/>
-        </w:numPr>
-        <w:spacing w:before="100" w:beforeAutospacing="1" w:after="100" w:afterAutospacing="1"/>
-        <w:rPr>
-          <w:rFonts w:eastAsia="Times New Roman"/>
-        </w:rPr>
-      </w:pPr>
-      <w:proofErr w:type="spellStart"/>
-      <w:r>
-        <w:rPr>
-          <w:rFonts w:eastAsia="Times New Roman"/>
-        </w:rPr>
-        <w:t>Thời</w:t>
-      </w:r>
-      <w:proofErr w:type="spellEnd"/>
-      <w:r>
-        <w:rPr>
-          <w:rFonts w:eastAsia="Times New Roman"/>
-        </w:rPr>
-        <w:t xml:space="preserve"> </w:t>
-      </w:r>
-      <w:proofErr w:type="spellStart"/>
-      <w:r>
-        <w:rPr>
-          <w:rFonts w:eastAsia="Times New Roman"/>
-        </w:rPr>
-        <w:t>gian</w:t>
-      </w:r>
-      <w:proofErr w:type="spellEnd"/>
-      <w:r>
-        <w:rPr>
-          <w:rFonts w:eastAsia="Times New Roman"/>
-        </w:rPr>
-        <w:t xml:space="preserve"> </w:t>
-      </w:r>
-      <w:proofErr w:type="spellStart"/>
-      <w:r>
-        <w:rPr>
-          <w:rFonts w:eastAsia="Times New Roman"/>
-        </w:rPr>
-        <w:t>tiếp</w:t>
-      </w:r>
-      <w:proofErr w:type="spellEnd"/>
-      <w:r>
-        <w:rPr>
-          <w:rFonts w:eastAsia="Times New Roman"/>
-        </w:rPr>
-        <w:t xml:space="preserve"> </w:t>
-      </w:r>
-      <w:proofErr w:type="spellStart"/>
-      <w:r>
-        <w:rPr>
-          <w:rFonts w:eastAsia="Times New Roman"/>
-        </w:rPr>
-        <w:t>nhận</w:t>
-      </w:r>
-      <w:proofErr w:type="spellEnd"/>
-    </w:p>
-    <w:p>
-      <w:pPr>
-        <w:pStyle w:val="ListParagraph"/>
-        <w:numPr>
-          <w:ilvl w:val="0"/>
-          <w:numId w:val="5"/>
-        </w:numPr>
-        <w:spacing w:before="100" w:beforeAutospacing="1" w:after="100" w:afterAutospacing="1"/>
-        <w:rPr>
-          <w:rFonts w:eastAsia="Times New Roman"/>
-        </w:rPr>
-      </w:pPr>
-      <w:proofErr w:type="spellStart"/>
-      <w:r>
-        <w:rPr>
-          <w:rFonts w:eastAsia="Times New Roman"/>
-        </w:rPr>
-        <w:t>Thời</w:t>
-      </w:r>
-      <w:proofErr w:type="spellEnd"/>
-      <w:r>
-        <w:rPr>
-          <w:rFonts w:eastAsia="Times New Roman"/>
-        </w:rPr>
-        <w:t xml:space="preserve"> </w:t>
-      </w:r>
-      <w:proofErr w:type="spellStart"/>
-      <w:r>
-        <w:rPr>
-          <w:rFonts w:eastAsia="Times New Roman"/>
-        </w:rPr>
-        <w:t>gian</w:t>
-      </w:r>
-      <w:proofErr w:type="spellEnd"/>
-      <w:r>
-        <w:rPr>
-          <w:rFonts w:eastAsia="Times New Roman"/>
-        </w:rPr>
-        <w:t xml:space="preserve"> </w:t>
-      </w:r>
-      <w:proofErr w:type="spellStart"/>
-      <w:r>
-        <w:rPr>
-          <w:rFonts w:eastAsia="Times New Roman"/>
-        </w:rPr>
-        <w:t>hoàn</w:t>
-      </w:r>
-      <w:proofErr w:type="spellEnd"/>
-      <w:r>
-        <w:rPr>
-          <w:rFonts w:eastAsia="Times New Roman"/>
-        </w:rPr>
-        <w:t xml:space="preserve"> </w:t>
-      </w:r>
-      <w:proofErr w:type="spellStart"/>
-      <w:r>
-        <w:rPr>
-          <w:rFonts w:eastAsia="Times New Roman"/>
-        </w:rPr>
-        <w:t>thành</w:t>
-      </w:r>
-      <w:proofErr w:type="spellEnd"/>
-    </w:p>
-    <w:p>
-      <w:pPr>
-        <w:spacing w:before="100" w:beforeAutospacing="1" w:after="100" w:afterAutospacing="1"/>
-        <w:rPr>
-          <w:rFonts w:eastAsia="Times New Roman"/>
-        </w:rPr>
-      </w:pPr>
-      <w:r>
-        <w:rPr>
-          <w:rFonts w:eastAsia="Times New Roman"/>
-        </w:rPr>
         <w:t xml:space="preserve">Observer </w:t>
       </w:r>
       <w:proofErr w:type="spellStart"/>
@@ -2408,6 +2605,22 @@
         </w:rPr>
         <w:t>, Finish</w:t>
       </w:r>
+    </w:p>
+    <w:p>
+      <w:pPr>
+        <w:spacing w:before="100" w:beforeAutospacing="1" w:after="100" w:afterAutospacing="1"/>
+        <w:rPr>
+          <w:rFonts w:eastAsia="Times New Roman"/>
+        </w:rPr>
+      </w:pPr>
+    </w:p>
+    <w:p>
+      <w:pPr>
+        <w:spacing w:before="100" w:beforeAutospacing="1" w:after="100" w:afterAutospacing="1"/>
+        <w:rPr>
+          <w:rFonts w:eastAsia="Times New Roman"/>
+        </w:rPr>
+      </w:pPr>
     </w:p>
     <w:sectPr>
       <w:pgSz w:w="11906" w:h="16838"/>

</xml_diff>

<commit_message>
Update diagram and specification
</commit_message>
<xml_diff>
--- a/specification_breakdown.docx
+++ b/specification_breakdown.docx
@@ -15,9 +15,19 @@
           <w:numId w:val="3"/>
         </w:numPr>
       </w:pPr>
-      <w:r>
-        <w:t>Người dùng</w:t>
-      </w:r>
+      <w:proofErr w:type="spellStart"/>
+      <w:r>
+        <w:t>Người</w:t>
+      </w:r>
+      <w:proofErr w:type="spellEnd"/>
+      <w:r>
+        <w:t xml:space="preserve"> </w:t>
+      </w:r>
+      <w:proofErr w:type="spellStart"/>
+      <w:r>
+        <w:t>dùng</w:t>
+      </w:r>
+      <w:proofErr w:type="spellEnd"/>
     </w:p>
     <w:p>
       <w:pPr>
@@ -31,12 +41,28 @@
           <w:rFonts w:eastAsia="Times New Roman"/>
         </w:rPr>
       </w:pPr>
-      <w:r>
-        <w:rPr>
-          <w:rFonts w:eastAsia="Times New Roman"/>
-        </w:rPr>
-        <w:t>Tiêu đề</w:t>
-      </w:r>
+      <w:proofErr w:type="spellStart"/>
+      <w:r>
+        <w:rPr>
+          <w:rFonts w:eastAsia="Times New Roman"/>
+        </w:rPr>
+        <w:t>Tiêu</w:t>
+      </w:r>
+      <w:proofErr w:type="spellEnd"/>
+      <w:r>
+        <w:rPr>
+          <w:rFonts w:eastAsia="Times New Roman"/>
+        </w:rPr>
+        <w:t xml:space="preserve"> </w:t>
+      </w:r>
+      <w:proofErr w:type="spellStart"/>
+      <w:r>
+        <w:rPr>
+          <w:rFonts w:eastAsia="Times New Roman"/>
+        </w:rPr>
+        <w:t>đề</w:t>
+      </w:r>
+      <w:proofErr w:type="spellEnd"/>
     </w:p>
     <w:p>
       <w:pPr>
@@ -50,12 +76,42 @@
           <w:rFonts w:eastAsia="Times New Roman"/>
         </w:rPr>
       </w:pPr>
-      <w:r>
-        <w:rPr>
-          <w:rFonts w:eastAsia="Times New Roman"/>
-        </w:rPr>
-        <w:t>Mô tả chi tiết</w:t>
-      </w:r>
+      <w:proofErr w:type="spellStart"/>
+      <w:r>
+        <w:rPr>
+          <w:rFonts w:eastAsia="Times New Roman"/>
+        </w:rPr>
+        <w:t>Mô</w:t>
+      </w:r>
+      <w:proofErr w:type="spellEnd"/>
+      <w:r>
+        <w:rPr>
+          <w:rFonts w:eastAsia="Times New Roman"/>
+        </w:rPr>
+        <w:t xml:space="preserve"> </w:t>
+      </w:r>
+      <w:proofErr w:type="spellStart"/>
+      <w:r>
+        <w:rPr>
+          <w:rFonts w:eastAsia="Times New Roman"/>
+        </w:rPr>
+        <w:t>tả</w:t>
+      </w:r>
+      <w:proofErr w:type="spellEnd"/>
+      <w:r>
+        <w:rPr>
+          <w:rFonts w:eastAsia="Times New Roman"/>
+        </w:rPr>
+        <w:t xml:space="preserve"> chi </w:t>
+      </w:r>
+      <w:proofErr w:type="spellStart"/>
+      <w:r>
+        <w:rPr>
+          <w:rFonts w:eastAsia="Times New Roman"/>
+        </w:rPr>
+        <w:t>tiết</w:t>
+      </w:r>
+      <w:proofErr w:type="spellEnd"/>
     </w:p>
     <w:p>
       <w:pPr>
@@ -69,12 +125,56 @@
           <w:rFonts w:eastAsia="Times New Roman"/>
         </w:rPr>
       </w:pPr>
-      <w:r>
-        <w:rPr>
-          <w:rFonts w:eastAsia="Times New Roman"/>
-        </w:rPr>
-        <w:t>Mức độ ưu tiên</w:t>
-      </w:r>
+      <w:proofErr w:type="spellStart"/>
+      <w:r>
+        <w:rPr>
+          <w:rFonts w:eastAsia="Times New Roman"/>
+        </w:rPr>
+        <w:t>Mức</w:t>
+      </w:r>
+      <w:proofErr w:type="spellEnd"/>
+      <w:r>
+        <w:rPr>
+          <w:rFonts w:eastAsia="Times New Roman"/>
+        </w:rPr>
+        <w:t xml:space="preserve"> </w:t>
+      </w:r>
+      <w:proofErr w:type="spellStart"/>
+      <w:r>
+        <w:rPr>
+          <w:rFonts w:eastAsia="Times New Roman"/>
+        </w:rPr>
+        <w:t>độ</w:t>
+      </w:r>
+      <w:proofErr w:type="spellEnd"/>
+      <w:r>
+        <w:rPr>
+          <w:rFonts w:eastAsia="Times New Roman"/>
+        </w:rPr>
+        <w:t xml:space="preserve"> </w:t>
+      </w:r>
+      <w:proofErr w:type="spellStart"/>
+      <w:r>
+        <w:rPr>
+          <w:rFonts w:eastAsia="Times New Roman"/>
+        </w:rPr>
+        <w:t>ưu</w:t>
+      </w:r>
+      <w:proofErr w:type="spellEnd"/>
+      <w:r>
+        <w:rPr>
+          <w:rFonts w:eastAsia="Times New Roman"/>
+        </w:rPr>
+        <w:t xml:space="preserve"> </w:t>
+      </w:r>
+      <w:proofErr w:type="spellStart"/>
+      <w:r>
+        <w:rPr>
+          <w:rFonts w:eastAsia="Times New Roman"/>
+        </w:rPr>
+        <w:t>tiên</w:t>
+      </w:r>
+      <w:proofErr w:type="spellEnd"/>
     </w:p>
     <w:p>
       <w:pPr>
@@ -88,11 +188,173 @@
           <w:rFonts w:eastAsia="Times New Roman"/>
         </w:rPr>
       </w:pPr>
-      <w:r>
-        <w:rPr>
-          <w:rFonts w:eastAsia="Times New Roman"/>
-        </w:rPr>
-        <w:t>Loại sự cố/yêu cầu (Không bắt buộc / Có thể gán sau)</w:t>
+      <w:proofErr w:type="spellStart"/>
+      <w:r>
+        <w:rPr>
+          <w:rFonts w:eastAsia="Times New Roman"/>
+        </w:rPr>
+        <w:t>Loại</w:t>
+      </w:r>
+      <w:proofErr w:type="spellEnd"/>
+      <w:r>
+        <w:rPr>
+          <w:rFonts w:eastAsia="Times New Roman"/>
+        </w:rPr>
+        <w:t xml:space="preserve"> </w:t>
+      </w:r>
+      <w:proofErr w:type="spellStart"/>
+      <w:r>
+        <w:rPr>
+          <w:rFonts w:eastAsia="Times New Roman"/>
+        </w:rPr>
+        <w:t>sự</w:t>
+      </w:r>
+      <w:proofErr w:type="spellEnd"/>
+      <w:r>
+        <w:rPr>
+          <w:rFonts w:eastAsia="Times New Roman"/>
+        </w:rPr>
+        <w:t xml:space="preserve"> </w:t>
+      </w:r>
+      <w:proofErr w:type="spellStart"/>
+      <w:r>
+        <w:rPr>
+          <w:rFonts w:eastAsia="Times New Roman"/>
+        </w:rPr>
+        <w:t>cố</w:t>
+      </w:r>
+      <w:proofErr w:type="spellEnd"/>
+      <w:r>
+        <w:rPr>
+          <w:rFonts w:eastAsia="Times New Roman"/>
+        </w:rPr>
+        <w:t>/</w:t>
+      </w:r>
+      <w:proofErr w:type="spellStart"/>
+      <w:r>
+        <w:rPr>
+          <w:rFonts w:eastAsia="Times New Roman"/>
+        </w:rPr>
+        <w:t>yêu</w:t>
+      </w:r>
+      <w:proofErr w:type="spellEnd"/>
+      <w:r>
+        <w:rPr>
+          <w:rFonts w:eastAsia="Times New Roman"/>
+        </w:rPr>
+        <w:t xml:space="preserve"> </w:t>
+      </w:r>
+      <w:proofErr w:type="spellStart"/>
+      <w:r>
+        <w:rPr>
+          <w:rFonts w:eastAsia="Times New Roman"/>
+        </w:rPr>
+        <w:t>cầu</w:t>
+      </w:r>
+      <w:proofErr w:type="spellEnd"/>
+      <w:r>
+        <w:rPr>
+          <w:rFonts w:eastAsia="Times New Roman"/>
+        </w:rPr>
+        <w:t xml:space="preserve"> (</w:t>
+      </w:r>
+      <w:proofErr w:type="spellStart"/>
+      <w:r>
+        <w:rPr>
+          <w:rFonts w:eastAsia="Times New Roman"/>
+        </w:rPr>
+        <w:t>Không</w:t>
+      </w:r>
+      <w:proofErr w:type="spellEnd"/>
+      <w:r>
+        <w:rPr>
+          <w:rFonts w:eastAsia="Times New Roman"/>
+        </w:rPr>
+        <w:t xml:space="preserve"> </w:t>
+      </w:r>
+      <w:proofErr w:type="spellStart"/>
+      <w:r>
+        <w:rPr>
+          <w:rFonts w:eastAsia="Times New Roman"/>
+        </w:rPr>
+        <w:t>bắt</w:t>
+      </w:r>
+      <w:proofErr w:type="spellEnd"/>
+      <w:r>
+        <w:rPr>
+          <w:rFonts w:eastAsia="Times New Roman"/>
+        </w:rPr>
+        <w:t xml:space="preserve"> </w:t>
+      </w:r>
+      <w:proofErr w:type="spellStart"/>
+      <w:r>
+        <w:rPr>
+          <w:rFonts w:eastAsia="Times New Roman"/>
+        </w:rPr>
+        <w:t>buộc</w:t>
+      </w:r>
+      <w:proofErr w:type="spellEnd"/>
+      <w:r>
+        <w:rPr>
+          <w:rFonts w:eastAsia="Times New Roman"/>
+        </w:rPr>
+        <w:t xml:space="preserve"> / </w:t>
+      </w:r>
+      <w:proofErr w:type="spellStart"/>
+      <w:r>
+        <w:rPr>
+          <w:rFonts w:eastAsia="Times New Roman"/>
+        </w:rPr>
+        <w:t>Có</w:t>
+      </w:r>
+      <w:proofErr w:type="spellEnd"/>
+      <w:r>
+        <w:rPr>
+          <w:rFonts w:eastAsia="Times New Roman"/>
+        </w:rPr>
+        <w:t xml:space="preserve"> </w:t>
+      </w:r>
+      <w:proofErr w:type="spellStart"/>
+      <w:r>
+        <w:rPr>
+          <w:rFonts w:eastAsia="Times New Roman"/>
+        </w:rPr>
+        <w:t>thể</w:t>
+      </w:r>
+      <w:proofErr w:type="spellEnd"/>
+      <w:r>
+        <w:rPr>
+          <w:rFonts w:eastAsia="Times New Roman"/>
+        </w:rPr>
+        <w:t xml:space="preserve"> </w:t>
+      </w:r>
+      <w:proofErr w:type="spellStart"/>
+      <w:r>
+        <w:rPr>
+          <w:rFonts w:eastAsia="Times New Roman"/>
+        </w:rPr>
+        <w:t>gán</w:t>
+      </w:r>
+      <w:proofErr w:type="spellEnd"/>
+      <w:r>
+        <w:rPr>
+          <w:rFonts w:eastAsia="Times New Roman"/>
+        </w:rPr>
+        <w:t xml:space="preserve"> </w:t>
+      </w:r>
+      <w:proofErr w:type="spellStart"/>
+      <w:r>
+        <w:rPr>
+          <w:rFonts w:eastAsia="Times New Roman"/>
+        </w:rPr>
+        <w:t>sau</w:t>
+      </w:r>
+      <w:proofErr w:type="spellEnd"/>
+      <w:r>
+        <w:rPr>
+          <w:rFonts w:eastAsia="Times New Roman"/>
+        </w:rPr>
+        <w:t>)</w:t>
       </w:r>
     </w:p>
     <w:p>
@@ -111,8 +373,58 @@
         <w:rPr>
           <w:rFonts w:eastAsia="Times New Roman"/>
         </w:rPr>
-        <w:t>File đính kèm nếu có</w:t>
-      </w:r>
+        <w:t xml:space="preserve">File </w:t>
+      </w:r>
+      <w:proofErr w:type="spellStart"/>
+      <w:r>
+        <w:rPr>
+          <w:rFonts w:eastAsia="Times New Roman"/>
+        </w:rPr>
+        <w:t>đính</w:t>
+      </w:r>
+      <w:proofErr w:type="spellEnd"/>
+      <w:r>
+        <w:rPr>
+          <w:rFonts w:eastAsia="Times New Roman"/>
+        </w:rPr>
+        <w:t xml:space="preserve"> </w:t>
+      </w:r>
+      <w:proofErr w:type="spellStart"/>
+      <w:r>
+        <w:rPr>
+          <w:rFonts w:eastAsia="Times New Roman"/>
+        </w:rPr>
+        <w:t>kèm</w:t>
+      </w:r>
+      <w:proofErr w:type="spellEnd"/>
+      <w:r>
+        <w:rPr>
+          <w:rFonts w:eastAsia="Times New Roman"/>
+        </w:rPr>
+        <w:t xml:space="preserve"> </w:t>
+      </w:r>
+      <w:proofErr w:type="spellStart"/>
+      <w:r>
+        <w:rPr>
+          <w:rFonts w:eastAsia="Times New Roman"/>
+        </w:rPr>
+        <w:t>nếu</w:t>
+      </w:r>
+      <w:proofErr w:type="spellEnd"/>
+      <w:r>
+        <w:rPr>
+          <w:rFonts w:eastAsia="Times New Roman"/>
+        </w:rPr>
+        <w:t xml:space="preserve"> </w:t>
+      </w:r>
+      <w:proofErr w:type="spellStart"/>
+      <w:r>
+        <w:rPr>
+          <w:rFonts w:eastAsia="Times New Roman"/>
+        </w:rPr>
+        <w:t>có</w:t>
+      </w:r>
+      <w:proofErr w:type="spellEnd"/>
     </w:p>
     <w:p>
       <w:pPr>
@@ -126,12 +438,28 @@
           <w:rFonts w:eastAsia="Times New Roman"/>
         </w:rPr>
       </w:pPr>
-      <w:r>
-        <w:rPr>
-          <w:rFonts w:eastAsia="Times New Roman"/>
-        </w:rPr>
-        <w:t>Hệ thống</w:t>
-      </w:r>
+      <w:proofErr w:type="spellStart"/>
+      <w:r>
+        <w:rPr>
+          <w:rFonts w:eastAsia="Times New Roman"/>
+        </w:rPr>
+        <w:t>Hệ</w:t>
+      </w:r>
+      <w:proofErr w:type="spellEnd"/>
+      <w:r>
+        <w:rPr>
+          <w:rFonts w:eastAsia="Times New Roman"/>
+        </w:rPr>
+        <w:t xml:space="preserve"> </w:t>
+      </w:r>
+      <w:proofErr w:type="spellStart"/>
+      <w:r>
+        <w:rPr>
+          <w:rFonts w:eastAsia="Times New Roman"/>
+        </w:rPr>
+        <w:t>thống</w:t>
+      </w:r>
+      <w:proofErr w:type="spellEnd"/>
     </w:p>
     <w:p>
       <w:pPr>
@@ -145,8 +473,29 @@
           <w:rFonts w:eastAsia="Times New Roman"/>
         </w:rPr>
       </w:pPr>
-      <w:r>
-        <w:t>Đơn vị/phòng ban</w:t>
+      <w:proofErr w:type="spellStart"/>
+      <w:r>
+        <w:t>Đơn</w:t>
+      </w:r>
+      <w:proofErr w:type="spellEnd"/>
+      <w:r>
+        <w:t xml:space="preserve"> </w:t>
+      </w:r>
+      <w:proofErr w:type="spellStart"/>
+      <w:r>
+        <w:t>vị</w:t>
+      </w:r>
+      <w:proofErr w:type="spellEnd"/>
+      <w:r>
+        <w:t>/</w:t>
+      </w:r>
+      <w:proofErr w:type="spellStart"/>
+      <w:r>
+        <w:t>phòng</w:t>
+      </w:r>
+      <w:proofErr w:type="spellEnd"/>
+      <w:r>
+        <w:t xml:space="preserve"> ban</w:t>
       </w:r>
     </w:p>
     <w:p>
@@ -180,11 +529,61 @@
           <w:rFonts w:eastAsia="Times New Roman"/>
         </w:rPr>
       </w:pPr>
-      <w:r>
-        <w:rPr>
-          <w:rFonts w:eastAsia="Times New Roman"/>
-        </w:rPr>
-        <w:t>Trạng thái = “Mới tạo”</w:t>
+      <w:proofErr w:type="spellStart"/>
+      <w:r>
+        <w:rPr>
+          <w:rFonts w:eastAsia="Times New Roman"/>
+        </w:rPr>
+        <w:t>Trạng</w:t>
+      </w:r>
+      <w:proofErr w:type="spellEnd"/>
+      <w:r>
+        <w:rPr>
+          <w:rFonts w:eastAsia="Times New Roman"/>
+        </w:rPr>
+        <w:t xml:space="preserve"> </w:t>
+      </w:r>
+      <w:proofErr w:type="spellStart"/>
+      <w:r>
+        <w:rPr>
+          <w:rFonts w:eastAsia="Times New Roman"/>
+        </w:rPr>
+        <w:t>thái</w:t>
+      </w:r>
+      <w:proofErr w:type="spellEnd"/>
+      <w:r>
+        <w:rPr>
+          <w:rFonts w:eastAsia="Times New Roman"/>
+        </w:rPr>
+        <w:t xml:space="preserve"> = “</w:t>
+      </w:r>
+      <w:proofErr w:type="spellStart"/>
+      <w:r>
+        <w:rPr>
+          <w:rFonts w:eastAsia="Times New Roman"/>
+        </w:rPr>
+        <w:t>Mới</w:t>
+      </w:r>
+      <w:proofErr w:type="spellEnd"/>
+      <w:r>
+        <w:rPr>
+          <w:rFonts w:eastAsia="Times New Roman"/>
+        </w:rPr>
+        <w:t xml:space="preserve"> </w:t>
+      </w:r>
+      <w:proofErr w:type="spellStart"/>
+      <w:r>
+        <w:rPr>
+          <w:rFonts w:eastAsia="Times New Roman"/>
+        </w:rPr>
+        <w:t>tạo</w:t>
+      </w:r>
+      <w:proofErr w:type="spellEnd"/>
+      <w:r>
+        <w:rPr>
+          <w:rFonts w:eastAsia="Times New Roman"/>
+        </w:rPr>
+        <w:t>”</w:t>
       </w:r>
     </w:p>
     <w:p>
@@ -199,12 +598,70 @@
           <w:rFonts w:eastAsia="Times New Roman"/>
         </w:rPr>
       </w:pPr>
-      <w:r>
-        <w:rPr>
-          <w:rFonts w:eastAsia="Times New Roman"/>
-        </w:rPr>
-        <w:t>Thời gian tạo = Hiện tại</w:t>
-      </w:r>
+      <w:proofErr w:type="spellStart"/>
+      <w:r>
+        <w:rPr>
+          <w:rFonts w:eastAsia="Times New Roman"/>
+        </w:rPr>
+        <w:t>Thời</w:t>
+      </w:r>
+      <w:proofErr w:type="spellEnd"/>
+      <w:r>
+        <w:rPr>
+          <w:rFonts w:eastAsia="Times New Roman"/>
+        </w:rPr>
+        <w:t xml:space="preserve"> </w:t>
+      </w:r>
+      <w:proofErr w:type="spellStart"/>
+      <w:r>
+        <w:rPr>
+          <w:rFonts w:eastAsia="Times New Roman"/>
+        </w:rPr>
+        <w:t>gian</w:t>
+      </w:r>
+      <w:proofErr w:type="spellEnd"/>
+      <w:r>
+        <w:rPr>
+          <w:rFonts w:eastAsia="Times New Roman"/>
+        </w:rPr>
+        <w:t xml:space="preserve"> </w:t>
+      </w:r>
+      <w:proofErr w:type="spellStart"/>
+      <w:r>
+        <w:rPr>
+          <w:rFonts w:eastAsia="Times New Roman"/>
+        </w:rPr>
+        <w:t>tạo</w:t>
+      </w:r>
+      <w:proofErr w:type="spellEnd"/>
+      <w:r>
+        <w:rPr>
+          <w:rFonts w:eastAsia="Times New Roman"/>
+        </w:rPr>
+        <w:t xml:space="preserve"> = </w:t>
+      </w:r>
+      <w:proofErr w:type="spellStart"/>
+      <w:r>
+        <w:rPr>
+          <w:rFonts w:eastAsia="Times New Roman"/>
+        </w:rPr>
+        <w:t>Hiện</w:t>
+      </w:r>
+      <w:proofErr w:type="spellEnd"/>
+      <w:r>
+        <w:rPr>
+          <w:rFonts w:eastAsia="Times New Roman"/>
+        </w:rPr>
+        <w:t xml:space="preserve"> </w:t>
+      </w:r>
+      <w:proofErr w:type="spellStart"/>
+      <w:r>
+        <w:rPr>
+          <w:rFonts w:eastAsia="Times New Roman"/>
+        </w:rPr>
+        <w:t>tại</w:t>
+      </w:r>
+      <w:proofErr w:type="spellEnd"/>
     </w:p>
     <w:p>
       <w:pPr>
@@ -218,12 +675,56 @@
           <w:rFonts w:eastAsia="Times New Roman"/>
         </w:rPr>
       </w:pPr>
-      <w:r>
-        <w:rPr>
-          <w:rFonts w:eastAsia="Times New Roman"/>
-        </w:rPr>
-        <w:t>Thời gian tiếp nhận</w:t>
-      </w:r>
+      <w:proofErr w:type="spellStart"/>
+      <w:r>
+        <w:rPr>
+          <w:rFonts w:eastAsia="Times New Roman"/>
+        </w:rPr>
+        <w:t>Thời</w:t>
+      </w:r>
+      <w:proofErr w:type="spellEnd"/>
+      <w:r>
+        <w:rPr>
+          <w:rFonts w:eastAsia="Times New Roman"/>
+        </w:rPr>
+        <w:t xml:space="preserve"> </w:t>
+      </w:r>
+      <w:proofErr w:type="spellStart"/>
+      <w:r>
+        <w:rPr>
+          <w:rFonts w:eastAsia="Times New Roman"/>
+        </w:rPr>
+        <w:t>gian</w:t>
+      </w:r>
+      <w:proofErr w:type="spellEnd"/>
+      <w:r>
+        <w:rPr>
+          <w:rFonts w:eastAsia="Times New Roman"/>
+        </w:rPr>
+        <w:t xml:space="preserve"> </w:t>
+      </w:r>
+      <w:proofErr w:type="spellStart"/>
+      <w:r>
+        <w:rPr>
+          <w:rFonts w:eastAsia="Times New Roman"/>
+        </w:rPr>
+        <w:t>tiếp</w:t>
+      </w:r>
+      <w:proofErr w:type="spellEnd"/>
+      <w:r>
+        <w:rPr>
+          <w:rFonts w:eastAsia="Times New Roman"/>
+        </w:rPr>
+        <w:t xml:space="preserve"> </w:t>
+      </w:r>
+      <w:proofErr w:type="spellStart"/>
+      <w:r>
+        <w:rPr>
+          <w:rFonts w:eastAsia="Times New Roman"/>
+        </w:rPr>
+        <w:t>nhận</w:t>
+      </w:r>
+      <w:proofErr w:type="spellEnd"/>
     </w:p>
     <w:p>
       <w:pPr>
@@ -237,12 +738,56 @@
           <w:rFonts w:eastAsia="Times New Roman"/>
         </w:rPr>
       </w:pPr>
-      <w:r>
-        <w:rPr>
-          <w:rFonts w:eastAsia="Times New Roman"/>
-        </w:rPr>
-        <w:t>Thời gian hoàn thành</w:t>
-      </w:r>
+      <w:proofErr w:type="spellStart"/>
+      <w:r>
+        <w:rPr>
+          <w:rFonts w:eastAsia="Times New Roman"/>
+        </w:rPr>
+        <w:t>Thời</w:t>
+      </w:r>
+      <w:proofErr w:type="spellEnd"/>
+      <w:r>
+        <w:rPr>
+          <w:rFonts w:eastAsia="Times New Roman"/>
+        </w:rPr>
+        <w:t xml:space="preserve"> </w:t>
+      </w:r>
+      <w:proofErr w:type="spellStart"/>
+      <w:r>
+        <w:rPr>
+          <w:rFonts w:eastAsia="Times New Roman"/>
+        </w:rPr>
+        <w:t>gian</w:t>
+      </w:r>
+      <w:proofErr w:type="spellEnd"/>
+      <w:r>
+        <w:rPr>
+          <w:rFonts w:eastAsia="Times New Roman"/>
+        </w:rPr>
+        <w:t xml:space="preserve"> </w:t>
+      </w:r>
+      <w:proofErr w:type="spellStart"/>
+      <w:r>
+        <w:rPr>
+          <w:rFonts w:eastAsia="Times New Roman"/>
+        </w:rPr>
+        <w:t>hoàn</w:t>
+      </w:r>
+      <w:proofErr w:type="spellEnd"/>
+      <w:r>
+        <w:rPr>
+          <w:rFonts w:eastAsia="Times New Roman"/>
+        </w:rPr>
+        <w:t xml:space="preserve"> </w:t>
+      </w:r>
+      <w:proofErr w:type="spellStart"/>
+      <w:r>
+        <w:rPr>
+          <w:rFonts w:eastAsia="Times New Roman"/>
+        </w:rPr>
+        <w:t>thành</w:t>
+      </w:r>
+      <w:proofErr w:type="spellEnd"/>
     </w:p>
     <w:p>
       <w:pPr>
@@ -260,8 +805,16 @@
         <w:rPr>
           <w:rFonts w:eastAsia="Times New Roman"/>
         </w:rPr>
-        <w:t>Quản trị</w:t>
-      </w:r>
+        <w:t xml:space="preserve">Quản </w:t>
+      </w:r>
+      <w:proofErr w:type="spellStart"/>
+      <w:r>
+        <w:rPr>
+          <w:rFonts w:eastAsia="Times New Roman"/>
+        </w:rPr>
+        <w:t>trị</w:t>
+      </w:r>
+      <w:proofErr w:type="spellEnd"/>
     </w:p>
     <w:p>
       <w:pPr>
@@ -275,12 +828,42 @@
           <w:rFonts w:eastAsia="Times New Roman"/>
         </w:rPr>
       </w:pPr>
-      <w:r>
-        <w:rPr>
-          <w:rFonts w:eastAsia="Times New Roman"/>
-        </w:rPr>
-        <w:t>Người xử lí</w:t>
-      </w:r>
+      <w:proofErr w:type="spellStart"/>
+      <w:r>
+        <w:rPr>
+          <w:rFonts w:eastAsia="Times New Roman"/>
+        </w:rPr>
+        <w:t>Người</w:t>
+      </w:r>
+      <w:proofErr w:type="spellEnd"/>
+      <w:r>
+        <w:rPr>
+          <w:rFonts w:eastAsia="Times New Roman"/>
+        </w:rPr>
+        <w:t xml:space="preserve"> </w:t>
+      </w:r>
+      <w:proofErr w:type="spellStart"/>
+      <w:r>
+        <w:rPr>
+          <w:rFonts w:eastAsia="Times New Roman"/>
+        </w:rPr>
+        <w:t>xử</w:t>
+      </w:r>
+      <w:proofErr w:type="spellEnd"/>
+      <w:r>
+        <w:rPr>
+          <w:rFonts w:eastAsia="Times New Roman"/>
+        </w:rPr>
+        <w:t xml:space="preserve"> </w:t>
+      </w:r>
+      <w:proofErr w:type="spellStart"/>
+      <w:r>
+        <w:rPr>
+          <w:rFonts w:eastAsia="Times New Roman"/>
+        </w:rPr>
+        <w:t>lí</w:t>
+      </w:r>
+      <w:proofErr w:type="spellEnd"/>
     </w:p>
     <w:p>
       <w:pPr>
@@ -298,8 +881,16 @@
         <w:rPr>
           <w:rFonts w:eastAsia="Times New Roman"/>
         </w:rPr>
-        <w:t>Nguyên nhân</w:t>
-      </w:r>
+        <w:t xml:space="preserve">Nguyên </w:t>
+      </w:r>
+      <w:proofErr w:type="spellStart"/>
+      <w:r>
+        <w:rPr>
+          <w:rFonts w:eastAsia="Times New Roman"/>
+        </w:rPr>
+        <w:t>nhân</w:t>
+      </w:r>
+      <w:proofErr w:type="spellEnd"/>
     </w:p>
     <w:p>
       <w:pPr>
@@ -317,8 +908,44 @@
         <w:rPr>
           <w:rFonts w:eastAsia="Times New Roman"/>
         </w:rPr>
-        <w:t>Các bước xử lí</w:t>
-      </w:r>
+        <w:t xml:space="preserve">Các </w:t>
+      </w:r>
+      <w:proofErr w:type="spellStart"/>
+      <w:r>
+        <w:rPr>
+          <w:rFonts w:eastAsia="Times New Roman"/>
+        </w:rPr>
+        <w:t>bước</w:t>
+      </w:r>
+      <w:proofErr w:type="spellEnd"/>
+      <w:r>
+        <w:rPr>
+          <w:rFonts w:eastAsia="Times New Roman"/>
+        </w:rPr>
+        <w:t xml:space="preserve"> </w:t>
+      </w:r>
+      <w:proofErr w:type="spellStart"/>
+      <w:r>
+        <w:rPr>
+          <w:rFonts w:eastAsia="Times New Roman"/>
+        </w:rPr>
+        <w:t>xử</w:t>
+      </w:r>
+      <w:proofErr w:type="spellEnd"/>
+      <w:r>
+        <w:rPr>
+          <w:rFonts w:eastAsia="Times New Roman"/>
+        </w:rPr>
+        <w:t xml:space="preserve"> </w:t>
+      </w:r>
+      <w:proofErr w:type="spellStart"/>
+      <w:r>
+        <w:rPr>
+          <w:rFonts w:eastAsia="Times New Roman"/>
+        </w:rPr>
+        <w:t>lí</w:t>
+      </w:r>
+      <w:proofErr w:type="spellEnd"/>
     </w:p>
     <w:p>
       <w:pPr>
@@ -332,12 +959,56 @@
           <w:rFonts w:eastAsia="Times New Roman"/>
         </w:rPr>
       </w:pPr>
-      <w:r>
-        <w:rPr>
-          <w:rFonts w:eastAsia="Times New Roman"/>
-        </w:rPr>
-        <w:t>Kết quả xử lí</w:t>
-      </w:r>
+      <w:proofErr w:type="spellStart"/>
+      <w:r>
+        <w:rPr>
+          <w:rFonts w:eastAsia="Times New Roman"/>
+        </w:rPr>
+        <w:t>Kết</w:t>
+      </w:r>
+      <w:proofErr w:type="spellEnd"/>
+      <w:r>
+        <w:rPr>
+          <w:rFonts w:eastAsia="Times New Roman"/>
+        </w:rPr>
+        <w:t xml:space="preserve"> </w:t>
+      </w:r>
+      <w:proofErr w:type="spellStart"/>
+      <w:r>
+        <w:rPr>
+          <w:rFonts w:eastAsia="Times New Roman"/>
+        </w:rPr>
+        <w:t>quả</w:t>
+      </w:r>
+      <w:proofErr w:type="spellEnd"/>
+      <w:r>
+        <w:rPr>
+          <w:rFonts w:eastAsia="Times New Roman"/>
+        </w:rPr>
+        <w:t xml:space="preserve"> </w:t>
+      </w:r>
+      <w:proofErr w:type="spellStart"/>
+      <w:r>
+        <w:rPr>
+          <w:rFonts w:eastAsia="Times New Roman"/>
+        </w:rPr>
+        <w:t>xử</w:t>
+      </w:r>
+      <w:proofErr w:type="spellEnd"/>
+      <w:r>
+        <w:rPr>
+          <w:rFonts w:eastAsia="Times New Roman"/>
+        </w:rPr>
+        <w:t xml:space="preserve"> </w:t>
+      </w:r>
+      <w:proofErr w:type="spellStart"/>
+      <w:r>
+        <w:rPr>
+          <w:rFonts w:eastAsia="Times New Roman"/>
+        </w:rPr>
+        <w:t>lí</w:t>
+      </w:r>
+      <w:proofErr w:type="spellEnd"/>
     </w:p>
     <w:p>
       <w:pPr>
@@ -346,11 +1017,33 @@
           <w:rFonts w:eastAsia="Times New Roman"/>
         </w:rPr>
       </w:pPr>
-      <w:r>
-        <w:rPr>
-          <w:rFonts w:eastAsia="Times New Roman"/>
-        </w:rPr>
-        <w:t xml:space="preserve">Trạng thái: </w:t>
+      <w:proofErr w:type="spellStart"/>
+      <w:r>
+        <w:rPr>
+          <w:rFonts w:eastAsia="Times New Roman"/>
+        </w:rPr>
+        <w:t>Trạng</w:t>
+      </w:r>
+      <w:proofErr w:type="spellEnd"/>
+      <w:r>
+        <w:rPr>
+          <w:rFonts w:eastAsia="Times New Roman"/>
+        </w:rPr>
+        <w:t xml:space="preserve"> </w:t>
+      </w:r>
+      <w:proofErr w:type="spellStart"/>
+      <w:r>
+        <w:rPr>
+          <w:rFonts w:eastAsia="Times New Roman"/>
+        </w:rPr>
+        <w:t>thái</w:t>
+      </w:r>
+      <w:proofErr w:type="spellEnd"/>
+      <w:r>
+        <w:rPr>
+          <w:rFonts w:eastAsia="Times New Roman"/>
+        </w:rPr>
+        <w:t xml:space="preserve">: </w:t>
       </w:r>
     </w:p>
     <w:p>
@@ -369,7 +1062,91 @@
         <w:rPr>
           <w:rFonts w:eastAsia="Times New Roman"/>
         </w:rPr>
-        <w:t>“Mới tạo” - người dùng vừa tạo ticket</w:t>
+        <w:t>“</w:t>
+      </w:r>
+      <w:proofErr w:type="spellStart"/>
+      <w:r>
+        <w:rPr>
+          <w:rFonts w:eastAsia="Times New Roman"/>
+        </w:rPr>
+        <w:t>Mới</w:t>
+      </w:r>
+      <w:proofErr w:type="spellEnd"/>
+      <w:r>
+        <w:rPr>
+          <w:rFonts w:eastAsia="Times New Roman"/>
+        </w:rPr>
+        <w:t xml:space="preserve"> </w:t>
+      </w:r>
+      <w:proofErr w:type="spellStart"/>
+      <w:r>
+        <w:rPr>
+          <w:rFonts w:eastAsia="Times New Roman"/>
+        </w:rPr>
+        <w:t>tạo</w:t>
+      </w:r>
+      <w:proofErr w:type="spellEnd"/>
+      <w:r>
+        <w:rPr>
+          <w:rFonts w:eastAsia="Times New Roman"/>
+        </w:rPr>
+        <w:t xml:space="preserve">” - </w:t>
+      </w:r>
+      <w:proofErr w:type="spellStart"/>
+      <w:r>
+        <w:rPr>
+          <w:rFonts w:eastAsia="Times New Roman"/>
+        </w:rPr>
+        <w:t>người</w:t>
+      </w:r>
+      <w:proofErr w:type="spellEnd"/>
+      <w:r>
+        <w:rPr>
+          <w:rFonts w:eastAsia="Times New Roman"/>
+        </w:rPr>
+        <w:t xml:space="preserve"> </w:t>
+      </w:r>
+      <w:proofErr w:type="spellStart"/>
+      <w:r>
+        <w:rPr>
+          <w:rFonts w:eastAsia="Times New Roman"/>
+        </w:rPr>
+        <w:t>dùng</w:t>
+      </w:r>
+      <w:proofErr w:type="spellEnd"/>
+      <w:r>
+        <w:rPr>
+          <w:rFonts w:eastAsia="Times New Roman"/>
+        </w:rPr>
+        <w:t xml:space="preserve"> </w:t>
+      </w:r>
+      <w:proofErr w:type="spellStart"/>
+      <w:r>
+        <w:rPr>
+          <w:rFonts w:eastAsia="Times New Roman"/>
+        </w:rPr>
+        <w:t>vừa</w:t>
+      </w:r>
+      <w:proofErr w:type="spellEnd"/>
+      <w:r>
+        <w:rPr>
+          <w:rFonts w:eastAsia="Times New Roman"/>
+        </w:rPr>
+        <w:t xml:space="preserve"> </w:t>
+      </w:r>
+      <w:proofErr w:type="spellStart"/>
+      <w:r>
+        <w:rPr>
+          <w:rFonts w:eastAsia="Times New Roman"/>
+        </w:rPr>
+        <w:t>tạo</w:t>
+      </w:r>
+      <w:proofErr w:type="spellEnd"/>
+      <w:r>
+        <w:rPr>
+          <w:rFonts w:eastAsia="Times New Roman"/>
+        </w:rPr>
+        <w:t xml:space="preserve"> ticket</w:t>
       </w:r>
     </w:p>
     <w:p>
@@ -388,8 +1165,156 @@
         <w:rPr>
           <w:rFonts w:eastAsia="Times New Roman"/>
         </w:rPr>
-        <w:t>“Đang xử lý” - quản trị viên cập nhập người xử lí</w:t>
-      </w:r>
+        <w:t>“</w:t>
+      </w:r>
+      <w:proofErr w:type="spellStart"/>
+      <w:r>
+        <w:rPr>
+          <w:rFonts w:eastAsia="Times New Roman"/>
+        </w:rPr>
+        <w:t>Đang</w:t>
+      </w:r>
+      <w:proofErr w:type="spellEnd"/>
+      <w:r>
+        <w:rPr>
+          <w:rFonts w:eastAsia="Times New Roman"/>
+        </w:rPr>
+        <w:t xml:space="preserve"> </w:t>
+      </w:r>
+      <w:proofErr w:type="spellStart"/>
+      <w:r>
+        <w:rPr>
+          <w:rFonts w:eastAsia="Times New Roman"/>
+        </w:rPr>
+        <w:t>xử</w:t>
+      </w:r>
+      <w:proofErr w:type="spellEnd"/>
+      <w:r>
+        <w:rPr>
+          <w:rFonts w:eastAsia="Times New Roman"/>
+        </w:rPr>
+        <w:t xml:space="preserve"> </w:t>
+      </w:r>
+      <w:proofErr w:type="spellStart"/>
+      <w:r>
+        <w:rPr>
+          <w:rFonts w:eastAsia="Times New Roman"/>
+        </w:rPr>
+        <w:t>lý</w:t>
+      </w:r>
+      <w:proofErr w:type="spellEnd"/>
+      <w:r>
+        <w:rPr>
+          <w:rFonts w:eastAsia="Times New Roman"/>
+        </w:rPr>
+        <w:t xml:space="preserve">” - </w:t>
+      </w:r>
+      <w:proofErr w:type="spellStart"/>
+      <w:r>
+        <w:rPr>
+          <w:rFonts w:eastAsia="Times New Roman"/>
+        </w:rPr>
+        <w:t>quản</w:t>
+      </w:r>
+      <w:proofErr w:type="spellEnd"/>
+      <w:r>
+        <w:rPr>
+          <w:rFonts w:eastAsia="Times New Roman"/>
+        </w:rPr>
+        <w:t xml:space="preserve"> </w:t>
+      </w:r>
+      <w:proofErr w:type="spellStart"/>
+      <w:r>
+        <w:rPr>
+          <w:rFonts w:eastAsia="Times New Roman"/>
+        </w:rPr>
+        <w:t>trị</w:t>
+      </w:r>
+      <w:proofErr w:type="spellEnd"/>
+      <w:r>
+        <w:rPr>
+          <w:rFonts w:eastAsia="Times New Roman"/>
+        </w:rPr>
+        <w:t xml:space="preserve"> </w:t>
+      </w:r>
+      <w:proofErr w:type="spellStart"/>
+      <w:r>
+        <w:rPr>
+          <w:rFonts w:eastAsia="Times New Roman"/>
+        </w:rPr>
+        <w:t>viên</w:t>
+      </w:r>
+      <w:proofErr w:type="spellEnd"/>
+      <w:r>
+        <w:rPr>
+          <w:rFonts w:eastAsia="Times New Roman"/>
+        </w:rPr>
+        <w:t xml:space="preserve"> </w:t>
+      </w:r>
+      <w:proofErr w:type="spellStart"/>
+      <w:r>
+        <w:rPr>
+          <w:rFonts w:eastAsia="Times New Roman"/>
+        </w:rPr>
+        <w:t>cập</w:t>
+      </w:r>
+      <w:proofErr w:type="spellEnd"/>
+      <w:r>
+        <w:rPr>
+          <w:rFonts w:eastAsia="Times New Roman"/>
+        </w:rPr>
+        <w:t xml:space="preserve"> </w:t>
+      </w:r>
+      <w:proofErr w:type="spellStart"/>
+      <w:r>
+        <w:rPr>
+          <w:rFonts w:eastAsia="Times New Roman"/>
+        </w:rPr>
+        <w:t>nhập</w:t>
+      </w:r>
+      <w:proofErr w:type="spellEnd"/>
+      <w:r>
+        <w:rPr>
+          <w:rFonts w:eastAsia="Times New Roman"/>
+        </w:rPr>
+        <w:t xml:space="preserve"> </w:t>
+      </w:r>
+      <w:proofErr w:type="spellStart"/>
+      <w:r>
+        <w:rPr>
+          <w:rFonts w:eastAsia="Times New Roman"/>
+        </w:rPr>
+        <w:t>người</w:t>
+      </w:r>
+      <w:proofErr w:type="spellEnd"/>
+      <w:r>
+        <w:rPr>
+          <w:rFonts w:eastAsia="Times New Roman"/>
+        </w:rPr>
+        <w:t xml:space="preserve"> </w:t>
+      </w:r>
+      <w:proofErr w:type="spellStart"/>
+      <w:r>
+        <w:rPr>
+          <w:rFonts w:eastAsia="Times New Roman"/>
+        </w:rPr>
+        <w:t>xử</w:t>
+      </w:r>
+      <w:proofErr w:type="spellEnd"/>
+      <w:r>
+        <w:rPr>
+          <w:rFonts w:eastAsia="Times New Roman"/>
+        </w:rPr>
+        <w:t xml:space="preserve"> </w:t>
+      </w:r>
+      <w:proofErr w:type="spellStart"/>
+      <w:r>
+        <w:rPr>
+          <w:rFonts w:eastAsia="Times New Roman"/>
+        </w:rPr>
+        <w:t>lí</w:t>
+      </w:r>
+      <w:proofErr w:type="spellEnd"/>
     </w:p>
     <w:p>
       <w:pPr>
@@ -407,8 +1332,212 @@
         <w:rPr>
           <w:rFonts w:eastAsia="Times New Roman"/>
         </w:rPr>
-        <w:t>“Đã xử lý xong” - người xử lí cập nhập đánh dấu đã xử lý xong</w:t>
-      </w:r>
+        <w:t>“</w:t>
+      </w:r>
+      <w:proofErr w:type="spellStart"/>
+      <w:r>
+        <w:rPr>
+          <w:rFonts w:eastAsia="Times New Roman"/>
+        </w:rPr>
+        <w:t>Đã</w:t>
+      </w:r>
+      <w:proofErr w:type="spellEnd"/>
+      <w:r>
+        <w:rPr>
+          <w:rFonts w:eastAsia="Times New Roman"/>
+        </w:rPr>
+        <w:t xml:space="preserve"> </w:t>
+      </w:r>
+      <w:proofErr w:type="spellStart"/>
+      <w:r>
+        <w:rPr>
+          <w:rFonts w:eastAsia="Times New Roman"/>
+        </w:rPr>
+        <w:t>xử</w:t>
+      </w:r>
+      <w:proofErr w:type="spellEnd"/>
+      <w:r>
+        <w:rPr>
+          <w:rFonts w:eastAsia="Times New Roman"/>
+        </w:rPr>
+        <w:t xml:space="preserve"> </w:t>
+      </w:r>
+      <w:proofErr w:type="spellStart"/>
+      <w:r>
+        <w:rPr>
+          <w:rFonts w:eastAsia="Times New Roman"/>
+        </w:rPr>
+        <w:t>lý</w:t>
+      </w:r>
+      <w:proofErr w:type="spellEnd"/>
+      <w:r>
+        <w:rPr>
+          <w:rFonts w:eastAsia="Times New Roman"/>
+        </w:rPr>
+        <w:t xml:space="preserve"> </w:t>
+      </w:r>
+      <w:proofErr w:type="spellStart"/>
+      <w:r>
+        <w:rPr>
+          <w:rFonts w:eastAsia="Times New Roman"/>
+        </w:rPr>
+        <w:t>xong</w:t>
+      </w:r>
+      <w:proofErr w:type="spellEnd"/>
+      <w:r>
+        <w:rPr>
+          <w:rFonts w:eastAsia="Times New Roman"/>
+        </w:rPr>
+        <w:t xml:space="preserve">” - </w:t>
+      </w:r>
+      <w:proofErr w:type="spellStart"/>
+      <w:r>
+        <w:rPr>
+          <w:rFonts w:eastAsia="Times New Roman"/>
+        </w:rPr>
+        <w:t>người</w:t>
+      </w:r>
+      <w:proofErr w:type="spellEnd"/>
+      <w:r>
+        <w:rPr>
+          <w:rFonts w:eastAsia="Times New Roman"/>
+        </w:rPr>
+        <w:t xml:space="preserve"> </w:t>
+      </w:r>
+      <w:proofErr w:type="spellStart"/>
+      <w:r>
+        <w:rPr>
+          <w:rFonts w:eastAsia="Times New Roman"/>
+        </w:rPr>
+        <w:t>xử</w:t>
+      </w:r>
+      <w:proofErr w:type="spellEnd"/>
+      <w:r>
+        <w:rPr>
+          <w:rFonts w:eastAsia="Times New Roman"/>
+        </w:rPr>
+        <w:t xml:space="preserve"> </w:t>
+      </w:r>
+      <w:proofErr w:type="spellStart"/>
+      <w:r>
+        <w:rPr>
+          <w:rFonts w:eastAsia="Times New Roman"/>
+        </w:rPr>
+        <w:t>lí</w:t>
+      </w:r>
+      <w:proofErr w:type="spellEnd"/>
+      <w:r>
+        <w:rPr>
+          <w:rFonts w:eastAsia="Times New Roman"/>
+        </w:rPr>
+        <w:t xml:space="preserve"> </w:t>
+      </w:r>
+      <w:proofErr w:type="spellStart"/>
+      <w:r>
+        <w:rPr>
+          <w:rFonts w:eastAsia="Times New Roman"/>
+        </w:rPr>
+        <w:t>cập</w:t>
+      </w:r>
+      <w:proofErr w:type="spellEnd"/>
+      <w:r>
+        <w:rPr>
+          <w:rFonts w:eastAsia="Times New Roman"/>
+        </w:rPr>
+        <w:t xml:space="preserve"> </w:t>
+      </w:r>
+      <w:proofErr w:type="spellStart"/>
+      <w:r>
+        <w:rPr>
+          <w:rFonts w:eastAsia="Times New Roman"/>
+        </w:rPr>
+        <w:t>nhập</w:t>
+      </w:r>
+      <w:proofErr w:type="spellEnd"/>
+      <w:r>
+        <w:rPr>
+          <w:rFonts w:eastAsia="Times New Roman"/>
+        </w:rPr>
+        <w:t xml:space="preserve"> </w:t>
+      </w:r>
+      <w:proofErr w:type="spellStart"/>
+      <w:r>
+        <w:rPr>
+          <w:rFonts w:eastAsia="Times New Roman"/>
+        </w:rPr>
+        <w:t>đánh</w:t>
+      </w:r>
+      <w:proofErr w:type="spellEnd"/>
+      <w:r>
+        <w:rPr>
+          <w:rFonts w:eastAsia="Times New Roman"/>
+        </w:rPr>
+        <w:t xml:space="preserve"> </w:t>
+      </w:r>
+      <w:proofErr w:type="spellStart"/>
+      <w:r>
+        <w:rPr>
+          <w:rFonts w:eastAsia="Times New Roman"/>
+        </w:rPr>
+        <w:t>dấu</w:t>
+      </w:r>
+      <w:proofErr w:type="spellEnd"/>
+      <w:r>
+        <w:rPr>
+          <w:rFonts w:eastAsia="Times New Roman"/>
+        </w:rPr>
+        <w:t xml:space="preserve"> </w:t>
+      </w:r>
+      <w:proofErr w:type="spellStart"/>
+      <w:r>
+        <w:rPr>
+          <w:rFonts w:eastAsia="Times New Roman"/>
+        </w:rPr>
+        <w:t>đã</w:t>
+      </w:r>
+      <w:proofErr w:type="spellEnd"/>
+      <w:r>
+        <w:rPr>
+          <w:rFonts w:eastAsia="Times New Roman"/>
+        </w:rPr>
+        <w:t xml:space="preserve"> </w:t>
+      </w:r>
+      <w:proofErr w:type="spellStart"/>
+      <w:r>
+        <w:rPr>
+          <w:rFonts w:eastAsia="Times New Roman"/>
+        </w:rPr>
+        <w:t>xử</w:t>
+      </w:r>
+      <w:proofErr w:type="spellEnd"/>
+      <w:r>
+        <w:rPr>
+          <w:rFonts w:eastAsia="Times New Roman"/>
+        </w:rPr>
+        <w:t xml:space="preserve"> </w:t>
+      </w:r>
+      <w:proofErr w:type="spellStart"/>
+      <w:r>
+        <w:rPr>
+          <w:rFonts w:eastAsia="Times New Roman"/>
+        </w:rPr>
+        <w:t>lý</w:t>
+      </w:r>
+      <w:proofErr w:type="spellEnd"/>
+      <w:r>
+        <w:rPr>
+          <w:rFonts w:eastAsia="Times New Roman"/>
+        </w:rPr>
+        <w:t xml:space="preserve"> </w:t>
+      </w:r>
+      <w:proofErr w:type="spellStart"/>
+      <w:r>
+        <w:rPr>
+          <w:rFonts w:eastAsia="Times New Roman"/>
+        </w:rPr>
+        <w:t>xong</w:t>
+      </w:r>
+      <w:proofErr w:type="spellEnd"/>
     </w:p>
     <w:p>
       <w:pPr>
@@ -426,8 +1555,128 @@
         <w:rPr>
           <w:rFonts w:eastAsia="Times New Roman"/>
         </w:rPr>
-        <w:t>“Đóng” - người dùng chấp nhận kết quả xử lí</w:t>
-      </w:r>
+        <w:t>“</w:t>
+      </w:r>
+      <w:proofErr w:type="spellStart"/>
+      <w:r>
+        <w:rPr>
+          <w:rFonts w:eastAsia="Times New Roman"/>
+        </w:rPr>
+        <w:t>Đóng</w:t>
+      </w:r>
+      <w:proofErr w:type="spellEnd"/>
+      <w:r>
+        <w:rPr>
+          <w:rFonts w:eastAsia="Times New Roman"/>
+        </w:rPr>
+        <w:t xml:space="preserve">” - </w:t>
+      </w:r>
+      <w:proofErr w:type="spellStart"/>
+      <w:r>
+        <w:rPr>
+          <w:rFonts w:eastAsia="Times New Roman"/>
+        </w:rPr>
+        <w:t>người</w:t>
+      </w:r>
+      <w:proofErr w:type="spellEnd"/>
+      <w:r>
+        <w:rPr>
+          <w:rFonts w:eastAsia="Times New Roman"/>
+        </w:rPr>
+        <w:t xml:space="preserve"> </w:t>
+      </w:r>
+      <w:proofErr w:type="spellStart"/>
+      <w:r>
+        <w:rPr>
+          <w:rFonts w:eastAsia="Times New Roman"/>
+        </w:rPr>
+        <w:t>dùng</w:t>
+      </w:r>
+      <w:proofErr w:type="spellEnd"/>
+      <w:r>
+        <w:rPr>
+          <w:rFonts w:eastAsia="Times New Roman"/>
+        </w:rPr>
+        <w:t xml:space="preserve"> </w:t>
+      </w:r>
+      <w:proofErr w:type="spellStart"/>
+      <w:r>
+        <w:rPr>
+          <w:rFonts w:eastAsia="Times New Roman"/>
+        </w:rPr>
+        <w:t>chấp</w:t>
+      </w:r>
+      <w:proofErr w:type="spellEnd"/>
+      <w:r>
+        <w:rPr>
+          <w:rFonts w:eastAsia="Times New Roman"/>
+        </w:rPr>
+        <w:t xml:space="preserve"> </w:t>
+      </w:r>
+      <w:proofErr w:type="spellStart"/>
+      <w:r>
+        <w:rPr>
+          <w:rFonts w:eastAsia="Times New Roman"/>
+        </w:rPr>
+        <w:t>nhận</w:t>
+      </w:r>
+      <w:proofErr w:type="spellEnd"/>
+      <w:r>
+        <w:rPr>
+          <w:rFonts w:eastAsia="Times New Roman"/>
+        </w:rPr>
+        <w:t xml:space="preserve"> </w:t>
+      </w:r>
+      <w:proofErr w:type="spellStart"/>
+      <w:r>
+        <w:rPr>
+          <w:rFonts w:eastAsia="Times New Roman"/>
+        </w:rPr>
+        <w:t>kết</w:t>
+      </w:r>
+      <w:proofErr w:type="spellEnd"/>
+      <w:r>
+        <w:rPr>
+          <w:rFonts w:eastAsia="Times New Roman"/>
+        </w:rPr>
+        <w:t xml:space="preserve"> </w:t>
+      </w:r>
+      <w:proofErr w:type="spellStart"/>
+      <w:r>
+        <w:rPr>
+          <w:rFonts w:eastAsia="Times New Roman"/>
+        </w:rPr>
+        <w:t>quả</w:t>
+      </w:r>
+      <w:proofErr w:type="spellEnd"/>
+      <w:r>
+        <w:rPr>
+          <w:rFonts w:eastAsia="Times New Roman"/>
+        </w:rPr>
+        <w:t xml:space="preserve"> </w:t>
+      </w:r>
+      <w:proofErr w:type="spellStart"/>
+      <w:r>
+        <w:rPr>
+          <w:rFonts w:eastAsia="Times New Roman"/>
+        </w:rPr>
+        <w:t>xử</w:t>
+      </w:r>
+      <w:proofErr w:type="spellEnd"/>
+      <w:r>
+        <w:rPr>
+          <w:rFonts w:eastAsia="Times New Roman"/>
+        </w:rPr>
+        <w:t xml:space="preserve"> </w:t>
+      </w:r>
+      <w:proofErr w:type="spellStart"/>
+      <w:r>
+        <w:rPr>
+          <w:rFonts w:eastAsia="Times New Roman"/>
+        </w:rPr>
+        <w:t>lí</w:t>
+      </w:r>
+      <w:proofErr w:type="spellEnd"/>
     </w:p>
     <w:p>
       <w:pPr>
@@ -436,11 +1685,47 @@
           <w:rFonts w:eastAsia="Times New Roman"/>
         </w:rPr>
       </w:pPr>
-      <w:r>
-        <w:rPr>
-          <w:rFonts w:eastAsia="Times New Roman"/>
-        </w:rPr>
-        <w:t>Mức ưu tiên:</w:t>
+      <w:proofErr w:type="spellStart"/>
+      <w:r>
+        <w:rPr>
+          <w:rFonts w:eastAsia="Times New Roman"/>
+        </w:rPr>
+        <w:t>Mức</w:t>
+      </w:r>
+      <w:proofErr w:type="spellEnd"/>
+      <w:r>
+        <w:rPr>
+          <w:rFonts w:eastAsia="Times New Roman"/>
+        </w:rPr>
+        <w:t xml:space="preserve"> </w:t>
+      </w:r>
+      <w:proofErr w:type="spellStart"/>
+      <w:r>
+        <w:rPr>
+          <w:rFonts w:eastAsia="Times New Roman"/>
+        </w:rPr>
+        <w:t>ưu</w:t>
+      </w:r>
+      <w:proofErr w:type="spellEnd"/>
+      <w:r>
+        <w:rPr>
+          <w:rFonts w:eastAsia="Times New Roman"/>
+        </w:rPr>
+        <w:t xml:space="preserve"> </w:t>
+      </w:r>
+      <w:proofErr w:type="spellStart"/>
+      <w:r>
+        <w:rPr>
+          <w:rFonts w:eastAsia="Times New Roman"/>
+        </w:rPr>
+        <w:t>tiên</w:t>
+      </w:r>
+      <w:proofErr w:type="spellEnd"/>
+      <w:r>
+        <w:rPr>
+          <w:rFonts w:eastAsia="Times New Roman"/>
+        </w:rPr>
+        <w:t>:</w:t>
       </w:r>
     </w:p>
     <w:p>
@@ -459,8 +1744,16 @@
         <w:rPr>
           <w:rFonts w:eastAsia="Times New Roman"/>
         </w:rPr>
-        <w:t>Nghiêm trọng</w:t>
-      </w:r>
+        <w:t xml:space="preserve">Nghiêm </w:t>
+      </w:r>
+      <w:proofErr w:type="spellStart"/>
+      <w:r>
+        <w:rPr>
+          <w:rFonts w:eastAsia="Times New Roman"/>
+        </w:rPr>
+        <w:t>trọng</w:t>
+      </w:r>
+      <w:proofErr w:type="spellEnd"/>
     </w:p>
     <w:p>
       <w:pPr>
@@ -497,8 +1790,16 @@
         <w:rPr>
           <w:rFonts w:eastAsia="Times New Roman"/>
         </w:rPr>
-        <w:t>Trung bình</w:t>
-      </w:r>
+        <w:t xml:space="preserve">Trung </w:t>
+      </w:r>
+      <w:proofErr w:type="spellStart"/>
+      <w:r>
+        <w:rPr>
+          <w:rFonts w:eastAsia="Times New Roman"/>
+        </w:rPr>
+        <w:t>bình</w:t>
+      </w:r>
+      <w:proofErr w:type="spellEnd"/>
     </w:p>
     <w:p>
       <w:pPr>
@@ -512,12 +1813,14 @@
           <w:rFonts w:eastAsia="Times New Roman"/>
         </w:rPr>
       </w:pPr>
+      <w:proofErr w:type="spellStart"/>
       <w:r>
         <w:rPr>
           <w:rFonts w:eastAsia="Times New Roman"/>
         </w:rPr>
         <w:t>Thấp</w:t>
       </w:r>
+      <w:proofErr w:type="spellEnd"/>
     </w:p>
     <w:p>
       <w:pPr>
@@ -526,11 +1829,208 @@
           <w:rFonts w:eastAsia="Times New Roman"/>
         </w:rPr>
       </w:pPr>
-      <w:r>
-        <w:rPr>
-          <w:rFonts w:eastAsia="Times New Roman"/>
-        </w:rPr>
-        <w:t>Khi tạo ticket -&gt; tạo thông báo cho bộ phận IT</w:t>
+      <w:proofErr w:type="spellStart"/>
+      <w:r>
+        <w:rPr>
+          <w:rFonts w:eastAsia="Times New Roman"/>
+        </w:rPr>
+        <w:t>Loại</w:t>
+      </w:r>
+      <w:proofErr w:type="spellEnd"/>
+      <w:r>
+        <w:rPr>
+          <w:rFonts w:eastAsia="Times New Roman"/>
+        </w:rPr>
+        <w:t xml:space="preserve"> </w:t>
+      </w:r>
+      <w:proofErr w:type="spellStart"/>
+      <w:r>
+        <w:rPr>
+          <w:rFonts w:eastAsia="Times New Roman"/>
+        </w:rPr>
+        <w:t>sự</w:t>
+      </w:r>
+      <w:proofErr w:type="spellEnd"/>
+      <w:r>
+        <w:rPr>
+          <w:rFonts w:eastAsia="Times New Roman"/>
+        </w:rPr>
+        <w:t xml:space="preserve"> </w:t>
+      </w:r>
+      <w:proofErr w:type="spellStart"/>
+      <w:r>
+        <w:rPr>
+          <w:rFonts w:eastAsia="Times New Roman"/>
+        </w:rPr>
+        <w:t>cố</w:t>
+      </w:r>
+      <w:proofErr w:type="spellEnd"/>
+      <w:r>
+        <w:rPr>
+          <w:rFonts w:eastAsia="Times New Roman"/>
+        </w:rPr>
+        <w:t>/</w:t>
+      </w:r>
+      <w:proofErr w:type="spellStart"/>
+      <w:r>
+        <w:rPr>
+          <w:rFonts w:eastAsia="Times New Roman"/>
+        </w:rPr>
+        <w:t>yêu</w:t>
+      </w:r>
+      <w:proofErr w:type="spellEnd"/>
+      <w:r>
+        <w:rPr>
+          <w:rFonts w:eastAsia="Times New Roman"/>
+        </w:rPr>
+        <w:t xml:space="preserve"> </w:t>
+      </w:r>
+      <w:proofErr w:type="spellStart"/>
+      <w:r>
+        <w:rPr>
+          <w:rFonts w:eastAsia="Times New Roman"/>
+        </w:rPr>
+        <w:t>cầu</w:t>
+      </w:r>
+      <w:proofErr w:type="spellEnd"/>
+      <w:r>
+        <w:rPr>
+          <w:rFonts w:eastAsia="Times New Roman"/>
+        </w:rPr>
+        <w:t>:</w:t>
+      </w:r>
+    </w:p>
+    <w:p>
+      <w:pPr>
+        <w:pStyle w:val="ListParagraph"/>
+        <w:numPr>
+          <w:ilvl w:val="0"/>
+          <w:numId w:val="3"/>
+        </w:numPr>
+        <w:spacing w:beforeAutospacing="1" w:afterAutospacing="1"/>
+        <w:rPr>
+          <w:rFonts w:eastAsia="Times New Roman"/>
+        </w:rPr>
+      </w:pPr>
+    </w:p>
+    <w:p>
+      <w:pPr>
+        <w:spacing w:beforeAutospacing="1" w:afterAutospacing="1"/>
+        <w:rPr>
+          <w:rFonts w:eastAsia="Times New Roman"/>
+        </w:rPr>
+      </w:pPr>
+    </w:p>
+    <w:p>
+      <w:pPr>
+        <w:spacing w:beforeAutospacing="1" w:afterAutospacing="1"/>
+        <w:rPr>
+          <w:rFonts w:eastAsia="Times New Roman"/>
+        </w:rPr>
+      </w:pPr>
+      <w:r>
+        <w:rPr>
+          <w:rFonts w:eastAsia="Times New Roman"/>
+        </w:rPr>
+        <w:t xml:space="preserve">Khi </w:t>
+      </w:r>
+      <w:proofErr w:type="spellStart"/>
+      <w:r>
+        <w:rPr>
+          <w:rFonts w:eastAsia="Times New Roman"/>
+        </w:rPr>
+        <w:t>tạo</w:t>
+      </w:r>
+      <w:proofErr w:type="spellEnd"/>
+      <w:r>
+        <w:rPr>
+          <w:rFonts w:eastAsia="Times New Roman"/>
+        </w:rPr>
+        <w:t xml:space="preserve"> ticket -&gt; </w:t>
+      </w:r>
+      <w:proofErr w:type="spellStart"/>
+      <w:r>
+        <w:rPr>
+          <w:rFonts w:eastAsia="Times New Roman"/>
+        </w:rPr>
+        <w:t>tạo</w:t>
+      </w:r>
+      <w:proofErr w:type="spellEnd"/>
+      <w:r>
+        <w:rPr>
+          <w:rFonts w:eastAsia="Times New Roman"/>
+        </w:rPr>
+        <w:t xml:space="preserve"> </w:t>
+      </w:r>
+      <w:proofErr w:type="spellStart"/>
+      <w:r>
+        <w:rPr>
+          <w:rFonts w:eastAsia="Times New Roman"/>
+        </w:rPr>
+        <w:t>thông</w:t>
+      </w:r>
+      <w:proofErr w:type="spellEnd"/>
+      <w:r>
+        <w:rPr>
+          <w:rFonts w:eastAsia="Times New Roman"/>
+        </w:rPr>
+        <w:t xml:space="preserve"> </w:t>
+      </w:r>
+      <w:proofErr w:type="spellStart"/>
+      <w:r>
+        <w:rPr>
+          <w:rFonts w:eastAsia="Times New Roman"/>
+        </w:rPr>
+        <w:t>báo</w:t>
+      </w:r>
+      <w:proofErr w:type="spellEnd"/>
+      <w:r>
+        <w:rPr>
+          <w:rFonts w:eastAsia="Times New Roman"/>
+        </w:rPr>
+        <w:t xml:space="preserve"> </w:t>
+      </w:r>
+      <w:proofErr w:type="spellStart"/>
+      <w:r>
+        <w:rPr>
+          <w:rFonts w:eastAsia="Times New Roman"/>
+        </w:rPr>
+        <w:t>cho</w:t>
+      </w:r>
+      <w:proofErr w:type="spellEnd"/>
+      <w:r>
+        <w:rPr>
+          <w:rFonts w:eastAsia="Times New Roman"/>
+        </w:rPr>
+        <w:t xml:space="preserve"> </w:t>
+      </w:r>
+      <w:proofErr w:type="spellStart"/>
+      <w:r>
+        <w:rPr>
+          <w:rFonts w:eastAsia="Times New Roman"/>
+        </w:rPr>
+        <w:t>bộ</w:t>
+      </w:r>
+      <w:proofErr w:type="spellEnd"/>
+      <w:r>
+        <w:rPr>
+          <w:rFonts w:eastAsia="Times New Roman"/>
+        </w:rPr>
+        <w:t xml:space="preserve"> </w:t>
+      </w:r>
+      <w:proofErr w:type="spellStart"/>
+      <w:r>
+        <w:rPr>
+          <w:rFonts w:eastAsia="Times New Roman"/>
+        </w:rPr>
+        <w:t>phận</w:t>
+      </w:r>
+      <w:proofErr w:type="spellEnd"/>
+      <w:r>
+        <w:rPr>
+          <w:rFonts w:eastAsia="Times New Roman"/>
+        </w:rPr>
+        <w:t xml:space="preserve"> IT</w:t>
       </w:r>
     </w:p>
     <w:p>
@@ -559,11 +2059,33 @@
           <w:rFonts w:eastAsia="Times New Roman"/>
         </w:rPr>
       </w:pPr>
-      <w:r>
-        <w:rPr>
-          <w:rFonts w:eastAsia="Times New Roman"/>
-        </w:rPr>
-        <w:t>Thủ công:</w:t>
+      <w:proofErr w:type="spellStart"/>
+      <w:r>
+        <w:rPr>
+          <w:rFonts w:eastAsia="Times New Roman"/>
+        </w:rPr>
+        <w:t>Thủ</w:t>
+      </w:r>
+      <w:proofErr w:type="spellEnd"/>
+      <w:r>
+        <w:rPr>
+          <w:rFonts w:eastAsia="Times New Roman"/>
+        </w:rPr>
+        <w:t xml:space="preserve"> </w:t>
+      </w:r>
+      <w:proofErr w:type="spellStart"/>
+      <w:r>
+        <w:rPr>
+          <w:rFonts w:eastAsia="Times New Roman"/>
+        </w:rPr>
+        <w:t>công</w:t>
+      </w:r>
+      <w:proofErr w:type="spellEnd"/>
+      <w:r>
+        <w:rPr>
+          <w:rFonts w:eastAsia="Times New Roman"/>
+        </w:rPr>
+        <w:t>:</w:t>
       </w:r>
     </w:p>
     <w:p>
@@ -578,12 +2100,43 @@
           <w:rFonts w:eastAsia="Times New Roman"/>
         </w:rPr>
       </w:pPr>
-      <w:r>
-        <w:rPr>
-          <w:rFonts w:eastAsia="Times New Roman"/>
-        </w:rPr>
-        <w:t>Mức ưu tiên</w:t>
-      </w:r>
+      <w:proofErr w:type="spellStart"/>
+      <w:r>
+        <w:rPr>
+          <w:rFonts w:eastAsia="Times New Roman"/>
+        </w:rPr>
+        <w:lastRenderedPageBreak/>
+        <w:t>Mức</w:t>
+      </w:r>
+      <w:proofErr w:type="spellEnd"/>
+      <w:r>
+        <w:rPr>
+          <w:rFonts w:eastAsia="Times New Roman"/>
+        </w:rPr>
+        <w:t xml:space="preserve"> </w:t>
+      </w:r>
+      <w:proofErr w:type="spellStart"/>
+      <w:r>
+        <w:rPr>
+          <w:rFonts w:eastAsia="Times New Roman"/>
+        </w:rPr>
+        <w:t>ưu</w:t>
+      </w:r>
+      <w:proofErr w:type="spellEnd"/>
+      <w:r>
+        <w:rPr>
+          <w:rFonts w:eastAsia="Times New Roman"/>
+        </w:rPr>
+        <w:t xml:space="preserve"> </w:t>
+      </w:r>
+      <w:proofErr w:type="spellStart"/>
+      <w:r>
+        <w:rPr>
+          <w:rFonts w:eastAsia="Times New Roman"/>
+        </w:rPr>
+        <w:t>tiên</w:t>
+      </w:r>
+      <w:proofErr w:type="spellEnd"/>
     </w:p>
     <w:p>
       <w:pPr>
@@ -593,9 +2146,11 @@
           <w:numId w:val="3"/>
         </w:numPr>
       </w:pPr>
+      <w:proofErr w:type="spellStart"/>
       <w:r>
         <w:t>Tên</w:t>
       </w:r>
+      <w:proofErr w:type="spellEnd"/>
     </w:p>
     <w:p>
       <w:pPr>
@@ -605,12 +2160,56 @@
           <w:numId w:val="3"/>
         </w:numPr>
       </w:pPr>
-      <w:r>
-        <w:rPr>
-          <w:rFonts w:eastAsia="Times New Roman"/>
-        </w:rPr>
-        <w:t>Thời gian phản hồi</w:t>
-      </w:r>
+      <w:proofErr w:type="spellStart"/>
+      <w:r>
+        <w:rPr>
+          <w:rFonts w:eastAsia="Times New Roman"/>
+        </w:rPr>
+        <w:t>Thời</w:t>
+      </w:r>
+      <w:proofErr w:type="spellEnd"/>
+      <w:r>
+        <w:rPr>
+          <w:rFonts w:eastAsia="Times New Roman"/>
+        </w:rPr>
+        <w:t xml:space="preserve"> </w:t>
+      </w:r>
+      <w:proofErr w:type="spellStart"/>
+      <w:r>
+        <w:rPr>
+          <w:rFonts w:eastAsia="Times New Roman"/>
+        </w:rPr>
+        <w:t>gian</w:t>
+      </w:r>
+      <w:proofErr w:type="spellEnd"/>
+      <w:r>
+        <w:rPr>
+          <w:rFonts w:eastAsia="Times New Roman"/>
+        </w:rPr>
+        <w:t xml:space="preserve"> </w:t>
+      </w:r>
+      <w:proofErr w:type="spellStart"/>
+      <w:r>
+        <w:rPr>
+          <w:rFonts w:eastAsia="Times New Roman"/>
+        </w:rPr>
+        <w:t>phản</w:t>
+      </w:r>
+      <w:proofErr w:type="spellEnd"/>
+      <w:r>
+        <w:rPr>
+          <w:rFonts w:eastAsia="Times New Roman"/>
+        </w:rPr>
+        <w:t xml:space="preserve"> </w:t>
+      </w:r>
+      <w:proofErr w:type="spellStart"/>
+      <w:r>
+        <w:rPr>
+          <w:rFonts w:eastAsia="Times New Roman"/>
+        </w:rPr>
+        <w:t>hồi</w:t>
+      </w:r>
+      <w:proofErr w:type="spellEnd"/>
     </w:p>
     <w:p>
       <w:pPr>
@@ -624,12 +2223,56 @@
           <w:rFonts w:eastAsia="Times New Roman"/>
         </w:rPr>
       </w:pPr>
-      <w:r>
-        <w:rPr>
-          <w:rFonts w:eastAsia="Times New Roman"/>
-        </w:rPr>
-        <w:t>Thời gian xử lí</w:t>
-      </w:r>
+      <w:proofErr w:type="spellStart"/>
+      <w:r>
+        <w:rPr>
+          <w:rFonts w:eastAsia="Times New Roman"/>
+        </w:rPr>
+        <w:t>Thời</w:t>
+      </w:r>
+      <w:proofErr w:type="spellEnd"/>
+      <w:r>
+        <w:rPr>
+          <w:rFonts w:eastAsia="Times New Roman"/>
+        </w:rPr>
+        <w:t xml:space="preserve"> </w:t>
+      </w:r>
+      <w:proofErr w:type="spellStart"/>
+      <w:r>
+        <w:rPr>
+          <w:rFonts w:eastAsia="Times New Roman"/>
+        </w:rPr>
+        <w:t>gian</w:t>
+      </w:r>
+      <w:proofErr w:type="spellEnd"/>
+      <w:r>
+        <w:rPr>
+          <w:rFonts w:eastAsia="Times New Roman"/>
+        </w:rPr>
+        <w:t xml:space="preserve"> </w:t>
+      </w:r>
+      <w:proofErr w:type="spellStart"/>
+      <w:r>
+        <w:rPr>
+          <w:rFonts w:eastAsia="Times New Roman"/>
+        </w:rPr>
+        <w:t>xử</w:t>
+      </w:r>
+      <w:proofErr w:type="spellEnd"/>
+      <w:r>
+        <w:rPr>
+          <w:rFonts w:eastAsia="Times New Roman"/>
+        </w:rPr>
+        <w:t xml:space="preserve"> </w:t>
+      </w:r>
+      <w:proofErr w:type="spellStart"/>
+      <w:r>
+        <w:rPr>
+          <w:rFonts w:eastAsia="Times New Roman"/>
+        </w:rPr>
+        <w:t>lí</w:t>
+      </w:r>
+      <w:proofErr w:type="spellEnd"/>
     </w:p>
     <w:p>
       <w:pPr>
@@ -642,8 +2285,21 @@
         <w:rPr>
           <w:rFonts w:eastAsia="Times New Roman"/>
         </w:rPr>
-        <w:lastRenderedPageBreak/>
-        <w:t>Bình luận:</w:t>
+        <w:t xml:space="preserve">Bình </w:t>
+      </w:r>
+      <w:proofErr w:type="spellStart"/>
+      <w:r>
+        <w:rPr>
+          <w:rFonts w:eastAsia="Times New Roman"/>
+        </w:rPr>
+        <w:t>luận</w:t>
+      </w:r>
+      <w:proofErr w:type="spellEnd"/>
+      <w:r>
+        <w:rPr>
+          <w:rFonts w:eastAsia="Times New Roman"/>
+        </w:rPr>
+        <w:t>:</w:t>
       </w:r>
     </w:p>
     <w:p>
@@ -658,11 +2314,33 @@
           <w:rFonts w:eastAsia="Times New Roman"/>
         </w:rPr>
       </w:pPr>
-      <w:r>
-        <w:rPr>
-          <w:rFonts w:eastAsia="Times New Roman"/>
-        </w:rPr>
-        <w:t>Thủ công:</w:t>
+      <w:proofErr w:type="spellStart"/>
+      <w:r>
+        <w:rPr>
+          <w:rFonts w:eastAsia="Times New Roman"/>
+        </w:rPr>
+        <w:t>Thủ</w:t>
+      </w:r>
+      <w:proofErr w:type="spellEnd"/>
+      <w:r>
+        <w:rPr>
+          <w:rFonts w:eastAsia="Times New Roman"/>
+        </w:rPr>
+        <w:t xml:space="preserve"> </w:t>
+      </w:r>
+      <w:proofErr w:type="spellStart"/>
+      <w:r>
+        <w:rPr>
+          <w:rFonts w:eastAsia="Times New Roman"/>
+        </w:rPr>
+        <w:t>công</w:t>
+      </w:r>
+      <w:proofErr w:type="spellEnd"/>
+      <w:r>
+        <w:rPr>
+          <w:rFonts w:eastAsia="Times New Roman"/>
+        </w:rPr>
+        <w:t>:</w:t>
       </w:r>
     </w:p>
     <w:p>
@@ -677,11 +2355,19 @@
           <w:rFonts w:eastAsia="Times New Roman"/>
         </w:rPr>
       </w:pPr>
-      <w:r>
-        <w:rPr>
-          <w:rFonts w:eastAsia="Times New Roman"/>
-        </w:rPr>
-        <w:t>Nội dung</w:t>
+      <w:proofErr w:type="spellStart"/>
+      <w:r>
+        <w:rPr>
+          <w:rFonts w:eastAsia="Times New Roman"/>
+        </w:rPr>
+        <w:t>Nội</w:t>
+      </w:r>
+      <w:proofErr w:type="spellEnd"/>
+      <w:r>
+        <w:rPr>
+          <w:rFonts w:eastAsia="Times New Roman"/>
+        </w:rPr>
+        <w:t xml:space="preserve"> dung</w:t>
       </w:r>
     </w:p>
     <w:p>
@@ -700,7 +2386,63 @@
         <w:rPr>
           <w:rFonts w:eastAsia="Times New Roman"/>
         </w:rPr>
-        <w:t>File đính kèm (nếu có)</w:t>
+        <w:t xml:space="preserve">File </w:t>
+      </w:r>
+      <w:proofErr w:type="spellStart"/>
+      <w:r>
+        <w:rPr>
+          <w:rFonts w:eastAsia="Times New Roman"/>
+        </w:rPr>
+        <w:t>đính</w:t>
+      </w:r>
+      <w:proofErr w:type="spellEnd"/>
+      <w:r>
+        <w:rPr>
+          <w:rFonts w:eastAsia="Times New Roman"/>
+        </w:rPr>
+        <w:t xml:space="preserve"> </w:t>
+      </w:r>
+      <w:proofErr w:type="spellStart"/>
+      <w:r>
+        <w:rPr>
+          <w:rFonts w:eastAsia="Times New Roman"/>
+        </w:rPr>
+        <w:t>kèm</w:t>
+      </w:r>
+      <w:proofErr w:type="spellEnd"/>
+      <w:r>
+        <w:rPr>
+          <w:rFonts w:eastAsia="Times New Roman"/>
+        </w:rPr>
+        <w:t xml:space="preserve"> (</w:t>
+      </w:r>
+      <w:proofErr w:type="spellStart"/>
+      <w:r>
+        <w:rPr>
+          <w:rFonts w:eastAsia="Times New Roman"/>
+        </w:rPr>
+        <w:t>nếu</w:t>
+      </w:r>
+      <w:proofErr w:type="spellEnd"/>
+      <w:r>
+        <w:rPr>
+          <w:rFonts w:eastAsia="Times New Roman"/>
+        </w:rPr>
+        <w:t xml:space="preserve"> </w:t>
+      </w:r>
+      <w:proofErr w:type="spellStart"/>
+      <w:r>
+        <w:rPr>
+          <w:rFonts w:eastAsia="Times New Roman"/>
+        </w:rPr>
+        <w:t>có</w:t>
+      </w:r>
+      <w:proofErr w:type="spellEnd"/>
+      <w:r>
+        <w:rPr>
+          <w:rFonts w:eastAsia="Times New Roman"/>
+        </w:rPr>
+        <w:t>)</w:t>
       </w:r>
     </w:p>
     <w:p>
@@ -715,11 +2457,33 @@
           <w:rFonts w:eastAsia="Times New Roman"/>
         </w:rPr>
       </w:pPr>
-      <w:r>
-        <w:rPr>
-          <w:rFonts w:eastAsia="Times New Roman"/>
-        </w:rPr>
-        <w:t>Tự động:</w:t>
+      <w:proofErr w:type="spellStart"/>
+      <w:r>
+        <w:rPr>
+          <w:rFonts w:eastAsia="Times New Roman"/>
+        </w:rPr>
+        <w:t>Tự</w:t>
+      </w:r>
+      <w:proofErr w:type="spellEnd"/>
+      <w:r>
+        <w:rPr>
+          <w:rFonts w:eastAsia="Times New Roman"/>
+        </w:rPr>
+        <w:t xml:space="preserve"> </w:t>
+      </w:r>
+      <w:proofErr w:type="spellStart"/>
+      <w:r>
+        <w:rPr>
+          <w:rFonts w:eastAsia="Times New Roman"/>
+        </w:rPr>
+        <w:t>động</w:t>
+      </w:r>
+      <w:proofErr w:type="spellEnd"/>
+      <w:r>
+        <w:rPr>
+          <w:rFonts w:eastAsia="Times New Roman"/>
+        </w:rPr>
+        <w:t>:</w:t>
       </w:r>
     </w:p>
     <w:p>
@@ -734,12 +2498,14 @@
           <w:rFonts w:eastAsia="Times New Roman"/>
         </w:rPr>
       </w:pPr>
+      <w:proofErr w:type="spellStart"/>
       <w:r>
         <w:rPr>
           <w:rFonts w:eastAsia="Times New Roman"/>
         </w:rPr>
         <w:t>CommentID</w:t>
       </w:r>
+      <w:proofErr w:type="spellEnd"/>
     </w:p>
     <w:p>
       <w:pPr>
@@ -753,12 +2519,14 @@
           <w:rFonts w:eastAsia="Times New Roman"/>
         </w:rPr>
       </w:pPr>
+      <w:proofErr w:type="spellStart"/>
       <w:r>
         <w:rPr>
           <w:rFonts w:eastAsia="Times New Roman"/>
         </w:rPr>
         <w:t>TicketID</w:t>
       </w:r>
+      <w:proofErr w:type="spellEnd"/>
     </w:p>
     <w:p>
       <w:pPr>
@@ -772,12 +2540,28 @@
           <w:rFonts w:eastAsia="Times New Roman"/>
         </w:rPr>
       </w:pPr>
-      <w:r>
-        <w:rPr>
-          <w:rFonts w:eastAsia="Times New Roman"/>
-        </w:rPr>
-        <w:t>Người gửi</w:t>
-      </w:r>
+      <w:proofErr w:type="spellStart"/>
+      <w:r>
+        <w:rPr>
+          <w:rFonts w:eastAsia="Times New Roman"/>
+        </w:rPr>
+        <w:t>Người</w:t>
+      </w:r>
+      <w:proofErr w:type="spellEnd"/>
+      <w:r>
+        <w:rPr>
+          <w:rFonts w:eastAsia="Times New Roman"/>
+        </w:rPr>
+        <w:t xml:space="preserve"> </w:t>
+      </w:r>
+      <w:proofErr w:type="spellStart"/>
+      <w:r>
+        <w:rPr>
+          <w:rFonts w:eastAsia="Times New Roman"/>
+        </w:rPr>
+        <w:t>gửi</w:t>
+      </w:r>
+      <w:proofErr w:type="spellEnd"/>
     </w:p>
     <w:p>
       <w:pPr>
@@ -791,26 +2575,75 @@
           <w:rFonts w:eastAsia="Times New Roman"/>
         </w:rPr>
       </w:pPr>
-      <w:r>
-        <w:rPr>
-          <w:rFonts w:eastAsia="Times New Roman"/>
-        </w:rPr>
-        <w:t>Thời gian gửi</w:t>
-      </w:r>
+      <w:proofErr w:type="spellStart"/>
+      <w:r>
+        <w:rPr>
+          <w:rFonts w:eastAsia="Times New Roman"/>
+        </w:rPr>
+        <w:t>Thời</w:t>
+      </w:r>
+      <w:proofErr w:type="spellEnd"/>
+      <w:r>
+        <w:rPr>
+          <w:rFonts w:eastAsia="Times New Roman"/>
+        </w:rPr>
+        <w:t xml:space="preserve"> </w:t>
+      </w:r>
+      <w:proofErr w:type="spellStart"/>
+      <w:r>
+        <w:rPr>
+          <w:rFonts w:eastAsia="Times New Roman"/>
+        </w:rPr>
+        <w:t>gian</w:t>
+      </w:r>
+      <w:proofErr w:type="spellEnd"/>
+      <w:r>
+        <w:rPr>
+          <w:rFonts w:eastAsia="Times New Roman"/>
+        </w:rPr>
+        <w:t xml:space="preserve"> </w:t>
+      </w:r>
+      <w:proofErr w:type="spellStart"/>
+      <w:r>
+        <w:rPr>
+          <w:rFonts w:eastAsia="Times New Roman"/>
+        </w:rPr>
+        <w:t>gửi</w:t>
+      </w:r>
+      <w:proofErr w:type="spellEnd"/>
     </w:p>
     <w:p>
       <w:pPr>
         <w:spacing w:beforeAutospacing="1" w:afterAutospacing="1"/>
         <w:rPr>
-          <w:rFonts w:eastAsia="Times New Roman"/>
-        </w:rPr>
-      </w:pPr>
-      <w:r>
-        <w:rPr>
-          <w:rFonts w:eastAsia="Times New Roman"/>
-        </w:rPr>
-        <w:t>Người dùng:</w:t>
-      </w:r>
+          <w:rFonts w:eastAsia="Times New Roman" w:cs="Times New Roman"/>
+          <w:iCs/>
+          <w:sz w:val="26"/>
+          <w:szCs w:val="26"/>
+        </w:rPr>
+      </w:pPr>
+      <w:proofErr w:type="spellStart"/>
+      <w:r>
+        <w:rPr>
+          <w:rFonts w:eastAsia="Times New Roman"/>
+        </w:rPr>
+        <w:t>Người</w:t>
+      </w:r>
+      <w:proofErr w:type="spellEnd"/>
+      <w:r>
+        <w:rPr>
+          <w:rFonts w:eastAsia="Times New Roman"/>
+        </w:rPr>
+        <w:t xml:space="preserve"> </w:t>
+      </w:r>
+      <w:proofErr w:type="spellStart"/>
+      <w:r>
+        <w:rPr>
+          <w:rFonts w:eastAsia="Times New Roman"/>
+        </w:rPr>
+        <w:t>dùng:</w:t>
+      </w:r>
+      <w:proofErr w:type="spellEnd"/>
     </w:p>
     <w:p>
       <w:pPr>
@@ -828,7 +2661,13 @@
         <w:rPr>
           <w:rFonts w:eastAsia="Times New Roman"/>
         </w:rPr>
-        <w:t>UserID</w:t>
+        <w:t>Rol</w:t>
+      </w:r>
+      <w:r>
+        <w:rPr>
+          <w:rFonts w:eastAsia="Times New Roman"/>
+        </w:rPr>
+        <w:t>e</w:t>
       </w:r>
     </w:p>
     <w:p>
@@ -847,7 +2686,7 @@
         <w:rPr>
           <w:rFonts w:eastAsia="Times New Roman"/>
         </w:rPr>
-        <w:t>Role</w:t>
+        <w:t>Department</w:t>
       </w:r>
     </w:p>
     <w:p>
@@ -881,12 +2720,14 @@
           <w:rFonts w:eastAsia="Times New Roman"/>
         </w:rPr>
       </w:pPr>
+      <w:proofErr w:type="spellStart"/>
       <w:r>
         <w:rPr>
           <w:rFonts w:eastAsia="Times New Roman"/>
         </w:rPr>
         <w:t>Fullname</w:t>
       </w:r>
+      <w:proofErr w:type="spellEnd"/>
     </w:p>
     <w:p>
       <w:pPr>
@@ -922,11 +2763,33 @@
           <w:rFonts w:eastAsia="Times New Roman"/>
         </w:rPr>
       </w:pPr>
-      <w:r>
-        <w:rPr>
-          <w:rFonts w:eastAsia="Times New Roman"/>
-        </w:rPr>
-        <w:t>Sự kiện:</w:t>
+      <w:proofErr w:type="spellStart"/>
+      <w:r>
+        <w:rPr>
+          <w:rFonts w:eastAsia="Times New Roman"/>
+        </w:rPr>
+        <w:t>Sự</w:t>
+      </w:r>
+      <w:proofErr w:type="spellEnd"/>
+      <w:r>
+        <w:rPr>
+          <w:rFonts w:eastAsia="Times New Roman"/>
+        </w:rPr>
+        <w:t xml:space="preserve"> </w:t>
+      </w:r>
+      <w:proofErr w:type="spellStart"/>
+      <w:r>
+        <w:rPr>
+          <w:rFonts w:eastAsia="Times New Roman"/>
+        </w:rPr>
+        <w:t>kiện</w:t>
+      </w:r>
+      <w:proofErr w:type="spellEnd"/>
+      <w:r>
+        <w:rPr>
+          <w:rFonts w:eastAsia="Times New Roman"/>
+        </w:rPr>
+        <w:t>:</w:t>
       </w:r>
     </w:p>
     <w:p>
@@ -945,7 +2808,21 @@
         <w:rPr>
           <w:rFonts w:eastAsia="Times New Roman"/>
         </w:rPr>
-        <w:t>Thay đổi: Ticket</w:t>
+        <w:t xml:space="preserve">Thay </w:t>
+      </w:r>
+      <w:proofErr w:type="spellStart"/>
+      <w:r>
+        <w:rPr>
+          <w:rFonts w:eastAsia="Times New Roman"/>
+        </w:rPr>
+        <w:t>đổi</w:t>
+      </w:r>
+      <w:proofErr w:type="spellEnd"/>
+      <w:r>
+        <w:rPr>
+          <w:rFonts w:eastAsia="Times New Roman"/>
+        </w:rPr>
+        <w:t>: Ticket</w:t>
       </w:r>
     </w:p>
     <w:p>
@@ -959,8 +2836,100 @@
         <w:rPr>
           <w:rFonts w:eastAsia="Times New Roman"/>
         </w:rPr>
-        <w:t>Observer có hai sự kiện cơ bản: onTicketStatusChange</w:t>
-      </w:r>
+        <w:t xml:space="preserve">Observer </w:t>
+      </w:r>
+      <w:proofErr w:type="spellStart"/>
+      <w:r>
+        <w:rPr>
+          <w:rFonts w:eastAsia="Times New Roman"/>
+        </w:rPr>
+        <w:t>có</w:t>
+      </w:r>
+      <w:proofErr w:type="spellEnd"/>
+      <w:r>
+        <w:rPr>
+          <w:rFonts w:eastAsia="Times New Roman"/>
+        </w:rPr>
+        <w:t xml:space="preserve"> </w:t>
+      </w:r>
+      <w:proofErr w:type="spellStart"/>
+      <w:r>
+        <w:rPr>
+          <w:rFonts w:eastAsia="Times New Roman"/>
+        </w:rPr>
+        <w:t>hai</w:t>
+      </w:r>
+      <w:proofErr w:type="spellEnd"/>
+      <w:r>
+        <w:rPr>
+          <w:rFonts w:eastAsia="Times New Roman"/>
+        </w:rPr>
+        <w:t xml:space="preserve"> </w:t>
+      </w:r>
+      <w:proofErr w:type="spellStart"/>
+      <w:r>
+        <w:rPr>
+          <w:rFonts w:eastAsia="Times New Roman"/>
+        </w:rPr>
+        <w:t>sự</w:t>
+      </w:r>
+      <w:proofErr w:type="spellEnd"/>
+      <w:r>
+        <w:rPr>
+          <w:rFonts w:eastAsia="Times New Roman"/>
+        </w:rPr>
+        <w:t xml:space="preserve"> </w:t>
+      </w:r>
+      <w:proofErr w:type="spellStart"/>
+      <w:r>
+        <w:rPr>
+          <w:rFonts w:eastAsia="Times New Roman"/>
+        </w:rPr>
+        <w:t>kiện</w:t>
+      </w:r>
+      <w:proofErr w:type="spellEnd"/>
+      <w:r>
+        <w:rPr>
+          <w:rFonts w:eastAsia="Times New Roman"/>
+        </w:rPr>
+        <w:t xml:space="preserve"> </w:t>
+      </w:r>
+      <w:proofErr w:type="spellStart"/>
+      <w:r>
+        <w:rPr>
+          <w:rFonts w:eastAsia="Times New Roman"/>
+        </w:rPr>
+        <w:t>cơ</w:t>
+      </w:r>
+      <w:proofErr w:type="spellEnd"/>
+      <w:r>
+        <w:rPr>
+          <w:rFonts w:eastAsia="Times New Roman"/>
+        </w:rPr>
+        <w:t xml:space="preserve"> </w:t>
+      </w:r>
+      <w:proofErr w:type="spellStart"/>
+      <w:r>
+        <w:rPr>
+          <w:rFonts w:eastAsia="Times New Roman"/>
+        </w:rPr>
+        <w:t>bản</w:t>
+      </w:r>
+      <w:proofErr w:type="spellEnd"/>
+      <w:r>
+        <w:rPr>
+          <w:rFonts w:eastAsia="Times New Roman"/>
+        </w:rPr>
+        <w:t xml:space="preserve">: </w:t>
+      </w:r>
+      <w:proofErr w:type="spellStart"/>
+      <w:r>
+        <w:rPr>
+          <w:rFonts w:eastAsia="Times New Roman"/>
+        </w:rPr>
+        <w:t>onTicketStatusChange</w:t>
+      </w:r>
+      <w:proofErr w:type="spellEnd"/>
     </w:p>
     <w:p>
       <w:pPr>
@@ -969,11 +2938,201 @@
           <w:rFonts w:eastAsia="Times New Roman"/>
         </w:rPr>
       </w:pPr>
-      <w:r>
-        <w:rPr>
-          <w:rFonts w:eastAsia="Times New Roman"/>
-        </w:rPr>
-        <w:t>Một Observer sẽ có một loại thuộc tính là EventType gồm có thể có: Created, OnChange, Finish</w:t>
+      <w:proofErr w:type="spellStart"/>
+      <w:r>
+        <w:rPr>
+          <w:rFonts w:eastAsia="Times New Roman"/>
+        </w:rPr>
+        <w:t>Một</w:t>
+      </w:r>
+      <w:proofErr w:type="spellEnd"/>
+      <w:r>
+        <w:rPr>
+          <w:rFonts w:eastAsia="Times New Roman"/>
+        </w:rPr>
+        <w:t xml:space="preserve"> Observer </w:t>
+      </w:r>
+      <w:proofErr w:type="spellStart"/>
+      <w:r>
+        <w:rPr>
+          <w:rFonts w:eastAsia="Times New Roman"/>
+        </w:rPr>
+        <w:t>sẽ</w:t>
+      </w:r>
+      <w:proofErr w:type="spellEnd"/>
+      <w:r>
+        <w:rPr>
+          <w:rFonts w:eastAsia="Times New Roman"/>
+        </w:rPr>
+        <w:t xml:space="preserve"> </w:t>
+      </w:r>
+      <w:proofErr w:type="spellStart"/>
+      <w:r>
+        <w:rPr>
+          <w:rFonts w:eastAsia="Times New Roman"/>
+        </w:rPr>
+        <w:t>có</w:t>
+      </w:r>
+      <w:proofErr w:type="spellEnd"/>
+      <w:r>
+        <w:rPr>
+          <w:rFonts w:eastAsia="Times New Roman"/>
+        </w:rPr>
+        <w:t xml:space="preserve"> </w:t>
+      </w:r>
+      <w:proofErr w:type="spellStart"/>
+      <w:r>
+        <w:rPr>
+          <w:rFonts w:eastAsia="Times New Roman"/>
+        </w:rPr>
+        <w:t>một</w:t>
+      </w:r>
+      <w:proofErr w:type="spellEnd"/>
+      <w:r>
+        <w:rPr>
+          <w:rFonts w:eastAsia="Times New Roman"/>
+        </w:rPr>
+        <w:t xml:space="preserve"> </w:t>
+      </w:r>
+      <w:proofErr w:type="spellStart"/>
+      <w:r>
+        <w:rPr>
+          <w:rFonts w:eastAsia="Times New Roman"/>
+        </w:rPr>
+        <w:t>loại</w:t>
+      </w:r>
+      <w:proofErr w:type="spellEnd"/>
+      <w:r>
+        <w:rPr>
+          <w:rFonts w:eastAsia="Times New Roman"/>
+        </w:rPr>
+        <w:t xml:space="preserve"> </w:t>
+      </w:r>
+      <w:proofErr w:type="spellStart"/>
+      <w:r>
+        <w:rPr>
+          <w:rFonts w:eastAsia="Times New Roman"/>
+        </w:rPr>
+        <w:t>thuộc</w:t>
+      </w:r>
+      <w:proofErr w:type="spellEnd"/>
+      <w:r>
+        <w:rPr>
+          <w:rFonts w:eastAsia="Times New Roman"/>
+        </w:rPr>
+        <w:t xml:space="preserve"> </w:t>
+      </w:r>
+      <w:proofErr w:type="spellStart"/>
+      <w:r>
+        <w:rPr>
+          <w:rFonts w:eastAsia="Times New Roman"/>
+        </w:rPr>
+        <w:t>tính</w:t>
+      </w:r>
+      <w:proofErr w:type="spellEnd"/>
+      <w:r>
+        <w:rPr>
+          <w:rFonts w:eastAsia="Times New Roman"/>
+        </w:rPr>
+        <w:t xml:space="preserve"> </w:t>
+      </w:r>
+      <w:proofErr w:type="spellStart"/>
+      <w:r>
+        <w:rPr>
+          <w:rFonts w:eastAsia="Times New Roman"/>
+        </w:rPr>
+        <w:t>là</w:t>
+      </w:r>
+      <w:proofErr w:type="spellEnd"/>
+      <w:r>
+        <w:rPr>
+          <w:rFonts w:eastAsia="Times New Roman"/>
+        </w:rPr>
+        <w:t xml:space="preserve"> </w:t>
+      </w:r>
+      <w:proofErr w:type="spellStart"/>
+      <w:r>
+        <w:rPr>
+          <w:rFonts w:eastAsia="Times New Roman"/>
+        </w:rPr>
+        <w:t>EventType</w:t>
+      </w:r>
+      <w:proofErr w:type="spellEnd"/>
+      <w:r>
+        <w:rPr>
+          <w:rFonts w:eastAsia="Times New Roman"/>
+        </w:rPr>
+        <w:t xml:space="preserve"> </w:t>
+      </w:r>
+      <w:proofErr w:type="spellStart"/>
+      <w:r>
+        <w:rPr>
+          <w:rFonts w:eastAsia="Times New Roman"/>
+        </w:rPr>
+        <w:t>gồm</w:t>
+      </w:r>
+      <w:proofErr w:type="spellEnd"/>
+      <w:r>
+        <w:rPr>
+          <w:rFonts w:eastAsia="Times New Roman"/>
+        </w:rPr>
+        <w:t xml:space="preserve"> </w:t>
+      </w:r>
+      <w:proofErr w:type="spellStart"/>
+      <w:r>
+        <w:rPr>
+          <w:rFonts w:eastAsia="Times New Roman"/>
+        </w:rPr>
+        <w:t>có</w:t>
+      </w:r>
+      <w:proofErr w:type="spellEnd"/>
+      <w:r>
+        <w:rPr>
+          <w:rFonts w:eastAsia="Times New Roman"/>
+        </w:rPr>
+        <w:t xml:space="preserve"> </w:t>
+      </w:r>
+      <w:proofErr w:type="spellStart"/>
+      <w:r>
+        <w:rPr>
+          <w:rFonts w:eastAsia="Times New Roman"/>
+        </w:rPr>
+        <w:t>thể</w:t>
+      </w:r>
+      <w:proofErr w:type="spellEnd"/>
+      <w:r>
+        <w:rPr>
+          <w:rFonts w:eastAsia="Times New Roman"/>
+        </w:rPr>
+        <w:t xml:space="preserve"> </w:t>
+      </w:r>
+      <w:proofErr w:type="spellStart"/>
+      <w:r>
+        <w:rPr>
+          <w:rFonts w:eastAsia="Times New Roman"/>
+        </w:rPr>
+        <w:t>có</w:t>
+      </w:r>
+      <w:proofErr w:type="spellEnd"/>
+      <w:r>
+        <w:rPr>
+          <w:rFonts w:eastAsia="Times New Roman"/>
+        </w:rPr>
+        <w:t xml:space="preserve">: Created, </w:t>
+      </w:r>
+      <w:proofErr w:type="spellStart"/>
+      <w:r>
+        <w:rPr>
+          <w:rFonts w:eastAsia="Times New Roman"/>
+        </w:rPr>
+        <w:t>OnChange</w:t>
+      </w:r>
+      <w:proofErr w:type="spellEnd"/>
+      <w:r>
+        <w:rPr>
+          <w:rFonts w:eastAsia="Times New Roman"/>
+        </w:rPr>
+        <w:t>, Finish</w:t>
       </w:r>
     </w:p>
     <w:p>
@@ -987,7 +3146,35 @@
         <w:rPr>
           <w:rFonts w:eastAsia="Times New Roman"/>
         </w:rPr>
-        <w:t>Use httpOnly to prevent xss oops</w:t>
+        <w:t xml:space="preserve">Use </w:t>
+      </w:r>
+      <w:proofErr w:type="spellStart"/>
+      <w:r>
+        <w:rPr>
+          <w:rFonts w:eastAsia="Times New Roman"/>
+        </w:rPr>
+        <w:t>httpOnly</w:t>
+      </w:r>
+      <w:proofErr w:type="spellEnd"/>
+      <w:r>
+        <w:rPr>
+          <w:rFonts w:eastAsia="Times New Roman"/>
+        </w:rPr>
+        <w:t xml:space="preserve"> to prevent </w:t>
+      </w:r>
+      <w:proofErr w:type="spellStart"/>
+      <w:r>
+        <w:rPr>
+          <w:rFonts w:eastAsia="Times New Roman"/>
+        </w:rPr>
+        <w:t>xss</w:t>
+      </w:r>
+      <w:proofErr w:type="spellEnd"/>
+      <w:r>
+        <w:rPr>
+          <w:rFonts w:eastAsia="Times New Roman"/>
+        </w:rPr>
+        <w:t xml:space="preserve"> oops</w:t>
       </w:r>
     </w:p>
     <w:p>
@@ -1037,7 +3224,35 @@
         <w:rPr>
           <w:rFonts w:eastAsia="Times New Roman"/>
         </w:rPr>
-        <w:t xml:space="preserve">get getUserInfo() (jwt is embedded) </w:t>
+        <w:t xml:space="preserve">get </w:t>
+      </w:r>
+      <w:proofErr w:type="spellStart"/>
+      <w:r>
+        <w:rPr>
+          <w:rFonts w:eastAsia="Times New Roman"/>
+        </w:rPr>
+        <w:t>getUserInfo</w:t>
+      </w:r>
+      <w:proofErr w:type="spellEnd"/>
+      <w:r>
+        <w:rPr>
+          <w:rFonts w:eastAsia="Times New Roman"/>
+        </w:rPr>
+        <w:t>() (</w:t>
+      </w:r>
+      <w:proofErr w:type="spellStart"/>
+      <w:r>
+        <w:rPr>
+          <w:rFonts w:eastAsia="Times New Roman"/>
+        </w:rPr>
+        <w:t>jwt</w:t>
+      </w:r>
+      <w:proofErr w:type="spellEnd"/>
+      <w:r>
+        <w:rPr>
+          <w:rFonts w:eastAsia="Times New Roman"/>
+        </w:rPr>
+        <w:t xml:space="preserve"> is embedded) </w:t>
       </w:r>
     </w:p>
     <w:p>
@@ -1068,8 +3283,17 @@
         <w:rPr>
           <w:rFonts w:eastAsia="Times New Roman"/>
         </w:rPr>
-        <w:t>get getTickets</w:t>
-      </w:r>
+        <w:lastRenderedPageBreak/>
+        <w:t xml:space="preserve">get </w:t>
+      </w:r>
+      <w:proofErr w:type="spellStart"/>
+      <w:r>
+        <w:rPr>
+          <w:rFonts w:eastAsia="Times New Roman"/>
+        </w:rPr>
+        <w:t>getTickets</w:t>
+      </w:r>
+      <w:proofErr w:type="spellEnd"/>
       <w:r>
         <w:rPr>
           <w:rFonts w:eastAsia="Times New Roman"/>
@@ -1094,7 +3318,35 @@
         <w:rPr>
           <w:rFonts w:eastAsia="Times New Roman"/>
         </w:rPr>
-        <w:t>get viewTickets(ticketID) → ticket</w:t>
+        <w:t xml:space="preserve">get </w:t>
+      </w:r>
+      <w:proofErr w:type="spellStart"/>
+      <w:r>
+        <w:rPr>
+          <w:rFonts w:eastAsia="Times New Roman"/>
+        </w:rPr>
+        <w:t>viewTickets</w:t>
+      </w:r>
+      <w:proofErr w:type="spellEnd"/>
+      <w:r>
+        <w:rPr>
+          <w:rFonts w:eastAsia="Times New Roman"/>
+        </w:rPr>
+        <w:t>(</w:t>
+      </w:r>
+      <w:proofErr w:type="spellStart"/>
+      <w:r>
+        <w:rPr>
+          <w:rFonts w:eastAsia="Times New Roman"/>
+        </w:rPr>
+        <w:t>ticketID</w:t>
+      </w:r>
+      <w:proofErr w:type="spellEnd"/>
+      <w:r>
+        <w:rPr>
+          <w:rFonts w:eastAsia="Times New Roman"/>
+        </w:rPr>
+        <w:t>) → ticket</w:t>
       </w:r>
     </w:p>
     <w:p>
@@ -1108,7 +3360,61 @@
         <w:rPr>
           <w:rFonts w:eastAsia="Times New Roman"/>
         </w:rPr>
-        <w:t>post updateTicketStatus(ticketID, statusCode)</w:t>
+        <w:t>p</w:t>
+      </w:r>
+      <w:r>
+        <w:rPr>
+          <w:rFonts w:eastAsia="Times New Roman"/>
+        </w:rPr>
+        <w:t>u</w:t>
+      </w:r>
+      <w:r>
+        <w:rPr>
+          <w:rFonts w:eastAsia="Times New Roman"/>
+        </w:rPr>
+        <w:t xml:space="preserve">t </w:t>
+      </w:r>
+      <w:proofErr w:type="spellStart"/>
+      <w:r>
+        <w:rPr>
+          <w:rFonts w:eastAsia="Times New Roman"/>
+        </w:rPr>
+        <w:t>updateTicketStatus</w:t>
+      </w:r>
+      <w:proofErr w:type="spellEnd"/>
+      <w:r>
+        <w:rPr>
+          <w:rFonts w:eastAsia="Times New Roman"/>
+        </w:rPr>
+        <w:t>(</w:t>
+      </w:r>
+      <w:proofErr w:type="spellStart"/>
+      <w:r>
+        <w:rPr>
+          <w:rFonts w:eastAsia="Times New Roman"/>
+        </w:rPr>
+        <w:t>ticketID</w:t>
+      </w:r>
+      <w:proofErr w:type="spellEnd"/>
+      <w:r>
+        <w:rPr>
+          <w:rFonts w:eastAsia="Times New Roman"/>
+        </w:rPr>
+        <w:t xml:space="preserve">, </w:t>
+      </w:r>
+      <w:proofErr w:type="spellStart"/>
+      <w:r>
+        <w:rPr>
+          <w:rFonts w:eastAsia="Times New Roman"/>
+        </w:rPr>
+        <w:t>statusCode</w:t>
+      </w:r>
+      <w:proofErr w:type="spellEnd"/>
+      <w:r>
+        <w:rPr>
+          <w:rFonts w:eastAsia="Times New Roman"/>
+        </w:rPr>
+        <w:t>)</w:t>
       </w:r>
     </w:p>
     <w:p>
@@ -1122,21 +3428,118 @@
         <w:rPr>
           <w:rFonts w:eastAsia="Times New Roman"/>
         </w:rPr>
-        <w:lastRenderedPageBreak/>
-        <w:t>post addComment(ticketID, attachedFile (Optional</w:t>
-      </w:r>
+        <w:t xml:space="preserve">post </w:t>
+      </w:r>
+      <w:proofErr w:type="spellStart"/>
+      <w:r>
+        <w:rPr>
+          <w:rFonts w:eastAsia="Times New Roman"/>
+        </w:rPr>
+        <w:t>addAssignee</w:t>
+      </w:r>
+      <w:proofErr w:type="spellEnd"/>
+      <w:r>
+        <w:rPr>
+          <w:rFonts w:eastAsia="Times New Roman"/>
+        </w:rPr>
+        <w:t>(</w:t>
+      </w:r>
+      <w:proofErr w:type="spellStart"/>
+      <w:r>
+        <w:rPr>
+          <w:rFonts w:eastAsia="Times New Roman"/>
+        </w:rPr>
+        <w:t>ticketID</w:t>
+      </w:r>
+      <w:proofErr w:type="spellEnd"/>
+      <w:r>
+        <w:rPr>
+          <w:rFonts w:eastAsia="Times New Roman"/>
+        </w:rPr>
+        <w:t xml:space="preserve">, </w:t>
+      </w:r>
+      <w:proofErr w:type="spellStart"/>
+      <w:r>
+        <w:rPr>
+          <w:rFonts w:eastAsia="Times New Roman"/>
+        </w:rPr>
+        <w:t>userID</w:t>
+      </w:r>
+      <w:proofErr w:type="spellEnd"/>
       <w:r>
         <w:rPr>
           <w:rFonts w:eastAsia="Times New Roman"/>
         </w:rPr>
         <w:t>)</w:t>
       </w:r>
+    </w:p>
+    <w:p>
+      <w:pPr>
+        <w:spacing w:beforeAutospacing="1" w:afterAutospacing="1"/>
+        <w:rPr>
+          <w:rFonts w:eastAsia="Times New Roman"/>
+        </w:rPr>
+      </w:pPr>
+      <w:r>
+        <w:rPr>
+          <w:rFonts w:eastAsia="Times New Roman"/>
+        </w:rPr>
+        <w:t xml:space="preserve">post </w:t>
+      </w:r>
+      <w:proofErr w:type="spellStart"/>
+      <w:r>
+        <w:rPr>
+          <w:rFonts w:eastAsia="Times New Roman"/>
+        </w:rPr>
+        <w:t>addComment</w:t>
+      </w:r>
+      <w:proofErr w:type="spellEnd"/>
+      <w:r>
+        <w:rPr>
+          <w:rFonts w:eastAsia="Times New Roman"/>
+        </w:rPr>
+        <w:t>(</w:t>
+      </w:r>
+      <w:proofErr w:type="spellStart"/>
+      <w:r>
+        <w:rPr>
+          <w:rFonts w:eastAsia="Times New Roman"/>
+        </w:rPr>
+        <w:t>ticketID</w:t>
+      </w:r>
+      <w:proofErr w:type="spellEnd"/>
+      <w:r>
+        <w:rPr>
+          <w:rFonts w:eastAsia="Times New Roman"/>
+        </w:rPr>
+        <w:t xml:space="preserve">, </w:t>
+      </w:r>
+      <w:proofErr w:type="spellStart"/>
+      <w:r>
+        <w:rPr>
+          <w:rFonts w:eastAsia="Times New Roman"/>
+        </w:rPr>
+        <w:t>attachedFile</w:t>
+      </w:r>
+      <w:proofErr w:type="spellEnd"/>
+      <w:r>
+        <w:rPr>
+          <w:rFonts w:eastAsia="Times New Roman"/>
+        </w:rPr>
+        <w:t xml:space="preserve"> (Optional</w:t>
+      </w:r>
       <w:r>
         <w:rPr>
           <w:rFonts w:eastAsia="Times New Roman"/>
         </w:rPr>
         <w:t>)</w:t>
       </w:r>
+      <w:r>
+        <w:rPr>
+          <w:rFonts w:eastAsia="Times New Roman"/>
+        </w:rPr>
+        <w:t>)</w:t>
+      </w:r>
     </w:p>
     <w:p>
       <w:pPr>
@@ -1149,7 +3552,21 @@
         <w:rPr>
           <w:rFonts w:eastAsia="Times New Roman"/>
         </w:rPr>
-        <w:t>post addAccount(username, passwor</w:t>
+        <w:t xml:space="preserve">post </w:t>
+      </w:r>
+      <w:proofErr w:type="spellStart"/>
+      <w:r>
+        <w:rPr>
+          <w:rFonts w:eastAsia="Times New Roman"/>
+        </w:rPr>
+        <w:t>addAccount</w:t>
+      </w:r>
+      <w:proofErr w:type="spellEnd"/>
+      <w:r>
+        <w:rPr>
+          <w:rFonts w:eastAsia="Times New Roman"/>
+        </w:rPr>
+        <w:t>(username, passwor</w:t>
       </w:r>
       <w:r>
         <w:rPr>
@@ -1175,8 +3592,16 @@
         <w:rPr>
           <w:rFonts w:eastAsia="Times New Roman"/>
         </w:rPr>
-        <w:t>get getOwnAccount</w:t>
-      </w:r>
+        <w:t xml:space="preserve">get </w:t>
+      </w:r>
+      <w:proofErr w:type="spellStart"/>
+      <w:r>
+        <w:rPr>
+          <w:rFonts w:eastAsia="Times New Roman"/>
+        </w:rPr>
+        <w:t>getAccount</w:t>
+      </w:r>
+      <w:proofErr w:type="spellEnd"/>
       <w:r>
         <w:rPr>
           <w:rFonts w:eastAsia="Times New Roman"/>
@@ -1187,6 +3612,12 @@
         <w:rPr>
           <w:rFonts w:eastAsia="Times New Roman"/>
         </w:rPr>
+        <w:t>username</w:t>
+      </w:r>
+      <w:r>
+        <w:rPr>
+          <w:rFonts w:eastAsia="Times New Roman"/>
+        </w:rPr>
         <w:t>)</w:t>
       </w:r>
     </w:p>
@@ -1201,14 +3632,412 @@
         <w:rPr>
           <w:rFonts w:eastAsia="Times New Roman"/>
         </w:rPr>
-        <w:t>get getAccounts</w:t>
-      </w:r>
+        <w:t>p</w:t>
+      </w:r>
+      <w:r>
+        <w:rPr>
+          <w:rFonts w:eastAsia="Times New Roman"/>
+        </w:rPr>
+        <w:t>ut</w:t>
+      </w:r>
+      <w:r>
+        <w:rPr>
+          <w:rFonts w:eastAsia="Times New Roman"/>
+        </w:rPr>
+        <w:t xml:space="preserve"> </w:t>
+      </w:r>
+      <w:proofErr w:type="spellStart"/>
+      <w:r>
+        <w:rPr>
+          <w:rFonts w:eastAsia="Times New Roman"/>
+        </w:rPr>
+        <w:t>change</w:t>
+      </w:r>
+      <w:r>
+        <w:rPr>
+          <w:rFonts w:eastAsia="Times New Roman"/>
+        </w:rPr>
+        <w:t>User</w:t>
+      </w:r>
+      <w:r>
+        <w:rPr>
+          <w:rFonts w:eastAsia="Times New Roman"/>
+        </w:rPr>
+        <w:t>Password</w:t>
+      </w:r>
+      <w:proofErr w:type="spellEnd"/>
+      <w:r>
+        <w:rPr>
+          <w:rFonts w:eastAsia="Times New Roman"/>
+        </w:rPr>
+        <w:t xml:space="preserve">(password, </w:t>
+      </w:r>
+      <w:proofErr w:type="spellStart"/>
+      <w:r>
+        <w:rPr>
+          <w:rFonts w:eastAsia="Times New Roman"/>
+        </w:rPr>
+        <w:t>newPassword</w:t>
+      </w:r>
+      <w:proofErr w:type="spellEnd"/>
+      <w:r>
+        <w:rPr>
+          <w:rFonts w:eastAsia="Times New Roman"/>
+        </w:rPr>
+        <w:t>)</w:t>
+      </w:r>
+      <w:r>
+        <w:rPr>
+          <w:rFonts w:eastAsia="Times New Roman"/>
+        </w:rPr>
+        <w:t xml:space="preserve"> /</w:t>
+      </w:r>
+      <w:proofErr w:type="spellStart"/>
+      <w:r>
+        <w:rPr>
+          <w:rFonts w:eastAsia="Times New Roman"/>
+        </w:rPr>
+        <w:t>api</w:t>
+      </w:r>
+      <w:proofErr w:type="spellEnd"/>
+      <w:r>
+        <w:rPr>
+          <w:rFonts w:eastAsia="Times New Roman"/>
+        </w:rPr>
+        <w:t>/user/password</w:t>
+      </w:r>
+    </w:p>
+    <w:p>
+      <w:pPr>
+        <w:spacing w:beforeAutospacing="1" w:afterAutospacing="1"/>
+        <w:rPr>
+          <w:rFonts w:eastAsia="Times New Roman"/>
+        </w:rPr>
+      </w:pPr>
+      <w:r>
+        <w:rPr>
+          <w:rFonts w:eastAsia="Times New Roman"/>
+        </w:rPr>
+        <w:t xml:space="preserve">put </w:t>
+      </w:r>
+      <w:proofErr w:type="spellStart"/>
+      <w:r>
+        <w:rPr>
+          <w:rFonts w:eastAsia="Times New Roman"/>
+        </w:rPr>
+        <w:t>changeUserPassword</w:t>
+      </w:r>
+      <w:proofErr w:type="spellEnd"/>
       <w:r>
         <w:rPr>
           <w:rFonts w:eastAsia="Times New Roman"/>
         </w:rPr>
         <w:t>(</w:t>
       </w:r>
+      <w:proofErr w:type="spellStart"/>
+      <w:r>
+        <w:rPr>
+          <w:rFonts w:eastAsia="Times New Roman"/>
+        </w:rPr>
+        <w:t>newPassword</w:t>
+      </w:r>
+      <w:proofErr w:type="spellEnd"/>
+      <w:r>
+        <w:rPr>
+          <w:rFonts w:eastAsia="Times New Roman"/>
+        </w:rPr>
+        <w:t>) /</w:t>
+      </w:r>
+      <w:proofErr w:type="spellStart"/>
+      <w:r>
+        <w:rPr>
+          <w:rFonts w:eastAsia="Times New Roman"/>
+        </w:rPr>
+        <w:t>api</w:t>
+      </w:r>
+      <w:proofErr w:type="spellEnd"/>
+      <w:r>
+        <w:rPr>
+          <w:rFonts w:eastAsia="Times New Roman"/>
+        </w:rPr>
+        <w:t>/</w:t>
+      </w:r>
+      <w:r>
+        <w:rPr>
+          <w:rFonts w:eastAsia="Times New Roman"/>
+        </w:rPr>
+        <w:t>{</w:t>
+      </w:r>
+      <w:proofErr w:type="spellStart"/>
+      <w:r>
+        <w:rPr>
+          <w:rFonts w:eastAsia="Times New Roman"/>
+        </w:rPr>
+        <w:t>userID</w:t>
+      </w:r>
+      <w:proofErr w:type="spellEnd"/>
+      <w:r>
+        <w:rPr>
+          <w:rFonts w:eastAsia="Times New Roman"/>
+        </w:rPr>
+        <w:t>}/password (API for admin only)</w:t>
+      </w:r>
+    </w:p>
+    <w:p>
+      <w:pPr>
+        <w:spacing w:beforeAutospacing="1" w:afterAutospacing="1"/>
+        <w:rPr>
+          <w:rFonts w:eastAsia="Times New Roman"/>
+        </w:rPr>
+      </w:pPr>
+      <w:r>
+        <w:rPr>
+          <w:rFonts w:eastAsia="Times New Roman"/>
+        </w:rPr>
+        <w:t>p</w:t>
+      </w:r>
+      <w:r>
+        <w:rPr>
+          <w:rFonts w:eastAsia="Times New Roman"/>
+        </w:rPr>
+        <w:t>ut</w:t>
+      </w:r>
+      <w:r>
+        <w:rPr>
+          <w:rFonts w:eastAsia="Times New Roman"/>
+        </w:rPr>
+        <w:t xml:space="preserve"> </w:t>
+      </w:r>
+      <w:proofErr w:type="spellStart"/>
+      <w:r>
+        <w:rPr>
+          <w:rFonts w:eastAsia="Times New Roman"/>
+        </w:rPr>
+        <w:t>changeDepartment</w:t>
+      </w:r>
+      <w:proofErr w:type="spellEnd"/>
+      <w:r>
+        <w:rPr>
+          <w:rFonts w:eastAsia="Times New Roman"/>
+        </w:rPr>
+        <w:t>(</w:t>
+      </w:r>
+      <w:proofErr w:type="spellStart"/>
+      <w:r>
+        <w:rPr>
+          <w:rFonts w:eastAsia="Times New Roman"/>
+        </w:rPr>
+        <w:t>userID</w:t>
+      </w:r>
+      <w:proofErr w:type="spellEnd"/>
+      <w:r>
+        <w:rPr>
+          <w:rFonts w:eastAsia="Times New Roman"/>
+        </w:rPr>
+        <w:t>, department)</w:t>
+      </w:r>
+    </w:p>
+    <w:p>
+      <w:pPr>
+        <w:spacing w:beforeAutospacing="1" w:afterAutospacing="1"/>
+        <w:rPr>
+          <w:rFonts w:eastAsia="Times New Roman"/>
+        </w:rPr>
+      </w:pPr>
+      <w:r>
+        <w:rPr>
+          <w:rFonts w:eastAsia="Times New Roman"/>
+        </w:rPr>
+        <w:t xml:space="preserve">delete </w:t>
+      </w:r>
+      <w:proofErr w:type="spellStart"/>
+      <w:r>
+        <w:rPr>
+          <w:rFonts w:eastAsia="Times New Roman"/>
+        </w:rPr>
+        <w:t>deleteAccount</w:t>
+      </w:r>
+      <w:proofErr w:type="spellEnd"/>
+      <w:r>
+        <w:rPr>
+          <w:rFonts w:eastAsia="Times New Roman"/>
+        </w:rPr>
+        <w:t>(</w:t>
+      </w:r>
+      <w:proofErr w:type="spellStart"/>
+      <w:r>
+        <w:rPr>
+          <w:rFonts w:eastAsia="Times New Roman"/>
+        </w:rPr>
+        <w:t>userID</w:t>
+      </w:r>
+      <w:proofErr w:type="spellEnd"/>
+      <w:r>
+        <w:rPr>
+          <w:rFonts w:eastAsia="Times New Roman"/>
+        </w:rPr>
+        <w:t xml:space="preserve">) </w:t>
+      </w:r>
+    </w:p>
+    <w:p>
+      <w:pPr>
+        <w:spacing w:beforeAutospacing="1" w:afterAutospacing="1"/>
+        <w:rPr>
+          <w:rFonts w:eastAsia="Times New Roman"/>
+        </w:rPr>
+      </w:pPr>
+      <w:r>
+        <w:rPr>
+          <w:rFonts w:eastAsia="Times New Roman"/>
+        </w:rPr>
+        <w:t xml:space="preserve">get </w:t>
+      </w:r>
+      <w:proofErr w:type="spellStart"/>
+      <w:r>
+        <w:rPr>
+          <w:rFonts w:eastAsia="Times New Roman"/>
+        </w:rPr>
+        <w:t>getPriorities</w:t>
+      </w:r>
+      <w:proofErr w:type="spellEnd"/>
+      <w:r>
+        <w:rPr>
+          <w:rFonts w:eastAsia="Times New Roman"/>
+        </w:rPr>
+        <w:t>()</w:t>
+      </w:r>
+    </w:p>
+    <w:p>
+      <w:pPr>
+        <w:spacing w:beforeAutospacing="1" w:afterAutospacing="1"/>
+        <w:rPr>
+          <w:rFonts w:eastAsia="Times New Roman"/>
+        </w:rPr>
+      </w:pPr>
+      <w:r>
+        <w:rPr>
+          <w:rFonts w:eastAsia="Times New Roman"/>
+        </w:rPr>
+        <w:t>p</w:t>
+      </w:r>
+      <w:r>
+        <w:rPr>
+          <w:rFonts w:eastAsia="Times New Roman"/>
+        </w:rPr>
+        <w:t>ut</w:t>
+      </w:r>
+      <w:r>
+        <w:rPr>
+          <w:rFonts w:eastAsia="Times New Roman"/>
+        </w:rPr>
+        <w:t xml:space="preserve"> </w:t>
+      </w:r>
+      <w:proofErr w:type="spellStart"/>
+      <w:r>
+        <w:rPr>
+          <w:rFonts w:eastAsia="Times New Roman"/>
+        </w:rPr>
+        <w:t>changePriority</w:t>
+      </w:r>
+      <w:proofErr w:type="spellEnd"/>
+      <w:r>
+        <w:rPr>
+          <w:rFonts w:eastAsia="Times New Roman"/>
+        </w:rPr>
+        <w:t>(</w:t>
+      </w:r>
+      <w:proofErr w:type="spellStart"/>
+      <w:r>
+        <w:rPr>
+          <w:rFonts w:eastAsia="Times New Roman"/>
+        </w:rPr>
+        <w:t>priorityID</w:t>
+      </w:r>
+      <w:proofErr w:type="spellEnd"/>
+      <w:r>
+        <w:rPr>
+          <w:rFonts w:eastAsia="Times New Roman"/>
+        </w:rPr>
+        <w:t xml:space="preserve">, </w:t>
+      </w:r>
+      <w:proofErr w:type="spellStart"/>
+      <w:r>
+        <w:rPr>
+          <w:rFonts w:eastAsia="Times New Roman"/>
+        </w:rPr>
+        <w:t>levelOfPriority</w:t>
+      </w:r>
+      <w:proofErr w:type="spellEnd"/>
+      <w:r>
+        <w:rPr>
+          <w:rFonts w:eastAsia="Times New Roman"/>
+        </w:rPr>
+        <w:t xml:space="preserve">(int), name, </w:t>
+      </w:r>
+      <w:proofErr w:type="spellStart"/>
+      <w:r>
+        <w:rPr>
+          <w:rFonts w:eastAsia="Times New Roman"/>
+        </w:rPr>
+        <w:t>timeToRespond</w:t>
+      </w:r>
+      <w:proofErr w:type="spellEnd"/>
+      <w:r>
+        <w:rPr>
+          <w:rFonts w:eastAsia="Times New Roman"/>
+        </w:rPr>
+        <w:t xml:space="preserve">, </w:t>
+      </w:r>
+      <w:proofErr w:type="spellStart"/>
+      <w:r>
+        <w:rPr>
+          <w:rFonts w:eastAsia="Times New Roman"/>
+        </w:rPr>
+        <w:t>timeToFinish</w:t>
+      </w:r>
+      <w:proofErr w:type="spellEnd"/>
+      <w:r>
+        <w:rPr>
+          <w:rFonts w:eastAsia="Times New Roman"/>
+        </w:rPr>
+        <w:t xml:space="preserve">) </w:t>
+      </w:r>
+    </w:p>
+    <w:p>
+      <w:pPr>
+        <w:spacing w:beforeAutospacing="1" w:afterAutospacing="1"/>
+        <w:rPr>
+          <w:rFonts w:eastAsia="Times New Roman"/>
+        </w:rPr>
+      </w:pPr>
+      <w:r>
+        <w:rPr>
+          <w:rFonts w:eastAsia="Times New Roman"/>
+        </w:rPr>
+        <w:t xml:space="preserve">delete </w:t>
+      </w:r>
+      <w:proofErr w:type="spellStart"/>
+      <w:r>
+        <w:rPr>
+          <w:rFonts w:eastAsia="Times New Roman"/>
+        </w:rPr>
+        <w:t>deletePriorities</w:t>
+      </w:r>
+      <w:proofErr w:type="spellEnd"/>
+      <w:r>
+        <w:rPr>
+          <w:rFonts w:eastAsia="Times New Roman"/>
+        </w:rPr>
+        <w:t>(</w:t>
+      </w:r>
+      <w:proofErr w:type="spellStart"/>
+      <w:r>
+        <w:rPr>
+          <w:rFonts w:eastAsia="Times New Roman"/>
+        </w:rPr>
+        <w:t>priorityID</w:t>
+      </w:r>
+      <w:proofErr w:type="spellEnd"/>
       <w:r>
         <w:rPr>
           <w:rFonts w:eastAsia="Times New Roman"/>
@@ -1223,12 +4052,6 @@
           <w:rFonts w:eastAsia="Times New Roman"/>
         </w:rPr>
       </w:pPr>
-      <w:r>
-        <w:rPr>
-          <w:rFonts w:eastAsia="Times New Roman"/>
-        </w:rPr>
-        <w:t>post changePassword(userID, password, newPassword)</w:t>
-      </w:r>
     </w:p>
     <w:p>
       <w:pPr>
@@ -1241,7 +4064,7 @@
         <w:rPr>
           <w:rFonts w:eastAsia="Times New Roman"/>
         </w:rPr>
-        <w:t>post changeDepartment(userID, department)</w:t>
+        <w:t xml:space="preserve">get ticket repository </w:t>
       </w:r>
     </w:p>
     <w:p>
@@ -1251,11 +4074,103 @@
           <w:rFonts w:eastAsia="Times New Roman"/>
         </w:rPr>
       </w:pPr>
-      <w:r>
-        <w:rPr>
-          <w:rFonts w:eastAsia="Times New Roman"/>
-        </w:rPr>
-        <w:t>delete deleteAccount(userID)</w:t>
+      <w:proofErr w:type="spellStart"/>
+      <w:r>
+        <w:rPr>
+          <w:rFonts w:eastAsia="Times New Roman"/>
+        </w:rPr>
+        <w:t>tao</w:t>
+      </w:r>
+      <w:proofErr w:type="spellEnd"/>
+      <w:r>
+        <w:rPr>
+          <w:rFonts w:eastAsia="Times New Roman"/>
+        </w:rPr>
+        <w:t xml:space="preserve"> mot filter </w:t>
+      </w:r>
+      <w:proofErr w:type="spellStart"/>
+      <w:r>
+        <w:rPr>
+          <w:rFonts w:eastAsia="Times New Roman"/>
+        </w:rPr>
+        <w:t>kiem</w:t>
+      </w:r>
+      <w:proofErr w:type="spellEnd"/>
+      <w:r>
+        <w:rPr>
+          <w:rFonts w:eastAsia="Times New Roman"/>
+        </w:rPr>
+        <w:t xml:space="preserve"> </w:t>
+      </w:r>
+      <w:proofErr w:type="spellStart"/>
+      <w:r>
+        <w:rPr>
+          <w:rFonts w:eastAsia="Times New Roman"/>
+        </w:rPr>
+        <w:t>tra</w:t>
+      </w:r>
+      <w:proofErr w:type="spellEnd"/>
+      <w:r>
+        <w:rPr>
+          <w:rFonts w:eastAsia="Times New Roman"/>
+        </w:rPr>
+        <w:t xml:space="preserve"> </w:t>
+      </w:r>
+      <w:proofErr w:type="spellStart"/>
+      <w:r>
+        <w:rPr>
+          <w:rFonts w:eastAsia="Times New Roman"/>
+        </w:rPr>
+        <w:t>jwt</w:t>
+      </w:r>
+      <w:proofErr w:type="spellEnd"/>
+      <w:r>
+        <w:rPr>
+          <w:rFonts w:eastAsia="Times New Roman"/>
+        </w:rPr>
+        <w:t xml:space="preserve"> </w:t>
+      </w:r>
+      <w:proofErr w:type="spellStart"/>
+      <w:r>
+        <w:rPr>
+          <w:rFonts w:eastAsia="Times New Roman"/>
+        </w:rPr>
+        <w:t>cho</w:t>
+      </w:r>
+      <w:proofErr w:type="spellEnd"/>
+      <w:r>
+        <w:rPr>
+          <w:rFonts w:eastAsia="Times New Roman"/>
+        </w:rPr>
+        <w:t xml:space="preserve"> </w:t>
+      </w:r>
+      <w:proofErr w:type="spellStart"/>
+      <w:r>
+        <w:rPr>
+          <w:rFonts w:eastAsia="Times New Roman"/>
+        </w:rPr>
+        <w:t>quyen</w:t>
+      </w:r>
+      <w:proofErr w:type="spellEnd"/>
+      <w:r>
+        <w:rPr>
+          <w:rFonts w:eastAsia="Times New Roman"/>
+        </w:rPr>
+        <w:t xml:space="preserve"> </w:t>
+      </w:r>
+      <w:proofErr w:type="spellStart"/>
+      <w:r>
+        <w:rPr>
+          <w:rFonts w:eastAsia="Times New Roman"/>
+        </w:rPr>
+        <w:t>xem</w:t>
+      </w:r>
+      <w:proofErr w:type="spellEnd"/>
+      <w:r>
+        <w:rPr>
+          <w:rFonts w:eastAsia="Times New Roman"/>
+        </w:rPr>
+        <w:t xml:space="preserve"> ticket id</w:t>
       </w:r>
     </w:p>
     <w:p>
@@ -1265,24 +4180,6 @@
           <w:rFonts w:eastAsia="Times New Roman"/>
         </w:rPr>
       </w:pPr>
-      <w:r>
-        <w:rPr>
-          <w:rFonts w:eastAsia="Times New Roman"/>
-        </w:rPr>
-        <w:t>post addPriority(levelOfPriority(int), name, timeToRespond, timeToFinis</w:t>
-      </w:r>
-      <w:r>
-        <w:rPr>
-          <w:rFonts w:eastAsia="Times New Roman"/>
-        </w:rPr>
-        <w:t>h</w:t>
-      </w:r>
-      <w:r>
-        <w:rPr>
-          <w:rFonts w:eastAsia="Times New Roman"/>
-        </w:rPr>
-        <w:t xml:space="preserve">) </w:t>
-      </w:r>
     </w:p>
     <w:p>
       <w:pPr>
@@ -1295,93 +4192,21 @@
         <w:rPr>
           <w:rFonts w:eastAsia="Times New Roman"/>
         </w:rPr>
-        <w:t>get getPriorities()</w:t>
-      </w:r>
-    </w:p>
-    <w:p>
-      <w:pPr>
-        <w:spacing w:beforeAutospacing="1" w:afterAutospacing="1"/>
-        <w:rPr>
-          <w:rFonts w:eastAsia="Times New Roman"/>
-        </w:rPr>
-      </w:pPr>
-      <w:r>
-        <w:rPr>
-          <w:rFonts w:eastAsia="Times New Roman"/>
-        </w:rPr>
-        <w:t xml:space="preserve">post changePriority(priorityID, levelOfPriority(int), name, timeToRespond, timeToFinish) </w:t>
-      </w:r>
-    </w:p>
-    <w:p>
-      <w:pPr>
-        <w:spacing w:beforeAutospacing="1" w:afterAutospacing="1"/>
-        <w:rPr>
-          <w:rFonts w:eastAsia="Times New Roman"/>
-        </w:rPr>
-      </w:pPr>
-      <w:r>
-        <w:rPr>
-          <w:rFonts w:eastAsia="Times New Roman"/>
-        </w:rPr>
-        <w:t>delete deletePriorities(priorityID)</w:t>
-      </w:r>
-    </w:p>
-    <w:p>
-      <w:pPr>
-        <w:spacing w:beforeAutospacing="1" w:afterAutospacing="1"/>
-        <w:rPr>
-          <w:rFonts w:eastAsia="Times New Roman"/>
-        </w:rPr>
-      </w:pPr>
-    </w:p>
-    <w:p>
-      <w:pPr>
-        <w:spacing w:beforeAutospacing="1" w:afterAutospacing="1"/>
-        <w:rPr>
-          <w:rFonts w:eastAsia="Times New Roman"/>
-        </w:rPr>
-      </w:pPr>
-      <w:r>
-        <w:rPr>
-          <w:rFonts w:eastAsia="Times New Roman"/>
-        </w:rPr>
-        <w:t xml:space="preserve">get ticket repository </w:t>
-      </w:r>
-    </w:p>
-    <w:p>
-      <w:pPr>
-        <w:spacing w:beforeAutospacing="1" w:afterAutospacing="1"/>
-        <w:rPr>
-          <w:rFonts w:eastAsia="Times New Roman"/>
-        </w:rPr>
-      </w:pPr>
-      <w:r>
-        <w:rPr>
-          <w:rFonts w:eastAsia="Times New Roman"/>
-        </w:rPr>
-        <w:t>tao mot filter kiem tra jwt cho quyen xem ticket id</w:t>
-      </w:r>
-    </w:p>
-    <w:p>
-      <w:pPr>
-        <w:spacing w:beforeAutospacing="1" w:afterAutospacing="1"/>
-        <w:rPr>
-          <w:rFonts w:eastAsia="Times New Roman"/>
-        </w:rPr>
-      </w:pPr>
-    </w:p>
-    <w:p>
-      <w:pPr>
-        <w:spacing w:beforeAutospacing="1" w:afterAutospacing="1"/>
-        <w:rPr>
-          <w:rFonts w:eastAsia="Times New Roman"/>
-        </w:rPr>
-      </w:pPr>
-      <w:r>
-        <w:rPr>
-          <w:rFonts w:eastAsia="Times New Roman"/>
-        </w:rPr>
-        <w:t>beware of xss attack</w:t>
+        <w:t xml:space="preserve">beware of </w:t>
+      </w:r>
+      <w:proofErr w:type="spellStart"/>
+      <w:r>
+        <w:rPr>
+          <w:rFonts w:eastAsia="Times New Roman"/>
+        </w:rPr>
+        <w:t>xss</w:t>
+      </w:r>
+      <w:proofErr w:type="spellEnd"/>
+      <w:r>
+        <w:rPr>
+          <w:rFonts w:eastAsia="Times New Roman"/>
+        </w:rPr>
+        <w:t xml:space="preserve"> attack</w:t>
       </w:r>
     </w:p>
     <w:p>
@@ -1396,11 +4221,19 @@
           <w:rFonts w:eastAsia="Times New Roman"/>
         </w:rPr>
       </w:pPr>
-      <w:r>
-        <w:rPr>
-          <w:rFonts w:eastAsia="Times New Roman"/>
-        </w:rPr>
-        <w:t>SameSite=Strict, Secure</w:t>
+      <w:proofErr w:type="spellStart"/>
+      <w:r>
+        <w:rPr>
+          <w:rFonts w:eastAsia="Times New Roman"/>
+        </w:rPr>
+        <w:t>SameSite</w:t>
+      </w:r>
+      <w:proofErr w:type="spellEnd"/>
+      <w:r>
+        <w:rPr>
+          <w:rFonts w:eastAsia="Times New Roman"/>
+        </w:rPr>
+        <w:t>=Strict, Secure</w:t>
       </w:r>
     </w:p>
     <w:p>
@@ -1438,7 +4271,49 @@
         <w:rPr>
           <w:rFonts w:eastAsia="Times New Roman"/>
         </w:rPr>
-        <w:t xml:space="preserve">use { } of jsx or data set by useState not innerHTML </w:t>
+        <w:t xml:space="preserve">use { } of </w:t>
+      </w:r>
+      <w:proofErr w:type="spellStart"/>
+      <w:r>
+        <w:rPr>
+          <w:rFonts w:eastAsia="Times New Roman"/>
+        </w:rPr>
+        <w:t>jsx</w:t>
+      </w:r>
+      <w:proofErr w:type="spellEnd"/>
+      <w:r>
+        <w:rPr>
+          <w:rFonts w:eastAsia="Times New Roman"/>
+        </w:rPr>
+        <w:t xml:space="preserve"> or data set by </w:t>
+      </w:r>
+      <w:proofErr w:type="spellStart"/>
+      <w:r>
+        <w:rPr>
+          <w:rFonts w:eastAsia="Times New Roman"/>
+        </w:rPr>
+        <w:t>useState</w:t>
+      </w:r>
+      <w:proofErr w:type="spellEnd"/>
+      <w:r>
+        <w:rPr>
+          <w:rFonts w:eastAsia="Times New Roman"/>
+        </w:rPr>
+        <w:t xml:space="preserve"> not </w:t>
+      </w:r>
+      <w:proofErr w:type="spellStart"/>
+      <w:r>
+        <w:rPr>
+          <w:rFonts w:eastAsia="Times New Roman"/>
+        </w:rPr>
+        <w:t>innerHTML</w:t>
+      </w:r>
+      <w:proofErr w:type="spellEnd"/>
+      <w:r>
+        <w:rPr>
+          <w:rFonts w:eastAsia="Times New Roman"/>
+        </w:rPr>
+        <w:t xml:space="preserve"> </w:t>
       </w:r>
     </w:p>
     <w:p>
@@ -1457,8 +4332,16 @@
         <w:rPr>
           <w:rFonts w:eastAsia="Times New Roman"/>
         </w:rPr>
-        <w:t>dangerous use of {} in href</w:t>
-      </w:r>
+        <w:t xml:space="preserve">dangerous use of {} in </w:t>
+      </w:r>
+      <w:proofErr w:type="spellStart"/>
+      <w:r>
+        <w:rPr>
+          <w:rFonts w:eastAsia="Times New Roman"/>
+        </w:rPr>
+        <w:t>href</w:t>
+      </w:r>
+      <w:proofErr w:type="spellEnd"/>
       <w:r>
         <w:rPr>
           <w:rFonts w:eastAsia="Times New Roman"/>
@@ -1476,6 +4359,7 @@
       <w:r>
         <w:rPr>
           <w:rFonts w:eastAsia="Times New Roman"/>
+          <w:noProof/>
         </w:rPr>
         <w:lastRenderedPageBreak/>
         <w:drawing>
@@ -1518,7 +4402,217 @@
         <w:rPr>
           <w:rFonts w:eastAsia="Times New Roman"/>
         </w:rPr>
-        <w:t>login form có username và mật khẩu cùng nút submit, không có nút quên mật khẩu và đăng kí.</w:t>
+        <w:t xml:space="preserve">login form </w:t>
+      </w:r>
+      <w:proofErr w:type="spellStart"/>
+      <w:r>
+        <w:rPr>
+          <w:rFonts w:eastAsia="Times New Roman"/>
+        </w:rPr>
+        <w:t>có</w:t>
+      </w:r>
+      <w:proofErr w:type="spellEnd"/>
+      <w:r>
+        <w:rPr>
+          <w:rFonts w:eastAsia="Times New Roman"/>
+        </w:rPr>
+        <w:t xml:space="preserve"> username </w:t>
+      </w:r>
+      <w:proofErr w:type="spellStart"/>
+      <w:r>
+        <w:rPr>
+          <w:rFonts w:eastAsia="Times New Roman"/>
+        </w:rPr>
+        <w:t>và</w:t>
+      </w:r>
+      <w:proofErr w:type="spellEnd"/>
+      <w:r>
+        <w:rPr>
+          <w:rFonts w:eastAsia="Times New Roman"/>
+        </w:rPr>
+        <w:t xml:space="preserve"> </w:t>
+      </w:r>
+      <w:proofErr w:type="spellStart"/>
+      <w:r>
+        <w:rPr>
+          <w:rFonts w:eastAsia="Times New Roman"/>
+        </w:rPr>
+        <w:t>mật</w:t>
+      </w:r>
+      <w:proofErr w:type="spellEnd"/>
+      <w:r>
+        <w:rPr>
+          <w:rFonts w:eastAsia="Times New Roman"/>
+        </w:rPr>
+        <w:t xml:space="preserve"> </w:t>
+      </w:r>
+      <w:proofErr w:type="spellStart"/>
+      <w:r>
+        <w:rPr>
+          <w:rFonts w:eastAsia="Times New Roman"/>
+        </w:rPr>
+        <w:t>khẩu</w:t>
+      </w:r>
+      <w:proofErr w:type="spellEnd"/>
+      <w:r>
+        <w:rPr>
+          <w:rFonts w:eastAsia="Times New Roman"/>
+        </w:rPr>
+        <w:t xml:space="preserve"> </w:t>
+      </w:r>
+      <w:proofErr w:type="spellStart"/>
+      <w:r>
+        <w:rPr>
+          <w:rFonts w:eastAsia="Times New Roman"/>
+        </w:rPr>
+        <w:t>cùng</w:t>
+      </w:r>
+      <w:proofErr w:type="spellEnd"/>
+      <w:r>
+        <w:rPr>
+          <w:rFonts w:eastAsia="Times New Roman"/>
+        </w:rPr>
+        <w:t xml:space="preserve"> </w:t>
+      </w:r>
+      <w:proofErr w:type="spellStart"/>
+      <w:r>
+        <w:rPr>
+          <w:rFonts w:eastAsia="Times New Roman"/>
+        </w:rPr>
+        <w:t>nút</w:t>
+      </w:r>
+      <w:proofErr w:type="spellEnd"/>
+      <w:r>
+        <w:rPr>
+          <w:rFonts w:eastAsia="Times New Roman"/>
+        </w:rPr>
+        <w:t xml:space="preserve"> submit, </w:t>
+      </w:r>
+      <w:proofErr w:type="spellStart"/>
+      <w:r>
+        <w:rPr>
+          <w:rFonts w:eastAsia="Times New Roman"/>
+        </w:rPr>
+        <w:t>không</w:t>
+      </w:r>
+      <w:proofErr w:type="spellEnd"/>
+      <w:r>
+        <w:rPr>
+          <w:rFonts w:eastAsia="Times New Roman"/>
+        </w:rPr>
+        <w:t xml:space="preserve"> </w:t>
+      </w:r>
+      <w:proofErr w:type="spellStart"/>
+      <w:r>
+        <w:rPr>
+          <w:rFonts w:eastAsia="Times New Roman"/>
+        </w:rPr>
+        <w:t>có</w:t>
+      </w:r>
+      <w:proofErr w:type="spellEnd"/>
+      <w:r>
+        <w:rPr>
+          <w:rFonts w:eastAsia="Times New Roman"/>
+        </w:rPr>
+        <w:t xml:space="preserve"> </w:t>
+      </w:r>
+      <w:proofErr w:type="spellStart"/>
+      <w:r>
+        <w:rPr>
+          <w:rFonts w:eastAsia="Times New Roman"/>
+        </w:rPr>
+        <w:t>nút</w:t>
+      </w:r>
+      <w:proofErr w:type="spellEnd"/>
+      <w:r>
+        <w:rPr>
+          <w:rFonts w:eastAsia="Times New Roman"/>
+        </w:rPr>
+        <w:t xml:space="preserve"> </w:t>
+      </w:r>
+      <w:proofErr w:type="spellStart"/>
+      <w:r>
+        <w:rPr>
+          <w:rFonts w:eastAsia="Times New Roman"/>
+        </w:rPr>
+        <w:t>quên</w:t>
+      </w:r>
+      <w:proofErr w:type="spellEnd"/>
+      <w:r>
+        <w:rPr>
+          <w:rFonts w:eastAsia="Times New Roman"/>
+        </w:rPr>
+        <w:t xml:space="preserve"> </w:t>
+      </w:r>
+      <w:proofErr w:type="spellStart"/>
+      <w:r>
+        <w:rPr>
+          <w:rFonts w:eastAsia="Times New Roman"/>
+        </w:rPr>
+        <w:t>mật</w:t>
+      </w:r>
+      <w:proofErr w:type="spellEnd"/>
+      <w:r>
+        <w:rPr>
+          <w:rFonts w:eastAsia="Times New Roman"/>
+        </w:rPr>
+        <w:t xml:space="preserve"> </w:t>
+      </w:r>
+      <w:proofErr w:type="spellStart"/>
+      <w:r>
+        <w:rPr>
+          <w:rFonts w:eastAsia="Times New Roman"/>
+        </w:rPr>
+        <w:t>khẩu</w:t>
+      </w:r>
+      <w:proofErr w:type="spellEnd"/>
+      <w:r>
+        <w:rPr>
+          <w:rFonts w:eastAsia="Times New Roman"/>
+        </w:rPr>
+        <w:t xml:space="preserve"> </w:t>
+      </w:r>
+      <w:proofErr w:type="spellStart"/>
+      <w:r>
+        <w:rPr>
+          <w:rFonts w:eastAsia="Times New Roman"/>
+        </w:rPr>
+        <w:t>và</w:t>
+      </w:r>
+      <w:proofErr w:type="spellEnd"/>
+      <w:r>
+        <w:rPr>
+          <w:rFonts w:eastAsia="Times New Roman"/>
+        </w:rPr>
+        <w:t xml:space="preserve"> </w:t>
+      </w:r>
+      <w:proofErr w:type="spellStart"/>
+      <w:r>
+        <w:rPr>
+          <w:rFonts w:eastAsia="Times New Roman"/>
+        </w:rPr>
+        <w:t>đăng</w:t>
+      </w:r>
+      <w:proofErr w:type="spellEnd"/>
+      <w:r>
+        <w:rPr>
+          <w:rFonts w:eastAsia="Times New Roman"/>
+        </w:rPr>
+        <w:t xml:space="preserve"> </w:t>
+      </w:r>
+      <w:proofErr w:type="spellStart"/>
+      <w:r>
+        <w:rPr>
+          <w:rFonts w:eastAsia="Times New Roman"/>
+        </w:rPr>
+        <w:t>kí</w:t>
+      </w:r>
+      <w:proofErr w:type="spellEnd"/>
+      <w:r>
+        <w:rPr>
+          <w:rFonts w:eastAsia="Times New Roman"/>
+        </w:rPr>
+        <w:t>.</w:t>
       </w:r>
     </w:p>
     <w:p>
@@ -1532,7 +4626,133 @@
         <w:rPr>
           <w:rFonts w:eastAsia="Times New Roman"/>
         </w:rPr>
-        <w:t xml:space="preserve">Sau khi đăng nhập nút đăng nhập sẽ thay bằng </w:t>
+        <w:t xml:space="preserve">Sau </w:t>
+      </w:r>
+      <w:proofErr w:type="spellStart"/>
+      <w:r>
+        <w:rPr>
+          <w:rFonts w:eastAsia="Times New Roman"/>
+        </w:rPr>
+        <w:t>khi</w:t>
+      </w:r>
+      <w:proofErr w:type="spellEnd"/>
+      <w:r>
+        <w:rPr>
+          <w:rFonts w:eastAsia="Times New Roman"/>
+        </w:rPr>
+        <w:t xml:space="preserve"> </w:t>
+      </w:r>
+      <w:proofErr w:type="spellStart"/>
+      <w:r>
+        <w:rPr>
+          <w:rFonts w:eastAsia="Times New Roman"/>
+        </w:rPr>
+        <w:t>đăng</w:t>
+      </w:r>
+      <w:proofErr w:type="spellEnd"/>
+      <w:r>
+        <w:rPr>
+          <w:rFonts w:eastAsia="Times New Roman"/>
+        </w:rPr>
+        <w:t xml:space="preserve"> </w:t>
+      </w:r>
+      <w:proofErr w:type="spellStart"/>
+      <w:r>
+        <w:rPr>
+          <w:rFonts w:eastAsia="Times New Roman"/>
+        </w:rPr>
+        <w:t>nhập</w:t>
+      </w:r>
+      <w:proofErr w:type="spellEnd"/>
+      <w:r>
+        <w:rPr>
+          <w:rFonts w:eastAsia="Times New Roman"/>
+        </w:rPr>
+        <w:t xml:space="preserve"> </w:t>
+      </w:r>
+      <w:proofErr w:type="spellStart"/>
+      <w:r>
+        <w:rPr>
+          <w:rFonts w:eastAsia="Times New Roman"/>
+        </w:rPr>
+        <w:t>nút</w:t>
+      </w:r>
+      <w:proofErr w:type="spellEnd"/>
+      <w:r>
+        <w:rPr>
+          <w:rFonts w:eastAsia="Times New Roman"/>
+        </w:rPr>
+        <w:t xml:space="preserve"> </w:t>
+      </w:r>
+      <w:proofErr w:type="spellStart"/>
+      <w:r>
+        <w:rPr>
+          <w:rFonts w:eastAsia="Times New Roman"/>
+        </w:rPr>
+        <w:t>đăng</w:t>
+      </w:r>
+      <w:proofErr w:type="spellEnd"/>
+      <w:r>
+        <w:rPr>
+          <w:rFonts w:eastAsia="Times New Roman"/>
+        </w:rPr>
+        <w:t xml:space="preserve"> </w:t>
+      </w:r>
+      <w:proofErr w:type="spellStart"/>
+      <w:r>
+        <w:rPr>
+          <w:rFonts w:eastAsia="Times New Roman"/>
+        </w:rPr>
+        <w:t>nhập</w:t>
+      </w:r>
+      <w:proofErr w:type="spellEnd"/>
+      <w:r>
+        <w:rPr>
+          <w:rFonts w:eastAsia="Times New Roman"/>
+        </w:rPr>
+        <w:t xml:space="preserve"> </w:t>
+      </w:r>
+      <w:proofErr w:type="spellStart"/>
+      <w:r>
+        <w:rPr>
+          <w:rFonts w:eastAsia="Times New Roman"/>
+        </w:rPr>
+        <w:t>sẽ</w:t>
+      </w:r>
+      <w:proofErr w:type="spellEnd"/>
+      <w:r>
+        <w:rPr>
+          <w:rFonts w:eastAsia="Times New Roman"/>
+        </w:rPr>
+        <w:t xml:space="preserve"> </w:t>
+      </w:r>
+      <w:proofErr w:type="spellStart"/>
+      <w:r>
+        <w:rPr>
+          <w:rFonts w:eastAsia="Times New Roman"/>
+        </w:rPr>
+        <w:t>thay</w:t>
+      </w:r>
+      <w:proofErr w:type="spellEnd"/>
+      <w:r>
+        <w:rPr>
+          <w:rFonts w:eastAsia="Times New Roman"/>
+        </w:rPr>
+        <w:t xml:space="preserve"> </w:t>
+      </w:r>
+      <w:proofErr w:type="spellStart"/>
+      <w:r>
+        <w:rPr>
+          <w:rFonts w:eastAsia="Times New Roman"/>
+        </w:rPr>
+        <w:t>bằng</w:t>
+      </w:r>
+      <w:proofErr w:type="spellEnd"/>
+      <w:r>
+        <w:rPr>
+          <w:rFonts w:eastAsia="Times New Roman"/>
+        </w:rPr>
+        <w:t xml:space="preserve"> </w:t>
       </w:r>
     </w:p>
     <w:sectPr>
@@ -2540,6 +5760,7 @@
   <w:style w:type="character" w:default="1" w:styleId="DefaultParagraphFont">
     <w:name w:val="Default Paragraph Font"/>
     <w:uiPriority w:val="1"/>
+    <w:semiHidden/>
     <w:unhideWhenUsed/>
   </w:style>
   <w:style w:type="table" w:default="1" w:styleId="TableNormal">

</xml_diff>

<commit_message>
Update specification on library usage
</commit_message>
<xml_diff>
--- a/specification_breakdown.docx
+++ b/specification_breakdown.docx
@@ -1053,7 +1053,21 @@
         <w:rPr>
           <w:rFonts w:eastAsia="Times New Roman"/>
         </w:rPr>
-        <w:t>post login(username, password)</w:t>
+        <w:t xml:space="preserve">post </w:t>
+      </w:r>
+      <w:proofErr w:type="gramStart"/>
+      <w:r>
+        <w:rPr>
+          <w:rFonts w:eastAsia="Times New Roman"/>
+        </w:rPr>
+        <w:t>login(</w:t>
+      </w:r>
+      <w:proofErr w:type="gramEnd"/>
+      <w:r>
+        <w:rPr>
+          <w:rFonts w:eastAsia="Times New Roman"/>
+        </w:rPr>
+        <w:t>username, password)</w:t>
       </w:r>
       <w:r>
         <w:rPr>
@@ -1073,53 +1087,83 @@
         <w:rPr>
           <w:rFonts w:eastAsia="Times New Roman"/>
         </w:rPr>
-        <w:t>post logout()</w:t>
-      </w:r>
-      <w:r>
-        <w:rPr>
-          <w:rFonts w:eastAsia="Times New Roman"/>
-        </w:rPr>
-        <w:t xml:space="preserve"> </w:t>
-      </w:r>
-      <w:r>
-        <w:rPr>
-          <w:rFonts w:eastAsia="Times New Roman"/>
-        </w:rPr>
-        <w:t>/auth/log</w:t>
-      </w:r>
-      <w:r>
-        <w:rPr>
-          <w:rFonts w:eastAsia="Times New Roman"/>
-        </w:rPr>
-        <w:t>out</w:t>
-      </w:r>
-    </w:p>
-    <w:p>
-      <w:pPr>
-        <w:spacing w:beforeAutospacing="1" w:afterAutospacing="1"/>
-        <w:rPr>
-          <w:rFonts w:eastAsia="Times New Roman"/>
-        </w:rPr>
-      </w:pPr>
-      <w:r>
-        <w:rPr>
-          <w:rFonts w:eastAsia="Times New Roman"/>
-        </w:rPr>
-        <w:t>post login() /auth/google</w:t>
-      </w:r>
-    </w:p>
-    <w:p>
-      <w:pPr>
-        <w:spacing w:beforeAutospacing="1" w:afterAutospacing="1"/>
-        <w:rPr>
-          <w:rFonts w:eastAsia="Times New Roman"/>
-        </w:rPr>
-      </w:pPr>
-      <w:r>
-        <w:rPr>
-          <w:rFonts w:eastAsia="Times New Roman"/>
-        </w:rPr>
-        <w:t>post callback() /auth/</w:t>
+        <w:t xml:space="preserve">post </w:t>
+      </w:r>
+      <w:proofErr w:type="gramStart"/>
+      <w:r>
+        <w:rPr>
+          <w:rFonts w:eastAsia="Times New Roman"/>
+        </w:rPr>
+        <w:t>logout(</w:t>
+      </w:r>
+      <w:proofErr w:type="gramEnd"/>
+      <w:r>
+        <w:rPr>
+          <w:rFonts w:eastAsia="Times New Roman"/>
+        </w:rPr>
+        <w:t>)</w:t>
+      </w:r>
+      <w:r>
+        <w:rPr>
+          <w:rFonts w:eastAsia="Times New Roman"/>
+        </w:rPr>
+        <w:t xml:space="preserve"> /auth/logout</w:t>
+      </w:r>
+    </w:p>
+    <w:p>
+      <w:pPr>
+        <w:spacing w:beforeAutospacing="1" w:afterAutospacing="1"/>
+        <w:rPr>
+          <w:rFonts w:eastAsia="Times New Roman"/>
+        </w:rPr>
+      </w:pPr>
+      <w:r>
+        <w:rPr>
+          <w:rFonts w:eastAsia="Times New Roman"/>
+        </w:rPr>
+        <w:t xml:space="preserve">post </w:t>
+      </w:r>
+      <w:proofErr w:type="gramStart"/>
+      <w:r>
+        <w:rPr>
+          <w:rFonts w:eastAsia="Times New Roman"/>
+        </w:rPr>
+        <w:t>login(</w:t>
+      </w:r>
+      <w:proofErr w:type="gramEnd"/>
+      <w:r>
+        <w:rPr>
+          <w:rFonts w:eastAsia="Times New Roman"/>
+        </w:rPr>
+        <w:t>) /auth/google</w:t>
+      </w:r>
+    </w:p>
+    <w:p>
+      <w:pPr>
+        <w:spacing w:beforeAutospacing="1" w:afterAutospacing="1"/>
+        <w:rPr>
+          <w:rFonts w:eastAsia="Times New Roman"/>
+        </w:rPr>
+      </w:pPr>
+      <w:r>
+        <w:rPr>
+          <w:rFonts w:eastAsia="Times New Roman"/>
+        </w:rPr>
+        <w:t xml:space="preserve">post </w:t>
+      </w:r>
+      <w:proofErr w:type="gramStart"/>
+      <w:r>
+        <w:rPr>
+          <w:rFonts w:eastAsia="Times New Roman"/>
+        </w:rPr>
+        <w:t>callback(</w:t>
+      </w:r>
+      <w:proofErr w:type="gramEnd"/>
+      <w:r>
+        <w:rPr>
+          <w:rFonts w:eastAsia="Times New Roman"/>
+        </w:rPr>
+        <w:t>) /auth/</w:t>
       </w:r>
       <w:r>
         <w:rPr>
@@ -1140,7 +1184,21 @@
           <w:rFonts w:eastAsia="Times New Roman"/>
         </w:rPr>
         <w:lastRenderedPageBreak/>
-        <w:t xml:space="preserve">get getUserInfo() (jwt is embedded) </w:t>
+        <w:t xml:space="preserve">get </w:t>
+      </w:r>
+      <w:proofErr w:type="gramStart"/>
+      <w:r>
+        <w:rPr>
+          <w:rFonts w:eastAsia="Times New Roman"/>
+        </w:rPr>
+        <w:t>getUserInfo(</w:t>
+      </w:r>
+      <w:proofErr w:type="gramEnd"/>
+      <w:r>
+        <w:rPr>
+          <w:rFonts w:eastAsia="Times New Roman"/>
+        </w:rPr>
+        <w:t xml:space="preserve">) (jwt is embedded) </w:t>
       </w:r>
       <w:r>
         <w:rPr>
@@ -1163,7 +1221,21 @@
         <w:rPr>
           <w:rFonts w:eastAsia="Times New Roman"/>
         </w:rPr>
-        <w:t>post create ticket(Title, Description, Priority, Type (Optional), File (Optional)) → void</w:t>
+        <w:t xml:space="preserve">post create </w:t>
+      </w:r>
+      <w:proofErr w:type="gramStart"/>
+      <w:r>
+        <w:rPr>
+          <w:rFonts w:eastAsia="Times New Roman"/>
+        </w:rPr>
+        <w:t>ticket(</w:t>
+      </w:r>
+      <w:proofErr w:type="gramEnd"/>
+      <w:r>
+        <w:rPr>
+          <w:rFonts w:eastAsia="Times New Roman"/>
+        </w:rPr>
+        <w:t>Title, Description, Priority, Type (Optional), File (Optional)) → void</w:t>
       </w:r>
       <w:r>
         <w:rPr>
@@ -1189,7 +1261,14 @@
         <w:rPr>
           <w:rFonts w:eastAsia="Times New Roman"/>
         </w:rPr>
-        <w:t>get getTickets</w:t>
+        <w:t xml:space="preserve">get </w:t>
+      </w:r>
+      <w:proofErr w:type="gramStart"/>
+      <w:r>
+        <w:rPr>
+          <w:rFonts w:eastAsia="Times New Roman"/>
+        </w:rPr>
+        <w:t>getTickets</w:t>
       </w:r>
       <w:r>
         <w:rPr>
@@ -1197,6 +1276,7 @@
         </w:rPr>
         <w:t>(</w:t>
       </w:r>
+      <w:proofErr w:type="gramEnd"/>
       <w:r>
         <w:rPr>
           <w:rFonts w:eastAsia="Times New Roman"/>
@@ -1227,7 +1307,21 @@
         <w:rPr>
           <w:rFonts w:eastAsia="Times New Roman"/>
         </w:rPr>
-        <w:t xml:space="preserve"> /api/tickets/{id}</w:t>
+        <w:t xml:space="preserve"> /api/</w:t>
+      </w:r>
+      <w:proofErr w:type="gramStart"/>
+      <w:r>
+        <w:rPr>
+          <w:rFonts w:eastAsia="Times New Roman"/>
+        </w:rPr>
+        <w:t>tickets/{</w:t>
+      </w:r>
+      <w:proofErr w:type="gramEnd"/>
+      <w:r>
+        <w:rPr>
+          <w:rFonts w:eastAsia="Times New Roman"/>
+        </w:rPr>
+        <w:t>id}</w:t>
       </w:r>
     </w:p>
     <w:p>
@@ -1253,47 +1347,117 @@
         <w:rPr>
           <w:rFonts w:eastAsia="Times New Roman"/>
         </w:rPr>
-        <w:t>t updateTicketStatus(ticketID, statusCode)</w:t>
-      </w:r>
-      <w:r>
-        <w:rPr>
-          <w:rFonts w:eastAsia="Times New Roman"/>
-        </w:rPr>
-        <w:t xml:space="preserve"> /api/tickets/{id}</w:t>
-      </w:r>
-    </w:p>
-    <w:p>
-      <w:pPr>
-        <w:spacing w:beforeAutospacing="1" w:afterAutospacing="1"/>
-        <w:rPr>
-          <w:rFonts w:eastAsia="Times New Roman"/>
-        </w:rPr>
-      </w:pPr>
-      <w:r>
-        <w:rPr>
-          <w:rFonts w:eastAsia="Times New Roman"/>
-        </w:rPr>
-        <w:t>post addAssignee(ticketID, userID)</w:t>
-      </w:r>
-      <w:r>
-        <w:rPr>
-          <w:rFonts w:eastAsia="Times New Roman"/>
-        </w:rPr>
-        <w:t xml:space="preserve"> /api/tickets/{id}/assignees</w:t>
-      </w:r>
-    </w:p>
-    <w:p>
-      <w:pPr>
-        <w:spacing w:beforeAutospacing="1" w:afterAutospacing="1"/>
-        <w:rPr>
-          <w:rFonts w:eastAsia="Times New Roman"/>
-        </w:rPr>
-      </w:pPr>
-      <w:r>
-        <w:rPr>
-          <w:rFonts w:eastAsia="Times New Roman"/>
-        </w:rPr>
-        <w:t>post addComment(ticketID, attachedFile (Optional</w:t>
+        <w:t xml:space="preserve">t </w:t>
+      </w:r>
+      <w:proofErr w:type="gramStart"/>
+      <w:r>
+        <w:rPr>
+          <w:rFonts w:eastAsia="Times New Roman"/>
+        </w:rPr>
+        <w:t>updateTicketStatus(</w:t>
+      </w:r>
+      <w:proofErr w:type="gramEnd"/>
+      <w:r>
+        <w:rPr>
+          <w:rFonts w:eastAsia="Times New Roman"/>
+        </w:rPr>
+        <w:t>ticketID, statusCode)</w:t>
+      </w:r>
+      <w:r>
+        <w:rPr>
+          <w:rFonts w:eastAsia="Times New Roman"/>
+        </w:rPr>
+        <w:t xml:space="preserve"> /api/</w:t>
+      </w:r>
+      <w:proofErr w:type="gramStart"/>
+      <w:r>
+        <w:rPr>
+          <w:rFonts w:eastAsia="Times New Roman"/>
+        </w:rPr>
+        <w:t>tickets/{</w:t>
+      </w:r>
+      <w:proofErr w:type="gramEnd"/>
+      <w:r>
+        <w:rPr>
+          <w:rFonts w:eastAsia="Times New Roman"/>
+        </w:rPr>
+        <w:t>id}</w:t>
+      </w:r>
+    </w:p>
+    <w:p>
+      <w:pPr>
+        <w:spacing w:beforeAutospacing="1" w:afterAutospacing="1"/>
+        <w:rPr>
+          <w:rFonts w:eastAsia="Times New Roman"/>
+        </w:rPr>
+      </w:pPr>
+      <w:r>
+        <w:rPr>
+          <w:rFonts w:eastAsia="Times New Roman"/>
+        </w:rPr>
+        <w:t xml:space="preserve">post </w:t>
+      </w:r>
+      <w:proofErr w:type="gramStart"/>
+      <w:r>
+        <w:rPr>
+          <w:rFonts w:eastAsia="Times New Roman"/>
+        </w:rPr>
+        <w:t>addAssignee(</w:t>
+      </w:r>
+      <w:proofErr w:type="gramEnd"/>
+      <w:r>
+        <w:rPr>
+          <w:rFonts w:eastAsia="Times New Roman"/>
+        </w:rPr>
+        <w:t>ticketID, userID)</w:t>
+      </w:r>
+      <w:r>
+        <w:rPr>
+          <w:rFonts w:eastAsia="Times New Roman"/>
+        </w:rPr>
+        <w:t xml:space="preserve"> /api/</w:t>
+      </w:r>
+      <w:proofErr w:type="gramStart"/>
+      <w:r>
+        <w:rPr>
+          <w:rFonts w:eastAsia="Times New Roman"/>
+        </w:rPr>
+        <w:t>tickets/{id}/</w:t>
+      </w:r>
+      <w:proofErr w:type="gramEnd"/>
+      <w:r>
+        <w:rPr>
+          <w:rFonts w:eastAsia="Times New Roman"/>
+        </w:rPr>
+        <w:t>assignees</w:t>
+      </w:r>
+    </w:p>
+    <w:p>
+      <w:pPr>
+        <w:spacing w:beforeAutospacing="1" w:afterAutospacing="1"/>
+        <w:rPr>
+          <w:rFonts w:eastAsia="Times New Roman"/>
+        </w:rPr>
+      </w:pPr>
+      <w:r>
+        <w:rPr>
+          <w:rFonts w:eastAsia="Times New Roman"/>
+        </w:rPr>
+        <w:t xml:space="preserve">post </w:t>
+      </w:r>
+      <w:proofErr w:type="gramStart"/>
+      <w:r>
+        <w:rPr>
+          <w:rFonts w:eastAsia="Times New Roman"/>
+        </w:rPr>
+        <w:t>addComment(</w:t>
+      </w:r>
+      <w:proofErr w:type="gramEnd"/>
+      <w:r>
+        <w:rPr>
+          <w:rFonts w:eastAsia="Times New Roman"/>
+        </w:rPr>
+        <w:t>ticketID, attachedFile (Optional</w:t>
       </w:r>
       <w:r>
         <w:rPr>
@@ -1311,21 +1475,49 @@
         <w:rPr>
           <w:rFonts w:eastAsia="Times New Roman"/>
         </w:rPr>
-        <w:t xml:space="preserve"> /api/tickets/{id}/comments</w:t>
-      </w:r>
-    </w:p>
-    <w:p>
-      <w:pPr>
-        <w:spacing w:beforeAutospacing="1" w:afterAutospacing="1"/>
-        <w:rPr>
-          <w:rFonts w:eastAsia="Times New Roman"/>
-        </w:rPr>
-      </w:pPr>
-      <w:r>
-        <w:rPr>
-          <w:rFonts w:eastAsia="Times New Roman"/>
-        </w:rPr>
-        <w:t>post addAccount(username, passwor</w:t>
+        <w:t xml:space="preserve"> /api/</w:t>
+      </w:r>
+      <w:proofErr w:type="gramStart"/>
+      <w:r>
+        <w:rPr>
+          <w:rFonts w:eastAsia="Times New Roman"/>
+        </w:rPr>
+        <w:t>tickets/{id}/</w:t>
+      </w:r>
+      <w:proofErr w:type="gramEnd"/>
+      <w:r>
+        <w:rPr>
+          <w:rFonts w:eastAsia="Times New Roman"/>
+        </w:rPr>
+        <w:t>comments</w:t>
+      </w:r>
+    </w:p>
+    <w:p>
+      <w:pPr>
+        <w:spacing w:beforeAutospacing="1" w:afterAutospacing="1"/>
+        <w:rPr>
+          <w:rFonts w:eastAsia="Times New Roman"/>
+        </w:rPr>
+      </w:pPr>
+      <w:r>
+        <w:rPr>
+          <w:rFonts w:eastAsia="Times New Roman"/>
+        </w:rPr>
+        <w:t xml:space="preserve">post </w:t>
+      </w:r>
+      <w:proofErr w:type="gramStart"/>
+      <w:r>
+        <w:rPr>
+          <w:rFonts w:eastAsia="Times New Roman"/>
+        </w:rPr>
+        <w:t>addAccount(</w:t>
+      </w:r>
+      <w:proofErr w:type="gramEnd"/>
+      <w:r>
+        <w:rPr>
+          <w:rFonts w:eastAsia="Times New Roman"/>
+        </w:rPr>
+        <w:t>username, passwor</w:t>
       </w:r>
       <w:r>
         <w:rPr>
@@ -1381,7 +1573,21 @@
         <w:rPr>
           <w:rFonts w:eastAsia="Times New Roman"/>
         </w:rPr>
-        <w:t xml:space="preserve"> /api/users/{id}</w:t>
+        <w:t xml:space="preserve"> /api/</w:t>
+      </w:r>
+      <w:proofErr w:type="gramStart"/>
+      <w:r>
+        <w:rPr>
+          <w:rFonts w:eastAsia="Times New Roman"/>
+        </w:rPr>
+        <w:t>users/{</w:t>
+      </w:r>
+      <w:proofErr w:type="gramEnd"/>
+      <w:r>
+        <w:rPr>
+          <w:rFonts w:eastAsia="Times New Roman"/>
+        </w:rPr>
+        <w:t>id}</w:t>
       </w:r>
     </w:p>
     <w:p>
@@ -1407,7 +1613,14 @@
         <w:rPr>
           <w:rFonts w:eastAsia="Times New Roman"/>
         </w:rPr>
-        <w:t xml:space="preserve"> change</w:t>
+        <w:t xml:space="preserve"> </w:t>
+      </w:r>
+      <w:proofErr w:type="gramStart"/>
+      <w:r>
+        <w:rPr>
+          <w:rFonts w:eastAsia="Times New Roman"/>
+        </w:rPr>
+        <w:t>change</w:t>
       </w:r>
       <w:r>
         <w:rPr>
@@ -1419,19 +1632,40 @@
         <w:rPr>
           <w:rFonts w:eastAsia="Times New Roman"/>
         </w:rPr>
-        <w:t>Password(password, newPassword)</w:t>
-      </w:r>
-      <w:r>
-        <w:rPr>
-          <w:rFonts w:eastAsia="Times New Roman"/>
-        </w:rPr>
-        <w:t xml:space="preserve"> /api/user</w:t>
-      </w:r>
-      <w:r>
-        <w:rPr>
-          <w:rFonts w:eastAsia="Times New Roman"/>
-        </w:rPr>
-        <w:t>s/{id}/password</w:t>
+        <w:t>Password(</w:t>
+      </w:r>
+      <w:proofErr w:type="gramEnd"/>
+      <w:r>
+        <w:rPr>
+          <w:rFonts w:eastAsia="Times New Roman"/>
+        </w:rPr>
+        <w:t>password, newPassword)</w:t>
+      </w:r>
+      <w:r>
+        <w:rPr>
+          <w:rFonts w:eastAsia="Times New Roman"/>
+        </w:rPr>
+        <w:t xml:space="preserve"> /api/</w:t>
+      </w:r>
+      <w:proofErr w:type="gramStart"/>
+      <w:r>
+        <w:rPr>
+          <w:rFonts w:eastAsia="Times New Roman"/>
+        </w:rPr>
+        <w:t>user</w:t>
+      </w:r>
+      <w:r>
+        <w:rPr>
+          <w:rFonts w:eastAsia="Times New Roman"/>
+        </w:rPr>
+        <w:t>s/{id}/</w:t>
+      </w:r>
+      <w:proofErr w:type="gramEnd"/>
+      <w:r>
+        <w:rPr>
+          <w:rFonts w:eastAsia="Times New Roman"/>
+        </w:rPr>
+        <w:t>password</w:t>
       </w:r>
     </w:p>
     <w:p>
@@ -1451,13 +1685,27 @@
         <w:rPr>
           <w:rFonts w:eastAsia="Times New Roman"/>
         </w:rPr>
-        <w:t>admin/users/</w:t>
-      </w:r>
-      <w:r>
-        <w:rPr>
-          <w:rFonts w:eastAsia="Times New Roman"/>
-        </w:rPr>
-        <w:t>{userID}/password (API for admin only)</w:t>
+        <w:t>admin/</w:t>
+      </w:r>
+      <w:proofErr w:type="gramStart"/>
+      <w:r>
+        <w:rPr>
+          <w:rFonts w:eastAsia="Times New Roman"/>
+        </w:rPr>
+        <w:t>users/</w:t>
+      </w:r>
+      <w:r>
+        <w:rPr>
+          <w:rFonts w:eastAsia="Times New Roman"/>
+        </w:rPr>
+        <w:t>{userID}/</w:t>
+      </w:r>
+      <w:proofErr w:type="gramEnd"/>
+      <w:r>
+        <w:rPr>
+          <w:rFonts w:eastAsia="Times New Roman"/>
+        </w:rPr>
+        <w:t>password (API for admin only)</w:t>
       </w:r>
     </w:p>
     <w:p>
@@ -1489,7 +1737,21 @@
         <w:rPr>
           <w:rFonts w:eastAsia="Times New Roman"/>
         </w:rPr>
-        <w:t xml:space="preserve"> /api/admin/users/{userID}/department</w:t>
+        <w:t xml:space="preserve"> /api/admin/</w:t>
+      </w:r>
+      <w:proofErr w:type="gramStart"/>
+      <w:r>
+        <w:rPr>
+          <w:rFonts w:eastAsia="Times New Roman"/>
+        </w:rPr>
+        <w:t>users/{userID}/</w:t>
+      </w:r>
+      <w:proofErr w:type="gramEnd"/>
+      <w:r>
+        <w:rPr>
+          <w:rFonts w:eastAsia="Times New Roman"/>
+        </w:rPr>
+        <w:t>department</w:t>
       </w:r>
     </w:p>
     <w:p>
@@ -1509,21 +1771,49 @@
         <w:rPr>
           <w:rFonts w:eastAsia="Times New Roman"/>
         </w:rPr>
-        <w:t>/api/admin/users/{userID}</w:t>
-      </w:r>
-    </w:p>
-    <w:p>
-      <w:pPr>
-        <w:spacing w:beforeAutospacing="1" w:afterAutospacing="1"/>
-        <w:rPr>
-          <w:rFonts w:eastAsia="Times New Roman"/>
-        </w:rPr>
-      </w:pPr>
-      <w:r>
-        <w:rPr>
-          <w:rFonts w:eastAsia="Times New Roman"/>
-        </w:rPr>
-        <w:t>get getPriorities()</w:t>
+        <w:t>/api/admin/</w:t>
+      </w:r>
+      <w:proofErr w:type="gramStart"/>
+      <w:r>
+        <w:rPr>
+          <w:rFonts w:eastAsia="Times New Roman"/>
+        </w:rPr>
+        <w:t>users/{</w:t>
+      </w:r>
+      <w:proofErr w:type="gramEnd"/>
+      <w:r>
+        <w:rPr>
+          <w:rFonts w:eastAsia="Times New Roman"/>
+        </w:rPr>
+        <w:t>userID}</w:t>
+      </w:r>
+    </w:p>
+    <w:p>
+      <w:pPr>
+        <w:spacing w:beforeAutospacing="1" w:afterAutospacing="1"/>
+        <w:rPr>
+          <w:rFonts w:eastAsia="Times New Roman"/>
+        </w:rPr>
+      </w:pPr>
+      <w:r>
+        <w:rPr>
+          <w:rFonts w:eastAsia="Times New Roman"/>
+        </w:rPr>
+        <w:t xml:space="preserve">get </w:t>
+      </w:r>
+      <w:proofErr w:type="gramStart"/>
+      <w:r>
+        <w:rPr>
+          <w:rFonts w:eastAsia="Times New Roman"/>
+        </w:rPr>
+        <w:t>getPriorities(</w:t>
+      </w:r>
+      <w:proofErr w:type="gramEnd"/>
+      <w:r>
+        <w:rPr>
+          <w:rFonts w:eastAsia="Times New Roman"/>
+        </w:rPr>
+        <w:t>)</w:t>
       </w:r>
       <w:r>
         <w:rPr>
@@ -1555,13 +1845,41 @@
         <w:rPr>
           <w:rFonts w:eastAsia="Times New Roman"/>
         </w:rPr>
-        <w:t xml:space="preserve"> changePriority(priorityID, levelOfPriority(int), name, timeToRespond, timeToFinish) </w:t>
-      </w:r>
-      <w:r>
-        <w:rPr>
-          <w:rFonts w:eastAsia="Times New Roman"/>
-        </w:rPr>
-        <w:t>/api/admin/priorities/{piriority-id}</w:t>
+        <w:t xml:space="preserve"> </w:t>
+      </w:r>
+      <w:proofErr w:type="gramStart"/>
+      <w:r>
+        <w:rPr>
+          <w:rFonts w:eastAsia="Times New Roman"/>
+        </w:rPr>
+        <w:t>changePriority(</w:t>
+      </w:r>
+      <w:proofErr w:type="gramEnd"/>
+      <w:r>
+        <w:rPr>
+          <w:rFonts w:eastAsia="Times New Roman"/>
+        </w:rPr>
+        <w:t xml:space="preserve">priorityID, levelOfPriority(int), name, timeToRespond, timeToFinish) </w:t>
+      </w:r>
+      <w:r>
+        <w:rPr>
+          <w:rFonts w:eastAsia="Times New Roman"/>
+        </w:rPr>
+        <w:t>/api/admin/</w:t>
+      </w:r>
+      <w:proofErr w:type="gramStart"/>
+      <w:r>
+        <w:rPr>
+          <w:rFonts w:eastAsia="Times New Roman"/>
+        </w:rPr>
+        <w:t>priorities/{piriority</w:t>
+      </w:r>
+      <w:proofErr w:type="gramEnd"/>
+      <w:r>
+        <w:rPr>
+          <w:rFonts w:eastAsia="Times New Roman"/>
+        </w:rPr>
+        <w:t>-id}</w:t>
       </w:r>
     </w:p>
     <w:p>
@@ -1581,7 +1899,21 @@
         <w:rPr>
           <w:rFonts w:eastAsia="Times New Roman"/>
         </w:rPr>
-        <w:t xml:space="preserve"> /api/admin/priorities/{priority-id}</w:t>
+        <w:t xml:space="preserve"> /api/admin</w:t>
+      </w:r>
+      <w:proofErr w:type="gramStart"/>
+      <w:r>
+        <w:rPr>
+          <w:rFonts w:eastAsia="Times New Roman"/>
+        </w:rPr>
+        <w:t>/priorities/{</w:t>
+      </w:r>
+      <w:proofErr w:type="gramEnd"/>
+      <w:r>
+        <w:rPr>
+          <w:rFonts w:eastAsia="Times New Roman"/>
+        </w:rPr>
+        <w:t>priority-id}</w:t>
       </w:r>
     </w:p>
     <w:p>
@@ -1696,7 +2028,21 @@
         <w:rPr>
           <w:rFonts w:eastAsia="Times New Roman"/>
         </w:rPr>
-        <w:t xml:space="preserve">use { } of jsx or data set by useState not innerHTML </w:t>
+        <w:t xml:space="preserve">use </w:t>
+      </w:r>
+      <w:proofErr w:type="gramStart"/>
+      <w:r>
+        <w:rPr>
+          <w:rFonts w:eastAsia="Times New Roman"/>
+        </w:rPr>
+        <w:t>{ }</w:t>
+      </w:r>
+      <w:proofErr w:type="gramEnd"/>
+      <w:r>
+        <w:rPr>
+          <w:rFonts w:eastAsia="Times New Roman"/>
+        </w:rPr>
+        <w:t xml:space="preserve"> of jsx or data set by useState not innerHTML </w:t>
       </w:r>
     </w:p>
     <w:p>
@@ -1843,6 +2189,26 @@
         </w:rPr>
         <w:t>Jjwt được sử dụng với hàm băm hs256 cho phép bảo mật ở mức chấp nhận được trong mạng nội bộ với tốc độ tốt giữa các loại băm hs, rs và es</w:t>
       </w:r>
+      <w:r>
+        <w:rPr>
+          <w:rFonts w:eastAsia="Times New Roman"/>
+        </w:rPr>
+        <w:t>. Việc sử dụng hàm băm sha256 có thể chưa phù hợp do có bảo mật yếu hơn hàm băm bcrypt, tuy nhiên jwt được config có thời gian vô hiệu hóa là 1 ngày nhằm tăng độ bảo mật (?). Jjwt có vẻ là Thread Safe (?), hiện tại chưa tận dụng được chức năng này.</w:t>
+      </w:r>
+    </w:p>
+    <w:p>
+      <w:pPr>
+        <w:spacing w:beforeAutospacing="1" w:afterAutospacing="1"/>
+        <w:rPr>
+          <w:rFonts w:eastAsia="Times New Roman"/>
+        </w:rPr>
+      </w:pPr>
+      <w:r>
+        <w:rPr>
+          <w:rFonts w:eastAsia="Times New Roman"/>
+        </w:rPr>
+        <w:t>Jjwt của auth0 được chọn vì có documentation tốt, được nhiều người sử dụng, do một tổ chức có danh tiếng đứng sau</w:t>
+      </w:r>
     </w:p>
     <w:p>
       <w:pPr>
@@ -1869,7 +2235,74 @@
         <w:rPr>
           <w:rFonts w:eastAsia="Times New Roman"/>
         </w:rPr>
+        <w:lastRenderedPageBreak/>
         <w:t>BCrypt khởi tạo mặc định với độ khó 10</w:t>
+      </w:r>
+    </w:p>
+    <w:p>
+      <w:pPr>
+        <w:spacing w:beforeAutospacing="1" w:afterAutospacing="1"/>
+        <w:rPr>
+          <w:rFonts w:eastAsia="Times New Roman"/>
+        </w:rPr>
+      </w:pPr>
+      <w:r>
+        <w:rPr>
+          <w:rFonts w:eastAsia="Times New Roman"/>
+        </w:rPr>
+        <w:t>BCrypt được sử dụng do nằm đầu trong danh sách những thuật toán khuyên dùng của spring cho mục đích bảo vệ mật khẩu. Không rõ về</w:t>
+      </w:r>
+    </w:p>
+    <w:p>
+      <w:pPr>
+        <w:spacing w:beforeAutospacing="1" w:afterAutospacing="1"/>
+        <w:rPr>
+          <w:rFonts w:eastAsia="Times New Roman"/>
+        </w:rPr>
+      </w:pPr>
+      <w:r>
+        <w:rPr>
+          <w:rFonts w:eastAsia="Times New Roman"/>
+        </w:rPr>
+        <w:t>Hibernate – cung cấp ORM</w:t>
+      </w:r>
+      <w:r>
+        <w:rPr>
+          <w:rFonts w:eastAsia="Times New Roman"/>
+        </w:rPr>
+        <w:t xml:space="preserve"> kết hợp với Jakarta data thành repository</w:t>
+      </w:r>
+    </w:p>
+    <w:p>
+      <w:pPr>
+        <w:spacing w:beforeAutospacing="1" w:afterAutospacing="1"/>
+        <w:rPr>
+          <w:rFonts w:eastAsia="Times New Roman"/>
+        </w:rPr>
+      </w:pPr>
+      <w:r>
+        <w:rPr>
+          <w:rFonts w:eastAsia="Times New Roman"/>
+        </w:rPr>
+        <w:t>Hibernate được sử dụng nhằm tăng tốc độ xây dựng sản phẩm</w:t>
+      </w:r>
+      <w:r>
+        <w:rPr>
+          <w:rFonts w:eastAsia="Times New Roman"/>
+        </w:rPr>
+        <w:t xml:space="preserve"> và dễ sử dụng do đã có kinh nghiệm từ trước</w:t>
+      </w:r>
+      <w:r>
+        <w:rPr>
+          <w:rFonts w:eastAsia="Times New Roman"/>
+        </w:rPr>
+        <w:t xml:space="preserve"> (có thể đổi thành jdbc hoặc </w:t>
+      </w:r>
+      <w:r>
+        <w:rPr>
+          <w:rFonts w:eastAsia="Times New Roman"/>
+        </w:rPr>
+        <w:t xml:space="preserve">sử dụng stored procedure trong db hoặc spring data) </w:t>
       </w:r>
     </w:p>
     <w:sectPr>

</xml_diff>

<commit_message>
update api path for convention
</commit_message>
<xml_diff>
--- a/specification_breakdown.docx
+++ b/specification_breakdown.docx
@@ -1059,7 +1059,19 @@
         <w:rPr>
           <w:rFonts w:eastAsia="Times New Roman"/>
         </w:rPr>
-        <w:t xml:space="preserve"> /auth/login</w:t>
+        <w:t xml:space="preserve"> </w:t>
+      </w:r>
+      <w:r>
+        <w:rPr>
+          <w:rFonts w:eastAsia="Times New Roman"/>
+        </w:rPr>
+        <w:t>/api</w:t>
+      </w:r>
+      <w:r>
+        <w:rPr>
+          <w:rFonts w:eastAsia="Times New Roman"/>
+        </w:rPr>
+        <w:t>/auth/login</w:t>
       </w:r>
     </w:p>
     <w:p>
@@ -1079,7 +1091,19 @@
         <w:rPr>
           <w:rFonts w:eastAsia="Times New Roman"/>
         </w:rPr>
-        <w:t xml:space="preserve"> /auth/logout</w:t>
+        <w:t xml:space="preserve"> </w:t>
+      </w:r>
+      <w:r>
+        <w:rPr>
+          <w:rFonts w:eastAsia="Times New Roman"/>
+        </w:rPr>
+        <w:t>/api</w:t>
+      </w:r>
+      <w:r>
+        <w:rPr>
+          <w:rFonts w:eastAsia="Times New Roman"/>
+        </w:rPr>
+        <w:t>/auth/logout</w:t>
       </w:r>
     </w:p>
     <w:p>
@@ -1455,13 +1479,7 @@
         <w:rPr>
           <w:rFonts w:eastAsia="Times New Roman"/>
         </w:rPr>
-        <w:t xml:space="preserve">get getDepartment(department) </w:t>
-      </w:r>
-      <w:r>
-        <w:rPr>
-          <w:rFonts w:eastAsia="Times New Roman"/>
-        </w:rPr>
-        <w:t>/api/admin/users/{userID}/department</w:t>
+        <w:t>get getDepartment(department) /api/admin/users/{userID}/department</w:t>
       </w:r>
     </w:p>
     <w:p>

</xml_diff>

<commit_message>
Add the rest of the model and mvc
</commit_message>
<xml_diff>
--- a/specification_breakdown.docx
+++ b/specification_breakdown.docx
@@ -1,9 +1,14 @@
 
 <file path=word/document.xml><?xml version="1.0" encoding="utf-8"?>
-<w:document xmlns:wpc="http://schemas.microsoft.com/office/word/2010/wordprocessingCanvas" xmlns:cx="http://schemas.microsoft.com/office/drawing/2014/chartex" xmlns:cx1="http://schemas.microsoft.com/office/drawing/2015/9/8/chartex" xmlns:cx2="http://schemas.microsoft.com/office/drawing/2015/10/21/chartex" xmlns:cx3="http://schemas.microsoft.com/office/drawing/2016/5/9/chartex" xmlns:cx4="http://schemas.microsoft.com/office/drawing/2016/5/10/chartex" xmlns:cx5="http://schemas.microsoft.com/office/drawing/2016/5/11/chartex" xmlns:cx6="http://schemas.microsoft.com/office/drawing/2016/5/12/chartex" xmlns:cx7="http://schemas.microsoft.com/office/drawing/2016/5/13/chartex" xmlns:cx8="http://schemas.microsoft.com/office/drawing/2016/5/14/chartex" xmlns:mc="http://schemas.openxmlformats.org/markup-compatibility/2006" xmlns:aink="http://schemas.microsoft.com/office/drawing/2016/ink" xmlns:am3d="http://schemas.microsoft.com/office/drawing/2017/model3d" xmlns:o="urn:schemas-microsoft-com:office:office" xmlns:oel="http://schemas.microsoft.com/office/2019/extlst" xmlns:r="http://schemas.openxmlformats.org/officeDocument/2006/relationships" xmlns:m="http://schemas.openxmlformats.org/officeDocument/2006/math" xmlns:v="urn:schemas-microsoft-com:vml" xmlns:wp14="http://schemas.microsoft.com/office/word/2010/wordprocessingDrawing" xmlns:wp="http://schemas.openxmlformats.org/drawingml/2006/wordprocessingDrawing" xmlns:w10="urn:schemas-microsoft-com:office:word" xmlns:w="http://schemas.openxmlformats.org/wordprocessingml/2006/main" xmlns:w14="http://schemas.microsoft.com/office/word/2010/wordml" xmlns:w15="http://schemas.microsoft.com/office/word/2012/wordml" xmlns:w16cex="http://schemas.microsoft.com/office/word/2018/wordml/cex" xmlns:w16cid="http://schemas.microsoft.com/office/word/2016/wordml/cid" xmlns:w16="http://schemas.microsoft.com/office/word/2018/wordml" xmlns:w16du="http://schemas.microsoft.com/office/word/2023/wordml/word16du" xmlns:w16sdtdh="http://schemas.microsoft.com/office/word/2020/wordml/sdtdatahash" xmlns:w16sdtfl="http://schemas.microsoft.com/office/word/2024/wordml/sdtformatlock" xmlns:w16se="http://schemas.microsoft.com/office/word/2015/wordml/symex" xmlns:wpg="http://schemas.microsoft.com/office/word/2010/wordprocessingGroup" xmlns:wpi="http://schemas.microsoft.com/office/word/2010/wordprocessingInk" xmlns:wne="http://schemas.microsoft.com/office/word/2006/wordml" xmlns:wps="http://schemas.microsoft.com/office/word/2010/wordprocessingShape" mc:Ignorable="w14 w15 w16se w16cid w16 w16cex w16sdtdh w16sdtfl w16du wp14">
+<w:document xmlns:o="urn:schemas-microsoft-com:office:office" xmlns:r="http://schemas.openxmlformats.org/officeDocument/2006/relationships" xmlns:v="urn:schemas-microsoft-com:vml" xmlns:w="http://schemas.openxmlformats.org/wordprocessingml/2006/main" xmlns:w10="urn:schemas-microsoft-com:office:word" xmlns:wp="http://schemas.openxmlformats.org/drawingml/2006/wordprocessingDrawing" xmlns:pic="http://schemas.openxmlformats.org/drawingml/2006/picture" xmlns:wps="http://schemas.microsoft.com/office/word/2010/wordprocessingShape" xmlns:wpg="http://schemas.microsoft.com/office/word/2010/wordprocessingGroup" xmlns:mc="http://schemas.openxmlformats.org/markup-compatibility/2006" xmlns:wp14="http://schemas.microsoft.com/office/word/2010/wordprocessingDrawing" xmlns:w14="http://schemas.microsoft.com/office/word/2010/wordml" xmlns:w15="http://schemas.microsoft.com/office/word/2012/wordml" mc:Ignorable="w14 wp14 w15">
   <w:body>
     <w:p>
-      <w:r>
+      <w:pPr>
+        <w:pStyle w:val="Normal"/>
+        <w:rPr/>
+      </w:pPr>
+      <w:r>
+        <w:rPr/>
         <w:t>Ticket:</w:t>
       </w:r>
     </w:p>
@@ -14,8 +19,10 @@
           <w:ilvl w:val="0"/>
           <w:numId w:val="3"/>
         </w:numPr>
-      </w:pPr>
-      <w:r>
+        <w:rPr/>
+      </w:pPr>
+      <w:r>
+        <w:rPr/>
         <w:t>Người dùng</w:t>
       </w:r>
     </w:p>
@@ -26,7 +33,7 @@
           <w:ilvl w:val="1"/>
           <w:numId w:val="3"/>
         </w:numPr>
-        <w:spacing w:after="0"/>
+        <w:spacing w:before="0" w:after="0"/>
         <w:rPr>
           <w:rFonts w:eastAsia="Times New Roman"/>
         </w:rPr>
@@ -45,7 +52,7 @@
           <w:ilvl w:val="1"/>
           <w:numId w:val="3"/>
         </w:numPr>
-        <w:spacing w:after="0"/>
+        <w:spacing w:before="0" w:after="0"/>
         <w:rPr>
           <w:rFonts w:eastAsia="Times New Roman"/>
         </w:rPr>
@@ -64,7 +71,7 @@
           <w:ilvl w:val="1"/>
           <w:numId w:val="3"/>
         </w:numPr>
-        <w:spacing w:after="0"/>
+        <w:spacing w:before="0" w:after="0"/>
         <w:rPr>
           <w:rFonts w:eastAsia="Times New Roman"/>
         </w:rPr>
@@ -83,7 +90,7 @@
           <w:ilvl w:val="1"/>
           <w:numId w:val="3"/>
         </w:numPr>
-        <w:spacing w:after="0"/>
+        <w:spacing w:before="0" w:after="0"/>
         <w:rPr>
           <w:rFonts w:eastAsia="Times New Roman"/>
         </w:rPr>
@@ -102,7 +109,7 @@
           <w:ilvl w:val="1"/>
           <w:numId w:val="3"/>
         </w:numPr>
-        <w:spacing w:after="0"/>
+        <w:spacing w:before="0" w:after="0"/>
         <w:rPr>
           <w:rFonts w:eastAsia="Times New Roman"/>
         </w:rPr>
@@ -121,7 +128,7 @@
           <w:ilvl w:val="0"/>
           <w:numId w:val="3"/>
         </w:numPr>
-        <w:spacing w:after="0"/>
+        <w:spacing w:before="0" w:after="0"/>
         <w:rPr>
           <w:rFonts w:eastAsia="Times New Roman"/>
         </w:rPr>
@@ -140,12 +147,13 @@
           <w:ilvl w:val="1"/>
           <w:numId w:val="3"/>
         </w:numPr>
-        <w:spacing w:after="0"/>
-        <w:rPr>
-          <w:rFonts w:eastAsia="Times New Roman"/>
-        </w:rPr>
-      </w:pPr>
-      <w:r>
+        <w:spacing w:before="0" w:after="0"/>
+        <w:rPr>
+          <w:rFonts w:eastAsia="Times New Roman"/>
+        </w:rPr>
+      </w:pPr>
+      <w:r>
+        <w:rPr/>
         <w:t>Đơn vị/phòng ban</w:t>
       </w:r>
     </w:p>
@@ -156,7 +164,7 @@
           <w:ilvl w:val="1"/>
           <w:numId w:val="3"/>
         </w:numPr>
-        <w:spacing w:after="0"/>
+        <w:spacing w:before="0" w:after="0"/>
         <w:rPr>
           <w:rFonts w:eastAsia="Times New Roman"/>
         </w:rPr>
@@ -175,7 +183,7 @@
           <w:ilvl w:val="1"/>
           <w:numId w:val="3"/>
         </w:numPr>
-        <w:spacing w:after="0"/>
+        <w:spacing w:before="0" w:after="0"/>
         <w:rPr>
           <w:rFonts w:eastAsia="Times New Roman"/>
         </w:rPr>
@@ -194,7 +202,7 @@
           <w:ilvl w:val="1"/>
           <w:numId w:val="3"/>
         </w:numPr>
-        <w:spacing w:after="0"/>
+        <w:spacing w:before="0" w:after="0"/>
         <w:rPr>
           <w:rFonts w:eastAsia="Times New Roman"/>
         </w:rPr>
@@ -213,7 +221,7 @@
           <w:ilvl w:val="1"/>
           <w:numId w:val="3"/>
         </w:numPr>
-        <w:spacing w:after="0"/>
+        <w:spacing w:before="0" w:after="0"/>
         <w:rPr>
           <w:rFonts w:eastAsia="Times New Roman"/>
         </w:rPr>
@@ -232,7 +240,7 @@
           <w:ilvl w:val="1"/>
           <w:numId w:val="3"/>
         </w:numPr>
-        <w:spacing w:after="0"/>
+        <w:spacing w:before="0" w:after="0"/>
         <w:rPr>
           <w:rFonts w:eastAsia="Times New Roman"/>
         </w:rPr>
@@ -251,7 +259,7 @@
           <w:ilvl w:val="0"/>
           <w:numId w:val="3"/>
         </w:numPr>
-        <w:spacing w:after="0"/>
+        <w:spacing w:before="0" w:after="0"/>
         <w:rPr>
           <w:rFonts w:eastAsia="Times New Roman"/>
         </w:rPr>
@@ -270,7 +278,7 @@
           <w:ilvl w:val="1"/>
           <w:numId w:val="3"/>
         </w:numPr>
-        <w:spacing w:after="0"/>
+        <w:spacing w:before="0" w:after="0"/>
         <w:rPr>
           <w:rFonts w:eastAsia="Times New Roman"/>
         </w:rPr>
@@ -289,7 +297,7 @@
           <w:ilvl w:val="1"/>
           <w:numId w:val="3"/>
         </w:numPr>
-        <w:spacing w:after="0"/>
+        <w:spacing w:before="0" w:after="0"/>
         <w:rPr>
           <w:rFonts w:eastAsia="Times New Roman"/>
         </w:rPr>
@@ -308,7 +316,7 @@
           <w:ilvl w:val="1"/>
           <w:numId w:val="3"/>
         </w:numPr>
-        <w:spacing w:after="0"/>
+        <w:spacing w:before="0" w:after="0"/>
         <w:rPr>
           <w:rFonts w:eastAsia="Times New Roman"/>
         </w:rPr>
@@ -327,7 +335,7 @@
           <w:ilvl w:val="1"/>
           <w:numId w:val="3"/>
         </w:numPr>
-        <w:spacing w:afterAutospacing="1"/>
+        <w:spacing w:before="0" w:afterAutospacing="1"/>
         <w:rPr>
           <w:rFonts w:eastAsia="Times New Roman"/>
         </w:rPr>
@@ -341,6 +349,7 @@
     </w:p>
     <w:p>
       <w:pPr>
+        <w:pStyle w:val="Normal"/>
         <w:spacing w:beforeAutospacing="1" w:afterAutospacing="1"/>
         <w:rPr>
           <w:rFonts w:eastAsia="Times New Roman"/>
@@ -369,7 +378,13 @@
         <w:rPr>
           <w:rFonts w:eastAsia="Times New Roman"/>
         </w:rPr>
-        <w:t>“Mới tạo” - người dùng vừa tạo ticket</w:t>
+        <w:t>“</w:t>
+      </w:r>
+      <w:r>
+        <w:rPr>
+          <w:rFonts w:eastAsia="Times New Roman"/>
+        </w:rPr>
+        <w:t>Mới tạo” - người dùng vừa tạo ticket</w:t>
       </w:r>
     </w:p>
     <w:p>
@@ -379,16 +394,22 @@
           <w:ilvl w:val="0"/>
           <w:numId w:val="3"/>
         </w:numPr>
-        <w:spacing w:after="0"/>
-        <w:rPr>
-          <w:rFonts w:eastAsia="Times New Roman"/>
-        </w:rPr>
-      </w:pPr>
-      <w:r>
-        <w:rPr>
-          <w:rFonts w:eastAsia="Times New Roman"/>
-        </w:rPr>
-        <w:t>“Đang xử lý” - quản trị viên cập nhập người xử lí</w:t>
+        <w:spacing w:before="0" w:after="0"/>
+        <w:rPr>
+          <w:rFonts w:eastAsia="Times New Roman"/>
+        </w:rPr>
+      </w:pPr>
+      <w:r>
+        <w:rPr>
+          <w:rFonts w:eastAsia="Times New Roman"/>
+        </w:rPr>
+        <w:t>“</w:t>
+      </w:r>
+      <w:r>
+        <w:rPr>
+          <w:rFonts w:eastAsia="Times New Roman"/>
+        </w:rPr>
+        <w:t>Đang xử lý” - quản trị viên cập nhập người xử lí</w:t>
       </w:r>
     </w:p>
     <w:p>
@@ -398,16 +419,22 @@
           <w:ilvl w:val="0"/>
           <w:numId w:val="3"/>
         </w:numPr>
-        <w:spacing w:after="0"/>
-        <w:rPr>
-          <w:rFonts w:eastAsia="Times New Roman"/>
-        </w:rPr>
-      </w:pPr>
-      <w:r>
-        <w:rPr>
-          <w:rFonts w:eastAsia="Times New Roman"/>
-        </w:rPr>
-        <w:t>“Đã xử lý xong” - người xử lí cập nhập đánh dấu đã xử lý xong</w:t>
+        <w:spacing w:before="0" w:after="0"/>
+        <w:rPr>
+          <w:rFonts w:eastAsia="Times New Roman"/>
+        </w:rPr>
+      </w:pPr>
+      <w:r>
+        <w:rPr>
+          <w:rFonts w:eastAsia="Times New Roman"/>
+        </w:rPr>
+        <w:t>“</w:t>
+      </w:r>
+      <w:r>
+        <w:rPr>
+          <w:rFonts w:eastAsia="Times New Roman"/>
+        </w:rPr>
+        <w:t>Đã xử lý xong” - người xử lí cập nhập đánh dấu đã xử lý xong</w:t>
       </w:r>
     </w:p>
     <w:p>
@@ -417,20 +444,27 @@
           <w:ilvl w:val="0"/>
           <w:numId w:val="3"/>
         </w:numPr>
-        <w:spacing w:after="0"/>
-        <w:rPr>
-          <w:rFonts w:eastAsia="Times New Roman"/>
-        </w:rPr>
-      </w:pPr>
-      <w:r>
-        <w:rPr>
-          <w:rFonts w:eastAsia="Times New Roman"/>
-        </w:rPr>
-        <w:t>“Đóng” - người dùng chấp nhận kết quả xử lí</w:t>
-      </w:r>
-    </w:p>
-    <w:p>
-      <w:pPr>
+        <w:spacing w:before="0" w:after="0"/>
+        <w:rPr>
+          <w:rFonts w:eastAsia="Times New Roman"/>
+        </w:rPr>
+      </w:pPr>
+      <w:r>
+        <w:rPr>
+          <w:rFonts w:eastAsia="Times New Roman"/>
+        </w:rPr>
+        <w:t>“</w:t>
+      </w:r>
+      <w:r>
+        <w:rPr>
+          <w:rFonts w:eastAsia="Times New Roman"/>
+        </w:rPr>
+        <w:t>Đóng” - người dùng chấp nhận kết quả xử lí</w:t>
+      </w:r>
+    </w:p>
+    <w:p>
+      <w:pPr>
+        <w:pStyle w:val="Normal"/>
         <w:spacing w:beforeAutospacing="1" w:afterAutospacing="1"/>
         <w:rPr>
           <w:rFonts w:eastAsia="Times New Roman"/>
@@ -469,7 +503,7 @@
           <w:ilvl w:val="0"/>
           <w:numId w:val="3"/>
         </w:numPr>
-        <w:spacing w:after="0"/>
+        <w:spacing w:before="0" w:after="0"/>
         <w:rPr>
           <w:rFonts w:eastAsia="Times New Roman"/>
         </w:rPr>
@@ -488,7 +522,7 @@
           <w:ilvl w:val="0"/>
           <w:numId w:val="3"/>
         </w:numPr>
-        <w:spacing w:after="0"/>
+        <w:spacing w:before="0" w:after="0"/>
         <w:rPr>
           <w:rFonts w:eastAsia="Times New Roman"/>
         </w:rPr>
@@ -507,7 +541,7 @@
           <w:ilvl w:val="0"/>
           <w:numId w:val="3"/>
         </w:numPr>
-        <w:spacing w:afterAutospacing="1"/>
+        <w:spacing w:before="0" w:afterAutospacing="1"/>
         <w:rPr>
           <w:rFonts w:eastAsia="Times New Roman"/>
         </w:rPr>
@@ -521,6 +555,7 @@
     </w:p>
     <w:p>
       <w:pPr>
+        <w:pStyle w:val="Normal"/>
         <w:spacing w:beforeAutospacing="1" w:afterAutospacing="1"/>
         <w:rPr>
           <w:rFonts w:eastAsia="Times New Roman"/>
@@ -545,17 +580,29 @@
           <w:rFonts w:eastAsia="Times New Roman"/>
         </w:rPr>
       </w:pPr>
-    </w:p>
-    <w:p>
-      <w:pPr>
-        <w:spacing w:beforeAutospacing="1" w:afterAutospacing="1"/>
-        <w:rPr>
-          <w:rFonts w:eastAsia="Times New Roman"/>
-        </w:rPr>
-      </w:pPr>
-    </w:p>
-    <w:p>
-      <w:pPr>
+      <w:r>
+        <w:rPr>
+          <w:rFonts w:eastAsia="Times New Roman"/>
+        </w:rPr>
+      </w:r>
+    </w:p>
+    <w:p>
+      <w:pPr>
+        <w:pStyle w:val="Normal"/>
+        <w:spacing w:beforeAutospacing="1" w:afterAutospacing="1"/>
+        <w:rPr>
+          <w:rFonts w:eastAsia="Times New Roman"/>
+        </w:rPr>
+      </w:pPr>
+      <w:r>
+        <w:rPr>
+          <w:rFonts w:eastAsia="Times New Roman"/>
+        </w:rPr>
+      </w:r>
+    </w:p>
+    <w:p>
+      <w:pPr>
+        <w:pStyle w:val="Normal"/>
         <w:spacing w:beforeAutospacing="1" w:afterAutospacing="1"/>
         <w:rPr>
           <w:rFonts w:eastAsia="Times New Roman"/>
@@ -570,6 +617,7 @@
     </w:p>
     <w:p>
       <w:pPr>
+        <w:pStyle w:val="Normal"/>
         <w:spacing w:beforeAutospacing="1" w:afterAutospacing="1"/>
         <w:rPr>
           <w:rFonts w:eastAsia="Times New Roman"/>
@@ -608,16 +656,15 @@
           <w:ilvl w:val="1"/>
           <w:numId w:val="3"/>
         </w:numPr>
-        <w:spacing w:after="0"/>
-        <w:rPr>
-          <w:rFonts w:eastAsia="Times New Roman"/>
-        </w:rPr>
-      </w:pPr>
-      <w:r>
-        <w:rPr>
-          <w:rFonts w:eastAsia="Times New Roman"/>
-        </w:rPr>
-        <w:lastRenderedPageBreak/>
+        <w:spacing w:before="0" w:after="0"/>
+        <w:rPr>
+          <w:rFonts w:eastAsia="Times New Roman"/>
+        </w:rPr>
+      </w:pPr>
+      <w:r>
+        <w:rPr>
+          <w:rFonts w:eastAsia="Times New Roman"/>
+        </w:rPr>
         <w:t>Mức ưu tiên</w:t>
       </w:r>
     </w:p>
@@ -628,8 +675,10 @@
           <w:ilvl w:val="1"/>
           <w:numId w:val="3"/>
         </w:numPr>
-      </w:pPr>
-      <w:r>
+        <w:rPr/>
+      </w:pPr>
+      <w:r>
+        <w:rPr/>
         <w:t>Tên</w:t>
       </w:r>
     </w:p>
@@ -640,6 +689,7 @@
           <w:ilvl w:val="1"/>
           <w:numId w:val="3"/>
         </w:numPr>
+        <w:rPr/>
       </w:pPr>
       <w:r>
         <w:rPr>
@@ -655,7 +705,7 @@
           <w:ilvl w:val="1"/>
           <w:numId w:val="3"/>
         </w:numPr>
-        <w:spacing w:afterAutospacing="1"/>
+        <w:spacing w:before="0" w:afterAutospacing="1"/>
         <w:rPr>
           <w:rFonts w:eastAsia="Times New Roman"/>
         </w:rPr>
@@ -669,6 +719,7 @@
     </w:p>
     <w:p>
       <w:pPr>
+        <w:pStyle w:val="Normal"/>
         <w:spacing w:beforeAutospacing="1" w:afterAutospacing="1"/>
         <w:rPr>
           <w:rFonts w:eastAsia="Times New Roman"/>
@@ -707,7 +758,7 @@
           <w:ilvl w:val="1"/>
           <w:numId w:val="3"/>
         </w:numPr>
-        <w:spacing w:after="0"/>
+        <w:spacing w:before="0" w:after="0"/>
         <w:rPr>
           <w:rFonts w:eastAsia="Times New Roman"/>
         </w:rPr>
@@ -726,7 +777,7 @@
           <w:ilvl w:val="1"/>
           <w:numId w:val="3"/>
         </w:numPr>
-        <w:spacing w:after="0"/>
+        <w:spacing w:before="0" w:after="0"/>
         <w:rPr>
           <w:rFonts w:eastAsia="Times New Roman"/>
         </w:rPr>
@@ -745,7 +796,7 @@
           <w:ilvl w:val="0"/>
           <w:numId w:val="3"/>
         </w:numPr>
-        <w:spacing w:after="0"/>
+        <w:spacing w:before="0" w:after="0"/>
         <w:rPr>
           <w:rFonts w:eastAsia="Times New Roman"/>
         </w:rPr>
@@ -764,7 +815,7 @@
           <w:ilvl w:val="1"/>
           <w:numId w:val="3"/>
         </w:numPr>
-        <w:spacing w:after="0"/>
+        <w:spacing w:before="0" w:after="0"/>
         <w:rPr>
           <w:rFonts w:eastAsia="Times New Roman"/>
         </w:rPr>
@@ -783,7 +834,7 @@
           <w:ilvl w:val="1"/>
           <w:numId w:val="3"/>
         </w:numPr>
-        <w:spacing w:after="0"/>
+        <w:spacing w:before="0" w:after="0"/>
         <w:rPr>
           <w:rFonts w:eastAsia="Times New Roman"/>
         </w:rPr>
@@ -802,7 +853,7 @@
           <w:ilvl w:val="1"/>
           <w:numId w:val="3"/>
         </w:numPr>
-        <w:spacing w:after="0"/>
+        <w:spacing w:before="0" w:after="0"/>
         <w:rPr>
           <w:rFonts w:eastAsia="Times New Roman"/>
         </w:rPr>
@@ -821,7 +872,7 @@
           <w:ilvl w:val="1"/>
           <w:numId w:val="3"/>
         </w:numPr>
-        <w:spacing w:afterAutospacing="1"/>
+        <w:spacing w:before="0" w:afterAutospacing="1"/>
         <w:rPr>
           <w:rFonts w:eastAsia="Times New Roman"/>
         </w:rPr>
@@ -835,6 +886,7 @@
     </w:p>
     <w:p>
       <w:pPr>
+        <w:pStyle w:val="Normal"/>
         <w:spacing w:beforeAutospacing="1" w:afterAutospacing="1"/>
         <w:rPr>
           <w:rFonts w:eastAsia="Times New Roman" w:cs="Times New Roman"/>
@@ -857,22 +909,16 @@
           <w:ilvl w:val="0"/>
           <w:numId w:val="3"/>
         </w:numPr>
-        <w:spacing w:beforeAutospacing="1" w:afterAutospacing="1"/>
-        <w:rPr>
-          <w:rFonts w:eastAsia="Times New Roman"/>
-        </w:rPr>
-      </w:pPr>
-      <w:r>
-        <w:rPr>
-          <w:rFonts w:eastAsia="Times New Roman"/>
-        </w:rPr>
-        <w:t>Rol</w:t>
-      </w:r>
-      <w:r>
-        <w:rPr>
-          <w:rFonts w:eastAsia="Times New Roman"/>
-        </w:rPr>
-        <w:t>e</w:t>
+        <w:spacing w:beforeAutospacing="1" w:after="0"/>
+        <w:rPr>
+          <w:rFonts w:eastAsia="Times New Roman"/>
+        </w:rPr>
+      </w:pPr>
+      <w:r>
+        <w:rPr>
+          <w:rFonts w:eastAsia="Times New Roman"/>
+        </w:rPr>
+        <w:t>Role</w:t>
       </w:r>
     </w:p>
     <w:p>
@@ -882,7 +928,7 @@
           <w:ilvl w:val="0"/>
           <w:numId w:val="3"/>
         </w:numPr>
-        <w:spacing w:beforeAutospacing="1" w:afterAutospacing="1"/>
+        <w:spacing w:before="0" w:after="0"/>
         <w:rPr>
           <w:rFonts w:eastAsia="Times New Roman"/>
         </w:rPr>
@@ -901,7 +947,7 @@
           <w:ilvl w:val="0"/>
           <w:numId w:val="3"/>
         </w:numPr>
-        <w:spacing w:beforeAutospacing="1" w:afterAutospacing="1"/>
+        <w:spacing w:before="0" w:after="0"/>
         <w:rPr>
           <w:rFonts w:eastAsia="Times New Roman"/>
         </w:rPr>
@@ -920,7 +966,7 @@
           <w:ilvl w:val="0"/>
           <w:numId w:val="3"/>
         </w:numPr>
-        <w:spacing w:beforeAutospacing="1" w:afterAutospacing="1"/>
+        <w:spacing w:before="0" w:after="0"/>
         <w:rPr>
           <w:rFonts w:eastAsia="Times New Roman"/>
         </w:rPr>
@@ -939,7 +985,7 @@
           <w:ilvl w:val="0"/>
           <w:numId w:val="3"/>
         </w:numPr>
-        <w:spacing w:beforeAutospacing="1" w:afterAutospacing="1"/>
+        <w:spacing w:before="0" w:afterAutospacing="1"/>
         <w:rPr>
           <w:rFonts w:eastAsia="Times New Roman"/>
         </w:rPr>
@@ -953,14 +999,21 @@
     </w:p>
     <w:p>
       <w:pPr>
-        <w:spacing w:beforeAutospacing="1" w:afterAutospacing="1"/>
-        <w:rPr>
-          <w:rFonts w:eastAsia="Times New Roman"/>
-        </w:rPr>
-      </w:pPr>
-    </w:p>
-    <w:p>
-      <w:pPr>
+        <w:pStyle w:val="Normal"/>
+        <w:spacing w:beforeAutospacing="1" w:afterAutospacing="1"/>
+        <w:rPr>
+          <w:rFonts w:eastAsia="Times New Roman"/>
+        </w:rPr>
+      </w:pPr>
+      <w:r>
+        <w:rPr>
+          <w:rFonts w:eastAsia="Times New Roman"/>
+        </w:rPr>
+      </w:r>
+    </w:p>
+    <w:p>
+      <w:pPr>
+        <w:pStyle w:val="Normal"/>
         <w:spacing w:beforeAutospacing="1" w:afterAutospacing="1"/>
         <w:rPr>
           <w:rFonts w:eastAsia="Times New Roman"/>
@@ -994,6 +1047,7 @@
     </w:p>
     <w:p>
       <w:pPr>
+        <w:pStyle w:val="Normal"/>
         <w:spacing w:beforeAutospacing="1" w:afterAutospacing="1"/>
         <w:rPr>
           <w:rFonts w:eastAsia="Times New Roman"/>
@@ -1008,6 +1062,7 @@
     </w:p>
     <w:p>
       <w:pPr>
+        <w:pStyle w:val="Normal"/>
         <w:spacing w:beforeAutospacing="1" w:afterAutospacing="1"/>
         <w:rPr>
           <w:rFonts w:eastAsia="Times New Roman"/>
@@ -1022,6 +1077,7 @@
     </w:p>
     <w:p>
       <w:pPr>
+        <w:pStyle w:val="Normal"/>
         <w:spacing w:beforeAutospacing="1" w:afterAutospacing="1"/>
         <w:rPr>
           <w:rFonts w:eastAsia="Times New Roman"/>
@@ -1036,130 +1092,69 @@
     </w:p>
     <w:p>
       <w:pPr>
-        <w:spacing w:beforeAutospacing="1" w:afterAutospacing="1"/>
-        <w:rPr>
-          <w:rFonts w:eastAsia="Times New Roman"/>
-        </w:rPr>
-      </w:pPr>
-    </w:p>
-    <w:p>
-      <w:pPr>
-        <w:spacing w:beforeAutospacing="1" w:afterAutospacing="1"/>
-        <w:rPr>
-          <w:rFonts w:eastAsia="Times New Roman"/>
-        </w:rPr>
-      </w:pPr>
-      <w:r>
-        <w:rPr>
-          <w:rFonts w:eastAsia="Times New Roman"/>
-        </w:rPr>
-        <w:t>post login(username, password)</w:t>
-      </w:r>
-      <w:r>
-        <w:rPr>
-          <w:rFonts w:eastAsia="Times New Roman"/>
-        </w:rPr>
-        <w:t xml:space="preserve"> </w:t>
-      </w:r>
-      <w:r>
-        <w:rPr>
-          <w:rFonts w:eastAsia="Times New Roman"/>
-        </w:rPr>
-        <w:t>/api</w:t>
-      </w:r>
-      <w:r>
-        <w:rPr>
-          <w:rFonts w:eastAsia="Times New Roman"/>
-        </w:rPr>
-        <w:t>/auth/login</w:t>
-      </w:r>
-    </w:p>
-    <w:p>
-      <w:pPr>
-        <w:spacing w:beforeAutospacing="1" w:afterAutospacing="1"/>
-        <w:rPr>
-          <w:rFonts w:eastAsia="Times New Roman"/>
-        </w:rPr>
-      </w:pPr>
-      <w:r>
-        <w:rPr>
-          <w:rFonts w:eastAsia="Times New Roman"/>
-        </w:rPr>
-        <w:t>post logout()</w:t>
-      </w:r>
-      <w:r>
-        <w:rPr>
-          <w:rFonts w:eastAsia="Times New Roman"/>
-        </w:rPr>
-        <w:t xml:space="preserve"> </w:t>
-      </w:r>
-      <w:r>
-        <w:rPr>
-          <w:rFonts w:eastAsia="Times New Roman"/>
-        </w:rPr>
-        <w:t>/api</w:t>
-      </w:r>
-      <w:r>
-        <w:rPr>
-          <w:rFonts w:eastAsia="Times New Roman"/>
-        </w:rPr>
-        <w:t>/auth/logout</w:t>
-      </w:r>
-    </w:p>
-    <w:p>
-      <w:pPr>
-        <w:spacing w:beforeAutospacing="1" w:afterAutospacing="1"/>
-        <w:rPr>
-          <w:rFonts w:eastAsia="Times New Roman"/>
-        </w:rPr>
-      </w:pPr>
-      <w:r>
-        <w:rPr>
-          <w:rFonts w:eastAsia="Times New Roman"/>
-        </w:rPr>
-        <w:t>get get</w:t>
-      </w:r>
-      <w:r>
-        <w:rPr>
-          <w:rFonts w:eastAsia="Times New Roman"/>
-        </w:rPr>
-        <w:t>LoggedIn</w:t>
-      </w:r>
-      <w:r>
-        <w:rPr>
-          <w:rFonts w:eastAsia="Times New Roman"/>
-        </w:rPr>
-        <w:t xml:space="preserve">UserInfo() (jwt is embedded) </w:t>
-      </w:r>
-      <w:r>
-        <w:rPr>
-          <w:rFonts w:eastAsia="Times New Roman"/>
-        </w:rPr>
-        <w:t>/api/user</w:t>
-      </w:r>
-      <w:r>
-        <w:rPr>
-          <w:rFonts w:eastAsia="Times New Roman"/>
-        </w:rPr>
-        <w:t>s</w:t>
-      </w:r>
-      <w:r>
-        <w:rPr>
-          <w:rFonts w:eastAsia="Times New Roman"/>
-        </w:rPr>
-        <w:t>/</w:t>
-      </w:r>
-      <w:r>
-        <w:rPr>
-          <w:rFonts w:eastAsia="Times New Roman"/>
-        </w:rPr>
-        <w:t>me</w:t>
-      </w:r>
-    </w:p>
-    <w:p>
-      <w:pPr>
+        <w:pStyle w:val="Normal"/>
+        <w:spacing w:beforeAutospacing="1" w:afterAutospacing="1"/>
+        <w:rPr>
+          <w:rFonts w:eastAsia="Times New Roman"/>
+        </w:rPr>
+      </w:pPr>
+      <w:r>
+        <w:rPr>
+          <w:rFonts w:eastAsia="Times New Roman"/>
+        </w:rPr>
+      </w:r>
+    </w:p>
+    <w:p>
+      <w:pPr>
+        <w:pStyle w:val="Normal"/>
+        <w:spacing w:beforeAutospacing="1" w:afterAutospacing="1"/>
+        <w:rPr>
+          <w:rFonts w:eastAsia="Times New Roman"/>
+        </w:rPr>
+      </w:pPr>
+      <w:r>
+        <w:rPr>
+          <w:rFonts w:eastAsia="Times New Roman"/>
+        </w:rPr>
+        <w:t>post login(username, password) /api/auth/login</w:t>
+      </w:r>
+    </w:p>
+    <w:p>
+      <w:pPr>
+        <w:pStyle w:val="Normal"/>
+        <w:spacing w:beforeAutospacing="1" w:afterAutospacing="1"/>
+        <w:rPr>
+          <w:rFonts w:eastAsia="Times New Roman"/>
+        </w:rPr>
+      </w:pPr>
+      <w:r>
+        <w:rPr>
+          <w:rFonts w:eastAsia="Times New Roman"/>
+        </w:rPr>
+        <w:t>post logout() /api/auth/logout</w:t>
+      </w:r>
+    </w:p>
+    <w:p>
+      <w:pPr>
+        <w:pStyle w:val="Normal"/>
+        <w:spacing w:beforeAutospacing="1" w:afterAutospacing="1"/>
+        <w:rPr>
+          <w:rFonts w:eastAsia="Times New Roman"/>
+        </w:rPr>
+      </w:pPr>
+      <w:r>
+        <w:rPr>
+          <w:rFonts w:eastAsia="Times New Roman"/>
+        </w:rPr>
+        <w:t>get getLoggedInUserInfo() (jwt is embedded) /api/users/me</w:t>
+      </w:r>
+    </w:p>
+    <w:p>
+      <w:pPr>
+        <w:pStyle w:val="Normal"/>
         <w:tabs>
-          <w:tab w:val="left" w:pos="6318"/>
+          <w:tab w:val="clear" w:pos="720"/>
+          <w:tab w:val="left" w:pos="6318" w:leader="none"/>
         </w:tabs>
         <w:spacing w:beforeAutospacing="1" w:afterAutospacing="1"/>
         <w:rPr>
@@ -1170,306 +1165,147 @@
         <w:rPr>
           <w:rFonts w:eastAsia="Times New Roman"/>
         </w:rPr>
-        <w:lastRenderedPageBreak/>
-        <w:t>post create ticket(Title, Description, Priority, Type (Optional), File (Optional)) → void</w:t>
-      </w:r>
-      <w:r>
-        <w:rPr>
-          <w:rFonts w:eastAsia="Times New Roman"/>
-        </w:rPr>
-        <w:t xml:space="preserve"> /api/ticket</w:t>
-      </w:r>
-      <w:r>
-        <w:rPr>
-          <w:rFonts w:eastAsia="Times New Roman"/>
-        </w:rPr>
-        <w:t>s</w:t>
-      </w:r>
-    </w:p>
-    <w:p>
-      <w:pPr>
-        <w:spacing w:beforeAutospacing="1" w:afterAutospacing="1"/>
-        <w:rPr>
-          <w:rFonts w:eastAsia="Times New Roman"/>
-        </w:rPr>
-      </w:pPr>
-      <w:r>
-        <w:rPr>
-          <w:rFonts w:eastAsia="Times New Roman"/>
-        </w:rPr>
-        <w:t>get getTickets</w:t>
-      </w:r>
-      <w:r>
-        <w:rPr>
-          <w:rFonts w:eastAsia="Times New Roman"/>
-        </w:rPr>
-        <w:t>(</w:t>
-      </w:r>
-      <w:r>
-        <w:rPr>
-          <w:rFonts w:eastAsia="Times New Roman"/>
-        </w:rPr>
-        <w:t>) → tickets</w:t>
-      </w:r>
-      <w:r>
-        <w:rPr>
-          <w:rFonts w:eastAsia="Times New Roman"/>
-        </w:rPr>
-        <w:t xml:space="preserve"> /api/tickets</w:t>
-      </w:r>
-    </w:p>
-    <w:p>
-      <w:pPr>
-        <w:spacing w:beforeAutospacing="1" w:afterAutospacing="1"/>
-        <w:rPr>
-          <w:rFonts w:eastAsia="Times New Roman"/>
-        </w:rPr>
-      </w:pPr>
-      <w:r>
-        <w:rPr>
-          <w:rFonts w:eastAsia="Times New Roman"/>
-        </w:rPr>
-        <w:t>get viewTickets(ticketID) → ticket</w:t>
-      </w:r>
-      <w:r>
-        <w:rPr>
-          <w:rFonts w:eastAsia="Times New Roman"/>
-        </w:rPr>
-        <w:t xml:space="preserve"> /api/tickets/{id}</w:t>
-      </w:r>
-    </w:p>
-    <w:p>
-      <w:pPr>
-        <w:spacing w:beforeAutospacing="1" w:afterAutospacing="1"/>
-        <w:rPr>
-          <w:rFonts w:eastAsia="Times New Roman"/>
-        </w:rPr>
-      </w:pPr>
-      <w:r>
-        <w:rPr>
-          <w:rFonts w:eastAsia="Times New Roman"/>
-        </w:rPr>
-        <w:t>p</w:t>
-      </w:r>
-      <w:r>
-        <w:rPr>
-          <w:rFonts w:eastAsia="Times New Roman"/>
-        </w:rPr>
-        <w:t>u</w:t>
-      </w:r>
-      <w:r>
-        <w:rPr>
-          <w:rFonts w:eastAsia="Times New Roman"/>
-        </w:rPr>
-        <w:t>t updateTicketStatus(ticketID, statusCode)</w:t>
-      </w:r>
-      <w:r>
-        <w:rPr>
-          <w:rFonts w:eastAsia="Times New Roman"/>
-        </w:rPr>
-        <w:t xml:space="preserve"> /api/tickets/{id}</w:t>
-      </w:r>
-    </w:p>
-    <w:p>
-      <w:pPr>
-        <w:spacing w:beforeAutospacing="1" w:afterAutospacing="1"/>
-        <w:rPr>
-          <w:rFonts w:eastAsia="Times New Roman"/>
-        </w:rPr>
-      </w:pPr>
-      <w:r>
-        <w:rPr>
-          <w:rFonts w:eastAsia="Times New Roman"/>
-        </w:rPr>
-        <w:t>post addAssignee(ticketID, userID)</w:t>
-      </w:r>
-      <w:r>
-        <w:rPr>
-          <w:rFonts w:eastAsia="Times New Roman"/>
-        </w:rPr>
-        <w:t xml:space="preserve"> /api/tickets/{id}/assignees</w:t>
-      </w:r>
-    </w:p>
-    <w:p>
-      <w:pPr>
-        <w:spacing w:beforeAutospacing="1" w:afterAutospacing="1"/>
-        <w:rPr>
-          <w:rFonts w:eastAsia="Times New Roman"/>
-        </w:rPr>
-      </w:pPr>
-      <w:r>
-        <w:rPr>
-          <w:rFonts w:eastAsia="Times New Roman"/>
-        </w:rPr>
-        <w:t>post addComment(ticketID, attachedFile (Optional</w:t>
-      </w:r>
-      <w:r>
-        <w:rPr>
-          <w:rFonts w:eastAsia="Times New Roman"/>
-        </w:rPr>
-        <w:t>)</w:t>
-      </w:r>
-      <w:r>
-        <w:rPr>
-          <w:rFonts w:eastAsia="Times New Roman"/>
-        </w:rPr>
-        <w:t>)</w:t>
-      </w:r>
-      <w:r>
-        <w:rPr>
-          <w:rFonts w:eastAsia="Times New Roman"/>
-        </w:rPr>
-        <w:t xml:space="preserve"> /api/tickets/{id}/comments</w:t>
-      </w:r>
-    </w:p>
-    <w:p>
-      <w:pPr>
-        <w:spacing w:beforeAutospacing="1" w:afterAutospacing="1"/>
-        <w:rPr>
-          <w:rFonts w:eastAsia="Times New Roman"/>
-        </w:rPr>
-      </w:pPr>
-      <w:r>
-        <w:rPr>
-          <w:rFonts w:eastAsia="Times New Roman"/>
-        </w:rPr>
-        <w:t>post addAccount(username, passwor</w:t>
-      </w:r>
-      <w:r>
-        <w:rPr>
-          <w:rFonts w:eastAsia="Times New Roman"/>
-        </w:rPr>
-        <w:t>d</w:t>
-      </w:r>
-      <w:r>
-        <w:rPr>
-          <w:rFonts w:eastAsia="Times New Roman"/>
-        </w:rPr>
-        <w:t>)</w:t>
-      </w:r>
-      <w:r>
-        <w:rPr>
-          <w:rFonts w:eastAsia="Times New Roman"/>
-        </w:rPr>
-        <w:t xml:space="preserve"> /api/users</w:t>
-      </w:r>
-    </w:p>
-    <w:p>
-      <w:pPr>
-        <w:spacing w:beforeAutospacing="1" w:afterAutospacing="1"/>
-        <w:rPr>
-          <w:rFonts w:eastAsia="Times New Roman"/>
-        </w:rPr>
-      </w:pPr>
-      <w:r>
-        <w:rPr>
-          <w:rFonts w:eastAsia="Times New Roman"/>
-        </w:rPr>
-        <w:t>get getAccount</w:t>
-      </w:r>
-      <w:r>
-        <w:rPr>
-          <w:rFonts w:eastAsia="Times New Roman"/>
-        </w:rPr>
-        <w:t>(</w:t>
-      </w:r>
-      <w:r>
-        <w:rPr>
-          <w:rFonts w:eastAsia="Times New Roman"/>
-        </w:rPr>
-        <w:t>username</w:t>
-      </w:r>
-      <w:r>
-        <w:rPr>
-          <w:rFonts w:eastAsia="Times New Roman"/>
-        </w:rPr>
-        <w:t>)</w:t>
-      </w:r>
-      <w:r>
-        <w:rPr>
-          <w:rFonts w:eastAsia="Times New Roman"/>
-        </w:rPr>
-        <w:t xml:space="preserve"> /api/users/{id}</w:t>
-      </w:r>
-    </w:p>
-    <w:p>
-      <w:pPr>
-        <w:spacing w:beforeAutospacing="1" w:afterAutospacing="1"/>
-        <w:rPr>
-          <w:rFonts w:eastAsia="Times New Roman"/>
-        </w:rPr>
-      </w:pPr>
-      <w:r>
-        <w:rPr>
-          <w:rFonts w:eastAsia="Times New Roman"/>
-        </w:rPr>
-        <w:t>p</w:t>
-      </w:r>
-      <w:r>
-        <w:rPr>
-          <w:rFonts w:eastAsia="Times New Roman"/>
-        </w:rPr>
-        <w:t>ut</w:t>
-      </w:r>
-      <w:r>
-        <w:rPr>
-          <w:rFonts w:eastAsia="Times New Roman"/>
-        </w:rPr>
-        <w:t xml:space="preserve"> change</w:t>
-      </w:r>
-      <w:r>
-        <w:rPr>
-          <w:rFonts w:eastAsia="Times New Roman"/>
-        </w:rPr>
-        <w:t>User</w:t>
-      </w:r>
-      <w:r>
-        <w:rPr>
-          <w:rFonts w:eastAsia="Times New Roman"/>
-        </w:rPr>
-        <w:t>Password(password, newPassword)</w:t>
-      </w:r>
-      <w:r>
-        <w:rPr>
-          <w:rFonts w:eastAsia="Times New Roman"/>
-        </w:rPr>
-        <w:t xml:space="preserve"> /api/user</w:t>
-      </w:r>
-      <w:r>
-        <w:rPr>
-          <w:rFonts w:eastAsia="Times New Roman"/>
-        </w:rPr>
-        <w:t>s/{id}/password</w:t>
-      </w:r>
-    </w:p>
-    <w:p>
-      <w:pPr>
-        <w:spacing w:beforeAutospacing="1" w:afterAutospacing="1"/>
-        <w:rPr>
-          <w:rFonts w:eastAsia="Times New Roman"/>
-        </w:rPr>
-      </w:pPr>
-      <w:r>
-        <w:rPr>
-          <w:rFonts w:eastAsia="Times New Roman"/>
-        </w:rPr>
-        <w:t>put changeUserPassword(newPassword) /api/</w:t>
-      </w:r>
-      <w:r>
-        <w:rPr>
-          <w:rFonts w:eastAsia="Times New Roman"/>
-        </w:rPr>
-        <w:t>admin/users/</w:t>
-      </w:r>
-      <w:r>
-        <w:rPr>
-          <w:rFonts w:eastAsia="Times New Roman"/>
-        </w:rPr>
-        <w:t>{userID}/password (API for admin only)</w:t>
-      </w:r>
-    </w:p>
-    <w:p>
-      <w:pPr>
+        <w:t>post create ticket(Title, Description, Priority, Type (Optional), File (Optional)) → void /api/tickets</w:t>
+      </w:r>
+    </w:p>
+    <w:p>
+      <w:pPr>
+        <w:pStyle w:val="Normal"/>
+        <w:spacing w:beforeAutospacing="1" w:afterAutospacing="1"/>
+        <w:rPr>
+          <w:rFonts w:eastAsia="Times New Roman"/>
+        </w:rPr>
+      </w:pPr>
+      <w:r>
+        <w:rPr>
+          <w:rFonts w:eastAsia="Times New Roman"/>
+        </w:rPr>
+        <w:t>get getTickets() → tickets /api/tickets</w:t>
+      </w:r>
+    </w:p>
+    <w:p>
+      <w:pPr>
+        <w:pStyle w:val="Normal"/>
+        <w:spacing w:beforeAutospacing="1" w:afterAutospacing="1"/>
+        <w:rPr>
+          <w:rFonts w:eastAsia="Times New Roman"/>
+        </w:rPr>
+      </w:pPr>
+      <w:r>
+        <w:rPr>
+          <w:rFonts w:eastAsia="Times New Roman"/>
+        </w:rPr>
+        <w:t>get viewTickets(ticketID) → ticket /api/tickets/{id}</w:t>
+      </w:r>
+    </w:p>
+    <w:p>
+      <w:pPr>
+        <w:pStyle w:val="Normal"/>
+        <w:spacing w:beforeAutospacing="1" w:afterAutospacing="1"/>
+        <w:rPr>
+          <w:rFonts w:eastAsia="Times New Roman"/>
+        </w:rPr>
+      </w:pPr>
+      <w:r>
+        <w:rPr>
+          <w:rFonts w:eastAsia="Times New Roman"/>
+        </w:rPr>
+        <w:t>put updateTicketStatus(ticketID, statusCode) /api/tickets/{id}</w:t>
+      </w:r>
+    </w:p>
+    <w:p>
+      <w:pPr>
+        <w:pStyle w:val="Normal"/>
+        <w:spacing w:beforeAutospacing="1" w:afterAutospacing="1"/>
+        <w:rPr>
+          <w:rFonts w:eastAsia="Times New Roman"/>
+        </w:rPr>
+      </w:pPr>
+      <w:r>
+        <w:rPr>
+          <w:rFonts w:eastAsia="Times New Roman"/>
+        </w:rPr>
+        <w:t>post addAssignee(ticketID, userID) /api/tickets/{id}/assignees</w:t>
+      </w:r>
+    </w:p>
+    <w:p>
+      <w:pPr>
+        <w:pStyle w:val="Normal"/>
+        <w:spacing w:beforeAutospacing="1" w:afterAutospacing="1"/>
+        <w:rPr>
+          <w:rFonts w:eastAsia="Times New Roman"/>
+        </w:rPr>
+      </w:pPr>
+      <w:r>
+        <w:rPr>
+          <w:rFonts w:eastAsia="Times New Roman"/>
+        </w:rPr>
+        <w:t>post addComment(ticketID, attachedFile (Optional)) /api/tickets/{id}/comments</w:t>
+      </w:r>
+    </w:p>
+    <w:p>
+      <w:pPr>
+        <w:pStyle w:val="Normal"/>
+        <w:spacing w:beforeAutospacing="1" w:afterAutospacing="1"/>
+        <w:rPr>
+          <w:rFonts w:eastAsia="Times New Roman"/>
+        </w:rPr>
+      </w:pPr>
+      <w:r>
+        <w:rPr>
+          <w:rFonts w:eastAsia="Times New Roman"/>
+        </w:rPr>
+        <w:t>post addAccount(username, password) /api/users</w:t>
+      </w:r>
+    </w:p>
+    <w:p>
+      <w:pPr>
+        <w:pStyle w:val="Normal"/>
+        <w:spacing w:beforeAutospacing="1" w:afterAutospacing="1"/>
+        <w:rPr>
+          <w:rFonts w:eastAsia="Times New Roman"/>
+        </w:rPr>
+      </w:pPr>
+      <w:r>
+        <w:rPr>
+          <w:rFonts w:eastAsia="Times New Roman"/>
+        </w:rPr>
+        <w:t>get getAccount(username) /api/users/{id}</w:t>
+      </w:r>
+    </w:p>
+    <w:p>
+      <w:pPr>
+        <w:pStyle w:val="Normal"/>
+        <w:spacing w:beforeAutospacing="1" w:afterAutospacing="1"/>
+        <w:rPr>
+          <w:rFonts w:eastAsia="Times New Roman"/>
+        </w:rPr>
+      </w:pPr>
+      <w:r>
+        <w:rPr>
+          <w:rFonts w:eastAsia="Times New Roman"/>
+        </w:rPr>
+        <w:t>put changeUserPassword(password, newPassword) /api/users/{id}/password</w:t>
+      </w:r>
+    </w:p>
+    <w:p>
+      <w:pPr>
+        <w:pStyle w:val="Normal"/>
+        <w:spacing w:beforeAutospacing="1" w:afterAutospacing="1"/>
+        <w:rPr>
+          <w:rFonts w:eastAsia="Times New Roman"/>
+        </w:rPr>
+      </w:pPr>
+      <w:r>
+        <w:rPr>
+          <w:rFonts w:eastAsia="Times New Roman"/>
+        </w:rPr>
+        <w:t>put changeUserPassword(newPassword) /api/admin/users/{userID}/password (API for admin only)</w:t>
+      </w:r>
+    </w:p>
+    <w:p>
+      <w:pPr>
+        <w:pStyle w:val="Normal"/>
         <w:spacing w:beforeAutospacing="1" w:afterAutospacing="1"/>
         <w:rPr>
           <w:rFonts w:eastAsia="Times New Roman"/>
@@ -1484,138 +1320,96 @@
     </w:p>
     <w:p>
       <w:pPr>
-        <w:spacing w:beforeAutospacing="1" w:afterAutospacing="1"/>
-        <w:rPr>
-          <w:rFonts w:eastAsia="Times New Roman"/>
-        </w:rPr>
-      </w:pPr>
-      <w:r>
-        <w:rPr>
-          <w:rFonts w:eastAsia="Times New Roman"/>
-        </w:rPr>
-        <w:t>p</w:t>
-      </w:r>
-      <w:r>
-        <w:rPr>
-          <w:rFonts w:eastAsia="Times New Roman"/>
-        </w:rPr>
-        <w:t>ut</w:t>
-      </w:r>
-      <w:r>
-        <w:rPr>
-          <w:rFonts w:eastAsia="Times New Roman"/>
-        </w:rPr>
-        <w:t xml:space="preserve"> changeDepartment(department)</w:t>
-      </w:r>
-      <w:r>
-        <w:rPr>
-          <w:rFonts w:eastAsia="Times New Roman"/>
-        </w:rPr>
-        <w:t xml:space="preserve"> /api/admin/users/{userID}/department</w:t>
-      </w:r>
-    </w:p>
-    <w:p>
-      <w:pPr>
-        <w:spacing w:beforeAutospacing="1" w:afterAutospacing="1"/>
-        <w:rPr>
-          <w:rFonts w:eastAsia="Times New Roman"/>
-        </w:rPr>
-      </w:pPr>
-      <w:r>
-        <w:rPr>
-          <w:rFonts w:eastAsia="Times New Roman"/>
-        </w:rPr>
-        <w:t xml:space="preserve">delete deleteAccount(userID) </w:t>
-      </w:r>
-      <w:r>
-        <w:rPr>
-          <w:rFonts w:eastAsia="Times New Roman"/>
-        </w:rPr>
-        <w:t>/api/admin/users/{userID}</w:t>
-      </w:r>
-    </w:p>
-    <w:p>
-      <w:pPr>
-        <w:spacing w:beforeAutospacing="1" w:afterAutospacing="1"/>
-        <w:rPr>
-          <w:rFonts w:eastAsia="Times New Roman"/>
-        </w:rPr>
-      </w:pPr>
-      <w:r>
-        <w:rPr>
-          <w:rFonts w:eastAsia="Times New Roman"/>
-        </w:rPr>
-        <w:t>get getPriorities()</w:t>
-      </w:r>
-      <w:r>
-        <w:rPr>
-          <w:rFonts w:eastAsia="Times New Roman"/>
-        </w:rPr>
-        <w:t xml:space="preserve"> /api/admin/priorities</w:t>
-      </w:r>
-    </w:p>
-    <w:p>
-      <w:pPr>
-        <w:spacing w:beforeAutospacing="1" w:afterAutospacing="1"/>
-        <w:rPr>
-          <w:rFonts w:eastAsia="Times New Roman"/>
-        </w:rPr>
-      </w:pPr>
-      <w:r>
-        <w:rPr>
-          <w:rFonts w:eastAsia="Times New Roman"/>
-        </w:rPr>
-        <w:t>p</w:t>
-      </w:r>
-      <w:r>
-        <w:rPr>
-          <w:rFonts w:eastAsia="Times New Roman"/>
-        </w:rPr>
-        <w:t>ut</w:t>
-      </w:r>
-      <w:r>
-        <w:rPr>
-          <w:rFonts w:eastAsia="Times New Roman"/>
-        </w:rPr>
-        <w:t xml:space="preserve"> changePriority(priorityID, levelOfPriority(int), name, timeToRespond, timeToFinish) </w:t>
-      </w:r>
-      <w:r>
-        <w:rPr>
-          <w:rFonts w:eastAsia="Times New Roman"/>
-        </w:rPr>
-        <w:t>/api/admin/priorities/{piriority-id}</w:t>
-      </w:r>
-    </w:p>
-    <w:p>
-      <w:pPr>
-        <w:spacing w:beforeAutospacing="1" w:afterAutospacing="1"/>
-        <w:rPr>
-          <w:rFonts w:eastAsia="Times New Roman"/>
-        </w:rPr>
-      </w:pPr>
-      <w:r>
-        <w:rPr>
-          <w:rFonts w:eastAsia="Times New Roman"/>
-        </w:rPr>
-        <w:t>delete deletePriorities(priorityID)</w:t>
-      </w:r>
-      <w:r>
-        <w:rPr>
-          <w:rFonts w:eastAsia="Times New Roman"/>
-        </w:rPr>
-        <w:t xml:space="preserve"> /api/admin/priorities/{priority-id}</w:t>
-      </w:r>
-    </w:p>
-    <w:p>
-      <w:pPr>
-        <w:spacing w:beforeAutospacing="1" w:afterAutospacing="1"/>
-        <w:rPr>
-          <w:rFonts w:eastAsia="Times New Roman"/>
-        </w:rPr>
-      </w:pPr>
-    </w:p>
-    <w:p>
-      <w:pPr>
+        <w:pStyle w:val="Normal"/>
+        <w:spacing w:beforeAutospacing="1" w:afterAutospacing="1"/>
+        <w:rPr>
+          <w:rFonts w:eastAsia="Times New Roman"/>
+        </w:rPr>
+      </w:pPr>
+      <w:r>
+        <w:rPr>
+          <w:rFonts w:eastAsia="Times New Roman"/>
+        </w:rPr>
+        <w:t>put changeDepartment(department) /api/admin/users/{userID}/department</w:t>
+      </w:r>
+    </w:p>
+    <w:p>
+      <w:pPr>
+        <w:pStyle w:val="Normal"/>
+        <w:spacing w:beforeAutospacing="1" w:afterAutospacing="1"/>
+        <w:rPr>
+          <w:rFonts w:eastAsia="Times New Roman"/>
+        </w:rPr>
+      </w:pPr>
+      <w:r>
+        <w:rPr>
+          <w:rFonts w:eastAsia="Times New Roman"/>
+        </w:rPr>
+        <w:t>delete deleteAccount(userID) /api/admin/users/{userID}</w:t>
+      </w:r>
+    </w:p>
+    <w:p>
+      <w:pPr>
+        <w:pStyle w:val="Normal"/>
+        <w:spacing w:beforeAutospacing="1" w:afterAutospacing="1"/>
+        <w:rPr>
+          <w:rFonts w:eastAsia="Times New Roman"/>
+        </w:rPr>
+      </w:pPr>
+      <w:r>
+        <w:rPr>
+          <w:rFonts w:eastAsia="Times New Roman"/>
+        </w:rPr>
+        <w:t>get getPriorities() /api/admin/priorities</w:t>
+      </w:r>
+    </w:p>
+    <w:p>
+      <w:pPr>
+        <w:pStyle w:val="Normal"/>
+        <w:spacing w:beforeAutospacing="1" w:afterAutospacing="1"/>
+        <w:rPr>
+          <w:rFonts w:eastAsia="Times New Roman"/>
+        </w:rPr>
+      </w:pPr>
+      <w:r>
+        <w:rPr>
+          <w:rFonts w:eastAsia="Times New Roman"/>
+        </w:rPr>
+        <w:t>put changePriority(priorityID, levelOfPriority(int), name, timeToRespond, timeToFinish) /api/admin/priorities/{piriority-id}</w:t>
+      </w:r>
+    </w:p>
+    <w:p>
+      <w:pPr>
+        <w:pStyle w:val="Normal"/>
+        <w:spacing w:beforeAutospacing="1" w:afterAutospacing="1"/>
+        <w:rPr>
+          <w:rFonts w:eastAsia="Times New Roman"/>
+        </w:rPr>
+      </w:pPr>
+      <w:r>
+        <w:rPr>
+          <w:rFonts w:eastAsia="Times New Roman"/>
+        </w:rPr>
+        <w:t>delete deletePriorities(priorityID) /api/admin/priorities/{priority-id}</w:t>
+      </w:r>
+    </w:p>
+    <w:p>
+      <w:pPr>
+        <w:pStyle w:val="Normal"/>
+        <w:spacing w:beforeAutospacing="1" w:afterAutospacing="1"/>
+        <w:rPr>
+          <w:rFonts w:eastAsia="Times New Roman"/>
+        </w:rPr>
+      </w:pPr>
+      <w:r>
+        <w:rPr>
+          <w:rFonts w:eastAsia="Times New Roman"/>
+        </w:rPr>
+      </w:r>
+    </w:p>
+    <w:p>
+      <w:pPr>
+        <w:pStyle w:val="Normal"/>
         <w:spacing w:beforeAutospacing="1" w:afterAutospacing="1"/>
         <w:rPr>
           <w:rFonts w:eastAsia="Times New Roman"/>
@@ -1630,6 +1424,7 @@
     </w:p>
     <w:p>
       <w:pPr>
+        <w:pStyle w:val="Normal"/>
         <w:spacing w:beforeAutospacing="1" w:afterAutospacing="1"/>
         <w:rPr>
           <w:rFonts w:eastAsia="Times New Roman"/>
@@ -1644,6 +1439,7 @@
     </w:p>
     <w:p>
       <w:pPr>
+        <w:pStyle w:val="Normal"/>
         <w:spacing w:beforeAutospacing="1" w:afterAutospacing="1"/>
         <w:rPr>
           <w:rFonts w:eastAsia="Times New Roman"/>
@@ -1658,14 +1454,79 @@
     </w:p>
     <w:p>
       <w:pPr>
-        <w:spacing w:beforeAutospacing="1" w:afterAutospacing="1"/>
-        <w:rPr>
-          <w:rFonts w:eastAsia="Times New Roman"/>
-        </w:rPr>
-      </w:pPr>
-    </w:p>
-    <w:p>
-      <w:pPr>
+        <w:pStyle w:val="Normal"/>
+        <w:spacing w:beforeAutospacing="1" w:afterAutospacing="1"/>
+        <w:rPr>
+          <w:rFonts w:eastAsia="Times New Roman"/>
+        </w:rPr>
+      </w:pPr>
+      <w:r>
+        <w:rPr>
+          <w:rFonts w:eastAsia="Times New Roman"/>
+        </w:rPr>
+      </w:r>
+    </w:p>
+    <w:p>
+      <w:pPr>
+        <w:pStyle w:val="Normal"/>
+        <w:spacing w:beforeAutospacing="1" w:afterAutospacing="1"/>
+        <w:rPr>
+          <w:rFonts w:eastAsia="Times New Roman"/>
+        </w:rPr>
+      </w:pPr>
+      <w:r>
+        <w:rPr>
+          <w:rFonts w:eastAsia="Times New Roman"/>
+        </w:rPr>
+        <w:t>add lazy loading for attachment, if we have time later</w:t>
+      </w:r>
+    </w:p>
+    <w:p>
+      <w:pPr>
+        <w:pStyle w:val="Normal"/>
+        <w:spacing w:beforeAutospacing="1" w:afterAutospacing="1"/>
+        <w:rPr>
+          <w:rFonts w:eastAsia="Times New Roman"/>
+        </w:rPr>
+      </w:pPr>
+      <w:r>
+        <w:rPr>
+          <w:rFonts w:eastAsia="Times New Roman"/>
+        </w:rPr>
+      </w:r>
+    </w:p>
+    <w:p>
+      <w:pPr>
+        <w:pStyle w:val="Normal"/>
+        <w:spacing w:beforeAutospacing="1" w:afterAutospacing="1"/>
+        <w:rPr>
+          <w:rFonts w:eastAsia="Times New Roman"/>
+        </w:rPr>
+      </w:pPr>
+      <w:r>
+        <w:rPr>
+          <w:rFonts w:eastAsia="Times New Roman"/>
+        </w:rPr>
+        <w:t>add dedicated userID for attachment later</w:t>
+      </w:r>
+    </w:p>
+    <w:p>
+      <w:pPr>
+        <w:pStyle w:val="Normal"/>
+        <w:spacing w:beforeAutospacing="1" w:afterAutospacing="1"/>
+        <w:rPr>
+          <w:rFonts w:eastAsia="Times New Roman"/>
+        </w:rPr>
+      </w:pPr>
+      <w:r>
+        <w:rPr>
+          <w:rFonts w:eastAsia="Times New Roman"/>
+        </w:rPr>
+      </w:r>
+    </w:p>
+    <w:p>
+      <w:pPr>
+        <w:pStyle w:val="Normal"/>
         <w:spacing w:beforeAutospacing="1" w:afterAutospacing="1"/>
         <w:rPr>
           <w:rFonts w:eastAsia="Times New Roman"/>
@@ -1680,6 +1541,7 @@
     </w:p>
     <w:p>
       <w:pPr>
+        <w:pStyle w:val="Normal"/>
         <w:spacing w:beforeAutospacing="1" w:afterAutospacing="1"/>
         <w:rPr>
           <w:rFonts w:eastAsia="Times New Roman"/>
@@ -1694,24 +1556,30 @@
     </w:p>
     <w:p>
       <w:pPr>
-        <w:spacing w:beforeAutospacing="1" w:afterAutospacing="1"/>
-        <w:rPr>
-          <w:rFonts w:eastAsia="Times New Roman"/>
-        </w:rPr>
-      </w:pPr>
-    </w:p>
-    <w:p>
-      <w:pPr>
-        <w:spacing w:beforeAutospacing="1" w:afterAutospacing="1"/>
-        <w:rPr>
-          <w:rFonts w:eastAsia="Times New Roman"/>
-        </w:rPr>
-      </w:pPr>
-      <w:r>
-        <w:rPr>
-          <w:rFonts w:eastAsia="Times New Roman"/>
-        </w:rPr>
-        <w:lastRenderedPageBreak/>
+        <w:pStyle w:val="Normal"/>
+        <w:spacing w:beforeAutospacing="1" w:afterAutospacing="1"/>
+        <w:rPr>
+          <w:rFonts w:eastAsia="Times New Roman"/>
+        </w:rPr>
+      </w:pPr>
+      <w:r>
+        <w:rPr>
+          <w:rFonts w:eastAsia="Times New Roman"/>
+        </w:rPr>
+      </w:r>
+    </w:p>
+    <w:p>
+      <w:pPr>
+        <w:pStyle w:val="Normal"/>
+        <w:spacing w:beforeAutospacing="1" w:afterAutospacing="1"/>
+        <w:rPr>
+          <w:rFonts w:eastAsia="Times New Roman"/>
+        </w:rPr>
+      </w:pPr>
+      <w:r>
+        <w:rPr>
+          <w:rFonts w:eastAsia="Times New Roman"/>
+        </w:rPr>
         <w:t>beware of xss attack</w:t>
       </w:r>
     </w:p>
@@ -1722,7 +1590,7 @@
           <w:ilvl w:val="0"/>
           <w:numId w:val="3"/>
         </w:numPr>
-        <w:spacing w:beforeAutospacing="1" w:afterAutospacing="1"/>
+        <w:spacing w:beforeAutospacing="1" w:after="0"/>
         <w:rPr>
           <w:rFonts w:eastAsia="Times New Roman"/>
         </w:rPr>
@@ -1741,7 +1609,7 @@
           <w:ilvl w:val="0"/>
           <w:numId w:val="3"/>
         </w:numPr>
-        <w:spacing w:beforeAutospacing="1" w:afterAutospacing="1"/>
+        <w:spacing w:before="0" w:after="0"/>
         <w:rPr>
           <w:rFonts w:eastAsia="Times New Roman"/>
         </w:rPr>
@@ -1760,7 +1628,7 @@
           <w:ilvl w:val="0"/>
           <w:numId w:val="3"/>
         </w:numPr>
-        <w:spacing w:beforeAutospacing="1" w:afterAutospacing="1"/>
+        <w:spacing w:before="0" w:after="0"/>
         <w:rPr>
           <w:rFonts w:eastAsia="Times New Roman"/>
         </w:rPr>
@@ -1779,41 +1647,33 @@
           <w:ilvl w:val="0"/>
           <w:numId w:val="3"/>
         </w:numPr>
-        <w:spacing w:beforeAutospacing="1" w:afterAutospacing="1"/>
-        <w:rPr>
-          <w:rFonts w:eastAsia="Times New Roman"/>
-        </w:rPr>
-      </w:pPr>
-      <w:r>
-        <w:rPr>
-          <w:rFonts w:eastAsia="Times New Roman"/>
-        </w:rPr>
-        <w:t>dangerous use of {} in href</w:t>
-      </w:r>
-      <w:r>
-        <w:rPr>
-          <w:rFonts w:eastAsia="Times New Roman"/>
-        </w:rPr>
-        <w:t xml:space="preserve"> (though who put dynamic link using data from outside anyway)</w:t>
-      </w:r>
-    </w:p>
-    <w:p>
-      <w:pPr>
-        <w:spacing w:beforeAutospacing="1" w:afterAutospacing="1"/>
-        <w:rPr>
-          <w:rFonts w:eastAsia="Times New Roman"/>
-        </w:rPr>
-      </w:pPr>
-      <w:r>
-        <w:rPr>
-          <w:rFonts w:eastAsia="Times New Roman"/>
-          <w:noProof/>
-        </w:rPr>
+        <w:spacing w:before="0" w:afterAutospacing="1"/>
+        <w:rPr>
+          <w:rFonts w:eastAsia="Times New Roman"/>
+        </w:rPr>
+      </w:pPr>
+      <w:r>
+        <w:rPr>
+          <w:rFonts w:eastAsia="Times New Roman"/>
+        </w:rPr>
+        <w:t>dangerous use of {} in href (though who put dynamic link using data from outside anyway)</w:t>
+      </w:r>
+    </w:p>
+    <w:p>
+      <w:pPr>
+        <w:pStyle w:val="Normal"/>
+        <w:spacing w:beforeAutospacing="1" w:afterAutospacing="1"/>
+        <w:rPr>
+          <w:rFonts w:eastAsia="Times New Roman"/>
+        </w:rPr>
+      </w:pPr>
+      <w:r>
+        <w:rPr/>
         <w:drawing>
-          <wp:inline distT="0" distB="0" distL="0" distR="0" wp14:anchorId="2C95A9D1" wp14:editId="6CA97AA0">
+          <wp:inline distT="0" distB="0" distL="0" distR="0">
             <wp:extent cx="5731510" cy="4566285"/>
-            <wp:effectExtent l="0" t="0" r="2540" b="5715"/>
-            <wp:docPr id="1672393956" name="Picture 1"/>
+            <wp:effectExtent l="0" t="0" r="0" b="0"/>
+            <wp:docPr id="1" name="Picture 1"/>
             <wp:cNvGraphicFramePr>
               <a:graphicFrameLocks xmlns:a="http://schemas.openxmlformats.org/drawingml/2006/main" noChangeAspect="1"/>
             </wp:cNvGraphicFramePr>
@@ -1821,16 +1681,18 @@
               <a:graphicData uri="http://schemas.openxmlformats.org/drawingml/2006/picture">
                 <pic:pic xmlns:pic="http://schemas.openxmlformats.org/drawingml/2006/picture">
                   <pic:nvPicPr>
-                    <pic:cNvPr id="1672393956" name=""/>
-                    <pic:cNvPicPr/>
+                    <pic:cNvPr id="1" name="Picture 1"/>
+                    <pic:cNvPicPr>
+                      <a:picLocks noChangeAspect="1" noChangeArrowheads="1"/>
+                    </pic:cNvPicPr>
                   </pic:nvPicPr>
                   <pic:blipFill>
-                    <a:blip r:embed="rId5"/>
+                    <a:blip r:embed="rId2"/>
                     <a:stretch>
                       <a:fillRect/>
                     </a:stretch>
                   </pic:blipFill>
-                  <pic:spPr>
+                  <pic:spPr bwMode="auto">
                     <a:xfrm>
                       <a:off x="0" y="0"/>
                       <a:ext cx="5731510" cy="4566285"/>
@@ -1838,6 +1700,7 @@
                     <a:prstGeom prst="rect">
                       <a:avLst/>
                     </a:prstGeom>
+                    <a:noFill/>
                   </pic:spPr>
                 </pic:pic>
               </a:graphicData>
@@ -1854,6 +1717,7 @@
     </w:p>
     <w:p>
       <w:pPr>
+        <w:pStyle w:val="Normal"/>
         <w:spacing w:beforeAutospacing="1" w:afterAutospacing="1"/>
         <w:rPr>
           <w:rFonts w:eastAsia="Times New Roman"/>
@@ -1868,14 +1732,21 @@
     </w:p>
     <w:p>
       <w:pPr>
-        <w:spacing w:beforeAutospacing="1" w:afterAutospacing="1"/>
-        <w:rPr>
-          <w:rFonts w:eastAsia="Times New Roman"/>
-        </w:rPr>
-      </w:pPr>
-    </w:p>
-    <w:p>
-      <w:pPr>
+        <w:pStyle w:val="Normal"/>
+        <w:spacing w:beforeAutospacing="1" w:afterAutospacing="1"/>
+        <w:rPr>
+          <w:rFonts w:eastAsia="Times New Roman"/>
+        </w:rPr>
+      </w:pPr>
+      <w:r>
+        <w:rPr>
+          <w:rFonts w:eastAsia="Times New Roman"/>
+        </w:rPr>
+      </w:r>
+    </w:p>
+    <w:p>
+      <w:pPr>
+        <w:pStyle w:val="Normal"/>
         <w:spacing w:beforeAutospacing="1" w:afterAutospacing="1"/>
         <w:rPr>
           <w:rFonts w:eastAsia="Times New Roman"/>
@@ -1890,97 +1761,52 @@
     </w:p>
     <w:p>
       <w:pPr>
-        <w:spacing w:beforeAutospacing="1" w:afterAutospacing="1"/>
-        <w:rPr>
-          <w:rFonts w:eastAsia="Times New Roman"/>
-        </w:rPr>
-      </w:pPr>
-      <w:r>
-        <w:rPr>
-          <w:rFonts w:eastAsia="Times New Roman"/>
-        </w:rPr>
-        <w:t>J</w:t>
-      </w:r>
-      <w:r>
-        <w:rPr>
-          <w:rFonts w:eastAsia="Times New Roman"/>
-        </w:rPr>
-        <w:t>ava-</w:t>
-      </w:r>
-      <w:r>
-        <w:rPr>
-          <w:rFonts w:eastAsia="Times New Roman"/>
-        </w:rPr>
-        <w:t>jwt – cung cấp dịch vụ tạo jwt và xác thực jwt</w:t>
-      </w:r>
-    </w:p>
-    <w:p>
-      <w:pPr>
-        <w:spacing w:beforeAutospacing="1" w:afterAutospacing="1"/>
-        <w:rPr>
-          <w:rFonts w:eastAsia="Times New Roman"/>
-        </w:rPr>
-      </w:pPr>
-      <w:r>
-        <w:rPr>
-          <w:rFonts w:eastAsia="Times New Roman"/>
-        </w:rPr>
-        <w:t>J</w:t>
-      </w:r>
-      <w:r>
-        <w:rPr>
-          <w:rFonts w:eastAsia="Times New Roman"/>
-        </w:rPr>
-        <w:t>ava-</w:t>
-      </w:r>
-      <w:r>
-        <w:rPr>
-          <w:rFonts w:eastAsia="Times New Roman"/>
-        </w:rPr>
-        <w:t>jwt được sử dụng với hàm băm hs256 cho phép bảo mật ở mức chấp nhận được trong mạng nội bộ với tốc độ tốt giữa các loại băm hs, rs và es</w:t>
-      </w:r>
-      <w:r>
-        <w:rPr>
-          <w:rFonts w:eastAsia="Times New Roman"/>
-        </w:rPr>
-        <w:t xml:space="preserve">. Việc sử dụng hàm băm sha256 có thể chưa phù hợp do có bảo mật yếu hơn hàm băm bcrypt, tuy nhiên jwt được config có thời </w:t>
-      </w:r>
-      <w:r>
-        <w:rPr>
-          <w:rFonts w:eastAsia="Times New Roman"/>
-        </w:rPr>
-        <w:lastRenderedPageBreak/>
-        <w:t>gian vô hiệu hóa là 1 ngày nhằm tăng độ bảo mật (?). Jjwt có vẻ là Thread Safe (?), hiện tại chưa tận dụng được chức năng này.</w:t>
-      </w:r>
-    </w:p>
-    <w:p>
-      <w:pPr>
-        <w:spacing w:beforeAutospacing="1" w:afterAutospacing="1"/>
-        <w:rPr>
-          <w:rFonts w:eastAsia="Times New Roman"/>
-        </w:rPr>
-      </w:pPr>
-      <w:r>
-        <w:rPr>
-          <w:rFonts w:eastAsia="Times New Roman"/>
-        </w:rPr>
-        <w:t>J</w:t>
-      </w:r>
-      <w:r>
-        <w:rPr>
-          <w:rFonts w:eastAsia="Times New Roman"/>
-        </w:rPr>
-        <w:t>ava-</w:t>
-      </w:r>
-      <w:r>
-        <w:rPr>
-          <w:rFonts w:eastAsia="Times New Roman"/>
-        </w:rPr>
-        <w:t>jwt của auth0 được chọn vì có documentation tốt, được nhiều người sử dụng, do một tổ chức có danh tiếng đứng sau</w:t>
-      </w:r>
-    </w:p>
-    <w:p>
-      <w:pPr>
+        <w:pStyle w:val="Normal"/>
+        <w:spacing w:beforeAutospacing="1" w:afterAutospacing="1"/>
+        <w:rPr>
+          <w:rFonts w:eastAsia="Times New Roman"/>
+        </w:rPr>
+      </w:pPr>
+      <w:r>
+        <w:rPr>
+          <w:rFonts w:eastAsia="Times New Roman"/>
+        </w:rPr>
+        <w:t>Java-jwt – cung cấp dịch vụ tạo jwt và xác thực jwt</w:t>
+      </w:r>
+    </w:p>
+    <w:p>
+      <w:pPr>
+        <w:pStyle w:val="Normal"/>
+        <w:spacing w:beforeAutospacing="1" w:afterAutospacing="1"/>
+        <w:rPr>
+          <w:rFonts w:eastAsia="Times New Roman"/>
+        </w:rPr>
+      </w:pPr>
+      <w:r>
+        <w:rPr>
+          <w:rFonts w:eastAsia="Times New Roman"/>
+        </w:rPr>
+        <w:t>Java-jwt được sử dụng với hàm băm hs256 cho phép bảo mật ở mức chấp nhận được trong mạng nội bộ với tốc độ tốt giữa các loại băm hs, rs và es. Việc sử dụng hàm băm sha256 có thể chưa phù hợp do có bảo mật yếu hơn hàm băm bcrypt, tuy nhiên jwt được config có thời gian vô hiệu hóa là 1 ngày nhằm tăng độ bảo mật (?). Jjwt có vẻ là Thread Safe (?), hiện tại chưa tận dụng được chức năng này.</w:t>
+      </w:r>
+    </w:p>
+    <w:p>
+      <w:pPr>
+        <w:pStyle w:val="Normal"/>
+        <w:spacing w:beforeAutospacing="1" w:afterAutospacing="1"/>
+        <w:rPr>
+          <w:rFonts w:eastAsia="Times New Roman"/>
+        </w:rPr>
+      </w:pPr>
+      <w:r>
+        <w:rPr>
+          <w:rFonts w:eastAsia="Times New Roman"/>
+        </w:rPr>
+        <w:t>Java-jwt của auth0 được chọn vì có documentation tốt, được nhiều người sử dụng, do một tổ chức có danh tiếng đứng sau</w:t>
+      </w:r>
+    </w:p>
+    <w:p>
+      <w:pPr>
+        <w:pStyle w:val="Normal"/>
         <w:spacing w:beforeAutospacing="1" w:afterAutospacing="1"/>
         <w:rPr>
           <w:rFonts w:eastAsia="Times New Roman"/>
@@ -1995,6 +1821,7 @@
     </w:p>
     <w:p>
       <w:pPr>
+        <w:pStyle w:val="Normal"/>
         <w:spacing w:beforeAutospacing="1" w:afterAutospacing="1"/>
         <w:rPr>
           <w:rFonts w:eastAsia="Times New Roman"/>
@@ -2009,132 +1836,96 @@
     </w:p>
     <w:p>
       <w:pPr>
-        <w:spacing w:beforeAutospacing="1" w:afterAutospacing="1"/>
-        <w:rPr>
-          <w:rFonts w:eastAsia="Times New Roman"/>
-        </w:rPr>
-      </w:pPr>
-      <w:r>
-        <w:rPr>
-          <w:rFonts w:eastAsia="Times New Roman"/>
-        </w:rPr>
-        <w:t>BCrypt được sử dụng do nằm đầu trong danh sách những thuật toán khuyên dùng của spring cho mục đích bảo vệ mật khẩu. Không rõ về</w:t>
-      </w:r>
-    </w:p>
-    <w:p>
-      <w:pPr>
-        <w:spacing w:beforeAutospacing="1" w:afterAutospacing="1"/>
-        <w:rPr>
-          <w:rFonts w:eastAsia="Times New Roman"/>
-        </w:rPr>
-      </w:pPr>
-      <w:r>
-        <w:rPr>
-          <w:rFonts w:eastAsia="Times New Roman"/>
-        </w:rPr>
-        <w:t>Hibernate – cung cấp ORM</w:t>
-      </w:r>
-      <w:r>
-        <w:rPr>
-          <w:rFonts w:eastAsia="Times New Roman"/>
-        </w:rPr>
-        <w:t xml:space="preserve"> kết hợp với Jakarta data thành repository</w:t>
-      </w:r>
-    </w:p>
-    <w:p>
-      <w:pPr>
-        <w:spacing w:beforeAutospacing="1" w:afterAutospacing="1"/>
-        <w:rPr>
-          <w:rFonts w:eastAsia="Times New Roman"/>
-        </w:rPr>
-      </w:pPr>
-      <w:r>
-        <w:rPr>
-          <w:rFonts w:eastAsia="Times New Roman"/>
-        </w:rPr>
-        <w:t>Hibernate được sử dụng nhằm tăng tốc độ xây dựng sản phẩm</w:t>
-      </w:r>
-      <w:r>
-        <w:rPr>
-          <w:rFonts w:eastAsia="Times New Roman"/>
-        </w:rPr>
-        <w:t xml:space="preserve"> và dễ sử dụng do đã có kinh nghiệm từ trước</w:t>
-      </w:r>
-      <w:r>
-        <w:rPr>
-          <w:rFonts w:eastAsia="Times New Roman"/>
-        </w:rPr>
-        <w:t xml:space="preserve"> (có thể đổi thành jdbc hoặc </w:t>
-      </w:r>
-      <w:r>
-        <w:rPr>
-          <w:rFonts w:eastAsia="Times New Roman"/>
-        </w:rPr>
-        <w:t>sử dụng stored procedure trong db hoặc spring data)</w:t>
-      </w:r>
-    </w:p>
-    <w:p>
-      <w:pPr>
-        <w:spacing w:beforeAutospacing="1" w:afterAutospacing="1"/>
-        <w:rPr>
-          <w:rFonts w:eastAsia="Times New Roman"/>
-        </w:rPr>
-      </w:pPr>
-      <w:r>
-        <w:rPr>
-          <w:rFonts w:eastAsia="Times New Roman"/>
-        </w:rPr>
-        <w:t>Bỏ hibernate vì không tìm được cách kết hợp hibernate với spring</w:t>
-      </w:r>
-    </w:p>
-    <w:p>
-      <w:pPr>
-        <w:spacing w:beforeAutospacing="1" w:afterAutospacing="1"/>
-        <w:rPr>
-          <w:rFonts w:eastAsia="Times New Roman"/>
-        </w:rPr>
-      </w:pPr>
-      <w:r>
-        <w:rPr>
-          <w:rFonts w:eastAsia="Times New Roman"/>
-        </w:rPr>
-        <w:t>Chuyển sang sử dụng PG</w:t>
-      </w:r>
-      <w:r>
-        <w:rPr>
-          <w:rFonts w:eastAsia="Times New Roman"/>
-        </w:rPr>
-        <w:t>Simple</w:t>
-      </w:r>
-      <w:r>
-        <w:rPr>
-          <w:rFonts w:eastAsia="Times New Roman"/>
-        </w:rPr>
-        <w:t xml:space="preserve">DataSource, </w:t>
-      </w:r>
-      <w:r>
-        <w:rPr>
-          <w:rFonts w:eastAsia="Times New Roman"/>
-        </w:rPr>
-        <w:t xml:space="preserve">mở đơn data source, </w:t>
-      </w:r>
-      <w:r>
-        <w:rPr>
-          <w:rFonts w:eastAsia="Times New Roman"/>
-        </w:rPr>
-        <w:t>sử dụng chỉ với mục đích demo</w:t>
-      </w:r>
-    </w:p>
-    <w:p>
-      <w:pPr>
-        <w:spacing w:beforeAutospacing="1" w:afterAutospacing="1"/>
-        <w:rPr>
-          <w:rFonts w:eastAsia="Times New Roman"/>
-        </w:rPr>
-      </w:pPr>
-    </w:p>
-    <w:p>
-      <w:pPr>
+        <w:pStyle w:val="Normal"/>
+        <w:spacing w:beforeAutospacing="1" w:afterAutospacing="1"/>
+        <w:rPr>
+          <w:rFonts w:eastAsia="Times New Roman"/>
+        </w:rPr>
+      </w:pPr>
+      <w:r>
+        <w:rPr>
+          <w:rFonts w:eastAsia="Times New Roman"/>
+        </w:rPr>
+        <w:t>BCrypt được sử dụng do nằm đầu trong danh sách những thuật toán khuyên dùng của spring cho mục đích bảo vệ mật khẩu.</w:t>
+      </w:r>
+    </w:p>
+    <w:p>
+      <w:pPr>
+        <w:pStyle w:val="Normal"/>
+        <w:spacing w:beforeAutospacing="1" w:afterAutospacing="1"/>
+        <w:rPr>
+          <w:rFonts w:eastAsia="Times New Roman"/>
+        </w:rPr>
+      </w:pPr>
+      <w:r>
+        <w:rPr>
+          <w:rFonts w:eastAsia="Times New Roman"/>
+        </w:rPr>
+        <w:t>Hibernate – cung cấp ORM kết hợp với Jakarta data thành repository</w:t>
+      </w:r>
+    </w:p>
+    <w:p>
+      <w:pPr>
+        <w:pStyle w:val="Normal"/>
+        <w:spacing w:beforeAutospacing="1" w:afterAutospacing="1"/>
+        <w:rPr>
+          <w:rFonts w:eastAsia="Times New Roman"/>
+        </w:rPr>
+      </w:pPr>
+      <w:r>
+        <w:rPr>
+          <w:rFonts w:eastAsia="Times New Roman"/>
+        </w:rPr>
+        <w:t>Hibernate được sử dụng nhằm tăng tốc độ xây dựng sản phẩm và dễ sử dụng do đã có kinh nghiệm từ trước (có thể đổi thành jdbc hoặc sử dụng stored procedure trong db hoặc spring data)</w:t>
+      </w:r>
+    </w:p>
+    <w:p>
+      <w:pPr>
+        <w:pStyle w:val="Normal"/>
+        <w:spacing w:beforeAutospacing="1" w:afterAutospacing="1"/>
+        <w:rPr>
+          <w:rFonts w:eastAsia="Times New Roman"/>
+        </w:rPr>
+      </w:pPr>
+      <w:r>
+        <w:rPr>
+          <w:rFonts w:eastAsia="Times New Roman"/>
+        </w:rPr>
+        <w:t>Bỏ hibernate vì không tìm được cách kết hợp hibernate repository với spring</w:t>
+      </w:r>
+    </w:p>
+    <w:p>
+      <w:pPr>
+        <w:pStyle w:val="Normal"/>
+        <w:spacing w:beforeAutospacing="1" w:afterAutospacing="1"/>
+        <w:rPr>
+          <w:rFonts w:eastAsia="Times New Roman"/>
+        </w:rPr>
+      </w:pPr>
+      <w:r>
+        <w:rPr>
+          <w:rFonts w:eastAsia="Times New Roman"/>
+        </w:rPr>
+        <w:t>Chuyển sang sử dụng PGSimpleDataSource, mở đơn data source, sử dụng chỉ với mục đích demo</w:t>
+      </w:r>
+    </w:p>
+    <w:p>
+      <w:pPr>
+        <w:pStyle w:val="Normal"/>
+        <w:spacing w:beforeAutospacing="1" w:afterAutospacing="1"/>
+        <w:rPr>
+          <w:rFonts w:eastAsia="Times New Roman"/>
+        </w:rPr>
+      </w:pPr>
+      <w:r>
+        <w:rPr>
+          <w:rFonts w:eastAsia="Times New Roman"/>
+        </w:rPr>
+      </w:r>
+    </w:p>
+    <w:p>
+      <w:pPr>
+        <w:pStyle w:val="Normal"/>
         <w:spacing w:beforeAutospacing="1" w:afterAutospacing="1"/>
         <w:rPr>
           <w:rFonts w:eastAsia="Times New Roman"/>
@@ -2149,6 +1940,7 @@
     </w:p>
     <w:p>
       <w:pPr>
+        <w:pStyle w:val="Normal"/>
         <w:spacing w:beforeAutospacing="1" w:afterAutospacing="1"/>
         <w:rPr>
           <w:rFonts w:eastAsia="Times New Roman"/>
@@ -2163,6 +1955,7 @@
     </w:p>
     <w:p>
       <w:pPr>
+        <w:pStyle w:val="Normal"/>
         <w:spacing w:beforeAutospacing="1" w:afterAutospacing="1"/>
         <w:rPr>
           <w:rFonts w:eastAsia="Times New Roman"/>
@@ -2177,6 +1970,7 @@
     </w:p>
     <w:p>
       <w:pPr>
+        <w:pStyle w:val="Normal"/>
         <w:spacing w:beforeAutospacing="1" w:afterAutospacing="1"/>
         <w:rPr>
           <w:rFonts w:eastAsia="Times New Roman"/>
@@ -2191,6 +1985,7 @@
     </w:p>
     <w:p>
       <w:pPr>
+        <w:pStyle w:val="Normal"/>
         <w:spacing w:beforeAutospacing="1" w:afterAutospacing="1"/>
         <w:rPr>
           <w:rFonts w:eastAsia="Times New Roman"/>
@@ -2203,46 +1998,271 @@
         <w:t>Được sử dụng vì phần mềm hiện tại sử dụng nội bộ trong nước, nên chưa cần thêm múi giờ.</w:t>
       </w:r>
     </w:p>
-    <w:p>
-      <w:pPr>
-        <w:spacing w:beforeAutospacing="1" w:afterAutospacing="1"/>
-        <w:rPr>
-          <w:rFonts w:eastAsia="Times New Roman"/>
-        </w:rPr>
-      </w:pPr>
-      <w:r>
-        <w:rPr>
-          <w:rFonts w:eastAsia="Times New Roman"/>
-        </w:rPr>
-        <w:t>Nếu database chết thì app sẽ không sử lý được</w:t>
-      </w:r>
-    </w:p>
     <w:sectPr>
+      <w:type w:val="nextPage"/>
       <w:pgSz w:w="11906" w:h="16838"/>
-      <w:pgMar w:top="1440" w:right="1440" w:bottom="1440" w:left="1440" w:header="0" w:footer="0" w:gutter="0"/>
-      <w:cols w:space="720"/>
-      <w:formProt w:val="0"/>
-      <w:docGrid w:linePitch="360"/>
+      <w:pgMar w:left="1440" w:right="1440" w:gutter="0" w:header="0" w:top="1440" w:footer="0" w:bottom="1440"/>
+      <w:pgNumType w:fmt="decimal"/>
+      <w:formProt w:val="false"/>
+      <w:textDirection w:val="lrTb"/>
+      <w:docGrid w:type="default" w:linePitch="360" w:charSpace="0"/>
     </w:sectPr>
   </w:body>
 </w:document>
 </file>
 
 <file path=word/numbering.xml><?xml version="1.0" encoding="utf-8"?>
-<w:numbering xmlns:wpc="http://schemas.microsoft.com/office/word/2010/wordprocessingCanvas" xmlns:cx="http://schemas.microsoft.com/office/drawing/2014/chartex" xmlns:cx1="http://schemas.microsoft.com/office/drawing/2015/9/8/chartex" xmlns:cx2="http://schemas.microsoft.com/office/drawing/2015/10/21/chartex" xmlns:cx3="http://schemas.microsoft.com/office/drawing/2016/5/9/chartex" xmlns:cx4="http://schemas.microsoft.com/office/drawing/2016/5/10/chartex" xmlns:cx5="http://schemas.microsoft.com/office/drawing/2016/5/11/chartex" xmlns:cx6="http://schemas.microsoft.com/office/drawing/2016/5/12/chartex" xmlns:cx7="http://schemas.microsoft.com/office/drawing/2016/5/13/chartex" xmlns:cx8="http://schemas.microsoft.com/office/drawing/2016/5/14/chartex" xmlns:mc="http://schemas.openxmlformats.org/markup-compatibility/2006" xmlns:aink="http://schemas.microsoft.com/office/drawing/2016/ink" xmlns:am3d="http://schemas.microsoft.com/office/drawing/2017/model3d" xmlns:o="urn:schemas-microsoft-com:office:office" xmlns:oel="http://schemas.microsoft.com/office/2019/extlst" xmlns:r="http://schemas.openxmlformats.org/officeDocument/2006/relationships" xmlns:m="http://schemas.openxmlformats.org/officeDocument/2006/math" xmlns:v="urn:schemas-microsoft-com:vml" xmlns:wp14="http://schemas.microsoft.com/office/word/2010/wordprocessingDrawing" xmlns:wp="http://schemas.openxmlformats.org/drawingml/2006/wordprocessingDrawing" xmlns:w10="urn:schemas-microsoft-com:office:word" xmlns:w="http://schemas.openxmlformats.org/wordprocessingml/2006/main" xmlns:w14="http://schemas.microsoft.com/office/word/2010/wordml" xmlns:w15="http://schemas.microsoft.com/office/word/2012/wordml" xmlns:w16cex="http://schemas.microsoft.com/office/word/2018/wordml/cex" xmlns:w16cid="http://schemas.microsoft.com/office/word/2016/wordml/cid" xmlns:w16="http://schemas.microsoft.com/office/word/2018/wordml" xmlns:w16du="http://schemas.microsoft.com/office/word/2023/wordml/word16du" xmlns:w16sdtdh="http://schemas.microsoft.com/office/word/2020/wordml/sdtdatahash" xmlns:w16sdtfl="http://schemas.microsoft.com/office/word/2024/wordml/sdtformatlock" xmlns:w16se="http://schemas.microsoft.com/office/word/2015/wordml/symex" xmlns:wpg="http://schemas.microsoft.com/office/word/2010/wordprocessingGroup" xmlns:wpi="http://schemas.microsoft.com/office/word/2010/wordprocessingInk" xmlns:wne="http://schemas.microsoft.com/office/word/2006/wordml" xmlns:wps="http://schemas.microsoft.com/office/word/2010/wordprocessingShape" mc:Ignorable="w14 w15 w16se w16cid w16 w16cex w16sdtdh w16sdtfl w16du wp14">
-  <w:abstractNum w:abstractNumId="0" w15:restartNumberingAfterBreak="0">
-    <w:nsid w:val="2C410758"/>
-    <w:multiLevelType w:val="multilevel"/>
-    <w:tmpl w:val="F8382284"/>
+<w:numbering xmlns:w="http://schemas.openxmlformats.org/wordprocessingml/2006/main" xmlns:o="urn:schemas-microsoft-com:office:office" xmlns:r="http://schemas.openxmlformats.org/officeDocument/2006/relationships" xmlns:v="urn:schemas-microsoft-com:vml" xmlns:mc="http://schemas.openxmlformats.org/markup-compatibility/2006" xmlns:w14="http://schemas.microsoft.com/office/word/2010/wordml" mc:Ignorable="w14">
+  <w:abstractNum w:abstractNumId="1">
+    <w:lvl w:ilvl="0">
+      <w:start w:val="1"/>
+      <w:numFmt w:val="decimal"/>
+      <w:pStyle w:val="Heading1"/>
+      <w:lvlText w:val="%1."/>
+      <w:lvlJc w:val="start"/>
+      <w:pPr>
+        <w:tabs>
+          <w:tab w:val="num" w:pos="0"/>
+        </w:tabs>
+        <w:ind w:start="684" w:hanging="400"/>
+      </w:pPr>
+      <w:rPr/>
+    </w:lvl>
+    <w:lvl w:ilvl="1">
+      <w:start w:val="1"/>
+      <w:numFmt w:val="upperLetter"/>
+      <w:lvlText w:val="%2."/>
+      <w:lvlJc w:val="start"/>
+      <w:pPr>
+        <w:tabs>
+          <w:tab w:val="num" w:pos="0"/>
+        </w:tabs>
+        <w:ind w:start="1200" w:hanging="400"/>
+      </w:pPr>
+      <w:rPr/>
+    </w:lvl>
+    <w:lvl w:ilvl="2">
+      <w:start w:val="1"/>
+      <w:numFmt w:val="lowerRoman"/>
+      <w:lvlText w:val="%3."/>
+      <w:lvlJc w:val="end"/>
+      <w:pPr>
+        <w:tabs>
+          <w:tab w:val="num" w:pos="0"/>
+        </w:tabs>
+        <w:ind w:start="1600" w:hanging="400"/>
+      </w:pPr>
+      <w:rPr/>
+    </w:lvl>
+    <w:lvl w:ilvl="3">
+      <w:start w:val="1"/>
+      <w:numFmt w:val="decimal"/>
+      <w:lvlText w:val="%4."/>
+      <w:lvlJc w:val="start"/>
+      <w:pPr>
+        <w:tabs>
+          <w:tab w:val="num" w:pos="0"/>
+        </w:tabs>
+        <w:ind w:start="2000" w:hanging="400"/>
+      </w:pPr>
+      <w:rPr/>
+    </w:lvl>
+    <w:lvl w:ilvl="4">
+      <w:start w:val="1"/>
+      <w:numFmt w:val="upperLetter"/>
+      <w:lvlText w:val="%5."/>
+      <w:lvlJc w:val="start"/>
+      <w:pPr>
+        <w:tabs>
+          <w:tab w:val="num" w:pos="0"/>
+        </w:tabs>
+        <w:ind w:start="2400" w:hanging="400"/>
+      </w:pPr>
+      <w:rPr/>
+    </w:lvl>
+    <w:lvl w:ilvl="5">
+      <w:start w:val="1"/>
+      <w:numFmt w:val="lowerRoman"/>
+      <w:lvlText w:val="%6."/>
+      <w:lvlJc w:val="end"/>
+      <w:pPr>
+        <w:tabs>
+          <w:tab w:val="num" w:pos="0"/>
+        </w:tabs>
+        <w:ind w:start="2800" w:hanging="400"/>
+      </w:pPr>
+      <w:rPr/>
+    </w:lvl>
+    <w:lvl w:ilvl="6">
+      <w:start w:val="1"/>
+      <w:numFmt w:val="decimal"/>
+      <w:lvlText w:val="%7."/>
+      <w:lvlJc w:val="start"/>
+      <w:pPr>
+        <w:tabs>
+          <w:tab w:val="num" w:pos="0"/>
+        </w:tabs>
+        <w:ind w:start="3200" w:hanging="400"/>
+      </w:pPr>
+      <w:rPr/>
+    </w:lvl>
+    <w:lvl w:ilvl="7">
+      <w:start w:val="1"/>
+      <w:numFmt w:val="upperLetter"/>
+      <w:lvlText w:val="%8."/>
+      <w:lvlJc w:val="start"/>
+      <w:pPr>
+        <w:tabs>
+          <w:tab w:val="num" w:pos="0"/>
+        </w:tabs>
+        <w:ind w:start="3600" w:hanging="400"/>
+      </w:pPr>
+      <w:rPr/>
+    </w:lvl>
+    <w:lvl w:ilvl="8">
+      <w:start w:val="1"/>
+      <w:numFmt w:val="lowerRoman"/>
+      <w:lvlText w:val="%9."/>
+      <w:lvlJc w:val="end"/>
+      <w:pPr>
+        <w:tabs>
+          <w:tab w:val="num" w:pos="0"/>
+        </w:tabs>
+        <w:ind w:start="4000" w:hanging="400"/>
+      </w:pPr>
+      <w:rPr/>
+    </w:lvl>
+  </w:abstractNum>
+  <w:abstractNum w:abstractNumId="2">
+    <w:lvl w:ilvl="0">
+      <w:start w:val="1"/>
+      <w:numFmt w:val="lowerLetter"/>
+      <w:suff w:val="space"/>
+      <w:lvlText w:val="%1."/>
+      <w:lvlJc w:val="start"/>
+      <w:pPr>
+        <w:tabs>
+          <w:tab w:val="num" w:pos="0"/>
+        </w:tabs>
+        <w:ind w:start="0" w:hanging="0"/>
+      </w:pPr>
+      <w:rPr/>
+    </w:lvl>
+    <w:lvl w:ilvl="1">
+      <w:start w:val="1"/>
+      <w:numFmt w:val="decimal"/>
+      <w:lvlText w:val="%2."/>
+      <w:lvlJc w:val="start"/>
+      <w:pPr>
+        <w:tabs>
+          <w:tab w:val="num" w:pos="1080"/>
+        </w:tabs>
+        <w:ind w:start="1080" w:hanging="360"/>
+      </w:pPr>
+      <w:rPr/>
+    </w:lvl>
+    <w:lvl w:ilvl="2">
+      <w:start w:val="1"/>
+      <w:numFmt w:val="decimal"/>
+      <w:lvlText w:val="%3."/>
+      <w:lvlJc w:val="start"/>
+      <w:pPr>
+        <w:tabs>
+          <w:tab w:val="num" w:pos="1440"/>
+        </w:tabs>
+        <w:ind w:start="1440" w:hanging="360"/>
+      </w:pPr>
+      <w:rPr/>
+    </w:lvl>
+    <w:lvl w:ilvl="3">
+      <w:start w:val="1"/>
+      <w:numFmt w:val="decimal"/>
+      <w:lvlText w:val="%4."/>
+      <w:lvlJc w:val="start"/>
+      <w:pPr>
+        <w:tabs>
+          <w:tab w:val="num" w:pos="1800"/>
+        </w:tabs>
+        <w:ind w:start="1800" w:hanging="360"/>
+      </w:pPr>
+      <w:rPr/>
+    </w:lvl>
+    <w:lvl w:ilvl="4">
+      <w:start w:val="1"/>
+      <w:numFmt w:val="decimal"/>
+      <w:lvlText w:val="%5."/>
+      <w:lvlJc w:val="start"/>
+      <w:pPr>
+        <w:tabs>
+          <w:tab w:val="num" w:pos="2160"/>
+        </w:tabs>
+        <w:ind w:start="2160" w:hanging="360"/>
+      </w:pPr>
+      <w:rPr/>
+    </w:lvl>
+    <w:lvl w:ilvl="5">
+      <w:start w:val="1"/>
+      <w:numFmt w:val="decimal"/>
+      <w:lvlText w:val="%6."/>
+      <w:lvlJc w:val="start"/>
+      <w:pPr>
+        <w:tabs>
+          <w:tab w:val="num" w:pos="2520"/>
+        </w:tabs>
+        <w:ind w:start="2520" w:hanging="360"/>
+      </w:pPr>
+      <w:rPr/>
+    </w:lvl>
+    <w:lvl w:ilvl="6">
+      <w:start w:val="1"/>
+      <w:numFmt w:val="decimal"/>
+      <w:lvlText w:val="%7."/>
+      <w:lvlJc w:val="start"/>
+      <w:pPr>
+        <w:tabs>
+          <w:tab w:val="num" w:pos="2880"/>
+        </w:tabs>
+        <w:ind w:start="2880" w:hanging="360"/>
+      </w:pPr>
+      <w:rPr/>
+    </w:lvl>
+    <w:lvl w:ilvl="7">
+      <w:start w:val="1"/>
+      <w:numFmt w:val="decimal"/>
+      <w:lvlText w:val="%8."/>
+      <w:lvlJc w:val="start"/>
+      <w:pPr>
+        <w:tabs>
+          <w:tab w:val="num" w:pos="3240"/>
+        </w:tabs>
+        <w:ind w:start="3240" w:hanging="360"/>
+      </w:pPr>
+      <w:rPr/>
+    </w:lvl>
+    <w:lvl w:ilvl="8">
+      <w:start w:val="1"/>
+      <w:numFmt w:val="decimal"/>
+      <w:lvlText w:val="%9."/>
+      <w:lvlJc w:val="start"/>
+      <w:pPr>
+        <w:tabs>
+          <w:tab w:val="num" w:pos="3600"/>
+        </w:tabs>
+        <w:ind w:start="3600" w:hanging="360"/>
+      </w:pPr>
+      <w:rPr/>
+    </w:lvl>
+  </w:abstractNum>
+  <w:abstractNum w:abstractNumId="3">
     <w:lvl w:ilvl="0">
       <w:numFmt w:val="bullet"/>
       <w:lvlText w:val="-"/>
-      <w:lvlJc w:val="left"/>
+      <w:lvlJc w:val="start"/>
       <w:pPr>
         <w:tabs>
           <w:tab w:val="num" w:pos="0"/>
         </w:tabs>
-        <w:ind w:left="720" w:hanging="360"/>
+        <w:ind w:start="720" w:hanging="360"/>
       </w:pPr>
       <w:rPr>
         <w:rFonts w:ascii="Times New Roman" w:hAnsi="Times New Roman" w:cs="Times New Roman" w:hint="default"/>
@@ -2252,12 +2272,12 @@
       <w:start w:val="1"/>
       <w:numFmt w:val="bullet"/>
       <w:lvlText w:val="o"/>
-      <w:lvlJc w:val="left"/>
+      <w:lvlJc w:val="start"/>
       <w:pPr>
         <w:tabs>
           <w:tab w:val="num" w:pos="0"/>
         </w:tabs>
-        <w:ind w:left="1440" w:hanging="360"/>
+        <w:ind w:start="1440" w:hanging="360"/>
       </w:pPr>
       <w:rPr>
         <w:rFonts w:ascii="Courier New" w:hAnsi="Courier New" w:cs="Courier New" w:hint="default"/>
@@ -2267,12 +2287,12 @@
       <w:start w:val="1"/>
       <w:numFmt w:val="bullet"/>
       <w:lvlText w:val=""/>
-      <w:lvlJc w:val="left"/>
+      <w:lvlJc w:val="start"/>
       <w:pPr>
         <w:tabs>
           <w:tab w:val="num" w:pos="0"/>
         </w:tabs>
-        <w:ind w:left="2160" w:hanging="360"/>
+        <w:ind w:start="2160" w:hanging="360"/>
       </w:pPr>
       <w:rPr>
         <w:rFonts w:ascii="Wingdings" w:hAnsi="Wingdings" w:cs="Wingdings" w:hint="default"/>
@@ -2282,12 +2302,12 @@
       <w:start w:val="1"/>
       <w:numFmt w:val="bullet"/>
       <w:lvlText w:val=""/>
-      <w:lvlJc w:val="left"/>
+      <w:lvlJc w:val="start"/>
       <w:pPr>
         <w:tabs>
           <w:tab w:val="num" w:pos="0"/>
         </w:tabs>
-        <w:ind w:left="2880" w:hanging="360"/>
+        <w:ind w:start="2880" w:hanging="360"/>
       </w:pPr>
       <w:rPr>
         <w:rFonts w:ascii="Symbol" w:hAnsi="Symbol" w:cs="Symbol" w:hint="default"/>
@@ -2297,12 +2317,12 @@
       <w:start w:val="1"/>
       <w:numFmt w:val="bullet"/>
       <w:lvlText w:val="o"/>
-      <w:lvlJc w:val="left"/>
+      <w:lvlJc w:val="start"/>
       <w:pPr>
         <w:tabs>
           <w:tab w:val="num" w:pos="0"/>
         </w:tabs>
-        <w:ind w:left="3600" w:hanging="360"/>
+        <w:ind w:start="3600" w:hanging="360"/>
       </w:pPr>
       <w:rPr>
         <w:rFonts w:ascii="Courier New" w:hAnsi="Courier New" w:cs="Courier New" w:hint="default"/>
@@ -2312,12 +2332,12 @@
       <w:start w:val="1"/>
       <w:numFmt w:val="bullet"/>
       <w:lvlText w:val=""/>
-      <w:lvlJc w:val="left"/>
+      <w:lvlJc w:val="start"/>
       <w:pPr>
         <w:tabs>
           <w:tab w:val="num" w:pos="0"/>
         </w:tabs>
-        <w:ind w:left="4320" w:hanging="360"/>
+        <w:ind w:start="4320" w:hanging="360"/>
       </w:pPr>
       <w:rPr>
         <w:rFonts w:ascii="Wingdings" w:hAnsi="Wingdings" w:cs="Wingdings" w:hint="default"/>
@@ -2327,12 +2347,12 @@
       <w:start w:val="1"/>
       <w:numFmt w:val="bullet"/>
       <w:lvlText w:val=""/>
-      <w:lvlJc w:val="left"/>
+      <w:lvlJc w:val="start"/>
       <w:pPr>
         <w:tabs>
           <w:tab w:val="num" w:pos="0"/>
         </w:tabs>
-        <w:ind w:left="5040" w:hanging="360"/>
+        <w:ind w:start="5040" w:hanging="360"/>
       </w:pPr>
       <w:rPr>
         <w:rFonts w:ascii="Symbol" w:hAnsi="Symbol" w:cs="Symbol" w:hint="default"/>
@@ -2342,12 +2362,12 @@
       <w:start w:val="1"/>
       <w:numFmt w:val="bullet"/>
       <w:lvlText w:val="o"/>
-      <w:lvlJc w:val="left"/>
+      <w:lvlJc w:val="start"/>
       <w:pPr>
         <w:tabs>
           <w:tab w:val="num" w:pos="0"/>
         </w:tabs>
-        <w:ind w:left="5760" w:hanging="360"/>
+        <w:ind w:start="5760" w:hanging="360"/>
       </w:pPr>
       <w:rPr>
         <w:rFonts w:ascii="Courier New" w:hAnsi="Courier New" w:cs="Courier New" w:hint="default"/>
@@ -2357,265 +2377,36 @@
       <w:start w:val="1"/>
       <w:numFmt w:val="bullet"/>
       <w:lvlText w:val=""/>
-      <w:lvlJc w:val="left"/>
+      <w:lvlJc w:val="start"/>
       <w:pPr>
         <w:tabs>
           <w:tab w:val="num" w:pos="0"/>
         </w:tabs>
-        <w:ind w:left="6480" w:hanging="360"/>
+        <w:ind w:start="6480" w:hanging="360"/>
       </w:pPr>
       <w:rPr>
         <w:rFonts w:ascii="Wingdings" w:hAnsi="Wingdings" w:cs="Wingdings" w:hint="default"/>
       </w:rPr>
     </w:lvl>
   </w:abstractNum>
-  <w:abstractNum w:abstractNumId="1" w15:restartNumberingAfterBreak="0">
-    <w:nsid w:val="5D722661"/>
-    <w:multiLevelType w:val="multilevel"/>
-    <w:tmpl w:val="3606D9D8"/>
-    <w:lvl w:ilvl="0">
-      <w:start w:val="1"/>
-      <w:numFmt w:val="lowerLetter"/>
-      <w:pStyle w:val="ListParagraph"/>
-      <w:suff w:val="space"/>
-      <w:lvlText w:val="%1."/>
-      <w:lvlJc w:val="left"/>
-      <w:pPr>
-        <w:tabs>
-          <w:tab w:val="num" w:pos="0"/>
-        </w:tabs>
-        <w:ind w:left="0" w:firstLine="0"/>
-      </w:pPr>
-    </w:lvl>
-    <w:lvl w:ilvl="1">
-      <w:start w:val="1"/>
-      <w:numFmt w:val="decimal"/>
-      <w:lvlText w:val="%2."/>
-      <w:lvlJc w:val="left"/>
-      <w:pPr>
-        <w:tabs>
-          <w:tab w:val="num" w:pos="1080"/>
-        </w:tabs>
-        <w:ind w:left="1080" w:hanging="360"/>
-      </w:pPr>
-    </w:lvl>
-    <w:lvl w:ilvl="2">
-      <w:start w:val="1"/>
-      <w:numFmt w:val="decimal"/>
-      <w:lvlText w:val="%3."/>
-      <w:lvlJc w:val="left"/>
-      <w:pPr>
-        <w:tabs>
-          <w:tab w:val="num" w:pos="1440"/>
-        </w:tabs>
-        <w:ind w:left="1440" w:hanging="360"/>
-      </w:pPr>
-    </w:lvl>
-    <w:lvl w:ilvl="3">
-      <w:start w:val="1"/>
-      <w:numFmt w:val="decimal"/>
-      <w:lvlText w:val="%4."/>
-      <w:lvlJc w:val="left"/>
-      <w:pPr>
-        <w:tabs>
-          <w:tab w:val="num" w:pos="1800"/>
-        </w:tabs>
-        <w:ind w:left="1800" w:hanging="360"/>
-      </w:pPr>
-    </w:lvl>
-    <w:lvl w:ilvl="4">
-      <w:start w:val="1"/>
-      <w:numFmt w:val="decimal"/>
-      <w:lvlText w:val="%5."/>
-      <w:lvlJc w:val="left"/>
-      <w:pPr>
-        <w:tabs>
-          <w:tab w:val="num" w:pos="2160"/>
-        </w:tabs>
-        <w:ind w:left="2160" w:hanging="360"/>
-      </w:pPr>
-    </w:lvl>
-    <w:lvl w:ilvl="5">
-      <w:start w:val="1"/>
-      <w:numFmt w:val="decimal"/>
-      <w:lvlText w:val="%6."/>
-      <w:lvlJc w:val="left"/>
-      <w:pPr>
-        <w:tabs>
-          <w:tab w:val="num" w:pos="2520"/>
-        </w:tabs>
-        <w:ind w:left="2520" w:hanging="360"/>
-      </w:pPr>
-    </w:lvl>
-    <w:lvl w:ilvl="6">
-      <w:start w:val="1"/>
-      <w:numFmt w:val="decimal"/>
-      <w:lvlText w:val="%7."/>
-      <w:lvlJc w:val="left"/>
-      <w:pPr>
-        <w:tabs>
-          <w:tab w:val="num" w:pos="2880"/>
-        </w:tabs>
-        <w:ind w:left="2880" w:hanging="360"/>
-      </w:pPr>
-    </w:lvl>
-    <w:lvl w:ilvl="7">
-      <w:start w:val="1"/>
-      <w:numFmt w:val="decimal"/>
-      <w:lvlText w:val="%8."/>
-      <w:lvlJc w:val="left"/>
-      <w:pPr>
-        <w:tabs>
-          <w:tab w:val="num" w:pos="3240"/>
-        </w:tabs>
-        <w:ind w:left="3240" w:hanging="360"/>
-      </w:pPr>
-    </w:lvl>
-    <w:lvl w:ilvl="8">
-      <w:start w:val="1"/>
-      <w:numFmt w:val="decimal"/>
-      <w:lvlText w:val="%9."/>
-      <w:lvlJc w:val="left"/>
-      <w:pPr>
-        <w:tabs>
-          <w:tab w:val="num" w:pos="3600"/>
-        </w:tabs>
-        <w:ind w:left="3600" w:hanging="360"/>
-      </w:pPr>
-    </w:lvl>
-  </w:abstractNum>
-  <w:abstractNum w:abstractNumId="2" w15:restartNumberingAfterBreak="0">
-    <w:nsid w:val="72BB4221"/>
-    <w:multiLevelType w:val="multilevel"/>
-    <w:tmpl w:val="3C42120C"/>
-    <w:lvl w:ilvl="0">
-      <w:start w:val="1"/>
-      <w:numFmt w:val="decimal"/>
-      <w:pStyle w:val="Heading1"/>
-      <w:lvlText w:val="%1."/>
-      <w:lvlJc w:val="left"/>
-      <w:pPr>
-        <w:tabs>
-          <w:tab w:val="num" w:pos="0"/>
-        </w:tabs>
-        <w:ind w:left="684" w:hanging="400"/>
-      </w:pPr>
-    </w:lvl>
-    <w:lvl w:ilvl="1">
-      <w:start w:val="1"/>
-      <w:numFmt w:val="upperLetter"/>
-      <w:lvlText w:val="%2."/>
-      <w:lvlJc w:val="left"/>
-      <w:pPr>
-        <w:tabs>
-          <w:tab w:val="num" w:pos="0"/>
-        </w:tabs>
-        <w:ind w:left="1200" w:hanging="400"/>
-      </w:pPr>
-    </w:lvl>
-    <w:lvl w:ilvl="2">
-      <w:start w:val="1"/>
-      <w:numFmt w:val="lowerRoman"/>
-      <w:lvlText w:val="%3."/>
-      <w:lvlJc w:val="right"/>
-      <w:pPr>
-        <w:tabs>
-          <w:tab w:val="num" w:pos="0"/>
-        </w:tabs>
-        <w:ind w:left="1600" w:hanging="400"/>
-      </w:pPr>
-    </w:lvl>
-    <w:lvl w:ilvl="3">
-      <w:start w:val="1"/>
-      <w:numFmt w:val="decimal"/>
-      <w:lvlText w:val="%4."/>
-      <w:lvlJc w:val="left"/>
-      <w:pPr>
-        <w:tabs>
-          <w:tab w:val="num" w:pos="0"/>
-        </w:tabs>
-        <w:ind w:left="2000" w:hanging="400"/>
-      </w:pPr>
-    </w:lvl>
-    <w:lvl w:ilvl="4">
-      <w:start w:val="1"/>
-      <w:numFmt w:val="upperLetter"/>
-      <w:lvlText w:val="%5."/>
-      <w:lvlJc w:val="left"/>
-      <w:pPr>
-        <w:tabs>
-          <w:tab w:val="num" w:pos="0"/>
-        </w:tabs>
-        <w:ind w:left="2400" w:hanging="400"/>
-      </w:pPr>
-    </w:lvl>
-    <w:lvl w:ilvl="5">
-      <w:start w:val="1"/>
-      <w:numFmt w:val="lowerRoman"/>
-      <w:lvlText w:val="%6."/>
-      <w:lvlJc w:val="right"/>
-      <w:pPr>
-        <w:tabs>
-          <w:tab w:val="num" w:pos="0"/>
-        </w:tabs>
-        <w:ind w:left="2800" w:hanging="400"/>
-      </w:pPr>
-    </w:lvl>
-    <w:lvl w:ilvl="6">
-      <w:start w:val="1"/>
-      <w:numFmt w:val="decimal"/>
-      <w:lvlText w:val="%7."/>
-      <w:lvlJc w:val="left"/>
-      <w:pPr>
-        <w:tabs>
-          <w:tab w:val="num" w:pos="0"/>
-        </w:tabs>
-        <w:ind w:left="3200" w:hanging="400"/>
-      </w:pPr>
-    </w:lvl>
-    <w:lvl w:ilvl="7">
-      <w:start w:val="1"/>
-      <w:numFmt w:val="upperLetter"/>
-      <w:lvlText w:val="%8."/>
-      <w:lvlJc w:val="left"/>
-      <w:pPr>
-        <w:tabs>
-          <w:tab w:val="num" w:pos="0"/>
-        </w:tabs>
-        <w:ind w:left="3600" w:hanging="400"/>
-      </w:pPr>
-    </w:lvl>
-    <w:lvl w:ilvl="8">
-      <w:start w:val="1"/>
-      <w:numFmt w:val="lowerRoman"/>
-      <w:lvlText w:val="%9."/>
-      <w:lvlJc w:val="right"/>
-      <w:pPr>
-        <w:tabs>
-          <w:tab w:val="num" w:pos="0"/>
-        </w:tabs>
-        <w:ind w:left="4000" w:hanging="400"/>
-      </w:pPr>
-    </w:lvl>
-  </w:abstractNum>
-  <w:num w:numId="1" w16cid:durableId="1855683789">
+  <w:num w:numId="1">
+    <w:abstractNumId w:val="1"/>
+  </w:num>
+  <w:num w:numId="2">
     <w:abstractNumId w:val="2"/>
   </w:num>
-  <w:num w:numId="2" w16cid:durableId="1955096684">
-    <w:abstractNumId w:val="1"/>
-  </w:num>
-  <w:num w:numId="3" w16cid:durableId="1792943270">
-    <w:abstractNumId w:val="0"/>
+  <w:num w:numId="3">
+    <w:abstractNumId w:val="3"/>
   </w:num>
 </w:numbering>
 </file>
 
 <file path=word/styles.xml><?xml version="1.0" encoding="utf-8"?>
-<w:styles xmlns:mc="http://schemas.openxmlformats.org/markup-compatibility/2006" xmlns:r="http://schemas.openxmlformats.org/officeDocument/2006/relationships" xmlns:w="http://schemas.openxmlformats.org/wordprocessingml/2006/main" xmlns:w14="http://schemas.microsoft.com/office/word/2010/wordml" xmlns:w15="http://schemas.microsoft.com/office/word/2012/wordml" xmlns:w16cex="http://schemas.microsoft.com/office/word/2018/wordml/cex" xmlns:w16cid="http://schemas.microsoft.com/office/word/2016/wordml/cid" xmlns:w16="http://schemas.microsoft.com/office/word/2018/wordml" xmlns:w16du="http://schemas.microsoft.com/office/word/2023/wordml/word16du" xmlns:w16sdtdh="http://schemas.microsoft.com/office/word/2020/wordml/sdtdatahash" xmlns:w16sdtfl="http://schemas.microsoft.com/office/word/2024/wordml/sdtformatlock" xmlns:w16se="http://schemas.microsoft.com/office/word/2015/wordml/symex" mc:Ignorable="w14 w15 w16se w16cid w16 w16cex w16sdtdh w16sdtfl w16du">
+<w:styles xmlns:w="http://schemas.openxmlformats.org/wordprocessingml/2006/main" xmlns:w14="http://schemas.microsoft.com/office/word/2010/wordml" xmlns:mc="http://schemas.openxmlformats.org/markup-compatibility/2006" mc:Ignorable="w14">
   <w:docDefaults>
     <w:rPrDefault>
       <w:rPr>
-        <w:rFonts w:asciiTheme="minorHAnsi" w:eastAsia="Gulim" w:hAnsiTheme="minorHAnsi" w:cstheme="minorBidi"/>
+        <w:rFonts w:ascii="Aptos" w:hAnsi="Aptos" w:eastAsia="Gulim" w:cs="" w:asciiTheme="minorHAnsi" w:cstheme="minorBidi" w:hAnsiTheme="minorHAnsi"/>
         <w:kern w:val="2"/>
         <w:sz w:val="24"/>
         <w:szCs w:val="24"/>
@@ -2625,21 +2416,21 @@
     </w:rPrDefault>
     <w:pPrDefault>
       <w:pPr>
-        <w:suppressAutoHyphens/>
+        <w:suppressAutoHyphens w:val="true"/>
       </w:pPr>
     </w:pPrDefault>
   </w:docDefaults>
   <w:latentStyles w:defLockedState="0" w:defUIPriority="99" w:defSemiHidden="0" w:defUnhideWhenUsed="0" w:defQFormat="0" w:count="376">
     <w:lsdException w:name="Normal" w:uiPriority="0" w:qFormat="1"/>
     <w:lsdException w:name="heading 1" w:uiPriority="9" w:qFormat="1"/>
-    <w:lsdException w:name="heading 2" w:semiHidden="1" w:uiPriority="9" w:unhideWhenUsed="1" w:qFormat="1"/>
-    <w:lsdException w:name="heading 3" w:semiHidden="1" w:uiPriority="9" w:unhideWhenUsed="1" w:qFormat="1"/>
-    <w:lsdException w:name="heading 4" w:semiHidden="1" w:uiPriority="9" w:unhideWhenUsed="1" w:qFormat="1"/>
-    <w:lsdException w:name="heading 5" w:semiHidden="1" w:uiPriority="9" w:unhideWhenUsed="1" w:qFormat="1"/>
-    <w:lsdException w:name="heading 6" w:semiHidden="1" w:uiPriority="9" w:unhideWhenUsed="1" w:qFormat="1"/>
-    <w:lsdException w:name="heading 7" w:semiHidden="1" w:uiPriority="9" w:unhideWhenUsed="1" w:qFormat="1"/>
-    <w:lsdException w:name="heading 8" w:semiHidden="1" w:uiPriority="9" w:unhideWhenUsed="1" w:qFormat="1"/>
-    <w:lsdException w:name="heading 9" w:semiHidden="1" w:uiPriority="9" w:unhideWhenUsed="1" w:qFormat="1"/>
+    <w:lsdException w:name="heading 2" w:uiPriority="9" w:semiHidden="1" w:unhideWhenUsed="1" w:qFormat="1"/>
+    <w:lsdException w:name="heading 3" w:uiPriority="9" w:semiHidden="1" w:unhideWhenUsed="1" w:qFormat="1"/>
+    <w:lsdException w:name="heading 4" w:uiPriority="9" w:semiHidden="1" w:unhideWhenUsed="1" w:qFormat="1"/>
+    <w:lsdException w:name="heading 5" w:uiPriority="9" w:semiHidden="1" w:unhideWhenUsed="1" w:qFormat="1"/>
+    <w:lsdException w:name="heading 6" w:uiPriority="9" w:semiHidden="1" w:unhideWhenUsed="1" w:qFormat="1"/>
+    <w:lsdException w:name="heading 7" w:uiPriority="9" w:semiHidden="1" w:unhideWhenUsed="1" w:qFormat="1"/>
+    <w:lsdException w:name="heading 8" w:uiPriority="9" w:semiHidden="1" w:unhideWhenUsed="1" w:qFormat="1"/>
+    <w:lsdException w:name="heading 9" w:uiPriority="9" w:semiHidden="1" w:unhideWhenUsed="1" w:qFormat="1"/>
     <w:lsdException w:name="index 1" w:semiHidden="1" w:unhideWhenUsed="1"/>
     <w:lsdException w:name="index 2" w:semiHidden="1" w:unhideWhenUsed="1"/>
     <w:lsdException w:name="index 3" w:semiHidden="1" w:unhideWhenUsed="1"/>
@@ -2649,22 +2440,22 @@
     <w:lsdException w:name="index 7" w:semiHidden="1" w:unhideWhenUsed="1"/>
     <w:lsdException w:name="index 8" w:semiHidden="1" w:unhideWhenUsed="1"/>
     <w:lsdException w:name="index 9" w:semiHidden="1" w:unhideWhenUsed="1"/>
-    <w:lsdException w:name="toc 1" w:semiHidden="1" w:uiPriority="39" w:unhideWhenUsed="1"/>
-    <w:lsdException w:name="toc 2" w:semiHidden="1" w:uiPriority="39" w:unhideWhenUsed="1"/>
-    <w:lsdException w:name="toc 3" w:semiHidden="1" w:uiPriority="39" w:unhideWhenUsed="1"/>
-    <w:lsdException w:name="toc 4" w:semiHidden="1" w:uiPriority="39" w:unhideWhenUsed="1"/>
-    <w:lsdException w:name="toc 5" w:semiHidden="1" w:uiPriority="39" w:unhideWhenUsed="1"/>
-    <w:lsdException w:name="toc 6" w:semiHidden="1" w:uiPriority="39" w:unhideWhenUsed="1"/>
-    <w:lsdException w:name="toc 7" w:semiHidden="1" w:uiPriority="39" w:unhideWhenUsed="1"/>
-    <w:lsdException w:name="toc 8" w:semiHidden="1" w:uiPriority="39" w:unhideWhenUsed="1"/>
-    <w:lsdException w:name="toc 9" w:semiHidden="1" w:uiPriority="39" w:unhideWhenUsed="1"/>
+    <w:lsdException w:name="toc 1" w:uiPriority="39" w:semiHidden="1" w:unhideWhenUsed="1"/>
+    <w:lsdException w:name="toc 2" w:uiPriority="39" w:semiHidden="1" w:unhideWhenUsed="1"/>
+    <w:lsdException w:name="toc 3" w:uiPriority="39" w:semiHidden="1" w:unhideWhenUsed="1"/>
+    <w:lsdException w:name="toc 4" w:uiPriority="39" w:semiHidden="1" w:unhideWhenUsed="1"/>
+    <w:lsdException w:name="toc 5" w:uiPriority="39" w:semiHidden="1" w:unhideWhenUsed="1"/>
+    <w:lsdException w:name="toc 6" w:uiPriority="39" w:semiHidden="1" w:unhideWhenUsed="1"/>
+    <w:lsdException w:name="toc 7" w:uiPriority="39" w:semiHidden="1" w:unhideWhenUsed="1"/>
+    <w:lsdException w:name="toc 8" w:uiPriority="39" w:semiHidden="1" w:unhideWhenUsed="1"/>
+    <w:lsdException w:name="toc 9" w:uiPriority="39" w:semiHidden="1" w:unhideWhenUsed="1"/>
     <w:lsdException w:name="Normal Indent" w:semiHidden="1" w:unhideWhenUsed="1"/>
     <w:lsdException w:name="footnote text" w:semiHidden="1" w:unhideWhenUsed="1"/>
     <w:lsdException w:name="annotation text" w:semiHidden="1" w:unhideWhenUsed="1"/>
     <w:lsdException w:name="header" w:semiHidden="1" w:unhideWhenUsed="1"/>
     <w:lsdException w:name="footer" w:semiHidden="1" w:unhideWhenUsed="1"/>
     <w:lsdException w:name="index heading" w:semiHidden="1" w:unhideWhenUsed="1"/>
-    <w:lsdException w:name="caption" w:semiHidden="1" w:uiPriority="35" w:unhideWhenUsed="1" w:qFormat="1"/>
+    <w:lsdException w:name="caption" w:uiPriority="35" w:semiHidden="1" w:unhideWhenUsed="1" w:qFormat="1"/>
     <w:lsdException w:name="table of figures" w:semiHidden="1" w:unhideWhenUsed="1"/>
     <w:lsdException w:name="envelope address" w:semiHidden="1" w:unhideWhenUsed="1"/>
     <w:lsdException w:name="envelope return" w:semiHidden="1" w:unhideWhenUsed="1"/>
@@ -2695,7 +2486,7 @@
     <w:lsdException w:name="Title" w:uiPriority="10" w:qFormat="1"/>
     <w:lsdException w:name="Closing" w:semiHidden="1" w:unhideWhenUsed="1"/>
     <w:lsdException w:name="Signature" w:semiHidden="1" w:unhideWhenUsed="1"/>
-    <w:lsdException w:name="Default Paragraph Font" w:semiHidden="1" w:uiPriority="1" w:unhideWhenUsed="1"/>
+    <w:lsdException w:name="Default Paragraph Font" w:uiPriority="1" w:semiHidden="1" w:unhideWhenUsed="1"/>
     <w:lsdException w:name="Body Text" w:semiHidden="1" w:unhideWhenUsed="1"/>
     <w:lsdException w:name="Body Text Indent" w:semiHidden="1" w:unhideWhenUsed="1"/>
     <w:lsdException w:name="List Continue" w:semiHidden="1" w:unhideWhenUsed="1"/>
@@ -2895,8 +2686,8 @@
     <w:lsdException w:name="Subtle Reference" w:uiPriority="31" w:qFormat="1"/>
     <w:lsdException w:name="Intense Reference" w:uiPriority="32" w:qFormat="1"/>
     <w:lsdException w:name="Book Title" w:uiPriority="33" w:qFormat="1"/>
-    <w:lsdException w:name="Bibliography" w:semiHidden="1" w:uiPriority="37" w:unhideWhenUsed="1"/>
-    <w:lsdException w:name="TOC Heading" w:semiHidden="1" w:uiPriority="39" w:unhideWhenUsed="1" w:qFormat="1"/>
+    <w:lsdException w:name="Bibliography" w:uiPriority="37" w:semiHidden="1" w:unhideWhenUsed="1"/>
+    <w:lsdException w:name="TOC Heading" w:uiPriority="39" w:semiHidden="1" w:unhideWhenUsed="1" w:qFormat="1"/>
     <w:lsdException w:name="Plain Table 1" w:uiPriority="41"/>
     <w:lsdException w:name="Plain Table 2" w:uiPriority="42"/>
     <w:lsdException w:name="Plain Table 3" w:uiPriority="43"/>
@@ -3007,14 +2798,24 @@
     <w:lsdException w:name="Unresolved Mention" w:semiHidden="1" w:unhideWhenUsed="1"/>
     <w:lsdException w:name="Smart Link" w:semiHidden="1" w:unhideWhenUsed="1"/>
   </w:latentStyles>
-  <w:style w:type="paragraph" w:default="1" w:styleId="Normal">
+  <w:style w:type="paragraph" w:styleId="Normal" w:default="1">
     <w:name w:val="Normal"/>
     <w:qFormat/>
-    <w:rsid w:val="00A7237E"/>
+    <w:rsid w:val="00a7237e"/>
+    <w:pPr>
+      <w:widowControl/>
+      <w:suppressAutoHyphens w:val="true"/>
+      <w:bidi w:val="0"/>
+      <w:spacing w:before="0" w:after="0"/>
+      <w:jc w:val="start"/>
+    </w:pPr>
     <w:rPr>
-      <w:rFonts w:ascii="Times New Roman" w:hAnsi="Times New Roman" w:cs="Gulim"/>
+      <w:rFonts w:ascii="Times New Roman" w:hAnsi="Times New Roman" w:eastAsia="Gulim" w:cs="Gulim"/>
+      <w:color w:val="auto"/>
       <w:kern w:val="0"/>
-      <w:lang w:val="en-US" w:eastAsia="ko-KR"/>
+      <w:sz w:val="24"/>
+      <w:szCs w:val="24"/>
+      <w:lang w:val="en-US" w:eastAsia="ko-KR" w:bidi="ar-SA"/>
       <w14:ligatures w14:val="none"/>
     </w:rPr>
   </w:style>
@@ -3026,18 +2827,19 @@
     <w:autoRedefine/>
     <w:uiPriority w:val="9"/>
     <w:qFormat/>
-    <w:rsid w:val="00A7237E"/>
+    <w:rsid w:val="00a7237e"/>
     <w:pPr>
-      <w:keepNext/>
+      <w:keepNext w:val="true"/>
       <w:numPr>
+        <w:ilvl w:val="0"/>
         <w:numId w:val="1"/>
       </w:numPr>
       <w:spacing w:before="120" w:after="120"/>
-      <w:ind w:rightChars="100" w:right="100"/>
+      <w:ind w:endChars="100"/>
       <w:outlineLvl w:val="0"/>
     </w:pPr>
     <w:rPr>
-      <w:rFonts w:eastAsia="Times New Roman" w:cstheme="majorBidi"/>
+      <w:rFonts w:eastAsia="Times New Roman" w:cs="" w:cstheme="majorBidi"/>
       <w:b/>
       <w:sz w:val="28"/>
       <w:szCs w:val="28"/>
@@ -3052,16 +2854,16 @@
     <w:semiHidden/>
     <w:unhideWhenUsed/>
     <w:qFormat/>
-    <w:rsid w:val="00AC40A2"/>
+    <w:rsid w:val="00ac40a2"/>
     <w:pPr>
-      <w:keepNext/>
+      <w:keepNext w:val="true"/>
       <w:keepLines/>
       <w:spacing w:before="160" w:after="80"/>
       <w:outlineLvl w:val="1"/>
     </w:pPr>
     <w:rPr>
-      <w:rFonts w:asciiTheme="majorHAnsi" w:eastAsiaTheme="majorEastAsia" w:hAnsiTheme="majorHAnsi" w:cstheme="majorBidi"/>
-      <w:color w:val="0F4761" w:themeColor="accent1" w:themeShade="BF"/>
+      <w:rFonts w:ascii="Aptos Display" w:hAnsi="Aptos Display" w:eastAsia="" w:cs="" w:asciiTheme="majorHAnsi" w:cstheme="majorBidi" w:eastAsiaTheme="majorEastAsia" w:hAnsiTheme="majorHAnsi"/>
+      <w:color w:themeColor="accent1" w:themeShade="bf" w:val="0F4761"/>
       <w:sz w:val="32"/>
       <w:szCs w:val="32"/>
     </w:rPr>
@@ -3075,16 +2877,16 @@
     <w:semiHidden/>
     <w:unhideWhenUsed/>
     <w:qFormat/>
-    <w:rsid w:val="00AC40A2"/>
+    <w:rsid w:val="00ac40a2"/>
     <w:pPr>
-      <w:keepNext/>
+      <w:keepNext w:val="true"/>
       <w:keepLines/>
       <w:spacing w:before="160" w:after="80"/>
       <w:outlineLvl w:val="2"/>
     </w:pPr>
     <w:rPr>
-      <w:rFonts w:asciiTheme="minorHAnsi" w:eastAsiaTheme="majorEastAsia" w:hAnsiTheme="minorHAnsi" w:cstheme="majorBidi"/>
-      <w:color w:val="0F4761" w:themeColor="accent1" w:themeShade="BF"/>
+      <w:rFonts w:ascii="Aptos" w:hAnsi="Aptos" w:eastAsia="" w:cs="" w:asciiTheme="minorHAnsi" w:cstheme="majorBidi" w:eastAsiaTheme="majorEastAsia" w:hAnsiTheme="minorHAnsi"/>
+      <w:color w:themeColor="accent1" w:themeShade="bf" w:val="0F4761"/>
       <w:sz w:val="28"/>
       <w:szCs w:val="28"/>
     </w:rPr>
@@ -3098,18 +2900,18 @@
     <w:semiHidden/>
     <w:unhideWhenUsed/>
     <w:qFormat/>
-    <w:rsid w:val="00AC40A2"/>
+    <w:rsid w:val="00ac40a2"/>
     <w:pPr>
-      <w:keepNext/>
+      <w:keepNext w:val="true"/>
       <w:keepLines/>
       <w:spacing w:before="80" w:after="40"/>
       <w:outlineLvl w:val="3"/>
     </w:pPr>
     <w:rPr>
-      <w:rFonts w:asciiTheme="minorHAnsi" w:eastAsiaTheme="majorEastAsia" w:hAnsiTheme="minorHAnsi" w:cstheme="majorBidi"/>
+      <w:rFonts w:ascii="Aptos" w:hAnsi="Aptos" w:eastAsia="" w:cs="" w:asciiTheme="minorHAnsi" w:cstheme="majorBidi" w:eastAsiaTheme="majorEastAsia" w:hAnsiTheme="minorHAnsi"/>
       <w:i/>
       <w:iCs/>
-      <w:color w:val="0F4761" w:themeColor="accent1" w:themeShade="BF"/>
+      <w:color w:themeColor="accent1" w:themeShade="bf" w:val="0F4761"/>
     </w:rPr>
   </w:style>
   <w:style w:type="paragraph" w:styleId="Heading5">
@@ -3121,16 +2923,16 @@
     <w:semiHidden/>
     <w:unhideWhenUsed/>
     <w:qFormat/>
-    <w:rsid w:val="00AC40A2"/>
+    <w:rsid w:val="00ac40a2"/>
     <w:pPr>
-      <w:keepNext/>
+      <w:keepNext w:val="true"/>
       <w:keepLines/>
       <w:spacing w:before="80" w:after="40"/>
       <w:outlineLvl w:val="4"/>
     </w:pPr>
     <w:rPr>
-      <w:rFonts w:asciiTheme="minorHAnsi" w:eastAsiaTheme="majorEastAsia" w:hAnsiTheme="minorHAnsi" w:cstheme="majorBidi"/>
-      <w:color w:val="0F4761" w:themeColor="accent1" w:themeShade="BF"/>
+      <w:rFonts w:ascii="Aptos" w:hAnsi="Aptos" w:eastAsia="" w:cs="" w:asciiTheme="minorHAnsi" w:cstheme="majorBidi" w:eastAsiaTheme="majorEastAsia" w:hAnsiTheme="minorHAnsi"/>
+      <w:color w:themeColor="accent1" w:themeShade="bf" w:val="0F4761"/>
     </w:rPr>
   </w:style>
   <w:style w:type="paragraph" w:styleId="Heading6">
@@ -3142,18 +2944,18 @@
     <w:semiHidden/>
     <w:unhideWhenUsed/>
     <w:qFormat/>
-    <w:rsid w:val="00AC40A2"/>
+    <w:rsid w:val="00ac40a2"/>
     <w:pPr>
-      <w:keepNext/>
+      <w:keepNext w:val="true"/>
       <w:keepLines/>
-      <w:spacing w:before="40"/>
+      <w:spacing w:before="40" w:after="0"/>
       <w:outlineLvl w:val="5"/>
     </w:pPr>
     <w:rPr>
-      <w:rFonts w:asciiTheme="minorHAnsi" w:eastAsiaTheme="majorEastAsia" w:hAnsiTheme="minorHAnsi" w:cstheme="majorBidi"/>
+      <w:rFonts w:ascii="Aptos" w:hAnsi="Aptos" w:eastAsia="" w:cs="" w:asciiTheme="minorHAnsi" w:cstheme="majorBidi" w:eastAsiaTheme="majorEastAsia" w:hAnsiTheme="minorHAnsi"/>
       <w:i/>
       <w:iCs/>
-      <w:color w:val="595959" w:themeColor="text1" w:themeTint="A6"/>
+      <w:color w:themeColor="text1" w:themeTint="a6" w:val="595959"/>
     </w:rPr>
   </w:style>
   <w:style w:type="paragraph" w:styleId="Heading7">
@@ -3165,16 +2967,16 @@
     <w:semiHidden/>
     <w:unhideWhenUsed/>
     <w:qFormat/>
-    <w:rsid w:val="00AC40A2"/>
+    <w:rsid w:val="00ac40a2"/>
     <w:pPr>
-      <w:keepNext/>
+      <w:keepNext w:val="true"/>
       <w:keepLines/>
-      <w:spacing w:before="40"/>
+      <w:spacing w:before="40" w:after="0"/>
       <w:outlineLvl w:val="6"/>
     </w:pPr>
     <w:rPr>
-      <w:rFonts w:asciiTheme="minorHAnsi" w:eastAsiaTheme="majorEastAsia" w:hAnsiTheme="minorHAnsi" w:cstheme="majorBidi"/>
-      <w:color w:val="595959" w:themeColor="text1" w:themeTint="A6"/>
+      <w:rFonts w:ascii="Aptos" w:hAnsi="Aptos" w:eastAsia="" w:cs="" w:asciiTheme="minorHAnsi" w:cstheme="majorBidi" w:eastAsiaTheme="majorEastAsia" w:hAnsiTheme="minorHAnsi"/>
+      <w:color w:themeColor="text1" w:themeTint="a6" w:val="595959"/>
     </w:rPr>
   </w:style>
   <w:style w:type="paragraph" w:styleId="Heading8">
@@ -3186,17 +2988,17 @@
     <w:semiHidden/>
     <w:unhideWhenUsed/>
     <w:qFormat/>
-    <w:rsid w:val="00AC40A2"/>
+    <w:rsid w:val="00ac40a2"/>
     <w:pPr>
-      <w:keepNext/>
+      <w:keepNext w:val="true"/>
       <w:keepLines/>
       <w:outlineLvl w:val="7"/>
     </w:pPr>
     <w:rPr>
-      <w:rFonts w:asciiTheme="minorHAnsi" w:eastAsiaTheme="majorEastAsia" w:hAnsiTheme="minorHAnsi" w:cstheme="majorBidi"/>
+      <w:rFonts w:ascii="Aptos" w:hAnsi="Aptos" w:eastAsia="" w:cs="" w:asciiTheme="minorHAnsi" w:cstheme="majorBidi" w:eastAsiaTheme="majorEastAsia" w:hAnsiTheme="minorHAnsi"/>
       <w:i/>
       <w:iCs/>
-      <w:color w:val="272727" w:themeColor="text1" w:themeTint="D8"/>
+      <w:color w:themeColor="text1" w:themeTint="d8" w:val="272727"/>
     </w:rPr>
   </w:style>
   <w:style w:type="paragraph" w:styleId="Heading9">
@@ -3208,70 +3010,51 @@
     <w:semiHidden/>
     <w:unhideWhenUsed/>
     <w:qFormat/>
-    <w:rsid w:val="00AC40A2"/>
+    <w:rsid w:val="00ac40a2"/>
     <w:pPr>
-      <w:keepNext/>
+      <w:keepNext w:val="true"/>
       <w:keepLines/>
       <w:outlineLvl w:val="8"/>
     </w:pPr>
     <w:rPr>
-      <w:rFonts w:asciiTheme="minorHAnsi" w:eastAsiaTheme="majorEastAsia" w:hAnsiTheme="minorHAnsi" w:cstheme="majorBidi"/>
-      <w:color w:val="272727" w:themeColor="text1" w:themeTint="D8"/>
+      <w:rFonts w:ascii="Aptos" w:hAnsi="Aptos" w:eastAsia="" w:cs="" w:asciiTheme="minorHAnsi" w:cstheme="majorBidi" w:eastAsiaTheme="majorEastAsia" w:hAnsiTheme="minorHAnsi"/>
+      <w:color w:themeColor="text1" w:themeTint="d8" w:val="272727"/>
     </w:rPr>
   </w:style>
-  <w:style w:type="character" w:default="1" w:styleId="DefaultParagraphFont">
+  <w:style w:type="character" w:styleId="DefaultParagraphFont" w:default="1">
     <w:name w:val="Default Paragraph Font"/>
     <w:uiPriority w:val="1"/>
     <w:semiHidden/>
     <w:unhideWhenUsed/>
-  </w:style>
-  <w:style w:type="table" w:default="1" w:styleId="TableNormal">
-    <w:name w:val="Normal Table"/>
-    <w:uiPriority w:val="99"/>
-    <w:semiHidden/>
-    <w:unhideWhenUsed/>
-    <w:tblPr>
-      <w:tblInd w:w="0" w:type="dxa"/>
-      <w:tblCellMar>
-        <w:top w:w="0" w:type="dxa"/>
-        <w:left w:w="108" w:type="dxa"/>
-        <w:bottom w:w="0" w:type="dxa"/>
-        <w:right w:w="108" w:type="dxa"/>
-      </w:tblCellMar>
-    </w:tblPr>
-  </w:style>
-  <w:style w:type="numbering" w:default="1" w:styleId="NoList">
-    <w:name w:val="No List"/>
-    <w:uiPriority w:val="99"/>
-    <w:semiHidden/>
-    <w:unhideWhenUsed/>
-  </w:style>
-  <w:style w:type="character" w:customStyle="1" w:styleId="Heading1Char">
+    <w:qFormat/>
+    <w:rPr/>
+  </w:style>
+  <w:style w:type="character" w:styleId="Heading1Char" w:customStyle="1">
     <w:name w:val="Heading 1 Char"/>
     <w:basedOn w:val="DefaultParagraphFont"/>
     <w:link w:val="Heading1"/>
     <w:uiPriority w:val="9"/>
     <w:qFormat/>
-    <w:rsid w:val="00A7237E"/>
+    <w:rsid w:val="00a7237e"/>
     <w:rPr>
-      <w:rFonts w:ascii="Times New Roman" w:eastAsia="Times New Roman" w:hAnsi="Times New Roman" w:cstheme="majorBidi"/>
+      <w:rFonts w:ascii="Times New Roman" w:hAnsi="Times New Roman" w:eastAsia="Times New Roman" w:cs="" w:cstheme="majorBidi"/>
       <w:b/>
       <w:sz w:val="28"/>
       <w:szCs w:val="28"/>
       <w:lang w:eastAsia="ko-KR"/>
     </w:rPr>
   </w:style>
-  <w:style w:type="character" w:customStyle="1" w:styleId="Heading2Char">
+  <w:style w:type="character" w:styleId="Heading2Char" w:customStyle="1">
     <w:name w:val="Heading 2 Char"/>
     <w:basedOn w:val="DefaultParagraphFont"/>
     <w:link w:val="Heading2"/>
     <w:uiPriority w:val="9"/>
     <w:semiHidden/>
     <w:qFormat/>
-    <w:rsid w:val="00AC40A2"/>
+    <w:rsid w:val="00ac40a2"/>
     <w:rPr>
-      <w:rFonts w:asciiTheme="majorHAnsi" w:eastAsiaTheme="majorEastAsia" w:hAnsiTheme="majorHAnsi" w:cstheme="majorBidi"/>
-      <w:color w:val="0F4761" w:themeColor="accent1" w:themeShade="BF"/>
+      <w:rFonts w:ascii="Aptos Display" w:hAnsi="Aptos Display" w:eastAsia="" w:cs="" w:asciiTheme="majorHAnsi" w:cstheme="majorBidi" w:eastAsiaTheme="majorEastAsia" w:hAnsiTheme="majorHAnsi"/>
+      <w:color w:themeColor="accent1" w:themeShade="bf" w:val="0F4761"/>
       <w:kern w:val="0"/>
       <w:sz w:val="32"/>
       <w:szCs w:val="32"/>
@@ -3279,17 +3062,17 @@
       <w14:ligatures w14:val="none"/>
     </w:rPr>
   </w:style>
-  <w:style w:type="character" w:customStyle="1" w:styleId="Heading3Char">
+  <w:style w:type="character" w:styleId="Heading3Char" w:customStyle="1">
     <w:name w:val="Heading 3 Char"/>
     <w:basedOn w:val="DefaultParagraphFont"/>
     <w:link w:val="Heading3"/>
     <w:uiPriority w:val="9"/>
     <w:semiHidden/>
     <w:qFormat/>
-    <w:rsid w:val="00AC40A2"/>
+    <w:rsid w:val="00ac40a2"/>
     <w:rPr>
-      <w:rFonts w:eastAsiaTheme="majorEastAsia" w:cstheme="majorBidi"/>
-      <w:color w:val="0F4761" w:themeColor="accent1" w:themeShade="BF"/>
+      <w:rFonts w:eastAsia="" w:cs="" w:cstheme="majorBidi" w:eastAsiaTheme="majorEastAsia"/>
+      <w:color w:themeColor="accent1" w:themeShade="bf" w:val="0F4761"/>
       <w:kern w:val="0"/>
       <w:sz w:val="28"/>
       <w:szCs w:val="28"/>
@@ -3297,117 +3080,117 @@
       <w14:ligatures w14:val="none"/>
     </w:rPr>
   </w:style>
-  <w:style w:type="character" w:customStyle="1" w:styleId="Heading4Char">
+  <w:style w:type="character" w:styleId="Heading4Char" w:customStyle="1">
     <w:name w:val="Heading 4 Char"/>
     <w:basedOn w:val="DefaultParagraphFont"/>
     <w:link w:val="Heading4"/>
     <w:uiPriority w:val="9"/>
     <w:semiHidden/>
     <w:qFormat/>
-    <w:rsid w:val="00AC40A2"/>
+    <w:rsid w:val="00ac40a2"/>
     <w:rPr>
-      <w:rFonts w:eastAsiaTheme="majorEastAsia" w:cstheme="majorBidi"/>
+      <w:rFonts w:eastAsia="" w:cs="" w:cstheme="majorBidi" w:eastAsiaTheme="majorEastAsia"/>
       <w:i/>
       <w:iCs/>
-      <w:color w:val="0F4761" w:themeColor="accent1" w:themeShade="BF"/>
+      <w:color w:themeColor="accent1" w:themeShade="bf" w:val="0F4761"/>
       <w:kern w:val="0"/>
       <w:lang w:val="en-US" w:eastAsia="ko-KR"/>
       <w14:ligatures w14:val="none"/>
     </w:rPr>
   </w:style>
-  <w:style w:type="character" w:customStyle="1" w:styleId="Heading5Char">
+  <w:style w:type="character" w:styleId="Heading5Char" w:customStyle="1">
     <w:name w:val="Heading 5 Char"/>
     <w:basedOn w:val="DefaultParagraphFont"/>
     <w:link w:val="Heading5"/>
     <w:uiPriority w:val="9"/>
     <w:semiHidden/>
     <w:qFormat/>
-    <w:rsid w:val="00AC40A2"/>
+    <w:rsid w:val="00ac40a2"/>
     <w:rPr>
-      <w:rFonts w:eastAsiaTheme="majorEastAsia" w:cstheme="majorBidi"/>
-      <w:color w:val="0F4761" w:themeColor="accent1" w:themeShade="BF"/>
+      <w:rFonts w:eastAsia="" w:cs="" w:cstheme="majorBidi" w:eastAsiaTheme="majorEastAsia"/>
+      <w:color w:themeColor="accent1" w:themeShade="bf" w:val="0F4761"/>
       <w:kern w:val="0"/>
       <w:lang w:val="en-US" w:eastAsia="ko-KR"/>
       <w14:ligatures w14:val="none"/>
     </w:rPr>
   </w:style>
-  <w:style w:type="character" w:customStyle="1" w:styleId="Heading6Char">
+  <w:style w:type="character" w:styleId="Heading6Char" w:customStyle="1">
     <w:name w:val="Heading 6 Char"/>
     <w:basedOn w:val="DefaultParagraphFont"/>
     <w:link w:val="Heading6"/>
     <w:uiPriority w:val="9"/>
     <w:semiHidden/>
     <w:qFormat/>
-    <w:rsid w:val="00AC40A2"/>
+    <w:rsid w:val="00ac40a2"/>
     <w:rPr>
-      <w:rFonts w:eastAsiaTheme="majorEastAsia" w:cstheme="majorBidi"/>
+      <w:rFonts w:eastAsia="" w:cs="" w:cstheme="majorBidi" w:eastAsiaTheme="majorEastAsia"/>
       <w:i/>
       <w:iCs/>
-      <w:color w:val="595959" w:themeColor="text1" w:themeTint="A6"/>
+      <w:color w:themeColor="text1" w:themeTint="a6" w:val="595959"/>
       <w:kern w:val="0"/>
       <w:lang w:val="en-US" w:eastAsia="ko-KR"/>
       <w14:ligatures w14:val="none"/>
     </w:rPr>
   </w:style>
-  <w:style w:type="character" w:customStyle="1" w:styleId="Heading7Char">
+  <w:style w:type="character" w:styleId="Heading7Char" w:customStyle="1">
     <w:name w:val="Heading 7 Char"/>
     <w:basedOn w:val="DefaultParagraphFont"/>
     <w:link w:val="Heading7"/>
     <w:uiPriority w:val="9"/>
     <w:semiHidden/>
     <w:qFormat/>
-    <w:rsid w:val="00AC40A2"/>
+    <w:rsid w:val="00ac40a2"/>
     <w:rPr>
-      <w:rFonts w:eastAsiaTheme="majorEastAsia" w:cstheme="majorBidi"/>
-      <w:color w:val="595959" w:themeColor="text1" w:themeTint="A6"/>
+      <w:rFonts w:eastAsia="" w:cs="" w:cstheme="majorBidi" w:eastAsiaTheme="majorEastAsia"/>
+      <w:color w:themeColor="text1" w:themeTint="a6" w:val="595959"/>
       <w:kern w:val="0"/>
       <w:lang w:val="en-US" w:eastAsia="ko-KR"/>
       <w14:ligatures w14:val="none"/>
     </w:rPr>
   </w:style>
-  <w:style w:type="character" w:customStyle="1" w:styleId="Heading8Char">
+  <w:style w:type="character" w:styleId="Heading8Char" w:customStyle="1">
     <w:name w:val="Heading 8 Char"/>
     <w:basedOn w:val="DefaultParagraphFont"/>
     <w:link w:val="Heading8"/>
     <w:uiPriority w:val="9"/>
     <w:semiHidden/>
     <w:qFormat/>
-    <w:rsid w:val="00AC40A2"/>
+    <w:rsid w:val="00ac40a2"/>
     <w:rPr>
-      <w:rFonts w:eastAsiaTheme="majorEastAsia" w:cstheme="majorBidi"/>
+      <w:rFonts w:eastAsia="" w:cs="" w:cstheme="majorBidi" w:eastAsiaTheme="majorEastAsia"/>
       <w:i/>
       <w:iCs/>
-      <w:color w:val="272727" w:themeColor="text1" w:themeTint="D8"/>
+      <w:color w:themeColor="text1" w:themeTint="d8" w:val="272727"/>
       <w:kern w:val="0"/>
       <w:lang w:val="en-US" w:eastAsia="ko-KR"/>
       <w14:ligatures w14:val="none"/>
     </w:rPr>
   </w:style>
-  <w:style w:type="character" w:customStyle="1" w:styleId="Heading9Char">
+  <w:style w:type="character" w:styleId="Heading9Char" w:customStyle="1">
     <w:name w:val="Heading 9 Char"/>
     <w:basedOn w:val="DefaultParagraphFont"/>
     <w:link w:val="Heading9"/>
     <w:uiPriority w:val="9"/>
     <w:semiHidden/>
     <w:qFormat/>
-    <w:rsid w:val="00AC40A2"/>
+    <w:rsid w:val="00ac40a2"/>
     <w:rPr>
-      <w:rFonts w:eastAsiaTheme="majorEastAsia" w:cstheme="majorBidi"/>
-      <w:color w:val="272727" w:themeColor="text1" w:themeTint="D8"/>
+      <w:rFonts w:eastAsia="" w:cs="" w:cstheme="majorBidi" w:eastAsiaTheme="majorEastAsia"/>
+      <w:color w:themeColor="text1" w:themeTint="d8" w:val="272727"/>
       <w:kern w:val="0"/>
       <w:lang w:val="en-US" w:eastAsia="ko-KR"/>
       <w14:ligatures w14:val="none"/>
     </w:rPr>
   </w:style>
-  <w:style w:type="character" w:customStyle="1" w:styleId="TitleChar">
+  <w:style w:type="character" w:styleId="TitleChar" w:customStyle="1">
     <w:name w:val="Title Char"/>
     <w:basedOn w:val="DefaultParagraphFont"/>
     <w:link w:val="Title"/>
     <w:uiPriority w:val="10"/>
     <w:qFormat/>
-    <w:rsid w:val="00AC40A2"/>
+    <w:rsid w:val="00ac40a2"/>
     <w:rPr>
-      <w:rFonts w:asciiTheme="majorHAnsi" w:eastAsiaTheme="majorEastAsia" w:hAnsiTheme="majorHAnsi" w:cstheme="majorBidi"/>
+      <w:rFonts w:ascii="Aptos Display" w:hAnsi="Aptos Display" w:eastAsia="" w:cs="" w:asciiTheme="majorHAnsi" w:cstheme="majorBidi" w:eastAsiaTheme="majorEastAsia" w:hAnsiTheme="majorHAnsi"/>
       <w:spacing w:val="-10"/>
       <w:kern w:val="2"/>
       <w:sz w:val="56"/>
@@ -3416,16 +3199,16 @@
       <w14:ligatures w14:val="none"/>
     </w:rPr>
   </w:style>
-  <w:style w:type="character" w:customStyle="1" w:styleId="SubtitleChar">
+  <w:style w:type="character" w:styleId="SubtitleChar" w:customStyle="1">
     <w:name w:val="Subtitle Char"/>
     <w:basedOn w:val="DefaultParagraphFont"/>
     <w:link w:val="Subtitle"/>
     <w:uiPriority w:val="11"/>
     <w:qFormat/>
-    <w:rsid w:val="00AC40A2"/>
+    <w:rsid w:val="00ac40a2"/>
     <w:rPr>
-      <w:rFonts w:eastAsiaTheme="majorEastAsia" w:cstheme="majorBidi"/>
-      <w:color w:val="595959" w:themeColor="text1" w:themeTint="A6"/>
+      <w:rFonts w:eastAsia="" w:cs="" w:cstheme="majorBidi" w:eastAsiaTheme="majorEastAsia"/>
+      <w:color w:themeColor="text1" w:themeTint="a6" w:val="595959"/>
       <w:spacing w:val="15"/>
       <w:kern w:val="0"/>
       <w:sz w:val="28"/>
@@ -3434,18 +3217,18 @@
       <w14:ligatures w14:val="none"/>
     </w:rPr>
   </w:style>
-  <w:style w:type="character" w:customStyle="1" w:styleId="QuoteChar">
+  <w:style w:type="character" w:styleId="QuoteChar" w:customStyle="1">
     <w:name w:val="Quote Char"/>
     <w:basedOn w:val="DefaultParagraphFont"/>
     <w:link w:val="Quote"/>
     <w:uiPriority w:val="29"/>
     <w:qFormat/>
-    <w:rsid w:val="00AC40A2"/>
+    <w:rsid w:val="00ac40a2"/>
     <w:rPr>
       <w:rFonts w:ascii="Times New Roman" w:hAnsi="Times New Roman" w:cs="Gulim"/>
       <w:i/>
       <w:iCs/>
-      <w:color w:val="404040" w:themeColor="text1" w:themeTint="BF"/>
+      <w:color w:themeColor="text1" w:themeTint="bf" w:val="404040"/>
       <w:kern w:val="0"/>
       <w:lang w:val="en-US" w:eastAsia="ko-KR"/>
       <w14:ligatures w14:val="none"/>
@@ -3456,25 +3239,25 @@
     <w:basedOn w:val="DefaultParagraphFont"/>
     <w:uiPriority w:val="21"/>
     <w:qFormat/>
-    <w:rsid w:val="00AC40A2"/>
+    <w:rsid w:val="00ac40a2"/>
     <w:rPr>
       <w:i/>
       <w:iCs/>
-      <w:color w:val="0F4761" w:themeColor="accent1" w:themeShade="BF"/>
+      <w:color w:themeColor="accent1" w:themeShade="bf" w:val="0F4761"/>
     </w:rPr>
   </w:style>
-  <w:style w:type="character" w:customStyle="1" w:styleId="IntenseQuoteChar">
+  <w:style w:type="character" w:styleId="IntenseQuoteChar" w:customStyle="1">
     <w:name w:val="Intense Quote Char"/>
     <w:basedOn w:val="DefaultParagraphFont"/>
     <w:link w:val="IntenseQuote"/>
     <w:uiPriority w:val="30"/>
     <w:qFormat/>
-    <w:rsid w:val="00AC40A2"/>
+    <w:rsid w:val="00ac40a2"/>
     <w:rPr>
       <w:rFonts w:ascii="Times New Roman" w:hAnsi="Times New Roman" w:cs="Gulim"/>
       <w:i/>
       <w:iCs/>
-      <w:color w:val="0F4761" w:themeColor="accent1" w:themeShade="BF"/>
+      <w:color w:themeColor="accent1" w:themeShade="bf" w:val="0F4761"/>
       <w:kern w:val="0"/>
       <w:lang w:val="en-US" w:eastAsia="ko-KR"/>
       <w14:ligatures w14:val="none"/>
@@ -3485,26 +3268,26 @@
     <w:basedOn w:val="DefaultParagraphFont"/>
     <w:uiPriority w:val="32"/>
     <w:qFormat/>
-    <w:rsid w:val="00AC40A2"/>
+    <w:rsid w:val="00ac40a2"/>
     <w:rPr>
       <w:b/>
       <w:bCs/>
       <w:smallCaps/>
-      <w:color w:val="0F4761" w:themeColor="accent1" w:themeShade="BF"/>
+      <w:color w:themeColor="accent1" w:themeShade="bf" w:val="0F4761"/>
       <w:spacing w:val="5"/>
     </w:rPr>
   </w:style>
-  <w:style w:type="paragraph" w:customStyle="1" w:styleId="Heading">
+  <w:style w:type="paragraph" w:styleId="Heading" w:customStyle="1">
     <w:name w:val="Heading"/>
     <w:basedOn w:val="Normal"/>
     <w:next w:val="BodyText"/>
     <w:qFormat/>
     <w:pPr>
-      <w:keepNext/>
+      <w:keepNext w:val="true"/>
       <w:spacing w:before="240" w:after="120"/>
     </w:pPr>
     <w:rPr>
-      <w:rFonts w:ascii="Liberation Sans" w:eastAsia="Noto Sans CJK SC" w:hAnsi="Liberation Sans" w:cs="Noto Sans Devanagari"/>
+      <w:rFonts w:ascii="Liberation Sans" w:hAnsi="Liberation Sans" w:eastAsia="Noto Sans CJK SC" w:cs="Noto Sans Devanagari"/>
       <w:sz w:val="28"/>
       <w:szCs w:val="28"/>
     </w:rPr>
@@ -3513,12 +3296,14 @@
     <w:name w:val="Body Text"/>
     <w:basedOn w:val="Normal"/>
     <w:pPr>
-      <w:spacing w:after="140" w:line="276" w:lineRule="auto"/>
+      <w:spacing w:lineRule="auto" w:line="276" w:before="0" w:after="140"/>
     </w:pPr>
+    <w:rPr/>
   </w:style>
   <w:style w:type="paragraph" w:styleId="List">
     <w:name w:val="List"/>
     <w:basedOn w:val="BodyText"/>
+    <w:pPr/>
     <w:rPr>
       <w:rFonts w:cs="Noto Sans Devanagari"/>
     </w:rPr>
@@ -3537,7 +3322,7 @@
       <w:iCs/>
     </w:rPr>
   </w:style>
-  <w:style w:type="paragraph" w:customStyle="1" w:styleId="Index">
+  <w:style w:type="paragraph" w:styleId="Index" w:customStyle="1">
     <w:name w:val="Index"/>
     <w:basedOn w:val="Normal"/>
     <w:qFormat/>
@@ -3554,16 +3339,17 @@
     <w:autoRedefine/>
     <w:uiPriority w:val="34"/>
     <w:qFormat/>
-    <w:rsid w:val="00A7237E"/>
+    <w:rsid w:val="00a7237e"/>
     <w:pPr>
       <w:numPr>
+        <w:ilvl w:val="0"/>
         <w:numId w:val="2"/>
       </w:numPr>
-      <w:spacing w:after="160" w:line="259" w:lineRule="auto"/>
-      <w:ind w:left="240"/>
+      <w:spacing w:lineRule="auto" w:line="259" w:before="0" w:after="160"/>
+      <w:ind w:start="240"/>
     </w:pPr>
     <w:rPr>
-      <w:rFonts w:eastAsiaTheme="minorEastAsia" w:cs="Times New Roman"/>
+      <w:rFonts w:eastAsia="" w:cs="Times New Roman" w:eastAsiaTheme="minorEastAsia"/>
       <w:iCs/>
       <w:sz w:val="26"/>
       <w:szCs w:val="26"/>
@@ -3576,13 +3362,13 @@
     <w:link w:val="TitleChar"/>
     <w:uiPriority w:val="10"/>
     <w:qFormat/>
-    <w:rsid w:val="00AC40A2"/>
+    <w:rsid w:val="00ac40a2"/>
     <w:pPr>
-      <w:spacing w:after="80"/>
+      <w:spacing w:before="0" w:after="80"/>
       <w:contextualSpacing/>
     </w:pPr>
     <w:rPr>
-      <w:rFonts w:asciiTheme="majorHAnsi" w:eastAsiaTheme="majorEastAsia" w:hAnsiTheme="majorHAnsi" w:cstheme="majorBidi"/>
+      <w:rFonts w:ascii="Aptos Display" w:hAnsi="Aptos Display" w:eastAsia="" w:cs="" w:asciiTheme="majorHAnsi" w:cstheme="majorBidi" w:eastAsiaTheme="majorEastAsia" w:hAnsiTheme="majorHAnsi"/>
       <w:spacing w:val="-10"/>
       <w:kern w:val="2"/>
       <w:sz w:val="56"/>
@@ -3596,13 +3382,13 @@
     <w:link w:val="SubtitleChar"/>
     <w:uiPriority w:val="11"/>
     <w:qFormat/>
-    <w:rsid w:val="00AC40A2"/>
+    <w:rsid w:val="00ac40a2"/>
     <w:pPr>
-      <w:spacing w:after="160"/>
+      <w:spacing w:before="0" w:after="160"/>
     </w:pPr>
     <w:rPr>
-      <w:rFonts w:asciiTheme="minorHAnsi" w:eastAsiaTheme="majorEastAsia" w:hAnsiTheme="minorHAnsi" w:cstheme="majorBidi"/>
-      <w:color w:val="595959" w:themeColor="text1" w:themeTint="A6"/>
+      <w:rFonts w:ascii="Aptos" w:hAnsi="Aptos" w:eastAsia="" w:cs="" w:asciiTheme="minorHAnsi" w:cstheme="majorBidi" w:eastAsiaTheme="majorEastAsia" w:hAnsiTheme="minorHAnsi"/>
+      <w:color w:themeColor="text1" w:themeTint="a6" w:val="595959"/>
       <w:spacing w:val="15"/>
       <w:sz w:val="28"/>
       <w:szCs w:val="28"/>
@@ -3615,7 +3401,7 @@
     <w:link w:val="QuoteChar"/>
     <w:uiPriority w:val="29"/>
     <w:qFormat/>
-    <w:rsid w:val="00AC40A2"/>
+    <w:rsid w:val="00ac40a2"/>
     <w:pPr>
       <w:spacing w:before="160" w:after="160"/>
       <w:jc w:val="center"/>
@@ -3623,7 +3409,7 @@
     <w:rPr>
       <w:i/>
       <w:iCs/>
-      <w:color w:val="404040" w:themeColor="text1" w:themeTint="BF"/>
+      <w:color w:themeColor="text1" w:themeTint="bf" w:val="404040"/>
     </w:rPr>
   </w:style>
   <w:style w:type="paragraph" w:styleId="IntenseQuote">
@@ -3633,27 +3419,48 @@
     <w:link w:val="IntenseQuoteChar"/>
     <w:uiPriority w:val="30"/>
     <w:qFormat/>
-    <w:rsid w:val="00AC40A2"/>
+    <w:rsid w:val="00ac40a2"/>
     <w:pPr>
       <w:pBdr>
-        <w:top w:val="single" w:sz="4" w:space="10" w:color="0F4761" w:themeColor="accent1" w:themeShade="BF"/>
-        <w:bottom w:val="single" w:sz="4" w:space="10" w:color="0F4761" w:themeColor="accent1" w:themeShade="BF"/>
+        <w:top w:val="single" w:sz="4" w:space="10" w:color="0F4761" w:themeColor="accent1" w:themeShade="bf"/>
+        <w:bottom w:val="single" w:sz="4" w:space="10" w:color="0F4761" w:themeColor="accent1" w:themeShade="bf"/>
       </w:pBdr>
       <w:spacing w:before="360" w:after="360"/>
-      <w:ind w:left="864" w:right="864"/>
+      <w:ind w:start="864" w:end="864"/>
       <w:jc w:val="center"/>
     </w:pPr>
     <w:rPr>
       <w:i/>
       <w:iCs/>
-      <w:color w:val="0F4761" w:themeColor="accent1" w:themeShade="BF"/>
+      <w:color w:themeColor="accent1" w:themeShade="bf" w:val="0F4761"/>
     </w:rPr>
+  </w:style>
+  <w:style w:type="numbering" w:styleId="NoList" w:default="1">
+    <w:name w:val="No List"/>
+    <w:uiPriority w:val="99"/>
+    <w:semiHidden/>
+    <w:unhideWhenUsed/>
+    <w:qFormat/>
+  </w:style>
+  <w:style w:type="table" w:default="1" w:styleId="TableNormal">
+    <w:name w:val="Normal Table"/>
+    <w:uiPriority w:val="99"/>
+    <w:semiHidden/>
+    <w:unhideWhenUsed/>
+    <w:tblPr>
+      <w:tblCellMar>
+        <w:top w:w="0" w:type="dxa"/>
+        <w:left w:w="108" w:type="dxa"/>
+        <w:bottom w:w="0" w:type="dxa"/>
+        <w:right w:w="108" w:type="dxa"/>
+      </w:tblCellMar>
+    </w:tblPr>
   </w:style>
 </w:styles>
 </file>
 
 <file path=word/theme/theme1.xml><?xml version="1.0" encoding="utf-8"?>
-<a:theme xmlns:a="http://schemas.openxmlformats.org/drawingml/2006/main" name="Office Theme">
+<a:theme xmlns:a="http://schemas.openxmlformats.org/drawingml/2006/main" xmlns:r="http://schemas.openxmlformats.org/officeDocument/2006/relationships" name="Office Theme">
   <a:themeElements>
     <a:clrScheme name="Office">
       <a:dk1>
@@ -3695,12 +3502,12 @@
     </a:clrScheme>
     <a:fontScheme name="Office">
       <a:majorFont>
-        <a:latin typeface="Aptos Display" panose="02110004020202020204"/>
+        <a:latin typeface="Aptos Display" panose="02110004020202020204" pitchFamily="0" charset="1"/>
         <a:ea typeface=""/>
         <a:cs typeface=""/>
       </a:majorFont>
       <a:minorFont>
-        <a:latin typeface="Aptos" panose="02110004020202020204"/>
+        <a:latin typeface="Aptos" panose="02110004020202020204" pitchFamily="0" charset="1"/>
         <a:ea typeface=""/>
         <a:cs typeface=""/>
       </a:minorFont>
@@ -3732,7 +3539,7 @@
             </a:gs>
           </a:gsLst>
           <a:lin ang="5400000" scaled="0"/>
-          <a:tileRect/>
+          <a:tileRect l="0" t="0" r="0" b="0"/>
         </a:gradFill>
         <a:gradFill>
           <a:gsLst>
@@ -3756,7 +3563,7 @@
             </a:gs>
           </a:gsLst>
           <a:lin ang="5400000" scaled="0"/>
-          <a:tileRect/>
+          <a:tileRect l="0" t="0" r="0" b="0"/>
         </a:gradFill>
       </a:fillStyleLst>
       <a:lnStyleLst>
@@ -3816,12 +3623,10 @@
             </a:gs>
           </a:gsLst>
           <a:lin ang="5400000" scaled="0"/>
-          <a:tileRect/>
+          <a:tileRect l="0" t="0" r="0" b="0"/>
         </a:gradFill>
       </a:bgFillStyleLst>
     </a:fmtScheme>
   </a:themeElements>
-  <a:objectDefaults/>
-  <a:extraClrSchemeLst/>
 </a:theme>
 </file>
</xml_diff>

<commit_message>
change ticketType api name to ticket-type
</commit_message>
<xml_diff>
--- a/specification_breakdown.docx
+++ b/specification_breakdown.docx
@@ -1,14 +1,9 @@
 
 <file path=word/document.xml><?xml version="1.0" encoding="utf-8"?>
-<w:document xmlns:o="urn:schemas-microsoft-com:office:office" xmlns:r="http://schemas.openxmlformats.org/officeDocument/2006/relationships" xmlns:v="urn:schemas-microsoft-com:vml" xmlns:w="http://schemas.openxmlformats.org/wordprocessingml/2006/main" xmlns:w10="urn:schemas-microsoft-com:office:word" xmlns:wp="http://schemas.openxmlformats.org/drawingml/2006/wordprocessingDrawing" xmlns:pic="http://schemas.openxmlformats.org/drawingml/2006/picture" xmlns:wps="http://schemas.microsoft.com/office/word/2010/wordprocessingShape" xmlns:wpg="http://schemas.microsoft.com/office/word/2010/wordprocessingGroup" xmlns:mc="http://schemas.openxmlformats.org/markup-compatibility/2006" xmlns:wp14="http://schemas.microsoft.com/office/word/2010/wordprocessingDrawing" xmlns:w14="http://schemas.microsoft.com/office/word/2010/wordml" xmlns:w15="http://schemas.microsoft.com/office/word/2012/wordml" mc:Ignorable="w14 wp14 w15">
+<w:document xmlns:wpc="http://schemas.microsoft.com/office/word/2010/wordprocessingCanvas" xmlns:cx="http://schemas.microsoft.com/office/drawing/2014/chartex" xmlns:cx1="http://schemas.microsoft.com/office/drawing/2015/9/8/chartex" xmlns:cx2="http://schemas.microsoft.com/office/drawing/2015/10/21/chartex" xmlns:cx3="http://schemas.microsoft.com/office/drawing/2016/5/9/chartex" xmlns:cx4="http://schemas.microsoft.com/office/drawing/2016/5/10/chartex" xmlns:cx5="http://schemas.microsoft.com/office/drawing/2016/5/11/chartex" xmlns:cx6="http://schemas.microsoft.com/office/drawing/2016/5/12/chartex" xmlns:cx7="http://schemas.microsoft.com/office/drawing/2016/5/13/chartex" xmlns:cx8="http://schemas.microsoft.com/office/drawing/2016/5/14/chartex" xmlns:mc="http://schemas.openxmlformats.org/markup-compatibility/2006" xmlns:aink="http://schemas.microsoft.com/office/drawing/2016/ink" xmlns:am3d="http://schemas.microsoft.com/office/drawing/2017/model3d" xmlns:o="urn:schemas-microsoft-com:office:office" xmlns:oel="http://schemas.microsoft.com/office/2019/extlst" xmlns:r="http://schemas.openxmlformats.org/officeDocument/2006/relationships" xmlns:m="http://schemas.openxmlformats.org/officeDocument/2006/math" xmlns:v="urn:schemas-microsoft-com:vml" xmlns:wp14="http://schemas.microsoft.com/office/word/2010/wordprocessingDrawing" xmlns:wp="http://schemas.openxmlformats.org/drawingml/2006/wordprocessingDrawing" xmlns:w10="urn:schemas-microsoft-com:office:word" xmlns:w="http://schemas.openxmlformats.org/wordprocessingml/2006/main" xmlns:w14="http://schemas.microsoft.com/office/word/2010/wordml" xmlns:w15="http://schemas.microsoft.com/office/word/2012/wordml" xmlns:w16cex="http://schemas.microsoft.com/office/word/2018/wordml/cex" xmlns:w16cid="http://schemas.microsoft.com/office/word/2016/wordml/cid" xmlns:w16="http://schemas.microsoft.com/office/word/2018/wordml" xmlns:w16du="http://schemas.microsoft.com/office/word/2023/wordml/word16du" xmlns:w16sdtdh="http://schemas.microsoft.com/office/word/2020/wordml/sdtdatahash" xmlns:w16sdtfl="http://schemas.microsoft.com/office/word/2024/wordml/sdtformatlock" xmlns:w16se="http://schemas.microsoft.com/office/word/2015/wordml/symex" xmlns:wpg="http://schemas.microsoft.com/office/word/2010/wordprocessingGroup" xmlns:wpi="http://schemas.microsoft.com/office/word/2010/wordprocessingInk" xmlns:wne="http://schemas.microsoft.com/office/word/2006/wordml" xmlns:wps="http://schemas.microsoft.com/office/word/2010/wordprocessingShape" mc:Ignorable="w14 w15 w16se w16cid w16 w16cex w16sdtdh w16sdtfl w16du wp14">
   <w:body>
     <w:p>
-      <w:pPr>
-        <w:pStyle w:val="Normal"/>
-        <w:rPr/>
-      </w:pPr>
-      <w:r>
-        <w:rPr/>
+      <w:r>
         <w:t>Ticket:</w:t>
       </w:r>
     </w:p>
@@ -19,10 +14,8 @@
           <w:ilvl w:val="0"/>
           <w:numId w:val="3"/>
         </w:numPr>
-        <w:rPr/>
-      </w:pPr>
-      <w:r>
-        <w:rPr/>
+      </w:pPr>
+      <w:r>
         <w:t>Người dùng</w:t>
       </w:r>
     </w:p>
@@ -33,7 +26,7 @@
           <w:ilvl w:val="1"/>
           <w:numId w:val="3"/>
         </w:numPr>
-        <w:spacing w:before="0" w:after="0"/>
+        <w:spacing w:after="0"/>
         <w:rPr>
           <w:rFonts w:eastAsia="Times New Roman"/>
         </w:rPr>
@@ -52,7 +45,7 @@
           <w:ilvl w:val="1"/>
           <w:numId w:val="3"/>
         </w:numPr>
-        <w:spacing w:before="0" w:after="0"/>
+        <w:spacing w:after="0"/>
         <w:rPr>
           <w:rFonts w:eastAsia="Times New Roman"/>
         </w:rPr>
@@ -71,7 +64,7 @@
           <w:ilvl w:val="1"/>
           <w:numId w:val="3"/>
         </w:numPr>
-        <w:spacing w:before="0" w:after="0"/>
+        <w:spacing w:after="0"/>
         <w:rPr>
           <w:rFonts w:eastAsia="Times New Roman"/>
         </w:rPr>
@@ -90,7 +83,7 @@
           <w:ilvl w:val="1"/>
           <w:numId w:val="3"/>
         </w:numPr>
-        <w:spacing w:before="0" w:after="0"/>
+        <w:spacing w:after="0"/>
         <w:rPr>
           <w:rFonts w:eastAsia="Times New Roman"/>
         </w:rPr>
@@ -109,7 +102,7 @@
           <w:ilvl w:val="1"/>
           <w:numId w:val="3"/>
         </w:numPr>
-        <w:spacing w:before="0" w:after="0"/>
+        <w:spacing w:after="0"/>
         <w:rPr>
           <w:rFonts w:eastAsia="Times New Roman"/>
         </w:rPr>
@@ -128,7 +121,7 @@
           <w:ilvl w:val="0"/>
           <w:numId w:val="3"/>
         </w:numPr>
-        <w:spacing w:before="0" w:after="0"/>
+        <w:spacing w:after="0"/>
         <w:rPr>
           <w:rFonts w:eastAsia="Times New Roman"/>
         </w:rPr>
@@ -147,13 +140,12 @@
           <w:ilvl w:val="1"/>
           <w:numId w:val="3"/>
         </w:numPr>
-        <w:spacing w:before="0" w:after="0"/>
-        <w:rPr>
-          <w:rFonts w:eastAsia="Times New Roman"/>
-        </w:rPr>
-      </w:pPr>
-      <w:r>
-        <w:rPr/>
+        <w:spacing w:after="0"/>
+        <w:rPr>
+          <w:rFonts w:eastAsia="Times New Roman"/>
+        </w:rPr>
+      </w:pPr>
+      <w:r>
         <w:t>Đơn vị/phòng ban</w:t>
       </w:r>
     </w:p>
@@ -164,7 +156,7 @@
           <w:ilvl w:val="1"/>
           <w:numId w:val="3"/>
         </w:numPr>
-        <w:spacing w:before="0" w:after="0"/>
+        <w:spacing w:after="0"/>
         <w:rPr>
           <w:rFonts w:eastAsia="Times New Roman"/>
         </w:rPr>
@@ -183,7 +175,7 @@
           <w:ilvl w:val="1"/>
           <w:numId w:val="3"/>
         </w:numPr>
-        <w:spacing w:before="0" w:after="0"/>
+        <w:spacing w:after="0"/>
         <w:rPr>
           <w:rFonts w:eastAsia="Times New Roman"/>
         </w:rPr>
@@ -202,7 +194,7 @@
           <w:ilvl w:val="1"/>
           <w:numId w:val="3"/>
         </w:numPr>
-        <w:spacing w:before="0" w:after="0"/>
+        <w:spacing w:after="0"/>
         <w:rPr>
           <w:rFonts w:eastAsia="Times New Roman"/>
         </w:rPr>
@@ -221,7 +213,7 @@
           <w:ilvl w:val="1"/>
           <w:numId w:val="3"/>
         </w:numPr>
-        <w:spacing w:before="0" w:after="0"/>
+        <w:spacing w:after="0"/>
         <w:rPr>
           <w:rFonts w:eastAsia="Times New Roman"/>
         </w:rPr>
@@ -240,7 +232,7 @@
           <w:ilvl w:val="1"/>
           <w:numId w:val="3"/>
         </w:numPr>
-        <w:spacing w:before="0" w:after="0"/>
+        <w:spacing w:after="0"/>
         <w:rPr>
           <w:rFonts w:eastAsia="Times New Roman"/>
         </w:rPr>
@@ -259,7 +251,7 @@
           <w:ilvl w:val="0"/>
           <w:numId w:val="3"/>
         </w:numPr>
-        <w:spacing w:before="0" w:after="0"/>
+        <w:spacing w:after="0"/>
         <w:rPr>
           <w:rFonts w:eastAsia="Times New Roman"/>
         </w:rPr>
@@ -278,7 +270,7 @@
           <w:ilvl w:val="1"/>
           <w:numId w:val="3"/>
         </w:numPr>
-        <w:spacing w:before="0" w:after="0"/>
+        <w:spacing w:after="0"/>
         <w:rPr>
           <w:rFonts w:eastAsia="Times New Roman"/>
         </w:rPr>
@@ -297,7 +289,7 @@
           <w:ilvl w:val="1"/>
           <w:numId w:val="3"/>
         </w:numPr>
-        <w:spacing w:before="0" w:after="0"/>
+        <w:spacing w:after="0"/>
         <w:rPr>
           <w:rFonts w:eastAsia="Times New Roman"/>
         </w:rPr>
@@ -316,7 +308,7 @@
           <w:ilvl w:val="1"/>
           <w:numId w:val="3"/>
         </w:numPr>
-        <w:spacing w:before="0" w:after="0"/>
+        <w:spacing w:after="0"/>
         <w:rPr>
           <w:rFonts w:eastAsia="Times New Roman"/>
         </w:rPr>
@@ -335,7 +327,7 @@
           <w:ilvl w:val="1"/>
           <w:numId w:val="3"/>
         </w:numPr>
-        <w:spacing w:before="0" w:afterAutospacing="1"/>
+        <w:spacing w:afterAutospacing="1"/>
         <w:rPr>
           <w:rFonts w:eastAsia="Times New Roman"/>
         </w:rPr>
@@ -349,7 +341,6 @@
     </w:p>
     <w:p>
       <w:pPr>
-        <w:pStyle w:val="Normal"/>
         <w:spacing w:beforeAutospacing="1" w:afterAutospacing="1"/>
         <w:rPr>
           <w:rFonts w:eastAsia="Times New Roman"/>
@@ -378,13 +369,7 @@
         <w:rPr>
           <w:rFonts w:eastAsia="Times New Roman"/>
         </w:rPr>
-        <w:t>“</w:t>
-      </w:r>
-      <w:r>
-        <w:rPr>
-          <w:rFonts w:eastAsia="Times New Roman"/>
-        </w:rPr>
-        <w:t>Mới tạo” - người dùng vừa tạo ticket</w:t>
+        <w:t>“Mới tạo” - người dùng vừa tạo ticket</w:t>
       </w:r>
     </w:p>
     <w:p>
@@ -394,22 +379,16 @@
           <w:ilvl w:val="0"/>
           <w:numId w:val="3"/>
         </w:numPr>
-        <w:spacing w:before="0" w:after="0"/>
-        <w:rPr>
-          <w:rFonts w:eastAsia="Times New Roman"/>
-        </w:rPr>
-      </w:pPr>
-      <w:r>
-        <w:rPr>
-          <w:rFonts w:eastAsia="Times New Roman"/>
-        </w:rPr>
-        <w:t>“</w:t>
-      </w:r>
-      <w:r>
-        <w:rPr>
-          <w:rFonts w:eastAsia="Times New Roman"/>
-        </w:rPr>
-        <w:t>Đang xử lý” - quản trị viên cập nhập người xử lí</w:t>
+        <w:spacing w:after="0"/>
+        <w:rPr>
+          <w:rFonts w:eastAsia="Times New Roman"/>
+        </w:rPr>
+      </w:pPr>
+      <w:r>
+        <w:rPr>
+          <w:rFonts w:eastAsia="Times New Roman"/>
+        </w:rPr>
+        <w:t>“Đang xử lý” - quản trị viên cập nhập người xử lí</w:t>
       </w:r>
     </w:p>
     <w:p>
@@ -419,22 +398,16 @@
           <w:ilvl w:val="0"/>
           <w:numId w:val="3"/>
         </w:numPr>
-        <w:spacing w:before="0" w:after="0"/>
-        <w:rPr>
-          <w:rFonts w:eastAsia="Times New Roman"/>
-        </w:rPr>
-      </w:pPr>
-      <w:r>
-        <w:rPr>
-          <w:rFonts w:eastAsia="Times New Roman"/>
-        </w:rPr>
-        <w:t>“</w:t>
-      </w:r>
-      <w:r>
-        <w:rPr>
-          <w:rFonts w:eastAsia="Times New Roman"/>
-        </w:rPr>
-        <w:t>Đã xử lý xong” - người xử lí cập nhập đánh dấu đã xử lý xong</w:t>
+        <w:spacing w:after="0"/>
+        <w:rPr>
+          <w:rFonts w:eastAsia="Times New Roman"/>
+        </w:rPr>
+      </w:pPr>
+      <w:r>
+        <w:rPr>
+          <w:rFonts w:eastAsia="Times New Roman"/>
+        </w:rPr>
+        <w:t>“Đã xử lý xong” - người xử lí cập nhập đánh dấu đã xử lý xong</w:t>
       </w:r>
     </w:p>
     <w:p>
@@ -444,27 +417,20 @@
           <w:ilvl w:val="0"/>
           <w:numId w:val="3"/>
         </w:numPr>
-        <w:spacing w:before="0" w:after="0"/>
-        <w:rPr>
-          <w:rFonts w:eastAsia="Times New Roman"/>
-        </w:rPr>
-      </w:pPr>
-      <w:r>
-        <w:rPr>
-          <w:rFonts w:eastAsia="Times New Roman"/>
-        </w:rPr>
-        <w:t>“</w:t>
-      </w:r>
-      <w:r>
-        <w:rPr>
-          <w:rFonts w:eastAsia="Times New Roman"/>
-        </w:rPr>
-        <w:t>Đóng” - người dùng chấp nhận kết quả xử lí</w:t>
-      </w:r>
-    </w:p>
-    <w:p>
-      <w:pPr>
-        <w:pStyle w:val="Normal"/>
+        <w:spacing w:after="0"/>
+        <w:rPr>
+          <w:rFonts w:eastAsia="Times New Roman"/>
+        </w:rPr>
+      </w:pPr>
+      <w:r>
+        <w:rPr>
+          <w:rFonts w:eastAsia="Times New Roman"/>
+        </w:rPr>
+        <w:t>“Đóng” - người dùng chấp nhận kết quả xử lí</w:t>
+      </w:r>
+    </w:p>
+    <w:p>
+      <w:pPr>
         <w:spacing w:beforeAutospacing="1" w:afterAutospacing="1"/>
         <w:rPr>
           <w:rFonts w:eastAsia="Times New Roman"/>
@@ -503,7 +469,7 @@
           <w:ilvl w:val="0"/>
           <w:numId w:val="3"/>
         </w:numPr>
-        <w:spacing w:before="0" w:after="0"/>
+        <w:spacing w:after="0"/>
         <w:rPr>
           <w:rFonts w:eastAsia="Times New Roman"/>
         </w:rPr>
@@ -522,7 +488,7 @@
           <w:ilvl w:val="0"/>
           <w:numId w:val="3"/>
         </w:numPr>
-        <w:spacing w:before="0" w:after="0"/>
+        <w:spacing w:after="0"/>
         <w:rPr>
           <w:rFonts w:eastAsia="Times New Roman"/>
         </w:rPr>
@@ -541,7 +507,7 @@
           <w:ilvl w:val="0"/>
           <w:numId w:val="3"/>
         </w:numPr>
-        <w:spacing w:before="0" w:afterAutospacing="1"/>
+        <w:spacing w:afterAutospacing="1"/>
         <w:rPr>
           <w:rFonts w:eastAsia="Times New Roman"/>
         </w:rPr>
@@ -555,7 +521,6 @@
     </w:p>
     <w:p>
       <w:pPr>
-        <w:pStyle w:val="Normal"/>
         <w:spacing w:beforeAutospacing="1" w:afterAutospacing="1"/>
         <w:rPr>
           <w:rFonts w:eastAsia="Times New Roman"/>
@@ -580,29 +545,17 @@
           <w:rFonts w:eastAsia="Times New Roman"/>
         </w:rPr>
       </w:pPr>
-      <w:r>
-        <w:rPr>
-          <w:rFonts w:eastAsia="Times New Roman"/>
-        </w:rPr>
-      </w:r>
-    </w:p>
-    <w:p>
-      <w:pPr>
-        <w:pStyle w:val="Normal"/>
-        <w:spacing w:beforeAutospacing="1" w:afterAutospacing="1"/>
-        <w:rPr>
-          <w:rFonts w:eastAsia="Times New Roman"/>
-        </w:rPr>
-      </w:pPr>
-      <w:r>
-        <w:rPr>
-          <w:rFonts w:eastAsia="Times New Roman"/>
-        </w:rPr>
-      </w:r>
-    </w:p>
-    <w:p>
-      <w:pPr>
-        <w:pStyle w:val="Normal"/>
+    </w:p>
+    <w:p>
+      <w:pPr>
+        <w:spacing w:beforeAutospacing="1" w:afterAutospacing="1"/>
+        <w:rPr>
+          <w:rFonts w:eastAsia="Times New Roman"/>
+        </w:rPr>
+      </w:pPr>
+    </w:p>
+    <w:p>
+      <w:pPr>
         <w:spacing w:beforeAutospacing="1" w:afterAutospacing="1"/>
         <w:rPr>
           <w:rFonts w:eastAsia="Times New Roman"/>
@@ -617,7 +570,6 @@
     </w:p>
     <w:p>
       <w:pPr>
-        <w:pStyle w:val="Normal"/>
         <w:spacing w:beforeAutospacing="1" w:afterAutospacing="1"/>
         <w:rPr>
           <w:rFonts w:eastAsia="Times New Roman"/>
@@ -656,15 +608,16 @@
           <w:ilvl w:val="1"/>
           <w:numId w:val="3"/>
         </w:numPr>
-        <w:spacing w:before="0" w:after="0"/>
-        <w:rPr>
-          <w:rFonts w:eastAsia="Times New Roman"/>
-        </w:rPr>
-      </w:pPr>
-      <w:r>
-        <w:rPr>
-          <w:rFonts w:eastAsia="Times New Roman"/>
-        </w:rPr>
+        <w:spacing w:after="0"/>
+        <w:rPr>
+          <w:rFonts w:eastAsia="Times New Roman"/>
+        </w:rPr>
+      </w:pPr>
+      <w:r>
+        <w:rPr>
+          <w:rFonts w:eastAsia="Times New Roman"/>
+        </w:rPr>
+        <w:lastRenderedPageBreak/>
         <w:t>Mức ưu tiên</w:t>
       </w:r>
     </w:p>
@@ -675,10 +628,8 @@
           <w:ilvl w:val="1"/>
           <w:numId w:val="3"/>
         </w:numPr>
-        <w:rPr/>
-      </w:pPr>
-      <w:r>
-        <w:rPr/>
+      </w:pPr>
+      <w:r>
         <w:t>Tên</w:t>
       </w:r>
     </w:p>
@@ -689,7 +640,6 @@
           <w:ilvl w:val="1"/>
           <w:numId w:val="3"/>
         </w:numPr>
-        <w:rPr/>
       </w:pPr>
       <w:r>
         <w:rPr>
@@ -705,7 +655,7 @@
           <w:ilvl w:val="1"/>
           <w:numId w:val="3"/>
         </w:numPr>
-        <w:spacing w:before="0" w:afterAutospacing="1"/>
+        <w:spacing w:afterAutospacing="1"/>
         <w:rPr>
           <w:rFonts w:eastAsia="Times New Roman"/>
         </w:rPr>
@@ -719,7 +669,6 @@
     </w:p>
     <w:p>
       <w:pPr>
-        <w:pStyle w:val="Normal"/>
         <w:spacing w:beforeAutospacing="1" w:afterAutospacing="1"/>
         <w:rPr>
           <w:rFonts w:eastAsia="Times New Roman"/>
@@ -758,7 +707,7 @@
           <w:ilvl w:val="1"/>
           <w:numId w:val="3"/>
         </w:numPr>
-        <w:spacing w:before="0" w:after="0"/>
+        <w:spacing w:after="0"/>
         <w:rPr>
           <w:rFonts w:eastAsia="Times New Roman"/>
         </w:rPr>
@@ -777,7 +726,7 @@
           <w:ilvl w:val="1"/>
           <w:numId w:val="3"/>
         </w:numPr>
-        <w:spacing w:before="0" w:after="0"/>
+        <w:spacing w:after="0"/>
         <w:rPr>
           <w:rFonts w:eastAsia="Times New Roman"/>
         </w:rPr>
@@ -796,7 +745,7 @@
           <w:ilvl w:val="0"/>
           <w:numId w:val="3"/>
         </w:numPr>
-        <w:spacing w:before="0" w:after="0"/>
+        <w:spacing w:after="0"/>
         <w:rPr>
           <w:rFonts w:eastAsia="Times New Roman"/>
         </w:rPr>
@@ -815,7 +764,7 @@
           <w:ilvl w:val="1"/>
           <w:numId w:val="3"/>
         </w:numPr>
-        <w:spacing w:before="0" w:after="0"/>
+        <w:spacing w:after="0"/>
         <w:rPr>
           <w:rFonts w:eastAsia="Times New Roman"/>
         </w:rPr>
@@ -834,7 +783,7 @@
           <w:ilvl w:val="1"/>
           <w:numId w:val="3"/>
         </w:numPr>
-        <w:spacing w:before="0" w:after="0"/>
+        <w:spacing w:after="0"/>
         <w:rPr>
           <w:rFonts w:eastAsia="Times New Roman"/>
         </w:rPr>
@@ -853,7 +802,7 @@
           <w:ilvl w:val="1"/>
           <w:numId w:val="3"/>
         </w:numPr>
-        <w:spacing w:before="0" w:after="0"/>
+        <w:spacing w:after="0"/>
         <w:rPr>
           <w:rFonts w:eastAsia="Times New Roman"/>
         </w:rPr>
@@ -872,7 +821,7 @@
           <w:ilvl w:val="1"/>
           <w:numId w:val="3"/>
         </w:numPr>
-        <w:spacing w:before="0" w:afterAutospacing="1"/>
+        <w:spacing w:afterAutospacing="1"/>
         <w:rPr>
           <w:rFonts w:eastAsia="Times New Roman"/>
         </w:rPr>
@@ -886,7 +835,6 @@
     </w:p>
     <w:p>
       <w:pPr>
-        <w:pStyle w:val="Normal"/>
         <w:spacing w:beforeAutospacing="1" w:afterAutospacing="1"/>
         <w:rPr>
           <w:rFonts w:eastAsia="Times New Roman" w:cs="Times New Roman"/>
@@ -928,7 +876,7 @@
           <w:ilvl w:val="0"/>
           <w:numId w:val="3"/>
         </w:numPr>
-        <w:spacing w:before="0" w:after="0"/>
+        <w:spacing w:after="0"/>
         <w:rPr>
           <w:rFonts w:eastAsia="Times New Roman"/>
         </w:rPr>
@@ -947,7 +895,7 @@
           <w:ilvl w:val="0"/>
           <w:numId w:val="3"/>
         </w:numPr>
-        <w:spacing w:before="0" w:after="0"/>
+        <w:spacing w:after="0"/>
         <w:rPr>
           <w:rFonts w:eastAsia="Times New Roman"/>
         </w:rPr>
@@ -966,7 +914,7 @@
           <w:ilvl w:val="0"/>
           <w:numId w:val="3"/>
         </w:numPr>
-        <w:spacing w:before="0" w:after="0"/>
+        <w:spacing w:after="0"/>
         <w:rPr>
           <w:rFonts w:eastAsia="Times New Roman"/>
         </w:rPr>
@@ -985,7 +933,7 @@
           <w:ilvl w:val="0"/>
           <w:numId w:val="3"/>
         </w:numPr>
-        <w:spacing w:before="0" w:afterAutospacing="1"/>
+        <w:spacing w:afterAutospacing="1"/>
         <w:rPr>
           <w:rFonts w:eastAsia="Times New Roman"/>
         </w:rPr>
@@ -999,21 +947,14 @@
     </w:p>
     <w:p>
       <w:pPr>
-        <w:pStyle w:val="Normal"/>
-        <w:spacing w:beforeAutospacing="1" w:afterAutospacing="1"/>
-        <w:rPr>
-          <w:rFonts w:eastAsia="Times New Roman"/>
-        </w:rPr>
-      </w:pPr>
-      <w:r>
-        <w:rPr>
-          <w:rFonts w:eastAsia="Times New Roman"/>
-        </w:rPr>
-      </w:r>
-    </w:p>
-    <w:p>
-      <w:pPr>
-        <w:pStyle w:val="Normal"/>
+        <w:spacing w:beforeAutospacing="1" w:afterAutospacing="1"/>
+        <w:rPr>
+          <w:rFonts w:eastAsia="Times New Roman"/>
+        </w:rPr>
+      </w:pPr>
+    </w:p>
+    <w:p>
+      <w:pPr>
         <w:spacing w:beforeAutospacing="1" w:afterAutospacing="1"/>
         <w:rPr>
           <w:rFonts w:eastAsia="Times New Roman"/>
@@ -1047,7 +988,6 @@
     </w:p>
     <w:p>
       <w:pPr>
-        <w:pStyle w:val="Normal"/>
         <w:spacing w:beforeAutospacing="1" w:afterAutospacing="1"/>
         <w:rPr>
           <w:rFonts w:eastAsia="Times New Roman"/>
@@ -1062,7 +1002,6 @@
     </w:p>
     <w:p>
       <w:pPr>
-        <w:pStyle w:val="Normal"/>
         <w:spacing w:beforeAutospacing="1" w:afterAutospacing="1"/>
         <w:rPr>
           <w:rFonts w:eastAsia="Times New Roman"/>
@@ -1077,7 +1016,6 @@
     </w:p>
     <w:p>
       <w:pPr>
-        <w:pStyle w:val="Normal"/>
         <w:spacing w:beforeAutospacing="1" w:afterAutospacing="1"/>
         <w:rPr>
           <w:rFonts w:eastAsia="Times New Roman"/>
@@ -1092,21 +1030,14 @@
     </w:p>
     <w:p>
       <w:pPr>
-        <w:pStyle w:val="Normal"/>
-        <w:spacing w:beforeAutospacing="1" w:afterAutospacing="1"/>
-        <w:rPr>
-          <w:rFonts w:eastAsia="Times New Roman"/>
-        </w:rPr>
-      </w:pPr>
-      <w:r>
-        <w:rPr>
-          <w:rFonts w:eastAsia="Times New Roman"/>
-        </w:rPr>
-      </w:r>
-    </w:p>
-    <w:p>
-      <w:pPr>
-        <w:pStyle w:val="Normal"/>
+        <w:spacing w:beforeAutospacing="1" w:afterAutospacing="1"/>
+        <w:rPr>
+          <w:rFonts w:eastAsia="Times New Roman"/>
+        </w:rPr>
+      </w:pPr>
+    </w:p>
+    <w:p>
+      <w:pPr>
         <w:spacing w:beforeAutospacing="1" w:afterAutospacing="1"/>
         <w:rPr>
           <w:rFonts w:eastAsia="Times New Roman"/>
@@ -1121,7 +1052,6 @@
     </w:p>
     <w:p>
       <w:pPr>
-        <w:pStyle w:val="Normal"/>
         <w:spacing w:beforeAutospacing="1" w:afterAutospacing="1"/>
         <w:rPr>
           <w:rFonts w:eastAsia="Times New Roman"/>
@@ -1136,7 +1066,6 @@
     </w:p>
     <w:p>
       <w:pPr>
-        <w:pStyle w:val="Normal"/>
         <w:spacing w:beforeAutospacing="1" w:afterAutospacing="1"/>
         <w:rPr>
           <w:rFonts w:eastAsia="Times New Roman"/>
@@ -1151,10 +1080,8 @@
     </w:p>
     <w:p>
       <w:pPr>
-        <w:pStyle w:val="Normal"/>
         <w:tabs>
-          <w:tab w:val="clear" w:pos="720"/>
-          <w:tab w:val="left" w:pos="6318" w:leader="none"/>
+          <w:tab w:val="left" w:pos="6318"/>
         </w:tabs>
         <w:spacing w:beforeAutospacing="1" w:afterAutospacing="1"/>
         <w:rPr>
@@ -1165,12 +1092,12 @@
         <w:rPr>
           <w:rFonts w:eastAsia="Times New Roman"/>
         </w:rPr>
+        <w:lastRenderedPageBreak/>
         <w:t>post create ticket(Title, Description, Priority, Type (Optional), File (Optional)) → void /api/tickets</w:t>
       </w:r>
     </w:p>
     <w:p>
       <w:pPr>
-        <w:pStyle w:val="Normal"/>
         <w:spacing w:beforeAutospacing="1" w:afterAutospacing="1"/>
         <w:rPr>
           <w:rFonts w:eastAsia="Times New Roman"/>
@@ -1185,7 +1112,46 @@
     </w:p>
     <w:p>
       <w:pPr>
-        <w:pStyle w:val="Normal"/>
+        <w:spacing w:beforeAutospacing="1" w:afterAutospacing="1"/>
+        <w:rPr>
+          <w:rFonts w:eastAsia="Times New Roman"/>
+        </w:rPr>
+      </w:pPr>
+      <w:r>
+        <w:rPr>
+          <w:rFonts w:eastAsia="Times New Roman"/>
+        </w:rPr>
+        <w:t>get getPriorities()  /api/priorities</w:t>
+      </w:r>
+    </w:p>
+    <w:p>
+      <w:pPr>
+        <w:spacing w:beforeAutospacing="1" w:afterAutospacing="1"/>
+        <w:rPr>
+          <w:rFonts w:eastAsia="Times New Roman"/>
+        </w:rPr>
+      </w:pPr>
+      <w:r>
+        <w:rPr>
+          <w:rFonts w:eastAsia="Times New Roman"/>
+        </w:rPr>
+        <w:t>get getTicketType() /api/ticket</w:t>
+      </w:r>
+      <w:r>
+        <w:rPr>
+          <w:rFonts w:eastAsia="Times New Roman"/>
+        </w:rPr>
+        <w:t>-t</w:t>
+      </w:r>
+      <w:r>
+        <w:rPr>
+          <w:rFonts w:eastAsia="Times New Roman"/>
+        </w:rPr>
+        <w:t>ype</w:t>
+      </w:r>
+    </w:p>
+    <w:p>
+      <w:pPr>
         <w:spacing w:beforeAutospacing="1" w:afterAutospacing="1"/>
         <w:rPr>
           <w:rFonts w:eastAsia="Times New Roman"/>
@@ -1200,7 +1166,6 @@
     </w:p>
     <w:p>
       <w:pPr>
-        <w:pStyle w:val="Normal"/>
         <w:spacing w:beforeAutospacing="1" w:afterAutospacing="1"/>
         <w:rPr>
           <w:rFonts w:eastAsia="Times New Roman"/>
@@ -1215,7 +1180,6 @@
     </w:p>
     <w:p>
       <w:pPr>
-        <w:pStyle w:val="Normal"/>
         <w:spacing w:beforeAutospacing="1" w:afterAutospacing="1"/>
         <w:rPr>
           <w:rFonts w:eastAsia="Times New Roman"/>
@@ -1230,7 +1194,6 @@
     </w:p>
     <w:p>
       <w:pPr>
-        <w:pStyle w:val="Normal"/>
         <w:spacing w:beforeAutospacing="1" w:afterAutospacing="1"/>
         <w:rPr>
           <w:rFonts w:eastAsia="Times New Roman"/>
@@ -1245,7 +1208,6 @@
     </w:p>
     <w:p>
       <w:pPr>
-        <w:pStyle w:val="Normal"/>
         <w:spacing w:beforeAutospacing="1" w:afterAutospacing="1"/>
         <w:rPr>
           <w:rFonts w:eastAsia="Times New Roman"/>
@@ -1260,7 +1222,6 @@
     </w:p>
     <w:p>
       <w:pPr>
-        <w:pStyle w:val="Normal"/>
         <w:spacing w:beforeAutospacing="1" w:afterAutospacing="1"/>
         <w:rPr>
           <w:rFonts w:eastAsia="Times New Roman"/>
@@ -1275,7 +1236,6 @@
     </w:p>
     <w:p>
       <w:pPr>
-        <w:pStyle w:val="Normal"/>
         <w:spacing w:beforeAutospacing="1" w:afterAutospacing="1"/>
         <w:rPr>
           <w:rFonts w:eastAsia="Times New Roman"/>
@@ -1290,7 +1250,6 @@
     </w:p>
     <w:p>
       <w:pPr>
-        <w:pStyle w:val="Normal"/>
         <w:spacing w:beforeAutospacing="1" w:afterAutospacing="1"/>
         <w:rPr>
           <w:rFonts w:eastAsia="Times New Roman"/>
@@ -1305,7 +1264,6 @@
     </w:p>
     <w:p>
       <w:pPr>
-        <w:pStyle w:val="Normal"/>
         <w:spacing w:beforeAutospacing="1" w:afterAutospacing="1"/>
         <w:rPr>
           <w:rFonts w:eastAsia="Times New Roman"/>
@@ -1320,7 +1278,6 @@
     </w:p>
     <w:p>
       <w:pPr>
-        <w:pStyle w:val="Normal"/>
         <w:spacing w:beforeAutospacing="1" w:afterAutospacing="1"/>
         <w:rPr>
           <w:rFonts w:eastAsia="Times New Roman"/>
@@ -1335,7 +1292,6 @@
     </w:p>
     <w:p>
       <w:pPr>
-        <w:pStyle w:val="Normal"/>
         <w:spacing w:beforeAutospacing="1" w:afterAutospacing="1"/>
         <w:rPr>
           <w:rFonts w:eastAsia="Times New Roman"/>
@@ -1350,7 +1306,20 @@
     </w:p>
     <w:p>
       <w:pPr>
-        <w:pStyle w:val="Normal"/>
+        <w:spacing w:beforeAutospacing="1" w:afterAutospacing="1"/>
+        <w:rPr>
+          <w:rFonts w:eastAsia="Times New Roman"/>
+        </w:rPr>
+      </w:pPr>
+      <w:r>
+        <w:rPr>
+          <w:rFonts w:eastAsia="Times New Roman"/>
+        </w:rPr>
+        <w:t>post addPriorities() /api/admin/priorities</w:t>
+      </w:r>
+    </w:p>
+    <w:p>
+      <w:pPr>
         <w:spacing w:beforeAutospacing="1" w:afterAutospacing="1"/>
         <w:rPr>
           <w:rFonts w:eastAsia="Times New Roman"/>
@@ -1365,7 +1334,6 @@
     </w:p>
     <w:p>
       <w:pPr>
-        <w:pStyle w:val="Normal"/>
         <w:spacing w:beforeAutospacing="1" w:afterAutospacing="1"/>
         <w:rPr>
           <w:rFonts w:eastAsia="Times New Roman"/>
@@ -1380,7 +1348,6 @@
     </w:p>
     <w:p>
       <w:pPr>
-        <w:pStyle w:val="Normal"/>
         <w:spacing w:beforeAutospacing="1" w:afterAutospacing="1"/>
         <w:rPr>
           <w:rFonts w:eastAsia="Times New Roman"/>
@@ -1395,21 +1362,14 @@
     </w:p>
     <w:p>
       <w:pPr>
-        <w:pStyle w:val="Normal"/>
-        <w:spacing w:beforeAutospacing="1" w:afterAutospacing="1"/>
-        <w:rPr>
-          <w:rFonts w:eastAsia="Times New Roman"/>
-        </w:rPr>
-      </w:pPr>
-      <w:r>
-        <w:rPr>
-          <w:rFonts w:eastAsia="Times New Roman"/>
-        </w:rPr>
-      </w:r>
-    </w:p>
-    <w:p>
-      <w:pPr>
-        <w:pStyle w:val="Normal"/>
+        <w:spacing w:beforeAutospacing="1" w:afterAutospacing="1"/>
+        <w:rPr>
+          <w:rFonts w:eastAsia="Times New Roman"/>
+        </w:rPr>
+      </w:pPr>
+    </w:p>
+    <w:p>
+      <w:pPr>
         <w:spacing w:beforeAutospacing="1" w:afterAutospacing="1"/>
         <w:rPr>
           <w:rFonts w:eastAsia="Times New Roman"/>
@@ -1424,7 +1384,6 @@
     </w:p>
     <w:p>
       <w:pPr>
-        <w:pStyle w:val="Normal"/>
         <w:spacing w:beforeAutospacing="1" w:afterAutospacing="1"/>
         <w:rPr>
           <w:rFonts w:eastAsia="Times New Roman"/>
@@ -1439,7 +1398,6 @@
     </w:p>
     <w:p>
       <w:pPr>
-        <w:pStyle w:val="Normal"/>
         <w:spacing w:beforeAutospacing="1" w:afterAutospacing="1"/>
         <w:rPr>
           <w:rFonts w:eastAsia="Times New Roman"/>
@@ -1454,51 +1412,57 @@
     </w:p>
     <w:p>
       <w:pPr>
-        <w:pStyle w:val="Normal"/>
-        <w:spacing w:beforeAutospacing="1" w:afterAutospacing="1"/>
-        <w:rPr>
-          <w:rFonts w:eastAsia="Times New Roman"/>
-        </w:rPr>
-      </w:pPr>
-      <w:r>
-        <w:rPr>
-          <w:rFonts w:eastAsia="Times New Roman"/>
-        </w:rPr>
-      </w:r>
-    </w:p>
-    <w:p>
-      <w:pPr>
-        <w:pStyle w:val="Normal"/>
-        <w:spacing w:beforeAutospacing="1" w:afterAutospacing="1"/>
-        <w:rPr>
-          <w:rFonts w:eastAsia="Times New Roman"/>
-        </w:rPr>
-      </w:pPr>
-      <w:r>
-        <w:rPr>
-          <w:rFonts w:eastAsia="Times New Roman"/>
-        </w:rPr>
+        <w:spacing w:beforeAutospacing="1" w:afterAutospacing="1"/>
+        <w:rPr>
+          <w:rFonts w:eastAsia="Times New Roman"/>
+        </w:rPr>
+      </w:pPr>
+    </w:p>
+    <w:p>
+      <w:pPr>
+        <w:spacing w:beforeAutospacing="1" w:afterAutospacing="1"/>
+        <w:rPr>
+          <w:rFonts w:eastAsia="Times New Roman"/>
+        </w:rPr>
+      </w:pPr>
+      <w:r>
+        <w:rPr>
+          <w:rFonts w:eastAsia="Times New Roman"/>
+        </w:rPr>
+        <w:lastRenderedPageBreak/>
         <w:t>add lazy loading for attachment, if we have time later</w:t>
       </w:r>
     </w:p>
     <w:p>
       <w:pPr>
-        <w:pStyle w:val="Normal"/>
-        <w:spacing w:beforeAutospacing="1" w:afterAutospacing="1"/>
-        <w:rPr>
-          <w:rFonts w:eastAsia="Times New Roman"/>
-        </w:rPr>
-      </w:pPr>
-      <w:r>
-        <w:rPr>
-          <w:rFonts w:eastAsia="Times New Roman"/>
-        </w:rPr>
-        <w:t>add post for /api/admin/priority</w:t>
-      </w:r>
-    </w:p>
-    <w:p>
-      <w:pPr>
-        <w:pStyle w:val="Normal"/>
+        <w:spacing w:beforeAutospacing="1" w:afterAutospacing="1"/>
+        <w:rPr>
+          <w:rFonts w:eastAsia="Times New Roman"/>
+        </w:rPr>
+      </w:pPr>
+      <w:r>
+        <w:rPr>
+          <w:rFonts w:eastAsia="Times New Roman"/>
+        </w:rPr>
+        <w:t>add get for /api/priorities</w:t>
+      </w:r>
+    </w:p>
+    <w:p>
+      <w:pPr>
+        <w:spacing w:beforeAutospacing="1" w:afterAutospacing="1"/>
+        <w:rPr>
+          <w:rFonts w:eastAsia="Times New Roman"/>
+        </w:rPr>
+      </w:pPr>
+      <w:r>
+        <w:rPr>
+          <w:rFonts w:eastAsia="Times New Roman"/>
+        </w:rPr>
+        <w:t>add get for /api/ticketType</w:t>
+      </w:r>
+    </w:p>
+    <w:p>
+      <w:pPr>
         <w:spacing w:beforeAutospacing="1" w:afterAutospacing="1"/>
         <w:rPr>
           <w:rFonts w:eastAsia="Times New Roman"/>
@@ -1513,21 +1477,14 @@
     </w:p>
     <w:p>
       <w:pPr>
-        <w:pStyle w:val="Normal"/>
-        <w:spacing w:beforeAutospacing="1" w:afterAutospacing="1"/>
-        <w:rPr>
-          <w:rFonts w:eastAsia="Times New Roman"/>
-        </w:rPr>
-      </w:pPr>
-      <w:r>
-        <w:rPr>
-          <w:rFonts w:eastAsia="Times New Roman"/>
-        </w:rPr>
-      </w:r>
-    </w:p>
-    <w:p>
-      <w:pPr>
-        <w:pStyle w:val="Normal"/>
+        <w:spacing w:beforeAutospacing="1" w:afterAutospacing="1"/>
+        <w:rPr>
+          <w:rFonts w:eastAsia="Times New Roman"/>
+        </w:rPr>
+      </w:pPr>
+    </w:p>
+    <w:p>
+      <w:pPr>
         <w:spacing w:beforeAutospacing="1" w:afterAutospacing="1"/>
         <w:rPr>
           <w:rFonts w:eastAsia="Times New Roman"/>
@@ -1542,7 +1499,6 @@
     </w:p>
     <w:p>
       <w:pPr>
-        <w:pStyle w:val="Normal"/>
         <w:spacing w:beforeAutospacing="1" w:afterAutospacing="1"/>
         <w:rPr>
           <w:rFonts w:eastAsia="Times New Roman"/>
@@ -1557,21 +1513,14 @@
     </w:p>
     <w:p>
       <w:pPr>
-        <w:pStyle w:val="Normal"/>
-        <w:spacing w:beforeAutospacing="1" w:afterAutospacing="1"/>
-        <w:rPr>
-          <w:rFonts w:eastAsia="Times New Roman"/>
-        </w:rPr>
-      </w:pPr>
-      <w:r>
-        <w:rPr>
-          <w:rFonts w:eastAsia="Times New Roman"/>
-        </w:rPr>
-      </w:r>
-    </w:p>
-    <w:p>
-      <w:pPr>
-        <w:pStyle w:val="Normal"/>
+        <w:spacing w:beforeAutospacing="1" w:afterAutospacing="1"/>
+        <w:rPr>
+          <w:rFonts w:eastAsia="Times New Roman"/>
+        </w:rPr>
+      </w:pPr>
+    </w:p>
+    <w:p>
+      <w:pPr>
         <w:spacing w:beforeAutospacing="1" w:afterAutospacing="1"/>
         <w:rPr>
           <w:rFonts w:eastAsia="Times New Roman"/>
@@ -1610,7 +1559,7 @@
           <w:ilvl w:val="0"/>
           <w:numId w:val="3"/>
         </w:numPr>
-        <w:spacing w:before="0" w:after="0"/>
+        <w:spacing w:after="0"/>
         <w:rPr>
           <w:rFonts w:eastAsia="Times New Roman"/>
         </w:rPr>
@@ -1629,7 +1578,7 @@
           <w:ilvl w:val="0"/>
           <w:numId w:val="3"/>
         </w:numPr>
-        <w:spacing w:before="0" w:after="0"/>
+        <w:spacing w:after="0"/>
         <w:rPr>
           <w:rFonts w:eastAsia="Times New Roman"/>
         </w:rPr>
@@ -1648,7 +1597,7 @@
           <w:ilvl w:val="0"/>
           <w:numId w:val="3"/>
         </w:numPr>
-        <w:spacing w:before="0" w:afterAutospacing="1"/>
+        <w:spacing w:afterAutospacing="1"/>
         <w:rPr>
           <w:rFonts w:eastAsia="Times New Roman"/>
         </w:rPr>
@@ -1662,16 +1611,18 @@
     </w:p>
     <w:p>
       <w:pPr>
-        <w:pStyle w:val="Normal"/>
-        <w:spacing w:beforeAutospacing="1" w:afterAutospacing="1"/>
-        <w:rPr>
-          <w:rFonts w:eastAsia="Times New Roman"/>
-        </w:rPr>
-      </w:pPr>
-      <w:r>
-        <w:rPr/>
+        <w:spacing w:beforeAutospacing="1" w:afterAutospacing="1"/>
+        <w:rPr>
+          <w:rFonts w:eastAsia="Times New Roman"/>
+        </w:rPr>
+      </w:pPr>
+      <w:r>
+        <w:rPr>
+          <w:noProof/>
+        </w:rPr>
+        <w:lastRenderedPageBreak/>
         <w:drawing>
-          <wp:inline distT="0" distB="0" distL="0" distR="0">
+          <wp:inline distT="0" distB="0" distL="0" distR="0" wp14:anchorId="61E28B64" wp14:editId="4B0A5864">
             <wp:extent cx="5731510" cy="4566285"/>
             <wp:effectExtent l="0" t="0" r="0" b="0"/>
             <wp:docPr id="1" name="Picture 1"/>
@@ -1688,7 +1639,7 @@
                     </pic:cNvPicPr>
                   </pic:nvPicPr>
                   <pic:blipFill>
-                    <a:blip r:embed="rId2"/>
+                    <a:blip r:embed="rId5"/>
                     <a:stretch>
                       <a:fillRect/>
                     </a:stretch>
@@ -1718,7 +1669,6 @@
     </w:p>
     <w:p>
       <w:pPr>
-        <w:pStyle w:val="Normal"/>
         <w:spacing w:beforeAutospacing="1" w:afterAutospacing="1"/>
         <w:rPr>
           <w:rFonts w:eastAsia="Times New Roman"/>
@@ -1733,21 +1683,14 @@
     </w:p>
     <w:p>
       <w:pPr>
-        <w:pStyle w:val="Normal"/>
-        <w:spacing w:beforeAutospacing="1" w:afterAutospacing="1"/>
-        <w:rPr>
-          <w:rFonts w:eastAsia="Times New Roman"/>
-        </w:rPr>
-      </w:pPr>
-      <w:r>
-        <w:rPr>
-          <w:rFonts w:eastAsia="Times New Roman"/>
-        </w:rPr>
-      </w:r>
-    </w:p>
-    <w:p>
-      <w:pPr>
-        <w:pStyle w:val="Normal"/>
+        <w:spacing w:beforeAutospacing="1" w:afterAutospacing="1"/>
+        <w:rPr>
+          <w:rFonts w:eastAsia="Times New Roman"/>
+        </w:rPr>
+      </w:pPr>
+    </w:p>
+    <w:p>
+      <w:pPr>
         <w:spacing w:beforeAutospacing="1" w:afterAutospacing="1"/>
         <w:rPr>
           <w:rFonts w:eastAsia="Times New Roman"/>
@@ -1762,7 +1705,6 @@
     </w:p>
     <w:p>
       <w:pPr>
-        <w:pStyle w:val="Normal"/>
         <w:spacing w:beforeAutospacing="1" w:afterAutospacing="1"/>
         <w:rPr>
           <w:rFonts w:eastAsia="Times New Roman"/>
@@ -1777,7 +1719,6 @@
     </w:p>
     <w:p>
       <w:pPr>
-        <w:pStyle w:val="Normal"/>
         <w:spacing w:beforeAutospacing="1" w:afterAutospacing="1"/>
         <w:rPr>
           <w:rFonts w:eastAsia="Times New Roman"/>
@@ -1792,7 +1733,6 @@
     </w:p>
     <w:p>
       <w:pPr>
-        <w:pStyle w:val="Normal"/>
         <w:spacing w:beforeAutospacing="1" w:afterAutospacing="1"/>
         <w:rPr>
           <w:rFonts w:eastAsia="Times New Roman"/>
@@ -1807,7 +1747,6 @@
     </w:p>
     <w:p>
       <w:pPr>
-        <w:pStyle w:val="Normal"/>
         <w:spacing w:beforeAutospacing="1" w:afterAutospacing="1"/>
         <w:rPr>
           <w:rFonts w:eastAsia="Times New Roman"/>
@@ -1822,7 +1761,6 @@
     </w:p>
     <w:p>
       <w:pPr>
-        <w:pStyle w:val="Normal"/>
         <w:spacing w:beforeAutospacing="1" w:afterAutospacing="1"/>
         <w:rPr>
           <w:rFonts w:eastAsia="Times New Roman"/>
@@ -1837,22 +1775,21 @@
     </w:p>
     <w:p>
       <w:pPr>
-        <w:pStyle w:val="Normal"/>
-        <w:spacing w:beforeAutospacing="1" w:afterAutospacing="1"/>
-        <w:rPr>
-          <w:rFonts w:eastAsia="Times New Roman"/>
-        </w:rPr>
-      </w:pPr>
-      <w:r>
-        <w:rPr>
-          <w:rFonts w:eastAsia="Times New Roman"/>
-        </w:rPr>
+        <w:spacing w:beforeAutospacing="1" w:afterAutospacing="1"/>
+        <w:rPr>
+          <w:rFonts w:eastAsia="Times New Roman"/>
+        </w:rPr>
+      </w:pPr>
+      <w:r>
+        <w:rPr>
+          <w:rFonts w:eastAsia="Times New Roman"/>
+        </w:rPr>
+        <w:lastRenderedPageBreak/>
         <w:t>BCrypt được sử dụng do nằm đầu trong danh sách những thuật toán khuyên dùng của spring cho mục đích bảo vệ mật khẩu.</w:t>
       </w:r>
     </w:p>
     <w:p>
       <w:pPr>
-        <w:pStyle w:val="Normal"/>
         <w:spacing w:beforeAutospacing="1" w:afterAutospacing="1"/>
         <w:rPr>
           <w:rFonts w:eastAsia="Times New Roman"/>
@@ -1867,7 +1804,6 @@
     </w:p>
     <w:p>
       <w:pPr>
-        <w:pStyle w:val="Normal"/>
         <w:spacing w:beforeAutospacing="1" w:afterAutospacing="1"/>
         <w:rPr>
           <w:rFonts w:eastAsia="Times New Roman"/>
@@ -1882,7 +1818,6 @@
     </w:p>
     <w:p>
       <w:pPr>
-        <w:pStyle w:val="Normal"/>
         <w:spacing w:beforeAutospacing="1" w:afterAutospacing="1"/>
         <w:rPr>
           <w:rFonts w:eastAsia="Times New Roman"/>
@@ -1897,7 +1832,6 @@
     </w:p>
     <w:p>
       <w:pPr>
-        <w:pStyle w:val="Normal"/>
         <w:spacing w:beforeAutospacing="1" w:afterAutospacing="1"/>
         <w:rPr>
           <w:rFonts w:eastAsia="Times New Roman"/>
@@ -1912,21 +1846,14 @@
     </w:p>
     <w:p>
       <w:pPr>
-        <w:pStyle w:val="Normal"/>
-        <w:spacing w:beforeAutospacing="1" w:afterAutospacing="1"/>
-        <w:rPr>
-          <w:rFonts w:eastAsia="Times New Roman"/>
-        </w:rPr>
-      </w:pPr>
-      <w:r>
-        <w:rPr>
-          <w:rFonts w:eastAsia="Times New Roman"/>
-        </w:rPr>
-      </w:r>
-    </w:p>
-    <w:p>
-      <w:pPr>
-        <w:pStyle w:val="Normal"/>
+        <w:spacing w:beforeAutospacing="1" w:afterAutospacing="1"/>
+        <w:rPr>
+          <w:rFonts w:eastAsia="Times New Roman"/>
+        </w:rPr>
+      </w:pPr>
+    </w:p>
+    <w:p>
+      <w:pPr>
         <w:spacing w:beforeAutospacing="1" w:afterAutospacing="1"/>
         <w:rPr>
           <w:rFonts w:eastAsia="Times New Roman"/>
@@ -1941,7 +1868,6 @@
     </w:p>
     <w:p>
       <w:pPr>
-        <w:pStyle w:val="Normal"/>
         <w:spacing w:beforeAutospacing="1" w:afterAutospacing="1"/>
         <w:rPr>
           <w:rFonts w:eastAsia="Times New Roman"/>
@@ -1956,7 +1882,6 @@
     </w:p>
     <w:p>
       <w:pPr>
-        <w:pStyle w:val="Normal"/>
         <w:spacing w:beforeAutospacing="1" w:afterAutospacing="1"/>
         <w:rPr>
           <w:rFonts w:eastAsia="Times New Roman"/>
@@ -1971,7 +1896,6 @@
     </w:p>
     <w:p>
       <w:pPr>
-        <w:pStyle w:val="Normal"/>
         <w:spacing w:beforeAutospacing="1" w:afterAutospacing="1"/>
         <w:rPr>
           <w:rFonts w:eastAsia="Times New Roman"/>
@@ -1986,7 +1910,6 @@
     </w:p>
     <w:p>
       <w:pPr>
-        <w:pStyle w:val="Normal"/>
         <w:spacing w:beforeAutospacing="1" w:afterAutospacing="1"/>
         <w:rPr>
           <w:rFonts w:eastAsia="Times New Roman"/>
@@ -2000,270 +1923,31 @@
       </w:r>
     </w:p>
     <w:sectPr>
-      <w:type w:val="nextPage"/>
       <w:pgSz w:w="11906" w:h="16838"/>
-      <w:pgMar w:left="1440" w:right="1440" w:gutter="0" w:header="0" w:top="1440" w:footer="0" w:bottom="1440"/>
-      <w:pgNumType w:fmt="decimal"/>
-      <w:formProt w:val="false"/>
-      <w:textDirection w:val="lrTb"/>
-      <w:docGrid w:type="default" w:linePitch="360" w:charSpace="0"/>
+      <w:pgMar w:top="1440" w:right="1440" w:bottom="1440" w:left="1440" w:header="0" w:footer="0" w:gutter="0"/>
+      <w:cols w:space="720"/>
+      <w:formProt w:val="0"/>
+      <w:docGrid w:linePitch="360"/>
     </w:sectPr>
   </w:body>
 </w:document>
 </file>
 
 <file path=word/numbering.xml><?xml version="1.0" encoding="utf-8"?>
-<w:numbering xmlns:w="http://schemas.openxmlformats.org/wordprocessingml/2006/main" xmlns:o="urn:schemas-microsoft-com:office:office" xmlns:r="http://schemas.openxmlformats.org/officeDocument/2006/relationships" xmlns:v="urn:schemas-microsoft-com:vml" xmlns:mc="http://schemas.openxmlformats.org/markup-compatibility/2006" xmlns:w14="http://schemas.microsoft.com/office/word/2010/wordml" mc:Ignorable="w14">
-  <w:abstractNum w:abstractNumId="1">
+<w:numbering xmlns:wpc="http://schemas.microsoft.com/office/word/2010/wordprocessingCanvas" xmlns:cx="http://schemas.microsoft.com/office/drawing/2014/chartex" xmlns:cx1="http://schemas.microsoft.com/office/drawing/2015/9/8/chartex" xmlns:cx2="http://schemas.microsoft.com/office/drawing/2015/10/21/chartex" xmlns:cx3="http://schemas.microsoft.com/office/drawing/2016/5/9/chartex" xmlns:cx4="http://schemas.microsoft.com/office/drawing/2016/5/10/chartex" xmlns:cx5="http://schemas.microsoft.com/office/drawing/2016/5/11/chartex" xmlns:cx6="http://schemas.microsoft.com/office/drawing/2016/5/12/chartex" xmlns:cx7="http://schemas.microsoft.com/office/drawing/2016/5/13/chartex" xmlns:cx8="http://schemas.microsoft.com/office/drawing/2016/5/14/chartex" xmlns:mc="http://schemas.openxmlformats.org/markup-compatibility/2006" xmlns:aink="http://schemas.microsoft.com/office/drawing/2016/ink" xmlns:am3d="http://schemas.microsoft.com/office/drawing/2017/model3d" xmlns:o="urn:schemas-microsoft-com:office:office" xmlns:oel="http://schemas.microsoft.com/office/2019/extlst" xmlns:r="http://schemas.openxmlformats.org/officeDocument/2006/relationships" xmlns:m="http://schemas.openxmlformats.org/officeDocument/2006/math" xmlns:v="urn:schemas-microsoft-com:vml" xmlns:wp14="http://schemas.microsoft.com/office/word/2010/wordprocessingDrawing" xmlns:wp="http://schemas.openxmlformats.org/drawingml/2006/wordprocessingDrawing" xmlns:w10="urn:schemas-microsoft-com:office:word" xmlns:w="http://schemas.openxmlformats.org/wordprocessingml/2006/main" xmlns:w14="http://schemas.microsoft.com/office/word/2010/wordml" xmlns:w15="http://schemas.microsoft.com/office/word/2012/wordml" xmlns:w16cex="http://schemas.microsoft.com/office/word/2018/wordml/cex" xmlns:w16cid="http://schemas.microsoft.com/office/word/2016/wordml/cid" xmlns:w16="http://schemas.microsoft.com/office/word/2018/wordml" xmlns:w16du="http://schemas.microsoft.com/office/word/2023/wordml/word16du" xmlns:w16sdtdh="http://schemas.microsoft.com/office/word/2020/wordml/sdtdatahash" xmlns:w16sdtfl="http://schemas.microsoft.com/office/word/2024/wordml/sdtformatlock" xmlns:w16se="http://schemas.microsoft.com/office/word/2015/wordml/symex" xmlns:wpg="http://schemas.microsoft.com/office/word/2010/wordprocessingGroup" xmlns:wpi="http://schemas.microsoft.com/office/word/2010/wordprocessingInk" xmlns:wne="http://schemas.microsoft.com/office/word/2006/wordml" xmlns:wps="http://schemas.microsoft.com/office/word/2010/wordprocessingShape" mc:Ignorable="w14 w15 w16se w16cid w16 w16cex w16sdtdh w16sdtfl w16du wp14">
+  <w:abstractNum w:abstractNumId="0" w15:restartNumberingAfterBreak="0">
+    <w:nsid w:val="53B92B78"/>
+    <w:multiLevelType w:val="multilevel"/>
+    <w:tmpl w:val="8D0454E0"/>
     <w:lvl w:ilvl="0">
-      <w:start w:val="1"/>
-      <w:numFmt w:val="decimal"/>
-      <w:pStyle w:val="Heading1"/>
-      <w:lvlText w:val="%1."/>
-      <w:lvlJc w:val="start"/>
+      <w:numFmt w:val="bullet"/>
+      <w:lvlText w:val="-"/>
+      <w:lvlJc w:val="left"/>
       <w:pPr>
         <w:tabs>
           <w:tab w:val="num" w:pos="0"/>
         </w:tabs>
-        <w:ind w:start="684" w:hanging="400"/>
-      </w:pPr>
-      <w:rPr/>
-    </w:lvl>
-    <w:lvl w:ilvl="1">
-      <w:start w:val="1"/>
-      <w:numFmt w:val="upperLetter"/>
-      <w:lvlText w:val="%2."/>
-      <w:lvlJc w:val="start"/>
-      <w:pPr>
-        <w:tabs>
-          <w:tab w:val="num" w:pos="0"/>
-        </w:tabs>
-        <w:ind w:start="1200" w:hanging="400"/>
-      </w:pPr>
-      <w:rPr/>
-    </w:lvl>
-    <w:lvl w:ilvl="2">
-      <w:start w:val="1"/>
-      <w:numFmt w:val="lowerRoman"/>
-      <w:lvlText w:val="%3."/>
-      <w:lvlJc w:val="end"/>
-      <w:pPr>
-        <w:tabs>
-          <w:tab w:val="num" w:pos="0"/>
-        </w:tabs>
-        <w:ind w:start="1600" w:hanging="400"/>
-      </w:pPr>
-      <w:rPr/>
-    </w:lvl>
-    <w:lvl w:ilvl="3">
-      <w:start w:val="1"/>
-      <w:numFmt w:val="decimal"/>
-      <w:lvlText w:val="%4."/>
-      <w:lvlJc w:val="start"/>
-      <w:pPr>
-        <w:tabs>
-          <w:tab w:val="num" w:pos="0"/>
-        </w:tabs>
-        <w:ind w:start="2000" w:hanging="400"/>
-      </w:pPr>
-      <w:rPr/>
-    </w:lvl>
-    <w:lvl w:ilvl="4">
-      <w:start w:val="1"/>
-      <w:numFmt w:val="upperLetter"/>
-      <w:lvlText w:val="%5."/>
-      <w:lvlJc w:val="start"/>
-      <w:pPr>
-        <w:tabs>
-          <w:tab w:val="num" w:pos="0"/>
-        </w:tabs>
-        <w:ind w:start="2400" w:hanging="400"/>
-      </w:pPr>
-      <w:rPr/>
-    </w:lvl>
-    <w:lvl w:ilvl="5">
-      <w:start w:val="1"/>
-      <w:numFmt w:val="lowerRoman"/>
-      <w:lvlText w:val="%6."/>
-      <w:lvlJc w:val="end"/>
-      <w:pPr>
-        <w:tabs>
-          <w:tab w:val="num" w:pos="0"/>
-        </w:tabs>
-        <w:ind w:start="2800" w:hanging="400"/>
-      </w:pPr>
-      <w:rPr/>
-    </w:lvl>
-    <w:lvl w:ilvl="6">
-      <w:start w:val="1"/>
-      <w:numFmt w:val="decimal"/>
-      <w:lvlText w:val="%7."/>
-      <w:lvlJc w:val="start"/>
-      <w:pPr>
-        <w:tabs>
-          <w:tab w:val="num" w:pos="0"/>
-        </w:tabs>
-        <w:ind w:start="3200" w:hanging="400"/>
-      </w:pPr>
-      <w:rPr/>
-    </w:lvl>
-    <w:lvl w:ilvl="7">
-      <w:start w:val="1"/>
-      <w:numFmt w:val="upperLetter"/>
-      <w:lvlText w:val="%8."/>
-      <w:lvlJc w:val="start"/>
-      <w:pPr>
-        <w:tabs>
-          <w:tab w:val="num" w:pos="0"/>
-        </w:tabs>
-        <w:ind w:start="3600" w:hanging="400"/>
-      </w:pPr>
-      <w:rPr/>
-    </w:lvl>
-    <w:lvl w:ilvl="8">
-      <w:start w:val="1"/>
-      <w:numFmt w:val="lowerRoman"/>
-      <w:lvlText w:val="%9."/>
-      <w:lvlJc w:val="end"/>
-      <w:pPr>
-        <w:tabs>
-          <w:tab w:val="num" w:pos="0"/>
-        </w:tabs>
-        <w:ind w:start="4000" w:hanging="400"/>
-      </w:pPr>
-      <w:rPr/>
-    </w:lvl>
-  </w:abstractNum>
-  <w:abstractNum w:abstractNumId="2">
-    <w:lvl w:ilvl="0">
-      <w:start w:val="1"/>
-      <w:numFmt w:val="lowerLetter"/>
-      <w:suff w:val="space"/>
-      <w:lvlText w:val="%1."/>
-      <w:lvlJc w:val="start"/>
-      <w:pPr>
-        <w:tabs>
-          <w:tab w:val="num" w:pos="0"/>
-        </w:tabs>
-        <w:ind w:start="0" w:hanging="0"/>
-      </w:pPr>
-      <w:rPr/>
-    </w:lvl>
-    <w:lvl w:ilvl="1">
-      <w:start w:val="1"/>
-      <w:numFmt w:val="decimal"/>
-      <w:lvlText w:val="%2."/>
-      <w:lvlJc w:val="start"/>
-      <w:pPr>
-        <w:tabs>
-          <w:tab w:val="num" w:pos="1080"/>
-        </w:tabs>
-        <w:ind w:start="1080" w:hanging="360"/>
-      </w:pPr>
-      <w:rPr/>
-    </w:lvl>
-    <w:lvl w:ilvl="2">
-      <w:start w:val="1"/>
-      <w:numFmt w:val="decimal"/>
-      <w:lvlText w:val="%3."/>
-      <w:lvlJc w:val="start"/>
-      <w:pPr>
-        <w:tabs>
-          <w:tab w:val="num" w:pos="1440"/>
-        </w:tabs>
-        <w:ind w:start="1440" w:hanging="360"/>
-      </w:pPr>
-      <w:rPr/>
-    </w:lvl>
-    <w:lvl w:ilvl="3">
-      <w:start w:val="1"/>
-      <w:numFmt w:val="decimal"/>
-      <w:lvlText w:val="%4."/>
-      <w:lvlJc w:val="start"/>
-      <w:pPr>
-        <w:tabs>
-          <w:tab w:val="num" w:pos="1800"/>
-        </w:tabs>
-        <w:ind w:start="1800" w:hanging="360"/>
-      </w:pPr>
-      <w:rPr/>
-    </w:lvl>
-    <w:lvl w:ilvl="4">
-      <w:start w:val="1"/>
-      <w:numFmt w:val="decimal"/>
-      <w:lvlText w:val="%5."/>
-      <w:lvlJc w:val="start"/>
-      <w:pPr>
-        <w:tabs>
-          <w:tab w:val="num" w:pos="2160"/>
-        </w:tabs>
-        <w:ind w:start="2160" w:hanging="360"/>
-      </w:pPr>
-      <w:rPr/>
-    </w:lvl>
-    <w:lvl w:ilvl="5">
-      <w:start w:val="1"/>
-      <w:numFmt w:val="decimal"/>
-      <w:lvlText w:val="%6."/>
-      <w:lvlJc w:val="start"/>
-      <w:pPr>
-        <w:tabs>
-          <w:tab w:val="num" w:pos="2520"/>
-        </w:tabs>
-        <w:ind w:start="2520" w:hanging="360"/>
-      </w:pPr>
-      <w:rPr/>
-    </w:lvl>
-    <w:lvl w:ilvl="6">
-      <w:start w:val="1"/>
-      <w:numFmt w:val="decimal"/>
-      <w:lvlText w:val="%7."/>
-      <w:lvlJc w:val="start"/>
-      <w:pPr>
-        <w:tabs>
-          <w:tab w:val="num" w:pos="2880"/>
-        </w:tabs>
-        <w:ind w:start="2880" w:hanging="360"/>
-      </w:pPr>
-      <w:rPr/>
-    </w:lvl>
-    <w:lvl w:ilvl="7">
-      <w:start w:val="1"/>
-      <w:numFmt w:val="decimal"/>
-      <w:lvlText w:val="%8."/>
-      <w:lvlJc w:val="start"/>
-      <w:pPr>
-        <w:tabs>
-          <w:tab w:val="num" w:pos="3240"/>
-        </w:tabs>
-        <w:ind w:start="3240" w:hanging="360"/>
-      </w:pPr>
-      <w:rPr/>
-    </w:lvl>
-    <w:lvl w:ilvl="8">
-      <w:start w:val="1"/>
-      <w:numFmt w:val="decimal"/>
-      <w:lvlText w:val="%9."/>
-      <w:lvlJc w:val="start"/>
-      <w:pPr>
-        <w:tabs>
-          <w:tab w:val="num" w:pos="3600"/>
-        </w:tabs>
-        <w:ind w:start="3600" w:hanging="360"/>
-      </w:pPr>
-      <w:rPr/>
-    </w:lvl>
-  </w:abstractNum>
-  <w:abstractNum w:abstractNumId="3">
-    <w:lvl w:ilvl="0">
-      <w:numFmt w:val="bullet"/>
-      <w:lvlText w:val="-"/>
-      <w:lvlJc w:val="start"/>
-      <w:pPr>
-        <w:tabs>
-          <w:tab w:val="num" w:pos="0"/>
-        </w:tabs>
-        <w:ind w:start="720" w:hanging="360"/>
+        <w:ind w:left="720" w:hanging="360"/>
       </w:pPr>
       <w:rPr>
         <w:rFonts w:ascii="Times New Roman" w:hAnsi="Times New Roman" w:cs="Times New Roman" w:hint="default"/>
@@ -2273,12 +1957,12 @@
       <w:start w:val="1"/>
       <w:numFmt w:val="bullet"/>
       <w:lvlText w:val="o"/>
-      <w:lvlJc w:val="start"/>
+      <w:lvlJc w:val="left"/>
       <w:pPr>
         <w:tabs>
           <w:tab w:val="num" w:pos="0"/>
         </w:tabs>
-        <w:ind w:start="1440" w:hanging="360"/>
+        <w:ind w:left="1440" w:hanging="360"/>
       </w:pPr>
       <w:rPr>
         <w:rFonts w:ascii="Courier New" w:hAnsi="Courier New" w:cs="Courier New" w:hint="default"/>
@@ -2288,12 +1972,12 @@
       <w:start w:val="1"/>
       <w:numFmt w:val="bullet"/>
       <w:lvlText w:val=""/>
-      <w:lvlJc w:val="start"/>
+      <w:lvlJc w:val="left"/>
       <w:pPr>
         <w:tabs>
           <w:tab w:val="num" w:pos="0"/>
         </w:tabs>
-        <w:ind w:start="2160" w:hanging="360"/>
+        <w:ind w:left="2160" w:hanging="360"/>
       </w:pPr>
       <w:rPr>
         <w:rFonts w:ascii="Wingdings" w:hAnsi="Wingdings" w:cs="Wingdings" w:hint="default"/>
@@ -2303,12 +1987,12 @@
       <w:start w:val="1"/>
       <w:numFmt w:val="bullet"/>
       <w:lvlText w:val=""/>
-      <w:lvlJc w:val="start"/>
+      <w:lvlJc w:val="left"/>
       <w:pPr>
         <w:tabs>
           <w:tab w:val="num" w:pos="0"/>
         </w:tabs>
-        <w:ind w:start="2880" w:hanging="360"/>
+        <w:ind w:left="2880" w:hanging="360"/>
       </w:pPr>
       <w:rPr>
         <w:rFonts w:ascii="Symbol" w:hAnsi="Symbol" w:cs="Symbol" w:hint="default"/>
@@ -2318,12 +2002,12 @@
       <w:start w:val="1"/>
       <w:numFmt w:val="bullet"/>
       <w:lvlText w:val="o"/>
-      <w:lvlJc w:val="start"/>
+      <w:lvlJc w:val="left"/>
       <w:pPr>
         <w:tabs>
           <w:tab w:val="num" w:pos="0"/>
         </w:tabs>
-        <w:ind w:start="3600" w:hanging="360"/>
+        <w:ind w:left="3600" w:hanging="360"/>
       </w:pPr>
       <w:rPr>
         <w:rFonts w:ascii="Courier New" w:hAnsi="Courier New" w:cs="Courier New" w:hint="default"/>
@@ -2333,12 +2017,12 @@
       <w:start w:val="1"/>
       <w:numFmt w:val="bullet"/>
       <w:lvlText w:val=""/>
-      <w:lvlJc w:val="start"/>
+      <w:lvlJc w:val="left"/>
       <w:pPr>
         <w:tabs>
           <w:tab w:val="num" w:pos="0"/>
         </w:tabs>
-        <w:ind w:start="4320" w:hanging="360"/>
+        <w:ind w:left="4320" w:hanging="360"/>
       </w:pPr>
       <w:rPr>
         <w:rFonts w:ascii="Wingdings" w:hAnsi="Wingdings" w:cs="Wingdings" w:hint="default"/>
@@ -2348,12 +2032,12 @@
       <w:start w:val="1"/>
       <w:numFmt w:val="bullet"/>
       <w:lvlText w:val=""/>
-      <w:lvlJc w:val="start"/>
+      <w:lvlJc w:val="left"/>
       <w:pPr>
         <w:tabs>
           <w:tab w:val="num" w:pos="0"/>
         </w:tabs>
-        <w:ind w:start="5040" w:hanging="360"/>
+        <w:ind w:left="5040" w:hanging="360"/>
       </w:pPr>
       <w:rPr>
         <w:rFonts w:ascii="Symbol" w:hAnsi="Symbol" w:cs="Symbol" w:hint="default"/>
@@ -2363,12 +2047,12 @@
       <w:start w:val="1"/>
       <w:numFmt w:val="bullet"/>
       <w:lvlText w:val="o"/>
-      <w:lvlJc w:val="start"/>
+      <w:lvlJc w:val="left"/>
       <w:pPr>
         <w:tabs>
           <w:tab w:val="num" w:pos="0"/>
         </w:tabs>
-        <w:ind w:start="5760" w:hanging="360"/>
+        <w:ind w:left="5760" w:hanging="360"/>
       </w:pPr>
       <w:rPr>
         <w:rFonts w:ascii="Courier New" w:hAnsi="Courier New" w:cs="Courier New" w:hint="default"/>
@@ -2378,36 +2062,265 @@
       <w:start w:val="1"/>
       <w:numFmt w:val="bullet"/>
       <w:lvlText w:val=""/>
-      <w:lvlJc w:val="start"/>
+      <w:lvlJc w:val="left"/>
       <w:pPr>
         <w:tabs>
           <w:tab w:val="num" w:pos="0"/>
         </w:tabs>
-        <w:ind w:start="6480" w:hanging="360"/>
+        <w:ind w:left="6480" w:hanging="360"/>
       </w:pPr>
       <w:rPr>
         <w:rFonts w:ascii="Wingdings" w:hAnsi="Wingdings" w:cs="Wingdings" w:hint="default"/>
       </w:rPr>
     </w:lvl>
   </w:abstractNum>
-  <w:num w:numId="1">
+  <w:abstractNum w:abstractNumId="1" w15:restartNumberingAfterBreak="0">
+    <w:nsid w:val="59310205"/>
+    <w:multiLevelType w:val="multilevel"/>
+    <w:tmpl w:val="427E7280"/>
+    <w:lvl w:ilvl="0">
+      <w:start w:val="1"/>
+      <w:numFmt w:val="lowerLetter"/>
+      <w:pStyle w:val="ListParagraph"/>
+      <w:suff w:val="space"/>
+      <w:lvlText w:val="%1."/>
+      <w:lvlJc w:val="left"/>
+      <w:pPr>
+        <w:tabs>
+          <w:tab w:val="num" w:pos="0"/>
+        </w:tabs>
+        <w:ind w:left="0" w:firstLine="0"/>
+      </w:pPr>
+    </w:lvl>
+    <w:lvl w:ilvl="1">
+      <w:start w:val="1"/>
+      <w:numFmt w:val="decimal"/>
+      <w:lvlText w:val="%2."/>
+      <w:lvlJc w:val="left"/>
+      <w:pPr>
+        <w:tabs>
+          <w:tab w:val="num" w:pos="1080"/>
+        </w:tabs>
+        <w:ind w:left="1080" w:hanging="360"/>
+      </w:pPr>
+    </w:lvl>
+    <w:lvl w:ilvl="2">
+      <w:start w:val="1"/>
+      <w:numFmt w:val="decimal"/>
+      <w:lvlText w:val="%3."/>
+      <w:lvlJc w:val="left"/>
+      <w:pPr>
+        <w:tabs>
+          <w:tab w:val="num" w:pos="1440"/>
+        </w:tabs>
+        <w:ind w:left="1440" w:hanging="360"/>
+      </w:pPr>
+    </w:lvl>
+    <w:lvl w:ilvl="3">
+      <w:start w:val="1"/>
+      <w:numFmt w:val="decimal"/>
+      <w:lvlText w:val="%4."/>
+      <w:lvlJc w:val="left"/>
+      <w:pPr>
+        <w:tabs>
+          <w:tab w:val="num" w:pos="1800"/>
+        </w:tabs>
+        <w:ind w:left="1800" w:hanging="360"/>
+      </w:pPr>
+    </w:lvl>
+    <w:lvl w:ilvl="4">
+      <w:start w:val="1"/>
+      <w:numFmt w:val="decimal"/>
+      <w:lvlText w:val="%5."/>
+      <w:lvlJc w:val="left"/>
+      <w:pPr>
+        <w:tabs>
+          <w:tab w:val="num" w:pos="2160"/>
+        </w:tabs>
+        <w:ind w:left="2160" w:hanging="360"/>
+      </w:pPr>
+    </w:lvl>
+    <w:lvl w:ilvl="5">
+      <w:start w:val="1"/>
+      <w:numFmt w:val="decimal"/>
+      <w:lvlText w:val="%6."/>
+      <w:lvlJc w:val="left"/>
+      <w:pPr>
+        <w:tabs>
+          <w:tab w:val="num" w:pos="2520"/>
+        </w:tabs>
+        <w:ind w:left="2520" w:hanging="360"/>
+      </w:pPr>
+    </w:lvl>
+    <w:lvl w:ilvl="6">
+      <w:start w:val="1"/>
+      <w:numFmt w:val="decimal"/>
+      <w:lvlText w:val="%7."/>
+      <w:lvlJc w:val="left"/>
+      <w:pPr>
+        <w:tabs>
+          <w:tab w:val="num" w:pos="2880"/>
+        </w:tabs>
+        <w:ind w:left="2880" w:hanging="360"/>
+      </w:pPr>
+    </w:lvl>
+    <w:lvl w:ilvl="7">
+      <w:start w:val="1"/>
+      <w:numFmt w:val="decimal"/>
+      <w:lvlText w:val="%8."/>
+      <w:lvlJc w:val="left"/>
+      <w:pPr>
+        <w:tabs>
+          <w:tab w:val="num" w:pos="3240"/>
+        </w:tabs>
+        <w:ind w:left="3240" w:hanging="360"/>
+      </w:pPr>
+    </w:lvl>
+    <w:lvl w:ilvl="8">
+      <w:start w:val="1"/>
+      <w:numFmt w:val="decimal"/>
+      <w:lvlText w:val="%9."/>
+      <w:lvlJc w:val="left"/>
+      <w:pPr>
+        <w:tabs>
+          <w:tab w:val="num" w:pos="3600"/>
+        </w:tabs>
+        <w:ind w:left="3600" w:hanging="360"/>
+      </w:pPr>
+    </w:lvl>
+  </w:abstractNum>
+  <w:abstractNum w:abstractNumId="2" w15:restartNumberingAfterBreak="0">
+    <w:nsid w:val="616B1F4E"/>
+    <w:multiLevelType w:val="multilevel"/>
+    <w:tmpl w:val="6674D136"/>
+    <w:lvl w:ilvl="0">
+      <w:start w:val="1"/>
+      <w:numFmt w:val="decimal"/>
+      <w:pStyle w:val="Heading1"/>
+      <w:lvlText w:val="%1."/>
+      <w:lvlJc w:val="left"/>
+      <w:pPr>
+        <w:tabs>
+          <w:tab w:val="num" w:pos="0"/>
+        </w:tabs>
+        <w:ind w:left="684" w:hanging="400"/>
+      </w:pPr>
+    </w:lvl>
+    <w:lvl w:ilvl="1">
+      <w:start w:val="1"/>
+      <w:numFmt w:val="upperLetter"/>
+      <w:lvlText w:val="%2."/>
+      <w:lvlJc w:val="left"/>
+      <w:pPr>
+        <w:tabs>
+          <w:tab w:val="num" w:pos="0"/>
+        </w:tabs>
+        <w:ind w:left="1200" w:hanging="400"/>
+      </w:pPr>
+    </w:lvl>
+    <w:lvl w:ilvl="2">
+      <w:start w:val="1"/>
+      <w:numFmt w:val="lowerRoman"/>
+      <w:lvlText w:val="%3."/>
+      <w:lvlJc w:val="right"/>
+      <w:pPr>
+        <w:tabs>
+          <w:tab w:val="num" w:pos="0"/>
+        </w:tabs>
+        <w:ind w:left="1600" w:hanging="400"/>
+      </w:pPr>
+    </w:lvl>
+    <w:lvl w:ilvl="3">
+      <w:start w:val="1"/>
+      <w:numFmt w:val="decimal"/>
+      <w:lvlText w:val="%4."/>
+      <w:lvlJc w:val="left"/>
+      <w:pPr>
+        <w:tabs>
+          <w:tab w:val="num" w:pos="0"/>
+        </w:tabs>
+        <w:ind w:left="2000" w:hanging="400"/>
+      </w:pPr>
+    </w:lvl>
+    <w:lvl w:ilvl="4">
+      <w:start w:val="1"/>
+      <w:numFmt w:val="upperLetter"/>
+      <w:lvlText w:val="%5."/>
+      <w:lvlJc w:val="left"/>
+      <w:pPr>
+        <w:tabs>
+          <w:tab w:val="num" w:pos="0"/>
+        </w:tabs>
+        <w:ind w:left="2400" w:hanging="400"/>
+      </w:pPr>
+    </w:lvl>
+    <w:lvl w:ilvl="5">
+      <w:start w:val="1"/>
+      <w:numFmt w:val="lowerRoman"/>
+      <w:lvlText w:val="%6."/>
+      <w:lvlJc w:val="right"/>
+      <w:pPr>
+        <w:tabs>
+          <w:tab w:val="num" w:pos="0"/>
+        </w:tabs>
+        <w:ind w:left="2800" w:hanging="400"/>
+      </w:pPr>
+    </w:lvl>
+    <w:lvl w:ilvl="6">
+      <w:start w:val="1"/>
+      <w:numFmt w:val="decimal"/>
+      <w:lvlText w:val="%7."/>
+      <w:lvlJc w:val="left"/>
+      <w:pPr>
+        <w:tabs>
+          <w:tab w:val="num" w:pos="0"/>
+        </w:tabs>
+        <w:ind w:left="3200" w:hanging="400"/>
+      </w:pPr>
+    </w:lvl>
+    <w:lvl w:ilvl="7">
+      <w:start w:val="1"/>
+      <w:numFmt w:val="upperLetter"/>
+      <w:lvlText w:val="%8."/>
+      <w:lvlJc w:val="left"/>
+      <w:pPr>
+        <w:tabs>
+          <w:tab w:val="num" w:pos="0"/>
+        </w:tabs>
+        <w:ind w:left="3600" w:hanging="400"/>
+      </w:pPr>
+    </w:lvl>
+    <w:lvl w:ilvl="8">
+      <w:start w:val="1"/>
+      <w:numFmt w:val="lowerRoman"/>
+      <w:lvlText w:val="%9."/>
+      <w:lvlJc w:val="right"/>
+      <w:pPr>
+        <w:tabs>
+          <w:tab w:val="num" w:pos="0"/>
+        </w:tabs>
+        <w:ind w:left="4000" w:hanging="400"/>
+      </w:pPr>
+    </w:lvl>
+  </w:abstractNum>
+  <w:num w:numId="1" w16cid:durableId="318770335">
+    <w:abstractNumId w:val="2"/>
+  </w:num>
+  <w:num w:numId="2" w16cid:durableId="660815869">
     <w:abstractNumId w:val="1"/>
   </w:num>
-  <w:num w:numId="2">
-    <w:abstractNumId w:val="2"/>
-  </w:num>
-  <w:num w:numId="3">
-    <w:abstractNumId w:val="3"/>
+  <w:num w:numId="3" w16cid:durableId="1849447218">
+    <w:abstractNumId w:val="0"/>
   </w:num>
 </w:numbering>
 </file>
 
 <file path=word/styles.xml><?xml version="1.0" encoding="utf-8"?>
-<w:styles xmlns:w="http://schemas.openxmlformats.org/wordprocessingml/2006/main" xmlns:w14="http://schemas.microsoft.com/office/word/2010/wordml" xmlns:mc="http://schemas.openxmlformats.org/markup-compatibility/2006" mc:Ignorable="w14">
+<w:styles xmlns:mc="http://schemas.openxmlformats.org/markup-compatibility/2006" xmlns:r="http://schemas.openxmlformats.org/officeDocument/2006/relationships" xmlns:w="http://schemas.openxmlformats.org/wordprocessingml/2006/main" xmlns:w14="http://schemas.microsoft.com/office/word/2010/wordml" xmlns:w15="http://schemas.microsoft.com/office/word/2012/wordml" xmlns:w16cex="http://schemas.microsoft.com/office/word/2018/wordml/cex" xmlns:w16cid="http://schemas.microsoft.com/office/word/2016/wordml/cid" xmlns:w16="http://schemas.microsoft.com/office/word/2018/wordml" xmlns:w16du="http://schemas.microsoft.com/office/word/2023/wordml/word16du" xmlns:w16sdtdh="http://schemas.microsoft.com/office/word/2020/wordml/sdtdatahash" xmlns:w16sdtfl="http://schemas.microsoft.com/office/word/2024/wordml/sdtformatlock" xmlns:w16se="http://schemas.microsoft.com/office/word/2015/wordml/symex" mc:Ignorable="w14 w15 w16se w16cid w16 w16cex w16sdtdh w16sdtfl w16du">
   <w:docDefaults>
     <w:rPrDefault>
       <w:rPr>
-        <w:rFonts w:ascii="Aptos" w:hAnsi="Aptos" w:eastAsia="Gulim" w:cs="" w:asciiTheme="minorHAnsi" w:cstheme="minorBidi" w:hAnsiTheme="minorHAnsi"/>
+        <w:rFonts w:asciiTheme="minorHAnsi" w:eastAsia="Gulim" w:hAnsiTheme="minorHAnsi" w:cstheme="minorBidi"/>
         <w:kern w:val="2"/>
         <w:sz w:val="24"/>
         <w:szCs w:val="24"/>
@@ -2417,21 +2330,21 @@
     </w:rPrDefault>
     <w:pPrDefault>
       <w:pPr>
-        <w:suppressAutoHyphens w:val="true"/>
+        <w:suppressAutoHyphens/>
       </w:pPr>
     </w:pPrDefault>
   </w:docDefaults>
   <w:latentStyles w:defLockedState="0" w:defUIPriority="99" w:defSemiHidden="0" w:defUnhideWhenUsed="0" w:defQFormat="0" w:count="376">
     <w:lsdException w:name="Normal" w:uiPriority="0" w:qFormat="1"/>
     <w:lsdException w:name="heading 1" w:uiPriority="9" w:qFormat="1"/>
-    <w:lsdException w:name="heading 2" w:uiPriority="9" w:semiHidden="1" w:unhideWhenUsed="1" w:qFormat="1"/>
-    <w:lsdException w:name="heading 3" w:uiPriority="9" w:semiHidden="1" w:unhideWhenUsed="1" w:qFormat="1"/>
-    <w:lsdException w:name="heading 4" w:uiPriority="9" w:semiHidden="1" w:unhideWhenUsed="1" w:qFormat="1"/>
-    <w:lsdException w:name="heading 5" w:uiPriority="9" w:semiHidden="1" w:unhideWhenUsed="1" w:qFormat="1"/>
-    <w:lsdException w:name="heading 6" w:uiPriority="9" w:semiHidden="1" w:unhideWhenUsed="1" w:qFormat="1"/>
-    <w:lsdException w:name="heading 7" w:uiPriority="9" w:semiHidden="1" w:unhideWhenUsed="1" w:qFormat="1"/>
-    <w:lsdException w:name="heading 8" w:uiPriority="9" w:semiHidden="1" w:unhideWhenUsed="1" w:qFormat="1"/>
-    <w:lsdException w:name="heading 9" w:uiPriority="9" w:semiHidden="1" w:unhideWhenUsed="1" w:qFormat="1"/>
+    <w:lsdException w:name="heading 2" w:semiHidden="1" w:uiPriority="9" w:unhideWhenUsed="1" w:qFormat="1"/>
+    <w:lsdException w:name="heading 3" w:semiHidden="1" w:uiPriority="9" w:unhideWhenUsed="1" w:qFormat="1"/>
+    <w:lsdException w:name="heading 4" w:semiHidden="1" w:uiPriority="9" w:unhideWhenUsed="1" w:qFormat="1"/>
+    <w:lsdException w:name="heading 5" w:semiHidden="1" w:uiPriority="9" w:unhideWhenUsed="1" w:qFormat="1"/>
+    <w:lsdException w:name="heading 6" w:semiHidden="1" w:uiPriority="9" w:unhideWhenUsed="1" w:qFormat="1"/>
+    <w:lsdException w:name="heading 7" w:semiHidden="1" w:uiPriority="9" w:unhideWhenUsed="1" w:qFormat="1"/>
+    <w:lsdException w:name="heading 8" w:semiHidden="1" w:uiPriority="9" w:unhideWhenUsed="1" w:qFormat="1"/>
+    <w:lsdException w:name="heading 9" w:semiHidden="1" w:uiPriority="9" w:unhideWhenUsed="1" w:qFormat="1"/>
     <w:lsdException w:name="index 1" w:semiHidden="1" w:unhideWhenUsed="1"/>
     <w:lsdException w:name="index 2" w:semiHidden="1" w:unhideWhenUsed="1"/>
     <w:lsdException w:name="index 3" w:semiHidden="1" w:unhideWhenUsed="1"/>
@@ -2441,22 +2354,22 @@
     <w:lsdException w:name="index 7" w:semiHidden="1" w:unhideWhenUsed="1"/>
     <w:lsdException w:name="index 8" w:semiHidden="1" w:unhideWhenUsed="1"/>
     <w:lsdException w:name="index 9" w:semiHidden="1" w:unhideWhenUsed="1"/>
-    <w:lsdException w:name="toc 1" w:uiPriority="39" w:semiHidden="1" w:unhideWhenUsed="1"/>
-    <w:lsdException w:name="toc 2" w:uiPriority="39" w:semiHidden="1" w:unhideWhenUsed="1"/>
-    <w:lsdException w:name="toc 3" w:uiPriority="39" w:semiHidden="1" w:unhideWhenUsed="1"/>
-    <w:lsdException w:name="toc 4" w:uiPriority="39" w:semiHidden="1" w:unhideWhenUsed="1"/>
-    <w:lsdException w:name="toc 5" w:uiPriority="39" w:semiHidden="1" w:unhideWhenUsed="1"/>
-    <w:lsdException w:name="toc 6" w:uiPriority="39" w:semiHidden="1" w:unhideWhenUsed="1"/>
-    <w:lsdException w:name="toc 7" w:uiPriority="39" w:semiHidden="1" w:unhideWhenUsed="1"/>
-    <w:lsdException w:name="toc 8" w:uiPriority="39" w:semiHidden="1" w:unhideWhenUsed="1"/>
-    <w:lsdException w:name="toc 9" w:uiPriority="39" w:semiHidden="1" w:unhideWhenUsed="1"/>
+    <w:lsdException w:name="toc 1" w:semiHidden="1" w:uiPriority="39" w:unhideWhenUsed="1"/>
+    <w:lsdException w:name="toc 2" w:semiHidden="1" w:uiPriority="39" w:unhideWhenUsed="1"/>
+    <w:lsdException w:name="toc 3" w:semiHidden="1" w:uiPriority="39" w:unhideWhenUsed="1"/>
+    <w:lsdException w:name="toc 4" w:semiHidden="1" w:uiPriority="39" w:unhideWhenUsed="1"/>
+    <w:lsdException w:name="toc 5" w:semiHidden="1" w:uiPriority="39" w:unhideWhenUsed="1"/>
+    <w:lsdException w:name="toc 6" w:semiHidden="1" w:uiPriority="39" w:unhideWhenUsed="1"/>
+    <w:lsdException w:name="toc 7" w:semiHidden="1" w:uiPriority="39" w:unhideWhenUsed="1"/>
+    <w:lsdException w:name="toc 8" w:semiHidden="1" w:uiPriority="39" w:unhideWhenUsed="1"/>
+    <w:lsdException w:name="toc 9" w:semiHidden="1" w:uiPriority="39" w:unhideWhenUsed="1"/>
     <w:lsdException w:name="Normal Indent" w:semiHidden="1" w:unhideWhenUsed="1"/>
     <w:lsdException w:name="footnote text" w:semiHidden="1" w:unhideWhenUsed="1"/>
     <w:lsdException w:name="annotation text" w:semiHidden="1" w:unhideWhenUsed="1"/>
     <w:lsdException w:name="header" w:semiHidden="1" w:unhideWhenUsed="1"/>
     <w:lsdException w:name="footer" w:semiHidden="1" w:unhideWhenUsed="1"/>
     <w:lsdException w:name="index heading" w:semiHidden="1" w:unhideWhenUsed="1"/>
-    <w:lsdException w:name="caption" w:uiPriority="35" w:semiHidden="1" w:unhideWhenUsed="1" w:qFormat="1"/>
+    <w:lsdException w:name="caption" w:semiHidden="1" w:uiPriority="35" w:unhideWhenUsed="1" w:qFormat="1"/>
     <w:lsdException w:name="table of figures" w:semiHidden="1" w:unhideWhenUsed="1"/>
     <w:lsdException w:name="envelope address" w:semiHidden="1" w:unhideWhenUsed="1"/>
     <w:lsdException w:name="envelope return" w:semiHidden="1" w:unhideWhenUsed="1"/>
@@ -2487,7 +2400,7 @@
     <w:lsdException w:name="Title" w:uiPriority="10" w:qFormat="1"/>
     <w:lsdException w:name="Closing" w:semiHidden="1" w:unhideWhenUsed="1"/>
     <w:lsdException w:name="Signature" w:semiHidden="1" w:unhideWhenUsed="1"/>
-    <w:lsdException w:name="Default Paragraph Font" w:uiPriority="1" w:semiHidden="1" w:unhideWhenUsed="1"/>
+    <w:lsdException w:name="Default Paragraph Font" w:semiHidden="1" w:uiPriority="1" w:unhideWhenUsed="1"/>
     <w:lsdException w:name="Body Text" w:semiHidden="1" w:unhideWhenUsed="1"/>
     <w:lsdException w:name="Body Text Indent" w:semiHidden="1" w:unhideWhenUsed="1"/>
     <w:lsdException w:name="List Continue" w:semiHidden="1" w:unhideWhenUsed="1"/>
@@ -2687,8 +2600,8 @@
     <w:lsdException w:name="Subtle Reference" w:uiPriority="31" w:qFormat="1"/>
     <w:lsdException w:name="Intense Reference" w:uiPriority="32" w:qFormat="1"/>
     <w:lsdException w:name="Book Title" w:uiPriority="33" w:qFormat="1"/>
-    <w:lsdException w:name="Bibliography" w:uiPriority="37" w:semiHidden="1" w:unhideWhenUsed="1"/>
-    <w:lsdException w:name="TOC Heading" w:uiPriority="39" w:semiHidden="1" w:unhideWhenUsed="1" w:qFormat="1"/>
+    <w:lsdException w:name="Bibliography" w:semiHidden="1" w:uiPriority="37" w:unhideWhenUsed="1"/>
+    <w:lsdException w:name="TOC Heading" w:semiHidden="1" w:uiPriority="39" w:unhideWhenUsed="1" w:qFormat="1"/>
     <w:lsdException w:name="Plain Table 1" w:uiPriority="41"/>
     <w:lsdException w:name="Plain Table 2" w:uiPriority="42"/>
     <w:lsdException w:name="Plain Table 3" w:uiPriority="43"/>
@@ -2799,24 +2712,14 @@
     <w:lsdException w:name="Unresolved Mention" w:semiHidden="1" w:unhideWhenUsed="1"/>
     <w:lsdException w:name="Smart Link" w:semiHidden="1" w:unhideWhenUsed="1"/>
   </w:latentStyles>
-  <w:style w:type="paragraph" w:styleId="Normal" w:default="1">
+  <w:style w:type="paragraph" w:default="1" w:styleId="Normal">
     <w:name w:val="Normal"/>
     <w:qFormat/>
-    <w:rsid w:val="00a7237e"/>
-    <w:pPr>
-      <w:widowControl/>
-      <w:suppressAutoHyphens w:val="true"/>
-      <w:bidi w:val="0"/>
-      <w:spacing w:before="0" w:after="0"/>
-      <w:jc w:val="start"/>
-    </w:pPr>
+    <w:rsid w:val="00A7237E"/>
     <w:rPr>
-      <w:rFonts w:ascii="Times New Roman" w:hAnsi="Times New Roman" w:eastAsia="Gulim" w:cs="Gulim"/>
-      <w:color w:val="auto"/>
+      <w:rFonts w:ascii="Times New Roman" w:hAnsi="Times New Roman" w:cs="Gulim"/>
       <w:kern w:val="0"/>
-      <w:sz w:val="24"/>
-      <w:szCs w:val="24"/>
-      <w:lang w:val="en-US" w:eastAsia="ko-KR" w:bidi="ar-SA"/>
+      <w:lang w:val="en-US" w:eastAsia="ko-KR"/>
       <w14:ligatures w14:val="none"/>
     </w:rPr>
   </w:style>
@@ -2828,19 +2731,18 @@
     <w:autoRedefine/>
     <w:uiPriority w:val="9"/>
     <w:qFormat/>
-    <w:rsid w:val="00a7237e"/>
+    <w:rsid w:val="00A7237E"/>
     <w:pPr>
-      <w:keepNext w:val="true"/>
+      <w:keepNext/>
       <w:numPr>
-        <w:ilvl w:val="0"/>
         <w:numId w:val="1"/>
       </w:numPr>
       <w:spacing w:before="120" w:after="120"/>
-      <w:ind w:endChars="100"/>
+      <w:ind w:rightChars="100" w:right="100"/>
       <w:outlineLvl w:val="0"/>
     </w:pPr>
     <w:rPr>
-      <w:rFonts w:eastAsia="Times New Roman" w:cs="" w:cstheme="majorBidi"/>
+      <w:rFonts w:eastAsia="Times New Roman" w:cstheme="majorBidi"/>
       <w:b/>
       <w:sz w:val="28"/>
       <w:szCs w:val="28"/>
@@ -2855,16 +2757,16 @@
     <w:semiHidden/>
     <w:unhideWhenUsed/>
     <w:qFormat/>
-    <w:rsid w:val="00ac40a2"/>
+    <w:rsid w:val="00AC40A2"/>
     <w:pPr>
-      <w:keepNext w:val="true"/>
+      <w:keepNext/>
       <w:keepLines/>
       <w:spacing w:before="160" w:after="80"/>
       <w:outlineLvl w:val="1"/>
     </w:pPr>
     <w:rPr>
-      <w:rFonts w:ascii="Aptos Display" w:hAnsi="Aptos Display" w:eastAsia="" w:cs="" w:asciiTheme="majorHAnsi" w:cstheme="majorBidi" w:eastAsiaTheme="majorEastAsia" w:hAnsiTheme="majorHAnsi"/>
-      <w:color w:themeColor="accent1" w:themeShade="bf" w:val="0F4761"/>
+      <w:rFonts w:asciiTheme="majorHAnsi" w:eastAsiaTheme="majorEastAsia" w:hAnsiTheme="majorHAnsi" w:cstheme="majorBidi"/>
+      <w:color w:val="0F4761" w:themeColor="accent1" w:themeShade="BF"/>
       <w:sz w:val="32"/>
       <w:szCs w:val="32"/>
     </w:rPr>
@@ -2878,16 +2780,16 @@
     <w:semiHidden/>
     <w:unhideWhenUsed/>
     <w:qFormat/>
-    <w:rsid w:val="00ac40a2"/>
+    <w:rsid w:val="00AC40A2"/>
     <w:pPr>
-      <w:keepNext w:val="true"/>
+      <w:keepNext/>
       <w:keepLines/>
       <w:spacing w:before="160" w:after="80"/>
       <w:outlineLvl w:val="2"/>
     </w:pPr>
     <w:rPr>
-      <w:rFonts w:ascii="Aptos" w:hAnsi="Aptos" w:eastAsia="" w:cs="" w:asciiTheme="minorHAnsi" w:cstheme="majorBidi" w:eastAsiaTheme="majorEastAsia" w:hAnsiTheme="minorHAnsi"/>
-      <w:color w:themeColor="accent1" w:themeShade="bf" w:val="0F4761"/>
+      <w:rFonts w:asciiTheme="minorHAnsi" w:eastAsiaTheme="majorEastAsia" w:hAnsiTheme="minorHAnsi" w:cstheme="majorBidi"/>
+      <w:color w:val="0F4761" w:themeColor="accent1" w:themeShade="BF"/>
       <w:sz w:val="28"/>
       <w:szCs w:val="28"/>
     </w:rPr>
@@ -2901,18 +2803,18 @@
     <w:semiHidden/>
     <w:unhideWhenUsed/>
     <w:qFormat/>
-    <w:rsid w:val="00ac40a2"/>
+    <w:rsid w:val="00AC40A2"/>
     <w:pPr>
-      <w:keepNext w:val="true"/>
+      <w:keepNext/>
       <w:keepLines/>
       <w:spacing w:before="80" w:after="40"/>
       <w:outlineLvl w:val="3"/>
     </w:pPr>
     <w:rPr>
-      <w:rFonts w:ascii="Aptos" w:hAnsi="Aptos" w:eastAsia="" w:cs="" w:asciiTheme="minorHAnsi" w:cstheme="majorBidi" w:eastAsiaTheme="majorEastAsia" w:hAnsiTheme="minorHAnsi"/>
+      <w:rFonts w:asciiTheme="minorHAnsi" w:eastAsiaTheme="majorEastAsia" w:hAnsiTheme="minorHAnsi" w:cstheme="majorBidi"/>
       <w:i/>
       <w:iCs/>
-      <w:color w:themeColor="accent1" w:themeShade="bf" w:val="0F4761"/>
+      <w:color w:val="0F4761" w:themeColor="accent1" w:themeShade="BF"/>
     </w:rPr>
   </w:style>
   <w:style w:type="paragraph" w:styleId="Heading5">
@@ -2924,16 +2826,16 @@
     <w:semiHidden/>
     <w:unhideWhenUsed/>
     <w:qFormat/>
-    <w:rsid w:val="00ac40a2"/>
+    <w:rsid w:val="00AC40A2"/>
     <w:pPr>
-      <w:keepNext w:val="true"/>
+      <w:keepNext/>
       <w:keepLines/>
       <w:spacing w:before="80" w:after="40"/>
       <w:outlineLvl w:val="4"/>
     </w:pPr>
     <w:rPr>
-      <w:rFonts w:ascii="Aptos" w:hAnsi="Aptos" w:eastAsia="" w:cs="" w:asciiTheme="minorHAnsi" w:cstheme="majorBidi" w:eastAsiaTheme="majorEastAsia" w:hAnsiTheme="minorHAnsi"/>
-      <w:color w:themeColor="accent1" w:themeShade="bf" w:val="0F4761"/>
+      <w:rFonts w:asciiTheme="minorHAnsi" w:eastAsiaTheme="majorEastAsia" w:hAnsiTheme="minorHAnsi" w:cstheme="majorBidi"/>
+      <w:color w:val="0F4761" w:themeColor="accent1" w:themeShade="BF"/>
     </w:rPr>
   </w:style>
   <w:style w:type="paragraph" w:styleId="Heading6">
@@ -2945,18 +2847,18 @@
     <w:semiHidden/>
     <w:unhideWhenUsed/>
     <w:qFormat/>
-    <w:rsid w:val="00ac40a2"/>
+    <w:rsid w:val="00AC40A2"/>
     <w:pPr>
-      <w:keepNext w:val="true"/>
+      <w:keepNext/>
       <w:keepLines/>
-      <w:spacing w:before="40" w:after="0"/>
+      <w:spacing w:before="40"/>
       <w:outlineLvl w:val="5"/>
     </w:pPr>
     <w:rPr>
-      <w:rFonts w:ascii="Aptos" w:hAnsi="Aptos" w:eastAsia="" w:cs="" w:asciiTheme="minorHAnsi" w:cstheme="majorBidi" w:eastAsiaTheme="majorEastAsia" w:hAnsiTheme="minorHAnsi"/>
+      <w:rFonts w:asciiTheme="minorHAnsi" w:eastAsiaTheme="majorEastAsia" w:hAnsiTheme="minorHAnsi" w:cstheme="majorBidi"/>
       <w:i/>
       <w:iCs/>
-      <w:color w:themeColor="text1" w:themeTint="a6" w:val="595959"/>
+      <w:color w:val="595959" w:themeColor="text1" w:themeTint="A6"/>
     </w:rPr>
   </w:style>
   <w:style w:type="paragraph" w:styleId="Heading7">
@@ -2968,16 +2870,16 @@
     <w:semiHidden/>
     <w:unhideWhenUsed/>
     <w:qFormat/>
-    <w:rsid w:val="00ac40a2"/>
+    <w:rsid w:val="00AC40A2"/>
     <w:pPr>
-      <w:keepNext w:val="true"/>
+      <w:keepNext/>
       <w:keepLines/>
-      <w:spacing w:before="40" w:after="0"/>
+      <w:spacing w:before="40"/>
       <w:outlineLvl w:val="6"/>
     </w:pPr>
     <w:rPr>
-      <w:rFonts w:ascii="Aptos" w:hAnsi="Aptos" w:eastAsia="" w:cs="" w:asciiTheme="minorHAnsi" w:cstheme="majorBidi" w:eastAsiaTheme="majorEastAsia" w:hAnsiTheme="minorHAnsi"/>
-      <w:color w:themeColor="text1" w:themeTint="a6" w:val="595959"/>
+      <w:rFonts w:asciiTheme="minorHAnsi" w:eastAsiaTheme="majorEastAsia" w:hAnsiTheme="minorHAnsi" w:cstheme="majorBidi"/>
+      <w:color w:val="595959" w:themeColor="text1" w:themeTint="A6"/>
     </w:rPr>
   </w:style>
   <w:style w:type="paragraph" w:styleId="Heading8">
@@ -2989,17 +2891,17 @@
     <w:semiHidden/>
     <w:unhideWhenUsed/>
     <w:qFormat/>
-    <w:rsid w:val="00ac40a2"/>
+    <w:rsid w:val="00AC40A2"/>
     <w:pPr>
-      <w:keepNext w:val="true"/>
+      <w:keepNext/>
       <w:keepLines/>
       <w:outlineLvl w:val="7"/>
     </w:pPr>
     <w:rPr>
-      <w:rFonts w:ascii="Aptos" w:hAnsi="Aptos" w:eastAsia="" w:cs="" w:asciiTheme="minorHAnsi" w:cstheme="majorBidi" w:eastAsiaTheme="majorEastAsia" w:hAnsiTheme="minorHAnsi"/>
+      <w:rFonts w:asciiTheme="minorHAnsi" w:eastAsiaTheme="majorEastAsia" w:hAnsiTheme="minorHAnsi" w:cstheme="majorBidi"/>
       <w:i/>
       <w:iCs/>
-      <w:color w:themeColor="text1" w:themeTint="d8" w:val="272727"/>
+      <w:color w:val="272727" w:themeColor="text1" w:themeTint="D8"/>
     </w:rPr>
   </w:style>
   <w:style w:type="paragraph" w:styleId="Heading9">
@@ -3011,51 +2913,70 @@
     <w:semiHidden/>
     <w:unhideWhenUsed/>
     <w:qFormat/>
-    <w:rsid w:val="00ac40a2"/>
+    <w:rsid w:val="00AC40A2"/>
     <w:pPr>
-      <w:keepNext w:val="true"/>
+      <w:keepNext/>
       <w:keepLines/>
       <w:outlineLvl w:val="8"/>
     </w:pPr>
     <w:rPr>
-      <w:rFonts w:ascii="Aptos" w:hAnsi="Aptos" w:eastAsia="" w:cs="" w:asciiTheme="minorHAnsi" w:cstheme="majorBidi" w:eastAsiaTheme="majorEastAsia" w:hAnsiTheme="minorHAnsi"/>
-      <w:color w:themeColor="text1" w:themeTint="d8" w:val="272727"/>
+      <w:rFonts w:asciiTheme="minorHAnsi" w:eastAsiaTheme="majorEastAsia" w:hAnsiTheme="minorHAnsi" w:cstheme="majorBidi"/>
+      <w:color w:val="272727" w:themeColor="text1" w:themeTint="D8"/>
     </w:rPr>
   </w:style>
-  <w:style w:type="character" w:styleId="DefaultParagraphFont" w:default="1">
+  <w:style w:type="character" w:default="1" w:styleId="DefaultParagraphFont">
     <w:name w:val="Default Paragraph Font"/>
     <w:uiPriority w:val="1"/>
     <w:semiHidden/>
     <w:unhideWhenUsed/>
-    <w:qFormat/>
-    <w:rPr/>
-  </w:style>
-  <w:style w:type="character" w:styleId="Heading1Char" w:customStyle="1">
+  </w:style>
+  <w:style w:type="table" w:default="1" w:styleId="TableNormal">
+    <w:name w:val="Normal Table"/>
+    <w:uiPriority w:val="99"/>
+    <w:semiHidden/>
+    <w:unhideWhenUsed/>
+    <w:tblPr>
+      <w:tblInd w:w="0" w:type="dxa"/>
+      <w:tblCellMar>
+        <w:top w:w="0" w:type="dxa"/>
+        <w:left w:w="108" w:type="dxa"/>
+        <w:bottom w:w="0" w:type="dxa"/>
+        <w:right w:w="108" w:type="dxa"/>
+      </w:tblCellMar>
+    </w:tblPr>
+  </w:style>
+  <w:style w:type="numbering" w:default="1" w:styleId="NoList">
+    <w:name w:val="No List"/>
+    <w:uiPriority w:val="99"/>
+    <w:semiHidden/>
+    <w:unhideWhenUsed/>
+  </w:style>
+  <w:style w:type="character" w:customStyle="1" w:styleId="Heading1Char">
     <w:name w:val="Heading 1 Char"/>
     <w:basedOn w:val="DefaultParagraphFont"/>
     <w:link w:val="Heading1"/>
     <w:uiPriority w:val="9"/>
     <w:qFormat/>
-    <w:rsid w:val="00a7237e"/>
+    <w:rsid w:val="00A7237E"/>
     <w:rPr>
-      <w:rFonts w:ascii="Times New Roman" w:hAnsi="Times New Roman" w:eastAsia="Times New Roman" w:cs="" w:cstheme="majorBidi"/>
+      <w:rFonts w:ascii="Times New Roman" w:eastAsia="Times New Roman" w:hAnsi="Times New Roman" w:cstheme="majorBidi"/>
       <w:b/>
       <w:sz w:val="28"/>
       <w:szCs w:val="28"/>
       <w:lang w:eastAsia="ko-KR"/>
     </w:rPr>
   </w:style>
-  <w:style w:type="character" w:styleId="Heading2Char" w:customStyle="1">
+  <w:style w:type="character" w:customStyle="1" w:styleId="Heading2Char">
     <w:name w:val="Heading 2 Char"/>
     <w:basedOn w:val="DefaultParagraphFont"/>
     <w:link w:val="Heading2"/>
     <w:uiPriority w:val="9"/>
     <w:semiHidden/>
     <w:qFormat/>
-    <w:rsid w:val="00ac40a2"/>
+    <w:rsid w:val="00AC40A2"/>
     <w:rPr>
-      <w:rFonts w:ascii="Aptos Display" w:hAnsi="Aptos Display" w:eastAsia="" w:cs="" w:asciiTheme="majorHAnsi" w:cstheme="majorBidi" w:eastAsiaTheme="majorEastAsia" w:hAnsiTheme="majorHAnsi"/>
-      <w:color w:themeColor="accent1" w:themeShade="bf" w:val="0F4761"/>
+      <w:rFonts w:asciiTheme="majorHAnsi" w:eastAsiaTheme="majorEastAsia" w:hAnsiTheme="majorHAnsi" w:cstheme="majorBidi"/>
+      <w:color w:val="0F4761" w:themeColor="accent1" w:themeShade="BF"/>
       <w:kern w:val="0"/>
       <w:sz w:val="32"/>
       <w:szCs w:val="32"/>
@@ -3063,17 +2984,17 @@
       <w14:ligatures w14:val="none"/>
     </w:rPr>
   </w:style>
-  <w:style w:type="character" w:styleId="Heading3Char" w:customStyle="1">
+  <w:style w:type="character" w:customStyle="1" w:styleId="Heading3Char">
     <w:name w:val="Heading 3 Char"/>
     <w:basedOn w:val="DefaultParagraphFont"/>
     <w:link w:val="Heading3"/>
     <w:uiPriority w:val="9"/>
     <w:semiHidden/>
     <w:qFormat/>
-    <w:rsid w:val="00ac40a2"/>
+    <w:rsid w:val="00AC40A2"/>
     <w:rPr>
-      <w:rFonts w:eastAsia="" w:cs="" w:cstheme="majorBidi" w:eastAsiaTheme="majorEastAsia"/>
-      <w:color w:themeColor="accent1" w:themeShade="bf" w:val="0F4761"/>
+      <w:rFonts w:eastAsiaTheme="majorEastAsia" w:cstheme="majorBidi"/>
+      <w:color w:val="0F4761" w:themeColor="accent1" w:themeShade="BF"/>
       <w:kern w:val="0"/>
       <w:sz w:val="28"/>
       <w:szCs w:val="28"/>
@@ -3081,117 +3002,117 @@
       <w14:ligatures w14:val="none"/>
     </w:rPr>
   </w:style>
-  <w:style w:type="character" w:styleId="Heading4Char" w:customStyle="1">
+  <w:style w:type="character" w:customStyle="1" w:styleId="Heading4Char">
     <w:name w:val="Heading 4 Char"/>
     <w:basedOn w:val="DefaultParagraphFont"/>
     <w:link w:val="Heading4"/>
     <w:uiPriority w:val="9"/>
     <w:semiHidden/>
     <w:qFormat/>
-    <w:rsid w:val="00ac40a2"/>
+    <w:rsid w:val="00AC40A2"/>
     <w:rPr>
-      <w:rFonts w:eastAsia="" w:cs="" w:cstheme="majorBidi" w:eastAsiaTheme="majorEastAsia"/>
+      <w:rFonts w:eastAsiaTheme="majorEastAsia" w:cstheme="majorBidi"/>
       <w:i/>
       <w:iCs/>
-      <w:color w:themeColor="accent1" w:themeShade="bf" w:val="0F4761"/>
+      <w:color w:val="0F4761" w:themeColor="accent1" w:themeShade="BF"/>
       <w:kern w:val="0"/>
       <w:lang w:val="en-US" w:eastAsia="ko-KR"/>
       <w14:ligatures w14:val="none"/>
     </w:rPr>
   </w:style>
-  <w:style w:type="character" w:styleId="Heading5Char" w:customStyle="1">
+  <w:style w:type="character" w:customStyle="1" w:styleId="Heading5Char">
     <w:name w:val="Heading 5 Char"/>
     <w:basedOn w:val="DefaultParagraphFont"/>
     <w:link w:val="Heading5"/>
     <w:uiPriority w:val="9"/>
     <w:semiHidden/>
     <w:qFormat/>
-    <w:rsid w:val="00ac40a2"/>
+    <w:rsid w:val="00AC40A2"/>
     <w:rPr>
-      <w:rFonts w:eastAsia="" w:cs="" w:cstheme="majorBidi" w:eastAsiaTheme="majorEastAsia"/>
-      <w:color w:themeColor="accent1" w:themeShade="bf" w:val="0F4761"/>
+      <w:rFonts w:eastAsiaTheme="majorEastAsia" w:cstheme="majorBidi"/>
+      <w:color w:val="0F4761" w:themeColor="accent1" w:themeShade="BF"/>
       <w:kern w:val="0"/>
       <w:lang w:val="en-US" w:eastAsia="ko-KR"/>
       <w14:ligatures w14:val="none"/>
     </w:rPr>
   </w:style>
-  <w:style w:type="character" w:styleId="Heading6Char" w:customStyle="1">
+  <w:style w:type="character" w:customStyle="1" w:styleId="Heading6Char">
     <w:name w:val="Heading 6 Char"/>
     <w:basedOn w:val="DefaultParagraphFont"/>
     <w:link w:val="Heading6"/>
     <w:uiPriority w:val="9"/>
     <w:semiHidden/>
     <w:qFormat/>
-    <w:rsid w:val="00ac40a2"/>
+    <w:rsid w:val="00AC40A2"/>
     <w:rPr>
-      <w:rFonts w:eastAsia="" w:cs="" w:cstheme="majorBidi" w:eastAsiaTheme="majorEastAsia"/>
+      <w:rFonts w:eastAsiaTheme="majorEastAsia" w:cstheme="majorBidi"/>
       <w:i/>
       <w:iCs/>
-      <w:color w:themeColor="text1" w:themeTint="a6" w:val="595959"/>
+      <w:color w:val="595959" w:themeColor="text1" w:themeTint="A6"/>
       <w:kern w:val="0"/>
       <w:lang w:val="en-US" w:eastAsia="ko-KR"/>
       <w14:ligatures w14:val="none"/>
     </w:rPr>
   </w:style>
-  <w:style w:type="character" w:styleId="Heading7Char" w:customStyle="1">
+  <w:style w:type="character" w:customStyle="1" w:styleId="Heading7Char">
     <w:name w:val="Heading 7 Char"/>
     <w:basedOn w:val="DefaultParagraphFont"/>
     <w:link w:val="Heading7"/>
     <w:uiPriority w:val="9"/>
     <w:semiHidden/>
     <w:qFormat/>
-    <w:rsid w:val="00ac40a2"/>
+    <w:rsid w:val="00AC40A2"/>
     <w:rPr>
-      <w:rFonts w:eastAsia="" w:cs="" w:cstheme="majorBidi" w:eastAsiaTheme="majorEastAsia"/>
-      <w:color w:themeColor="text1" w:themeTint="a6" w:val="595959"/>
+      <w:rFonts w:eastAsiaTheme="majorEastAsia" w:cstheme="majorBidi"/>
+      <w:color w:val="595959" w:themeColor="text1" w:themeTint="A6"/>
       <w:kern w:val="0"/>
       <w:lang w:val="en-US" w:eastAsia="ko-KR"/>
       <w14:ligatures w14:val="none"/>
     </w:rPr>
   </w:style>
-  <w:style w:type="character" w:styleId="Heading8Char" w:customStyle="1">
+  <w:style w:type="character" w:customStyle="1" w:styleId="Heading8Char">
     <w:name w:val="Heading 8 Char"/>
     <w:basedOn w:val="DefaultParagraphFont"/>
     <w:link w:val="Heading8"/>
     <w:uiPriority w:val="9"/>
     <w:semiHidden/>
     <w:qFormat/>
-    <w:rsid w:val="00ac40a2"/>
+    <w:rsid w:val="00AC40A2"/>
     <w:rPr>
-      <w:rFonts w:eastAsia="" w:cs="" w:cstheme="majorBidi" w:eastAsiaTheme="majorEastAsia"/>
+      <w:rFonts w:eastAsiaTheme="majorEastAsia" w:cstheme="majorBidi"/>
       <w:i/>
       <w:iCs/>
-      <w:color w:themeColor="text1" w:themeTint="d8" w:val="272727"/>
+      <w:color w:val="272727" w:themeColor="text1" w:themeTint="D8"/>
       <w:kern w:val="0"/>
       <w:lang w:val="en-US" w:eastAsia="ko-KR"/>
       <w14:ligatures w14:val="none"/>
     </w:rPr>
   </w:style>
-  <w:style w:type="character" w:styleId="Heading9Char" w:customStyle="1">
+  <w:style w:type="character" w:customStyle="1" w:styleId="Heading9Char">
     <w:name w:val="Heading 9 Char"/>
     <w:basedOn w:val="DefaultParagraphFont"/>
     <w:link w:val="Heading9"/>
     <w:uiPriority w:val="9"/>
     <w:semiHidden/>
     <w:qFormat/>
-    <w:rsid w:val="00ac40a2"/>
+    <w:rsid w:val="00AC40A2"/>
     <w:rPr>
-      <w:rFonts w:eastAsia="" w:cs="" w:cstheme="majorBidi" w:eastAsiaTheme="majorEastAsia"/>
-      <w:color w:themeColor="text1" w:themeTint="d8" w:val="272727"/>
+      <w:rFonts w:eastAsiaTheme="majorEastAsia" w:cstheme="majorBidi"/>
+      <w:color w:val="272727" w:themeColor="text1" w:themeTint="D8"/>
       <w:kern w:val="0"/>
       <w:lang w:val="en-US" w:eastAsia="ko-KR"/>
       <w14:ligatures w14:val="none"/>
     </w:rPr>
   </w:style>
-  <w:style w:type="character" w:styleId="TitleChar" w:customStyle="1">
+  <w:style w:type="character" w:customStyle="1" w:styleId="TitleChar">
     <w:name w:val="Title Char"/>
     <w:basedOn w:val="DefaultParagraphFont"/>
     <w:link w:val="Title"/>
     <w:uiPriority w:val="10"/>
     <w:qFormat/>
-    <w:rsid w:val="00ac40a2"/>
+    <w:rsid w:val="00AC40A2"/>
     <w:rPr>
-      <w:rFonts w:ascii="Aptos Display" w:hAnsi="Aptos Display" w:eastAsia="" w:cs="" w:asciiTheme="majorHAnsi" w:cstheme="majorBidi" w:eastAsiaTheme="majorEastAsia" w:hAnsiTheme="majorHAnsi"/>
+      <w:rFonts w:asciiTheme="majorHAnsi" w:eastAsiaTheme="majorEastAsia" w:hAnsiTheme="majorHAnsi" w:cstheme="majorBidi"/>
       <w:spacing w:val="-10"/>
       <w:kern w:val="2"/>
       <w:sz w:val="56"/>
@@ -3200,16 +3121,16 @@
       <w14:ligatures w14:val="none"/>
     </w:rPr>
   </w:style>
-  <w:style w:type="character" w:styleId="SubtitleChar" w:customStyle="1">
+  <w:style w:type="character" w:customStyle="1" w:styleId="SubtitleChar">
     <w:name w:val="Subtitle Char"/>
     <w:basedOn w:val="DefaultParagraphFont"/>
     <w:link w:val="Subtitle"/>
     <w:uiPriority w:val="11"/>
     <w:qFormat/>
-    <w:rsid w:val="00ac40a2"/>
+    <w:rsid w:val="00AC40A2"/>
     <w:rPr>
-      <w:rFonts w:eastAsia="" w:cs="" w:cstheme="majorBidi" w:eastAsiaTheme="majorEastAsia"/>
-      <w:color w:themeColor="text1" w:themeTint="a6" w:val="595959"/>
+      <w:rFonts w:eastAsiaTheme="majorEastAsia" w:cstheme="majorBidi"/>
+      <w:color w:val="595959" w:themeColor="text1" w:themeTint="A6"/>
       <w:spacing w:val="15"/>
       <w:kern w:val="0"/>
       <w:sz w:val="28"/>
@@ -3218,18 +3139,18 @@
       <w14:ligatures w14:val="none"/>
     </w:rPr>
   </w:style>
-  <w:style w:type="character" w:styleId="QuoteChar" w:customStyle="1">
+  <w:style w:type="character" w:customStyle="1" w:styleId="QuoteChar">
     <w:name w:val="Quote Char"/>
     <w:basedOn w:val="DefaultParagraphFont"/>
     <w:link w:val="Quote"/>
     <w:uiPriority w:val="29"/>
     <w:qFormat/>
-    <w:rsid w:val="00ac40a2"/>
+    <w:rsid w:val="00AC40A2"/>
     <w:rPr>
       <w:rFonts w:ascii="Times New Roman" w:hAnsi="Times New Roman" w:cs="Gulim"/>
       <w:i/>
       <w:iCs/>
-      <w:color w:themeColor="text1" w:themeTint="bf" w:val="404040"/>
+      <w:color w:val="404040" w:themeColor="text1" w:themeTint="BF"/>
       <w:kern w:val="0"/>
       <w:lang w:val="en-US" w:eastAsia="ko-KR"/>
       <w14:ligatures w14:val="none"/>
@@ -3240,25 +3161,25 @@
     <w:basedOn w:val="DefaultParagraphFont"/>
     <w:uiPriority w:val="21"/>
     <w:qFormat/>
-    <w:rsid w:val="00ac40a2"/>
+    <w:rsid w:val="00AC40A2"/>
     <w:rPr>
       <w:i/>
       <w:iCs/>
-      <w:color w:themeColor="accent1" w:themeShade="bf" w:val="0F4761"/>
+      <w:color w:val="0F4761" w:themeColor="accent1" w:themeShade="BF"/>
     </w:rPr>
   </w:style>
-  <w:style w:type="character" w:styleId="IntenseQuoteChar" w:customStyle="1">
+  <w:style w:type="character" w:customStyle="1" w:styleId="IntenseQuoteChar">
     <w:name w:val="Intense Quote Char"/>
     <w:basedOn w:val="DefaultParagraphFont"/>
     <w:link w:val="IntenseQuote"/>
     <w:uiPriority w:val="30"/>
     <w:qFormat/>
-    <w:rsid w:val="00ac40a2"/>
+    <w:rsid w:val="00AC40A2"/>
     <w:rPr>
       <w:rFonts w:ascii="Times New Roman" w:hAnsi="Times New Roman" w:cs="Gulim"/>
       <w:i/>
       <w:iCs/>
-      <w:color w:themeColor="accent1" w:themeShade="bf" w:val="0F4761"/>
+      <w:color w:val="0F4761" w:themeColor="accent1" w:themeShade="BF"/>
       <w:kern w:val="0"/>
       <w:lang w:val="en-US" w:eastAsia="ko-KR"/>
       <w14:ligatures w14:val="none"/>
@@ -3269,26 +3190,26 @@
     <w:basedOn w:val="DefaultParagraphFont"/>
     <w:uiPriority w:val="32"/>
     <w:qFormat/>
-    <w:rsid w:val="00ac40a2"/>
+    <w:rsid w:val="00AC40A2"/>
     <w:rPr>
       <w:b/>
       <w:bCs/>
       <w:smallCaps/>
-      <w:color w:themeColor="accent1" w:themeShade="bf" w:val="0F4761"/>
+      <w:color w:val="0F4761" w:themeColor="accent1" w:themeShade="BF"/>
       <w:spacing w:val="5"/>
     </w:rPr>
   </w:style>
-  <w:style w:type="paragraph" w:styleId="Heading" w:customStyle="1">
+  <w:style w:type="paragraph" w:customStyle="1" w:styleId="Heading">
     <w:name w:val="Heading"/>
     <w:basedOn w:val="Normal"/>
     <w:next w:val="BodyText"/>
     <w:qFormat/>
     <w:pPr>
-      <w:keepNext w:val="true"/>
+      <w:keepNext/>
       <w:spacing w:before="240" w:after="120"/>
     </w:pPr>
     <w:rPr>
-      <w:rFonts w:ascii="Liberation Sans" w:hAnsi="Liberation Sans" w:eastAsia="Noto Sans CJK SC" w:cs="Noto Sans Devanagari"/>
+      <w:rFonts w:ascii="Liberation Sans" w:eastAsia="Noto Sans CJK SC" w:hAnsi="Liberation Sans" w:cs="Noto Sans Devanagari"/>
       <w:sz w:val="28"/>
       <w:szCs w:val="28"/>
     </w:rPr>
@@ -3297,14 +3218,12 @@
     <w:name w:val="Body Text"/>
     <w:basedOn w:val="Normal"/>
     <w:pPr>
-      <w:spacing w:lineRule="auto" w:line="276" w:before="0" w:after="140"/>
+      <w:spacing w:after="140" w:line="276" w:lineRule="auto"/>
     </w:pPr>
-    <w:rPr/>
   </w:style>
   <w:style w:type="paragraph" w:styleId="List">
     <w:name w:val="List"/>
     <w:basedOn w:val="BodyText"/>
-    <w:pPr/>
     <w:rPr>
       <w:rFonts w:cs="Noto Sans Devanagari"/>
     </w:rPr>
@@ -3323,7 +3242,7 @@
       <w:iCs/>
     </w:rPr>
   </w:style>
-  <w:style w:type="paragraph" w:styleId="Index" w:customStyle="1">
+  <w:style w:type="paragraph" w:customStyle="1" w:styleId="Index">
     <w:name w:val="Index"/>
     <w:basedOn w:val="Normal"/>
     <w:qFormat/>
@@ -3340,17 +3259,16 @@
     <w:autoRedefine/>
     <w:uiPriority w:val="34"/>
     <w:qFormat/>
-    <w:rsid w:val="00a7237e"/>
+    <w:rsid w:val="00A7237E"/>
     <w:pPr>
       <w:numPr>
-        <w:ilvl w:val="0"/>
         <w:numId w:val="2"/>
       </w:numPr>
-      <w:spacing w:lineRule="auto" w:line="259" w:before="0" w:after="160"/>
-      <w:ind w:start="240"/>
+      <w:spacing w:after="160" w:line="259" w:lineRule="auto"/>
+      <w:ind w:left="240"/>
     </w:pPr>
     <w:rPr>
-      <w:rFonts w:eastAsia="" w:cs="Times New Roman" w:eastAsiaTheme="minorEastAsia"/>
+      <w:rFonts w:eastAsiaTheme="minorEastAsia" w:cs="Times New Roman"/>
       <w:iCs/>
       <w:sz w:val="26"/>
       <w:szCs w:val="26"/>
@@ -3363,13 +3281,13 @@
     <w:link w:val="TitleChar"/>
     <w:uiPriority w:val="10"/>
     <w:qFormat/>
-    <w:rsid w:val="00ac40a2"/>
+    <w:rsid w:val="00AC40A2"/>
     <w:pPr>
-      <w:spacing w:before="0" w:after="80"/>
+      <w:spacing w:after="80"/>
       <w:contextualSpacing/>
     </w:pPr>
     <w:rPr>
-      <w:rFonts w:ascii="Aptos Display" w:hAnsi="Aptos Display" w:eastAsia="" w:cs="" w:asciiTheme="majorHAnsi" w:cstheme="majorBidi" w:eastAsiaTheme="majorEastAsia" w:hAnsiTheme="majorHAnsi"/>
+      <w:rFonts w:asciiTheme="majorHAnsi" w:eastAsiaTheme="majorEastAsia" w:hAnsiTheme="majorHAnsi" w:cstheme="majorBidi"/>
       <w:spacing w:val="-10"/>
       <w:kern w:val="2"/>
       <w:sz w:val="56"/>
@@ -3383,13 +3301,13 @@
     <w:link w:val="SubtitleChar"/>
     <w:uiPriority w:val="11"/>
     <w:qFormat/>
-    <w:rsid w:val="00ac40a2"/>
+    <w:rsid w:val="00AC40A2"/>
     <w:pPr>
-      <w:spacing w:before="0" w:after="160"/>
+      <w:spacing w:after="160"/>
     </w:pPr>
     <w:rPr>
-      <w:rFonts w:ascii="Aptos" w:hAnsi="Aptos" w:eastAsia="" w:cs="" w:asciiTheme="minorHAnsi" w:cstheme="majorBidi" w:eastAsiaTheme="majorEastAsia" w:hAnsiTheme="minorHAnsi"/>
-      <w:color w:themeColor="text1" w:themeTint="a6" w:val="595959"/>
+      <w:rFonts w:asciiTheme="minorHAnsi" w:eastAsiaTheme="majorEastAsia" w:hAnsiTheme="minorHAnsi" w:cstheme="majorBidi"/>
+      <w:color w:val="595959" w:themeColor="text1" w:themeTint="A6"/>
       <w:spacing w:val="15"/>
       <w:sz w:val="28"/>
       <w:szCs w:val="28"/>
@@ -3402,7 +3320,7 @@
     <w:link w:val="QuoteChar"/>
     <w:uiPriority w:val="29"/>
     <w:qFormat/>
-    <w:rsid w:val="00ac40a2"/>
+    <w:rsid w:val="00AC40A2"/>
     <w:pPr>
       <w:spacing w:before="160" w:after="160"/>
       <w:jc w:val="center"/>
@@ -3410,7 +3328,7 @@
     <w:rPr>
       <w:i/>
       <w:iCs/>
-      <w:color w:themeColor="text1" w:themeTint="bf" w:val="404040"/>
+      <w:color w:val="404040" w:themeColor="text1" w:themeTint="BF"/>
     </w:rPr>
   </w:style>
   <w:style w:type="paragraph" w:styleId="IntenseQuote">
@@ -3420,48 +3338,27 @@
     <w:link w:val="IntenseQuoteChar"/>
     <w:uiPriority w:val="30"/>
     <w:qFormat/>
-    <w:rsid w:val="00ac40a2"/>
+    <w:rsid w:val="00AC40A2"/>
     <w:pPr>
       <w:pBdr>
-        <w:top w:val="single" w:sz="4" w:space="10" w:color="0F4761" w:themeColor="accent1" w:themeShade="bf"/>
-        <w:bottom w:val="single" w:sz="4" w:space="10" w:color="0F4761" w:themeColor="accent1" w:themeShade="bf"/>
+        <w:top w:val="single" w:sz="4" w:space="10" w:color="0F4761" w:themeColor="accent1" w:themeShade="BF"/>
+        <w:bottom w:val="single" w:sz="4" w:space="10" w:color="0F4761" w:themeColor="accent1" w:themeShade="BF"/>
       </w:pBdr>
       <w:spacing w:before="360" w:after="360"/>
-      <w:ind w:start="864" w:end="864"/>
+      <w:ind w:left="864" w:right="864"/>
       <w:jc w:val="center"/>
     </w:pPr>
     <w:rPr>
       <w:i/>
       <w:iCs/>
-      <w:color w:themeColor="accent1" w:themeShade="bf" w:val="0F4761"/>
+      <w:color w:val="0F4761" w:themeColor="accent1" w:themeShade="BF"/>
     </w:rPr>
-  </w:style>
-  <w:style w:type="numbering" w:styleId="NoList" w:default="1">
-    <w:name w:val="No List"/>
-    <w:uiPriority w:val="99"/>
-    <w:semiHidden/>
-    <w:unhideWhenUsed/>
-    <w:qFormat/>
-  </w:style>
-  <w:style w:type="table" w:default="1" w:styleId="TableNormal">
-    <w:name w:val="Normal Table"/>
-    <w:uiPriority w:val="99"/>
-    <w:semiHidden/>
-    <w:unhideWhenUsed/>
-    <w:tblPr>
-      <w:tblCellMar>
-        <w:top w:w="0" w:type="dxa"/>
-        <w:left w:w="108" w:type="dxa"/>
-        <w:bottom w:w="0" w:type="dxa"/>
-        <w:right w:w="108" w:type="dxa"/>
-      </w:tblCellMar>
-    </w:tblPr>
   </w:style>
 </w:styles>
 </file>
 
 <file path=word/theme/theme1.xml><?xml version="1.0" encoding="utf-8"?>
-<a:theme xmlns:a="http://schemas.openxmlformats.org/drawingml/2006/main" xmlns:r="http://schemas.openxmlformats.org/officeDocument/2006/relationships" name="Office Theme">
+<a:theme xmlns:a="http://schemas.openxmlformats.org/drawingml/2006/main" name="Office Theme">
   <a:themeElements>
     <a:clrScheme name="Office">
       <a:dk1>
@@ -3503,12 +3400,12 @@
     </a:clrScheme>
     <a:fontScheme name="Office">
       <a:majorFont>
-        <a:latin typeface="Aptos Display" panose="02110004020202020204" pitchFamily="0" charset="1"/>
+        <a:latin typeface="Aptos Display" panose="02110004020202020204"/>
         <a:ea typeface=""/>
         <a:cs typeface=""/>
       </a:majorFont>
       <a:minorFont>
-        <a:latin typeface="Aptos" panose="02110004020202020204" pitchFamily="0" charset="1"/>
+        <a:latin typeface="Aptos" panose="02110004020202020204"/>
         <a:ea typeface=""/>
         <a:cs typeface=""/>
       </a:minorFont>
@@ -3540,7 +3437,7 @@
             </a:gs>
           </a:gsLst>
           <a:lin ang="5400000" scaled="0"/>
-          <a:tileRect l="0" t="0" r="0" b="0"/>
+          <a:tileRect/>
         </a:gradFill>
         <a:gradFill>
           <a:gsLst>
@@ -3564,7 +3461,7 @@
             </a:gs>
           </a:gsLst>
           <a:lin ang="5400000" scaled="0"/>
-          <a:tileRect l="0" t="0" r="0" b="0"/>
+          <a:tileRect/>
         </a:gradFill>
       </a:fillStyleLst>
       <a:lnStyleLst>
@@ -3624,10 +3521,12 @@
             </a:gs>
           </a:gsLst>
           <a:lin ang="5400000" scaled="0"/>
-          <a:tileRect l="0" t="0" r="0" b="0"/>
+          <a:tileRect/>
         </a:gradFill>
       </a:bgFillStyleLst>
     </a:fmtScheme>
   </a:themeElements>
+  <a:objectDefaults/>
+  <a:extraClrSchemeLst/>
 </a:theme>
 </file>
</xml_diff>

<commit_message>
Add api path to frontend (WIP)
</commit_message>
<xml_diff>
--- a/specification_breakdown.docx
+++ b/specification_breakdown.docx
@@ -1161,6 +1161,20 @@
         <w:rPr>
           <w:rFonts w:eastAsia="Times New Roman"/>
         </w:rPr>
+        <w:t>post addTicketType() /api/ticket-type</w:t>
+      </w:r>
+    </w:p>
+    <w:p>
+      <w:pPr>
+        <w:spacing w:beforeAutospacing="1" w:afterAutospacing="1"/>
+        <w:rPr>
+          <w:rFonts w:eastAsia="Times New Roman"/>
+        </w:rPr>
+      </w:pPr>
+      <w:r>
+        <w:rPr>
+          <w:rFonts w:eastAsia="Times New Roman"/>
+        </w:rPr>
         <w:t>get viewTickets(ticketID) → ticket /api/tickets/{id}</w:t>
       </w:r>
     </w:p>
@@ -1429,7 +1443,6 @@
         <w:rPr>
           <w:rFonts w:eastAsia="Times New Roman"/>
         </w:rPr>
-        <w:lastRenderedPageBreak/>
         <w:t>add lazy loading for attachment, if we have time later</w:t>
       </w:r>
     </w:p>

</xml_diff>

<commit_message>
WIP: change put /tickets/id api
</commit_message>
<xml_diff>
--- a/specification_breakdown.docx
+++ b/specification_breakdown.docx
@@ -1,14 +1,9 @@
 
 <file path=word/document.xml><?xml version="1.0" encoding="utf-8"?>
-<w:document xmlns:o="urn:schemas-microsoft-com:office:office" xmlns:r="http://schemas.openxmlformats.org/officeDocument/2006/relationships" xmlns:v="urn:schemas-microsoft-com:vml" xmlns:w="http://schemas.openxmlformats.org/wordprocessingml/2006/main" xmlns:w10="urn:schemas-microsoft-com:office:word" xmlns:wp="http://schemas.openxmlformats.org/drawingml/2006/wordprocessingDrawing" xmlns:pic="http://schemas.openxmlformats.org/drawingml/2006/picture" xmlns:wps="http://schemas.microsoft.com/office/word/2010/wordprocessingShape" xmlns:wpg="http://schemas.microsoft.com/office/word/2010/wordprocessingGroup" xmlns:mc="http://schemas.openxmlformats.org/markup-compatibility/2006" xmlns:wp14="http://schemas.microsoft.com/office/word/2010/wordprocessingDrawing" xmlns:w14="http://schemas.microsoft.com/office/word/2010/wordml" xmlns:w15="http://schemas.microsoft.com/office/word/2012/wordml" mc:Ignorable="w14 wp14 w15">
+<w:document xmlns:wpc="http://schemas.microsoft.com/office/word/2010/wordprocessingCanvas" xmlns:cx="http://schemas.microsoft.com/office/drawing/2014/chartex" xmlns:cx1="http://schemas.microsoft.com/office/drawing/2015/9/8/chartex" xmlns:cx2="http://schemas.microsoft.com/office/drawing/2015/10/21/chartex" xmlns:cx3="http://schemas.microsoft.com/office/drawing/2016/5/9/chartex" xmlns:cx4="http://schemas.microsoft.com/office/drawing/2016/5/10/chartex" xmlns:cx5="http://schemas.microsoft.com/office/drawing/2016/5/11/chartex" xmlns:cx6="http://schemas.microsoft.com/office/drawing/2016/5/12/chartex" xmlns:cx7="http://schemas.microsoft.com/office/drawing/2016/5/13/chartex" xmlns:cx8="http://schemas.microsoft.com/office/drawing/2016/5/14/chartex" xmlns:mc="http://schemas.openxmlformats.org/markup-compatibility/2006" xmlns:aink="http://schemas.microsoft.com/office/drawing/2016/ink" xmlns:am3d="http://schemas.microsoft.com/office/drawing/2017/model3d" xmlns:o="urn:schemas-microsoft-com:office:office" xmlns:oel="http://schemas.microsoft.com/office/2019/extlst" xmlns:r="http://schemas.openxmlformats.org/officeDocument/2006/relationships" xmlns:m="http://schemas.openxmlformats.org/officeDocument/2006/math" xmlns:v="urn:schemas-microsoft-com:vml" xmlns:wp14="http://schemas.microsoft.com/office/word/2010/wordprocessingDrawing" xmlns:wp="http://schemas.openxmlformats.org/drawingml/2006/wordprocessingDrawing" xmlns:w10="urn:schemas-microsoft-com:office:word" xmlns:w="http://schemas.openxmlformats.org/wordprocessingml/2006/main" xmlns:w14="http://schemas.microsoft.com/office/word/2010/wordml" xmlns:w15="http://schemas.microsoft.com/office/word/2012/wordml" xmlns:w16cex="http://schemas.microsoft.com/office/word/2018/wordml/cex" xmlns:w16cid="http://schemas.microsoft.com/office/word/2016/wordml/cid" xmlns:w16="http://schemas.microsoft.com/office/word/2018/wordml" xmlns:w16du="http://schemas.microsoft.com/office/word/2023/wordml/word16du" xmlns:w16sdtdh="http://schemas.microsoft.com/office/word/2020/wordml/sdtdatahash" xmlns:w16sdtfl="http://schemas.microsoft.com/office/word/2024/wordml/sdtformatlock" xmlns:w16se="http://schemas.microsoft.com/office/word/2015/wordml/symex" xmlns:wpg="http://schemas.microsoft.com/office/word/2010/wordprocessingGroup" xmlns:wpi="http://schemas.microsoft.com/office/word/2010/wordprocessingInk" xmlns:wne="http://schemas.microsoft.com/office/word/2006/wordml" xmlns:wps="http://schemas.microsoft.com/office/word/2010/wordprocessingShape" mc:Ignorable="w14 w15 w16se w16cid w16 w16cex w16sdtdh w16sdtfl w16du wp14">
   <w:body>
     <w:p>
-      <w:pPr>
-        <w:pStyle w:val="Normal"/>
-        <w:rPr/>
-      </w:pPr>
-      <w:r>
-        <w:rPr/>
+      <w:r>
         <w:t>Ticket:</w:t>
       </w:r>
     </w:p>
@@ -19,10 +14,8 @@
           <w:ilvl w:val="0"/>
           <w:numId w:val="3"/>
         </w:numPr>
-        <w:rPr/>
-      </w:pPr>
-      <w:r>
-        <w:rPr/>
+      </w:pPr>
+      <w:r>
         <w:t>Người dùng</w:t>
       </w:r>
     </w:p>
@@ -33,7 +26,7 @@
           <w:ilvl w:val="1"/>
           <w:numId w:val="3"/>
         </w:numPr>
-        <w:spacing w:before="0" w:after="0"/>
+        <w:spacing w:after="0"/>
         <w:rPr>
           <w:rFonts w:eastAsia="Times New Roman"/>
         </w:rPr>
@@ -52,7 +45,7 @@
           <w:ilvl w:val="1"/>
           <w:numId w:val="3"/>
         </w:numPr>
-        <w:spacing w:before="0" w:after="0"/>
+        <w:spacing w:after="0"/>
         <w:rPr>
           <w:rFonts w:eastAsia="Times New Roman"/>
         </w:rPr>
@@ -71,7 +64,7 @@
           <w:ilvl w:val="1"/>
           <w:numId w:val="3"/>
         </w:numPr>
-        <w:spacing w:before="0" w:after="0"/>
+        <w:spacing w:after="0"/>
         <w:rPr>
           <w:rFonts w:eastAsia="Times New Roman"/>
         </w:rPr>
@@ -90,7 +83,7 @@
           <w:ilvl w:val="1"/>
           <w:numId w:val="3"/>
         </w:numPr>
-        <w:spacing w:before="0" w:after="0"/>
+        <w:spacing w:after="0"/>
         <w:rPr>
           <w:rFonts w:eastAsia="Times New Roman"/>
         </w:rPr>
@@ -109,7 +102,7 @@
           <w:ilvl w:val="1"/>
           <w:numId w:val="3"/>
         </w:numPr>
-        <w:spacing w:before="0" w:after="0"/>
+        <w:spacing w:after="0"/>
         <w:rPr>
           <w:rFonts w:eastAsia="Times New Roman"/>
         </w:rPr>
@@ -128,7 +121,7 @@
           <w:ilvl w:val="0"/>
           <w:numId w:val="3"/>
         </w:numPr>
-        <w:spacing w:before="0" w:after="0"/>
+        <w:spacing w:after="0"/>
         <w:rPr>
           <w:rFonts w:eastAsia="Times New Roman"/>
         </w:rPr>
@@ -147,13 +140,12 @@
           <w:ilvl w:val="1"/>
           <w:numId w:val="3"/>
         </w:numPr>
-        <w:spacing w:before="0" w:after="0"/>
-        <w:rPr>
-          <w:rFonts w:eastAsia="Times New Roman"/>
-        </w:rPr>
-      </w:pPr>
-      <w:r>
-        <w:rPr/>
+        <w:spacing w:after="0"/>
+        <w:rPr>
+          <w:rFonts w:eastAsia="Times New Roman"/>
+        </w:rPr>
+      </w:pPr>
+      <w:r>
         <w:t>Đơn vị/phòng ban</w:t>
       </w:r>
     </w:p>
@@ -164,7 +156,7 @@
           <w:ilvl w:val="1"/>
           <w:numId w:val="3"/>
         </w:numPr>
-        <w:spacing w:before="0" w:after="0"/>
+        <w:spacing w:after="0"/>
         <w:rPr>
           <w:rFonts w:eastAsia="Times New Roman"/>
         </w:rPr>
@@ -183,7 +175,7 @@
           <w:ilvl w:val="1"/>
           <w:numId w:val="3"/>
         </w:numPr>
-        <w:spacing w:before="0" w:after="0"/>
+        <w:spacing w:after="0"/>
         <w:rPr>
           <w:rFonts w:eastAsia="Times New Roman"/>
         </w:rPr>
@@ -202,7 +194,7 @@
           <w:ilvl w:val="1"/>
           <w:numId w:val="3"/>
         </w:numPr>
-        <w:spacing w:before="0" w:after="0"/>
+        <w:spacing w:after="0"/>
         <w:rPr>
           <w:rFonts w:eastAsia="Times New Roman"/>
         </w:rPr>
@@ -221,7 +213,7 @@
           <w:ilvl w:val="1"/>
           <w:numId w:val="3"/>
         </w:numPr>
-        <w:spacing w:before="0" w:after="0"/>
+        <w:spacing w:after="0"/>
         <w:rPr>
           <w:rFonts w:eastAsia="Times New Roman"/>
         </w:rPr>
@@ -240,7 +232,7 @@
           <w:ilvl w:val="1"/>
           <w:numId w:val="3"/>
         </w:numPr>
-        <w:spacing w:before="0" w:after="0"/>
+        <w:spacing w:after="0"/>
         <w:rPr>
           <w:rFonts w:eastAsia="Times New Roman"/>
         </w:rPr>
@@ -259,7 +251,7 @@
           <w:ilvl w:val="0"/>
           <w:numId w:val="3"/>
         </w:numPr>
-        <w:spacing w:before="0" w:after="0"/>
+        <w:spacing w:after="0"/>
         <w:rPr>
           <w:rFonts w:eastAsia="Times New Roman"/>
         </w:rPr>
@@ -278,7 +270,7 @@
           <w:ilvl w:val="1"/>
           <w:numId w:val="3"/>
         </w:numPr>
-        <w:spacing w:before="0" w:after="0"/>
+        <w:spacing w:after="0"/>
         <w:rPr>
           <w:rFonts w:eastAsia="Times New Roman"/>
         </w:rPr>
@@ -297,7 +289,7 @@
           <w:ilvl w:val="1"/>
           <w:numId w:val="3"/>
         </w:numPr>
-        <w:spacing w:before="0" w:after="0"/>
+        <w:spacing w:after="0"/>
         <w:rPr>
           <w:rFonts w:eastAsia="Times New Roman"/>
         </w:rPr>
@@ -316,7 +308,7 @@
           <w:ilvl w:val="1"/>
           <w:numId w:val="3"/>
         </w:numPr>
-        <w:spacing w:before="0" w:after="0"/>
+        <w:spacing w:after="0"/>
         <w:rPr>
           <w:rFonts w:eastAsia="Times New Roman"/>
         </w:rPr>
@@ -335,7 +327,7 @@
           <w:ilvl w:val="1"/>
           <w:numId w:val="3"/>
         </w:numPr>
-        <w:spacing w:before="0" w:afterAutospacing="1"/>
+        <w:spacing w:afterAutospacing="1"/>
         <w:rPr>
           <w:rFonts w:eastAsia="Times New Roman"/>
         </w:rPr>
@@ -349,7 +341,6 @@
     </w:p>
     <w:p>
       <w:pPr>
-        <w:pStyle w:val="Normal"/>
         <w:spacing w:beforeAutospacing="1" w:afterAutospacing="1"/>
         <w:rPr>
           <w:rFonts w:eastAsia="Times New Roman"/>
@@ -378,13 +369,7 @@
         <w:rPr>
           <w:rFonts w:eastAsia="Times New Roman"/>
         </w:rPr>
-        <w:t>“</w:t>
-      </w:r>
-      <w:r>
-        <w:rPr>
-          <w:rFonts w:eastAsia="Times New Roman"/>
-        </w:rPr>
-        <w:t>Mới tạo” - người dùng vừa tạo ticket</w:t>
+        <w:t>“Mới tạo” - người dùng vừa tạo ticket</w:t>
       </w:r>
     </w:p>
     <w:p>
@@ -394,22 +379,16 @@
           <w:ilvl w:val="0"/>
           <w:numId w:val="3"/>
         </w:numPr>
-        <w:spacing w:before="0" w:after="0"/>
-        <w:rPr>
-          <w:rFonts w:eastAsia="Times New Roman"/>
-        </w:rPr>
-      </w:pPr>
-      <w:r>
-        <w:rPr>
-          <w:rFonts w:eastAsia="Times New Roman"/>
-        </w:rPr>
-        <w:t>“</w:t>
-      </w:r>
-      <w:r>
-        <w:rPr>
-          <w:rFonts w:eastAsia="Times New Roman"/>
-        </w:rPr>
-        <w:t>Đang xử lý” - quản trị viên cập nhập người xử lí</w:t>
+        <w:spacing w:after="0"/>
+        <w:rPr>
+          <w:rFonts w:eastAsia="Times New Roman"/>
+        </w:rPr>
+      </w:pPr>
+      <w:r>
+        <w:rPr>
+          <w:rFonts w:eastAsia="Times New Roman"/>
+        </w:rPr>
+        <w:t>“Đang xử lý” - quản trị viên cập nhập người xử lí</w:t>
       </w:r>
     </w:p>
     <w:p>
@@ -419,22 +398,16 @@
           <w:ilvl w:val="0"/>
           <w:numId w:val="3"/>
         </w:numPr>
-        <w:spacing w:before="0" w:after="0"/>
-        <w:rPr>
-          <w:rFonts w:eastAsia="Times New Roman"/>
-        </w:rPr>
-      </w:pPr>
-      <w:r>
-        <w:rPr>
-          <w:rFonts w:eastAsia="Times New Roman"/>
-        </w:rPr>
-        <w:t>“</w:t>
-      </w:r>
-      <w:r>
-        <w:rPr>
-          <w:rFonts w:eastAsia="Times New Roman"/>
-        </w:rPr>
-        <w:t>Đã xử lý xong” - người xử lí cập nhập đánh dấu đã xử lý xong</w:t>
+        <w:spacing w:after="0"/>
+        <w:rPr>
+          <w:rFonts w:eastAsia="Times New Roman"/>
+        </w:rPr>
+      </w:pPr>
+      <w:r>
+        <w:rPr>
+          <w:rFonts w:eastAsia="Times New Roman"/>
+        </w:rPr>
+        <w:t>“Đã xử lý xong” - người xử lí cập nhập đánh dấu đã xử lý xong</w:t>
       </w:r>
     </w:p>
     <w:p>
@@ -444,27 +417,20 @@
           <w:ilvl w:val="0"/>
           <w:numId w:val="3"/>
         </w:numPr>
-        <w:spacing w:before="0" w:after="0"/>
-        <w:rPr>
-          <w:rFonts w:eastAsia="Times New Roman"/>
-        </w:rPr>
-      </w:pPr>
-      <w:r>
-        <w:rPr>
-          <w:rFonts w:eastAsia="Times New Roman"/>
-        </w:rPr>
-        <w:t>“</w:t>
-      </w:r>
-      <w:r>
-        <w:rPr>
-          <w:rFonts w:eastAsia="Times New Roman"/>
-        </w:rPr>
-        <w:t>Đóng” - người dùng chấp nhận kết quả xử lí</w:t>
-      </w:r>
-    </w:p>
-    <w:p>
-      <w:pPr>
-        <w:pStyle w:val="Normal"/>
+        <w:spacing w:after="0"/>
+        <w:rPr>
+          <w:rFonts w:eastAsia="Times New Roman"/>
+        </w:rPr>
+      </w:pPr>
+      <w:r>
+        <w:rPr>
+          <w:rFonts w:eastAsia="Times New Roman"/>
+        </w:rPr>
+        <w:t>“Đóng” - người dùng chấp nhận kết quả xử lí</w:t>
+      </w:r>
+    </w:p>
+    <w:p>
+      <w:pPr>
         <w:spacing w:beforeAutospacing="1" w:afterAutospacing="1"/>
         <w:rPr>
           <w:rFonts w:eastAsia="Times New Roman"/>
@@ -503,7 +469,7 @@
           <w:ilvl w:val="0"/>
           <w:numId w:val="3"/>
         </w:numPr>
-        <w:spacing w:before="0" w:after="0"/>
+        <w:spacing w:after="0"/>
         <w:rPr>
           <w:rFonts w:eastAsia="Times New Roman"/>
         </w:rPr>
@@ -522,7 +488,7 @@
           <w:ilvl w:val="0"/>
           <w:numId w:val="3"/>
         </w:numPr>
-        <w:spacing w:before="0" w:after="0"/>
+        <w:spacing w:after="0"/>
         <w:rPr>
           <w:rFonts w:eastAsia="Times New Roman"/>
         </w:rPr>
@@ -541,7 +507,7 @@
           <w:ilvl w:val="0"/>
           <w:numId w:val="3"/>
         </w:numPr>
-        <w:spacing w:before="0" w:afterAutospacing="1"/>
+        <w:spacing w:afterAutospacing="1"/>
         <w:rPr>
           <w:rFonts w:eastAsia="Times New Roman"/>
         </w:rPr>
@@ -555,7 +521,6 @@
     </w:p>
     <w:p>
       <w:pPr>
-        <w:pStyle w:val="Normal"/>
         <w:spacing w:beforeAutospacing="1" w:afterAutospacing="1"/>
         <w:rPr>
           <w:rFonts w:eastAsia="Times New Roman"/>
@@ -580,29 +545,17 @@
           <w:rFonts w:eastAsia="Times New Roman"/>
         </w:rPr>
       </w:pPr>
-      <w:r>
-        <w:rPr>
-          <w:rFonts w:eastAsia="Times New Roman"/>
-        </w:rPr>
-      </w:r>
-    </w:p>
-    <w:p>
-      <w:pPr>
-        <w:pStyle w:val="Normal"/>
-        <w:spacing w:beforeAutospacing="1" w:afterAutospacing="1"/>
-        <w:rPr>
-          <w:rFonts w:eastAsia="Times New Roman"/>
-        </w:rPr>
-      </w:pPr>
-      <w:r>
-        <w:rPr>
-          <w:rFonts w:eastAsia="Times New Roman"/>
-        </w:rPr>
-      </w:r>
-    </w:p>
-    <w:p>
-      <w:pPr>
-        <w:pStyle w:val="Normal"/>
+    </w:p>
+    <w:p>
+      <w:pPr>
+        <w:spacing w:beforeAutospacing="1" w:afterAutospacing="1"/>
+        <w:rPr>
+          <w:rFonts w:eastAsia="Times New Roman"/>
+        </w:rPr>
+      </w:pPr>
+    </w:p>
+    <w:p>
+      <w:pPr>
         <w:spacing w:beforeAutospacing="1" w:afterAutospacing="1"/>
         <w:rPr>
           <w:rFonts w:eastAsia="Times New Roman"/>
@@ -617,7 +570,6 @@
     </w:p>
     <w:p>
       <w:pPr>
-        <w:pStyle w:val="Normal"/>
         <w:spacing w:beforeAutospacing="1" w:afterAutospacing="1"/>
         <w:rPr>
           <w:rFonts w:eastAsia="Times New Roman"/>
@@ -656,15 +608,16 @@
           <w:ilvl w:val="1"/>
           <w:numId w:val="3"/>
         </w:numPr>
-        <w:spacing w:before="0" w:after="0"/>
-        <w:rPr>
-          <w:rFonts w:eastAsia="Times New Roman"/>
-        </w:rPr>
-      </w:pPr>
-      <w:r>
-        <w:rPr>
-          <w:rFonts w:eastAsia="Times New Roman"/>
-        </w:rPr>
+        <w:spacing w:after="0"/>
+        <w:rPr>
+          <w:rFonts w:eastAsia="Times New Roman"/>
+        </w:rPr>
+      </w:pPr>
+      <w:r>
+        <w:rPr>
+          <w:rFonts w:eastAsia="Times New Roman"/>
+        </w:rPr>
+        <w:lastRenderedPageBreak/>
         <w:t>Mức ưu tiên</w:t>
       </w:r>
     </w:p>
@@ -675,10 +628,8 @@
           <w:ilvl w:val="1"/>
           <w:numId w:val="3"/>
         </w:numPr>
-        <w:rPr/>
-      </w:pPr>
-      <w:r>
-        <w:rPr/>
+      </w:pPr>
+      <w:r>
         <w:t>Tên</w:t>
       </w:r>
     </w:p>
@@ -689,7 +640,6 @@
           <w:ilvl w:val="1"/>
           <w:numId w:val="3"/>
         </w:numPr>
-        <w:rPr/>
       </w:pPr>
       <w:r>
         <w:rPr>
@@ -705,7 +655,7 @@
           <w:ilvl w:val="1"/>
           <w:numId w:val="3"/>
         </w:numPr>
-        <w:spacing w:before="0" w:afterAutospacing="1"/>
+        <w:spacing w:afterAutospacing="1"/>
         <w:rPr>
           <w:rFonts w:eastAsia="Times New Roman"/>
         </w:rPr>
@@ -719,7 +669,6 @@
     </w:p>
     <w:p>
       <w:pPr>
-        <w:pStyle w:val="Normal"/>
         <w:spacing w:beforeAutospacing="1" w:afterAutospacing="1"/>
         <w:rPr>
           <w:rFonts w:eastAsia="Times New Roman"/>
@@ -758,7 +707,7 @@
           <w:ilvl w:val="1"/>
           <w:numId w:val="3"/>
         </w:numPr>
-        <w:spacing w:before="0" w:after="0"/>
+        <w:spacing w:after="0"/>
         <w:rPr>
           <w:rFonts w:eastAsia="Times New Roman"/>
         </w:rPr>
@@ -777,7 +726,7 @@
           <w:ilvl w:val="1"/>
           <w:numId w:val="3"/>
         </w:numPr>
-        <w:spacing w:before="0" w:after="0"/>
+        <w:spacing w:after="0"/>
         <w:rPr>
           <w:rFonts w:eastAsia="Times New Roman"/>
         </w:rPr>
@@ -796,7 +745,7 @@
           <w:ilvl w:val="0"/>
           <w:numId w:val="3"/>
         </w:numPr>
-        <w:spacing w:before="0" w:after="0"/>
+        <w:spacing w:after="0"/>
         <w:rPr>
           <w:rFonts w:eastAsia="Times New Roman"/>
         </w:rPr>
@@ -815,7 +764,7 @@
           <w:ilvl w:val="1"/>
           <w:numId w:val="3"/>
         </w:numPr>
-        <w:spacing w:before="0" w:after="0"/>
+        <w:spacing w:after="0"/>
         <w:rPr>
           <w:rFonts w:eastAsia="Times New Roman"/>
         </w:rPr>
@@ -834,7 +783,7 @@
           <w:ilvl w:val="1"/>
           <w:numId w:val="3"/>
         </w:numPr>
-        <w:spacing w:before="0" w:after="0"/>
+        <w:spacing w:after="0"/>
         <w:rPr>
           <w:rFonts w:eastAsia="Times New Roman"/>
         </w:rPr>
@@ -853,7 +802,7 @@
           <w:ilvl w:val="1"/>
           <w:numId w:val="3"/>
         </w:numPr>
-        <w:spacing w:before="0" w:after="0"/>
+        <w:spacing w:after="0"/>
         <w:rPr>
           <w:rFonts w:eastAsia="Times New Roman"/>
         </w:rPr>
@@ -872,7 +821,7 @@
           <w:ilvl w:val="1"/>
           <w:numId w:val="3"/>
         </w:numPr>
-        <w:spacing w:before="0" w:afterAutospacing="1"/>
+        <w:spacing w:afterAutospacing="1"/>
         <w:rPr>
           <w:rFonts w:eastAsia="Times New Roman"/>
         </w:rPr>
@@ -886,7 +835,6 @@
     </w:p>
     <w:p>
       <w:pPr>
-        <w:pStyle w:val="Normal"/>
         <w:spacing w:beforeAutospacing="1" w:afterAutospacing="1"/>
         <w:rPr>
           <w:rFonts w:eastAsia="Times New Roman" w:cs="Times New Roman"/>
@@ -928,7 +876,7 @@
           <w:ilvl w:val="0"/>
           <w:numId w:val="3"/>
         </w:numPr>
-        <w:spacing w:before="0" w:after="0"/>
+        <w:spacing w:after="0"/>
         <w:rPr>
           <w:rFonts w:eastAsia="Times New Roman"/>
         </w:rPr>
@@ -947,7 +895,7 @@
           <w:ilvl w:val="0"/>
           <w:numId w:val="3"/>
         </w:numPr>
-        <w:spacing w:before="0" w:after="0"/>
+        <w:spacing w:after="0"/>
         <w:rPr>
           <w:rFonts w:eastAsia="Times New Roman"/>
         </w:rPr>
@@ -966,7 +914,7 @@
           <w:ilvl w:val="0"/>
           <w:numId w:val="3"/>
         </w:numPr>
-        <w:spacing w:before="0" w:after="0"/>
+        <w:spacing w:after="0"/>
         <w:rPr>
           <w:rFonts w:eastAsia="Times New Roman"/>
         </w:rPr>
@@ -985,7 +933,7 @@
           <w:ilvl w:val="0"/>
           <w:numId w:val="3"/>
         </w:numPr>
-        <w:spacing w:before="0" w:afterAutospacing="1"/>
+        <w:spacing w:afterAutospacing="1"/>
         <w:rPr>
           <w:rFonts w:eastAsia="Times New Roman"/>
         </w:rPr>
@@ -999,21 +947,14 @@
     </w:p>
     <w:p>
       <w:pPr>
-        <w:pStyle w:val="Normal"/>
-        <w:spacing w:beforeAutospacing="1" w:afterAutospacing="1"/>
-        <w:rPr>
-          <w:rFonts w:eastAsia="Times New Roman"/>
-        </w:rPr>
-      </w:pPr>
-      <w:r>
-        <w:rPr>
-          <w:rFonts w:eastAsia="Times New Roman"/>
-        </w:rPr>
-      </w:r>
-    </w:p>
-    <w:p>
-      <w:pPr>
-        <w:pStyle w:val="Normal"/>
+        <w:spacing w:beforeAutospacing="1" w:afterAutospacing="1"/>
+        <w:rPr>
+          <w:rFonts w:eastAsia="Times New Roman"/>
+        </w:rPr>
+      </w:pPr>
+    </w:p>
+    <w:p>
+      <w:pPr>
         <w:spacing w:beforeAutospacing="1" w:afterAutospacing="1"/>
         <w:rPr>
           <w:rFonts w:eastAsia="Times New Roman"/>
@@ -1047,7 +988,6 @@
     </w:p>
     <w:p>
       <w:pPr>
-        <w:pStyle w:val="Normal"/>
         <w:spacing w:beforeAutospacing="1" w:afterAutospacing="1"/>
         <w:rPr>
           <w:rFonts w:eastAsia="Times New Roman"/>
@@ -1062,7 +1002,6 @@
     </w:p>
     <w:p>
       <w:pPr>
-        <w:pStyle w:val="Normal"/>
         <w:spacing w:beforeAutospacing="1" w:afterAutospacing="1"/>
         <w:rPr>
           <w:rFonts w:eastAsia="Times New Roman"/>
@@ -1077,7 +1016,6 @@
     </w:p>
     <w:p>
       <w:pPr>
-        <w:pStyle w:val="Normal"/>
         <w:spacing w:beforeAutospacing="1" w:afterAutospacing="1"/>
         <w:rPr>
           <w:rFonts w:eastAsia="Times New Roman"/>
@@ -1092,21 +1030,14 @@
     </w:p>
     <w:p>
       <w:pPr>
-        <w:pStyle w:val="Normal"/>
-        <w:spacing w:beforeAutospacing="1" w:afterAutospacing="1"/>
-        <w:rPr>
-          <w:rFonts w:eastAsia="Times New Roman"/>
-        </w:rPr>
-      </w:pPr>
-      <w:r>
-        <w:rPr>
-          <w:rFonts w:eastAsia="Times New Roman"/>
-        </w:rPr>
-      </w:r>
-    </w:p>
-    <w:p>
-      <w:pPr>
-        <w:pStyle w:val="Normal"/>
+        <w:spacing w:beforeAutospacing="1" w:afterAutospacing="1"/>
+        <w:rPr>
+          <w:rFonts w:eastAsia="Times New Roman"/>
+        </w:rPr>
+      </w:pPr>
+    </w:p>
+    <w:p>
+      <w:pPr>
         <w:spacing w:beforeAutospacing="1" w:afterAutospacing="1"/>
         <w:rPr>
           <w:rFonts w:eastAsia="Times New Roman"/>
@@ -1121,7 +1052,6 @@
     </w:p>
     <w:p>
       <w:pPr>
-        <w:pStyle w:val="Normal"/>
         <w:spacing w:beforeAutospacing="1" w:afterAutospacing="1"/>
         <w:rPr>
           <w:rFonts w:eastAsia="Times New Roman"/>
@@ -1136,7 +1066,6 @@
     </w:p>
     <w:p>
       <w:pPr>
-        <w:pStyle w:val="Normal"/>
         <w:spacing w:beforeAutospacing="1" w:afterAutospacing="1"/>
         <w:rPr>
           <w:rFonts w:eastAsia="Times New Roman"/>
@@ -1151,10 +1080,8 @@
     </w:p>
     <w:p>
       <w:pPr>
-        <w:pStyle w:val="Normal"/>
         <w:tabs>
-          <w:tab w:val="clear" w:pos="720"/>
-          <w:tab w:val="left" w:pos="6318" w:leader="none"/>
+          <w:tab w:val="left" w:pos="6318"/>
         </w:tabs>
         <w:spacing w:beforeAutospacing="1" w:afterAutospacing="1"/>
         <w:rPr>
@@ -1165,12 +1092,12 @@
         <w:rPr>
           <w:rFonts w:eastAsia="Times New Roman"/>
         </w:rPr>
+        <w:lastRenderedPageBreak/>
         <w:t>post create ticket(Title, Description, Priority, Type (Optional), File (Optional)) → void /api/tickets</w:t>
       </w:r>
     </w:p>
     <w:p>
       <w:pPr>
-        <w:pStyle w:val="Normal"/>
         <w:spacing w:beforeAutospacing="1" w:afterAutospacing="1"/>
         <w:rPr>
           <w:rFonts w:eastAsia="Times New Roman"/>
@@ -1185,7 +1112,6 @@
     </w:p>
     <w:p>
       <w:pPr>
-        <w:pStyle w:val="Normal"/>
         <w:spacing w:beforeAutospacing="1" w:afterAutospacing="1"/>
         <w:rPr>
           <w:rFonts w:eastAsia="Times New Roman"/>
@@ -1200,7 +1126,6 @@
     </w:p>
     <w:p>
       <w:pPr>
-        <w:pStyle w:val="Normal"/>
         <w:spacing w:beforeAutospacing="1" w:afterAutospacing="1"/>
         <w:rPr>
           <w:rFonts w:eastAsia="Times New Roman"/>
@@ -1215,7 +1140,6 @@
     </w:p>
     <w:p>
       <w:pPr>
-        <w:pStyle w:val="Normal"/>
         <w:spacing w:beforeAutospacing="1" w:afterAutospacing="1"/>
         <w:rPr>
           <w:rFonts w:eastAsia="Times New Roman"/>
@@ -1230,7 +1154,6 @@
     </w:p>
     <w:p>
       <w:pPr>
-        <w:pStyle w:val="Normal"/>
         <w:spacing w:beforeAutospacing="1" w:afterAutospacing="1"/>
         <w:rPr>
           <w:rFonts w:eastAsia="Times New Roman"/>
@@ -1245,22 +1168,44 @@
     </w:p>
     <w:p>
       <w:pPr>
-        <w:pStyle w:val="Normal"/>
-        <w:spacing w:beforeAutospacing="1" w:afterAutospacing="1"/>
-        <w:rPr>
-          <w:rFonts w:eastAsia="Times New Roman"/>
-        </w:rPr>
-      </w:pPr>
-      <w:r>
-        <w:rPr>
-          <w:rFonts w:eastAsia="Times New Roman"/>
-        </w:rPr>
-        <w:t>put updateTicketStatus(ticketID, statusCode) /api/tickets/{id}</w:t>
-      </w:r>
-    </w:p>
-    <w:p>
-      <w:pPr>
-        <w:pStyle w:val="Normal"/>
+        <w:spacing w:beforeAutospacing="1" w:afterAutospacing="1"/>
+        <w:rPr>
+          <w:rFonts w:eastAsia="Times New Roman"/>
+        </w:rPr>
+      </w:pPr>
+      <w:r>
+        <w:rPr>
+          <w:rFonts w:eastAsia="Times New Roman"/>
+        </w:rPr>
+        <w:t>put updateTicket</w:t>
+      </w:r>
+      <w:r>
+        <w:rPr>
+          <w:rFonts w:eastAsia="Times New Roman"/>
+        </w:rPr>
+        <w:t xml:space="preserve"> </w:t>
+      </w:r>
+      <w:r>
+        <w:rPr>
+          <w:rFonts w:eastAsia="Times New Roman"/>
+        </w:rPr>
+        <w:t xml:space="preserve">(ticketID, </w:t>
+      </w:r>
+      <w:r>
+        <w:rPr>
+          <w:rFonts w:eastAsia="Times New Roman"/>
+        </w:rPr>
+        <w:t>ticket</w:t>
+      </w:r>
+      <w:r>
+        <w:rPr>
+          <w:rFonts w:eastAsia="Times New Roman"/>
+        </w:rPr>
+        <w:t>) /api/tickets/{id}</w:t>
+      </w:r>
+    </w:p>
+    <w:p>
+      <w:pPr>
         <w:spacing w:beforeAutospacing="1" w:afterAutospacing="1"/>
         <w:rPr>
           <w:rFonts w:eastAsia="Times New Roman"/>
@@ -1275,7 +1220,6 @@
     </w:p>
     <w:p>
       <w:pPr>
-        <w:pStyle w:val="Normal"/>
         <w:spacing w:beforeAutospacing="1" w:afterAutospacing="1"/>
         <w:rPr>
           <w:rFonts w:eastAsia="Times New Roman"/>
@@ -1290,7 +1234,6 @@
     </w:p>
     <w:p>
       <w:pPr>
-        <w:pStyle w:val="Normal"/>
         <w:spacing w:beforeAutospacing="1" w:afterAutospacing="1"/>
         <w:rPr>
           <w:rFonts w:eastAsia="Times New Roman"/>
@@ -1305,7 +1248,6 @@
     </w:p>
     <w:p>
       <w:pPr>
-        <w:pStyle w:val="Normal"/>
         <w:spacing w:beforeAutospacing="1" w:afterAutospacing="1"/>
         <w:rPr>
           <w:rFonts w:eastAsia="Times New Roman"/>
@@ -1320,7 +1262,6 @@
     </w:p>
     <w:p>
       <w:pPr>
-        <w:pStyle w:val="Normal"/>
         <w:spacing w:beforeAutospacing="1" w:afterAutospacing="1"/>
         <w:rPr>
           <w:rFonts w:eastAsia="Times New Roman"/>
@@ -1335,7 +1276,6 @@
     </w:p>
     <w:p>
       <w:pPr>
-        <w:pStyle w:val="Normal"/>
         <w:spacing w:beforeAutospacing="1" w:afterAutospacing="1"/>
         <w:rPr>
           <w:rFonts w:eastAsia="Times New Roman"/>
@@ -1350,7 +1290,6 @@
     </w:p>
     <w:p>
       <w:pPr>
-        <w:pStyle w:val="Normal"/>
         <w:spacing w:beforeAutospacing="1" w:afterAutospacing="1"/>
         <w:rPr>
           <w:rFonts w:eastAsia="Times New Roman"/>
@@ -1365,7 +1304,6 @@
     </w:p>
     <w:p>
       <w:pPr>
-        <w:pStyle w:val="Normal"/>
         <w:spacing w:beforeAutospacing="1" w:afterAutospacing="1"/>
         <w:rPr>
           <w:rFonts w:eastAsia="Times New Roman"/>
@@ -1380,7 +1318,6 @@
     </w:p>
     <w:p>
       <w:pPr>
-        <w:pStyle w:val="Normal"/>
         <w:spacing w:beforeAutospacing="1" w:afterAutospacing="1"/>
         <w:rPr>
           <w:rFonts w:eastAsia="Times New Roman"/>
@@ -1395,7 +1332,6 @@
     </w:p>
     <w:p>
       <w:pPr>
-        <w:pStyle w:val="Normal"/>
         <w:spacing w:beforeAutospacing="1" w:afterAutospacing="1"/>
         <w:rPr>
           <w:rFonts w:eastAsia="Times New Roman"/>
@@ -1410,7 +1346,6 @@
     </w:p>
     <w:p>
       <w:pPr>
-        <w:pStyle w:val="Normal"/>
         <w:spacing w:beforeAutospacing="1" w:afterAutospacing="1"/>
         <w:rPr>
           <w:rFonts w:eastAsia="Times New Roman"/>
@@ -1425,7 +1360,6 @@
     </w:p>
     <w:p>
       <w:pPr>
-        <w:pStyle w:val="Normal"/>
         <w:spacing w:beforeAutospacing="1" w:afterAutospacing="1"/>
         <w:rPr>
           <w:rFonts w:eastAsia="Times New Roman"/>
@@ -1440,7 +1374,6 @@
     </w:p>
     <w:p>
       <w:pPr>
-        <w:pStyle w:val="Normal"/>
         <w:spacing w:beforeAutospacing="1" w:afterAutospacing="1"/>
         <w:rPr>
           <w:rFonts w:eastAsia="Times New Roman"/>
@@ -1455,21 +1388,14 @@
     </w:p>
     <w:p>
       <w:pPr>
-        <w:pStyle w:val="Normal"/>
-        <w:spacing w:beforeAutospacing="1" w:afterAutospacing="1"/>
-        <w:rPr>
-          <w:rFonts w:eastAsia="Times New Roman"/>
-        </w:rPr>
-      </w:pPr>
-      <w:r>
-        <w:rPr>
-          <w:rFonts w:eastAsia="Times New Roman"/>
-        </w:rPr>
-      </w:r>
-    </w:p>
-    <w:p>
-      <w:pPr>
-        <w:pStyle w:val="Normal"/>
+        <w:spacing w:beforeAutospacing="1" w:afterAutospacing="1"/>
+        <w:rPr>
+          <w:rFonts w:eastAsia="Times New Roman"/>
+        </w:rPr>
+      </w:pPr>
+    </w:p>
+    <w:p>
+      <w:pPr>
         <w:spacing w:beforeAutospacing="1" w:afterAutospacing="1"/>
         <w:rPr>
           <w:rFonts w:eastAsia="Times New Roman"/>
@@ -1484,7 +1410,6 @@
     </w:p>
     <w:p>
       <w:pPr>
-        <w:pStyle w:val="Normal"/>
         <w:spacing w:beforeAutospacing="1" w:afterAutospacing="1"/>
         <w:rPr>
           <w:rFonts w:eastAsia="Times New Roman"/>
@@ -1499,7 +1424,6 @@
     </w:p>
     <w:p>
       <w:pPr>
-        <w:pStyle w:val="Normal"/>
         <w:spacing w:beforeAutospacing="1" w:afterAutospacing="1"/>
         <w:rPr>
           <w:rFonts w:eastAsia="Times New Roman"/>
@@ -1514,21 +1438,14 @@
     </w:p>
     <w:p>
       <w:pPr>
-        <w:pStyle w:val="Normal"/>
-        <w:spacing w:beforeAutospacing="1" w:afterAutospacing="1"/>
-        <w:rPr>
-          <w:rFonts w:eastAsia="Times New Roman"/>
-        </w:rPr>
-      </w:pPr>
-      <w:r>
-        <w:rPr>
-          <w:rFonts w:eastAsia="Times New Roman"/>
-        </w:rPr>
-      </w:r>
-    </w:p>
-    <w:p>
-      <w:pPr>
-        <w:pStyle w:val="Normal"/>
+        <w:spacing w:beforeAutospacing="1" w:afterAutospacing="1"/>
+        <w:rPr>
+          <w:rFonts w:eastAsia="Times New Roman"/>
+        </w:rPr>
+      </w:pPr>
+    </w:p>
+    <w:p>
+      <w:pPr>
         <w:spacing w:beforeAutospacing="1" w:afterAutospacing="1"/>
         <w:rPr>
           <w:rFonts w:eastAsia="Times New Roman"/>
@@ -1543,7 +1460,6 @@
     </w:p>
     <w:p>
       <w:pPr>
-        <w:pStyle w:val="Normal"/>
         <w:spacing w:beforeAutospacing="1" w:afterAutospacing="1"/>
         <w:rPr>
           <w:rFonts w:eastAsia="Times New Roman"/>
@@ -1558,7 +1474,6 @@
     </w:p>
     <w:p>
       <w:pPr>
-        <w:pStyle w:val="Normal"/>
         <w:spacing w:beforeAutospacing="1" w:afterAutospacing="1"/>
         <w:rPr>
           <w:rFonts w:eastAsia="Times New Roman"/>
@@ -1573,21 +1488,14 @@
     </w:p>
     <w:p>
       <w:pPr>
-        <w:pStyle w:val="Normal"/>
-        <w:spacing w:beforeAutospacing="1" w:afterAutospacing="1"/>
-        <w:rPr>
-          <w:rFonts w:eastAsia="Times New Roman"/>
-        </w:rPr>
-      </w:pPr>
-      <w:r>
-        <w:rPr>
-          <w:rFonts w:eastAsia="Times New Roman"/>
-        </w:rPr>
-      </w:r>
-    </w:p>
-    <w:p>
-      <w:pPr>
-        <w:pStyle w:val="Normal"/>
+        <w:spacing w:beforeAutospacing="1" w:afterAutospacing="1"/>
+        <w:rPr>
+          <w:rFonts w:eastAsia="Times New Roman"/>
+        </w:rPr>
+      </w:pPr>
+    </w:p>
+    <w:p>
+      <w:pPr>
         <w:spacing w:beforeAutospacing="1" w:afterAutospacing="1"/>
         <w:rPr>
           <w:rFonts w:eastAsia="Times New Roman"/>
@@ -1602,7 +1510,6 @@
     </w:p>
     <w:p>
       <w:pPr>
-        <w:pStyle w:val="Normal"/>
         <w:spacing w:beforeAutospacing="1" w:afterAutospacing="1"/>
         <w:rPr>
           <w:rFonts w:eastAsia="Times New Roman"/>
@@ -1617,21 +1524,14 @@
     </w:p>
     <w:p>
       <w:pPr>
-        <w:pStyle w:val="Normal"/>
-        <w:spacing w:beforeAutospacing="1" w:afterAutospacing="1"/>
-        <w:rPr>
-          <w:rFonts w:eastAsia="Times New Roman"/>
-        </w:rPr>
-      </w:pPr>
-      <w:r>
-        <w:rPr>
-          <w:rFonts w:eastAsia="Times New Roman"/>
-        </w:rPr>
-      </w:r>
-    </w:p>
-    <w:p>
-      <w:pPr>
-        <w:pStyle w:val="Normal"/>
+        <w:spacing w:beforeAutospacing="1" w:afterAutospacing="1"/>
+        <w:rPr>
+          <w:rFonts w:eastAsia="Times New Roman"/>
+        </w:rPr>
+      </w:pPr>
+    </w:p>
+    <w:p>
+      <w:pPr>
         <w:spacing w:beforeAutospacing="1" w:afterAutospacing="1"/>
         <w:rPr>
           <w:rFonts w:eastAsia="Times New Roman"/>
@@ -1670,7 +1570,7 @@
           <w:ilvl w:val="0"/>
           <w:numId w:val="3"/>
         </w:numPr>
-        <w:spacing w:before="0" w:after="0"/>
+        <w:spacing w:after="0"/>
         <w:rPr>
           <w:rFonts w:eastAsia="Times New Roman"/>
         </w:rPr>
@@ -1689,7 +1589,7 @@
           <w:ilvl w:val="0"/>
           <w:numId w:val="3"/>
         </w:numPr>
-        <w:spacing w:before="0" w:after="0"/>
+        <w:spacing w:after="0"/>
         <w:rPr>
           <w:rFonts w:eastAsia="Times New Roman"/>
         </w:rPr>
@@ -1708,7 +1608,7 @@
           <w:ilvl w:val="0"/>
           <w:numId w:val="3"/>
         </w:numPr>
-        <w:spacing w:before="0" w:afterAutospacing="1"/>
+        <w:spacing w:afterAutospacing="1"/>
         <w:rPr>
           <w:rFonts w:eastAsia="Times New Roman"/>
         </w:rPr>
@@ -1722,16 +1622,18 @@
     </w:p>
     <w:p>
       <w:pPr>
-        <w:pStyle w:val="Normal"/>
-        <w:spacing w:beforeAutospacing="1" w:afterAutospacing="1"/>
-        <w:rPr>
-          <w:rFonts w:eastAsia="Times New Roman"/>
-        </w:rPr>
-      </w:pPr>
-      <w:r>
-        <w:rPr/>
+        <w:spacing w:beforeAutospacing="1" w:afterAutospacing="1"/>
+        <w:rPr>
+          <w:rFonts w:eastAsia="Times New Roman"/>
+        </w:rPr>
+      </w:pPr>
+      <w:r>
+        <w:rPr>
+          <w:noProof/>
+        </w:rPr>
+        <w:lastRenderedPageBreak/>
         <w:drawing>
-          <wp:inline distT="0" distB="0" distL="0" distR="0">
+          <wp:inline distT="0" distB="0" distL="0" distR="0" wp14:anchorId="6F8AB910" wp14:editId="37EA81C4">
             <wp:extent cx="5731510" cy="4566285"/>
             <wp:effectExtent l="0" t="0" r="0" b="0"/>
             <wp:docPr id="1" name="Picture 1"/>
@@ -1748,7 +1650,7 @@
                     </pic:cNvPicPr>
                   </pic:nvPicPr>
                   <pic:blipFill>
-                    <a:blip r:embed="rId2"/>
+                    <a:blip r:embed="rId5"/>
                     <a:stretch>
                       <a:fillRect/>
                     </a:stretch>
@@ -1778,7 +1680,6 @@
     </w:p>
     <w:p>
       <w:pPr>
-        <w:pStyle w:val="Normal"/>
         <w:spacing w:beforeAutospacing="1" w:afterAutospacing="1"/>
         <w:rPr>
           <w:rFonts w:eastAsia="Times New Roman"/>
@@ -1793,21 +1694,14 @@
     </w:p>
     <w:p>
       <w:pPr>
-        <w:pStyle w:val="Normal"/>
-        <w:spacing w:beforeAutospacing="1" w:afterAutospacing="1"/>
-        <w:rPr>
-          <w:rFonts w:eastAsia="Times New Roman"/>
-        </w:rPr>
-      </w:pPr>
-      <w:r>
-        <w:rPr>
-          <w:rFonts w:eastAsia="Times New Roman"/>
-        </w:rPr>
-      </w:r>
-    </w:p>
-    <w:p>
-      <w:pPr>
-        <w:pStyle w:val="Normal"/>
+        <w:spacing w:beforeAutospacing="1" w:afterAutospacing="1"/>
+        <w:rPr>
+          <w:rFonts w:eastAsia="Times New Roman"/>
+        </w:rPr>
+      </w:pPr>
+    </w:p>
+    <w:p>
+      <w:pPr>
         <w:spacing w:beforeAutospacing="1" w:afterAutospacing="1"/>
         <w:rPr>
           <w:rFonts w:eastAsia="Times New Roman"/>
@@ -1822,7 +1716,6 @@
     </w:p>
     <w:p>
       <w:pPr>
-        <w:pStyle w:val="Normal"/>
         <w:spacing w:beforeAutospacing="1" w:afterAutospacing="1"/>
         <w:rPr>
           <w:rFonts w:eastAsia="Times New Roman"/>
@@ -1837,7 +1730,6 @@
     </w:p>
     <w:p>
       <w:pPr>
-        <w:pStyle w:val="Normal"/>
         <w:spacing w:beforeAutospacing="1" w:afterAutospacing="1"/>
         <w:rPr>
           <w:rFonts w:eastAsia="Times New Roman"/>
@@ -1852,7 +1744,6 @@
     </w:p>
     <w:p>
       <w:pPr>
-        <w:pStyle w:val="Normal"/>
         <w:spacing w:beforeAutospacing="1" w:afterAutospacing="1"/>
         <w:rPr>
           <w:rFonts w:eastAsia="Times New Roman"/>
@@ -1867,7 +1758,6 @@
     </w:p>
     <w:p>
       <w:pPr>
-        <w:pStyle w:val="Normal"/>
         <w:spacing w:beforeAutospacing="1" w:afterAutospacing="1"/>
         <w:rPr>
           <w:rFonts w:eastAsia="Times New Roman"/>
@@ -1882,7 +1772,6 @@
     </w:p>
     <w:p>
       <w:pPr>
-        <w:pStyle w:val="Normal"/>
         <w:spacing w:beforeAutospacing="1" w:afterAutospacing="1"/>
         <w:rPr>
           <w:rFonts w:eastAsia="Times New Roman"/>
@@ -1897,22 +1786,21 @@
     </w:p>
     <w:p>
       <w:pPr>
-        <w:pStyle w:val="Normal"/>
-        <w:spacing w:beforeAutospacing="1" w:afterAutospacing="1"/>
-        <w:rPr>
-          <w:rFonts w:eastAsia="Times New Roman"/>
-        </w:rPr>
-      </w:pPr>
-      <w:r>
-        <w:rPr>
-          <w:rFonts w:eastAsia="Times New Roman"/>
-        </w:rPr>
+        <w:spacing w:beforeAutospacing="1" w:afterAutospacing="1"/>
+        <w:rPr>
+          <w:rFonts w:eastAsia="Times New Roman"/>
+        </w:rPr>
+      </w:pPr>
+      <w:r>
+        <w:rPr>
+          <w:rFonts w:eastAsia="Times New Roman"/>
+        </w:rPr>
+        <w:lastRenderedPageBreak/>
         <w:t>BCrypt được sử dụng do nằm đầu trong danh sách những thuật toán khuyên dùng của spring cho mục đích bảo vệ mật khẩu.</w:t>
       </w:r>
     </w:p>
     <w:p>
       <w:pPr>
-        <w:pStyle w:val="Normal"/>
         <w:spacing w:beforeAutospacing="1" w:afterAutospacing="1"/>
         <w:rPr>
           <w:rFonts w:eastAsia="Times New Roman"/>
@@ -1927,7 +1815,6 @@
     </w:p>
     <w:p>
       <w:pPr>
-        <w:pStyle w:val="Normal"/>
         <w:spacing w:beforeAutospacing="1" w:afterAutospacing="1"/>
         <w:rPr>
           <w:rFonts w:eastAsia="Times New Roman"/>
@@ -1942,7 +1829,6 @@
     </w:p>
     <w:p>
       <w:pPr>
-        <w:pStyle w:val="Normal"/>
         <w:spacing w:beforeAutospacing="1" w:afterAutospacing="1"/>
         <w:rPr>
           <w:rFonts w:eastAsia="Times New Roman"/>
@@ -1957,7 +1843,6 @@
     </w:p>
     <w:p>
       <w:pPr>
-        <w:pStyle w:val="Normal"/>
         <w:spacing w:beforeAutospacing="1" w:afterAutospacing="1"/>
         <w:rPr>
           <w:rFonts w:eastAsia="Times New Roman"/>
@@ -1972,21 +1857,14 @@
     </w:p>
     <w:p>
       <w:pPr>
-        <w:pStyle w:val="Normal"/>
-        <w:spacing w:beforeAutospacing="1" w:afterAutospacing="1"/>
-        <w:rPr>
-          <w:rFonts w:eastAsia="Times New Roman"/>
-        </w:rPr>
-      </w:pPr>
-      <w:r>
-        <w:rPr>
-          <w:rFonts w:eastAsia="Times New Roman"/>
-        </w:rPr>
-      </w:r>
-    </w:p>
-    <w:p>
-      <w:pPr>
-        <w:pStyle w:val="Normal"/>
+        <w:spacing w:beforeAutospacing="1" w:afterAutospacing="1"/>
+        <w:rPr>
+          <w:rFonts w:eastAsia="Times New Roman"/>
+        </w:rPr>
+      </w:pPr>
+    </w:p>
+    <w:p>
+      <w:pPr>
         <w:spacing w:beforeAutospacing="1" w:afterAutospacing="1"/>
         <w:rPr>
           <w:rFonts w:eastAsia="Times New Roman"/>
@@ -2001,7 +1879,6 @@
     </w:p>
     <w:p>
       <w:pPr>
-        <w:pStyle w:val="Normal"/>
         <w:spacing w:beforeAutospacing="1" w:afterAutospacing="1"/>
         <w:rPr>
           <w:rFonts w:eastAsia="Times New Roman"/>
@@ -2016,7 +1893,6 @@
     </w:p>
     <w:p>
       <w:pPr>
-        <w:pStyle w:val="Normal"/>
         <w:spacing w:beforeAutospacing="1" w:afterAutospacing="1"/>
         <w:rPr>
           <w:rFonts w:eastAsia="Times New Roman"/>
@@ -2031,7 +1907,6 @@
     </w:p>
     <w:p>
       <w:pPr>
-        <w:pStyle w:val="Normal"/>
         <w:spacing w:beforeAutospacing="1" w:afterAutospacing="1"/>
         <w:rPr>
           <w:rFonts w:eastAsia="Times New Roman"/>
@@ -2046,7 +1921,6 @@
     </w:p>
     <w:p>
       <w:pPr>
-        <w:pStyle w:val="Normal"/>
         <w:spacing w:beforeAutospacing="1" w:afterAutospacing="1"/>
         <w:rPr>
           <w:rFonts w:eastAsia="Times New Roman"/>
@@ -2060,270 +1934,31 @@
       </w:r>
     </w:p>
     <w:sectPr>
-      <w:type w:val="nextPage"/>
       <w:pgSz w:w="11906" w:h="16838"/>
-      <w:pgMar w:left="1440" w:right="1440" w:gutter="0" w:header="0" w:top="1440" w:footer="0" w:bottom="1440"/>
-      <w:pgNumType w:fmt="decimal"/>
-      <w:formProt w:val="false"/>
-      <w:textDirection w:val="lrTb"/>
-      <w:docGrid w:type="default" w:linePitch="360" w:charSpace="0"/>
+      <w:pgMar w:top="1440" w:right="1440" w:bottom="1440" w:left="1440" w:header="0" w:footer="0" w:gutter="0"/>
+      <w:cols w:space="720"/>
+      <w:formProt w:val="0"/>
+      <w:docGrid w:linePitch="360"/>
     </w:sectPr>
   </w:body>
 </w:document>
 </file>
 
 <file path=word/numbering.xml><?xml version="1.0" encoding="utf-8"?>
-<w:numbering xmlns:w="http://schemas.openxmlformats.org/wordprocessingml/2006/main" xmlns:o="urn:schemas-microsoft-com:office:office" xmlns:r="http://schemas.openxmlformats.org/officeDocument/2006/relationships" xmlns:v="urn:schemas-microsoft-com:vml" xmlns:mc="http://schemas.openxmlformats.org/markup-compatibility/2006" xmlns:w14="http://schemas.microsoft.com/office/word/2010/wordml" mc:Ignorable="w14">
-  <w:abstractNum w:abstractNumId="1">
+<w:numbering xmlns:wpc="http://schemas.microsoft.com/office/word/2010/wordprocessingCanvas" xmlns:cx="http://schemas.microsoft.com/office/drawing/2014/chartex" xmlns:cx1="http://schemas.microsoft.com/office/drawing/2015/9/8/chartex" xmlns:cx2="http://schemas.microsoft.com/office/drawing/2015/10/21/chartex" xmlns:cx3="http://schemas.microsoft.com/office/drawing/2016/5/9/chartex" xmlns:cx4="http://schemas.microsoft.com/office/drawing/2016/5/10/chartex" xmlns:cx5="http://schemas.microsoft.com/office/drawing/2016/5/11/chartex" xmlns:cx6="http://schemas.microsoft.com/office/drawing/2016/5/12/chartex" xmlns:cx7="http://schemas.microsoft.com/office/drawing/2016/5/13/chartex" xmlns:cx8="http://schemas.microsoft.com/office/drawing/2016/5/14/chartex" xmlns:mc="http://schemas.openxmlformats.org/markup-compatibility/2006" xmlns:aink="http://schemas.microsoft.com/office/drawing/2016/ink" xmlns:am3d="http://schemas.microsoft.com/office/drawing/2017/model3d" xmlns:o="urn:schemas-microsoft-com:office:office" xmlns:oel="http://schemas.microsoft.com/office/2019/extlst" xmlns:r="http://schemas.openxmlformats.org/officeDocument/2006/relationships" xmlns:m="http://schemas.openxmlformats.org/officeDocument/2006/math" xmlns:v="urn:schemas-microsoft-com:vml" xmlns:wp14="http://schemas.microsoft.com/office/word/2010/wordprocessingDrawing" xmlns:wp="http://schemas.openxmlformats.org/drawingml/2006/wordprocessingDrawing" xmlns:w10="urn:schemas-microsoft-com:office:word" xmlns:w="http://schemas.openxmlformats.org/wordprocessingml/2006/main" xmlns:w14="http://schemas.microsoft.com/office/word/2010/wordml" xmlns:w15="http://schemas.microsoft.com/office/word/2012/wordml" xmlns:w16cex="http://schemas.microsoft.com/office/word/2018/wordml/cex" xmlns:w16cid="http://schemas.microsoft.com/office/word/2016/wordml/cid" xmlns:w16="http://schemas.microsoft.com/office/word/2018/wordml" xmlns:w16du="http://schemas.microsoft.com/office/word/2023/wordml/word16du" xmlns:w16sdtdh="http://schemas.microsoft.com/office/word/2020/wordml/sdtdatahash" xmlns:w16sdtfl="http://schemas.microsoft.com/office/word/2024/wordml/sdtformatlock" xmlns:w16se="http://schemas.microsoft.com/office/word/2015/wordml/symex" xmlns:wpg="http://schemas.microsoft.com/office/word/2010/wordprocessingGroup" xmlns:wpi="http://schemas.microsoft.com/office/word/2010/wordprocessingInk" xmlns:wne="http://schemas.microsoft.com/office/word/2006/wordml" xmlns:wps="http://schemas.microsoft.com/office/word/2010/wordprocessingShape" mc:Ignorable="w14 w15 w16se w16cid w16 w16cex w16sdtdh w16sdtfl w16du wp14">
+  <w:abstractNum w:abstractNumId="0" w15:restartNumberingAfterBreak="0">
+    <w:nsid w:val="0A1D3B71"/>
+    <w:multiLevelType w:val="multilevel"/>
+    <w:tmpl w:val="43C2B542"/>
     <w:lvl w:ilvl="0">
-      <w:start w:val="1"/>
-      <w:numFmt w:val="decimal"/>
-      <w:pStyle w:val="Heading1"/>
-      <w:lvlText w:val="%1."/>
-      <w:lvlJc w:val="start"/>
+      <w:numFmt w:val="bullet"/>
+      <w:lvlText w:val="-"/>
+      <w:lvlJc w:val="left"/>
       <w:pPr>
         <w:tabs>
           <w:tab w:val="num" w:pos="0"/>
         </w:tabs>
-        <w:ind w:start="684" w:hanging="400"/>
-      </w:pPr>
-      <w:rPr/>
-    </w:lvl>
-    <w:lvl w:ilvl="1">
-      <w:start w:val="1"/>
-      <w:numFmt w:val="upperLetter"/>
-      <w:lvlText w:val="%2."/>
-      <w:lvlJc w:val="start"/>
-      <w:pPr>
-        <w:tabs>
-          <w:tab w:val="num" w:pos="0"/>
-        </w:tabs>
-        <w:ind w:start="1200" w:hanging="400"/>
-      </w:pPr>
-      <w:rPr/>
-    </w:lvl>
-    <w:lvl w:ilvl="2">
-      <w:start w:val="1"/>
-      <w:numFmt w:val="lowerRoman"/>
-      <w:lvlText w:val="%3."/>
-      <w:lvlJc w:val="end"/>
-      <w:pPr>
-        <w:tabs>
-          <w:tab w:val="num" w:pos="0"/>
-        </w:tabs>
-        <w:ind w:start="1600" w:hanging="400"/>
-      </w:pPr>
-      <w:rPr/>
-    </w:lvl>
-    <w:lvl w:ilvl="3">
-      <w:start w:val="1"/>
-      <w:numFmt w:val="decimal"/>
-      <w:lvlText w:val="%4."/>
-      <w:lvlJc w:val="start"/>
-      <w:pPr>
-        <w:tabs>
-          <w:tab w:val="num" w:pos="0"/>
-        </w:tabs>
-        <w:ind w:start="2000" w:hanging="400"/>
-      </w:pPr>
-      <w:rPr/>
-    </w:lvl>
-    <w:lvl w:ilvl="4">
-      <w:start w:val="1"/>
-      <w:numFmt w:val="upperLetter"/>
-      <w:lvlText w:val="%5."/>
-      <w:lvlJc w:val="start"/>
-      <w:pPr>
-        <w:tabs>
-          <w:tab w:val="num" w:pos="0"/>
-        </w:tabs>
-        <w:ind w:start="2400" w:hanging="400"/>
-      </w:pPr>
-      <w:rPr/>
-    </w:lvl>
-    <w:lvl w:ilvl="5">
-      <w:start w:val="1"/>
-      <w:numFmt w:val="lowerRoman"/>
-      <w:lvlText w:val="%6."/>
-      <w:lvlJc w:val="end"/>
-      <w:pPr>
-        <w:tabs>
-          <w:tab w:val="num" w:pos="0"/>
-        </w:tabs>
-        <w:ind w:start="2800" w:hanging="400"/>
-      </w:pPr>
-      <w:rPr/>
-    </w:lvl>
-    <w:lvl w:ilvl="6">
-      <w:start w:val="1"/>
-      <w:numFmt w:val="decimal"/>
-      <w:lvlText w:val="%7."/>
-      <w:lvlJc w:val="start"/>
-      <w:pPr>
-        <w:tabs>
-          <w:tab w:val="num" w:pos="0"/>
-        </w:tabs>
-        <w:ind w:start="3200" w:hanging="400"/>
-      </w:pPr>
-      <w:rPr/>
-    </w:lvl>
-    <w:lvl w:ilvl="7">
-      <w:start w:val="1"/>
-      <w:numFmt w:val="upperLetter"/>
-      <w:lvlText w:val="%8."/>
-      <w:lvlJc w:val="start"/>
-      <w:pPr>
-        <w:tabs>
-          <w:tab w:val="num" w:pos="0"/>
-        </w:tabs>
-        <w:ind w:start="3600" w:hanging="400"/>
-      </w:pPr>
-      <w:rPr/>
-    </w:lvl>
-    <w:lvl w:ilvl="8">
-      <w:start w:val="1"/>
-      <w:numFmt w:val="lowerRoman"/>
-      <w:lvlText w:val="%9."/>
-      <w:lvlJc w:val="end"/>
-      <w:pPr>
-        <w:tabs>
-          <w:tab w:val="num" w:pos="0"/>
-        </w:tabs>
-        <w:ind w:start="4000" w:hanging="400"/>
-      </w:pPr>
-      <w:rPr/>
-    </w:lvl>
-  </w:abstractNum>
-  <w:abstractNum w:abstractNumId="2">
-    <w:lvl w:ilvl="0">
-      <w:start w:val="1"/>
-      <w:numFmt w:val="lowerLetter"/>
-      <w:suff w:val="space"/>
-      <w:lvlText w:val="%1."/>
-      <w:lvlJc w:val="start"/>
-      <w:pPr>
-        <w:tabs>
-          <w:tab w:val="num" w:pos="0"/>
-        </w:tabs>
-        <w:ind w:start="0" w:hanging="0"/>
-      </w:pPr>
-      <w:rPr/>
-    </w:lvl>
-    <w:lvl w:ilvl="1">
-      <w:start w:val="1"/>
-      <w:numFmt w:val="decimal"/>
-      <w:lvlText w:val="%2."/>
-      <w:lvlJc w:val="start"/>
-      <w:pPr>
-        <w:tabs>
-          <w:tab w:val="num" w:pos="1080"/>
-        </w:tabs>
-        <w:ind w:start="1080" w:hanging="360"/>
-      </w:pPr>
-      <w:rPr/>
-    </w:lvl>
-    <w:lvl w:ilvl="2">
-      <w:start w:val="1"/>
-      <w:numFmt w:val="decimal"/>
-      <w:lvlText w:val="%3."/>
-      <w:lvlJc w:val="start"/>
-      <w:pPr>
-        <w:tabs>
-          <w:tab w:val="num" w:pos="1440"/>
-        </w:tabs>
-        <w:ind w:start="1440" w:hanging="360"/>
-      </w:pPr>
-      <w:rPr/>
-    </w:lvl>
-    <w:lvl w:ilvl="3">
-      <w:start w:val="1"/>
-      <w:numFmt w:val="decimal"/>
-      <w:lvlText w:val="%4."/>
-      <w:lvlJc w:val="start"/>
-      <w:pPr>
-        <w:tabs>
-          <w:tab w:val="num" w:pos="1800"/>
-        </w:tabs>
-        <w:ind w:start="1800" w:hanging="360"/>
-      </w:pPr>
-      <w:rPr/>
-    </w:lvl>
-    <w:lvl w:ilvl="4">
-      <w:start w:val="1"/>
-      <w:numFmt w:val="decimal"/>
-      <w:lvlText w:val="%5."/>
-      <w:lvlJc w:val="start"/>
-      <w:pPr>
-        <w:tabs>
-          <w:tab w:val="num" w:pos="2160"/>
-        </w:tabs>
-        <w:ind w:start="2160" w:hanging="360"/>
-      </w:pPr>
-      <w:rPr/>
-    </w:lvl>
-    <w:lvl w:ilvl="5">
-      <w:start w:val="1"/>
-      <w:numFmt w:val="decimal"/>
-      <w:lvlText w:val="%6."/>
-      <w:lvlJc w:val="start"/>
-      <w:pPr>
-        <w:tabs>
-          <w:tab w:val="num" w:pos="2520"/>
-        </w:tabs>
-        <w:ind w:start="2520" w:hanging="360"/>
-      </w:pPr>
-      <w:rPr/>
-    </w:lvl>
-    <w:lvl w:ilvl="6">
-      <w:start w:val="1"/>
-      <w:numFmt w:val="decimal"/>
-      <w:lvlText w:val="%7."/>
-      <w:lvlJc w:val="start"/>
-      <w:pPr>
-        <w:tabs>
-          <w:tab w:val="num" w:pos="2880"/>
-        </w:tabs>
-        <w:ind w:start="2880" w:hanging="360"/>
-      </w:pPr>
-      <w:rPr/>
-    </w:lvl>
-    <w:lvl w:ilvl="7">
-      <w:start w:val="1"/>
-      <w:numFmt w:val="decimal"/>
-      <w:lvlText w:val="%8."/>
-      <w:lvlJc w:val="start"/>
-      <w:pPr>
-        <w:tabs>
-          <w:tab w:val="num" w:pos="3240"/>
-        </w:tabs>
-        <w:ind w:start="3240" w:hanging="360"/>
-      </w:pPr>
-      <w:rPr/>
-    </w:lvl>
-    <w:lvl w:ilvl="8">
-      <w:start w:val="1"/>
-      <w:numFmt w:val="decimal"/>
-      <w:lvlText w:val="%9."/>
-      <w:lvlJc w:val="start"/>
-      <w:pPr>
-        <w:tabs>
-          <w:tab w:val="num" w:pos="3600"/>
-        </w:tabs>
-        <w:ind w:start="3600" w:hanging="360"/>
-      </w:pPr>
-      <w:rPr/>
-    </w:lvl>
-  </w:abstractNum>
-  <w:abstractNum w:abstractNumId="3">
-    <w:lvl w:ilvl="0">
-      <w:numFmt w:val="bullet"/>
-      <w:lvlText w:val="-"/>
-      <w:lvlJc w:val="start"/>
-      <w:pPr>
-        <w:tabs>
-          <w:tab w:val="num" w:pos="0"/>
-        </w:tabs>
-        <w:ind w:start="720" w:hanging="360"/>
+        <w:ind w:left="720" w:hanging="360"/>
       </w:pPr>
       <w:rPr>
         <w:rFonts w:ascii="Times New Roman" w:hAnsi="Times New Roman" w:cs="Times New Roman" w:hint="default"/>
@@ -2333,12 +1968,12 @@
       <w:start w:val="1"/>
       <w:numFmt w:val="bullet"/>
       <w:lvlText w:val="o"/>
-      <w:lvlJc w:val="start"/>
+      <w:lvlJc w:val="left"/>
       <w:pPr>
         <w:tabs>
           <w:tab w:val="num" w:pos="0"/>
         </w:tabs>
-        <w:ind w:start="1440" w:hanging="360"/>
+        <w:ind w:left="1440" w:hanging="360"/>
       </w:pPr>
       <w:rPr>
         <w:rFonts w:ascii="Courier New" w:hAnsi="Courier New" w:cs="Courier New" w:hint="default"/>
@@ -2348,12 +1983,12 @@
       <w:start w:val="1"/>
       <w:numFmt w:val="bullet"/>
       <w:lvlText w:val=""/>
-      <w:lvlJc w:val="start"/>
+      <w:lvlJc w:val="left"/>
       <w:pPr>
         <w:tabs>
           <w:tab w:val="num" w:pos="0"/>
         </w:tabs>
-        <w:ind w:start="2160" w:hanging="360"/>
+        <w:ind w:left="2160" w:hanging="360"/>
       </w:pPr>
       <w:rPr>
         <w:rFonts w:ascii="Wingdings" w:hAnsi="Wingdings" w:cs="Wingdings" w:hint="default"/>
@@ -2363,12 +1998,12 @@
       <w:start w:val="1"/>
       <w:numFmt w:val="bullet"/>
       <w:lvlText w:val=""/>
-      <w:lvlJc w:val="start"/>
+      <w:lvlJc w:val="left"/>
       <w:pPr>
         <w:tabs>
           <w:tab w:val="num" w:pos="0"/>
         </w:tabs>
-        <w:ind w:start="2880" w:hanging="360"/>
+        <w:ind w:left="2880" w:hanging="360"/>
       </w:pPr>
       <w:rPr>
         <w:rFonts w:ascii="Symbol" w:hAnsi="Symbol" w:cs="Symbol" w:hint="default"/>
@@ -2378,12 +2013,12 @@
       <w:start w:val="1"/>
       <w:numFmt w:val="bullet"/>
       <w:lvlText w:val="o"/>
-      <w:lvlJc w:val="start"/>
+      <w:lvlJc w:val="left"/>
       <w:pPr>
         <w:tabs>
           <w:tab w:val="num" w:pos="0"/>
         </w:tabs>
-        <w:ind w:start="3600" w:hanging="360"/>
+        <w:ind w:left="3600" w:hanging="360"/>
       </w:pPr>
       <w:rPr>
         <w:rFonts w:ascii="Courier New" w:hAnsi="Courier New" w:cs="Courier New" w:hint="default"/>
@@ -2393,12 +2028,12 @@
       <w:start w:val="1"/>
       <w:numFmt w:val="bullet"/>
       <w:lvlText w:val=""/>
-      <w:lvlJc w:val="start"/>
+      <w:lvlJc w:val="left"/>
       <w:pPr>
         <w:tabs>
           <w:tab w:val="num" w:pos="0"/>
         </w:tabs>
-        <w:ind w:start="4320" w:hanging="360"/>
+        <w:ind w:left="4320" w:hanging="360"/>
       </w:pPr>
       <w:rPr>
         <w:rFonts w:ascii="Wingdings" w:hAnsi="Wingdings" w:cs="Wingdings" w:hint="default"/>
@@ -2408,12 +2043,12 @@
       <w:start w:val="1"/>
       <w:numFmt w:val="bullet"/>
       <w:lvlText w:val=""/>
-      <w:lvlJc w:val="start"/>
+      <w:lvlJc w:val="left"/>
       <w:pPr>
         <w:tabs>
           <w:tab w:val="num" w:pos="0"/>
         </w:tabs>
-        <w:ind w:start="5040" w:hanging="360"/>
+        <w:ind w:left="5040" w:hanging="360"/>
       </w:pPr>
       <w:rPr>
         <w:rFonts w:ascii="Symbol" w:hAnsi="Symbol" w:cs="Symbol" w:hint="default"/>
@@ -2423,12 +2058,12 @@
       <w:start w:val="1"/>
       <w:numFmt w:val="bullet"/>
       <w:lvlText w:val="o"/>
-      <w:lvlJc w:val="start"/>
+      <w:lvlJc w:val="left"/>
       <w:pPr>
         <w:tabs>
           <w:tab w:val="num" w:pos="0"/>
         </w:tabs>
-        <w:ind w:start="5760" w:hanging="360"/>
+        <w:ind w:left="5760" w:hanging="360"/>
       </w:pPr>
       <w:rPr>
         <w:rFonts w:ascii="Courier New" w:hAnsi="Courier New" w:cs="Courier New" w:hint="default"/>
@@ -2438,36 +2073,265 @@
       <w:start w:val="1"/>
       <w:numFmt w:val="bullet"/>
       <w:lvlText w:val=""/>
-      <w:lvlJc w:val="start"/>
+      <w:lvlJc w:val="left"/>
       <w:pPr>
         <w:tabs>
           <w:tab w:val="num" w:pos="0"/>
         </w:tabs>
-        <w:ind w:start="6480" w:hanging="360"/>
+        <w:ind w:left="6480" w:hanging="360"/>
       </w:pPr>
       <w:rPr>
         <w:rFonts w:ascii="Wingdings" w:hAnsi="Wingdings" w:cs="Wingdings" w:hint="default"/>
       </w:rPr>
     </w:lvl>
   </w:abstractNum>
-  <w:num w:numId="1">
+  <w:abstractNum w:abstractNumId="1" w15:restartNumberingAfterBreak="0">
+    <w:nsid w:val="424A4999"/>
+    <w:multiLevelType w:val="multilevel"/>
+    <w:tmpl w:val="4766A344"/>
+    <w:lvl w:ilvl="0">
+      <w:start w:val="1"/>
+      <w:numFmt w:val="decimal"/>
+      <w:pStyle w:val="Heading1"/>
+      <w:lvlText w:val="%1."/>
+      <w:lvlJc w:val="left"/>
+      <w:pPr>
+        <w:tabs>
+          <w:tab w:val="num" w:pos="0"/>
+        </w:tabs>
+        <w:ind w:left="684" w:hanging="400"/>
+      </w:pPr>
+    </w:lvl>
+    <w:lvl w:ilvl="1">
+      <w:start w:val="1"/>
+      <w:numFmt w:val="upperLetter"/>
+      <w:lvlText w:val="%2."/>
+      <w:lvlJc w:val="left"/>
+      <w:pPr>
+        <w:tabs>
+          <w:tab w:val="num" w:pos="0"/>
+        </w:tabs>
+        <w:ind w:left="1200" w:hanging="400"/>
+      </w:pPr>
+    </w:lvl>
+    <w:lvl w:ilvl="2">
+      <w:start w:val="1"/>
+      <w:numFmt w:val="lowerRoman"/>
+      <w:lvlText w:val="%3."/>
+      <w:lvlJc w:val="right"/>
+      <w:pPr>
+        <w:tabs>
+          <w:tab w:val="num" w:pos="0"/>
+        </w:tabs>
+        <w:ind w:left="1600" w:hanging="400"/>
+      </w:pPr>
+    </w:lvl>
+    <w:lvl w:ilvl="3">
+      <w:start w:val="1"/>
+      <w:numFmt w:val="decimal"/>
+      <w:lvlText w:val="%4."/>
+      <w:lvlJc w:val="left"/>
+      <w:pPr>
+        <w:tabs>
+          <w:tab w:val="num" w:pos="0"/>
+        </w:tabs>
+        <w:ind w:left="2000" w:hanging="400"/>
+      </w:pPr>
+    </w:lvl>
+    <w:lvl w:ilvl="4">
+      <w:start w:val="1"/>
+      <w:numFmt w:val="upperLetter"/>
+      <w:lvlText w:val="%5."/>
+      <w:lvlJc w:val="left"/>
+      <w:pPr>
+        <w:tabs>
+          <w:tab w:val="num" w:pos="0"/>
+        </w:tabs>
+        <w:ind w:left="2400" w:hanging="400"/>
+      </w:pPr>
+    </w:lvl>
+    <w:lvl w:ilvl="5">
+      <w:start w:val="1"/>
+      <w:numFmt w:val="lowerRoman"/>
+      <w:lvlText w:val="%6."/>
+      <w:lvlJc w:val="right"/>
+      <w:pPr>
+        <w:tabs>
+          <w:tab w:val="num" w:pos="0"/>
+        </w:tabs>
+        <w:ind w:left="2800" w:hanging="400"/>
+      </w:pPr>
+    </w:lvl>
+    <w:lvl w:ilvl="6">
+      <w:start w:val="1"/>
+      <w:numFmt w:val="decimal"/>
+      <w:lvlText w:val="%7."/>
+      <w:lvlJc w:val="left"/>
+      <w:pPr>
+        <w:tabs>
+          <w:tab w:val="num" w:pos="0"/>
+        </w:tabs>
+        <w:ind w:left="3200" w:hanging="400"/>
+      </w:pPr>
+    </w:lvl>
+    <w:lvl w:ilvl="7">
+      <w:start w:val="1"/>
+      <w:numFmt w:val="upperLetter"/>
+      <w:lvlText w:val="%8."/>
+      <w:lvlJc w:val="left"/>
+      <w:pPr>
+        <w:tabs>
+          <w:tab w:val="num" w:pos="0"/>
+        </w:tabs>
+        <w:ind w:left="3600" w:hanging="400"/>
+      </w:pPr>
+    </w:lvl>
+    <w:lvl w:ilvl="8">
+      <w:start w:val="1"/>
+      <w:numFmt w:val="lowerRoman"/>
+      <w:lvlText w:val="%9."/>
+      <w:lvlJc w:val="right"/>
+      <w:pPr>
+        <w:tabs>
+          <w:tab w:val="num" w:pos="0"/>
+        </w:tabs>
+        <w:ind w:left="4000" w:hanging="400"/>
+      </w:pPr>
+    </w:lvl>
+  </w:abstractNum>
+  <w:abstractNum w:abstractNumId="2" w15:restartNumberingAfterBreak="0">
+    <w:nsid w:val="7A916539"/>
+    <w:multiLevelType w:val="multilevel"/>
+    <w:tmpl w:val="03DEBDF6"/>
+    <w:lvl w:ilvl="0">
+      <w:start w:val="1"/>
+      <w:numFmt w:val="lowerLetter"/>
+      <w:pStyle w:val="ListParagraph"/>
+      <w:suff w:val="space"/>
+      <w:lvlText w:val="%1."/>
+      <w:lvlJc w:val="left"/>
+      <w:pPr>
+        <w:tabs>
+          <w:tab w:val="num" w:pos="0"/>
+        </w:tabs>
+        <w:ind w:left="0" w:firstLine="0"/>
+      </w:pPr>
+    </w:lvl>
+    <w:lvl w:ilvl="1">
+      <w:start w:val="1"/>
+      <w:numFmt w:val="decimal"/>
+      <w:lvlText w:val="%2."/>
+      <w:lvlJc w:val="left"/>
+      <w:pPr>
+        <w:tabs>
+          <w:tab w:val="num" w:pos="1080"/>
+        </w:tabs>
+        <w:ind w:left="1080" w:hanging="360"/>
+      </w:pPr>
+    </w:lvl>
+    <w:lvl w:ilvl="2">
+      <w:start w:val="1"/>
+      <w:numFmt w:val="decimal"/>
+      <w:lvlText w:val="%3."/>
+      <w:lvlJc w:val="left"/>
+      <w:pPr>
+        <w:tabs>
+          <w:tab w:val="num" w:pos="1440"/>
+        </w:tabs>
+        <w:ind w:left="1440" w:hanging="360"/>
+      </w:pPr>
+    </w:lvl>
+    <w:lvl w:ilvl="3">
+      <w:start w:val="1"/>
+      <w:numFmt w:val="decimal"/>
+      <w:lvlText w:val="%4."/>
+      <w:lvlJc w:val="left"/>
+      <w:pPr>
+        <w:tabs>
+          <w:tab w:val="num" w:pos="1800"/>
+        </w:tabs>
+        <w:ind w:left="1800" w:hanging="360"/>
+      </w:pPr>
+    </w:lvl>
+    <w:lvl w:ilvl="4">
+      <w:start w:val="1"/>
+      <w:numFmt w:val="decimal"/>
+      <w:lvlText w:val="%5."/>
+      <w:lvlJc w:val="left"/>
+      <w:pPr>
+        <w:tabs>
+          <w:tab w:val="num" w:pos="2160"/>
+        </w:tabs>
+        <w:ind w:left="2160" w:hanging="360"/>
+      </w:pPr>
+    </w:lvl>
+    <w:lvl w:ilvl="5">
+      <w:start w:val="1"/>
+      <w:numFmt w:val="decimal"/>
+      <w:lvlText w:val="%6."/>
+      <w:lvlJc w:val="left"/>
+      <w:pPr>
+        <w:tabs>
+          <w:tab w:val="num" w:pos="2520"/>
+        </w:tabs>
+        <w:ind w:left="2520" w:hanging="360"/>
+      </w:pPr>
+    </w:lvl>
+    <w:lvl w:ilvl="6">
+      <w:start w:val="1"/>
+      <w:numFmt w:val="decimal"/>
+      <w:lvlText w:val="%7."/>
+      <w:lvlJc w:val="left"/>
+      <w:pPr>
+        <w:tabs>
+          <w:tab w:val="num" w:pos="2880"/>
+        </w:tabs>
+        <w:ind w:left="2880" w:hanging="360"/>
+      </w:pPr>
+    </w:lvl>
+    <w:lvl w:ilvl="7">
+      <w:start w:val="1"/>
+      <w:numFmt w:val="decimal"/>
+      <w:lvlText w:val="%8."/>
+      <w:lvlJc w:val="left"/>
+      <w:pPr>
+        <w:tabs>
+          <w:tab w:val="num" w:pos="3240"/>
+        </w:tabs>
+        <w:ind w:left="3240" w:hanging="360"/>
+      </w:pPr>
+    </w:lvl>
+    <w:lvl w:ilvl="8">
+      <w:start w:val="1"/>
+      <w:numFmt w:val="decimal"/>
+      <w:lvlText w:val="%9."/>
+      <w:lvlJc w:val="left"/>
+      <w:pPr>
+        <w:tabs>
+          <w:tab w:val="num" w:pos="3600"/>
+        </w:tabs>
+        <w:ind w:left="3600" w:hanging="360"/>
+      </w:pPr>
+    </w:lvl>
+  </w:abstractNum>
+  <w:num w:numId="1" w16cid:durableId="2076973761">
     <w:abstractNumId w:val="1"/>
   </w:num>
-  <w:num w:numId="2">
+  <w:num w:numId="2" w16cid:durableId="1826318448">
     <w:abstractNumId w:val="2"/>
   </w:num>
-  <w:num w:numId="3">
-    <w:abstractNumId w:val="3"/>
+  <w:num w:numId="3" w16cid:durableId="1510019620">
+    <w:abstractNumId w:val="0"/>
   </w:num>
 </w:numbering>
 </file>
 
 <file path=word/styles.xml><?xml version="1.0" encoding="utf-8"?>
-<w:styles xmlns:w="http://schemas.openxmlformats.org/wordprocessingml/2006/main" xmlns:w14="http://schemas.microsoft.com/office/word/2010/wordml" xmlns:mc="http://schemas.openxmlformats.org/markup-compatibility/2006" mc:Ignorable="w14">
+<w:styles xmlns:mc="http://schemas.openxmlformats.org/markup-compatibility/2006" xmlns:r="http://schemas.openxmlformats.org/officeDocument/2006/relationships" xmlns:w="http://schemas.openxmlformats.org/wordprocessingml/2006/main" xmlns:w14="http://schemas.microsoft.com/office/word/2010/wordml" xmlns:w15="http://schemas.microsoft.com/office/word/2012/wordml" xmlns:w16cex="http://schemas.microsoft.com/office/word/2018/wordml/cex" xmlns:w16cid="http://schemas.microsoft.com/office/word/2016/wordml/cid" xmlns:w16="http://schemas.microsoft.com/office/word/2018/wordml" xmlns:w16du="http://schemas.microsoft.com/office/word/2023/wordml/word16du" xmlns:w16sdtdh="http://schemas.microsoft.com/office/word/2020/wordml/sdtdatahash" xmlns:w16sdtfl="http://schemas.microsoft.com/office/word/2024/wordml/sdtformatlock" xmlns:w16se="http://schemas.microsoft.com/office/word/2015/wordml/symex" mc:Ignorable="w14 w15 w16se w16cid w16 w16cex w16sdtdh w16sdtfl w16du">
   <w:docDefaults>
     <w:rPrDefault>
       <w:rPr>
-        <w:rFonts w:ascii="Aptos" w:hAnsi="Aptos" w:eastAsia="Gulim" w:cs="" w:asciiTheme="minorHAnsi" w:cstheme="minorBidi" w:hAnsiTheme="minorHAnsi"/>
+        <w:rFonts w:asciiTheme="minorHAnsi" w:eastAsia="Gulim" w:hAnsiTheme="minorHAnsi" w:cstheme="minorBidi"/>
         <w:kern w:val="2"/>
         <w:sz w:val="24"/>
         <w:szCs w:val="24"/>
@@ -2477,21 +2341,21 @@
     </w:rPrDefault>
     <w:pPrDefault>
       <w:pPr>
-        <w:suppressAutoHyphens w:val="true"/>
+        <w:suppressAutoHyphens/>
       </w:pPr>
     </w:pPrDefault>
   </w:docDefaults>
   <w:latentStyles w:defLockedState="0" w:defUIPriority="99" w:defSemiHidden="0" w:defUnhideWhenUsed="0" w:defQFormat="0" w:count="376">
     <w:lsdException w:name="Normal" w:uiPriority="0" w:qFormat="1"/>
     <w:lsdException w:name="heading 1" w:uiPriority="9" w:qFormat="1"/>
-    <w:lsdException w:name="heading 2" w:uiPriority="9" w:semiHidden="1" w:unhideWhenUsed="1" w:qFormat="1"/>
-    <w:lsdException w:name="heading 3" w:uiPriority="9" w:semiHidden="1" w:unhideWhenUsed="1" w:qFormat="1"/>
-    <w:lsdException w:name="heading 4" w:uiPriority="9" w:semiHidden="1" w:unhideWhenUsed="1" w:qFormat="1"/>
-    <w:lsdException w:name="heading 5" w:uiPriority="9" w:semiHidden="1" w:unhideWhenUsed="1" w:qFormat="1"/>
-    <w:lsdException w:name="heading 6" w:uiPriority="9" w:semiHidden="1" w:unhideWhenUsed="1" w:qFormat="1"/>
-    <w:lsdException w:name="heading 7" w:uiPriority="9" w:semiHidden="1" w:unhideWhenUsed="1" w:qFormat="1"/>
-    <w:lsdException w:name="heading 8" w:uiPriority="9" w:semiHidden="1" w:unhideWhenUsed="1" w:qFormat="1"/>
-    <w:lsdException w:name="heading 9" w:uiPriority="9" w:semiHidden="1" w:unhideWhenUsed="1" w:qFormat="1"/>
+    <w:lsdException w:name="heading 2" w:semiHidden="1" w:uiPriority="9" w:unhideWhenUsed="1" w:qFormat="1"/>
+    <w:lsdException w:name="heading 3" w:semiHidden="1" w:uiPriority="9" w:unhideWhenUsed="1" w:qFormat="1"/>
+    <w:lsdException w:name="heading 4" w:semiHidden="1" w:uiPriority="9" w:unhideWhenUsed="1" w:qFormat="1"/>
+    <w:lsdException w:name="heading 5" w:semiHidden="1" w:uiPriority="9" w:unhideWhenUsed="1" w:qFormat="1"/>
+    <w:lsdException w:name="heading 6" w:semiHidden="1" w:uiPriority="9" w:unhideWhenUsed="1" w:qFormat="1"/>
+    <w:lsdException w:name="heading 7" w:semiHidden="1" w:uiPriority="9" w:unhideWhenUsed="1" w:qFormat="1"/>
+    <w:lsdException w:name="heading 8" w:semiHidden="1" w:uiPriority="9" w:unhideWhenUsed="1" w:qFormat="1"/>
+    <w:lsdException w:name="heading 9" w:semiHidden="1" w:uiPriority="9" w:unhideWhenUsed="1" w:qFormat="1"/>
     <w:lsdException w:name="index 1" w:semiHidden="1" w:unhideWhenUsed="1"/>
     <w:lsdException w:name="index 2" w:semiHidden="1" w:unhideWhenUsed="1"/>
     <w:lsdException w:name="index 3" w:semiHidden="1" w:unhideWhenUsed="1"/>
@@ -2501,22 +2365,22 @@
     <w:lsdException w:name="index 7" w:semiHidden="1" w:unhideWhenUsed="1"/>
     <w:lsdException w:name="index 8" w:semiHidden="1" w:unhideWhenUsed="1"/>
     <w:lsdException w:name="index 9" w:semiHidden="1" w:unhideWhenUsed="1"/>
-    <w:lsdException w:name="toc 1" w:uiPriority="39" w:semiHidden="1" w:unhideWhenUsed="1"/>
-    <w:lsdException w:name="toc 2" w:uiPriority="39" w:semiHidden="1" w:unhideWhenUsed="1"/>
-    <w:lsdException w:name="toc 3" w:uiPriority="39" w:semiHidden="1" w:unhideWhenUsed="1"/>
-    <w:lsdException w:name="toc 4" w:uiPriority="39" w:semiHidden="1" w:unhideWhenUsed="1"/>
-    <w:lsdException w:name="toc 5" w:uiPriority="39" w:semiHidden="1" w:unhideWhenUsed="1"/>
-    <w:lsdException w:name="toc 6" w:uiPriority="39" w:semiHidden="1" w:unhideWhenUsed="1"/>
-    <w:lsdException w:name="toc 7" w:uiPriority="39" w:semiHidden="1" w:unhideWhenUsed="1"/>
-    <w:lsdException w:name="toc 8" w:uiPriority="39" w:semiHidden="1" w:unhideWhenUsed="1"/>
-    <w:lsdException w:name="toc 9" w:uiPriority="39" w:semiHidden="1" w:unhideWhenUsed="1"/>
+    <w:lsdException w:name="toc 1" w:semiHidden="1" w:uiPriority="39" w:unhideWhenUsed="1"/>
+    <w:lsdException w:name="toc 2" w:semiHidden="1" w:uiPriority="39" w:unhideWhenUsed="1"/>
+    <w:lsdException w:name="toc 3" w:semiHidden="1" w:uiPriority="39" w:unhideWhenUsed="1"/>
+    <w:lsdException w:name="toc 4" w:semiHidden="1" w:uiPriority="39" w:unhideWhenUsed="1"/>
+    <w:lsdException w:name="toc 5" w:semiHidden="1" w:uiPriority="39" w:unhideWhenUsed="1"/>
+    <w:lsdException w:name="toc 6" w:semiHidden="1" w:uiPriority="39" w:unhideWhenUsed="1"/>
+    <w:lsdException w:name="toc 7" w:semiHidden="1" w:uiPriority="39" w:unhideWhenUsed="1"/>
+    <w:lsdException w:name="toc 8" w:semiHidden="1" w:uiPriority="39" w:unhideWhenUsed="1"/>
+    <w:lsdException w:name="toc 9" w:semiHidden="1" w:uiPriority="39" w:unhideWhenUsed="1"/>
     <w:lsdException w:name="Normal Indent" w:semiHidden="1" w:unhideWhenUsed="1"/>
     <w:lsdException w:name="footnote text" w:semiHidden="1" w:unhideWhenUsed="1"/>
     <w:lsdException w:name="annotation text" w:semiHidden="1" w:unhideWhenUsed="1"/>
     <w:lsdException w:name="header" w:semiHidden="1" w:unhideWhenUsed="1"/>
     <w:lsdException w:name="footer" w:semiHidden="1" w:unhideWhenUsed="1"/>
     <w:lsdException w:name="index heading" w:semiHidden="1" w:unhideWhenUsed="1"/>
-    <w:lsdException w:name="caption" w:uiPriority="35" w:semiHidden="1" w:unhideWhenUsed="1" w:qFormat="1"/>
+    <w:lsdException w:name="caption" w:semiHidden="1" w:uiPriority="35" w:unhideWhenUsed="1" w:qFormat="1"/>
     <w:lsdException w:name="table of figures" w:semiHidden="1" w:unhideWhenUsed="1"/>
     <w:lsdException w:name="envelope address" w:semiHidden="1" w:unhideWhenUsed="1"/>
     <w:lsdException w:name="envelope return" w:semiHidden="1" w:unhideWhenUsed="1"/>
@@ -2547,7 +2411,7 @@
     <w:lsdException w:name="Title" w:uiPriority="10" w:qFormat="1"/>
     <w:lsdException w:name="Closing" w:semiHidden="1" w:unhideWhenUsed="1"/>
     <w:lsdException w:name="Signature" w:semiHidden="1" w:unhideWhenUsed="1"/>
-    <w:lsdException w:name="Default Paragraph Font" w:uiPriority="1" w:semiHidden="1" w:unhideWhenUsed="1"/>
+    <w:lsdException w:name="Default Paragraph Font" w:semiHidden="1" w:uiPriority="1" w:unhideWhenUsed="1"/>
     <w:lsdException w:name="Body Text" w:semiHidden="1" w:unhideWhenUsed="1"/>
     <w:lsdException w:name="Body Text Indent" w:semiHidden="1" w:unhideWhenUsed="1"/>
     <w:lsdException w:name="List Continue" w:semiHidden="1" w:unhideWhenUsed="1"/>
@@ -2747,8 +2611,8 @@
     <w:lsdException w:name="Subtle Reference" w:uiPriority="31" w:qFormat="1"/>
     <w:lsdException w:name="Intense Reference" w:uiPriority="32" w:qFormat="1"/>
     <w:lsdException w:name="Book Title" w:uiPriority="33" w:qFormat="1"/>
-    <w:lsdException w:name="Bibliography" w:uiPriority="37" w:semiHidden="1" w:unhideWhenUsed="1"/>
-    <w:lsdException w:name="TOC Heading" w:uiPriority="39" w:semiHidden="1" w:unhideWhenUsed="1" w:qFormat="1"/>
+    <w:lsdException w:name="Bibliography" w:semiHidden="1" w:uiPriority="37" w:unhideWhenUsed="1"/>
+    <w:lsdException w:name="TOC Heading" w:semiHidden="1" w:uiPriority="39" w:unhideWhenUsed="1" w:qFormat="1"/>
     <w:lsdException w:name="Plain Table 1" w:uiPriority="41"/>
     <w:lsdException w:name="Plain Table 2" w:uiPriority="42"/>
     <w:lsdException w:name="Plain Table 3" w:uiPriority="43"/>
@@ -2859,24 +2723,14 @@
     <w:lsdException w:name="Unresolved Mention" w:semiHidden="1" w:unhideWhenUsed="1"/>
     <w:lsdException w:name="Smart Link" w:semiHidden="1" w:unhideWhenUsed="1"/>
   </w:latentStyles>
-  <w:style w:type="paragraph" w:styleId="Normal" w:default="1">
+  <w:style w:type="paragraph" w:default="1" w:styleId="Normal">
     <w:name w:val="Normal"/>
     <w:qFormat/>
-    <w:rsid w:val="00a7237e"/>
-    <w:pPr>
-      <w:widowControl/>
-      <w:suppressAutoHyphens w:val="true"/>
-      <w:bidi w:val="0"/>
-      <w:spacing w:before="0" w:after="0"/>
-      <w:jc w:val="start"/>
-    </w:pPr>
+    <w:rsid w:val="00A7237E"/>
     <w:rPr>
-      <w:rFonts w:ascii="Times New Roman" w:hAnsi="Times New Roman" w:cs="Gulim" w:eastAsia="Gulim"/>
-      <w:color w:val="auto"/>
+      <w:rFonts w:ascii="Times New Roman" w:hAnsi="Times New Roman" w:cs="Gulim"/>
       <w:kern w:val="0"/>
-      <w:sz w:val="24"/>
-      <w:szCs w:val="24"/>
-      <w:lang w:val="en-US" w:eastAsia="ko-KR" w:bidi="ar-SA"/>
+      <w:lang w:val="en-US" w:eastAsia="ko-KR"/>
       <w14:ligatures w14:val="none"/>
     </w:rPr>
   </w:style>
@@ -2888,19 +2742,18 @@
     <w:autoRedefine/>
     <w:uiPriority w:val="9"/>
     <w:qFormat/>
-    <w:rsid w:val="00a7237e"/>
+    <w:rsid w:val="00A7237E"/>
     <w:pPr>
-      <w:keepNext w:val="true"/>
+      <w:keepNext/>
       <w:numPr>
-        <w:ilvl w:val="0"/>
         <w:numId w:val="1"/>
       </w:numPr>
       <w:spacing w:before="120" w:after="120"/>
-      <w:ind w:endChars="100"/>
+      <w:ind w:rightChars="100" w:right="100"/>
       <w:outlineLvl w:val="0"/>
     </w:pPr>
     <w:rPr>
-      <w:rFonts w:eastAsia="Times New Roman" w:cs="" w:cstheme="majorBidi"/>
+      <w:rFonts w:eastAsia="Times New Roman" w:cstheme="majorBidi"/>
       <w:b/>
       <w:sz w:val="28"/>
       <w:szCs w:val="28"/>
@@ -2915,16 +2768,16 @@
     <w:semiHidden/>
     <w:unhideWhenUsed/>
     <w:qFormat/>
-    <w:rsid w:val="00ac40a2"/>
+    <w:rsid w:val="00AC40A2"/>
     <w:pPr>
-      <w:keepNext w:val="true"/>
+      <w:keepNext/>
       <w:keepLines/>
       <w:spacing w:before="160" w:after="80"/>
       <w:outlineLvl w:val="1"/>
     </w:pPr>
     <w:rPr>
-      <w:rFonts w:ascii="Aptos Display" w:hAnsi="Aptos Display" w:eastAsia="" w:cs="" w:asciiTheme="majorHAnsi" w:cstheme="majorBidi" w:eastAsiaTheme="majorEastAsia" w:hAnsiTheme="majorHAnsi"/>
-      <w:color w:themeColor="accent1" w:themeShade="bf" w:val="0F4761"/>
+      <w:rFonts w:asciiTheme="majorHAnsi" w:eastAsiaTheme="majorEastAsia" w:hAnsiTheme="majorHAnsi" w:cstheme="majorBidi"/>
+      <w:color w:val="0F4761" w:themeColor="accent1" w:themeShade="BF"/>
       <w:sz w:val="32"/>
       <w:szCs w:val="32"/>
     </w:rPr>
@@ -2938,16 +2791,16 @@
     <w:semiHidden/>
     <w:unhideWhenUsed/>
     <w:qFormat/>
-    <w:rsid w:val="00ac40a2"/>
+    <w:rsid w:val="00AC40A2"/>
     <w:pPr>
-      <w:keepNext w:val="true"/>
+      <w:keepNext/>
       <w:keepLines/>
       <w:spacing w:before="160" w:after="80"/>
       <w:outlineLvl w:val="2"/>
     </w:pPr>
     <w:rPr>
-      <w:rFonts w:ascii="Aptos" w:hAnsi="Aptos" w:eastAsia="" w:cs="" w:asciiTheme="minorHAnsi" w:cstheme="majorBidi" w:eastAsiaTheme="majorEastAsia" w:hAnsiTheme="minorHAnsi"/>
-      <w:color w:themeColor="accent1" w:themeShade="bf" w:val="0F4761"/>
+      <w:rFonts w:asciiTheme="minorHAnsi" w:eastAsiaTheme="majorEastAsia" w:hAnsiTheme="minorHAnsi" w:cstheme="majorBidi"/>
+      <w:color w:val="0F4761" w:themeColor="accent1" w:themeShade="BF"/>
       <w:sz w:val="28"/>
       <w:szCs w:val="28"/>
     </w:rPr>
@@ -2961,18 +2814,18 @@
     <w:semiHidden/>
     <w:unhideWhenUsed/>
     <w:qFormat/>
-    <w:rsid w:val="00ac40a2"/>
+    <w:rsid w:val="00AC40A2"/>
     <w:pPr>
-      <w:keepNext w:val="true"/>
+      <w:keepNext/>
       <w:keepLines/>
       <w:spacing w:before="80" w:after="40"/>
       <w:outlineLvl w:val="3"/>
     </w:pPr>
     <w:rPr>
-      <w:rFonts w:ascii="Aptos" w:hAnsi="Aptos" w:eastAsia="" w:cs="" w:asciiTheme="minorHAnsi" w:cstheme="majorBidi" w:eastAsiaTheme="majorEastAsia" w:hAnsiTheme="minorHAnsi"/>
+      <w:rFonts w:asciiTheme="minorHAnsi" w:eastAsiaTheme="majorEastAsia" w:hAnsiTheme="minorHAnsi" w:cstheme="majorBidi"/>
       <w:i/>
       <w:iCs/>
-      <w:color w:themeColor="accent1" w:themeShade="bf" w:val="0F4761"/>
+      <w:color w:val="0F4761" w:themeColor="accent1" w:themeShade="BF"/>
     </w:rPr>
   </w:style>
   <w:style w:type="paragraph" w:styleId="Heading5">
@@ -2984,16 +2837,16 @@
     <w:semiHidden/>
     <w:unhideWhenUsed/>
     <w:qFormat/>
-    <w:rsid w:val="00ac40a2"/>
+    <w:rsid w:val="00AC40A2"/>
     <w:pPr>
-      <w:keepNext w:val="true"/>
+      <w:keepNext/>
       <w:keepLines/>
       <w:spacing w:before="80" w:after="40"/>
       <w:outlineLvl w:val="4"/>
     </w:pPr>
     <w:rPr>
-      <w:rFonts w:ascii="Aptos" w:hAnsi="Aptos" w:eastAsia="" w:cs="" w:asciiTheme="minorHAnsi" w:cstheme="majorBidi" w:eastAsiaTheme="majorEastAsia" w:hAnsiTheme="minorHAnsi"/>
-      <w:color w:themeColor="accent1" w:themeShade="bf" w:val="0F4761"/>
+      <w:rFonts w:asciiTheme="minorHAnsi" w:eastAsiaTheme="majorEastAsia" w:hAnsiTheme="minorHAnsi" w:cstheme="majorBidi"/>
+      <w:color w:val="0F4761" w:themeColor="accent1" w:themeShade="BF"/>
     </w:rPr>
   </w:style>
   <w:style w:type="paragraph" w:styleId="Heading6">
@@ -3005,18 +2858,18 @@
     <w:semiHidden/>
     <w:unhideWhenUsed/>
     <w:qFormat/>
-    <w:rsid w:val="00ac40a2"/>
+    <w:rsid w:val="00AC40A2"/>
     <w:pPr>
-      <w:keepNext w:val="true"/>
+      <w:keepNext/>
       <w:keepLines/>
-      <w:spacing w:before="40" w:after="0"/>
+      <w:spacing w:before="40"/>
       <w:outlineLvl w:val="5"/>
     </w:pPr>
     <w:rPr>
-      <w:rFonts w:ascii="Aptos" w:hAnsi="Aptos" w:eastAsia="" w:cs="" w:asciiTheme="minorHAnsi" w:cstheme="majorBidi" w:eastAsiaTheme="majorEastAsia" w:hAnsiTheme="minorHAnsi"/>
+      <w:rFonts w:asciiTheme="minorHAnsi" w:eastAsiaTheme="majorEastAsia" w:hAnsiTheme="minorHAnsi" w:cstheme="majorBidi"/>
       <w:i/>
       <w:iCs/>
-      <w:color w:themeColor="text1" w:themeTint="a6" w:val="595959"/>
+      <w:color w:val="595959" w:themeColor="text1" w:themeTint="A6"/>
     </w:rPr>
   </w:style>
   <w:style w:type="paragraph" w:styleId="Heading7">
@@ -3028,16 +2881,16 @@
     <w:semiHidden/>
     <w:unhideWhenUsed/>
     <w:qFormat/>
-    <w:rsid w:val="00ac40a2"/>
+    <w:rsid w:val="00AC40A2"/>
     <w:pPr>
-      <w:keepNext w:val="true"/>
+      <w:keepNext/>
       <w:keepLines/>
-      <w:spacing w:before="40" w:after="0"/>
+      <w:spacing w:before="40"/>
       <w:outlineLvl w:val="6"/>
     </w:pPr>
     <w:rPr>
-      <w:rFonts w:ascii="Aptos" w:hAnsi="Aptos" w:eastAsia="" w:cs="" w:asciiTheme="minorHAnsi" w:cstheme="majorBidi" w:eastAsiaTheme="majorEastAsia" w:hAnsiTheme="minorHAnsi"/>
-      <w:color w:themeColor="text1" w:themeTint="a6" w:val="595959"/>
+      <w:rFonts w:asciiTheme="minorHAnsi" w:eastAsiaTheme="majorEastAsia" w:hAnsiTheme="minorHAnsi" w:cstheme="majorBidi"/>
+      <w:color w:val="595959" w:themeColor="text1" w:themeTint="A6"/>
     </w:rPr>
   </w:style>
   <w:style w:type="paragraph" w:styleId="Heading8">
@@ -3049,17 +2902,17 @@
     <w:semiHidden/>
     <w:unhideWhenUsed/>
     <w:qFormat/>
-    <w:rsid w:val="00ac40a2"/>
+    <w:rsid w:val="00AC40A2"/>
     <w:pPr>
-      <w:keepNext w:val="true"/>
+      <w:keepNext/>
       <w:keepLines/>
       <w:outlineLvl w:val="7"/>
     </w:pPr>
     <w:rPr>
-      <w:rFonts w:ascii="Aptos" w:hAnsi="Aptos" w:eastAsia="" w:cs="" w:asciiTheme="minorHAnsi" w:cstheme="majorBidi" w:eastAsiaTheme="majorEastAsia" w:hAnsiTheme="minorHAnsi"/>
+      <w:rFonts w:asciiTheme="minorHAnsi" w:eastAsiaTheme="majorEastAsia" w:hAnsiTheme="minorHAnsi" w:cstheme="majorBidi"/>
       <w:i/>
       <w:iCs/>
-      <w:color w:themeColor="text1" w:themeTint="d8" w:val="272727"/>
+      <w:color w:val="272727" w:themeColor="text1" w:themeTint="D8"/>
     </w:rPr>
   </w:style>
   <w:style w:type="paragraph" w:styleId="Heading9">
@@ -3071,51 +2924,70 @@
     <w:semiHidden/>
     <w:unhideWhenUsed/>
     <w:qFormat/>
-    <w:rsid w:val="00ac40a2"/>
+    <w:rsid w:val="00AC40A2"/>
     <w:pPr>
-      <w:keepNext w:val="true"/>
+      <w:keepNext/>
       <w:keepLines/>
       <w:outlineLvl w:val="8"/>
     </w:pPr>
     <w:rPr>
-      <w:rFonts w:ascii="Aptos" w:hAnsi="Aptos" w:eastAsia="" w:cs="" w:asciiTheme="minorHAnsi" w:cstheme="majorBidi" w:eastAsiaTheme="majorEastAsia" w:hAnsiTheme="minorHAnsi"/>
-      <w:color w:themeColor="text1" w:themeTint="d8" w:val="272727"/>
+      <w:rFonts w:asciiTheme="minorHAnsi" w:eastAsiaTheme="majorEastAsia" w:hAnsiTheme="minorHAnsi" w:cstheme="majorBidi"/>
+      <w:color w:val="272727" w:themeColor="text1" w:themeTint="D8"/>
     </w:rPr>
   </w:style>
-  <w:style w:type="character" w:styleId="DefaultParagraphFont" w:default="1">
+  <w:style w:type="character" w:default="1" w:styleId="DefaultParagraphFont">
     <w:name w:val="Default Paragraph Font"/>
     <w:uiPriority w:val="1"/>
     <w:semiHidden/>
     <w:unhideWhenUsed/>
-    <w:qFormat/>
-    <w:rPr/>
-  </w:style>
-  <w:style w:type="character" w:styleId="Heading1Char" w:customStyle="1">
+  </w:style>
+  <w:style w:type="table" w:default="1" w:styleId="TableNormal">
+    <w:name w:val="Normal Table"/>
+    <w:uiPriority w:val="99"/>
+    <w:semiHidden/>
+    <w:unhideWhenUsed/>
+    <w:tblPr>
+      <w:tblInd w:w="0" w:type="dxa"/>
+      <w:tblCellMar>
+        <w:top w:w="0" w:type="dxa"/>
+        <w:left w:w="108" w:type="dxa"/>
+        <w:bottom w:w="0" w:type="dxa"/>
+        <w:right w:w="108" w:type="dxa"/>
+      </w:tblCellMar>
+    </w:tblPr>
+  </w:style>
+  <w:style w:type="numbering" w:default="1" w:styleId="NoList">
+    <w:name w:val="No List"/>
+    <w:uiPriority w:val="99"/>
+    <w:semiHidden/>
+    <w:unhideWhenUsed/>
+  </w:style>
+  <w:style w:type="character" w:customStyle="1" w:styleId="Heading1Char">
     <w:name w:val="Heading 1 Char"/>
     <w:basedOn w:val="DefaultParagraphFont"/>
     <w:link w:val="Heading1"/>
     <w:uiPriority w:val="9"/>
     <w:qFormat/>
-    <w:rsid w:val="00a7237e"/>
+    <w:rsid w:val="00A7237E"/>
     <w:rPr>
-      <w:rFonts w:ascii="Times New Roman" w:hAnsi="Times New Roman" w:eastAsia="Times New Roman" w:cs="" w:cstheme="majorBidi"/>
+      <w:rFonts w:ascii="Times New Roman" w:eastAsia="Times New Roman" w:hAnsi="Times New Roman" w:cstheme="majorBidi"/>
       <w:b/>
       <w:sz w:val="28"/>
       <w:szCs w:val="28"/>
       <w:lang w:eastAsia="ko-KR"/>
     </w:rPr>
   </w:style>
-  <w:style w:type="character" w:styleId="Heading2Char" w:customStyle="1">
+  <w:style w:type="character" w:customStyle="1" w:styleId="Heading2Char">
     <w:name w:val="Heading 2 Char"/>
     <w:basedOn w:val="DefaultParagraphFont"/>
     <w:link w:val="Heading2"/>
     <w:uiPriority w:val="9"/>
     <w:semiHidden/>
     <w:qFormat/>
-    <w:rsid w:val="00ac40a2"/>
+    <w:rsid w:val="00AC40A2"/>
     <w:rPr>
-      <w:rFonts w:ascii="Aptos Display" w:hAnsi="Aptos Display" w:eastAsia="" w:cs="" w:asciiTheme="majorHAnsi" w:cstheme="majorBidi" w:eastAsiaTheme="majorEastAsia" w:hAnsiTheme="majorHAnsi"/>
-      <w:color w:themeColor="accent1" w:themeShade="bf" w:val="0F4761"/>
+      <w:rFonts w:asciiTheme="majorHAnsi" w:eastAsiaTheme="majorEastAsia" w:hAnsiTheme="majorHAnsi" w:cstheme="majorBidi"/>
+      <w:color w:val="0F4761" w:themeColor="accent1" w:themeShade="BF"/>
       <w:kern w:val="0"/>
       <w:sz w:val="32"/>
       <w:szCs w:val="32"/>
@@ -3123,17 +2995,17 @@
       <w14:ligatures w14:val="none"/>
     </w:rPr>
   </w:style>
-  <w:style w:type="character" w:styleId="Heading3Char" w:customStyle="1">
+  <w:style w:type="character" w:customStyle="1" w:styleId="Heading3Char">
     <w:name w:val="Heading 3 Char"/>
     <w:basedOn w:val="DefaultParagraphFont"/>
     <w:link w:val="Heading3"/>
     <w:uiPriority w:val="9"/>
     <w:semiHidden/>
     <w:qFormat/>
-    <w:rsid w:val="00ac40a2"/>
+    <w:rsid w:val="00AC40A2"/>
     <w:rPr>
-      <w:rFonts w:eastAsia="" w:cs="" w:cstheme="majorBidi" w:eastAsiaTheme="majorEastAsia"/>
-      <w:color w:themeColor="accent1" w:themeShade="bf" w:val="0F4761"/>
+      <w:rFonts w:eastAsiaTheme="majorEastAsia" w:cstheme="majorBidi"/>
+      <w:color w:val="0F4761" w:themeColor="accent1" w:themeShade="BF"/>
       <w:kern w:val="0"/>
       <w:sz w:val="28"/>
       <w:szCs w:val="28"/>
@@ -3141,117 +3013,117 @@
       <w14:ligatures w14:val="none"/>
     </w:rPr>
   </w:style>
-  <w:style w:type="character" w:styleId="Heading4Char" w:customStyle="1">
+  <w:style w:type="character" w:customStyle="1" w:styleId="Heading4Char">
     <w:name w:val="Heading 4 Char"/>
     <w:basedOn w:val="DefaultParagraphFont"/>
     <w:link w:val="Heading4"/>
     <w:uiPriority w:val="9"/>
     <w:semiHidden/>
     <w:qFormat/>
-    <w:rsid w:val="00ac40a2"/>
+    <w:rsid w:val="00AC40A2"/>
     <w:rPr>
-      <w:rFonts w:eastAsia="" w:cs="" w:cstheme="majorBidi" w:eastAsiaTheme="majorEastAsia"/>
+      <w:rFonts w:eastAsiaTheme="majorEastAsia" w:cstheme="majorBidi"/>
       <w:i/>
       <w:iCs/>
-      <w:color w:themeColor="accent1" w:themeShade="bf" w:val="0F4761"/>
+      <w:color w:val="0F4761" w:themeColor="accent1" w:themeShade="BF"/>
       <w:kern w:val="0"/>
       <w:lang w:val="en-US" w:eastAsia="ko-KR"/>
       <w14:ligatures w14:val="none"/>
     </w:rPr>
   </w:style>
-  <w:style w:type="character" w:styleId="Heading5Char" w:customStyle="1">
+  <w:style w:type="character" w:customStyle="1" w:styleId="Heading5Char">
     <w:name w:val="Heading 5 Char"/>
     <w:basedOn w:val="DefaultParagraphFont"/>
     <w:link w:val="Heading5"/>
     <w:uiPriority w:val="9"/>
     <w:semiHidden/>
     <w:qFormat/>
-    <w:rsid w:val="00ac40a2"/>
+    <w:rsid w:val="00AC40A2"/>
     <w:rPr>
-      <w:rFonts w:eastAsia="" w:cs="" w:cstheme="majorBidi" w:eastAsiaTheme="majorEastAsia"/>
-      <w:color w:themeColor="accent1" w:themeShade="bf" w:val="0F4761"/>
+      <w:rFonts w:eastAsiaTheme="majorEastAsia" w:cstheme="majorBidi"/>
+      <w:color w:val="0F4761" w:themeColor="accent1" w:themeShade="BF"/>
       <w:kern w:val="0"/>
       <w:lang w:val="en-US" w:eastAsia="ko-KR"/>
       <w14:ligatures w14:val="none"/>
     </w:rPr>
   </w:style>
-  <w:style w:type="character" w:styleId="Heading6Char" w:customStyle="1">
+  <w:style w:type="character" w:customStyle="1" w:styleId="Heading6Char">
     <w:name w:val="Heading 6 Char"/>
     <w:basedOn w:val="DefaultParagraphFont"/>
     <w:link w:val="Heading6"/>
     <w:uiPriority w:val="9"/>
     <w:semiHidden/>
     <w:qFormat/>
-    <w:rsid w:val="00ac40a2"/>
+    <w:rsid w:val="00AC40A2"/>
     <w:rPr>
-      <w:rFonts w:eastAsia="" w:cs="" w:cstheme="majorBidi" w:eastAsiaTheme="majorEastAsia"/>
+      <w:rFonts w:eastAsiaTheme="majorEastAsia" w:cstheme="majorBidi"/>
       <w:i/>
       <w:iCs/>
-      <w:color w:themeColor="text1" w:themeTint="a6" w:val="595959"/>
+      <w:color w:val="595959" w:themeColor="text1" w:themeTint="A6"/>
       <w:kern w:val="0"/>
       <w:lang w:val="en-US" w:eastAsia="ko-KR"/>
       <w14:ligatures w14:val="none"/>
     </w:rPr>
   </w:style>
-  <w:style w:type="character" w:styleId="Heading7Char" w:customStyle="1">
+  <w:style w:type="character" w:customStyle="1" w:styleId="Heading7Char">
     <w:name w:val="Heading 7 Char"/>
     <w:basedOn w:val="DefaultParagraphFont"/>
     <w:link w:val="Heading7"/>
     <w:uiPriority w:val="9"/>
     <w:semiHidden/>
     <w:qFormat/>
-    <w:rsid w:val="00ac40a2"/>
+    <w:rsid w:val="00AC40A2"/>
     <w:rPr>
-      <w:rFonts w:eastAsia="" w:cs="" w:cstheme="majorBidi" w:eastAsiaTheme="majorEastAsia"/>
-      <w:color w:themeColor="text1" w:themeTint="a6" w:val="595959"/>
+      <w:rFonts w:eastAsiaTheme="majorEastAsia" w:cstheme="majorBidi"/>
+      <w:color w:val="595959" w:themeColor="text1" w:themeTint="A6"/>
       <w:kern w:val="0"/>
       <w:lang w:val="en-US" w:eastAsia="ko-KR"/>
       <w14:ligatures w14:val="none"/>
     </w:rPr>
   </w:style>
-  <w:style w:type="character" w:styleId="Heading8Char" w:customStyle="1">
+  <w:style w:type="character" w:customStyle="1" w:styleId="Heading8Char">
     <w:name w:val="Heading 8 Char"/>
     <w:basedOn w:val="DefaultParagraphFont"/>
     <w:link w:val="Heading8"/>
     <w:uiPriority w:val="9"/>
     <w:semiHidden/>
     <w:qFormat/>
-    <w:rsid w:val="00ac40a2"/>
+    <w:rsid w:val="00AC40A2"/>
     <w:rPr>
-      <w:rFonts w:eastAsia="" w:cs="" w:cstheme="majorBidi" w:eastAsiaTheme="majorEastAsia"/>
+      <w:rFonts w:eastAsiaTheme="majorEastAsia" w:cstheme="majorBidi"/>
       <w:i/>
       <w:iCs/>
-      <w:color w:themeColor="text1" w:themeTint="d8" w:val="272727"/>
+      <w:color w:val="272727" w:themeColor="text1" w:themeTint="D8"/>
       <w:kern w:val="0"/>
       <w:lang w:val="en-US" w:eastAsia="ko-KR"/>
       <w14:ligatures w14:val="none"/>
     </w:rPr>
   </w:style>
-  <w:style w:type="character" w:styleId="Heading9Char" w:customStyle="1">
+  <w:style w:type="character" w:customStyle="1" w:styleId="Heading9Char">
     <w:name w:val="Heading 9 Char"/>
     <w:basedOn w:val="DefaultParagraphFont"/>
     <w:link w:val="Heading9"/>
     <w:uiPriority w:val="9"/>
     <w:semiHidden/>
     <w:qFormat/>
-    <w:rsid w:val="00ac40a2"/>
+    <w:rsid w:val="00AC40A2"/>
     <w:rPr>
-      <w:rFonts w:eastAsia="" w:cs="" w:cstheme="majorBidi" w:eastAsiaTheme="majorEastAsia"/>
-      <w:color w:themeColor="text1" w:themeTint="d8" w:val="272727"/>
+      <w:rFonts w:eastAsiaTheme="majorEastAsia" w:cstheme="majorBidi"/>
+      <w:color w:val="272727" w:themeColor="text1" w:themeTint="D8"/>
       <w:kern w:val="0"/>
       <w:lang w:val="en-US" w:eastAsia="ko-KR"/>
       <w14:ligatures w14:val="none"/>
     </w:rPr>
   </w:style>
-  <w:style w:type="character" w:styleId="TitleChar" w:customStyle="1">
+  <w:style w:type="character" w:customStyle="1" w:styleId="TitleChar">
     <w:name w:val="Title Char"/>
     <w:basedOn w:val="DefaultParagraphFont"/>
     <w:link w:val="Title"/>
     <w:uiPriority w:val="10"/>
     <w:qFormat/>
-    <w:rsid w:val="00ac40a2"/>
+    <w:rsid w:val="00AC40A2"/>
     <w:rPr>
-      <w:rFonts w:ascii="Aptos Display" w:hAnsi="Aptos Display" w:eastAsia="" w:cs="" w:asciiTheme="majorHAnsi" w:cstheme="majorBidi" w:eastAsiaTheme="majorEastAsia" w:hAnsiTheme="majorHAnsi"/>
+      <w:rFonts w:asciiTheme="majorHAnsi" w:eastAsiaTheme="majorEastAsia" w:hAnsiTheme="majorHAnsi" w:cstheme="majorBidi"/>
       <w:spacing w:val="-10"/>
       <w:kern w:val="2"/>
       <w:sz w:val="56"/>
@@ -3260,16 +3132,16 @@
       <w14:ligatures w14:val="none"/>
     </w:rPr>
   </w:style>
-  <w:style w:type="character" w:styleId="SubtitleChar" w:customStyle="1">
+  <w:style w:type="character" w:customStyle="1" w:styleId="SubtitleChar">
     <w:name w:val="Subtitle Char"/>
     <w:basedOn w:val="DefaultParagraphFont"/>
     <w:link w:val="Subtitle"/>
     <w:uiPriority w:val="11"/>
     <w:qFormat/>
-    <w:rsid w:val="00ac40a2"/>
+    <w:rsid w:val="00AC40A2"/>
     <w:rPr>
-      <w:rFonts w:eastAsia="" w:cs="" w:cstheme="majorBidi" w:eastAsiaTheme="majorEastAsia"/>
-      <w:color w:themeColor="text1" w:themeTint="a6" w:val="595959"/>
+      <w:rFonts w:eastAsiaTheme="majorEastAsia" w:cstheme="majorBidi"/>
+      <w:color w:val="595959" w:themeColor="text1" w:themeTint="A6"/>
       <w:spacing w:val="15"/>
       <w:kern w:val="0"/>
       <w:sz w:val="28"/>
@@ -3278,18 +3150,18 @@
       <w14:ligatures w14:val="none"/>
     </w:rPr>
   </w:style>
-  <w:style w:type="character" w:styleId="QuoteChar" w:customStyle="1">
+  <w:style w:type="character" w:customStyle="1" w:styleId="QuoteChar">
     <w:name w:val="Quote Char"/>
     <w:basedOn w:val="DefaultParagraphFont"/>
     <w:link w:val="Quote"/>
     <w:uiPriority w:val="29"/>
     <w:qFormat/>
-    <w:rsid w:val="00ac40a2"/>
+    <w:rsid w:val="00AC40A2"/>
     <w:rPr>
       <w:rFonts w:ascii="Times New Roman" w:hAnsi="Times New Roman" w:cs="Gulim"/>
       <w:i/>
       <w:iCs/>
-      <w:color w:themeColor="text1" w:themeTint="bf" w:val="404040"/>
+      <w:color w:val="404040" w:themeColor="text1" w:themeTint="BF"/>
       <w:kern w:val="0"/>
       <w:lang w:val="en-US" w:eastAsia="ko-KR"/>
       <w14:ligatures w14:val="none"/>
@@ -3300,25 +3172,25 @@
     <w:basedOn w:val="DefaultParagraphFont"/>
     <w:uiPriority w:val="21"/>
     <w:qFormat/>
-    <w:rsid w:val="00ac40a2"/>
+    <w:rsid w:val="00AC40A2"/>
     <w:rPr>
       <w:i/>
       <w:iCs/>
-      <w:color w:themeColor="accent1" w:themeShade="bf" w:val="0F4761"/>
+      <w:color w:val="0F4761" w:themeColor="accent1" w:themeShade="BF"/>
     </w:rPr>
   </w:style>
-  <w:style w:type="character" w:styleId="IntenseQuoteChar" w:customStyle="1">
+  <w:style w:type="character" w:customStyle="1" w:styleId="IntenseQuoteChar">
     <w:name w:val="Intense Quote Char"/>
     <w:basedOn w:val="DefaultParagraphFont"/>
     <w:link w:val="IntenseQuote"/>
     <w:uiPriority w:val="30"/>
     <w:qFormat/>
-    <w:rsid w:val="00ac40a2"/>
+    <w:rsid w:val="00AC40A2"/>
     <w:rPr>
       <w:rFonts w:ascii="Times New Roman" w:hAnsi="Times New Roman" w:cs="Gulim"/>
       <w:i/>
       <w:iCs/>
-      <w:color w:themeColor="accent1" w:themeShade="bf" w:val="0F4761"/>
+      <w:color w:val="0F4761" w:themeColor="accent1" w:themeShade="BF"/>
       <w:kern w:val="0"/>
       <w:lang w:val="en-US" w:eastAsia="ko-KR"/>
       <w14:ligatures w14:val="none"/>
@@ -3329,26 +3201,26 @@
     <w:basedOn w:val="DefaultParagraphFont"/>
     <w:uiPriority w:val="32"/>
     <w:qFormat/>
-    <w:rsid w:val="00ac40a2"/>
+    <w:rsid w:val="00AC40A2"/>
     <w:rPr>
       <w:b/>
       <w:bCs/>
       <w:smallCaps/>
-      <w:color w:themeColor="accent1" w:themeShade="bf" w:val="0F4761"/>
+      <w:color w:val="0F4761" w:themeColor="accent1" w:themeShade="BF"/>
       <w:spacing w:val="5"/>
     </w:rPr>
   </w:style>
-  <w:style w:type="paragraph" w:styleId="Heading" w:customStyle="1">
+  <w:style w:type="paragraph" w:customStyle="1" w:styleId="Heading">
     <w:name w:val="Heading"/>
     <w:basedOn w:val="Normal"/>
     <w:next w:val="BodyText"/>
     <w:qFormat/>
     <w:pPr>
-      <w:keepNext w:val="true"/>
+      <w:keepNext/>
       <w:spacing w:before="240" w:after="120"/>
     </w:pPr>
     <w:rPr>
-      <w:rFonts w:ascii="Liberation Sans" w:hAnsi="Liberation Sans" w:eastAsia="Noto Sans CJK SC" w:cs="Noto Sans Devanagari"/>
+      <w:rFonts w:ascii="Liberation Sans" w:eastAsia="Noto Sans CJK SC" w:hAnsi="Liberation Sans" w:cs="Noto Sans Devanagari"/>
       <w:sz w:val="28"/>
       <w:szCs w:val="28"/>
     </w:rPr>
@@ -3357,14 +3229,12 @@
     <w:name w:val="Body Text"/>
     <w:basedOn w:val="Normal"/>
     <w:pPr>
-      <w:spacing w:lineRule="auto" w:line="276" w:before="0" w:after="140"/>
+      <w:spacing w:after="140" w:line="276" w:lineRule="auto"/>
     </w:pPr>
-    <w:rPr/>
   </w:style>
   <w:style w:type="paragraph" w:styleId="List">
     <w:name w:val="List"/>
     <w:basedOn w:val="BodyText"/>
-    <w:pPr/>
     <w:rPr>
       <w:rFonts w:cs="Noto Sans Devanagari"/>
     </w:rPr>
@@ -3383,7 +3253,7 @@
       <w:iCs/>
     </w:rPr>
   </w:style>
-  <w:style w:type="paragraph" w:styleId="Index" w:customStyle="1">
+  <w:style w:type="paragraph" w:customStyle="1" w:styleId="Index">
     <w:name w:val="Index"/>
     <w:basedOn w:val="Normal"/>
     <w:qFormat/>
@@ -3400,17 +3270,16 @@
     <w:autoRedefine/>
     <w:uiPriority w:val="34"/>
     <w:qFormat/>
-    <w:rsid w:val="00a7237e"/>
+    <w:rsid w:val="00A7237E"/>
     <w:pPr>
       <w:numPr>
-        <w:ilvl w:val="0"/>
         <w:numId w:val="2"/>
       </w:numPr>
-      <w:spacing w:lineRule="auto" w:line="259" w:before="0" w:after="160"/>
-      <w:ind w:start="240"/>
+      <w:spacing w:after="160" w:line="259" w:lineRule="auto"/>
+      <w:ind w:left="240"/>
     </w:pPr>
     <w:rPr>
-      <w:rFonts w:eastAsia="" w:cs="Times New Roman" w:eastAsiaTheme="minorEastAsia"/>
+      <w:rFonts w:eastAsiaTheme="minorEastAsia" w:cs="Times New Roman"/>
       <w:iCs/>
       <w:sz w:val="26"/>
       <w:szCs w:val="26"/>
@@ -3423,13 +3292,13 @@
     <w:link w:val="TitleChar"/>
     <w:uiPriority w:val="10"/>
     <w:qFormat/>
-    <w:rsid w:val="00ac40a2"/>
+    <w:rsid w:val="00AC40A2"/>
     <w:pPr>
-      <w:spacing w:before="0" w:after="80"/>
+      <w:spacing w:after="80"/>
       <w:contextualSpacing/>
     </w:pPr>
     <w:rPr>
-      <w:rFonts w:ascii="Aptos Display" w:hAnsi="Aptos Display" w:eastAsia="" w:cs="" w:asciiTheme="majorHAnsi" w:cstheme="majorBidi" w:eastAsiaTheme="majorEastAsia" w:hAnsiTheme="majorHAnsi"/>
+      <w:rFonts w:asciiTheme="majorHAnsi" w:eastAsiaTheme="majorEastAsia" w:hAnsiTheme="majorHAnsi" w:cstheme="majorBidi"/>
       <w:spacing w:val="-10"/>
       <w:kern w:val="2"/>
       <w:sz w:val="56"/>
@@ -3443,13 +3312,13 @@
     <w:link w:val="SubtitleChar"/>
     <w:uiPriority w:val="11"/>
     <w:qFormat/>
-    <w:rsid w:val="00ac40a2"/>
+    <w:rsid w:val="00AC40A2"/>
     <w:pPr>
-      <w:spacing w:before="0" w:after="160"/>
+      <w:spacing w:after="160"/>
     </w:pPr>
     <w:rPr>
-      <w:rFonts w:ascii="Aptos" w:hAnsi="Aptos" w:eastAsia="" w:cs="" w:asciiTheme="minorHAnsi" w:cstheme="majorBidi" w:eastAsiaTheme="majorEastAsia" w:hAnsiTheme="minorHAnsi"/>
-      <w:color w:themeColor="text1" w:themeTint="a6" w:val="595959"/>
+      <w:rFonts w:asciiTheme="minorHAnsi" w:eastAsiaTheme="majorEastAsia" w:hAnsiTheme="minorHAnsi" w:cstheme="majorBidi"/>
+      <w:color w:val="595959" w:themeColor="text1" w:themeTint="A6"/>
       <w:spacing w:val="15"/>
       <w:sz w:val="28"/>
       <w:szCs w:val="28"/>
@@ -3462,7 +3331,7 @@
     <w:link w:val="QuoteChar"/>
     <w:uiPriority w:val="29"/>
     <w:qFormat/>
-    <w:rsid w:val="00ac40a2"/>
+    <w:rsid w:val="00AC40A2"/>
     <w:pPr>
       <w:spacing w:before="160" w:after="160"/>
       <w:jc w:val="center"/>
@@ -3470,7 +3339,7 @@
     <w:rPr>
       <w:i/>
       <w:iCs/>
-      <w:color w:themeColor="text1" w:themeTint="bf" w:val="404040"/>
+      <w:color w:val="404040" w:themeColor="text1" w:themeTint="BF"/>
     </w:rPr>
   </w:style>
   <w:style w:type="paragraph" w:styleId="IntenseQuote">
@@ -3480,48 +3349,27 @@
     <w:link w:val="IntenseQuoteChar"/>
     <w:uiPriority w:val="30"/>
     <w:qFormat/>
-    <w:rsid w:val="00ac40a2"/>
+    <w:rsid w:val="00AC40A2"/>
     <w:pPr>
       <w:pBdr>
-        <w:top w:val="single" w:sz="4" w:space="10" w:color="0F4761" w:themeColor="accent1" w:themeShade="bf"/>
-        <w:bottom w:val="single" w:sz="4" w:space="10" w:color="0F4761" w:themeColor="accent1" w:themeShade="bf"/>
+        <w:top w:val="single" w:sz="4" w:space="10" w:color="0F4761" w:themeColor="accent1" w:themeShade="BF"/>
+        <w:bottom w:val="single" w:sz="4" w:space="10" w:color="0F4761" w:themeColor="accent1" w:themeShade="BF"/>
       </w:pBdr>
       <w:spacing w:before="360" w:after="360"/>
-      <w:ind w:start="864" w:end="864"/>
+      <w:ind w:left="864" w:right="864"/>
       <w:jc w:val="center"/>
     </w:pPr>
     <w:rPr>
       <w:i/>
       <w:iCs/>
-      <w:color w:themeColor="accent1" w:themeShade="bf" w:val="0F4761"/>
+      <w:color w:val="0F4761" w:themeColor="accent1" w:themeShade="BF"/>
     </w:rPr>
-  </w:style>
-  <w:style w:type="numbering" w:styleId="NoList" w:default="1">
-    <w:name w:val="No List"/>
-    <w:uiPriority w:val="99"/>
-    <w:semiHidden/>
-    <w:unhideWhenUsed/>
-    <w:qFormat/>
-  </w:style>
-  <w:style w:type="table" w:default="1" w:styleId="TableNormal">
-    <w:name w:val="Normal Table"/>
-    <w:uiPriority w:val="99"/>
-    <w:semiHidden/>
-    <w:unhideWhenUsed/>
-    <w:tblPr>
-      <w:tblCellMar>
-        <w:top w:w="0" w:type="dxa"/>
-        <w:left w:w="108" w:type="dxa"/>
-        <w:bottom w:w="0" w:type="dxa"/>
-        <w:right w:w="108" w:type="dxa"/>
-      </w:tblCellMar>
-    </w:tblPr>
   </w:style>
 </w:styles>
 </file>
 
 <file path=word/theme/theme1.xml><?xml version="1.0" encoding="utf-8"?>
-<a:theme xmlns:a="http://schemas.openxmlformats.org/drawingml/2006/main" xmlns:r="http://schemas.openxmlformats.org/officeDocument/2006/relationships" name="Office Theme">
+<a:theme xmlns:a="http://schemas.openxmlformats.org/drawingml/2006/main" name="Office Theme">
   <a:themeElements>
     <a:clrScheme name="Office">
       <a:dk1>
@@ -3563,12 +3411,12 @@
     </a:clrScheme>
     <a:fontScheme name="Office">
       <a:majorFont>
-        <a:latin typeface="Aptos Display" panose="02110004020202020204" pitchFamily="0" charset="1"/>
+        <a:latin typeface="Aptos Display" panose="02110004020202020204"/>
         <a:ea typeface=""/>
         <a:cs typeface=""/>
       </a:majorFont>
       <a:minorFont>
-        <a:latin typeface="Aptos" panose="02110004020202020204" pitchFamily="0" charset="1"/>
+        <a:latin typeface="Aptos" panose="02110004020202020204"/>
         <a:ea typeface=""/>
         <a:cs typeface=""/>
       </a:minorFont>
@@ -3600,7 +3448,7 @@
             </a:gs>
           </a:gsLst>
           <a:lin ang="5400000" scaled="0"/>
-          <a:tileRect l="0" t="0" r="0" b="0"/>
+          <a:tileRect/>
         </a:gradFill>
         <a:gradFill>
           <a:gsLst>
@@ -3624,7 +3472,7 @@
             </a:gs>
           </a:gsLst>
           <a:lin ang="5400000" scaled="0"/>
-          <a:tileRect l="0" t="0" r="0" b="0"/>
+          <a:tileRect/>
         </a:gradFill>
       </a:fillStyleLst>
       <a:lnStyleLst>
@@ -3684,10 +3532,12 @@
             </a:gs>
           </a:gsLst>
           <a:lin ang="5400000" scaled="0"/>
-          <a:tileRect l="0" t="0" r="0" b="0"/>
+          <a:tileRect/>
         </a:gradFill>
       </a:bgFillStyleLst>
     </a:fmtScheme>
   </a:themeElements>
+  <a:objectDefaults/>
+  <a:extraClrSchemeLst/>
 </a:theme>
 </file>
</xml_diff>

<commit_message>
WIP: continue to work on /api/tickets/{id} api change
</commit_message>
<xml_diff>
--- a/specification_breakdown.docx
+++ b/specification_breakdown.docx
@@ -1550,6 +1550,25 @@
           <w:rFonts w:eastAsia="Times New Roman"/>
         </w:rPr>
         <w:t>Add assignee fetch for ticket detail</w:t>
+      </w:r>
+    </w:p>
+    <w:p>
+      <w:pPr>
+        <w:pStyle w:val="ListParagraph"/>
+        <w:numPr>
+          <w:ilvl w:val="0"/>
+          <w:numId w:val="3"/>
+        </w:numPr>
+        <w:spacing w:beforeAutospacing="1" w:afterAutospacing="1"/>
+        <w:rPr>
+          <w:rFonts w:eastAsia="Times New Roman"/>
+        </w:rPr>
+      </w:pPr>
+      <w:r>
+        <w:rPr>
+          <w:rFonts w:eastAsia="Times New Roman"/>
+        </w:rPr>
+        <w:t>User can’t accept ticket</w:t>
       </w:r>
     </w:p>
     <w:p>

</xml_diff>

<commit_message>
Update specification for notification
</commit_message>
<xml_diff>
--- a/specification_breakdown.docx
+++ b/specification_breakdown.docx
@@ -997,35 +997,134 @@
         <w:rPr>
           <w:rFonts w:eastAsia="Times New Roman"/>
         </w:rPr>
-        <w:t>Observer có hai sự kiện cơ bản: onTicketStatusChange</w:t>
-      </w:r>
-    </w:p>
-    <w:p>
-      <w:pPr>
-        <w:spacing w:beforeAutospacing="1" w:afterAutospacing="1"/>
-        <w:rPr>
-          <w:rFonts w:eastAsia="Times New Roman"/>
-        </w:rPr>
-      </w:pPr>
-      <w:r>
-        <w:rPr>
-          <w:rFonts w:eastAsia="Times New Roman"/>
-        </w:rPr>
-        <w:t>Một Observer sẽ có một loại thuộc tính là EventType gồm có thể có: Created, OnChange, Finish</w:t>
-      </w:r>
-    </w:p>
-    <w:p>
-      <w:pPr>
-        <w:spacing w:beforeAutospacing="1" w:afterAutospacing="1"/>
-        <w:rPr>
-          <w:rFonts w:eastAsia="Times New Roman"/>
-        </w:rPr>
-      </w:pPr>
-      <w:r>
-        <w:rPr>
-          <w:rFonts w:eastAsia="Times New Roman"/>
-        </w:rPr>
-        <w:t>Use httpOnly to prevent xss oops</w:t>
+        <w:t>Người dùng a đã tạo một ticket mới với tiêu đề …</w:t>
+      </w:r>
+    </w:p>
+    <w:p>
+      <w:pPr>
+        <w:spacing w:beforeAutospacing="1" w:afterAutospacing="1"/>
+        <w:rPr>
+          <w:rFonts w:eastAsia="Times New Roman"/>
+        </w:rPr>
+      </w:pPr>
+      <w:r>
+        <w:rPr>
+          <w:rFonts w:eastAsia="Times New Roman"/>
+        </w:rPr>
+        <w:t>Admin b đã thêm người xử lí IT c</w:t>
+      </w:r>
+    </w:p>
+    <w:p>
+      <w:pPr>
+        <w:spacing w:beforeAutospacing="1" w:afterAutospacing="1"/>
+        <w:rPr>
+          <w:rFonts w:eastAsia="Times New Roman"/>
+        </w:rPr>
+      </w:pPr>
+      <w:r>
+        <w:rPr>
+          <w:rFonts w:eastAsia="Times New Roman"/>
+        </w:rPr>
+        <w:t xml:space="preserve">IT c đã thêm một comment vào ticket tiêu đề </w:t>
+      </w:r>
+    </w:p>
+    <w:p>
+      <w:pPr>
+        <w:spacing w:beforeAutospacing="1" w:afterAutospacing="1"/>
+        <w:rPr>
+          <w:rFonts w:eastAsia="Times New Roman"/>
+        </w:rPr>
+      </w:pPr>
+      <w:r>
+        <w:rPr>
+          <w:rFonts w:eastAsia="Times New Roman"/>
+        </w:rPr>
+        <w:t>Người dùng a đã thêm một comment vào ticket tiêu đề</w:t>
+      </w:r>
+    </w:p>
+    <w:p>
+      <w:pPr>
+        <w:spacing w:beforeAutospacing="1" w:afterAutospacing="1"/>
+        <w:rPr>
+          <w:rFonts w:eastAsia="Times New Roman"/>
+        </w:rPr>
+      </w:pPr>
+      <w:r>
+        <w:rPr>
+          <w:rFonts w:eastAsia="Times New Roman"/>
+        </w:rPr>
+        <w:t>IT c đã đánh dấu ticket tiêu đề … hoàn tất</w:t>
+      </w:r>
+    </w:p>
+    <w:p>
+      <w:pPr>
+        <w:spacing w:beforeAutospacing="1" w:afterAutospacing="1"/>
+        <w:rPr>
+          <w:rFonts w:eastAsia="Times New Roman"/>
+        </w:rPr>
+      </w:pPr>
+      <w:r>
+        <w:rPr>
+          <w:rFonts w:eastAsia="Times New Roman"/>
+        </w:rPr>
+        <w:t>Người dùng a đã từ chối giải quyết ticket tiêu đề …</w:t>
+      </w:r>
+    </w:p>
+    <w:p>
+      <w:pPr>
+        <w:spacing w:beforeAutospacing="1" w:afterAutospacing="1"/>
+        <w:rPr>
+          <w:rFonts w:eastAsia="Times New Roman"/>
+        </w:rPr>
+      </w:pPr>
+      <w:r>
+        <w:rPr>
+          <w:rFonts w:eastAsia="Times New Roman"/>
+        </w:rPr>
+        <w:t>Người dùng a đã đồng ý giải quyết ticket tiêu đề …</w:t>
+      </w:r>
+    </w:p>
+    <w:p>
+      <w:pPr>
+        <w:spacing w:beforeAutospacing="1" w:afterAutospacing="1"/>
+        <w:rPr>
+          <w:rFonts w:eastAsia="Times New Roman"/>
+        </w:rPr>
+      </w:pPr>
+      <w:r>
+        <w:rPr>
+          <w:rFonts w:eastAsia="Times New Roman"/>
+        </w:rPr>
+        <w:t>Admin b đã thay đổi trạng thái SLA của ticket … thành …</w:t>
+      </w:r>
+    </w:p>
+    <w:p>
+      <w:pPr>
+        <w:spacing w:beforeAutospacing="1" w:afterAutospacing="1"/>
+        <w:rPr>
+          <w:rFonts w:eastAsia="Times New Roman"/>
+        </w:rPr>
+      </w:pPr>
+      <w:r>
+        <w:rPr>
+          <w:rFonts w:eastAsia="Times New Roman"/>
+        </w:rPr>
+        <w:lastRenderedPageBreak/>
+        <w:t>Admin b đã thay đổi loại ticket của ticket … thành …</w:t>
+      </w:r>
+    </w:p>
+    <w:p>
+      <w:pPr>
+        <w:spacing w:beforeAutospacing="1" w:afterAutospacing="1"/>
+        <w:rPr>
+          <w:rFonts w:eastAsia="Times New Roman"/>
+        </w:rPr>
+      </w:pPr>
+      <w:r>
+        <w:rPr>
+          <w:rFonts w:eastAsia="Times New Roman"/>
+        </w:rPr>
+        <w:t>Role + username + text from action + “ticket” + ticket title + target of the action</w:t>
       </w:r>
     </w:p>
     <w:p>
@@ -1092,333 +1191,343 @@
         <w:rPr>
           <w:rFonts w:eastAsia="Times New Roman"/>
         </w:rPr>
+        <w:t>post create ticket(Title, Description, Priority, Type (Optional), File (Optional)) → void /api/tickets</w:t>
+      </w:r>
+    </w:p>
+    <w:p>
+      <w:pPr>
+        <w:spacing w:beforeAutospacing="1" w:afterAutospacing="1"/>
+        <w:rPr>
+          <w:rFonts w:eastAsia="Times New Roman"/>
+        </w:rPr>
+      </w:pPr>
+      <w:r>
+        <w:rPr>
+          <w:rFonts w:eastAsia="Times New Roman"/>
+        </w:rPr>
+        <w:t>get getTickets</w:t>
+      </w:r>
+      <w:r>
+        <w:rPr>
+          <w:rFonts w:eastAsia="Times New Roman"/>
+        </w:rPr>
+        <w:t>InAuthority</w:t>
+      </w:r>
+      <w:r>
+        <w:rPr>
+          <w:rFonts w:eastAsia="Times New Roman"/>
+        </w:rPr>
+        <w:t>() → tickets /api/tickets</w:t>
+      </w:r>
+    </w:p>
+    <w:p>
+      <w:pPr>
+        <w:spacing w:beforeAutospacing="1" w:afterAutospacing="1"/>
+        <w:rPr>
+          <w:rFonts w:eastAsia="Times New Roman"/>
+        </w:rPr>
+      </w:pPr>
+      <w:r>
+        <w:rPr>
+          <w:rFonts w:eastAsia="Times New Roman"/>
+        </w:rPr>
+        <w:t>get getPriorities()  /api/priorities</w:t>
+      </w:r>
+    </w:p>
+    <w:p>
+      <w:pPr>
+        <w:spacing w:beforeAutospacing="1" w:afterAutospacing="1"/>
+        <w:rPr>
+          <w:rFonts w:eastAsia="Times New Roman"/>
+        </w:rPr>
+      </w:pPr>
+      <w:r>
+        <w:rPr>
+          <w:rFonts w:eastAsia="Times New Roman"/>
+        </w:rPr>
+        <w:t>get getTicketType() /api/ticket-type</w:t>
+      </w:r>
+    </w:p>
+    <w:p>
+      <w:pPr>
+        <w:spacing w:beforeAutospacing="1" w:afterAutospacing="1"/>
+        <w:rPr>
+          <w:rFonts w:eastAsia="Times New Roman"/>
+        </w:rPr>
+      </w:pPr>
+      <w:r>
+        <w:rPr>
+          <w:rFonts w:eastAsia="Times New Roman"/>
+        </w:rPr>
+        <w:t>post addTicketType() /api/ticket-type</w:t>
+      </w:r>
+    </w:p>
+    <w:p>
+      <w:pPr>
+        <w:spacing w:beforeAutospacing="1" w:afterAutospacing="1"/>
+        <w:rPr>
+          <w:rFonts w:eastAsia="Times New Roman"/>
+        </w:rPr>
+      </w:pPr>
+      <w:r>
+        <w:rPr>
+          <w:rFonts w:eastAsia="Times New Roman"/>
+        </w:rPr>
+        <w:t>get viewTickets(ticketID) → ticket /api/tickets/{id}</w:t>
+      </w:r>
+    </w:p>
+    <w:p>
+      <w:pPr>
+        <w:spacing w:beforeAutospacing="1" w:afterAutospacing="1"/>
+        <w:rPr>
+          <w:rFonts w:eastAsia="Times New Roman"/>
+        </w:rPr>
+      </w:pPr>
+      <w:r>
+        <w:rPr>
+          <w:rFonts w:eastAsia="Times New Roman"/>
+        </w:rPr>
+        <w:t>put updateTicket</w:t>
+      </w:r>
+      <w:r>
+        <w:rPr>
+          <w:rFonts w:eastAsia="Times New Roman"/>
+        </w:rPr>
+        <w:t>State</w:t>
+      </w:r>
+      <w:r>
+        <w:rPr>
+          <w:rFonts w:eastAsia="Times New Roman"/>
+        </w:rPr>
+        <w:t xml:space="preserve"> </w:t>
+      </w:r>
+      <w:r>
+        <w:rPr>
+          <w:rFonts w:eastAsia="Times New Roman"/>
+        </w:rPr>
+        <w:t xml:space="preserve">(ticketID, </w:t>
+      </w:r>
+      <w:r>
+        <w:rPr>
+          <w:rFonts w:eastAsia="Times New Roman"/>
+        </w:rPr>
+        <w:t>ticket</w:t>
+      </w:r>
+      <w:r>
+        <w:rPr>
+          <w:rFonts w:eastAsia="Times New Roman"/>
+        </w:rPr>
+        <w:t>) /api/tickets/{id}</w:t>
+      </w:r>
+    </w:p>
+    <w:p>
+      <w:pPr>
+        <w:spacing w:beforeAutospacing="1" w:afterAutospacing="1"/>
+        <w:rPr>
+          <w:rFonts w:eastAsia="Times New Roman"/>
+        </w:rPr>
+      </w:pPr>
+      <w:r>
+        <w:rPr>
+          <w:rFonts w:eastAsia="Times New Roman"/>
+        </w:rPr>
+        <w:t>post addComment(ticketID,</w:t>
+      </w:r>
+      <w:r>
+        <w:rPr>
+          <w:rFonts w:eastAsia="Times New Roman"/>
+        </w:rPr>
+        <w:t xml:space="preserve"> detail,</w:t>
+      </w:r>
+      <w:r>
+        <w:rPr>
+          <w:rFonts w:eastAsia="Times New Roman"/>
+        </w:rPr>
+        <w:t xml:space="preserve"> attachedFile (Optional)) /api/tickets/{id}/comments</w:t>
+      </w:r>
+    </w:p>
+    <w:p>
+      <w:pPr>
+        <w:spacing w:beforeAutospacing="1" w:afterAutospacing="1"/>
+        <w:rPr>
+          <w:rFonts w:eastAsia="Times New Roman"/>
+        </w:rPr>
+      </w:pPr>
+      <w:r>
+        <w:rPr>
+          <w:rFonts w:eastAsia="Times New Roman"/>
+        </w:rPr>
+        <w:t>get getPossibleAssignee(ticketID, userID) /api/admin</w:t>
+      </w:r>
+      <w:r>
+        <w:rPr>
+          <w:rFonts w:eastAsia="Times New Roman"/>
+        </w:rPr>
+        <w:t>/users/?role=IT</w:t>
+      </w:r>
+    </w:p>
+    <w:p>
+      <w:pPr>
+        <w:spacing w:beforeAutospacing="1" w:afterAutospacing="1"/>
+        <w:rPr>
+          <w:rFonts w:eastAsia="Times New Roman"/>
+        </w:rPr>
+      </w:pPr>
+      <w:r>
+        <w:rPr>
+          <w:rFonts w:eastAsia="Times New Roman"/>
+        </w:rPr>
+        <w:t>post addAccount(username, password) /api/</w:t>
+      </w:r>
+      <w:r>
+        <w:rPr>
+          <w:rFonts w:eastAsia="Times New Roman"/>
+        </w:rPr>
+        <w:t>admin/</w:t>
+      </w:r>
+      <w:r>
+        <w:rPr>
+          <w:rFonts w:eastAsia="Times New Roman"/>
+        </w:rPr>
+        <w:t>users</w:t>
+      </w:r>
+    </w:p>
+    <w:p>
+      <w:pPr>
+        <w:spacing w:beforeAutospacing="1" w:afterAutospacing="1"/>
+        <w:rPr>
+          <w:rFonts w:eastAsia="Times New Roman"/>
+        </w:rPr>
+      </w:pPr>
+      <w:r>
+        <w:rPr>
+          <w:rFonts w:eastAsia="Times New Roman"/>
+        </w:rPr>
+        <w:t>get getAccount(username) /api/</w:t>
+      </w:r>
+      <w:r>
+        <w:rPr>
+          <w:rFonts w:eastAsia="Times New Roman"/>
+        </w:rPr>
+        <w:t>admin/</w:t>
+      </w:r>
+      <w:r>
+        <w:rPr>
+          <w:rFonts w:eastAsia="Times New Roman"/>
+        </w:rPr>
+        <w:t>users/{id}</w:t>
+      </w:r>
+    </w:p>
+    <w:p>
+      <w:pPr>
+        <w:spacing w:beforeAutospacing="1" w:afterAutospacing="1"/>
+        <w:rPr>
+          <w:rFonts w:eastAsia="Times New Roman"/>
+        </w:rPr>
+      </w:pPr>
+      <w:r>
+        <w:rPr>
+          <w:rFonts w:eastAsia="Times New Roman"/>
+        </w:rPr>
+        <w:t>put changeUserPassword(password, newPassword) /api/users/{id}/password</w:t>
+      </w:r>
+    </w:p>
+    <w:p>
+      <w:pPr>
+        <w:spacing w:beforeAutospacing="1" w:afterAutospacing="1"/>
+        <w:rPr>
+          <w:rFonts w:eastAsia="Times New Roman"/>
+        </w:rPr>
+      </w:pPr>
+      <w:r>
+        <w:rPr>
+          <w:rFonts w:eastAsia="Times New Roman"/>
+        </w:rPr>
+        <w:t>put changeUserPassword(newPassword) /api/admin/users/{userID}/password (API for admin only)</w:t>
+      </w:r>
+    </w:p>
+    <w:p>
+      <w:pPr>
+        <w:spacing w:beforeAutospacing="1" w:afterAutospacing="1"/>
+        <w:rPr>
+          <w:rFonts w:eastAsia="Times New Roman"/>
+        </w:rPr>
+      </w:pPr>
+      <w:r>
+        <w:rPr>
+          <w:rFonts w:eastAsia="Times New Roman"/>
+        </w:rPr>
+        <w:t>get getDepartment(department) /api/admin/users/{userID}/department</w:t>
+      </w:r>
+    </w:p>
+    <w:p>
+      <w:pPr>
+        <w:spacing w:beforeAutospacing="1" w:afterAutospacing="1"/>
+        <w:rPr>
+          <w:rFonts w:eastAsia="Times New Roman"/>
+        </w:rPr>
+      </w:pPr>
+      <w:r>
+        <w:rPr>
+          <w:rFonts w:eastAsia="Times New Roman"/>
+        </w:rPr>
+        <w:t>put changeDepartment(department) /api/admin/users/{userID}/department</w:t>
+      </w:r>
+    </w:p>
+    <w:p>
+      <w:pPr>
+        <w:spacing w:beforeAutospacing="1" w:afterAutospacing="1"/>
+        <w:rPr>
+          <w:rFonts w:eastAsia="Times New Roman"/>
+        </w:rPr>
+      </w:pPr>
+      <w:r>
+        <w:rPr>
+          <w:rFonts w:eastAsia="Times New Roman"/>
+        </w:rPr>
+        <w:t>delete deleteAccount(userID) /api/admin/users/{userID}</w:t>
+      </w:r>
+    </w:p>
+    <w:p>
+      <w:pPr>
+        <w:spacing w:beforeAutospacing="1" w:afterAutospacing="1"/>
+        <w:rPr>
+          <w:rFonts w:eastAsia="Times New Roman"/>
+        </w:rPr>
+      </w:pPr>
+      <w:r>
+        <w:rPr>
+          <w:rFonts w:eastAsia="Times New Roman"/>
+        </w:rPr>
+        <w:t>post addPriorities() /api/admin/priorities</w:t>
+      </w:r>
+    </w:p>
+    <w:p>
+      <w:pPr>
+        <w:spacing w:beforeAutospacing="1" w:afterAutospacing="1"/>
+        <w:rPr>
+          <w:rFonts w:eastAsia="Times New Roman"/>
+        </w:rPr>
+      </w:pPr>
+      <w:r>
+        <w:rPr>
+          <w:rFonts w:eastAsia="Times New Roman"/>
+        </w:rPr>
+        <w:t>get getPriorities() /api/admin/priorities</w:t>
+      </w:r>
+    </w:p>
+    <w:p>
+      <w:pPr>
+        <w:spacing w:beforeAutospacing="1" w:afterAutospacing="1"/>
+        <w:rPr>
+          <w:rFonts w:eastAsia="Times New Roman"/>
+        </w:rPr>
+      </w:pPr>
+      <w:r>
+        <w:rPr>
+          <w:rFonts w:eastAsia="Times New Roman"/>
+        </w:rPr>
         <w:lastRenderedPageBreak/>
-        <w:t>post create ticket(Title, Description, Priority, Type (Optional), File (Optional)) → void /api/tickets</w:t>
-      </w:r>
-    </w:p>
-    <w:p>
-      <w:pPr>
-        <w:spacing w:beforeAutospacing="1" w:afterAutospacing="1"/>
-        <w:rPr>
-          <w:rFonts w:eastAsia="Times New Roman"/>
-        </w:rPr>
-      </w:pPr>
-      <w:r>
-        <w:rPr>
-          <w:rFonts w:eastAsia="Times New Roman"/>
-        </w:rPr>
-        <w:t>get getTickets() → tickets /api/tickets</w:t>
-      </w:r>
-    </w:p>
-    <w:p>
-      <w:pPr>
-        <w:spacing w:beforeAutospacing="1" w:afterAutospacing="1"/>
-        <w:rPr>
-          <w:rFonts w:eastAsia="Times New Roman"/>
-        </w:rPr>
-      </w:pPr>
-      <w:r>
-        <w:rPr>
-          <w:rFonts w:eastAsia="Times New Roman"/>
-        </w:rPr>
-        <w:t>get getPriorities()  /api/priorities</w:t>
-      </w:r>
-    </w:p>
-    <w:p>
-      <w:pPr>
-        <w:spacing w:beforeAutospacing="1" w:afterAutospacing="1"/>
-        <w:rPr>
-          <w:rFonts w:eastAsia="Times New Roman"/>
-        </w:rPr>
-      </w:pPr>
-      <w:r>
-        <w:rPr>
-          <w:rFonts w:eastAsia="Times New Roman"/>
-        </w:rPr>
-        <w:t>get getTicketType() /api/ticket-type</w:t>
-      </w:r>
-    </w:p>
-    <w:p>
-      <w:pPr>
-        <w:spacing w:beforeAutospacing="1" w:afterAutospacing="1"/>
-        <w:rPr>
-          <w:rFonts w:eastAsia="Times New Roman"/>
-        </w:rPr>
-      </w:pPr>
-      <w:r>
-        <w:rPr>
-          <w:rFonts w:eastAsia="Times New Roman"/>
-        </w:rPr>
-        <w:t>post addTicketType() /api/ticket-type</w:t>
-      </w:r>
-    </w:p>
-    <w:p>
-      <w:pPr>
-        <w:spacing w:beforeAutospacing="1" w:afterAutospacing="1"/>
-        <w:rPr>
-          <w:rFonts w:eastAsia="Times New Roman"/>
-        </w:rPr>
-      </w:pPr>
-      <w:r>
-        <w:rPr>
-          <w:rFonts w:eastAsia="Times New Roman"/>
-        </w:rPr>
-        <w:t>get viewTickets(ticketID) → ticket /api/tickets/{id}</w:t>
-      </w:r>
-    </w:p>
-    <w:p>
-      <w:pPr>
-        <w:spacing w:beforeAutospacing="1" w:afterAutospacing="1"/>
-        <w:rPr>
-          <w:rFonts w:eastAsia="Times New Roman"/>
-        </w:rPr>
-      </w:pPr>
-      <w:r>
-        <w:rPr>
-          <w:rFonts w:eastAsia="Times New Roman"/>
-        </w:rPr>
-        <w:t>put updateTicket</w:t>
-      </w:r>
-      <w:r>
-        <w:rPr>
-          <w:rFonts w:eastAsia="Times New Roman"/>
-        </w:rPr>
-        <w:t xml:space="preserve"> </w:t>
-      </w:r>
-      <w:r>
-        <w:rPr>
-          <w:rFonts w:eastAsia="Times New Roman"/>
-        </w:rPr>
-        <w:t xml:space="preserve">(ticketID, </w:t>
-      </w:r>
-      <w:r>
-        <w:rPr>
-          <w:rFonts w:eastAsia="Times New Roman"/>
-        </w:rPr>
-        <w:t>ticket</w:t>
-      </w:r>
-      <w:r>
-        <w:rPr>
-          <w:rFonts w:eastAsia="Times New Roman"/>
-        </w:rPr>
-        <w:t>) /api/tickets/{id}</w:t>
-      </w:r>
-    </w:p>
-    <w:p>
-      <w:pPr>
-        <w:spacing w:beforeAutospacing="1" w:afterAutospacing="1"/>
-        <w:rPr>
-          <w:rFonts w:eastAsia="Times New Roman"/>
-        </w:rPr>
-      </w:pPr>
-      <w:r>
-        <w:rPr>
-          <w:rFonts w:eastAsia="Times New Roman"/>
-        </w:rPr>
-        <w:t>get getPossibleAssignee(ticketID, userID) /api/tickets/{id}/assignees</w:t>
-      </w:r>
-    </w:p>
-    <w:p>
-      <w:pPr>
-        <w:spacing w:beforeAutospacing="1" w:afterAutospacing="1"/>
-        <w:rPr>
-          <w:rFonts w:eastAsia="Times New Roman"/>
-        </w:rPr>
-      </w:pPr>
-      <w:r>
-        <w:rPr>
-          <w:rFonts w:eastAsia="Times New Roman"/>
-        </w:rPr>
-        <w:t>post addAssignee(ticketID, userID) /api/tickets/{id}/assignees</w:t>
-      </w:r>
-    </w:p>
-    <w:p>
-      <w:pPr>
-        <w:spacing w:beforeAutospacing="1" w:afterAutospacing="1"/>
-        <w:rPr>
-          <w:rFonts w:eastAsia="Times New Roman"/>
-        </w:rPr>
-      </w:pPr>
-      <w:r>
-        <w:rPr>
-          <w:rFonts w:eastAsia="Times New Roman"/>
-        </w:rPr>
-        <w:t>post addComment(ticketID,</w:t>
-      </w:r>
-      <w:r>
-        <w:rPr>
-          <w:rFonts w:eastAsia="Times New Roman"/>
-        </w:rPr>
-        <w:t xml:space="preserve"> detail,</w:t>
-      </w:r>
-      <w:r>
-        <w:rPr>
-          <w:rFonts w:eastAsia="Times New Roman"/>
-        </w:rPr>
-        <w:t xml:space="preserve"> attachedFile (Optional)) /api/tickets/{id}/comments</w:t>
-      </w:r>
-    </w:p>
-    <w:p>
-      <w:pPr>
-        <w:spacing w:beforeAutospacing="1" w:afterAutospacing="1"/>
-        <w:rPr>
-          <w:rFonts w:eastAsia="Times New Roman"/>
-        </w:rPr>
-      </w:pPr>
-      <w:r>
-        <w:rPr>
-          <w:rFonts w:eastAsia="Times New Roman"/>
-        </w:rPr>
-        <w:t>post addAccount(username, password) /api/</w:t>
-      </w:r>
-      <w:r>
-        <w:rPr>
-          <w:rFonts w:eastAsia="Times New Roman"/>
-        </w:rPr>
-        <w:t>admin/</w:t>
-      </w:r>
-      <w:r>
-        <w:rPr>
-          <w:rFonts w:eastAsia="Times New Roman"/>
-        </w:rPr>
-        <w:t>users</w:t>
-      </w:r>
-    </w:p>
-    <w:p>
-      <w:pPr>
-        <w:spacing w:beforeAutospacing="1" w:afterAutospacing="1"/>
-        <w:rPr>
-          <w:rFonts w:eastAsia="Times New Roman"/>
-        </w:rPr>
-      </w:pPr>
-      <w:r>
-        <w:rPr>
-          <w:rFonts w:eastAsia="Times New Roman"/>
-        </w:rPr>
-        <w:t>get getAccount(username) /api/</w:t>
-      </w:r>
-      <w:r>
-        <w:rPr>
-          <w:rFonts w:eastAsia="Times New Roman"/>
-        </w:rPr>
-        <w:t>admin/</w:t>
-      </w:r>
-      <w:r>
-        <w:rPr>
-          <w:rFonts w:eastAsia="Times New Roman"/>
-        </w:rPr>
-        <w:t>users/{id}</w:t>
-      </w:r>
-    </w:p>
-    <w:p>
-      <w:pPr>
-        <w:spacing w:beforeAutospacing="1" w:afterAutospacing="1"/>
-        <w:rPr>
-          <w:rFonts w:eastAsia="Times New Roman"/>
-        </w:rPr>
-      </w:pPr>
-      <w:r>
-        <w:rPr>
-          <w:rFonts w:eastAsia="Times New Roman"/>
-        </w:rPr>
-        <w:t>put changeUserPassword(password, newPassword) /api/users/{id}/password</w:t>
-      </w:r>
-    </w:p>
-    <w:p>
-      <w:pPr>
-        <w:spacing w:beforeAutospacing="1" w:afterAutospacing="1"/>
-        <w:rPr>
-          <w:rFonts w:eastAsia="Times New Roman"/>
-        </w:rPr>
-      </w:pPr>
-      <w:r>
-        <w:rPr>
-          <w:rFonts w:eastAsia="Times New Roman"/>
-        </w:rPr>
-        <w:t>put changeUserPassword(newPassword) /api/admin/users/{userID}/password (API for admin only)</w:t>
-      </w:r>
-    </w:p>
-    <w:p>
-      <w:pPr>
-        <w:spacing w:beforeAutospacing="1" w:afterAutospacing="1"/>
-        <w:rPr>
-          <w:rFonts w:eastAsia="Times New Roman"/>
-        </w:rPr>
-      </w:pPr>
-      <w:r>
-        <w:rPr>
-          <w:rFonts w:eastAsia="Times New Roman"/>
-        </w:rPr>
-        <w:t>get getDepartment(department) /api/admin/users/{userID}/department</w:t>
-      </w:r>
-    </w:p>
-    <w:p>
-      <w:pPr>
-        <w:spacing w:beforeAutospacing="1" w:afterAutospacing="1"/>
-        <w:rPr>
-          <w:rFonts w:eastAsia="Times New Roman"/>
-        </w:rPr>
-      </w:pPr>
-      <w:r>
-        <w:rPr>
-          <w:rFonts w:eastAsia="Times New Roman"/>
-        </w:rPr>
-        <w:t>put changeDepartment(department) /api/admin/users/{userID}/department</w:t>
-      </w:r>
-    </w:p>
-    <w:p>
-      <w:pPr>
-        <w:spacing w:beforeAutospacing="1" w:afterAutospacing="1"/>
-        <w:rPr>
-          <w:rFonts w:eastAsia="Times New Roman"/>
-        </w:rPr>
-      </w:pPr>
-      <w:r>
-        <w:rPr>
-          <w:rFonts w:eastAsia="Times New Roman"/>
-        </w:rPr>
-        <w:t>delete deleteAccount(userID) /api/admin/users/{userID}</w:t>
-      </w:r>
-    </w:p>
-    <w:p>
-      <w:pPr>
-        <w:spacing w:beforeAutospacing="1" w:afterAutospacing="1"/>
-        <w:rPr>
-          <w:rFonts w:eastAsia="Times New Roman"/>
-        </w:rPr>
-      </w:pPr>
-      <w:r>
-        <w:rPr>
-          <w:rFonts w:eastAsia="Times New Roman"/>
-        </w:rPr>
-        <w:t>post addPriorities() /api/admin/priorities</w:t>
-      </w:r>
-    </w:p>
-    <w:p>
-      <w:pPr>
-        <w:spacing w:beforeAutospacing="1" w:afterAutospacing="1"/>
-        <w:rPr>
-          <w:rFonts w:eastAsia="Times New Roman"/>
-        </w:rPr>
-      </w:pPr>
-      <w:r>
-        <w:rPr>
-          <w:rFonts w:eastAsia="Times New Roman"/>
-        </w:rPr>
-        <w:t>get getPriorities() /api/admin/priorities</w:t>
-      </w:r>
-    </w:p>
-    <w:p>
-      <w:pPr>
-        <w:spacing w:beforeAutospacing="1" w:afterAutospacing="1"/>
-        <w:rPr>
-          <w:rFonts w:eastAsia="Times New Roman"/>
-        </w:rPr>
-      </w:pPr>
-      <w:r>
-        <w:rPr>
-          <w:rFonts w:eastAsia="Times New Roman"/>
-        </w:rPr>
         <w:t>put changePriority(priorityID, levelOfPriority(int), name, timeToRespond, timeToFinish) /api/admin/priorities/{piriority-id}</w:t>
       </w:r>
     </w:p>
@@ -1483,7 +1592,6 @@
         <w:rPr>
           <w:rFonts w:eastAsia="Times New Roman"/>
         </w:rPr>
-        <w:lastRenderedPageBreak/>
         <w:t>(Optional if google sso is to be added)</w:t>
       </w:r>
     </w:p>
@@ -3110,7 +3218,6 @@
   <w:style w:type="character" w:default="1" w:styleId="DefaultParagraphFont">
     <w:name w:val="Default Paragraph Font"/>
     <w:uiPriority w:val="1"/>
-    <w:semiHidden/>
     <w:unhideWhenUsed/>
   </w:style>
   <w:style w:type="table" w:default="1" w:styleId="TableNormal">

</xml_diff>

<commit_message>
Update and polish specification
</commit_message>
<xml_diff>
--- a/specification_breakdown.docx
+++ b/specification_breakdown.docx
@@ -1,9 +1,34 @@
 
 <file path=word/document.xml><?xml version="1.0" encoding="utf-8"?>
-<w:document xmlns:wpc="http://schemas.microsoft.com/office/word/2010/wordprocessingCanvas" xmlns:cx="http://schemas.microsoft.com/office/drawing/2014/chartex" xmlns:cx1="http://schemas.microsoft.com/office/drawing/2015/9/8/chartex" xmlns:cx2="http://schemas.microsoft.com/office/drawing/2015/10/21/chartex" xmlns:cx3="http://schemas.microsoft.com/office/drawing/2016/5/9/chartex" xmlns:cx4="http://schemas.microsoft.com/office/drawing/2016/5/10/chartex" xmlns:cx5="http://schemas.microsoft.com/office/drawing/2016/5/11/chartex" xmlns:cx6="http://schemas.microsoft.com/office/drawing/2016/5/12/chartex" xmlns:cx7="http://schemas.microsoft.com/office/drawing/2016/5/13/chartex" xmlns:cx8="http://schemas.microsoft.com/office/drawing/2016/5/14/chartex" xmlns:mc="http://schemas.openxmlformats.org/markup-compatibility/2006" xmlns:aink="http://schemas.microsoft.com/office/drawing/2016/ink" xmlns:am3d="http://schemas.microsoft.com/office/drawing/2017/model3d" xmlns:o="urn:schemas-microsoft-com:office:office" xmlns:oel="http://schemas.microsoft.com/office/2019/extlst" xmlns:r="http://schemas.openxmlformats.org/officeDocument/2006/relationships" xmlns:m="http://schemas.openxmlformats.org/officeDocument/2006/math" xmlns:v="urn:schemas-microsoft-com:vml" xmlns:wp14="http://schemas.microsoft.com/office/word/2010/wordprocessingDrawing" xmlns:wp="http://schemas.openxmlformats.org/drawingml/2006/wordprocessingDrawing" xmlns:w10="urn:schemas-microsoft-com:office:word" xmlns:w="http://schemas.openxmlformats.org/wordprocessingml/2006/main" xmlns:w14="http://schemas.microsoft.com/office/word/2010/wordml" xmlns:w15="http://schemas.microsoft.com/office/word/2012/wordml" xmlns:w16cex="http://schemas.microsoft.com/office/word/2018/wordml/cex" xmlns:w16cid="http://schemas.microsoft.com/office/word/2016/wordml/cid" xmlns:w16="http://schemas.microsoft.com/office/word/2018/wordml" xmlns:w16du="http://schemas.microsoft.com/office/word/2023/wordml/word16du" xmlns:w16sdtdh="http://schemas.microsoft.com/office/word/2020/wordml/sdtdatahash" xmlns:w16sdtfl="http://schemas.microsoft.com/office/word/2024/wordml/sdtformatlock" xmlns:w16se="http://schemas.microsoft.com/office/word/2015/wordml/symex" xmlns:wpg="http://schemas.microsoft.com/office/word/2010/wordprocessingGroup" xmlns:wpi="http://schemas.microsoft.com/office/word/2010/wordprocessingInk" xmlns:wne="http://schemas.microsoft.com/office/word/2006/wordml" xmlns:wps="http://schemas.microsoft.com/office/word/2010/wordprocessingShape" mc:Ignorable="w14 w15 w16se w16cid w16 w16cex w16sdtdh w16sdtfl w16du wp14">
+<w:document xmlns:o="urn:schemas-microsoft-com:office:office" xmlns:r="http://schemas.openxmlformats.org/officeDocument/2006/relationships" xmlns:v="urn:schemas-microsoft-com:vml" xmlns:w="http://schemas.openxmlformats.org/wordprocessingml/2006/main" xmlns:w10="urn:schemas-microsoft-com:office:word" xmlns:wp="http://schemas.openxmlformats.org/drawingml/2006/wordprocessingDrawing" xmlns:pic="http://schemas.openxmlformats.org/drawingml/2006/picture" xmlns:wps="http://schemas.microsoft.com/office/word/2010/wordprocessingShape" xmlns:wpg="http://schemas.microsoft.com/office/word/2010/wordprocessingGroup" xmlns:mc="http://schemas.openxmlformats.org/markup-compatibility/2006" xmlns:wp14="http://schemas.microsoft.com/office/word/2010/wordprocessingDrawing" xmlns:w14="http://schemas.microsoft.com/office/word/2010/wordml" xmlns:w15="http://schemas.microsoft.com/office/word/2012/wordml" mc:Ignorable="w14 wp14 w15">
   <w:body>
     <w:p>
-      <w:r>
+      <w:pPr>
+        <w:pStyle w:val="Normal"/>
+        <w:bidi w:val="0"/>
+        <w:rPr/>
+      </w:pPr>
+      <w:r>
+        <w:rPr/>
+        <w:t>Phân tích các đối tượng trong chương trình và đối tượng tương tác với các thuộc tính của các đối tượng đó</w:t>
+      </w:r>
+    </w:p>
+    <w:p>
+      <w:pPr>
+        <w:pStyle w:val="Normal"/>
+        <w:rPr/>
+      </w:pPr>
+      <w:r>
+        <w:rPr/>
+      </w:r>
+    </w:p>
+    <w:p>
+      <w:pPr>
+        <w:pStyle w:val="Normal"/>
+        <w:rPr/>
+      </w:pPr>
+      <w:r>
+        <w:rPr/>
         <w:t>Ticket:</w:t>
       </w:r>
     </w:p>
@@ -14,8 +39,10 @@
           <w:ilvl w:val="0"/>
           <w:numId w:val="3"/>
         </w:numPr>
-      </w:pPr>
-      <w:r>
+        <w:rPr/>
+      </w:pPr>
+      <w:r>
+        <w:rPr/>
         <w:t>Người dùng</w:t>
       </w:r>
     </w:p>
@@ -26,7 +53,7 @@
           <w:ilvl w:val="1"/>
           <w:numId w:val="3"/>
         </w:numPr>
-        <w:spacing w:after="0"/>
+        <w:spacing w:before="0" w:after="0"/>
         <w:rPr>
           <w:rFonts w:eastAsia="Times New Roman"/>
         </w:rPr>
@@ -45,7 +72,7 @@
           <w:ilvl w:val="1"/>
           <w:numId w:val="3"/>
         </w:numPr>
-        <w:spacing w:after="0"/>
+        <w:spacing w:before="0" w:after="0"/>
         <w:rPr>
           <w:rFonts w:eastAsia="Times New Roman"/>
         </w:rPr>
@@ -64,7 +91,7 @@
           <w:ilvl w:val="1"/>
           <w:numId w:val="3"/>
         </w:numPr>
-        <w:spacing w:after="0"/>
+        <w:spacing w:before="0" w:after="0"/>
         <w:rPr>
           <w:rFonts w:eastAsia="Times New Roman"/>
         </w:rPr>
@@ -83,7 +110,7 @@
           <w:ilvl w:val="1"/>
           <w:numId w:val="3"/>
         </w:numPr>
-        <w:spacing w:after="0"/>
+        <w:spacing w:before="0" w:after="0"/>
         <w:rPr>
           <w:rFonts w:eastAsia="Times New Roman"/>
         </w:rPr>
@@ -102,7 +129,7 @@
           <w:ilvl w:val="1"/>
           <w:numId w:val="3"/>
         </w:numPr>
-        <w:spacing w:after="0"/>
+        <w:spacing w:before="0" w:after="0"/>
         <w:rPr>
           <w:rFonts w:eastAsia="Times New Roman"/>
         </w:rPr>
@@ -121,7 +148,7 @@
           <w:ilvl w:val="0"/>
           <w:numId w:val="3"/>
         </w:numPr>
-        <w:spacing w:after="0"/>
+        <w:spacing w:before="0" w:after="0"/>
         <w:rPr>
           <w:rFonts w:eastAsia="Times New Roman"/>
         </w:rPr>
@@ -140,12 +167,13 @@
           <w:ilvl w:val="1"/>
           <w:numId w:val="3"/>
         </w:numPr>
-        <w:spacing w:after="0"/>
-        <w:rPr>
-          <w:rFonts w:eastAsia="Times New Roman"/>
-        </w:rPr>
-      </w:pPr>
-      <w:r>
+        <w:spacing w:before="0" w:after="0"/>
+        <w:rPr>
+          <w:rFonts w:eastAsia="Times New Roman"/>
+        </w:rPr>
+      </w:pPr>
+      <w:r>
+        <w:rPr/>
         <w:t>Đơn vị/phòng ban</w:t>
       </w:r>
     </w:p>
@@ -156,7 +184,7 @@
           <w:ilvl w:val="1"/>
           <w:numId w:val="3"/>
         </w:numPr>
-        <w:spacing w:after="0"/>
+        <w:spacing w:before="0" w:after="0"/>
         <w:rPr>
           <w:rFonts w:eastAsia="Times New Roman"/>
         </w:rPr>
@@ -175,7 +203,7 @@
           <w:ilvl w:val="1"/>
           <w:numId w:val="3"/>
         </w:numPr>
-        <w:spacing w:after="0"/>
+        <w:spacing w:before="0" w:after="0"/>
         <w:rPr>
           <w:rFonts w:eastAsia="Times New Roman"/>
         </w:rPr>
@@ -194,7 +222,7 @@
           <w:ilvl w:val="1"/>
           <w:numId w:val="3"/>
         </w:numPr>
-        <w:spacing w:after="0"/>
+        <w:spacing w:before="0" w:after="0"/>
         <w:rPr>
           <w:rFonts w:eastAsia="Times New Roman"/>
         </w:rPr>
@@ -213,7 +241,7 @@
           <w:ilvl w:val="1"/>
           <w:numId w:val="3"/>
         </w:numPr>
-        <w:spacing w:after="0"/>
+        <w:spacing w:before="0" w:after="0"/>
         <w:rPr>
           <w:rFonts w:eastAsia="Times New Roman"/>
         </w:rPr>
@@ -232,7 +260,7 @@
           <w:ilvl w:val="1"/>
           <w:numId w:val="3"/>
         </w:numPr>
-        <w:spacing w:after="0"/>
+        <w:spacing w:before="0" w:after="0"/>
         <w:rPr>
           <w:rFonts w:eastAsia="Times New Roman"/>
         </w:rPr>
@@ -251,7 +279,7 @@
           <w:ilvl w:val="0"/>
           <w:numId w:val="3"/>
         </w:numPr>
-        <w:spacing w:after="0"/>
+        <w:spacing w:before="0" w:after="0"/>
         <w:rPr>
           <w:rFonts w:eastAsia="Times New Roman"/>
         </w:rPr>
@@ -270,7 +298,7 @@
           <w:ilvl w:val="1"/>
           <w:numId w:val="3"/>
         </w:numPr>
-        <w:spacing w:after="0"/>
+        <w:spacing w:before="0" w:after="0"/>
         <w:rPr>
           <w:rFonts w:eastAsia="Times New Roman"/>
         </w:rPr>
@@ -289,7 +317,7 @@
           <w:ilvl w:val="1"/>
           <w:numId w:val="3"/>
         </w:numPr>
-        <w:spacing w:after="0"/>
+        <w:spacing w:before="0" w:after="0"/>
         <w:rPr>
           <w:rFonts w:eastAsia="Times New Roman"/>
         </w:rPr>
@@ -308,7 +336,7 @@
           <w:ilvl w:val="1"/>
           <w:numId w:val="3"/>
         </w:numPr>
-        <w:spacing w:after="0"/>
+        <w:spacing w:before="0" w:after="0"/>
         <w:rPr>
           <w:rFonts w:eastAsia="Times New Roman"/>
         </w:rPr>
@@ -327,7 +355,7 @@
           <w:ilvl w:val="1"/>
           <w:numId w:val="3"/>
         </w:numPr>
-        <w:spacing w:afterAutospacing="1"/>
+        <w:spacing w:before="0" w:afterAutospacing="1"/>
         <w:rPr>
           <w:rFonts w:eastAsia="Times New Roman"/>
         </w:rPr>
@@ -341,6 +369,7 @@
     </w:p>
     <w:p>
       <w:pPr>
+        <w:pStyle w:val="Normal"/>
         <w:spacing w:beforeAutospacing="1" w:afterAutospacing="1"/>
         <w:rPr>
           <w:rFonts w:eastAsia="Times New Roman"/>
@@ -369,7 +398,13 @@
         <w:rPr>
           <w:rFonts w:eastAsia="Times New Roman"/>
         </w:rPr>
-        <w:t>“Mới tạo” - người dùng vừa tạo ticket</w:t>
+        <w:t>“</w:t>
+      </w:r>
+      <w:r>
+        <w:rPr>
+          <w:rFonts w:eastAsia="Times New Roman"/>
+        </w:rPr>
+        <w:t>Mới tạo” - người dùng vừa tạo ticket</w:t>
       </w:r>
     </w:p>
     <w:p>
@@ -379,16 +414,22 @@
           <w:ilvl w:val="0"/>
           <w:numId w:val="3"/>
         </w:numPr>
-        <w:spacing w:after="0"/>
-        <w:rPr>
-          <w:rFonts w:eastAsia="Times New Roman"/>
-        </w:rPr>
-      </w:pPr>
-      <w:r>
-        <w:rPr>
-          <w:rFonts w:eastAsia="Times New Roman"/>
-        </w:rPr>
-        <w:t>“Đang xử lý” - quản trị viên cập nhập người xử lí</w:t>
+        <w:spacing w:before="0" w:after="0"/>
+        <w:rPr>
+          <w:rFonts w:eastAsia="Times New Roman"/>
+        </w:rPr>
+      </w:pPr>
+      <w:r>
+        <w:rPr>
+          <w:rFonts w:eastAsia="Times New Roman"/>
+        </w:rPr>
+        <w:t>“</w:t>
+      </w:r>
+      <w:r>
+        <w:rPr>
+          <w:rFonts w:eastAsia="Times New Roman"/>
+        </w:rPr>
+        <w:t>Đang xử lý” - quản trị viên cập nhập người xử lí</w:t>
       </w:r>
     </w:p>
     <w:p>
@@ -398,16 +439,22 @@
           <w:ilvl w:val="0"/>
           <w:numId w:val="3"/>
         </w:numPr>
-        <w:spacing w:after="0"/>
-        <w:rPr>
-          <w:rFonts w:eastAsia="Times New Roman"/>
-        </w:rPr>
-      </w:pPr>
-      <w:r>
-        <w:rPr>
-          <w:rFonts w:eastAsia="Times New Roman"/>
-        </w:rPr>
-        <w:t>“Đã xử lý xong” - người xử lí cập nhập đánh dấu đã xử lý xong</w:t>
+        <w:spacing w:before="0" w:after="0"/>
+        <w:rPr>
+          <w:rFonts w:eastAsia="Times New Roman"/>
+        </w:rPr>
+      </w:pPr>
+      <w:r>
+        <w:rPr>
+          <w:rFonts w:eastAsia="Times New Roman"/>
+        </w:rPr>
+        <w:t>“</w:t>
+      </w:r>
+      <w:r>
+        <w:rPr>
+          <w:rFonts w:eastAsia="Times New Roman"/>
+        </w:rPr>
+        <w:t>Đã xử lý xong” - người xử lí cập nhập đánh dấu đã xử lý xong</w:t>
       </w:r>
     </w:p>
     <w:p>
@@ -417,20 +464,27 @@
           <w:ilvl w:val="0"/>
           <w:numId w:val="3"/>
         </w:numPr>
-        <w:spacing w:after="0"/>
-        <w:rPr>
-          <w:rFonts w:eastAsia="Times New Roman"/>
-        </w:rPr>
-      </w:pPr>
-      <w:r>
-        <w:rPr>
-          <w:rFonts w:eastAsia="Times New Roman"/>
-        </w:rPr>
-        <w:t>“Đóng” - người dùng chấp nhận kết quả xử lí</w:t>
-      </w:r>
-    </w:p>
-    <w:p>
-      <w:pPr>
+        <w:spacing w:before="0" w:after="0"/>
+        <w:rPr>
+          <w:rFonts w:eastAsia="Times New Roman"/>
+        </w:rPr>
+      </w:pPr>
+      <w:r>
+        <w:rPr>
+          <w:rFonts w:eastAsia="Times New Roman"/>
+        </w:rPr>
+        <w:t>“</w:t>
+      </w:r>
+      <w:r>
+        <w:rPr>
+          <w:rFonts w:eastAsia="Times New Roman"/>
+        </w:rPr>
+        <w:t>Đóng” - người dùng chấp nhận kết quả xử lí</w:t>
+      </w:r>
+    </w:p>
+    <w:p>
+      <w:pPr>
+        <w:pStyle w:val="Normal"/>
         <w:spacing w:beforeAutospacing="1" w:afterAutospacing="1"/>
         <w:rPr>
           <w:rFonts w:eastAsia="Times New Roman"/>
@@ -469,7 +523,7 @@
           <w:ilvl w:val="0"/>
           <w:numId w:val="3"/>
         </w:numPr>
-        <w:spacing w:after="0"/>
+        <w:spacing w:before="0" w:after="0"/>
         <w:rPr>
           <w:rFonts w:eastAsia="Times New Roman"/>
         </w:rPr>
@@ -488,7 +542,7 @@
           <w:ilvl w:val="0"/>
           <w:numId w:val="3"/>
         </w:numPr>
-        <w:spacing w:after="0"/>
+        <w:spacing w:before="0" w:after="0"/>
         <w:rPr>
           <w:rFonts w:eastAsia="Times New Roman"/>
         </w:rPr>
@@ -507,7 +561,7 @@
           <w:ilvl w:val="0"/>
           <w:numId w:val="3"/>
         </w:numPr>
-        <w:spacing w:afterAutospacing="1"/>
+        <w:spacing w:before="0" w:afterAutospacing="1"/>
         <w:rPr>
           <w:rFonts w:eastAsia="Times New Roman"/>
         </w:rPr>
@@ -521,6 +575,7 @@
     </w:p>
     <w:p>
       <w:pPr>
+        <w:pStyle w:val="Normal"/>
         <w:spacing w:beforeAutospacing="1" w:afterAutospacing="1"/>
         <w:rPr>
           <w:rFonts w:eastAsia="Times New Roman"/>
@@ -535,6 +590,27 @@
     </w:p>
     <w:p>
       <w:pPr>
+        <w:pStyle w:val="Normal"/>
+        <w:spacing w:beforeAutospacing="1" w:afterAutospacing="1"/>
+        <w:rPr>
+          <w:rFonts w:eastAsia="Times New Roman"/>
+        </w:rPr>
+      </w:pPr>
+      <w:r>
+        <w:rPr>
+          <w:rFonts w:eastAsia="Times New Roman"/>
+        </w:rPr>
+        <w:t xml:space="preserve">      </w:t>
+      </w:r>
+      <w:r>
+        <w:rPr>
+          <w:rFonts w:eastAsia="Times New Roman"/>
+        </w:rPr>
+        <w:t xml:space="preserve">-     ID </w:t>
+      </w:r>
+    </w:p>
+    <w:p>
+      <w:pPr>
         <w:pStyle w:val="ListParagraph"/>
         <w:numPr>
           <w:ilvl w:val="0"/>
@@ -545,31 +621,47 @@
           <w:rFonts w:eastAsia="Times New Roman"/>
         </w:rPr>
       </w:pPr>
-    </w:p>
-    <w:p>
-      <w:pPr>
-        <w:spacing w:beforeAutospacing="1" w:afterAutospacing="1"/>
-        <w:rPr>
-          <w:rFonts w:eastAsia="Times New Roman"/>
-        </w:rPr>
-      </w:pPr>
-    </w:p>
-    <w:p>
-      <w:pPr>
-        <w:spacing w:beforeAutospacing="1" w:afterAutospacing="1"/>
-        <w:rPr>
-          <w:rFonts w:eastAsia="Times New Roman"/>
-        </w:rPr>
-      </w:pPr>
-      <w:r>
-        <w:rPr>
-          <w:rFonts w:eastAsia="Times New Roman"/>
-        </w:rPr>
-        <w:t>Khi tạo ticket -&gt; tạo thông báo cho bộ phận IT</w:t>
-      </w:r>
-    </w:p>
-    <w:p>
-      <w:pPr>
+      <w:r>
+        <w:rPr>
+          <w:rFonts w:eastAsia="Times New Roman"/>
+        </w:rPr>
+        <w:t>Tiêu đề</w:t>
+      </w:r>
+    </w:p>
+    <w:p>
+      <w:pPr>
+        <w:pStyle w:val="ListParagraph"/>
+        <w:numPr>
+          <w:ilvl w:val="0"/>
+          <w:numId w:val="3"/>
+        </w:numPr>
+        <w:spacing w:beforeAutospacing="1" w:afterAutospacing="1"/>
+        <w:rPr>
+          <w:rFonts w:eastAsia="Times New Roman"/>
+        </w:rPr>
+      </w:pPr>
+      <w:r>
+        <w:rPr>
+          <w:rFonts w:eastAsia="Times New Roman"/>
+        </w:rPr>
+        <w:t>Mô tả</w:t>
+      </w:r>
+    </w:p>
+    <w:p>
+      <w:pPr>
+        <w:pStyle w:val="Normal"/>
+        <w:spacing w:beforeAutospacing="1" w:afterAutospacing="1"/>
+        <w:rPr>
+          <w:rFonts w:eastAsia="Times New Roman"/>
+        </w:rPr>
+      </w:pPr>
+      <w:r>
+        <w:rPr/>
+      </w:r>
+    </w:p>
+    <w:p>
+      <w:pPr>
+        <w:pStyle w:val="Normal"/>
         <w:spacing w:beforeAutospacing="1" w:afterAutospacing="1"/>
         <w:rPr>
           <w:rFonts w:eastAsia="Times New Roman"/>
@@ -608,16 +700,15 @@
           <w:ilvl w:val="1"/>
           <w:numId w:val="3"/>
         </w:numPr>
-        <w:spacing w:after="0"/>
-        <w:rPr>
-          <w:rFonts w:eastAsia="Times New Roman"/>
-        </w:rPr>
-      </w:pPr>
-      <w:r>
-        <w:rPr>
-          <w:rFonts w:eastAsia="Times New Roman"/>
-        </w:rPr>
-        <w:lastRenderedPageBreak/>
+        <w:spacing w:before="0" w:after="0"/>
+        <w:rPr>
+          <w:rFonts w:eastAsia="Times New Roman"/>
+        </w:rPr>
+      </w:pPr>
+      <w:r>
+        <w:rPr>
+          <w:rFonts w:eastAsia="Times New Roman"/>
+        </w:rPr>
         <w:t>Mức ưu tiên</w:t>
       </w:r>
     </w:p>
@@ -628,8 +719,10 @@
           <w:ilvl w:val="1"/>
           <w:numId w:val="3"/>
         </w:numPr>
-      </w:pPr>
-      <w:r>
+        <w:rPr/>
+      </w:pPr>
+      <w:r>
+        <w:rPr/>
         <w:t>Tên</w:t>
       </w:r>
     </w:p>
@@ -640,6 +733,7 @@
           <w:ilvl w:val="1"/>
           <w:numId w:val="3"/>
         </w:numPr>
+        <w:rPr/>
       </w:pPr>
       <w:r>
         <w:rPr>
@@ -655,7 +749,7 @@
           <w:ilvl w:val="1"/>
           <w:numId w:val="3"/>
         </w:numPr>
-        <w:spacing w:afterAutospacing="1"/>
+        <w:spacing w:before="0" w:afterAutospacing="1"/>
         <w:rPr>
           <w:rFonts w:eastAsia="Times New Roman"/>
         </w:rPr>
@@ -669,6 +763,7 @@
     </w:p>
     <w:p>
       <w:pPr>
+        <w:pStyle w:val="Normal"/>
         <w:spacing w:beforeAutospacing="1" w:afterAutospacing="1"/>
         <w:rPr>
           <w:rFonts w:eastAsia="Times New Roman"/>
@@ -707,7 +802,7 @@
           <w:ilvl w:val="1"/>
           <w:numId w:val="3"/>
         </w:numPr>
-        <w:spacing w:after="0"/>
+        <w:spacing w:before="0" w:after="0"/>
         <w:rPr>
           <w:rFonts w:eastAsia="Times New Roman"/>
         </w:rPr>
@@ -726,7 +821,7 @@
           <w:ilvl w:val="1"/>
           <w:numId w:val="3"/>
         </w:numPr>
-        <w:spacing w:after="0"/>
+        <w:spacing w:before="0" w:after="0"/>
         <w:rPr>
           <w:rFonts w:eastAsia="Times New Roman"/>
         </w:rPr>
@@ -745,7 +840,7 @@
           <w:ilvl w:val="0"/>
           <w:numId w:val="3"/>
         </w:numPr>
-        <w:spacing w:after="0"/>
+        <w:spacing w:before="0" w:after="0"/>
         <w:rPr>
           <w:rFonts w:eastAsia="Times New Roman"/>
         </w:rPr>
@@ -764,7 +859,7 @@
           <w:ilvl w:val="1"/>
           <w:numId w:val="3"/>
         </w:numPr>
-        <w:spacing w:after="0"/>
+        <w:spacing w:before="0" w:after="0"/>
         <w:rPr>
           <w:rFonts w:eastAsia="Times New Roman"/>
         </w:rPr>
@@ -783,7 +878,7 @@
           <w:ilvl w:val="1"/>
           <w:numId w:val="3"/>
         </w:numPr>
-        <w:spacing w:after="0"/>
+        <w:spacing w:before="0" w:after="0"/>
         <w:rPr>
           <w:rFonts w:eastAsia="Times New Roman"/>
         </w:rPr>
@@ -802,7 +897,7 @@
           <w:ilvl w:val="1"/>
           <w:numId w:val="3"/>
         </w:numPr>
-        <w:spacing w:after="0"/>
+        <w:spacing w:before="0" w:after="0"/>
         <w:rPr>
           <w:rFonts w:eastAsia="Times New Roman"/>
         </w:rPr>
@@ -821,7 +916,7 @@
           <w:ilvl w:val="1"/>
           <w:numId w:val="3"/>
         </w:numPr>
-        <w:spacing w:afterAutospacing="1"/>
+        <w:spacing w:before="0" w:afterAutospacing="1"/>
         <w:rPr>
           <w:rFonts w:eastAsia="Times New Roman"/>
         </w:rPr>
@@ -835,6 +930,7 @@
     </w:p>
     <w:p>
       <w:pPr>
+        <w:pStyle w:val="Normal"/>
         <w:spacing w:beforeAutospacing="1" w:afterAutospacing="1"/>
         <w:rPr>
           <w:rFonts w:eastAsia="Times New Roman" w:cs="Times New Roman"/>
@@ -876,7 +972,7 @@
           <w:ilvl w:val="0"/>
           <w:numId w:val="3"/>
         </w:numPr>
-        <w:spacing w:after="0"/>
+        <w:spacing w:before="0" w:after="0"/>
         <w:rPr>
           <w:rFonts w:eastAsia="Times New Roman"/>
         </w:rPr>
@@ -895,7 +991,7 @@
           <w:ilvl w:val="0"/>
           <w:numId w:val="3"/>
         </w:numPr>
-        <w:spacing w:after="0"/>
+        <w:spacing w:before="0" w:after="0"/>
         <w:rPr>
           <w:rFonts w:eastAsia="Times New Roman"/>
         </w:rPr>
@@ -914,7 +1010,7 @@
           <w:ilvl w:val="0"/>
           <w:numId w:val="3"/>
         </w:numPr>
-        <w:spacing w:after="0"/>
+        <w:spacing w:before="0" w:after="0"/>
         <w:rPr>
           <w:rFonts w:eastAsia="Times New Roman"/>
         </w:rPr>
@@ -933,7 +1029,7 @@
           <w:ilvl w:val="0"/>
           <w:numId w:val="3"/>
         </w:numPr>
-        <w:spacing w:afterAutospacing="1"/>
+        <w:spacing w:before="0" w:afterAutospacing="1"/>
         <w:rPr>
           <w:rFonts w:eastAsia="Times New Roman"/>
         </w:rPr>
@@ -947,24 +1043,866 @@
     </w:p>
     <w:p>
       <w:pPr>
-        <w:spacing w:beforeAutospacing="1" w:afterAutospacing="1"/>
-        <w:rPr>
-          <w:rFonts w:eastAsia="Times New Roman"/>
-        </w:rPr>
-      </w:pPr>
-    </w:p>
-    <w:p>
-      <w:pPr>
-        <w:spacing w:beforeAutospacing="1" w:afterAutospacing="1"/>
-        <w:rPr>
-          <w:rFonts w:eastAsia="Times New Roman"/>
-        </w:rPr>
-      </w:pPr>
-      <w:r>
-        <w:rPr>
-          <w:rFonts w:eastAsia="Times New Roman"/>
-        </w:rPr>
-        <w:t>Sự kiện:</w:t>
+        <w:pStyle w:val="Normal"/>
+        <w:spacing w:beforeAutospacing="1" w:afterAutospacing="1"/>
+        <w:rPr>
+          <w:rFonts w:eastAsia="Times New Roman"/>
+        </w:rPr>
+      </w:pPr>
+      <w:r>
+        <w:rPr/>
+      </w:r>
+    </w:p>
+    <w:p>
+      <w:pPr>
+        <w:pStyle w:val="Normal"/>
+        <w:spacing w:beforeAutospacing="1" w:afterAutospacing="1"/>
+        <w:rPr>
+          <w:rFonts w:eastAsia="Times New Roman"/>
+        </w:rPr>
+      </w:pPr>
+      <w:r>
+        <w:rPr>
+          <w:rFonts w:eastAsia="Times New Roman"/>
+        </w:rPr>
+        <w:t>Người dùng a đã tạo một ticket mới với tiêu đề …</w:t>
+      </w:r>
+    </w:p>
+    <w:p>
+      <w:pPr>
+        <w:pStyle w:val="Normal"/>
+        <w:spacing w:beforeAutospacing="1" w:afterAutospacing="1"/>
+        <w:rPr>
+          <w:rFonts w:eastAsia="Times New Roman"/>
+        </w:rPr>
+      </w:pPr>
+      <w:r>
+        <w:rPr>
+          <w:rFonts w:eastAsia="Times New Roman"/>
+        </w:rPr>
+        <w:t>Admin b đã thêm người xử lí IT c</w:t>
+      </w:r>
+    </w:p>
+    <w:p>
+      <w:pPr>
+        <w:pStyle w:val="Normal"/>
+        <w:spacing w:beforeAutospacing="1" w:afterAutospacing="1"/>
+        <w:rPr>
+          <w:rFonts w:eastAsia="Times New Roman"/>
+        </w:rPr>
+      </w:pPr>
+      <w:r>
+        <w:rPr>
+          <w:rFonts w:eastAsia="Times New Roman"/>
+        </w:rPr>
+        <w:t xml:space="preserve">IT c đã thêm một comment vào ticket tiêu đề </w:t>
+      </w:r>
+    </w:p>
+    <w:p>
+      <w:pPr>
+        <w:pStyle w:val="Normal"/>
+        <w:spacing w:beforeAutospacing="1" w:afterAutospacing="1"/>
+        <w:rPr>
+          <w:rFonts w:eastAsia="Times New Roman"/>
+        </w:rPr>
+      </w:pPr>
+      <w:r>
+        <w:rPr>
+          <w:rFonts w:eastAsia="Times New Roman"/>
+        </w:rPr>
+        <w:t>Người dùng a đã thêm một comment vào ticket tiêu đề</w:t>
+      </w:r>
+    </w:p>
+    <w:p>
+      <w:pPr>
+        <w:pStyle w:val="Normal"/>
+        <w:spacing w:beforeAutospacing="1" w:afterAutospacing="1"/>
+        <w:rPr>
+          <w:rFonts w:eastAsia="Times New Roman"/>
+        </w:rPr>
+      </w:pPr>
+      <w:r>
+        <w:rPr>
+          <w:rFonts w:eastAsia="Times New Roman"/>
+        </w:rPr>
+        <w:t>IT c đã đánh dấu ticket tiêu đề … hoàn tất</w:t>
+      </w:r>
+    </w:p>
+    <w:p>
+      <w:pPr>
+        <w:pStyle w:val="Normal"/>
+        <w:spacing w:beforeAutospacing="1" w:afterAutospacing="1"/>
+        <w:rPr>
+          <w:rFonts w:eastAsia="Times New Roman"/>
+        </w:rPr>
+      </w:pPr>
+      <w:r>
+        <w:rPr>
+          <w:rFonts w:eastAsia="Times New Roman"/>
+        </w:rPr>
+        <w:t>Người dùng a đã từ chối giải quyết ticket tiêu đề …</w:t>
+      </w:r>
+    </w:p>
+    <w:p>
+      <w:pPr>
+        <w:pStyle w:val="Normal"/>
+        <w:spacing w:beforeAutospacing="1" w:afterAutospacing="1"/>
+        <w:rPr>
+          <w:rFonts w:eastAsia="Times New Roman"/>
+        </w:rPr>
+      </w:pPr>
+      <w:r>
+        <w:rPr>
+          <w:rFonts w:eastAsia="Times New Roman"/>
+        </w:rPr>
+        <w:t>Người dùng a đã đồng ý giải quyết ticket tiêu đề …</w:t>
+      </w:r>
+    </w:p>
+    <w:p>
+      <w:pPr>
+        <w:pStyle w:val="Normal"/>
+        <w:spacing w:beforeAutospacing="1" w:afterAutospacing="1"/>
+        <w:rPr>
+          <w:rFonts w:eastAsia="Times New Roman"/>
+        </w:rPr>
+      </w:pPr>
+      <w:r>
+        <w:rPr>
+          <w:rFonts w:eastAsia="Times New Roman"/>
+        </w:rPr>
+        <w:t>Admin b đã thay đổi trạng thái SLA của ticket … thành …</w:t>
+      </w:r>
+    </w:p>
+    <w:p>
+      <w:pPr>
+        <w:pStyle w:val="Normal"/>
+        <w:spacing w:beforeAutospacing="1" w:afterAutospacing="1"/>
+        <w:rPr>
+          <w:rFonts w:eastAsia="Times New Roman"/>
+        </w:rPr>
+      </w:pPr>
+      <w:r>
+        <w:rPr>
+          <w:rFonts w:eastAsia="Times New Roman"/>
+        </w:rPr>
+        <w:t>Admin b đã thay đổi loại ticket của ticket … thành …</w:t>
+      </w:r>
+    </w:p>
+    <w:p>
+      <w:pPr>
+        <w:pStyle w:val="Normal"/>
+        <w:spacing w:beforeAutospacing="1" w:afterAutospacing="1"/>
+        <w:rPr>
+          <w:rFonts w:eastAsia="Times New Roman"/>
+        </w:rPr>
+      </w:pPr>
+      <w:r>
+        <w:rPr>
+          <w:rFonts w:eastAsia="Times New Roman"/>
+        </w:rPr>
+        <w:t>Role + username + text from action + “ticket” + ticket title + target of the action</w:t>
+      </w:r>
+    </w:p>
+    <w:p>
+      <w:pPr>
+        <w:pStyle w:val="Normal"/>
+        <w:spacing w:beforeAutospacing="1" w:afterAutospacing="1"/>
+        <w:rPr>
+          <w:rFonts w:eastAsia="Times New Roman"/>
+        </w:rPr>
+      </w:pPr>
+      <w:r>
+        <w:rPr>
+          <w:rFonts w:eastAsia="Times New Roman"/>
+        </w:rPr>
+        <w:t>Action = State, assignee, ticketType, priority</w:t>
+      </w:r>
+    </w:p>
+    <w:p>
+      <w:pPr>
+        <w:pStyle w:val="Normal"/>
+        <w:spacing w:beforeAutospacing="1" w:afterAutospacing="1"/>
+        <w:rPr>
+          <w:rFonts w:eastAsia="Times New Roman"/>
+        </w:rPr>
+      </w:pPr>
+      <w:r>
+        <w:rPr>
+          <w:rFonts w:eastAsia="Times New Roman"/>
+        </w:rPr>
+        <w:t>Notify(User actionUser, List&lt;User&gt; receivingUserList, String action, int ticketID, String ticketTitle, String actionResult)</w:t>
+      </w:r>
+    </w:p>
+    <w:p>
+      <w:pPr>
+        <w:pStyle w:val="Normal"/>
+        <w:spacing w:beforeAutospacing="1" w:afterAutospacing="1"/>
+        <w:rPr>
+          <w:rFonts w:eastAsia="Times New Roman"/>
+        </w:rPr>
+      </w:pPr>
+      <w:r>
+        <w:rPr>
+          <w:rFonts w:eastAsia="Times New Roman"/>
+        </w:rPr>
+      </w:r>
+    </w:p>
+    <w:p>
+      <w:pPr>
+        <w:pStyle w:val="Normal"/>
+        <w:bidi w:val="0"/>
+        <w:spacing w:beforeAutospacing="1" w:afterAutospacing="1"/>
+        <w:rPr>
+          <w:rFonts w:eastAsia="Times New Roman"/>
+        </w:rPr>
+      </w:pPr>
+      <w:r>
+        <w:rPr>
+          <w:rFonts w:eastAsia="Times New Roman"/>
+        </w:rPr>
+        <w:t>API nhóm xác thực</w:t>
+      </w:r>
+    </w:p>
+    <w:p>
+      <w:pPr>
+        <w:pStyle w:val="Normal"/>
+        <w:spacing w:beforeAutospacing="1" w:afterAutospacing="1"/>
+        <w:rPr>
+          <w:rFonts w:eastAsia="Times New Roman"/>
+        </w:rPr>
+      </w:pPr>
+      <w:r>
+        <w:rPr>
+          <w:rFonts w:eastAsia="Times New Roman"/>
+        </w:rPr>
+        <w:t>- post login(username, password) /api/auth/login</w:t>
+      </w:r>
+    </w:p>
+    <w:p>
+      <w:pPr>
+        <w:pStyle w:val="Normal"/>
+        <w:spacing w:beforeAutospacing="1" w:afterAutospacing="1"/>
+        <w:rPr>
+          <w:rFonts w:eastAsia="Times New Roman"/>
+        </w:rPr>
+      </w:pPr>
+      <w:r>
+        <w:rPr>
+          <w:rFonts w:eastAsia="Times New Roman"/>
+        </w:rPr>
+        <w:t>- post logout() /api/auth/logout</w:t>
+      </w:r>
+    </w:p>
+    <w:p>
+      <w:pPr>
+        <w:pStyle w:val="Normal"/>
+        <w:spacing w:beforeAutospacing="1" w:afterAutospacing="1"/>
+        <w:rPr>
+          <w:rFonts w:eastAsia="Times New Roman"/>
+        </w:rPr>
+      </w:pPr>
+      <w:r>
+        <w:rPr>
+          <w:rFonts w:eastAsia="Times New Roman"/>
+        </w:rPr>
+      </w:r>
+    </w:p>
+    <w:p>
+      <w:pPr>
+        <w:pStyle w:val="Normal"/>
+        <w:spacing w:beforeAutospacing="1" w:afterAutospacing="1"/>
+        <w:rPr>
+          <w:rFonts w:eastAsia="Times New Roman"/>
+        </w:rPr>
+      </w:pPr>
+      <w:r>
+        <w:rPr>
+          <w:rFonts w:eastAsia="Times New Roman"/>
+        </w:rPr>
+        <w:t>API cho người dùng</w:t>
+      </w:r>
+    </w:p>
+    <w:p>
+      <w:pPr>
+        <w:pStyle w:val="Normal"/>
+        <w:spacing w:beforeAutospacing="1" w:afterAutospacing="1"/>
+        <w:rPr>
+          <w:rFonts w:eastAsia="Times New Roman"/>
+        </w:rPr>
+      </w:pPr>
+      <w:r>
+        <w:rPr>
+          <w:rFonts w:eastAsia="Times New Roman"/>
+        </w:rPr>
+        <w:t>- get getLoggedInUserInfo() (jwt is embedded) /api/users/me</w:t>
+      </w:r>
+    </w:p>
+    <w:p>
+      <w:pPr>
+        <w:pStyle w:val="Normal"/>
+        <w:spacing w:beforeAutospacing="1" w:afterAutospacing="1"/>
+        <w:rPr>
+          <w:rFonts w:eastAsia="Times New Roman"/>
+        </w:rPr>
+      </w:pPr>
+      <w:r>
+        <w:rPr/>
+        <w:t>- put changeUserPassword(password, newPassword) /api/users/{id}/password</w:t>
+      </w:r>
+    </w:p>
+    <w:p>
+      <w:pPr>
+        <w:pStyle w:val="Normal"/>
+        <w:spacing w:beforeAutospacing="1" w:afterAutospacing="1"/>
+        <w:rPr>
+          <w:rFonts w:eastAsia="Times New Roman"/>
+        </w:rPr>
+      </w:pPr>
+      <w:r>
+        <w:rPr>
+          <w:rFonts w:eastAsia="Times New Roman"/>
+        </w:rPr>
+      </w:r>
+    </w:p>
+    <w:p>
+      <w:pPr>
+        <w:pStyle w:val="Normal"/>
+        <w:spacing w:beforeAutospacing="1" w:afterAutospacing="1"/>
+        <w:rPr>
+          <w:rFonts w:eastAsia="Times New Roman"/>
+        </w:rPr>
+      </w:pPr>
+      <w:r>
+        <w:rPr>
+          <w:rFonts w:eastAsia="Times New Roman"/>
+        </w:rPr>
+        <w:t xml:space="preserve">API cho ticket </w:t>
+      </w:r>
+    </w:p>
+    <w:p>
+      <w:pPr>
+        <w:pStyle w:val="Normal"/>
+        <w:tabs>
+          <w:tab w:val="clear" w:pos="720"/>
+          <w:tab w:val="left" w:pos="6318" w:leader="none"/>
+        </w:tabs>
+        <w:spacing w:beforeAutospacing="1" w:afterAutospacing="1"/>
+        <w:rPr>
+          <w:rFonts w:eastAsia="Times New Roman"/>
+        </w:rPr>
+      </w:pPr>
+      <w:r>
+        <w:rPr>
+          <w:rFonts w:eastAsia="Times New Roman"/>
+        </w:rPr>
+        <w:t>- post create ticket(Title, Description, Priority, Type (Optional), File (Optional)) → void /api/tickets</w:t>
+      </w:r>
+    </w:p>
+    <w:p>
+      <w:pPr>
+        <w:pStyle w:val="Normal"/>
+        <w:spacing w:beforeAutospacing="1" w:afterAutospacing="1"/>
+        <w:rPr>
+          <w:rFonts w:eastAsia="Times New Roman"/>
+        </w:rPr>
+      </w:pPr>
+      <w:r>
+        <w:rPr>
+          <w:rFonts w:eastAsia="Times New Roman"/>
+        </w:rPr>
+        <w:t>- get getTicketsInAuthority() → tickets /api/tickets</w:t>
+      </w:r>
+    </w:p>
+    <w:p>
+      <w:pPr>
+        <w:pStyle w:val="Normal"/>
+        <w:spacing w:beforeAutospacing="1" w:afterAutospacing="1"/>
+        <w:rPr>
+          <w:rFonts w:eastAsia="Times New Roman"/>
+        </w:rPr>
+      </w:pPr>
+      <w:r>
+        <w:rPr>
+          <w:rFonts w:eastAsia="Times New Roman"/>
+        </w:rPr>
+        <w:t>- get viewTickets(ticketID) → ticket /api/tickets/{id}</w:t>
+      </w:r>
+    </w:p>
+    <w:p>
+      <w:pPr>
+        <w:pStyle w:val="Normal"/>
+        <w:spacing w:beforeAutospacing="1" w:afterAutospacing="1"/>
+        <w:rPr>
+          <w:rFonts w:eastAsia="Times New Roman"/>
+        </w:rPr>
+      </w:pPr>
+      <w:r>
+        <w:rPr/>
+        <w:t>- put updateTicketState (ticketID, ticket) /api/tickets/{id}?</w:t>
+      </w:r>
+    </w:p>
+    <w:p>
+      <w:pPr>
+        <w:pStyle w:val="Normal"/>
+        <w:spacing w:beforeAutospacing="1" w:afterAutospacing="1"/>
+        <w:rPr>
+          <w:rFonts w:eastAsia="Times New Roman"/>
+        </w:rPr>
+      </w:pPr>
+      <w:r>
+        <w:rPr/>
+        <w:t>- post addComment(ticketID, detail, attachedFile (Optional)) /api/tickets/{id}/comments</w:t>
+      </w:r>
+    </w:p>
+    <w:p>
+      <w:pPr>
+        <w:pStyle w:val="Normal"/>
+        <w:spacing w:beforeAutospacing="1" w:afterAutospacing="1"/>
+        <w:rPr>
+          <w:rFonts w:eastAsia="Times New Roman"/>
+        </w:rPr>
+      </w:pPr>
+      <w:r>
+        <w:rPr>
+          <w:rFonts w:eastAsia="Times New Roman"/>
+        </w:rPr>
+      </w:r>
+    </w:p>
+    <w:p>
+      <w:pPr>
+        <w:pStyle w:val="Normal"/>
+        <w:spacing w:beforeAutospacing="1" w:afterAutospacing="1"/>
+        <w:rPr>
+          <w:rFonts w:eastAsia="Times New Roman"/>
+        </w:rPr>
+      </w:pPr>
+      <w:r>
+        <w:rPr>
+          <w:rFonts w:eastAsia="Times New Roman"/>
+        </w:rPr>
+        <w:t>API cho độ ưu tiên</w:t>
+      </w:r>
+    </w:p>
+    <w:p>
+      <w:pPr>
+        <w:pStyle w:val="Normal"/>
+        <w:spacing w:beforeAutospacing="1" w:afterAutospacing="1"/>
+        <w:rPr>
+          <w:rFonts w:eastAsia="Times New Roman"/>
+        </w:rPr>
+      </w:pPr>
+      <w:r>
+        <w:rPr>
+          <w:rFonts w:eastAsia="Times New Roman"/>
+        </w:rPr>
+        <w:t>- get getPriorities()  /api/priorities</w:t>
+      </w:r>
+    </w:p>
+    <w:p>
+      <w:pPr>
+        <w:pStyle w:val="Normal"/>
+        <w:spacing w:beforeAutospacing="1" w:afterAutospacing="1"/>
+        <w:rPr>
+          <w:rFonts w:eastAsia="Times New Roman"/>
+        </w:rPr>
+      </w:pPr>
+      <w:r>
+        <w:rPr>
+          <w:rFonts w:eastAsia="Times New Roman"/>
+        </w:rPr>
+      </w:r>
+    </w:p>
+    <w:p>
+      <w:pPr>
+        <w:pStyle w:val="Normal"/>
+        <w:spacing w:beforeAutospacing="1" w:afterAutospacing="1"/>
+        <w:rPr>
+          <w:rFonts w:eastAsia="Times New Roman"/>
+        </w:rPr>
+      </w:pPr>
+      <w:r>
+        <w:rPr>
+          <w:rFonts w:eastAsia="Times New Roman"/>
+        </w:rPr>
+        <w:t>API cho loại ticket</w:t>
+      </w:r>
+    </w:p>
+    <w:p>
+      <w:pPr>
+        <w:pStyle w:val="Normal"/>
+        <w:spacing w:beforeAutospacing="1" w:afterAutospacing="1"/>
+        <w:rPr>
+          <w:rFonts w:eastAsia="Times New Roman"/>
+        </w:rPr>
+      </w:pPr>
+      <w:r>
+        <w:rPr>
+          <w:rFonts w:eastAsia="Times New Roman"/>
+        </w:rPr>
+        <w:t>- get getTicketType() /api/ticket-type</w:t>
+      </w:r>
+    </w:p>
+    <w:p>
+      <w:pPr>
+        <w:pStyle w:val="Normal"/>
+        <w:spacing w:beforeAutospacing="1" w:afterAutospacing="1"/>
+        <w:rPr>
+          <w:rFonts w:eastAsia="Times New Roman"/>
+        </w:rPr>
+      </w:pPr>
+      <w:r>
+        <w:rPr>
+          <w:rFonts w:eastAsia="Times New Roman"/>
+        </w:rPr>
+        <w:t>- post addTicketType() /api/ticket-type</w:t>
+      </w:r>
+    </w:p>
+    <w:p>
+      <w:pPr>
+        <w:pStyle w:val="Normal"/>
+        <w:spacing w:beforeAutospacing="1" w:afterAutospacing="1"/>
+        <w:rPr>
+          <w:rFonts w:eastAsia="Times New Roman"/>
+        </w:rPr>
+      </w:pPr>
+      <w:r>
+        <w:rPr>
+          <w:rFonts w:eastAsia="Times New Roman"/>
+        </w:rPr>
+      </w:r>
+    </w:p>
+    <w:p>
+      <w:pPr>
+        <w:pStyle w:val="Normal"/>
+        <w:spacing w:beforeAutospacing="1" w:afterAutospacing="1"/>
+        <w:rPr>
+          <w:rFonts w:eastAsia="Times New Roman"/>
+        </w:rPr>
+      </w:pPr>
+      <w:r>
+        <w:rPr>
+          <w:rFonts w:eastAsia="Times New Roman"/>
+        </w:rPr>
+        <w:t>API cho admin</w:t>
+      </w:r>
+    </w:p>
+    <w:p>
+      <w:pPr>
+        <w:pStyle w:val="Normal"/>
+        <w:spacing w:beforeAutospacing="1" w:afterAutospacing="1"/>
+        <w:rPr>
+          <w:rFonts w:eastAsia="Times New Roman"/>
+        </w:rPr>
+      </w:pPr>
+      <w:r>
+        <w:rPr>
+          <w:rFonts w:eastAsia="Times New Roman"/>
+        </w:rPr>
+        <w:t>- Nhóm quản lí người dùng</w:t>
+      </w:r>
+    </w:p>
+    <w:p>
+      <w:pPr>
+        <w:pStyle w:val="Normal"/>
+        <w:spacing w:beforeAutospacing="1" w:afterAutospacing="1"/>
+        <w:rPr>
+          <w:rFonts w:eastAsia="Times New Roman"/>
+        </w:rPr>
+      </w:pPr>
+      <w:r>
+        <w:rPr>
+          <w:rFonts w:eastAsia="Times New Roman"/>
+        </w:rPr>
+        <w:tab/>
+        <w:t>- post addAccount(username, password) /api/admin/users</w:t>
+      </w:r>
+    </w:p>
+    <w:p>
+      <w:pPr>
+        <w:pStyle w:val="Normal"/>
+        <w:spacing w:beforeAutospacing="1" w:afterAutospacing="1"/>
+        <w:rPr>
+          <w:rFonts w:eastAsia="Times New Roman"/>
+        </w:rPr>
+      </w:pPr>
+      <w:r>
+        <w:rPr>
+          <w:rFonts w:eastAsia="Times New Roman"/>
+        </w:rPr>
+        <w:tab/>
+        <w:t>- get getAccount(username) /api/admin/users/{id}</w:t>
+      </w:r>
+    </w:p>
+    <w:p>
+      <w:pPr>
+        <w:pStyle w:val="Normal"/>
+        <w:spacing w:beforeAutospacing="1" w:afterAutospacing="1"/>
+        <w:rPr>
+          <w:rFonts w:eastAsia="Times New Roman"/>
+        </w:rPr>
+      </w:pPr>
+      <w:r>
+        <w:rPr>
+          <w:rFonts w:eastAsia="Times New Roman"/>
+        </w:rPr>
+        <w:tab/>
+        <w:t>- get getAccountsByRole(</w:t>
+      </w:r>
+      <w:r>
+        <w:rPr>
+          <w:rFonts w:eastAsia="Times New Roman"/>
+        </w:rPr>
+        <w:t>role) /api/admin/users</w:t>
+      </w:r>
+    </w:p>
+    <w:p>
+      <w:pPr>
+        <w:pStyle w:val="Normal"/>
+        <w:spacing w:beforeAutospacing="1" w:afterAutospacing="1"/>
+        <w:rPr>
+          <w:rFonts w:eastAsia="Times New Roman"/>
+        </w:rPr>
+      </w:pPr>
+      <w:r>
+        <w:rPr>
+          <w:rFonts w:eastAsia="Times New Roman"/>
+        </w:rPr>
+        <w:tab/>
+        <w:t>- put changeUserPassword(newPassword) /api/admin/users/{userID}/password</w:t>
+      </w:r>
+    </w:p>
+    <w:p>
+      <w:pPr>
+        <w:pStyle w:val="Normal"/>
+        <w:spacing w:beforeAutospacing="1" w:afterAutospacing="1"/>
+        <w:rPr>
+          <w:rFonts w:eastAsia="Times New Roman"/>
+        </w:rPr>
+      </w:pPr>
+      <w:r>
+        <w:rPr>
+          <w:rFonts w:eastAsia="Times New Roman"/>
+        </w:rPr>
+        <w:tab/>
+        <w:t xml:space="preserve">- </w:t>
+      </w:r>
+      <w:r>
+        <w:rPr>
+          <w:rFonts w:eastAsia="Times New Roman"/>
+        </w:rPr>
+        <w:t>put change</w:t>
+      </w:r>
+      <w:r>
+        <w:rPr>
+          <w:rFonts w:eastAsia="Times New Roman"/>
+        </w:rPr>
+        <w:t>Department(department) /api/admin/users/{userID}/department</w:t>
+      </w:r>
+    </w:p>
+    <w:p>
+      <w:pPr>
+        <w:pStyle w:val="Normal"/>
+        <w:spacing w:beforeAutospacing="1" w:afterAutospacing="1"/>
+        <w:rPr>
+          <w:rFonts w:eastAsia="Times New Roman"/>
+        </w:rPr>
+      </w:pPr>
+      <w:r>
+        <w:rPr>
+          <w:rFonts w:eastAsia="Times New Roman"/>
+        </w:rPr>
+        <w:tab/>
+        <w:t>- delete deleteAccount(userID) /api/admin/users/{userID}</w:t>
+      </w:r>
+    </w:p>
+    <w:p>
+      <w:pPr>
+        <w:pStyle w:val="Normal"/>
+        <w:bidi w:val="0"/>
+        <w:spacing w:beforeAutospacing="1" w:afterAutospacing="1"/>
+        <w:rPr>
+          <w:rFonts w:eastAsia="Times New Roman"/>
+        </w:rPr>
+      </w:pPr>
+      <w:r>
+        <w:rPr>
+          <w:rFonts w:eastAsia="Times New Roman"/>
+        </w:rPr>
+        <w:t>- Nhóm cho độ ưu tiên</w:t>
+      </w:r>
+    </w:p>
+    <w:p>
+      <w:pPr>
+        <w:pStyle w:val="Normal"/>
+        <w:bidi w:val="0"/>
+        <w:spacing w:beforeAutospacing="1" w:afterAutospacing="1"/>
+        <w:rPr>
+          <w:rFonts w:eastAsia="Times New Roman"/>
+        </w:rPr>
+      </w:pPr>
+      <w:r>
+        <w:rPr>
+          <w:rFonts w:eastAsia="Times New Roman"/>
+        </w:rPr>
+        <w:tab/>
+        <w:t>- get getPriorities() /api/admin/priorities</w:t>
+      </w:r>
+    </w:p>
+    <w:p>
+      <w:pPr>
+        <w:pStyle w:val="Normal"/>
+        <w:bidi w:val="0"/>
+        <w:spacing w:beforeAutospacing="1" w:afterAutospacing="1"/>
+        <w:rPr>
+          <w:rFonts w:eastAsia="Times New Roman"/>
+        </w:rPr>
+      </w:pPr>
+      <w:r>
+        <w:rPr>
+          <w:rFonts w:eastAsia="Times New Roman"/>
+        </w:rPr>
+        <w:tab/>
+        <w:t>- post addPriorities() /api/admin/priorities</w:t>
+      </w:r>
+    </w:p>
+    <w:p>
+      <w:pPr>
+        <w:pStyle w:val="Normal"/>
+        <w:bidi w:val="0"/>
+        <w:spacing w:beforeAutospacing="1" w:afterAutospacing="1"/>
+        <w:rPr>
+          <w:rFonts w:eastAsia="Times New Roman"/>
+        </w:rPr>
+      </w:pPr>
+      <w:r>
+        <w:rPr>
+          <w:rFonts w:eastAsia="Times New Roman"/>
+        </w:rPr>
+        <w:tab/>
+        <w:t>- put changePriority(priorityID, levelOfPriority(int), name, timeToRespond, timeToFinish) /api/admin/priorities/{piriority-id}</w:t>
+      </w:r>
+    </w:p>
+    <w:p>
+      <w:pPr>
+        <w:pStyle w:val="Normal"/>
+        <w:bidi w:val="0"/>
+        <w:spacing w:beforeAutospacing="1" w:afterAutospacing="1"/>
+        <w:rPr>
+          <w:rFonts w:eastAsia="Times New Roman"/>
+        </w:rPr>
+      </w:pPr>
+      <w:r>
+        <w:rPr>
+          <w:rFonts w:eastAsia="Times New Roman"/>
+        </w:rPr>
+        <w:tab/>
+        <w:t>- delete deletePriorities(priorityID) /api/admin/priorities/{priority-id}</w:t>
+      </w:r>
+    </w:p>
+    <w:p>
+      <w:pPr>
+        <w:pStyle w:val="Normal"/>
+        <w:bidi w:val="0"/>
+        <w:spacing w:beforeAutospacing="1" w:afterAutospacing="1"/>
+        <w:rPr>
+          <w:rFonts w:eastAsia="Times New Roman"/>
+        </w:rPr>
+      </w:pPr>
+      <w:r>
+        <w:rPr>
+          <w:rFonts w:eastAsia="Times New Roman"/>
+        </w:rPr>
+        <w:t>- Nhóm cho ticket</w:t>
+      </w:r>
+    </w:p>
+    <w:p>
+      <w:pPr>
+        <w:pStyle w:val="Normal"/>
+        <w:bidi w:val="0"/>
+        <w:spacing w:beforeAutospacing="1" w:afterAutospacing="1"/>
+        <w:rPr>
+          <w:rFonts w:eastAsia="Times New Roman"/>
+        </w:rPr>
+      </w:pPr>
+      <w:r>
+        <w:rPr>
+          <w:rFonts w:eastAsia="Times New Roman"/>
+        </w:rPr>
+        <w:tab/>
+        <w:t>- put updateTicket(ticketID, ticket) /api/admin/tickets/{id}</w:t>
+      </w:r>
+    </w:p>
+    <w:p>
+      <w:pPr>
+        <w:pStyle w:val="Normal"/>
+        <w:spacing w:beforeAutospacing="1" w:afterAutospacing="1"/>
+        <w:rPr>
+          <w:rFonts w:eastAsia="Times New Roman"/>
+        </w:rPr>
+      </w:pPr>
+      <w:r>
+        <w:rPr>
+          <w:rFonts w:eastAsia="Times New Roman"/>
+        </w:rPr>
+      </w:r>
+    </w:p>
+    <w:p>
+      <w:pPr>
+        <w:pStyle w:val="Normal"/>
+        <w:spacing w:beforeAutospacing="1" w:afterAutospacing="1"/>
+        <w:rPr>
+          <w:rFonts w:eastAsia="Times New Roman"/>
+        </w:rPr>
+      </w:pPr>
+      <w:r>
+        <w:rPr>
+          <w:rFonts w:eastAsia="Times New Roman"/>
+        </w:rPr>
+        <w:t>post login() /auth/google</w:t>
+      </w:r>
+    </w:p>
+    <w:p>
+      <w:pPr>
+        <w:pStyle w:val="Normal"/>
+        <w:spacing w:beforeAutospacing="1" w:afterAutospacing="1"/>
+        <w:rPr>
+          <w:rFonts w:eastAsia="Times New Roman"/>
+        </w:rPr>
+      </w:pPr>
+      <w:r>
+        <w:rPr>
+          <w:rFonts w:eastAsia="Times New Roman"/>
+        </w:rPr>
+        <w:t>post callback() /auth/callback</w:t>
+      </w:r>
+    </w:p>
+    <w:p>
+      <w:pPr>
+        <w:pStyle w:val="Normal"/>
+        <w:spacing w:beforeAutospacing="1" w:afterAutospacing="1"/>
+        <w:rPr>
+          <w:rFonts w:eastAsia="Times New Roman"/>
+        </w:rPr>
+      </w:pPr>
+      <w:r>
+        <w:rPr>
+          <w:rFonts w:eastAsia="Times New Roman"/>
+        </w:rPr>
+        <w:t>(Optional if google sso is to be added)</w:t>
+      </w:r>
+    </w:p>
+    <w:p>
+      <w:pPr>
+        <w:pStyle w:val="Normal"/>
+        <w:spacing w:beforeAutospacing="1" w:afterAutospacing="1"/>
+        <w:rPr>
+          <w:rFonts w:eastAsia="Times New Roman"/>
+        </w:rPr>
+      </w:pPr>
+      <w:r>
+        <w:rPr>
+          <w:rFonts w:eastAsia="Times New Roman"/>
+        </w:rPr>
       </w:r>
     </w:p>
     <w:p>
@@ -974,634 +1912,17 @@
           <w:ilvl w:val="0"/>
           <w:numId w:val="3"/>
         </w:numPr>
-        <w:spacing w:beforeAutospacing="1" w:afterAutospacing="1"/>
-        <w:rPr>
-          <w:rFonts w:eastAsia="Times New Roman"/>
-        </w:rPr>
-      </w:pPr>
-      <w:r>
-        <w:rPr>
-          <w:rFonts w:eastAsia="Times New Roman"/>
-        </w:rPr>
-        <w:t>Thay đổi: Ticket</w:t>
-      </w:r>
-    </w:p>
-    <w:p>
-      <w:pPr>
-        <w:spacing w:beforeAutospacing="1" w:afterAutospacing="1"/>
-        <w:rPr>
-          <w:rFonts w:eastAsia="Times New Roman"/>
-        </w:rPr>
-      </w:pPr>
-      <w:r>
-        <w:rPr>
-          <w:rFonts w:eastAsia="Times New Roman"/>
-        </w:rPr>
-        <w:t>Người dùng a đã tạo một ticket mới với tiêu đề …</w:t>
-      </w:r>
-    </w:p>
-    <w:p>
-      <w:pPr>
-        <w:spacing w:beforeAutospacing="1" w:afterAutospacing="1"/>
-        <w:rPr>
-          <w:rFonts w:eastAsia="Times New Roman"/>
-        </w:rPr>
-      </w:pPr>
-      <w:r>
-        <w:rPr>
-          <w:rFonts w:eastAsia="Times New Roman"/>
-        </w:rPr>
-        <w:t>Admin b đã thêm người xử lí IT c</w:t>
-      </w:r>
-    </w:p>
-    <w:p>
-      <w:pPr>
-        <w:spacing w:beforeAutospacing="1" w:afterAutospacing="1"/>
-        <w:rPr>
-          <w:rFonts w:eastAsia="Times New Roman"/>
-        </w:rPr>
-      </w:pPr>
-      <w:r>
-        <w:rPr>
-          <w:rFonts w:eastAsia="Times New Roman"/>
-        </w:rPr>
-        <w:t xml:space="preserve">IT c đã thêm một comment vào ticket tiêu đề </w:t>
-      </w:r>
-    </w:p>
-    <w:p>
-      <w:pPr>
-        <w:spacing w:beforeAutospacing="1" w:afterAutospacing="1"/>
-        <w:rPr>
-          <w:rFonts w:eastAsia="Times New Roman"/>
-        </w:rPr>
-      </w:pPr>
-      <w:r>
-        <w:rPr>
-          <w:rFonts w:eastAsia="Times New Roman"/>
-        </w:rPr>
-        <w:t>Người dùng a đã thêm một comment vào ticket tiêu đề</w:t>
-      </w:r>
-    </w:p>
-    <w:p>
-      <w:pPr>
-        <w:spacing w:beforeAutospacing="1" w:afterAutospacing="1"/>
-        <w:rPr>
-          <w:rFonts w:eastAsia="Times New Roman"/>
-        </w:rPr>
-      </w:pPr>
-      <w:r>
-        <w:rPr>
-          <w:rFonts w:eastAsia="Times New Roman"/>
-        </w:rPr>
-        <w:t>IT c đã đánh dấu ticket tiêu đề … hoàn tất</w:t>
-      </w:r>
-    </w:p>
-    <w:p>
-      <w:pPr>
-        <w:spacing w:beforeAutospacing="1" w:afterAutospacing="1"/>
-        <w:rPr>
-          <w:rFonts w:eastAsia="Times New Roman"/>
-        </w:rPr>
-      </w:pPr>
-      <w:r>
-        <w:rPr>
-          <w:rFonts w:eastAsia="Times New Roman"/>
-        </w:rPr>
-        <w:t>Người dùng a đã từ chối giải quyết ticket tiêu đề …</w:t>
-      </w:r>
-    </w:p>
-    <w:p>
-      <w:pPr>
-        <w:spacing w:beforeAutospacing="1" w:afterAutospacing="1"/>
-        <w:rPr>
-          <w:rFonts w:eastAsia="Times New Roman"/>
-        </w:rPr>
-      </w:pPr>
-      <w:r>
-        <w:rPr>
-          <w:rFonts w:eastAsia="Times New Roman"/>
-        </w:rPr>
-        <w:t>Người dùng a đã đồng ý giải quyết ticket tiêu đề …</w:t>
-      </w:r>
-    </w:p>
-    <w:p>
-      <w:pPr>
-        <w:spacing w:beforeAutospacing="1" w:afterAutospacing="1"/>
-        <w:rPr>
-          <w:rFonts w:eastAsia="Times New Roman"/>
-        </w:rPr>
-      </w:pPr>
-      <w:r>
-        <w:rPr>
-          <w:rFonts w:eastAsia="Times New Roman"/>
-        </w:rPr>
-        <w:t>Admin b đã thay đổi trạng thái SLA của ticket … thành …</w:t>
-      </w:r>
-    </w:p>
-    <w:p>
-      <w:pPr>
-        <w:spacing w:beforeAutospacing="1" w:afterAutospacing="1"/>
-        <w:rPr>
-          <w:rFonts w:eastAsia="Times New Roman"/>
-        </w:rPr>
-      </w:pPr>
-      <w:r>
-        <w:rPr>
-          <w:rFonts w:eastAsia="Times New Roman"/>
-        </w:rPr>
-        <w:lastRenderedPageBreak/>
-        <w:t>Admin b đã thay đổi loại ticket của ticket … thành …</w:t>
-      </w:r>
-    </w:p>
-    <w:p>
-      <w:pPr>
-        <w:spacing w:beforeAutospacing="1" w:afterAutospacing="1"/>
-        <w:rPr>
-          <w:rFonts w:eastAsia="Times New Roman"/>
-        </w:rPr>
-      </w:pPr>
-      <w:r>
-        <w:rPr>
-          <w:rFonts w:eastAsia="Times New Roman"/>
-        </w:rPr>
-        <w:t>Role + username + text from action + “ticket” + ticket title + target of the action</w:t>
-      </w:r>
-    </w:p>
-    <w:p>
-      <w:pPr>
-        <w:spacing w:beforeAutospacing="1" w:afterAutospacing="1"/>
-        <w:rPr>
-          <w:rFonts w:eastAsia="Times New Roman"/>
-        </w:rPr>
-      </w:pPr>
-    </w:p>
-    <w:p>
-      <w:pPr>
-        <w:spacing w:beforeAutospacing="1" w:afterAutospacing="1"/>
-        <w:rPr>
-          <w:rFonts w:eastAsia="Times New Roman"/>
-        </w:rPr>
-      </w:pPr>
-      <w:r>
-        <w:rPr>
-          <w:rFonts w:eastAsia="Times New Roman"/>
-        </w:rPr>
-        <w:t>post login(username, password) /api/auth/login</w:t>
-      </w:r>
-    </w:p>
-    <w:p>
-      <w:pPr>
-        <w:spacing w:beforeAutospacing="1" w:afterAutospacing="1"/>
-        <w:rPr>
-          <w:rFonts w:eastAsia="Times New Roman"/>
-        </w:rPr>
-      </w:pPr>
-      <w:r>
-        <w:rPr>
-          <w:rFonts w:eastAsia="Times New Roman"/>
-        </w:rPr>
-        <w:t>post logout() /api/auth/logout</w:t>
-      </w:r>
-    </w:p>
-    <w:p>
-      <w:pPr>
-        <w:spacing w:beforeAutospacing="1" w:afterAutospacing="1"/>
-        <w:rPr>
-          <w:rFonts w:eastAsia="Times New Roman"/>
-        </w:rPr>
-      </w:pPr>
-      <w:r>
-        <w:rPr>
-          <w:rFonts w:eastAsia="Times New Roman"/>
-        </w:rPr>
-        <w:t>get getLoggedInUserInfo() (jwt is embedded) /api/users/me</w:t>
-      </w:r>
-    </w:p>
-    <w:p>
-      <w:pPr>
-        <w:tabs>
-          <w:tab w:val="left" w:pos="6318"/>
-        </w:tabs>
-        <w:spacing w:beforeAutospacing="1" w:afterAutospacing="1"/>
-        <w:rPr>
-          <w:rFonts w:eastAsia="Times New Roman"/>
-        </w:rPr>
-      </w:pPr>
-      <w:r>
-        <w:rPr>
-          <w:rFonts w:eastAsia="Times New Roman"/>
-        </w:rPr>
-        <w:t>post create ticket(Title, Description, Priority, Type (Optional), File (Optional)) → void /api/tickets</w:t>
-      </w:r>
-    </w:p>
-    <w:p>
-      <w:pPr>
-        <w:spacing w:beforeAutospacing="1" w:afterAutospacing="1"/>
-        <w:rPr>
-          <w:rFonts w:eastAsia="Times New Roman"/>
-        </w:rPr>
-      </w:pPr>
-      <w:r>
-        <w:rPr>
-          <w:rFonts w:eastAsia="Times New Roman"/>
-        </w:rPr>
-        <w:t>get getTickets</w:t>
-      </w:r>
-      <w:r>
-        <w:rPr>
-          <w:rFonts w:eastAsia="Times New Roman"/>
-        </w:rPr>
-        <w:t>InAuthority</w:t>
-      </w:r>
-      <w:r>
-        <w:rPr>
-          <w:rFonts w:eastAsia="Times New Roman"/>
-        </w:rPr>
-        <w:t>() → tickets /api/tickets</w:t>
-      </w:r>
-    </w:p>
-    <w:p>
-      <w:pPr>
-        <w:spacing w:beforeAutospacing="1" w:afterAutospacing="1"/>
-        <w:rPr>
-          <w:rFonts w:eastAsia="Times New Roman"/>
-        </w:rPr>
-      </w:pPr>
-      <w:r>
-        <w:rPr>
-          <w:rFonts w:eastAsia="Times New Roman"/>
-        </w:rPr>
-        <w:t>get getPriorities()  /api/priorities</w:t>
-      </w:r>
-    </w:p>
-    <w:p>
-      <w:pPr>
-        <w:spacing w:beforeAutospacing="1" w:afterAutospacing="1"/>
-        <w:rPr>
-          <w:rFonts w:eastAsia="Times New Roman"/>
-        </w:rPr>
-      </w:pPr>
-      <w:r>
-        <w:rPr>
-          <w:rFonts w:eastAsia="Times New Roman"/>
-        </w:rPr>
-        <w:t>get getTicketType() /api/ticket-type</w:t>
-      </w:r>
-    </w:p>
-    <w:p>
-      <w:pPr>
-        <w:spacing w:beforeAutospacing="1" w:afterAutospacing="1"/>
-        <w:rPr>
-          <w:rFonts w:eastAsia="Times New Roman"/>
-        </w:rPr>
-      </w:pPr>
-      <w:r>
-        <w:rPr>
-          <w:rFonts w:eastAsia="Times New Roman"/>
-        </w:rPr>
-        <w:t>post addTicketType() /api/ticket-type</w:t>
-      </w:r>
-    </w:p>
-    <w:p>
-      <w:pPr>
-        <w:spacing w:beforeAutospacing="1" w:afterAutospacing="1"/>
-        <w:rPr>
-          <w:rFonts w:eastAsia="Times New Roman"/>
-        </w:rPr>
-      </w:pPr>
-      <w:r>
-        <w:rPr>
-          <w:rFonts w:eastAsia="Times New Roman"/>
-        </w:rPr>
-        <w:t>get viewTickets(ticketID) → ticket /api/tickets/{id}</w:t>
-      </w:r>
-    </w:p>
-    <w:p>
-      <w:pPr>
-        <w:spacing w:beforeAutospacing="1" w:afterAutospacing="1"/>
-        <w:rPr>
-          <w:rFonts w:eastAsia="Times New Roman"/>
-        </w:rPr>
-      </w:pPr>
-      <w:r>
-        <w:rPr>
-          <w:rFonts w:eastAsia="Times New Roman"/>
-        </w:rPr>
-        <w:t>put updateTicket</w:t>
-      </w:r>
-      <w:r>
-        <w:rPr>
-          <w:rFonts w:eastAsia="Times New Roman"/>
-        </w:rPr>
-        <w:t>State</w:t>
-      </w:r>
-      <w:r>
-        <w:rPr>
-          <w:rFonts w:eastAsia="Times New Roman"/>
-        </w:rPr>
-        <w:t xml:space="preserve"> </w:t>
-      </w:r>
-      <w:r>
-        <w:rPr>
-          <w:rFonts w:eastAsia="Times New Roman"/>
-        </w:rPr>
-        <w:t xml:space="preserve">(ticketID, </w:t>
-      </w:r>
-      <w:r>
-        <w:rPr>
-          <w:rFonts w:eastAsia="Times New Roman"/>
-        </w:rPr>
-        <w:t>ticket</w:t>
-      </w:r>
-      <w:r>
-        <w:rPr>
-          <w:rFonts w:eastAsia="Times New Roman"/>
-        </w:rPr>
-        <w:t>) /api/tickets/{id}</w:t>
-      </w:r>
-    </w:p>
-    <w:p>
-      <w:pPr>
-        <w:spacing w:beforeAutospacing="1" w:afterAutospacing="1"/>
-        <w:rPr>
-          <w:rFonts w:eastAsia="Times New Roman"/>
-        </w:rPr>
-      </w:pPr>
-      <w:r>
-        <w:rPr>
-          <w:rFonts w:eastAsia="Times New Roman"/>
-        </w:rPr>
-        <w:t>post addComment(ticketID,</w:t>
-      </w:r>
-      <w:r>
-        <w:rPr>
-          <w:rFonts w:eastAsia="Times New Roman"/>
-        </w:rPr>
-        <w:t xml:space="preserve"> detail,</w:t>
-      </w:r>
-      <w:r>
-        <w:rPr>
-          <w:rFonts w:eastAsia="Times New Roman"/>
-        </w:rPr>
-        <w:t xml:space="preserve"> attachedFile (Optional)) /api/tickets/{id}/comments</w:t>
-      </w:r>
-    </w:p>
-    <w:p>
-      <w:pPr>
-        <w:spacing w:beforeAutospacing="1" w:afterAutospacing="1"/>
-        <w:rPr>
-          <w:rFonts w:eastAsia="Times New Roman"/>
-        </w:rPr>
-      </w:pPr>
-      <w:r>
-        <w:rPr>
-          <w:rFonts w:eastAsia="Times New Roman"/>
-        </w:rPr>
-        <w:t>get getPossibleAssignee(ticketID, userID) /api/admin</w:t>
-      </w:r>
-      <w:r>
-        <w:rPr>
-          <w:rFonts w:eastAsia="Times New Roman"/>
-        </w:rPr>
-        <w:t>/users/?role=IT</w:t>
-      </w:r>
-    </w:p>
-    <w:p>
-      <w:pPr>
-        <w:spacing w:beforeAutospacing="1" w:afterAutospacing="1"/>
-        <w:rPr>
-          <w:rFonts w:eastAsia="Times New Roman"/>
-        </w:rPr>
-      </w:pPr>
-      <w:r>
-        <w:rPr>
-          <w:rFonts w:eastAsia="Times New Roman"/>
-        </w:rPr>
-        <w:t>post addAccount(username, password) /api/</w:t>
-      </w:r>
-      <w:r>
-        <w:rPr>
-          <w:rFonts w:eastAsia="Times New Roman"/>
-        </w:rPr>
-        <w:t>admin/</w:t>
-      </w:r>
-      <w:r>
-        <w:rPr>
-          <w:rFonts w:eastAsia="Times New Roman"/>
-        </w:rPr>
-        <w:t>users</w:t>
-      </w:r>
-    </w:p>
-    <w:p>
-      <w:pPr>
-        <w:spacing w:beforeAutospacing="1" w:afterAutospacing="1"/>
-        <w:rPr>
-          <w:rFonts w:eastAsia="Times New Roman"/>
-        </w:rPr>
-      </w:pPr>
-      <w:r>
-        <w:rPr>
-          <w:rFonts w:eastAsia="Times New Roman"/>
-        </w:rPr>
-        <w:t>get getAccount(username) /api/</w:t>
-      </w:r>
-      <w:r>
-        <w:rPr>
-          <w:rFonts w:eastAsia="Times New Roman"/>
-        </w:rPr>
-        <w:t>admin/</w:t>
-      </w:r>
-      <w:r>
-        <w:rPr>
-          <w:rFonts w:eastAsia="Times New Roman"/>
-        </w:rPr>
-        <w:t>users/{id}</w:t>
-      </w:r>
-    </w:p>
-    <w:p>
-      <w:pPr>
-        <w:spacing w:beforeAutospacing="1" w:afterAutospacing="1"/>
-        <w:rPr>
-          <w:rFonts w:eastAsia="Times New Roman"/>
-        </w:rPr>
-      </w:pPr>
-      <w:r>
-        <w:rPr>
-          <w:rFonts w:eastAsia="Times New Roman"/>
-        </w:rPr>
-        <w:t>put changeUserPassword(password, newPassword) /api/users/{id}/password</w:t>
-      </w:r>
-    </w:p>
-    <w:p>
-      <w:pPr>
-        <w:spacing w:beforeAutospacing="1" w:afterAutospacing="1"/>
-        <w:rPr>
-          <w:rFonts w:eastAsia="Times New Roman"/>
-        </w:rPr>
-      </w:pPr>
-      <w:r>
-        <w:rPr>
-          <w:rFonts w:eastAsia="Times New Roman"/>
-        </w:rPr>
-        <w:t>put changeUserPassword(newPassword) /api/admin/users/{userID}/password (API for admin only)</w:t>
-      </w:r>
-    </w:p>
-    <w:p>
-      <w:pPr>
-        <w:spacing w:beforeAutospacing="1" w:afterAutospacing="1"/>
-        <w:rPr>
-          <w:rFonts w:eastAsia="Times New Roman"/>
-        </w:rPr>
-      </w:pPr>
-      <w:r>
-        <w:rPr>
-          <w:rFonts w:eastAsia="Times New Roman"/>
-        </w:rPr>
-        <w:t>get getDepartment(department) /api/admin/users/{userID}/department</w:t>
-      </w:r>
-    </w:p>
-    <w:p>
-      <w:pPr>
-        <w:spacing w:beforeAutospacing="1" w:afterAutospacing="1"/>
-        <w:rPr>
-          <w:rFonts w:eastAsia="Times New Roman"/>
-        </w:rPr>
-      </w:pPr>
-      <w:r>
-        <w:rPr>
-          <w:rFonts w:eastAsia="Times New Roman"/>
-        </w:rPr>
-        <w:t>put changeDepartment(department) /api/admin/users/{userID}/department</w:t>
-      </w:r>
-    </w:p>
-    <w:p>
-      <w:pPr>
-        <w:spacing w:beforeAutospacing="1" w:afterAutospacing="1"/>
-        <w:rPr>
-          <w:rFonts w:eastAsia="Times New Roman"/>
-        </w:rPr>
-      </w:pPr>
-      <w:r>
-        <w:rPr>
-          <w:rFonts w:eastAsia="Times New Roman"/>
-        </w:rPr>
-        <w:t>delete deleteAccount(userID) /api/admin/users/{userID}</w:t>
-      </w:r>
-    </w:p>
-    <w:p>
-      <w:pPr>
-        <w:spacing w:beforeAutospacing="1" w:afterAutospacing="1"/>
-        <w:rPr>
-          <w:rFonts w:eastAsia="Times New Roman"/>
-        </w:rPr>
-      </w:pPr>
-      <w:r>
-        <w:rPr>
-          <w:rFonts w:eastAsia="Times New Roman"/>
-        </w:rPr>
-        <w:t>post addPriorities() /api/admin/priorities</w:t>
-      </w:r>
-    </w:p>
-    <w:p>
-      <w:pPr>
-        <w:spacing w:beforeAutospacing="1" w:afterAutospacing="1"/>
-        <w:rPr>
-          <w:rFonts w:eastAsia="Times New Roman"/>
-        </w:rPr>
-      </w:pPr>
-      <w:r>
-        <w:rPr>
-          <w:rFonts w:eastAsia="Times New Roman"/>
-        </w:rPr>
-        <w:t>get getPriorities() /api/admin/priorities</w:t>
-      </w:r>
-    </w:p>
-    <w:p>
-      <w:pPr>
-        <w:spacing w:beforeAutospacing="1" w:afterAutospacing="1"/>
-        <w:rPr>
-          <w:rFonts w:eastAsia="Times New Roman"/>
-        </w:rPr>
-      </w:pPr>
-      <w:r>
-        <w:rPr>
-          <w:rFonts w:eastAsia="Times New Roman"/>
-        </w:rPr>
-        <w:lastRenderedPageBreak/>
-        <w:t>put changePriority(priorityID, levelOfPriority(int), name, timeToRespond, timeToFinish) /api/admin/priorities/{piriority-id}</w:t>
-      </w:r>
-    </w:p>
-    <w:p>
-      <w:pPr>
-        <w:spacing w:beforeAutospacing="1" w:afterAutospacing="1"/>
-        <w:rPr>
-          <w:rFonts w:eastAsia="Times New Roman"/>
-        </w:rPr>
-      </w:pPr>
-      <w:r>
-        <w:rPr>
-          <w:rFonts w:eastAsia="Times New Roman"/>
-        </w:rPr>
-        <w:t>delete deletePriorities(priorityID) /api/admin/priorities/{priority-id}</w:t>
-      </w:r>
-    </w:p>
-    <w:p>
-      <w:pPr>
-        <w:spacing w:beforeAutospacing="1" w:afterAutospacing="1"/>
-        <w:rPr>
-          <w:rFonts w:eastAsia="Times New Roman"/>
-        </w:rPr>
-      </w:pPr>
-    </w:p>
-    <w:p>
-      <w:pPr>
-        <w:spacing w:beforeAutospacing="1" w:afterAutospacing="1"/>
-        <w:rPr>
-          <w:rFonts w:eastAsia="Times New Roman"/>
-        </w:rPr>
-      </w:pPr>
-      <w:r>
-        <w:rPr>
-          <w:rFonts w:eastAsia="Times New Roman"/>
-        </w:rPr>
-        <w:t>post login() /auth/google</w:t>
-      </w:r>
-    </w:p>
-    <w:p>
-      <w:pPr>
-        <w:spacing w:beforeAutospacing="1" w:afterAutospacing="1"/>
-        <w:rPr>
-          <w:rFonts w:eastAsia="Times New Roman"/>
-        </w:rPr>
-      </w:pPr>
-      <w:r>
-        <w:rPr>
-          <w:rFonts w:eastAsia="Times New Roman"/>
-        </w:rPr>
-        <w:t>post callback() /auth/callback</w:t>
-      </w:r>
-    </w:p>
-    <w:p>
-      <w:pPr>
-        <w:spacing w:beforeAutospacing="1" w:afterAutospacing="1"/>
-        <w:rPr>
-          <w:rFonts w:eastAsia="Times New Roman"/>
-        </w:rPr>
-      </w:pPr>
-      <w:r>
-        <w:rPr>
-          <w:rFonts w:eastAsia="Times New Roman"/>
-        </w:rPr>
-        <w:t>(Optional if google sso is to be added)</w:t>
-      </w:r>
-    </w:p>
-    <w:p>
-      <w:pPr>
-        <w:spacing w:beforeAutospacing="1" w:afterAutospacing="1"/>
-        <w:rPr>
-          <w:rFonts w:eastAsia="Times New Roman"/>
-        </w:rPr>
-      </w:pPr>
+        <w:spacing w:beforeAutospacing="1" w:after="0"/>
+        <w:rPr>
+          <w:rFonts w:eastAsia="Times New Roman"/>
+        </w:rPr>
+      </w:pPr>
+      <w:r>
+        <w:rPr>
+          <w:rFonts w:eastAsia="Times New Roman"/>
+        </w:rPr>
+        <w:t>Add attachment flows in general</w:t>
+      </w:r>
     </w:p>
     <w:p>
       <w:pPr>
@@ -1610,16 +1931,16 @@
           <w:ilvl w:val="0"/>
           <w:numId w:val="3"/>
         </w:numPr>
-        <w:spacing w:beforeAutospacing="1" w:afterAutospacing="1"/>
-        <w:rPr>
-          <w:rFonts w:eastAsia="Times New Roman"/>
-        </w:rPr>
-      </w:pPr>
-      <w:r>
-        <w:rPr>
-          <w:rFonts w:eastAsia="Times New Roman"/>
-        </w:rPr>
-        <w:t>Add attachment slot for comment</w:t>
+        <w:spacing w:before="0" w:after="0"/>
+        <w:rPr>
+          <w:rFonts w:eastAsia="Times New Roman"/>
+        </w:rPr>
+      </w:pPr>
+      <w:r>
+        <w:rPr>
+          <w:rFonts w:eastAsia="Times New Roman"/>
+        </w:rPr>
+        <w:t>Implement mail service on real mail</w:t>
       </w:r>
     </w:p>
     <w:p>
@@ -1629,16 +1950,16 @@
           <w:ilvl w:val="0"/>
           <w:numId w:val="3"/>
         </w:numPr>
-        <w:spacing w:beforeAutospacing="1" w:afterAutospacing="1"/>
-        <w:rPr>
-          <w:rFonts w:eastAsia="Times New Roman"/>
-        </w:rPr>
-      </w:pPr>
-      <w:r>
-        <w:rPr>
-          <w:rFonts w:eastAsia="Times New Roman"/>
-        </w:rPr>
-        <w:t>Add comment fetch for ticket detail</w:t>
+        <w:spacing w:before="0" w:after="0"/>
+        <w:rPr>
+          <w:rFonts w:eastAsia="Times New Roman"/>
+        </w:rPr>
+      </w:pPr>
+      <w:r>
+        <w:rPr>
+          <w:rFonts w:eastAsia="Times New Roman"/>
+        </w:rPr>
+        <w:t>add lazy loading for attachment, if we have time later</w:t>
       </w:r>
     </w:p>
     <w:p>
@@ -1648,16 +1969,16 @@
           <w:ilvl w:val="0"/>
           <w:numId w:val="3"/>
         </w:numPr>
-        <w:spacing w:beforeAutospacing="1" w:afterAutospacing="1"/>
-        <w:rPr>
-          <w:rFonts w:eastAsia="Times New Roman"/>
-        </w:rPr>
-      </w:pPr>
-      <w:r>
-        <w:rPr>
-          <w:rFonts w:eastAsia="Times New Roman"/>
-        </w:rPr>
-        <w:t>Add assignee fetch for ticket detail</w:t>
+        <w:spacing w:before="0" w:after="0"/>
+        <w:rPr>
+          <w:rFonts w:eastAsia="Times New Roman"/>
+        </w:rPr>
+      </w:pPr>
+      <w:r>
+        <w:rPr>
+          <w:rFonts w:eastAsia="Times New Roman"/>
+        </w:rPr>
+        <w:t>add lazy loading/paging mechanic for frontend</w:t>
       </w:r>
     </w:p>
     <w:p>
@@ -1667,35 +1988,65 @@
           <w:ilvl w:val="0"/>
           <w:numId w:val="3"/>
         </w:numPr>
-        <w:spacing w:beforeAutospacing="1" w:afterAutospacing="1"/>
-        <w:rPr>
-          <w:rFonts w:eastAsia="Times New Roman"/>
-        </w:rPr>
-      </w:pPr>
-      <w:r>
-        <w:rPr>
-          <w:rFonts w:eastAsia="Times New Roman"/>
-        </w:rPr>
-        <w:t>User can’t accept ticket</w:t>
-      </w:r>
-    </w:p>
-    <w:p>
-      <w:pPr>
-        <w:pStyle w:val="ListParagraph"/>
+        <w:spacing w:before="0" w:afterAutospacing="1"/>
+        <w:rPr>
+          <w:rFonts w:eastAsia="Times New Roman"/>
+        </w:rPr>
+      </w:pPr>
+      <w:r>
+        <w:rPr>
+          <w:rFonts w:eastAsia="Times New Roman"/>
+        </w:rPr>
+        <w:t>add dedicated userID for attachment later</w:t>
+      </w:r>
+    </w:p>
+    <w:p>
+      <w:pPr>
+        <w:pStyle w:val="Normal"/>
         <w:numPr>
           <w:ilvl w:val="0"/>
           <w:numId w:val="3"/>
         </w:numPr>
-        <w:spacing w:beforeAutospacing="1" w:afterAutospacing="1"/>
-        <w:rPr>
-          <w:rFonts w:eastAsia="Times New Roman"/>
-        </w:rPr>
-      </w:pPr>
-      <w:r>
-        <w:rPr>
-          <w:rFonts w:eastAsia="Times New Roman"/>
-        </w:rPr>
-        <w:t xml:space="preserve">Currently bad assignee flow </w:t>
+        <w:bidi w:val="0"/>
+        <w:spacing w:beforeAutospacing="1" w:afterAutospacing="1"/>
+        <w:rPr>
+          <w:rFonts w:eastAsia="Times New Roman"/>
+        </w:rPr>
+      </w:pPr>
+      <w:r>
+        <w:rPr>
+          <w:rFonts w:eastAsia="Times New Roman"/>
+        </w:rPr>
+        <w:t>Admin service khá giống một godclass</w:t>
+      </w:r>
+    </w:p>
+    <w:p>
+      <w:pPr>
+        <w:pStyle w:val="Normal"/>
+        <w:spacing w:beforeAutospacing="1" w:afterAutospacing="1"/>
+        <w:rPr>
+          <w:rFonts w:eastAsia="Times New Roman"/>
+        </w:rPr>
+      </w:pPr>
+      <w:r>
+        <w:rPr>
+          <w:rFonts w:eastAsia="Times New Roman"/>
+        </w:rPr>
+      </w:r>
+    </w:p>
+    <w:p>
+      <w:pPr>
+        <w:pStyle w:val="Normal"/>
+        <w:spacing w:beforeAutospacing="1" w:afterAutospacing="1"/>
+        <w:rPr>
+          <w:rFonts w:eastAsia="Times New Roman"/>
+        </w:rPr>
+      </w:pPr>
+      <w:r>
+        <w:rPr>
+          <w:rFonts w:eastAsia="Times New Roman"/>
+        </w:rPr>
+        <w:t>beware of xss attack</w:t>
       </w:r>
     </w:p>
     <w:p>
@@ -1705,16 +2056,16 @@
           <w:ilvl w:val="0"/>
           <w:numId w:val="3"/>
         </w:numPr>
-        <w:spacing w:beforeAutospacing="1" w:afterAutospacing="1"/>
-        <w:rPr>
-          <w:rFonts w:eastAsia="Times New Roman"/>
-        </w:rPr>
-      </w:pPr>
-      <w:r>
-        <w:rPr>
-          <w:rFonts w:eastAsia="Times New Roman"/>
-        </w:rPr>
-        <w:t xml:space="preserve">Get mail service working </w:t>
+        <w:spacing w:beforeAutospacing="1" w:after="0"/>
+        <w:rPr>
+          <w:rFonts w:eastAsia="Times New Roman"/>
+        </w:rPr>
+      </w:pPr>
+      <w:r>
+        <w:rPr>
+          <w:rFonts w:eastAsia="Times New Roman"/>
+        </w:rPr>
+        <w:t>SameSite=Strict, Secure</w:t>
       </w:r>
     </w:p>
     <w:p>
@@ -1724,16 +2075,16 @@
           <w:ilvl w:val="0"/>
           <w:numId w:val="3"/>
         </w:numPr>
-        <w:spacing w:beforeAutospacing="1" w:afterAutospacing="1"/>
-        <w:rPr>
-          <w:rFonts w:eastAsia="Times New Roman"/>
-        </w:rPr>
-      </w:pPr>
-      <w:r>
-        <w:rPr>
-          <w:rFonts w:eastAsia="Times New Roman"/>
-        </w:rPr>
-        <w:t>add lazy loading for attachment, if we have time later</w:t>
+        <w:spacing w:before="0" w:after="0"/>
+        <w:rPr>
+          <w:rFonts w:eastAsia="Times New Roman"/>
+        </w:rPr>
+      </w:pPr>
+      <w:r>
+        <w:rPr>
+          <w:rFonts w:eastAsia="Times New Roman"/>
+        </w:rPr>
+        <w:t>sanity user input in frontend, before data get rendered</w:t>
       </w:r>
     </w:p>
     <w:p>
@@ -1743,16 +2094,16 @@
           <w:ilvl w:val="0"/>
           <w:numId w:val="3"/>
         </w:numPr>
-        <w:spacing w:beforeAutospacing="1" w:afterAutospacing="1"/>
-        <w:rPr>
-          <w:rFonts w:eastAsia="Times New Roman"/>
-        </w:rPr>
-      </w:pPr>
-      <w:r>
-        <w:rPr>
-          <w:rFonts w:eastAsia="Times New Roman"/>
-        </w:rPr>
-        <w:t>add lazy loading/paging mechanic for frontend</w:t>
+        <w:spacing w:before="0" w:after="0"/>
+        <w:rPr>
+          <w:rFonts w:eastAsia="Times New Roman"/>
+        </w:rPr>
+      </w:pPr>
+      <w:r>
+        <w:rPr>
+          <w:rFonts w:eastAsia="Times New Roman"/>
+        </w:rPr>
+        <w:t xml:space="preserve">use { } of jsx or data set by useState not innerHTML </w:t>
       </w:r>
     </w:p>
     <w:p>
@@ -1762,147 +2113,7 @@
           <w:ilvl w:val="0"/>
           <w:numId w:val="3"/>
         </w:numPr>
-        <w:spacing w:beforeAutospacing="1" w:afterAutospacing="1"/>
-        <w:rPr>
-          <w:rFonts w:eastAsia="Times New Roman"/>
-        </w:rPr>
-      </w:pPr>
-      <w:r>
-        <w:rPr>
-          <w:rFonts w:eastAsia="Times New Roman"/>
-        </w:rPr>
-        <w:t>add dedicated userID for attachment later</w:t>
-      </w:r>
-    </w:p>
-    <w:p>
-      <w:pPr>
-        <w:spacing w:beforeAutospacing="1" w:afterAutospacing="1"/>
-        <w:rPr>
-          <w:rFonts w:eastAsia="Times New Roman"/>
-        </w:rPr>
-      </w:pPr>
-    </w:p>
-    <w:p>
-      <w:pPr>
-        <w:spacing w:beforeAutospacing="1" w:afterAutospacing="1"/>
-        <w:rPr>
-          <w:rFonts w:eastAsia="Times New Roman"/>
-        </w:rPr>
-      </w:pPr>
-      <w:r>
-        <w:rPr>
-          <w:rFonts w:eastAsia="Times New Roman"/>
-        </w:rPr>
-        <w:t xml:space="preserve">get ticket repository </w:t>
-      </w:r>
-    </w:p>
-    <w:p>
-      <w:pPr>
-        <w:spacing w:beforeAutospacing="1" w:afterAutospacing="1"/>
-        <w:rPr>
-          <w:rFonts w:eastAsia="Times New Roman"/>
-        </w:rPr>
-      </w:pPr>
-      <w:r>
-        <w:rPr>
-          <w:rFonts w:eastAsia="Times New Roman"/>
-        </w:rPr>
-        <w:t>tao mot filter kiem tra jwt cho quyen xem ticket id</w:t>
-      </w:r>
-      <w:r>
-        <w:rPr>
-          <w:rFonts w:eastAsia="Times New Roman"/>
-        </w:rPr>
-        <w:t xml:space="preserve"> </w:t>
-      </w:r>
-    </w:p>
-    <w:p>
-      <w:pPr>
-        <w:spacing w:beforeAutospacing="1" w:afterAutospacing="1"/>
-        <w:rPr>
-          <w:rFonts w:eastAsia="Times New Roman"/>
-        </w:rPr>
-      </w:pPr>
-    </w:p>
-    <w:p>
-      <w:pPr>
-        <w:spacing w:beforeAutospacing="1" w:afterAutospacing="1"/>
-        <w:rPr>
-          <w:rFonts w:eastAsia="Times New Roman"/>
-        </w:rPr>
-      </w:pPr>
-      <w:r>
-        <w:rPr>
-          <w:rFonts w:eastAsia="Times New Roman"/>
-        </w:rPr>
-        <w:t>beware of xss attack</w:t>
-      </w:r>
-    </w:p>
-    <w:p>
-      <w:pPr>
-        <w:pStyle w:val="ListParagraph"/>
-        <w:numPr>
-          <w:ilvl w:val="0"/>
-          <w:numId w:val="3"/>
-        </w:numPr>
-        <w:spacing w:beforeAutospacing="1" w:after="0"/>
-        <w:rPr>
-          <w:rFonts w:eastAsia="Times New Roman"/>
-        </w:rPr>
-      </w:pPr>
-      <w:r>
-        <w:rPr>
-          <w:rFonts w:eastAsia="Times New Roman"/>
-        </w:rPr>
-        <w:t>SameSite=Strict, Secure</w:t>
-      </w:r>
-    </w:p>
-    <w:p>
-      <w:pPr>
-        <w:pStyle w:val="ListParagraph"/>
-        <w:numPr>
-          <w:ilvl w:val="0"/>
-          <w:numId w:val="3"/>
-        </w:numPr>
-        <w:spacing w:after="0"/>
-        <w:rPr>
-          <w:rFonts w:eastAsia="Times New Roman"/>
-        </w:rPr>
-      </w:pPr>
-      <w:r>
-        <w:rPr>
-          <w:rFonts w:eastAsia="Times New Roman"/>
-        </w:rPr>
-        <w:t>sanity user input in frontend, before data get rendered</w:t>
-      </w:r>
-    </w:p>
-    <w:p>
-      <w:pPr>
-        <w:pStyle w:val="ListParagraph"/>
-        <w:numPr>
-          <w:ilvl w:val="0"/>
-          <w:numId w:val="3"/>
-        </w:numPr>
-        <w:spacing w:after="0"/>
-        <w:rPr>
-          <w:rFonts w:eastAsia="Times New Roman"/>
-        </w:rPr>
-      </w:pPr>
-      <w:r>
-        <w:rPr>
-          <w:rFonts w:eastAsia="Times New Roman"/>
-        </w:rPr>
-        <w:t xml:space="preserve">use { } of jsx or data set by useState not innerHTML </w:t>
-      </w:r>
-    </w:p>
-    <w:p>
-      <w:pPr>
-        <w:pStyle w:val="ListParagraph"/>
-        <w:numPr>
-          <w:ilvl w:val="0"/>
-          <w:numId w:val="3"/>
-        </w:numPr>
-        <w:spacing w:afterAutospacing="1"/>
+        <w:spacing w:before="0" w:afterAutospacing="1"/>
         <w:rPr>
           <w:rFonts w:eastAsia="Times New Roman"/>
         </w:rPr>
@@ -1916,18 +2127,16 @@
     </w:p>
     <w:p>
       <w:pPr>
-        <w:spacing w:beforeAutospacing="1" w:afterAutospacing="1"/>
-        <w:rPr>
-          <w:rFonts w:eastAsia="Times New Roman"/>
-        </w:rPr>
-      </w:pPr>
-      <w:r>
-        <w:rPr>
-          <w:noProof/>
-        </w:rPr>
-        <w:lastRenderedPageBreak/>
+        <w:pStyle w:val="Normal"/>
+        <w:spacing w:beforeAutospacing="1" w:afterAutospacing="1"/>
+        <w:rPr>
+          <w:rFonts w:eastAsia="Times New Roman"/>
+        </w:rPr>
+      </w:pPr>
+      <w:r>
+        <w:rPr/>
         <w:drawing>
-          <wp:inline distT="0" distB="0" distL="0" distR="0" wp14:anchorId="6F8AB910" wp14:editId="37EA81C4">
+          <wp:inline distT="0" distB="0" distL="0" distR="0">
             <wp:extent cx="5731510" cy="4566285"/>
             <wp:effectExtent l="0" t="0" r="0" b="0"/>
             <wp:docPr id="1" name="Picture 1"/>
@@ -1944,7 +2153,7 @@
                     </pic:cNvPicPr>
                   </pic:nvPicPr>
                   <pic:blipFill>
-                    <a:blip r:embed="rId5"/>
+                    <a:blip r:embed="rId2"/>
                     <a:stretch>
                       <a:fillRect/>
                     </a:stretch>
@@ -1965,23 +2174,24 @@
           </wp:inline>
         </w:drawing>
       </w:r>
-      <w:r>
-        <w:rPr>
-          <w:rFonts w:eastAsia="Times New Roman"/>
-        </w:rPr>
-        <w:t xml:space="preserve">login form có username và mật khẩu cùng nút submit, không có nút quên mật khẩu và đăng kí. </w:t>
-      </w:r>
-    </w:p>
-    <w:p>
-      <w:pPr>
-        <w:spacing w:beforeAutospacing="1" w:afterAutospacing="1"/>
-        <w:rPr>
-          <w:rFonts w:eastAsia="Times New Roman"/>
-        </w:rPr>
-      </w:pPr>
-    </w:p>
-    <w:p>
-      <w:pPr>
+    </w:p>
+    <w:p>
+      <w:pPr>
+        <w:pStyle w:val="Normal"/>
+        <w:spacing w:beforeAutospacing="1" w:afterAutospacing="1"/>
+        <w:rPr>
+          <w:rFonts w:eastAsia="Times New Roman"/>
+        </w:rPr>
+      </w:pPr>
+      <w:r>
+        <w:rPr>
+          <w:rFonts w:eastAsia="Times New Roman"/>
+        </w:rPr>
+      </w:r>
+    </w:p>
+    <w:p>
+      <w:pPr>
+        <w:pStyle w:val="Normal"/>
         <w:spacing w:beforeAutospacing="1" w:afterAutospacing="1"/>
         <w:rPr>
           <w:rFonts w:eastAsia="Times New Roman"/>
@@ -1996,6 +2206,7 @@
     </w:p>
     <w:p>
       <w:pPr>
+        <w:pStyle w:val="Normal"/>
         <w:spacing w:beforeAutospacing="1" w:afterAutospacing="1"/>
         <w:rPr>
           <w:rFonts w:eastAsia="Times New Roman"/>
@@ -2010,6 +2221,7 @@
     </w:p>
     <w:p>
       <w:pPr>
+        <w:pStyle w:val="Normal"/>
         <w:spacing w:beforeAutospacing="1" w:afterAutospacing="1"/>
         <w:rPr>
           <w:rFonts w:eastAsia="Times New Roman"/>
@@ -2024,6 +2236,7 @@
     </w:p>
     <w:p>
       <w:pPr>
+        <w:pStyle w:val="Normal"/>
         <w:spacing w:beforeAutospacing="1" w:afterAutospacing="1"/>
         <w:rPr>
           <w:rFonts w:eastAsia="Times New Roman"/>
@@ -2038,6 +2251,7 @@
     </w:p>
     <w:p>
       <w:pPr>
+        <w:pStyle w:val="Normal"/>
         <w:spacing w:beforeAutospacing="1" w:afterAutospacing="1"/>
         <w:rPr>
           <w:rFonts w:eastAsia="Times New Roman"/>
@@ -2052,6 +2266,7 @@
     </w:p>
     <w:p>
       <w:pPr>
+        <w:pStyle w:val="Normal"/>
         <w:spacing w:beforeAutospacing="1" w:afterAutospacing="1"/>
         <w:rPr>
           <w:rFonts w:eastAsia="Times New Roman"/>
@@ -2066,6 +2281,7 @@
     </w:p>
     <w:p>
       <w:pPr>
+        <w:pStyle w:val="Normal"/>
         <w:spacing w:beforeAutospacing="1" w:afterAutospacing="1"/>
         <w:rPr>
           <w:rFonts w:eastAsia="Times New Roman"/>
@@ -2080,21 +2296,22 @@
     </w:p>
     <w:p>
       <w:pPr>
-        <w:spacing w:beforeAutospacing="1" w:afterAutospacing="1"/>
-        <w:rPr>
-          <w:rFonts w:eastAsia="Times New Roman"/>
-        </w:rPr>
-      </w:pPr>
-      <w:r>
-        <w:rPr>
-          <w:rFonts w:eastAsia="Times New Roman"/>
-        </w:rPr>
-        <w:lastRenderedPageBreak/>
+        <w:pStyle w:val="Normal"/>
+        <w:spacing w:beforeAutospacing="1" w:afterAutospacing="1"/>
+        <w:rPr>
+          <w:rFonts w:eastAsia="Times New Roman"/>
+        </w:rPr>
+      </w:pPr>
+      <w:r>
+        <w:rPr>
+          <w:rFonts w:eastAsia="Times New Roman"/>
+        </w:rPr>
         <w:t>Hibernate – cung cấp ORM kết hợp với Jakarta data thành repository</w:t>
       </w:r>
     </w:p>
     <w:p>
       <w:pPr>
+        <w:pStyle w:val="Normal"/>
         <w:spacing w:beforeAutospacing="1" w:afterAutospacing="1"/>
         <w:rPr>
           <w:rFonts w:eastAsia="Times New Roman"/>
@@ -2109,6 +2326,7 @@
     </w:p>
     <w:p>
       <w:pPr>
+        <w:pStyle w:val="Normal"/>
         <w:spacing w:beforeAutospacing="1" w:afterAutospacing="1"/>
         <w:rPr>
           <w:rFonts w:eastAsia="Times New Roman"/>
@@ -2123,6 +2341,7 @@
     </w:p>
     <w:p>
       <w:pPr>
+        <w:pStyle w:val="Normal"/>
         <w:spacing w:beforeAutospacing="1" w:afterAutospacing="1"/>
         <w:rPr>
           <w:rFonts w:eastAsia="Times New Roman"/>
@@ -2137,14 +2356,21 @@
     </w:p>
     <w:p>
       <w:pPr>
-        <w:spacing w:beforeAutospacing="1" w:afterAutospacing="1"/>
-        <w:rPr>
-          <w:rFonts w:eastAsia="Times New Roman"/>
-        </w:rPr>
-      </w:pPr>
-    </w:p>
-    <w:p>
-      <w:pPr>
+        <w:pStyle w:val="Normal"/>
+        <w:spacing w:beforeAutospacing="1" w:afterAutospacing="1"/>
+        <w:rPr>
+          <w:rFonts w:eastAsia="Times New Roman"/>
+        </w:rPr>
+      </w:pPr>
+      <w:r>
+        <w:rPr>
+          <w:rFonts w:eastAsia="Times New Roman"/>
+        </w:rPr>
+      </w:r>
+    </w:p>
+    <w:p>
+      <w:pPr>
+        <w:pStyle w:val="Normal"/>
         <w:spacing w:beforeAutospacing="1" w:afterAutospacing="1"/>
         <w:rPr>
           <w:rFonts w:eastAsia="Times New Roman"/>
@@ -2159,6 +2385,7 @@
     </w:p>
     <w:p>
       <w:pPr>
+        <w:pStyle w:val="Normal"/>
         <w:spacing w:beforeAutospacing="1" w:afterAutospacing="1"/>
         <w:rPr>
           <w:rFonts w:eastAsia="Times New Roman"/>
@@ -2173,6 +2400,7 @@
     </w:p>
     <w:p>
       <w:pPr>
+        <w:pStyle w:val="Normal"/>
         <w:spacing w:beforeAutospacing="1" w:afterAutospacing="1"/>
         <w:rPr>
           <w:rFonts w:eastAsia="Times New Roman"/>
@@ -2187,6 +2415,7 @@
     </w:p>
     <w:p>
       <w:pPr>
+        <w:pStyle w:val="Normal"/>
         <w:spacing w:beforeAutospacing="1" w:afterAutospacing="1"/>
         <w:rPr>
           <w:rFonts w:eastAsia="Times New Roman"/>
@@ -2201,6 +2430,7 @@
     </w:p>
     <w:p>
       <w:pPr>
+        <w:pStyle w:val="Normal"/>
         <w:spacing w:beforeAutospacing="1" w:afterAutospacing="1"/>
         <w:rPr>
           <w:rFonts w:eastAsia="Times New Roman"/>
@@ -2213,32 +2443,365 @@
         <w:t>Được sử dụng vì phần mềm hiện tại sử dụng nội bộ trong nước, nên chưa cần thêm múi giờ.</w:t>
       </w:r>
     </w:p>
+    <w:p>
+      <w:pPr>
+        <w:pStyle w:val="Normal"/>
+        <w:bidi w:val="0"/>
+        <w:spacing w:beforeAutospacing="1" w:afterAutospacing="1"/>
+        <w:rPr>
+          <w:rFonts w:eastAsia="Times New Roman"/>
+        </w:rPr>
+      </w:pPr>
+      <w:r>
+        <w:rPr>
+          <w:rFonts w:eastAsia="Times New Roman"/>
+        </w:rPr>
+        <w:t>Mail service được dùng là một bản mock sử dụng println để in ra màn hình</w:t>
+      </w:r>
+    </w:p>
+    <w:p>
+      <w:pPr>
+        <w:pStyle w:val="Normal"/>
+        <w:bidi w:val="0"/>
+        <w:spacing w:beforeAutospacing="1" w:afterAutospacing="1"/>
+        <w:rPr>
+          <w:rFonts w:eastAsia="Times New Roman"/>
+        </w:rPr>
+      </w:pPr>
+      <w:r>
+        <w:rPr>
+          <w:rFonts w:eastAsia="Times New Roman"/>
+        </w:rPr>
+        <w:t>Mail service dự kiến sử dụng java thuần để viết phương thức gửi mail đi thay vì sử dụng thư viện.</w:t>
+      </w:r>
+    </w:p>
+    <w:p>
+      <w:pPr>
+        <w:pStyle w:val="Normal"/>
+        <w:bidi w:val="0"/>
+        <w:spacing w:beforeAutospacing="1" w:afterAutospacing="1"/>
+        <w:rPr>
+          <w:rFonts w:eastAsia="Times New Roman"/>
+        </w:rPr>
+      </w:pPr>
+      <w:r>
+        <w:rPr>
+          <w:rFonts w:eastAsia="Times New Roman"/>
+        </w:rPr>
+        <w:t>Các dịch vụ thông báo thay đổi trạng thái ticket đang được viết chung về một interface nên còn một số giới hạn nhất định, vd: khi thay đổi người xử lí đáng nhẽ phải gửi cho người xử lí cũ một thông báo</w:t>
+      </w:r>
+    </w:p>
+    <w:p>
+      <w:pPr>
+        <w:pStyle w:val="Normal"/>
+        <w:bidi w:val="0"/>
+        <w:spacing w:beforeAutospacing="1" w:afterAutospacing="1"/>
+        <w:rPr>
+          <w:rFonts w:eastAsia="Times New Roman"/>
+        </w:rPr>
+      </w:pPr>
+      <w:r>
+        <w:rPr>
+          <w:rFonts w:eastAsia="Times New Roman"/>
+        </w:rPr>
+        <w:t>Dịch vụ có thể được thay đổi nếu ticket có một trường participant (người tham gia) theo dõi tất cả những người đã từng bình luận hoặc chỉnh sửa trên trang</w:t>
+      </w:r>
+    </w:p>
+    <w:p>
+      <w:pPr>
+        <w:pStyle w:val="Normal"/>
+        <w:bidi w:val="0"/>
+        <w:spacing w:beforeAutospacing="1" w:afterAutospacing="1"/>
+        <w:rPr>
+          <w:rFonts w:eastAsia="Times New Roman"/>
+        </w:rPr>
+      </w:pPr>
+      <w:r>
+        <w:rPr>
+          <w:rFonts w:eastAsia="Times New Roman"/>
+        </w:rPr>
+      </w:r>
+    </w:p>
+    <w:p>
+      <w:pPr>
+        <w:pStyle w:val="Normal"/>
+        <w:bidi w:val="0"/>
+        <w:spacing w:beforeAutospacing="1" w:afterAutospacing="1"/>
+        <w:rPr>
+          <w:rFonts w:eastAsia="Times New Roman"/>
+        </w:rPr>
+      </w:pPr>
+      <w:r>
+        <w:rPr>
+          <w:rFonts w:eastAsia="Times New Roman"/>
+        </w:rPr>
+      </w:r>
+    </w:p>
     <w:sectPr>
+      <w:type w:val="nextPage"/>
       <w:pgSz w:w="11906" w:h="16838"/>
-      <w:pgMar w:top="1440" w:right="1440" w:bottom="1440" w:left="1440" w:header="0" w:footer="0" w:gutter="0"/>
-      <w:cols w:space="720"/>
-      <w:formProt w:val="0"/>
-      <w:docGrid w:linePitch="360"/>
+      <w:pgMar w:left="1440" w:right="1440" w:gutter="0" w:header="0" w:top="1440" w:footer="0" w:bottom="1440"/>
+      <w:pgNumType w:fmt="decimal"/>
+      <w:formProt w:val="false"/>
+      <w:textDirection w:val="lrTb"/>
+      <w:docGrid w:type="default" w:linePitch="360" w:charSpace="0"/>
     </w:sectPr>
   </w:body>
 </w:document>
 </file>
 
 <file path=word/numbering.xml><?xml version="1.0" encoding="utf-8"?>
-<w:numbering xmlns:wpc="http://schemas.microsoft.com/office/word/2010/wordprocessingCanvas" xmlns:cx="http://schemas.microsoft.com/office/drawing/2014/chartex" xmlns:cx1="http://schemas.microsoft.com/office/drawing/2015/9/8/chartex" xmlns:cx2="http://schemas.microsoft.com/office/drawing/2015/10/21/chartex" xmlns:cx3="http://schemas.microsoft.com/office/drawing/2016/5/9/chartex" xmlns:cx4="http://schemas.microsoft.com/office/drawing/2016/5/10/chartex" xmlns:cx5="http://schemas.microsoft.com/office/drawing/2016/5/11/chartex" xmlns:cx6="http://schemas.microsoft.com/office/drawing/2016/5/12/chartex" xmlns:cx7="http://schemas.microsoft.com/office/drawing/2016/5/13/chartex" xmlns:cx8="http://schemas.microsoft.com/office/drawing/2016/5/14/chartex" xmlns:mc="http://schemas.openxmlformats.org/markup-compatibility/2006" xmlns:aink="http://schemas.microsoft.com/office/drawing/2016/ink" xmlns:am3d="http://schemas.microsoft.com/office/drawing/2017/model3d" xmlns:o="urn:schemas-microsoft-com:office:office" xmlns:oel="http://schemas.microsoft.com/office/2019/extlst" xmlns:r="http://schemas.openxmlformats.org/officeDocument/2006/relationships" xmlns:m="http://schemas.openxmlformats.org/officeDocument/2006/math" xmlns:v="urn:schemas-microsoft-com:vml" xmlns:wp14="http://schemas.microsoft.com/office/word/2010/wordprocessingDrawing" xmlns:wp="http://schemas.openxmlformats.org/drawingml/2006/wordprocessingDrawing" xmlns:w10="urn:schemas-microsoft-com:office:word" xmlns:w="http://schemas.openxmlformats.org/wordprocessingml/2006/main" xmlns:w14="http://schemas.microsoft.com/office/word/2010/wordml" xmlns:w15="http://schemas.microsoft.com/office/word/2012/wordml" xmlns:w16cex="http://schemas.microsoft.com/office/word/2018/wordml/cex" xmlns:w16cid="http://schemas.microsoft.com/office/word/2016/wordml/cid" xmlns:w16="http://schemas.microsoft.com/office/word/2018/wordml" xmlns:w16du="http://schemas.microsoft.com/office/word/2023/wordml/word16du" xmlns:w16sdtdh="http://schemas.microsoft.com/office/word/2020/wordml/sdtdatahash" xmlns:w16sdtfl="http://schemas.microsoft.com/office/word/2024/wordml/sdtformatlock" xmlns:w16se="http://schemas.microsoft.com/office/word/2015/wordml/symex" xmlns:wpg="http://schemas.microsoft.com/office/word/2010/wordprocessingGroup" xmlns:wpi="http://schemas.microsoft.com/office/word/2010/wordprocessingInk" xmlns:wne="http://schemas.microsoft.com/office/word/2006/wordml" xmlns:wps="http://schemas.microsoft.com/office/word/2010/wordprocessingShape" mc:Ignorable="w14 w15 w16se w16cid w16 w16cex w16sdtdh w16sdtfl w16du wp14">
-  <w:abstractNum w:abstractNumId="0" w15:restartNumberingAfterBreak="0">
-    <w:nsid w:val="0A1D3B71"/>
-    <w:multiLevelType w:val="multilevel"/>
-    <w:tmpl w:val="43C2B542"/>
+<w:numbering xmlns:w="http://schemas.openxmlformats.org/wordprocessingml/2006/main" xmlns:o="urn:schemas-microsoft-com:office:office" xmlns:r="http://schemas.openxmlformats.org/officeDocument/2006/relationships" xmlns:v="urn:schemas-microsoft-com:vml" xmlns:mc="http://schemas.openxmlformats.org/markup-compatibility/2006" xmlns:w14="http://schemas.microsoft.com/office/word/2010/wordml" mc:Ignorable="w14">
+  <w:abstractNum w:abstractNumId="1">
+    <w:lvl w:ilvl="0">
+      <w:start w:val="1"/>
+      <w:numFmt w:val="decimal"/>
+      <w:pStyle w:val="Heading1"/>
+      <w:lvlText w:val="%1."/>
+      <w:lvlJc w:val="start"/>
+      <w:pPr>
+        <w:tabs>
+          <w:tab w:val="num" w:pos="0"/>
+        </w:tabs>
+        <w:ind w:start="684" w:hanging="400"/>
+      </w:pPr>
+      <w:rPr/>
+    </w:lvl>
+    <w:lvl w:ilvl="1">
+      <w:start w:val="1"/>
+      <w:numFmt w:val="upperLetter"/>
+      <w:lvlText w:val="%2."/>
+      <w:lvlJc w:val="start"/>
+      <w:pPr>
+        <w:tabs>
+          <w:tab w:val="num" w:pos="0"/>
+        </w:tabs>
+        <w:ind w:start="1200" w:hanging="400"/>
+      </w:pPr>
+      <w:rPr/>
+    </w:lvl>
+    <w:lvl w:ilvl="2">
+      <w:start w:val="1"/>
+      <w:numFmt w:val="lowerRoman"/>
+      <w:lvlText w:val="%3."/>
+      <w:lvlJc w:val="end"/>
+      <w:pPr>
+        <w:tabs>
+          <w:tab w:val="num" w:pos="0"/>
+        </w:tabs>
+        <w:ind w:start="1600" w:hanging="400"/>
+      </w:pPr>
+      <w:rPr/>
+    </w:lvl>
+    <w:lvl w:ilvl="3">
+      <w:start w:val="1"/>
+      <w:numFmt w:val="decimal"/>
+      <w:lvlText w:val="%4."/>
+      <w:lvlJc w:val="start"/>
+      <w:pPr>
+        <w:tabs>
+          <w:tab w:val="num" w:pos="0"/>
+        </w:tabs>
+        <w:ind w:start="2000" w:hanging="400"/>
+      </w:pPr>
+      <w:rPr/>
+    </w:lvl>
+    <w:lvl w:ilvl="4">
+      <w:start w:val="1"/>
+      <w:numFmt w:val="upperLetter"/>
+      <w:lvlText w:val="%5."/>
+      <w:lvlJc w:val="start"/>
+      <w:pPr>
+        <w:tabs>
+          <w:tab w:val="num" w:pos="0"/>
+        </w:tabs>
+        <w:ind w:start="2400" w:hanging="400"/>
+      </w:pPr>
+      <w:rPr/>
+    </w:lvl>
+    <w:lvl w:ilvl="5">
+      <w:start w:val="1"/>
+      <w:numFmt w:val="lowerRoman"/>
+      <w:lvlText w:val="%6."/>
+      <w:lvlJc w:val="end"/>
+      <w:pPr>
+        <w:tabs>
+          <w:tab w:val="num" w:pos="0"/>
+        </w:tabs>
+        <w:ind w:start="2800" w:hanging="400"/>
+      </w:pPr>
+      <w:rPr/>
+    </w:lvl>
+    <w:lvl w:ilvl="6">
+      <w:start w:val="1"/>
+      <w:numFmt w:val="decimal"/>
+      <w:lvlText w:val="%7."/>
+      <w:lvlJc w:val="start"/>
+      <w:pPr>
+        <w:tabs>
+          <w:tab w:val="num" w:pos="0"/>
+        </w:tabs>
+        <w:ind w:start="3200" w:hanging="400"/>
+      </w:pPr>
+      <w:rPr/>
+    </w:lvl>
+    <w:lvl w:ilvl="7">
+      <w:start w:val="1"/>
+      <w:numFmt w:val="upperLetter"/>
+      <w:lvlText w:val="%8."/>
+      <w:lvlJc w:val="start"/>
+      <w:pPr>
+        <w:tabs>
+          <w:tab w:val="num" w:pos="0"/>
+        </w:tabs>
+        <w:ind w:start="3600" w:hanging="400"/>
+      </w:pPr>
+      <w:rPr/>
+    </w:lvl>
+    <w:lvl w:ilvl="8">
+      <w:start w:val="1"/>
+      <w:numFmt w:val="lowerRoman"/>
+      <w:lvlText w:val="%9."/>
+      <w:lvlJc w:val="end"/>
+      <w:pPr>
+        <w:tabs>
+          <w:tab w:val="num" w:pos="0"/>
+        </w:tabs>
+        <w:ind w:start="4000" w:hanging="400"/>
+      </w:pPr>
+      <w:rPr/>
+    </w:lvl>
+  </w:abstractNum>
+  <w:abstractNum w:abstractNumId="2">
+    <w:lvl w:ilvl="0">
+      <w:start w:val="1"/>
+      <w:numFmt w:val="lowerLetter"/>
+      <w:suff w:val="space"/>
+      <w:lvlText w:val="%1."/>
+      <w:lvlJc w:val="start"/>
+      <w:pPr>
+        <w:tabs>
+          <w:tab w:val="num" w:pos="0"/>
+        </w:tabs>
+        <w:ind w:start="0" w:hanging="0"/>
+      </w:pPr>
+      <w:rPr/>
+    </w:lvl>
+    <w:lvl w:ilvl="1">
+      <w:start w:val="1"/>
+      <w:numFmt w:val="decimal"/>
+      <w:lvlText w:val="%2."/>
+      <w:lvlJc w:val="start"/>
+      <w:pPr>
+        <w:tabs>
+          <w:tab w:val="num" w:pos="1080"/>
+        </w:tabs>
+        <w:ind w:start="1080" w:hanging="360"/>
+      </w:pPr>
+      <w:rPr/>
+    </w:lvl>
+    <w:lvl w:ilvl="2">
+      <w:start w:val="1"/>
+      <w:numFmt w:val="decimal"/>
+      <w:lvlText w:val="%3."/>
+      <w:lvlJc w:val="start"/>
+      <w:pPr>
+        <w:tabs>
+          <w:tab w:val="num" w:pos="1440"/>
+        </w:tabs>
+        <w:ind w:start="1440" w:hanging="360"/>
+      </w:pPr>
+      <w:rPr/>
+    </w:lvl>
+    <w:lvl w:ilvl="3">
+      <w:start w:val="1"/>
+      <w:numFmt w:val="decimal"/>
+      <w:lvlText w:val="%4."/>
+      <w:lvlJc w:val="start"/>
+      <w:pPr>
+        <w:tabs>
+          <w:tab w:val="num" w:pos="1800"/>
+        </w:tabs>
+        <w:ind w:start="1800" w:hanging="360"/>
+      </w:pPr>
+      <w:rPr/>
+    </w:lvl>
+    <w:lvl w:ilvl="4">
+      <w:start w:val="1"/>
+      <w:numFmt w:val="decimal"/>
+      <w:lvlText w:val="%5."/>
+      <w:lvlJc w:val="start"/>
+      <w:pPr>
+        <w:tabs>
+          <w:tab w:val="num" w:pos="2160"/>
+        </w:tabs>
+        <w:ind w:start="2160" w:hanging="360"/>
+      </w:pPr>
+      <w:rPr/>
+    </w:lvl>
+    <w:lvl w:ilvl="5">
+      <w:start w:val="1"/>
+      <w:numFmt w:val="decimal"/>
+      <w:lvlText w:val="%6."/>
+      <w:lvlJc w:val="start"/>
+      <w:pPr>
+        <w:tabs>
+          <w:tab w:val="num" w:pos="2520"/>
+        </w:tabs>
+        <w:ind w:start="2520" w:hanging="360"/>
+      </w:pPr>
+      <w:rPr/>
+    </w:lvl>
+    <w:lvl w:ilvl="6">
+      <w:start w:val="1"/>
+      <w:numFmt w:val="decimal"/>
+      <w:lvlText w:val="%7."/>
+      <w:lvlJc w:val="start"/>
+      <w:pPr>
+        <w:tabs>
+          <w:tab w:val="num" w:pos="2880"/>
+        </w:tabs>
+        <w:ind w:start="2880" w:hanging="360"/>
+      </w:pPr>
+      <w:rPr/>
+    </w:lvl>
+    <w:lvl w:ilvl="7">
+      <w:start w:val="1"/>
+      <w:numFmt w:val="decimal"/>
+      <w:lvlText w:val="%8."/>
+      <w:lvlJc w:val="start"/>
+      <w:pPr>
+        <w:tabs>
+          <w:tab w:val="num" w:pos="3240"/>
+        </w:tabs>
+        <w:ind w:start="3240" w:hanging="360"/>
+      </w:pPr>
+      <w:rPr/>
+    </w:lvl>
+    <w:lvl w:ilvl="8">
+      <w:start w:val="1"/>
+      <w:numFmt w:val="decimal"/>
+      <w:lvlText w:val="%9."/>
+      <w:lvlJc w:val="start"/>
+      <w:pPr>
+        <w:tabs>
+          <w:tab w:val="num" w:pos="3600"/>
+        </w:tabs>
+        <w:ind w:start="3600" w:hanging="360"/>
+      </w:pPr>
+      <w:rPr/>
+    </w:lvl>
+  </w:abstractNum>
+  <w:abstractNum w:abstractNumId="3">
     <w:lvl w:ilvl="0">
       <w:numFmt w:val="bullet"/>
       <w:lvlText w:val="-"/>
-      <w:lvlJc w:val="left"/>
+      <w:lvlJc w:val="start"/>
       <w:pPr>
         <w:tabs>
           <w:tab w:val="num" w:pos="0"/>
         </w:tabs>
-        <w:ind w:left="720" w:hanging="360"/>
+        <w:ind w:start="720" w:hanging="360"/>
       </w:pPr>
       <w:rPr>
         <w:rFonts w:ascii="Times New Roman" w:hAnsi="Times New Roman" w:cs="Times New Roman" w:hint="default"/>
@@ -2248,12 +2811,12 @@
       <w:start w:val="1"/>
       <w:numFmt w:val="bullet"/>
       <w:lvlText w:val="o"/>
-      <w:lvlJc w:val="left"/>
+      <w:lvlJc w:val="start"/>
       <w:pPr>
         <w:tabs>
           <w:tab w:val="num" w:pos="0"/>
         </w:tabs>
-        <w:ind w:left="1440" w:hanging="360"/>
+        <w:ind w:start="1440" w:hanging="360"/>
       </w:pPr>
       <w:rPr>
         <w:rFonts w:ascii="Courier New" w:hAnsi="Courier New" w:cs="Courier New" w:hint="default"/>
@@ -2263,12 +2826,12 @@
       <w:start w:val="1"/>
       <w:numFmt w:val="bullet"/>
       <w:lvlText w:val=""/>
-      <w:lvlJc w:val="left"/>
+      <w:lvlJc w:val="start"/>
       <w:pPr>
         <w:tabs>
           <w:tab w:val="num" w:pos="0"/>
         </w:tabs>
-        <w:ind w:left="2160" w:hanging="360"/>
+        <w:ind w:start="2160" w:hanging="360"/>
       </w:pPr>
       <w:rPr>
         <w:rFonts w:ascii="Wingdings" w:hAnsi="Wingdings" w:cs="Wingdings" w:hint="default"/>
@@ -2278,12 +2841,12 @@
       <w:start w:val="1"/>
       <w:numFmt w:val="bullet"/>
       <w:lvlText w:val=""/>
-      <w:lvlJc w:val="left"/>
+      <w:lvlJc w:val="start"/>
       <w:pPr>
         <w:tabs>
           <w:tab w:val="num" w:pos="0"/>
         </w:tabs>
-        <w:ind w:left="2880" w:hanging="360"/>
+        <w:ind w:start="2880" w:hanging="360"/>
       </w:pPr>
       <w:rPr>
         <w:rFonts w:ascii="Symbol" w:hAnsi="Symbol" w:cs="Symbol" w:hint="default"/>
@@ -2293,12 +2856,12 @@
       <w:start w:val="1"/>
       <w:numFmt w:val="bullet"/>
       <w:lvlText w:val="o"/>
-      <w:lvlJc w:val="left"/>
+      <w:lvlJc w:val="start"/>
       <w:pPr>
         <w:tabs>
           <w:tab w:val="num" w:pos="0"/>
         </w:tabs>
-        <w:ind w:left="3600" w:hanging="360"/>
+        <w:ind w:start="3600" w:hanging="360"/>
       </w:pPr>
       <w:rPr>
         <w:rFonts w:ascii="Courier New" w:hAnsi="Courier New" w:cs="Courier New" w:hint="default"/>
@@ -2308,12 +2871,12 @@
       <w:start w:val="1"/>
       <w:numFmt w:val="bullet"/>
       <w:lvlText w:val=""/>
-      <w:lvlJc w:val="left"/>
+      <w:lvlJc w:val="start"/>
       <w:pPr>
         <w:tabs>
           <w:tab w:val="num" w:pos="0"/>
         </w:tabs>
-        <w:ind w:left="4320" w:hanging="360"/>
+        <w:ind w:start="4320" w:hanging="360"/>
       </w:pPr>
       <w:rPr>
         <w:rFonts w:ascii="Wingdings" w:hAnsi="Wingdings" w:cs="Wingdings" w:hint="default"/>
@@ -2323,12 +2886,12 @@
       <w:start w:val="1"/>
       <w:numFmt w:val="bullet"/>
       <w:lvlText w:val=""/>
-      <w:lvlJc w:val="left"/>
+      <w:lvlJc w:val="start"/>
       <w:pPr>
         <w:tabs>
           <w:tab w:val="num" w:pos="0"/>
         </w:tabs>
-        <w:ind w:left="5040" w:hanging="360"/>
+        <w:ind w:start="5040" w:hanging="360"/>
       </w:pPr>
       <w:rPr>
         <w:rFonts w:ascii="Symbol" w:hAnsi="Symbol" w:cs="Symbol" w:hint="default"/>
@@ -2338,12 +2901,12 @@
       <w:start w:val="1"/>
       <w:numFmt w:val="bullet"/>
       <w:lvlText w:val="o"/>
-      <w:lvlJc w:val="left"/>
+      <w:lvlJc w:val="start"/>
       <w:pPr>
         <w:tabs>
           <w:tab w:val="num" w:pos="0"/>
         </w:tabs>
-        <w:ind w:left="5760" w:hanging="360"/>
+        <w:ind w:start="5760" w:hanging="360"/>
       </w:pPr>
       <w:rPr>
         <w:rFonts w:ascii="Courier New" w:hAnsi="Courier New" w:cs="Courier New" w:hint="default"/>
@@ -2353,265 +2916,36 @@
       <w:start w:val="1"/>
       <w:numFmt w:val="bullet"/>
       <w:lvlText w:val=""/>
-      <w:lvlJc w:val="left"/>
+      <w:lvlJc w:val="start"/>
       <w:pPr>
         <w:tabs>
           <w:tab w:val="num" w:pos="0"/>
         </w:tabs>
-        <w:ind w:left="6480" w:hanging="360"/>
+        <w:ind w:start="6480" w:hanging="360"/>
       </w:pPr>
       <w:rPr>
         <w:rFonts w:ascii="Wingdings" w:hAnsi="Wingdings" w:cs="Wingdings" w:hint="default"/>
       </w:rPr>
     </w:lvl>
   </w:abstractNum>
-  <w:abstractNum w:abstractNumId="1" w15:restartNumberingAfterBreak="0">
-    <w:nsid w:val="424A4999"/>
-    <w:multiLevelType w:val="multilevel"/>
-    <w:tmpl w:val="4766A344"/>
-    <w:lvl w:ilvl="0">
-      <w:start w:val="1"/>
-      <w:numFmt w:val="decimal"/>
-      <w:pStyle w:val="Heading1"/>
-      <w:lvlText w:val="%1."/>
-      <w:lvlJc w:val="left"/>
-      <w:pPr>
-        <w:tabs>
-          <w:tab w:val="num" w:pos="0"/>
-        </w:tabs>
-        <w:ind w:left="684" w:hanging="400"/>
-      </w:pPr>
-    </w:lvl>
-    <w:lvl w:ilvl="1">
-      <w:start w:val="1"/>
-      <w:numFmt w:val="upperLetter"/>
-      <w:lvlText w:val="%2."/>
-      <w:lvlJc w:val="left"/>
-      <w:pPr>
-        <w:tabs>
-          <w:tab w:val="num" w:pos="0"/>
-        </w:tabs>
-        <w:ind w:left="1200" w:hanging="400"/>
-      </w:pPr>
-    </w:lvl>
-    <w:lvl w:ilvl="2">
-      <w:start w:val="1"/>
-      <w:numFmt w:val="lowerRoman"/>
-      <w:lvlText w:val="%3."/>
-      <w:lvlJc w:val="right"/>
-      <w:pPr>
-        <w:tabs>
-          <w:tab w:val="num" w:pos="0"/>
-        </w:tabs>
-        <w:ind w:left="1600" w:hanging="400"/>
-      </w:pPr>
-    </w:lvl>
-    <w:lvl w:ilvl="3">
-      <w:start w:val="1"/>
-      <w:numFmt w:val="decimal"/>
-      <w:lvlText w:val="%4."/>
-      <w:lvlJc w:val="left"/>
-      <w:pPr>
-        <w:tabs>
-          <w:tab w:val="num" w:pos="0"/>
-        </w:tabs>
-        <w:ind w:left="2000" w:hanging="400"/>
-      </w:pPr>
-    </w:lvl>
-    <w:lvl w:ilvl="4">
-      <w:start w:val="1"/>
-      <w:numFmt w:val="upperLetter"/>
-      <w:lvlText w:val="%5."/>
-      <w:lvlJc w:val="left"/>
-      <w:pPr>
-        <w:tabs>
-          <w:tab w:val="num" w:pos="0"/>
-        </w:tabs>
-        <w:ind w:left="2400" w:hanging="400"/>
-      </w:pPr>
-    </w:lvl>
-    <w:lvl w:ilvl="5">
-      <w:start w:val="1"/>
-      <w:numFmt w:val="lowerRoman"/>
-      <w:lvlText w:val="%6."/>
-      <w:lvlJc w:val="right"/>
-      <w:pPr>
-        <w:tabs>
-          <w:tab w:val="num" w:pos="0"/>
-        </w:tabs>
-        <w:ind w:left="2800" w:hanging="400"/>
-      </w:pPr>
-    </w:lvl>
-    <w:lvl w:ilvl="6">
-      <w:start w:val="1"/>
-      <w:numFmt w:val="decimal"/>
-      <w:lvlText w:val="%7."/>
-      <w:lvlJc w:val="left"/>
-      <w:pPr>
-        <w:tabs>
-          <w:tab w:val="num" w:pos="0"/>
-        </w:tabs>
-        <w:ind w:left="3200" w:hanging="400"/>
-      </w:pPr>
-    </w:lvl>
-    <w:lvl w:ilvl="7">
-      <w:start w:val="1"/>
-      <w:numFmt w:val="upperLetter"/>
-      <w:lvlText w:val="%8."/>
-      <w:lvlJc w:val="left"/>
-      <w:pPr>
-        <w:tabs>
-          <w:tab w:val="num" w:pos="0"/>
-        </w:tabs>
-        <w:ind w:left="3600" w:hanging="400"/>
-      </w:pPr>
-    </w:lvl>
-    <w:lvl w:ilvl="8">
-      <w:start w:val="1"/>
-      <w:numFmt w:val="lowerRoman"/>
-      <w:lvlText w:val="%9."/>
-      <w:lvlJc w:val="right"/>
-      <w:pPr>
-        <w:tabs>
-          <w:tab w:val="num" w:pos="0"/>
-        </w:tabs>
-        <w:ind w:left="4000" w:hanging="400"/>
-      </w:pPr>
-    </w:lvl>
-  </w:abstractNum>
-  <w:abstractNum w:abstractNumId="2" w15:restartNumberingAfterBreak="0">
-    <w:nsid w:val="7A916539"/>
-    <w:multiLevelType w:val="multilevel"/>
-    <w:tmpl w:val="03DEBDF6"/>
-    <w:lvl w:ilvl="0">
-      <w:start w:val="1"/>
-      <w:numFmt w:val="lowerLetter"/>
-      <w:pStyle w:val="ListParagraph"/>
-      <w:suff w:val="space"/>
-      <w:lvlText w:val="%1."/>
-      <w:lvlJc w:val="left"/>
-      <w:pPr>
-        <w:tabs>
-          <w:tab w:val="num" w:pos="0"/>
-        </w:tabs>
-        <w:ind w:left="0" w:firstLine="0"/>
-      </w:pPr>
-    </w:lvl>
-    <w:lvl w:ilvl="1">
-      <w:start w:val="1"/>
-      <w:numFmt w:val="decimal"/>
-      <w:lvlText w:val="%2."/>
-      <w:lvlJc w:val="left"/>
-      <w:pPr>
-        <w:tabs>
-          <w:tab w:val="num" w:pos="1080"/>
-        </w:tabs>
-        <w:ind w:left="1080" w:hanging="360"/>
-      </w:pPr>
-    </w:lvl>
-    <w:lvl w:ilvl="2">
-      <w:start w:val="1"/>
-      <w:numFmt w:val="decimal"/>
-      <w:lvlText w:val="%3."/>
-      <w:lvlJc w:val="left"/>
-      <w:pPr>
-        <w:tabs>
-          <w:tab w:val="num" w:pos="1440"/>
-        </w:tabs>
-        <w:ind w:left="1440" w:hanging="360"/>
-      </w:pPr>
-    </w:lvl>
-    <w:lvl w:ilvl="3">
-      <w:start w:val="1"/>
-      <w:numFmt w:val="decimal"/>
-      <w:lvlText w:val="%4."/>
-      <w:lvlJc w:val="left"/>
-      <w:pPr>
-        <w:tabs>
-          <w:tab w:val="num" w:pos="1800"/>
-        </w:tabs>
-        <w:ind w:left="1800" w:hanging="360"/>
-      </w:pPr>
-    </w:lvl>
-    <w:lvl w:ilvl="4">
-      <w:start w:val="1"/>
-      <w:numFmt w:val="decimal"/>
-      <w:lvlText w:val="%5."/>
-      <w:lvlJc w:val="left"/>
-      <w:pPr>
-        <w:tabs>
-          <w:tab w:val="num" w:pos="2160"/>
-        </w:tabs>
-        <w:ind w:left="2160" w:hanging="360"/>
-      </w:pPr>
-    </w:lvl>
-    <w:lvl w:ilvl="5">
-      <w:start w:val="1"/>
-      <w:numFmt w:val="decimal"/>
-      <w:lvlText w:val="%6."/>
-      <w:lvlJc w:val="left"/>
-      <w:pPr>
-        <w:tabs>
-          <w:tab w:val="num" w:pos="2520"/>
-        </w:tabs>
-        <w:ind w:left="2520" w:hanging="360"/>
-      </w:pPr>
-    </w:lvl>
-    <w:lvl w:ilvl="6">
-      <w:start w:val="1"/>
-      <w:numFmt w:val="decimal"/>
-      <w:lvlText w:val="%7."/>
-      <w:lvlJc w:val="left"/>
-      <w:pPr>
-        <w:tabs>
-          <w:tab w:val="num" w:pos="2880"/>
-        </w:tabs>
-        <w:ind w:left="2880" w:hanging="360"/>
-      </w:pPr>
-    </w:lvl>
-    <w:lvl w:ilvl="7">
-      <w:start w:val="1"/>
-      <w:numFmt w:val="decimal"/>
-      <w:lvlText w:val="%8."/>
-      <w:lvlJc w:val="left"/>
-      <w:pPr>
-        <w:tabs>
-          <w:tab w:val="num" w:pos="3240"/>
-        </w:tabs>
-        <w:ind w:left="3240" w:hanging="360"/>
-      </w:pPr>
-    </w:lvl>
-    <w:lvl w:ilvl="8">
-      <w:start w:val="1"/>
-      <w:numFmt w:val="decimal"/>
-      <w:lvlText w:val="%9."/>
-      <w:lvlJc w:val="left"/>
-      <w:pPr>
-        <w:tabs>
-          <w:tab w:val="num" w:pos="3600"/>
-        </w:tabs>
-        <w:ind w:left="3600" w:hanging="360"/>
-      </w:pPr>
-    </w:lvl>
-  </w:abstractNum>
-  <w:num w:numId="1" w16cid:durableId="2076973761">
+  <w:num w:numId="1">
     <w:abstractNumId w:val="1"/>
   </w:num>
-  <w:num w:numId="2" w16cid:durableId="1826318448">
+  <w:num w:numId="2">
     <w:abstractNumId w:val="2"/>
   </w:num>
-  <w:num w:numId="3" w16cid:durableId="1510019620">
-    <w:abstractNumId w:val="0"/>
+  <w:num w:numId="3">
+    <w:abstractNumId w:val="3"/>
   </w:num>
 </w:numbering>
 </file>
 
 <file path=word/styles.xml><?xml version="1.0" encoding="utf-8"?>
-<w:styles xmlns:mc="http://schemas.openxmlformats.org/markup-compatibility/2006" xmlns:r="http://schemas.openxmlformats.org/officeDocument/2006/relationships" xmlns:w="http://schemas.openxmlformats.org/wordprocessingml/2006/main" xmlns:w14="http://schemas.microsoft.com/office/word/2010/wordml" xmlns:w15="http://schemas.microsoft.com/office/word/2012/wordml" xmlns:w16cex="http://schemas.microsoft.com/office/word/2018/wordml/cex" xmlns:w16cid="http://schemas.microsoft.com/office/word/2016/wordml/cid" xmlns:w16="http://schemas.microsoft.com/office/word/2018/wordml" xmlns:w16du="http://schemas.microsoft.com/office/word/2023/wordml/word16du" xmlns:w16sdtdh="http://schemas.microsoft.com/office/word/2020/wordml/sdtdatahash" xmlns:w16sdtfl="http://schemas.microsoft.com/office/word/2024/wordml/sdtformatlock" xmlns:w16se="http://schemas.microsoft.com/office/word/2015/wordml/symex" mc:Ignorable="w14 w15 w16se w16cid w16 w16cex w16sdtdh w16sdtfl w16du">
+<w:styles xmlns:w="http://schemas.openxmlformats.org/wordprocessingml/2006/main" xmlns:w14="http://schemas.microsoft.com/office/word/2010/wordml" xmlns:mc="http://schemas.openxmlformats.org/markup-compatibility/2006" mc:Ignorable="w14">
   <w:docDefaults>
     <w:rPrDefault>
       <w:rPr>
-        <w:rFonts w:asciiTheme="minorHAnsi" w:eastAsia="Gulim" w:hAnsiTheme="minorHAnsi" w:cstheme="minorBidi"/>
+        <w:rFonts w:ascii="Aptos" w:hAnsi="Aptos" w:eastAsia="Gulim" w:cs="" w:asciiTheme="minorHAnsi" w:cstheme="minorBidi" w:hAnsiTheme="minorHAnsi"/>
         <w:kern w:val="2"/>
         <w:sz w:val="24"/>
         <w:szCs w:val="24"/>
@@ -2621,21 +2955,21 @@
     </w:rPrDefault>
     <w:pPrDefault>
       <w:pPr>
-        <w:suppressAutoHyphens/>
+        <w:suppressAutoHyphens w:val="true"/>
       </w:pPr>
     </w:pPrDefault>
   </w:docDefaults>
   <w:latentStyles w:defLockedState="0" w:defUIPriority="99" w:defSemiHidden="0" w:defUnhideWhenUsed="0" w:defQFormat="0" w:count="376">
     <w:lsdException w:name="Normal" w:uiPriority="0" w:qFormat="1"/>
     <w:lsdException w:name="heading 1" w:uiPriority="9" w:qFormat="1"/>
-    <w:lsdException w:name="heading 2" w:semiHidden="1" w:uiPriority="9" w:unhideWhenUsed="1" w:qFormat="1"/>
-    <w:lsdException w:name="heading 3" w:semiHidden="1" w:uiPriority="9" w:unhideWhenUsed="1" w:qFormat="1"/>
-    <w:lsdException w:name="heading 4" w:semiHidden="1" w:uiPriority="9" w:unhideWhenUsed="1" w:qFormat="1"/>
-    <w:lsdException w:name="heading 5" w:semiHidden="1" w:uiPriority="9" w:unhideWhenUsed="1" w:qFormat="1"/>
-    <w:lsdException w:name="heading 6" w:semiHidden="1" w:uiPriority="9" w:unhideWhenUsed="1" w:qFormat="1"/>
-    <w:lsdException w:name="heading 7" w:semiHidden="1" w:uiPriority="9" w:unhideWhenUsed="1" w:qFormat="1"/>
-    <w:lsdException w:name="heading 8" w:semiHidden="1" w:uiPriority="9" w:unhideWhenUsed="1" w:qFormat="1"/>
-    <w:lsdException w:name="heading 9" w:semiHidden="1" w:uiPriority="9" w:unhideWhenUsed="1" w:qFormat="1"/>
+    <w:lsdException w:name="heading 2" w:uiPriority="9" w:semiHidden="1" w:unhideWhenUsed="1" w:qFormat="1"/>
+    <w:lsdException w:name="heading 3" w:uiPriority="9" w:semiHidden="1" w:unhideWhenUsed="1" w:qFormat="1"/>
+    <w:lsdException w:name="heading 4" w:uiPriority="9" w:semiHidden="1" w:unhideWhenUsed="1" w:qFormat="1"/>
+    <w:lsdException w:name="heading 5" w:uiPriority="9" w:semiHidden="1" w:unhideWhenUsed="1" w:qFormat="1"/>
+    <w:lsdException w:name="heading 6" w:uiPriority="9" w:semiHidden="1" w:unhideWhenUsed="1" w:qFormat="1"/>
+    <w:lsdException w:name="heading 7" w:uiPriority="9" w:semiHidden="1" w:unhideWhenUsed="1" w:qFormat="1"/>
+    <w:lsdException w:name="heading 8" w:uiPriority="9" w:semiHidden="1" w:unhideWhenUsed="1" w:qFormat="1"/>
+    <w:lsdException w:name="heading 9" w:uiPriority="9" w:semiHidden="1" w:unhideWhenUsed="1" w:qFormat="1"/>
     <w:lsdException w:name="index 1" w:semiHidden="1" w:unhideWhenUsed="1"/>
     <w:lsdException w:name="index 2" w:semiHidden="1" w:unhideWhenUsed="1"/>
     <w:lsdException w:name="index 3" w:semiHidden="1" w:unhideWhenUsed="1"/>
@@ -2645,22 +2979,22 @@
     <w:lsdException w:name="index 7" w:semiHidden="1" w:unhideWhenUsed="1"/>
     <w:lsdException w:name="index 8" w:semiHidden="1" w:unhideWhenUsed="1"/>
     <w:lsdException w:name="index 9" w:semiHidden="1" w:unhideWhenUsed="1"/>
-    <w:lsdException w:name="toc 1" w:semiHidden="1" w:uiPriority="39" w:unhideWhenUsed="1"/>
-    <w:lsdException w:name="toc 2" w:semiHidden="1" w:uiPriority="39" w:unhideWhenUsed="1"/>
-    <w:lsdException w:name="toc 3" w:semiHidden="1" w:uiPriority="39" w:unhideWhenUsed="1"/>
-    <w:lsdException w:name="toc 4" w:semiHidden="1" w:uiPriority="39" w:unhideWhenUsed="1"/>
-    <w:lsdException w:name="toc 5" w:semiHidden="1" w:uiPriority="39" w:unhideWhenUsed="1"/>
-    <w:lsdException w:name="toc 6" w:semiHidden="1" w:uiPriority="39" w:unhideWhenUsed="1"/>
-    <w:lsdException w:name="toc 7" w:semiHidden="1" w:uiPriority="39" w:unhideWhenUsed="1"/>
-    <w:lsdException w:name="toc 8" w:semiHidden="1" w:uiPriority="39" w:unhideWhenUsed="1"/>
-    <w:lsdException w:name="toc 9" w:semiHidden="1" w:uiPriority="39" w:unhideWhenUsed="1"/>
+    <w:lsdException w:name="toc 1" w:uiPriority="39" w:semiHidden="1" w:unhideWhenUsed="1"/>
+    <w:lsdException w:name="toc 2" w:uiPriority="39" w:semiHidden="1" w:unhideWhenUsed="1"/>
+    <w:lsdException w:name="toc 3" w:uiPriority="39" w:semiHidden="1" w:unhideWhenUsed="1"/>
+    <w:lsdException w:name="toc 4" w:uiPriority="39" w:semiHidden="1" w:unhideWhenUsed="1"/>
+    <w:lsdException w:name="toc 5" w:uiPriority="39" w:semiHidden="1" w:unhideWhenUsed="1"/>
+    <w:lsdException w:name="toc 6" w:uiPriority="39" w:semiHidden="1" w:unhideWhenUsed="1"/>
+    <w:lsdException w:name="toc 7" w:uiPriority="39" w:semiHidden="1" w:unhideWhenUsed="1"/>
+    <w:lsdException w:name="toc 8" w:uiPriority="39" w:semiHidden="1" w:unhideWhenUsed="1"/>
+    <w:lsdException w:name="toc 9" w:uiPriority="39" w:semiHidden="1" w:unhideWhenUsed="1"/>
     <w:lsdException w:name="Normal Indent" w:semiHidden="1" w:unhideWhenUsed="1"/>
     <w:lsdException w:name="footnote text" w:semiHidden="1" w:unhideWhenUsed="1"/>
     <w:lsdException w:name="annotation text" w:semiHidden="1" w:unhideWhenUsed="1"/>
     <w:lsdException w:name="header" w:semiHidden="1" w:unhideWhenUsed="1"/>
     <w:lsdException w:name="footer" w:semiHidden="1" w:unhideWhenUsed="1"/>
     <w:lsdException w:name="index heading" w:semiHidden="1" w:unhideWhenUsed="1"/>
-    <w:lsdException w:name="caption" w:semiHidden="1" w:uiPriority="35" w:unhideWhenUsed="1" w:qFormat="1"/>
+    <w:lsdException w:name="caption" w:uiPriority="35" w:semiHidden="1" w:unhideWhenUsed="1" w:qFormat="1"/>
     <w:lsdException w:name="table of figures" w:semiHidden="1" w:unhideWhenUsed="1"/>
     <w:lsdException w:name="envelope address" w:semiHidden="1" w:unhideWhenUsed="1"/>
     <w:lsdException w:name="envelope return" w:semiHidden="1" w:unhideWhenUsed="1"/>
@@ -2691,7 +3025,7 @@
     <w:lsdException w:name="Title" w:uiPriority="10" w:qFormat="1"/>
     <w:lsdException w:name="Closing" w:semiHidden="1" w:unhideWhenUsed="1"/>
     <w:lsdException w:name="Signature" w:semiHidden="1" w:unhideWhenUsed="1"/>
-    <w:lsdException w:name="Default Paragraph Font" w:semiHidden="1" w:uiPriority="1" w:unhideWhenUsed="1"/>
+    <w:lsdException w:name="Default Paragraph Font" w:uiPriority="1" w:semiHidden="1" w:unhideWhenUsed="1"/>
     <w:lsdException w:name="Body Text" w:semiHidden="1" w:unhideWhenUsed="1"/>
     <w:lsdException w:name="Body Text Indent" w:semiHidden="1" w:unhideWhenUsed="1"/>
     <w:lsdException w:name="List Continue" w:semiHidden="1" w:unhideWhenUsed="1"/>
@@ -2891,8 +3225,8 @@
     <w:lsdException w:name="Subtle Reference" w:uiPriority="31" w:qFormat="1"/>
     <w:lsdException w:name="Intense Reference" w:uiPriority="32" w:qFormat="1"/>
     <w:lsdException w:name="Book Title" w:uiPriority="33" w:qFormat="1"/>
-    <w:lsdException w:name="Bibliography" w:semiHidden="1" w:uiPriority="37" w:unhideWhenUsed="1"/>
-    <w:lsdException w:name="TOC Heading" w:semiHidden="1" w:uiPriority="39" w:unhideWhenUsed="1" w:qFormat="1"/>
+    <w:lsdException w:name="Bibliography" w:uiPriority="37" w:semiHidden="1" w:unhideWhenUsed="1"/>
+    <w:lsdException w:name="TOC Heading" w:uiPriority="39" w:semiHidden="1" w:unhideWhenUsed="1" w:qFormat="1"/>
     <w:lsdException w:name="Plain Table 1" w:uiPriority="41"/>
     <w:lsdException w:name="Plain Table 2" w:uiPriority="42"/>
     <w:lsdException w:name="Plain Table 3" w:uiPriority="43"/>
@@ -3003,14 +3337,24 @@
     <w:lsdException w:name="Unresolved Mention" w:semiHidden="1" w:unhideWhenUsed="1"/>
     <w:lsdException w:name="Smart Link" w:semiHidden="1" w:unhideWhenUsed="1"/>
   </w:latentStyles>
-  <w:style w:type="paragraph" w:default="1" w:styleId="Normal">
+  <w:style w:type="paragraph" w:styleId="Normal" w:default="1">
     <w:name w:val="Normal"/>
     <w:qFormat/>
-    <w:rsid w:val="00A7237E"/>
+    <w:rsid w:val="00a7237e"/>
+    <w:pPr>
+      <w:widowControl/>
+      <w:suppressAutoHyphens w:val="true"/>
+      <w:bidi w:val="0"/>
+      <w:spacing w:before="0" w:after="0"/>
+      <w:jc w:val="start"/>
+    </w:pPr>
     <w:rPr>
-      <w:rFonts w:ascii="Times New Roman" w:hAnsi="Times New Roman" w:cs="Gulim"/>
+      <w:rFonts w:ascii="Times New Roman" w:hAnsi="Times New Roman" w:cs="Gulim" w:eastAsia="Gulim"/>
+      <w:color w:val="auto"/>
       <w:kern w:val="0"/>
-      <w:lang w:val="en-US" w:eastAsia="ko-KR"/>
+      <w:sz w:val="24"/>
+      <w:szCs w:val="24"/>
+      <w:lang w:val="en-US" w:eastAsia="ko-KR" w:bidi="ar-SA"/>
       <w14:ligatures w14:val="none"/>
     </w:rPr>
   </w:style>
@@ -3022,18 +3366,19 @@
     <w:autoRedefine/>
     <w:uiPriority w:val="9"/>
     <w:qFormat/>
-    <w:rsid w:val="00A7237E"/>
+    <w:rsid w:val="00a7237e"/>
     <w:pPr>
-      <w:keepNext/>
+      <w:keepNext w:val="true"/>
       <w:numPr>
+        <w:ilvl w:val="0"/>
         <w:numId w:val="1"/>
       </w:numPr>
       <w:spacing w:before="120" w:after="120"/>
-      <w:ind w:rightChars="100" w:right="100"/>
+      <w:ind w:endChars="100"/>
       <w:outlineLvl w:val="0"/>
     </w:pPr>
     <w:rPr>
-      <w:rFonts w:eastAsia="Times New Roman" w:cstheme="majorBidi"/>
+      <w:rFonts w:eastAsia="Times New Roman" w:cs="" w:cstheme="majorBidi"/>
       <w:b/>
       <w:sz w:val="28"/>
       <w:szCs w:val="28"/>
@@ -3048,16 +3393,16 @@
     <w:semiHidden/>
     <w:unhideWhenUsed/>
     <w:qFormat/>
-    <w:rsid w:val="00AC40A2"/>
+    <w:rsid w:val="00ac40a2"/>
     <w:pPr>
-      <w:keepNext/>
+      <w:keepNext w:val="true"/>
       <w:keepLines/>
       <w:spacing w:before="160" w:after="80"/>
       <w:outlineLvl w:val="1"/>
     </w:pPr>
     <w:rPr>
-      <w:rFonts w:asciiTheme="majorHAnsi" w:eastAsiaTheme="majorEastAsia" w:hAnsiTheme="majorHAnsi" w:cstheme="majorBidi"/>
-      <w:color w:val="0F4761" w:themeColor="accent1" w:themeShade="BF"/>
+      <w:rFonts w:ascii="Aptos Display" w:hAnsi="Aptos Display" w:eastAsia="" w:cs="" w:asciiTheme="majorHAnsi" w:cstheme="majorBidi" w:eastAsiaTheme="majorEastAsia" w:hAnsiTheme="majorHAnsi"/>
+      <w:color w:themeColor="accent1" w:themeShade="bf" w:val="0F4761"/>
       <w:sz w:val="32"/>
       <w:szCs w:val="32"/>
     </w:rPr>
@@ -3071,16 +3416,16 @@
     <w:semiHidden/>
     <w:unhideWhenUsed/>
     <w:qFormat/>
-    <w:rsid w:val="00AC40A2"/>
+    <w:rsid w:val="00ac40a2"/>
     <w:pPr>
-      <w:keepNext/>
+      <w:keepNext w:val="true"/>
       <w:keepLines/>
       <w:spacing w:before="160" w:after="80"/>
       <w:outlineLvl w:val="2"/>
     </w:pPr>
     <w:rPr>
-      <w:rFonts w:asciiTheme="minorHAnsi" w:eastAsiaTheme="majorEastAsia" w:hAnsiTheme="minorHAnsi" w:cstheme="majorBidi"/>
-      <w:color w:val="0F4761" w:themeColor="accent1" w:themeShade="BF"/>
+      <w:rFonts w:ascii="Aptos" w:hAnsi="Aptos" w:eastAsia="" w:cs="" w:asciiTheme="minorHAnsi" w:cstheme="majorBidi" w:eastAsiaTheme="majorEastAsia" w:hAnsiTheme="minorHAnsi"/>
+      <w:color w:themeColor="accent1" w:themeShade="bf" w:val="0F4761"/>
       <w:sz w:val="28"/>
       <w:szCs w:val="28"/>
     </w:rPr>
@@ -3094,18 +3439,18 @@
     <w:semiHidden/>
     <w:unhideWhenUsed/>
     <w:qFormat/>
-    <w:rsid w:val="00AC40A2"/>
+    <w:rsid w:val="00ac40a2"/>
     <w:pPr>
-      <w:keepNext/>
+      <w:keepNext w:val="true"/>
       <w:keepLines/>
       <w:spacing w:before="80" w:after="40"/>
       <w:outlineLvl w:val="3"/>
     </w:pPr>
     <w:rPr>
-      <w:rFonts w:asciiTheme="minorHAnsi" w:eastAsiaTheme="majorEastAsia" w:hAnsiTheme="minorHAnsi" w:cstheme="majorBidi"/>
+      <w:rFonts w:ascii="Aptos" w:hAnsi="Aptos" w:eastAsia="" w:cs="" w:asciiTheme="minorHAnsi" w:cstheme="majorBidi" w:eastAsiaTheme="majorEastAsia" w:hAnsiTheme="minorHAnsi"/>
       <w:i/>
       <w:iCs/>
-      <w:color w:val="0F4761" w:themeColor="accent1" w:themeShade="BF"/>
+      <w:color w:themeColor="accent1" w:themeShade="bf" w:val="0F4761"/>
     </w:rPr>
   </w:style>
   <w:style w:type="paragraph" w:styleId="Heading5">
@@ -3117,16 +3462,16 @@
     <w:semiHidden/>
     <w:unhideWhenUsed/>
     <w:qFormat/>
-    <w:rsid w:val="00AC40A2"/>
+    <w:rsid w:val="00ac40a2"/>
     <w:pPr>
-      <w:keepNext/>
+      <w:keepNext w:val="true"/>
       <w:keepLines/>
       <w:spacing w:before="80" w:after="40"/>
       <w:outlineLvl w:val="4"/>
     </w:pPr>
     <w:rPr>
-      <w:rFonts w:asciiTheme="minorHAnsi" w:eastAsiaTheme="majorEastAsia" w:hAnsiTheme="minorHAnsi" w:cstheme="majorBidi"/>
-      <w:color w:val="0F4761" w:themeColor="accent1" w:themeShade="BF"/>
+      <w:rFonts w:ascii="Aptos" w:hAnsi="Aptos" w:eastAsia="" w:cs="" w:asciiTheme="minorHAnsi" w:cstheme="majorBidi" w:eastAsiaTheme="majorEastAsia" w:hAnsiTheme="minorHAnsi"/>
+      <w:color w:themeColor="accent1" w:themeShade="bf" w:val="0F4761"/>
     </w:rPr>
   </w:style>
   <w:style w:type="paragraph" w:styleId="Heading6">
@@ -3138,18 +3483,18 @@
     <w:semiHidden/>
     <w:unhideWhenUsed/>
     <w:qFormat/>
-    <w:rsid w:val="00AC40A2"/>
+    <w:rsid w:val="00ac40a2"/>
     <w:pPr>
-      <w:keepNext/>
+      <w:keepNext w:val="true"/>
       <w:keepLines/>
-      <w:spacing w:before="40"/>
+      <w:spacing w:before="40" w:after="0"/>
       <w:outlineLvl w:val="5"/>
     </w:pPr>
     <w:rPr>
-      <w:rFonts w:asciiTheme="minorHAnsi" w:eastAsiaTheme="majorEastAsia" w:hAnsiTheme="minorHAnsi" w:cstheme="majorBidi"/>
+      <w:rFonts w:ascii="Aptos" w:hAnsi="Aptos" w:eastAsia="" w:cs="" w:asciiTheme="minorHAnsi" w:cstheme="majorBidi" w:eastAsiaTheme="majorEastAsia" w:hAnsiTheme="minorHAnsi"/>
       <w:i/>
       <w:iCs/>
-      <w:color w:val="595959" w:themeColor="text1" w:themeTint="A6"/>
+      <w:color w:themeColor="text1" w:themeTint="a6" w:val="595959"/>
     </w:rPr>
   </w:style>
   <w:style w:type="paragraph" w:styleId="Heading7">
@@ -3161,16 +3506,16 @@
     <w:semiHidden/>
     <w:unhideWhenUsed/>
     <w:qFormat/>
-    <w:rsid w:val="00AC40A2"/>
+    <w:rsid w:val="00ac40a2"/>
     <w:pPr>
-      <w:keepNext/>
+      <w:keepNext w:val="true"/>
       <w:keepLines/>
-      <w:spacing w:before="40"/>
+      <w:spacing w:before="40" w:after="0"/>
       <w:outlineLvl w:val="6"/>
     </w:pPr>
     <w:rPr>
-      <w:rFonts w:asciiTheme="minorHAnsi" w:eastAsiaTheme="majorEastAsia" w:hAnsiTheme="minorHAnsi" w:cstheme="majorBidi"/>
-      <w:color w:val="595959" w:themeColor="text1" w:themeTint="A6"/>
+      <w:rFonts w:ascii="Aptos" w:hAnsi="Aptos" w:eastAsia="" w:cs="" w:asciiTheme="minorHAnsi" w:cstheme="majorBidi" w:eastAsiaTheme="majorEastAsia" w:hAnsiTheme="minorHAnsi"/>
+      <w:color w:themeColor="text1" w:themeTint="a6" w:val="595959"/>
     </w:rPr>
   </w:style>
   <w:style w:type="paragraph" w:styleId="Heading8">
@@ -3182,17 +3527,17 @@
     <w:semiHidden/>
     <w:unhideWhenUsed/>
     <w:qFormat/>
-    <w:rsid w:val="00AC40A2"/>
+    <w:rsid w:val="00ac40a2"/>
     <w:pPr>
-      <w:keepNext/>
+      <w:keepNext w:val="true"/>
       <w:keepLines/>
       <w:outlineLvl w:val="7"/>
     </w:pPr>
     <w:rPr>
-      <w:rFonts w:asciiTheme="minorHAnsi" w:eastAsiaTheme="majorEastAsia" w:hAnsiTheme="minorHAnsi" w:cstheme="majorBidi"/>
+      <w:rFonts w:ascii="Aptos" w:hAnsi="Aptos" w:eastAsia="" w:cs="" w:asciiTheme="minorHAnsi" w:cstheme="majorBidi" w:eastAsiaTheme="majorEastAsia" w:hAnsiTheme="minorHAnsi"/>
       <w:i/>
       <w:iCs/>
-      <w:color w:val="272727" w:themeColor="text1" w:themeTint="D8"/>
+      <w:color w:themeColor="text1" w:themeTint="d8" w:val="272727"/>
     </w:rPr>
   </w:style>
   <w:style w:type="paragraph" w:styleId="Heading9">
@@ -3204,69 +3549,50 @@
     <w:semiHidden/>
     <w:unhideWhenUsed/>
     <w:qFormat/>
-    <w:rsid w:val="00AC40A2"/>
+    <w:rsid w:val="00ac40a2"/>
     <w:pPr>
-      <w:keepNext/>
+      <w:keepNext w:val="true"/>
       <w:keepLines/>
       <w:outlineLvl w:val="8"/>
     </w:pPr>
     <w:rPr>
-      <w:rFonts w:asciiTheme="minorHAnsi" w:eastAsiaTheme="majorEastAsia" w:hAnsiTheme="minorHAnsi" w:cstheme="majorBidi"/>
-      <w:color w:val="272727" w:themeColor="text1" w:themeTint="D8"/>
+      <w:rFonts w:ascii="Aptos" w:hAnsi="Aptos" w:eastAsia="" w:cs="" w:asciiTheme="minorHAnsi" w:cstheme="majorBidi" w:eastAsiaTheme="majorEastAsia" w:hAnsiTheme="minorHAnsi"/>
+      <w:color w:themeColor="text1" w:themeTint="d8" w:val="272727"/>
     </w:rPr>
   </w:style>
-  <w:style w:type="character" w:default="1" w:styleId="DefaultParagraphFont">
+  <w:style w:type="character" w:styleId="DefaultParagraphFont" w:default="1">
     <w:name w:val="Default Paragraph Font"/>
     <w:uiPriority w:val="1"/>
     <w:unhideWhenUsed/>
+    <w:qFormat/>
+    <w:rPr/>
   </w:style>
-  <w:style w:type="table" w:default="1" w:styleId="TableNormal">
-    <w:name w:val="Normal Table"/>
-    <w:uiPriority w:val="99"/>
-    <w:semiHidden/>
-    <w:unhideWhenUsed/>
-    <w:tblPr>
-      <w:tblInd w:w="0" w:type="dxa"/>
-      <w:tblCellMar>
-        <w:top w:w="0" w:type="dxa"/>
-        <w:left w:w="108" w:type="dxa"/>
-        <w:bottom w:w="0" w:type="dxa"/>
-        <w:right w:w="108" w:type="dxa"/>
-      </w:tblCellMar>
-    </w:tblPr>
-  </w:style>
-  <w:style w:type="numbering" w:default="1" w:styleId="NoList">
-    <w:name w:val="No List"/>
-    <w:uiPriority w:val="99"/>
-    <w:semiHidden/>
-    <w:unhideWhenUsed/>
-  </w:style>
-  <w:style w:type="character" w:customStyle="1" w:styleId="Heading1Char">
+  <w:style w:type="character" w:styleId="Heading1Char" w:customStyle="1">
     <w:name w:val="Heading 1 Char"/>
     <w:basedOn w:val="DefaultParagraphFont"/>
     <w:link w:val="Heading1"/>
     <w:uiPriority w:val="9"/>
     <w:qFormat/>
-    <w:rsid w:val="00A7237E"/>
+    <w:rsid w:val="00a7237e"/>
     <w:rPr>
-      <w:rFonts w:ascii="Times New Roman" w:eastAsia="Times New Roman" w:hAnsi="Times New Roman" w:cstheme="majorBidi"/>
+      <w:rFonts w:ascii="Times New Roman" w:hAnsi="Times New Roman" w:eastAsia="Times New Roman" w:cs="" w:cstheme="majorBidi"/>
       <w:b/>
       <w:sz w:val="28"/>
       <w:szCs w:val="28"/>
       <w:lang w:eastAsia="ko-KR"/>
     </w:rPr>
   </w:style>
-  <w:style w:type="character" w:customStyle="1" w:styleId="Heading2Char">
+  <w:style w:type="character" w:styleId="Heading2Char" w:customStyle="1">
     <w:name w:val="Heading 2 Char"/>
     <w:basedOn w:val="DefaultParagraphFont"/>
     <w:link w:val="Heading2"/>
     <w:uiPriority w:val="9"/>
     <w:semiHidden/>
     <w:qFormat/>
-    <w:rsid w:val="00AC40A2"/>
+    <w:rsid w:val="00ac40a2"/>
     <w:rPr>
-      <w:rFonts w:asciiTheme="majorHAnsi" w:eastAsiaTheme="majorEastAsia" w:hAnsiTheme="majorHAnsi" w:cstheme="majorBidi"/>
-      <w:color w:val="0F4761" w:themeColor="accent1" w:themeShade="BF"/>
+      <w:rFonts w:ascii="Aptos Display" w:hAnsi="Aptos Display" w:eastAsia="" w:cs="" w:asciiTheme="majorHAnsi" w:cstheme="majorBidi" w:eastAsiaTheme="majorEastAsia" w:hAnsiTheme="majorHAnsi"/>
+      <w:color w:themeColor="accent1" w:themeShade="bf" w:val="0F4761"/>
       <w:kern w:val="0"/>
       <w:sz w:val="32"/>
       <w:szCs w:val="32"/>
@@ -3274,17 +3600,17 @@
       <w14:ligatures w14:val="none"/>
     </w:rPr>
   </w:style>
-  <w:style w:type="character" w:customStyle="1" w:styleId="Heading3Char">
+  <w:style w:type="character" w:styleId="Heading3Char" w:customStyle="1">
     <w:name w:val="Heading 3 Char"/>
     <w:basedOn w:val="DefaultParagraphFont"/>
     <w:link w:val="Heading3"/>
     <w:uiPriority w:val="9"/>
     <w:semiHidden/>
     <w:qFormat/>
-    <w:rsid w:val="00AC40A2"/>
+    <w:rsid w:val="00ac40a2"/>
     <w:rPr>
-      <w:rFonts w:eastAsiaTheme="majorEastAsia" w:cstheme="majorBidi"/>
-      <w:color w:val="0F4761" w:themeColor="accent1" w:themeShade="BF"/>
+      <w:rFonts w:eastAsia="" w:cs="" w:cstheme="majorBidi" w:eastAsiaTheme="majorEastAsia"/>
+      <w:color w:themeColor="accent1" w:themeShade="bf" w:val="0F4761"/>
       <w:kern w:val="0"/>
       <w:sz w:val="28"/>
       <w:szCs w:val="28"/>
@@ -3292,117 +3618,117 @@
       <w14:ligatures w14:val="none"/>
     </w:rPr>
   </w:style>
-  <w:style w:type="character" w:customStyle="1" w:styleId="Heading4Char">
+  <w:style w:type="character" w:styleId="Heading4Char" w:customStyle="1">
     <w:name w:val="Heading 4 Char"/>
     <w:basedOn w:val="DefaultParagraphFont"/>
     <w:link w:val="Heading4"/>
     <w:uiPriority w:val="9"/>
     <w:semiHidden/>
     <w:qFormat/>
-    <w:rsid w:val="00AC40A2"/>
+    <w:rsid w:val="00ac40a2"/>
     <w:rPr>
-      <w:rFonts w:eastAsiaTheme="majorEastAsia" w:cstheme="majorBidi"/>
+      <w:rFonts w:eastAsia="" w:cs="" w:cstheme="majorBidi" w:eastAsiaTheme="majorEastAsia"/>
       <w:i/>
       <w:iCs/>
-      <w:color w:val="0F4761" w:themeColor="accent1" w:themeShade="BF"/>
+      <w:color w:themeColor="accent1" w:themeShade="bf" w:val="0F4761"/>
       <w:kern w:val="0"/>
       <w:lang w:val="en-US" w:eastAsia="ko-KR"/>
       <w14:ligatures w14:val="none"/>
     </w:rPr>
   </w:style>
-  <w:style w:type="character" w:customStyle="1" w:styleId="Heading5Char">
+  <w:style w:type="character" w:styleId="Heading5Char" w:customStyle="1">
     <w:name w:val="Heading 5 Char"/>
     <w:basedOn w:val="DefaultParagraphFont"/>
     <w:link w:val="Heading5"/>
     <w:uiPriority w:val="9"/>
     <w:semiHidden/>
     <w:qFormat/>
-    <w:rsid w:val="00AC40A2"/>
+    <w:rsid w:val="00ac40a2"/>
     <w:rPr>
-      <w:rFonts w:eastAsiaTheme="majorEastAsia" w:cstheme="majorBidi"/>
-      <w:color w:val="0F4761" w:themeColor="accent1" w:themeShade="BF"/>
+      <w:rFonts w:eastAsia="" w:cs="" w:cstheme="majorBidi" w:eastAsiaTheme="majorEastAsia"/>
+      <w:color w:themeColor="accent1" w:themeShade="bf" w:val="0F4761"/>
       <w:kern w:val="0"/>
       <w:lang w:val="en-US" w:eastAsia="ko-KR"/>
       <w14:ligatures w14:val="none"/>
     </w:rPr>
   </w:style>
-  <w:style w:type="character" w:customStyle="1" w:styleId="Heading6Char">
+  <w:style w:type="character" w:styleId="Heading6Char" w:customStyle="1">
     <w:name w:val="Heading 6 Char"/>
     <w:basedOn w:val="DefaultParagraphFont"/>
     <w:link w:val="Heading6"/>
     <w:uiPriority w:val="9"/>
     <w:semiHidden/>
     <w:qFormat/>
-    <w:rsid w:val="00AC40A2"/>
+    <w:rsid w:val="00ac40a2"/>
     <w:rPr>
-      <w:rFonts w:eastAsiaTheme="majorEastAsia" w:cstheme="majorBidi"/>
+      <w:rFonts w:eastAsia="" w:cs="" w:cstheme="majorBidi" w:eastAsiaTheme="majorEastAsia"/>
       <w:i/>
       <w:iCs/>
-      <w:color w:val="595959" w:themeColor="text1" w:themeTint="A6"/>
+      <w:color w:themeColor="text1" w:themeTint="a6" w:val="595959"/>
       <w:kern w:val="0"/>
       <w:lang w:val="en-US" w:eastAsia="ko-KR"/>
       <w14:ligatures w14:val="none"/>
     </w:rPr>
   </w:style>
-  <w:style w:type="character" w:customStyle="1" w:styleId="Heading7Char">
+  <w:style w:type="character" w:styleId="Heading7Char" w:customStyle="1">
     <w:name w:val="Heading 7 Char"/>
     <w:basedOn w:val="DefaultParagraphFont"/>
     <w:link w:val="Heading7"/>
     <w:uiPriority w:val="9"/>
     <w:semiHidden/>
     <w:qFormat/>
-    <w:rsid w:val="00AC40A2"/>
+    <w:rsid w:val="00ac40a2"/>
     <w:rPr>
-      <w:rFonts w:eastAsiaTheme="majorEastAsia" w:cstheme="majorBidi"/>
-      <w:color w:val="595959" w:themeColor="text1" w:themeTint="A6"/>
+      <w:rFonts w:eastAsia="" w:cs="" w:cstheme="majorBidi" w:eastAsiaTheme="majorEastAsia"/>
+      <w:color w:themeColor="text1" w:themeTint="a6" w:val="595959"/>
       <w:kern w:val="0"/>
       <w:lang w:val="en-US" w:eastAsia="ko-KR"/>
       <w14:ligatures w14:val="none"/>
     </w:rPr>
   </w:style>
-  <w:style w:type="character" w:customStyle="1" w:styleId="Heading8Char">
+  <w:style w:type="character" w:styleId="Heading8Char" w:customStyle="1">
     <w:name w:val="Heading 8 Char"/>
     <w:basedOn w:val="DefaultParagraphFont"/>
     <w:link w:val="Heading8"/>
     <w:uiPriority w:val="9"/>
     <w:semiHidden/>
     <w:qFormat/>
-    <w:rsid w:val="00AC40A2"/>
+    <w:rsid w:val="00ac40a2"/>
     <w:rPr>
-      <w:rFonts w:eastAsiaTheme="majorEastAsia" w:cstheme="majorBidi"/>
+      <w:rFonts w:eastAsia="" w:cs="" w:cstheme="majorBidi" w:eastAsiaTheme="majorEastAsia"/>
       <w:i/>
       <w:iCs/>
-      <w:color w:val="272727" w:themeColor="text1" w:themeTint="D8"/>
+      <w:color w:themeColor="text1" w:themeTint="d8" w:val="272727"/>
       <w:kern w:val="0"/>
       <w:lang w:val="en-US" w:eastAsia="ko-KR"/>
       <w14:ligatures w14:val="none"/>
     </w:rPr>
   </w:style>
-  <w:style w:type="character" w:customStyle="1" w:styleId="Heading9Char">
+  <w:style w:type="character" w:styleId="Heading9Char" w:customStyle="1">
     <w:name w:val="Heading 9 Char"/>
     <w:basedOn w:val="DefaultParagraphFont"/>
     <w:link w:val="Heading9"/>
     <w:uiPriority w:val="9"/>
     <w:semiHidden/>
     <w:qFormat/>
-    <w:rsid w:val="00AC40A2"/>
+    <w:rsid w:val="00ac40a2"/>
     <w:rPr>
-      <w:rFonts w:eastAsiaTheme="majorEastAsia" w:cstheme="majorBidi"/>
-      <w:color w:val="272727" w:themeColor="text1" w:themeTint="D8"/>
+      <w:rFonts w:eastAsia="" w:cs="" w:cstheme="majorBidi" w:eastAsiaTheme="majorEastAsia"/>
+      <w:color w:themeColor="text1" w:themeTint="d8" w:val="272727"/>
       <w:kern w:val="0"/>
       <w:lang w:val="en-US" w:eastAsia="ko-KR"/>
       <w14:ligatures w14:val="none"/>
     </w:rPr>
   </w:style>
-  <w:style w:type="character" w:customStyle="1" w:styleId="TitleChar">
+  <w:style w:type="character" w:styleId="TitleChar" w:customStyle="1">
     <w:name w:val="Title Char"/>
     <w:basedOn w:val="DefaultParagraphFont"/>
     <w:link w:val="Title"/>
     <w:uiPriority w:val="10"/>
     <w:qFormat/>
-    <w:rsid w:val="00AC40A2"/>
+    <w:rsid w:val="00ac40a2"/>
     <w:rPr>
-      <w:rFonts w:asciiTheme="majorHAnsi" w:eastAsiaTheme="majorEastAsia" w:hAnsiTheme="majorHAnsi" w:cstheme="majorBidi"/>
+      <w:rFonts w:ascii="Aptos Display" w:hAnsi="Aptos Display" w:eastAsia="" w:cs="" w:asciiTheme="majorHAnsi" w:cstheme="majorBidi" w:eastAsiaTheme="majorEastAsia" w:hAnsiTheme="majorHAnsi"/>
       <w:spacing w:val="-10"/>
       <w:kern w:val="2"/>
       <w:sz w:val="56"/>
@@ -3411,16 +3737,16 @@
       <w14:ligatures w14:val="none"/>
     </w:rPr>
   </w:style>
-  <w:style w:type="character" w:customStyle="1" w:styleId="SubtitleChar">
+  <w:style w:type="character" w:styleId="SubtitleChar" w:customStyle="1">
     <w:name w:val="Subtitle Char"/>
     <w:basedOn w:val="DefaultParagraphFont"/>
     <w:link w:val="Subtitle"/>
     <w:uiPriority w:val="11"/>
     <w:qFormat/>
-    <w:rsid w:val="00AC40A2"/>
+    <w:rsid w:val="00ac40a2"/>
     <w:rPr>
-      <w:rFonts w:eastAsiaTheme="majorEastAsia" w:cstheme="majorBidi"/>
-      <w:color w:val="595959" w:themeColor="text1" w:themeTint="A6"/>
+      <w:rFonts w:eastAsia="" w:cs="" w:cstheme="majorBidi" w:eastAsiaTheme="majorEastAsia"/>
+      <w:color w:themeColor="text1" w:themeTint="a6" w:val="595959"/>
       <w:spacing w:val="15"/>
       <w:kern w:val="0"/>
       <w:sz w:val="28"/>
@@ -3429,18 +3755,18 @@
       <w14:ligatures w14:val="none"/>
     </w:rPr>
   </w:style>
-  <w:style w:type="character" w:customStyle="1" w:styleId="QuoteChar">
+  <w:style w:type="character" w:styleId="QuoteChar" w:customStyle="1">
     <w:name w:val="Quote Char"/>
     <w:basedOn w:val="DefaultParagraphFont"/>
     <w:link w:val="Quote"/>
     <w:uiPriority w:val="29"/>
     <w:qFormat/>
-    <w:rsid w:val="00AC40A2"/>
+    <w:rsid w:val="00ac40a2"/>
     <w:rPr>
       <w:rFonts w:ascii="Times New Roman" w:hAnsi="Times New Roman" w:cs="Gulim"/>
       <w:i/>
       <w:iCs/>
-      <w:color w:val="404040" w:themeColor="text1" w:themeTint="BF"/>
+      <w:color w:themeColor="text1" w:themeTint="bf" w:val="404040"/>
       <w:kern w:val="0"/>
       <w:lang w:val="en-US" w:eastAsia="ko-KR"/>
       <w14:ligatures w14:val="none"/>
@@ -3451,25 +3777,25 @@
     <w:basedOn w:val="DefaultParagraphFont"/>
     <w:uiPriority w:val="21"/>
     <w:qFormat/>
-    <w:rsid w:val="00AC40A2"/>
+    <w:rsid w:val="00ac40a2"/>
     <w:rPr>
       <w:i/>
       <w:iCs/>
-      <w:color w:val="0F4761" w:themeColor="accent1" w:themeShade="BF"/>
+      <w:color w:themeColor="accent1" w:themeShade="bf" w:val="0F4761"/>
     </w:rPr>
   </w:style>
-  <w:style w:type="character" w:customStyle="1" w:styleId="IntenseQuoteChar">
+  <w:style w:type="character" w:styleId="IntenseQuoteChar" w:customStyle="1">
     <w:name w:val="Intense Quote Char"/>
     <w:basedOn w:val="DefaultParagraphFont"/>
     <w:link w:val="IntenseQuote"/>
     <w:uiPriority w:val="30"/>
     <w:qFormat/>
-    <w:rsid w:val="00AC40A2"/>
+    <w:rsid w:val="00ac40a2"/>
     <w:rPr>
       <w:rFonts w:ascii="Times New Roman" w:hAnsi="Times New Roman" w:cs="Gulim"/>
       <w:i/>
       <w:iCs/>
-      <w:color w:val="0F4761" w:themeColor="accent1" w:themeShade="BF"/>
+      <w:color w:themeColor="accent1" w:themeShade="bf" w:val="0F4761"/>
       <w:kern w:val="0"/>
       <w:lang w:val="en-US" w:eastAsia="ko-KR"/>
       <w14:ligatures w14:val="none"/>
@@ -3480,26 +3806,26 @@
     <w:basedOn w:val="DefaultParagraphFont"/>
     <w:uiPriority w:val="32"/>
     <w:qFormat/>
-    <w:rsid w:val="00AC40A2"/>
+    <w:rsid w:val="00ac40a2"/>
     <w:rPr>
       <w:b/>
       <w:bCs/>
       <w:smallCaps/>
-      <w:color w:val="0F4761" w:themeColor="accent1" w:themeShade="BF"/>
+      <w:color w:themeColor="accent1" w:themeShade="bf" w:val="0F4761"/>
       <w:spacing w:val="5"/>
     </w:rPr>
   </w:style>
-  <w:style w:type="paragraph" w:customStyle="1" w:styleId="Heading">
+  <w:style w:type="paragraph" w:styleId="Heading" w:customStyle="1">
     <w:name w:val="Heading"/>
     <w:basedOn w:val="Normal"/>
     <w:next w:val="BodyText"/>
     <w:qFormat/>
     <w:pPr>
-      <w:keepNext/>
+      <w:keepNext w:val="true"/>
       <w:spacing w:before="240" w:after="120"/>
     </w:pPr>
     <w:rPr>
-      <w:rFonts w:ascii="Liberation Sans" w:eastAsia="Noto Sans CJK SC" w:hAnsi="Liberation Sans" w:cs="Noto Sans Devanagari"/>
+      <w:rFonts w:ascii="Liberation Sans" w:hAnsi="Liberation Sans" w:eastAsia="Noto Sans CJK SC" w:cs="Noto Sans Devanagari"/>
       <w:sz w:val="28"/>
       <w:szCs w:val="28"/>
     </w:rPr>
@@ -3508,12 +3834,14 @@
     <w:name w:val="Body Text"/>
     <w:basedOn w:val="Normal"/>
     <w:pPr>
-      <w:spacing w:after="140" w:line="276" w:lineRule="auto"/>
+      <w:spacing w:lineRule="auto" w:line="276" w:before="0" w:after="140"/>
     </w:pPr>
+    <w:rPr/>
   </w:style>
   <w:style w:type="paragraph" w:styleId="List">
     <w:name w:val="List"/>
     <w:basedOn w:val="BodyText"/>
+    <w:pPr/>
     <w:rPr>
       <w:rFonts w:cs="Noto Sans Devanagari"/>
     </w:rPr>
@@ -3532,7 +3860,7 @@
       <w:iCs/>
     </w:rPr>
   </w:style>
-  <w:style w:type="paragraph" w:customStyle="1" w:styleId="Index">
+  <w:style w:type="paragraph" w:styleId="Index" w:customStyle="1">
     <w:name w:val="Index"/>
     <w:basedOn w:val="Normal"/>
     <w:qFormat/>
@@ -3549,16 +3877,17 @@
     <w:autoRedefine/>
     <w:uiPriority w:val="34"/>
     <w:qFormat/>
-    <w:rsid w:val="00A7237E"/>
+    <w:rsid w:val="00a7237e"/>
     <w:pPr>
       <w:numPr>
+        <w:ilvl w:val="0"/>
         <w:numId w:val="2"/>
       </w:numPr>
-      <w:spacing w:after="160" w:line="259" w:lineRule="auto"/>
-      <w:ind w:left="240"/>
+      <w:spacing w:lineRule="auto" w:line="259" w:before="0" w:after="160"/>
+      <w:ind w:start="240"/>
     </w:pPr>
     <w:rPr>
-      <w:rFonts w:eastAsiaTheme="minorEastAsia" w:cs="Times New Roman"/>
+      <w:rFonts w:eastAsia="" w:cs="Times New Roman" w:eastAsiaTheme="minorEastAsia"/>
       <w:iCs/>
       <w:sz w:val="26"/>
       <w:szCs w:val="26"/>
@@ -3571,13 +3900,13 @@
     <w:link w:val="TitleChar"/>
     <w:uiPriority w:val="10"/>
     <w:qFormat/>
-    <w:rsid w:val="00AC40A2"/>
+    <w:rsid w:val="00ac40a2"/>
     <w:pPr>
-      <w:spacing w:after="80"/>
+      <w:spacing w:before="0" w:after="80"/>
       <w:contextualSpacing/>
     </w:pPr>
     <w:rPr>
-      <w:rFonts w:asciiTheme="majorHAnsi" w:eastAsiaTheme="majorEastAsia" w:hAnsiTheme="majorHAnsi" w:cstheme="majorBidi"/>
+      <w:rFonts w:ascii="Aptos Display" w:hAnsi="Aptos Display" w:eastAsia="" w:cs="" w:asciiTheme="majorHAnsi" w:cstheme="majorBidi" w:eastAsiaTheme="majorEastAsia" w:hAnsiTheme="majorHAnsi"/>
       <w:spacing w:val="-10"/>
       <w:kern w:val="2"/>
       <w:sz w:val="56"/>
@@ -3591,13 +3920,13 @@
     <w:link w:val="SubtitleChar"/>
     <w:uiPriority w:val="11"/>
     <w:qFormat/>
-    <w:rsid w:val="00AC40A2"/>
+    <w:rsid w:val="00ac40a2"/>
     <w:pPr>
-      <w:spacing w:after="160"/>
+      <w:spacing w:before="0" w:after="160"/>
     </w:pPr>
     <w:rPr>
-      <w:rFonts w:asciiTheme="minorHAnsi" w:eastAsiaTheme="majorEastAsia" w:hAnsiTheme="minorHAnsi" w:cstheme="majorBidi"/>
-      <w:color w:val="595959" w:themeColor="text1" w:themeTint="A6"/>
+      <w:rFonts w:ascii="Aptos" w:hAnsi="Aptos" w:eastAsia="" w:cs="" w:asciiTheme="minorHAnsi" w:cstheme="majorBidi" w:eastAsiaTheme="majorEastAsia" w:hAnsiTheme="minorHAnsi"/>
+      <w:color w:themeColor="text1" w:themeTint="a6" w:val="595959"/>
       <w:spacing w:val="15"/>
       <w:sz w:val="28"/>
       <w:szCs w:val="28"/>
@@ -3610,7 +3939,7 @@
     <w:link w:val="QuoteChar"/>
     <w:uiPriority w:val="29"/>
     <w:qFormat/>
-    <w:rsid w:val="00AC40A2"/>
+    <w:rsid w:val="00ac40a2"/>
     <w:pPr>
       <w:spacing w:before="160" w:after="160"/>
       <w:jc w:val="center"/>
@@ -3618,7 +3947,7 @@
     <w:rPr>
       <w:i/>
       <w:iCs/>
-      <w:color w:val="404040" w:themeColor="text1" w:themeTint="BF"/>
+      <w:color w:themeColor="text1" w:themeTint="bf" w:val="404040"/>
     </w:rPr>
   </w:style>
   <w:style w:type="paragraph" w:styleId="IntenseQuote">
@@ -3628,27 +3957,48 @@
     <w:link w:val="IntenseQuoteChar"/>
     <w:uiPriority w:val="30"/>
     <w:qFormat/>
-    <w:rsid w:val="00AC40A2"/>
+    <w:rsid w:val="00ac40a2"/>
     <w:pPr>
       <w:pBdr>
-        <w:top w:val="single" w:sz="4" w:space="10" w:color="0F4761" w:themeColor="accent1" w:themeShade="BF"/>
-        <w:bottom w:val="single" w:sz="4" w:space="10" w:color="0F4761" w:themeColor="accent1" w:themeShade="BF"/>
+        <w:top w:val="single" w:sz="4" w:space="10" w:color="0F4761" w:themeColor="accent1" w:themeShade="bf"/>
+        <w:bottom w:val="single" w:sz="4" w:space="10" w:color="0F4761" w:themeColor="accent1" w:themeShade="bf"/>
       </w:pBdr>
       <w:spacing w:before="360" w:after="360"/>
-      <w:ind w:left="864" w:right="864"/>
+      <w:ind w:start="864" w:end="864"/>
       <w:jc w:val="center"/>
     </w:pPr>
     <w:rPr>
       <w:i/>
       <w:iCs/>
-      <w:color w:val="0F4761" w:themeColor="accent1" w:themeShade="BF"/>
+      <w:color w:themeColor="accent1" w:themeShade="bf" w:val="0F4761"/>
     </w:rPr>
+  </w:style>
+  <w:style w:type="numbering" w:styleId="NoList" w:default="1">
+    <w:name w:val="No List"/>
+    <w:uiPriority w:val="99"/>
+    <w:semiHidden/>
+    <w:unhideWhenUsed/>
+    <w:qFormat/>
+  </w:style>
+  <w:style w:type="table" w:default="1" w:styleId="TableNormal">
+    <w:name w:val="Normal Table"/>
+    <w:uiPriority w:val="99"/>
+    <w:semiHidden/>
+    <w:unhideWhenUsed/>
+    <w:tblPr>
+      <w:tblCellMar>
+        <w:top w:w="0" w:type="dxa"/>
+        <w:left w:w="108" w:type="dxa"/>
+        <w:bottom w:w="0" w:type="dxa"/>
+        <w:right w:w="108" w:type="dxa"/>
+      </w:tblCellMar>
+    </w:tblPr>
   </w:style>
 </w:styles>
 </file>
 
 <file path=word/theme/theme1.xml><?xml version="1.0" encoding="utf-8"?>
-<a:theme xmlns:a="http://schemas.openxmlformats.org/drawingml/2006/main" name="Office Theme">
+<a:theme xmlns:a="http://schemas.openxmlformats.org/drawingml/2006/main" xmlns:r="http://schemas.openxmlformats.org/officeDocument/2006/relationships" name="Office Theme">
   <a:themeElements>
     <a:clrScheme name="Office">
       <a:dk1>
@@ -3690,12 +4040,12 @@
     </a:clrScheme>
     <a:fontScheme name="Office">
       <a:majorFont>
-        <a:latin typeface="Aptos Display" panose="02110004020202020204"/>
+        <a:latin typeface="Aptos Display" panose="02110004020202020204" pitchFamily="0" charset="1"/>
         <a:ea typeface=""/>
         <a:cs typeface=""/>
       </a:majorFont>
       <a:minorFont>
-        <a:latin typeface="Aptos" panose="02110004020202020204"/>
+        <a:latin typeface="Aptos" panose="02110004020202020204" pitchFamily="0" charset="1"/>
         <a:ea typeface=""/>
         <a:cs typeface=""/>
       </a:minorFont>
@@ -3727,7 +4077,7 @@
             </a:gs>
           </a:gsLst>
           <a:lin ang="5400000" scaled="0"/>
-          <a:tileRect/>
+          <a:tileRect l="0" t="0" r="0" b="0"/>
         </a:gradFill>
         <a:gradFill>
           <a:gsLst>
@@ -3751,7 +4101,7 @@
             </a:gs>
           </a:gsLst>
           <a:lin ang="5400000" scaled="0"/>
-          <a:tileRect/>
+          <a:tileRect l="0" t="0" r="0" b="0"/>
         </a:gradFill>
       </a:fillStyleLst>
       <a:lnStyleLst>
@@ -3811,12 +4161,10 @@
             </a:gs>
           </a:gsLst>
           <a:lin ang="5400000" scaled="0"/>
-          <a:tileRect/>
+          <a:tileRect l="0" t="0" r="0" b="0"/>
         </a:gradFill>
       </a:bgFillStyleLst>
     </a:fmtScheme>
   </a:themeElements>
-  <a:objectDefaults/>
-  <a:extraClrSchemeLst/>
 </a:theme>
 </file>
</xml_diff>

<commit_message>
Finish app deployment flow
</commit_message>
<xml_diff>
--- a/specification_breakdown.docx
+++ b/specification_breakdown.docx
@@ -616,7 +616,7 @@
           <w:ilvl w:val="0"/>
           <w:numId w:val="3"/>
         </w:numPr>
-        <w:spacing w:beforeAutospacing="1" w:afterAutospacing="1"/>
+        <w:spacing w:beforeAutospacing="1" w:after="0"/>
         <w:rPr>
           <w:rFonts w:eastAsia="Times New Roman"/>
         </w:rPr>
@@ -635,7 +635,7 @@
           <w:ilvl w:val="0"/>
           <w:numId w:val="3"/>
         </w:numPr>
-        <w:spacing w:beforeAutospacing="1" w:afterAutospacing="1"/>
+        <w:spacing w:before="0" w:afterAutospacing="1"/>
         <w:rPr>
           <w:rFonts w:eastAsia="Times New Roman"/>
         </w:rPr>
@@ -656,7 +656,9 @@
         </w:rPr>
       </w:pPr>
       <w:r>
-        <w:rPr/>
+        <w:rPr>
+          <w:rFonts w:eastAsia="Times New Roman"/>
+        </w:rPr>
       </w:r>
     </w:p>
     <w:p>
@@ -1050,7 +1052,9 @@
         </w:rPr>
       </w:pPr>
       <w:r>
-        <w:rPr/>
+        <w:rPr>
+          <w:rFonts w:eastAsia="Times New Roman"/>
+        </w:rPr>
       </w:r>
     </w:p>
     <w:p>
@@ -1646,13 +1650,7 @@
           <w:rFonts w:eastAsia="Times New Roman"/>
         </w:rPr>
         <w:tab/>
-        <w:t>- get getAccountsByRole(</w:t>
-      </w:r>
-      <w:r>
-        <w:rPr>
-          <w:rFonts w:eastAsia="Times New Roman"/>
-        </w:rPr>
-        <w:t>role) /api/admin/users</w:t>
+        <w:t>- get getAccountsByRole(role) /api/admin/users</w:t>
       </w:r>
     </w:p>
     <w:p>
@@ -1684,19 +1682,7 @@
           <w:rFonts w:eastAsia="Times New Roman"/>
         </w:rPr>
         <w:tab/>
-        <w:t xml:space="preserve">- </w:t>
-      </w:r>
-      <w:r>
-        <w:rPr>
-          <w:rFonts w:eastAsia="Times New Roman"/>
-        </w:rPr>
-        <w:t>put change</w:t>
-      </w:r>
-      <w:r>
-        <w:rPr>
-          <w:rFonts w:eastAsia="Times New Roman"/>
-        </w:rPr>
-        <w:t>Department(department) /api/admin/users/{userID}/department</w:t>
+        <w:t>- put changeDepartment(department) /api/admin/users/{userID}/department</w:t>
       </w:r>
     </w:p>
     <w:p>
@@ -1988,27 +1974,46 @@
           <w:ilvl w:val="0"/>
           <w:numId w:val="3"/>
         </w:numPr>
+        <w:spacing w:before="0" w:after="0"/>
+        <w:rPr>
+          <w:rFonts w:eastAsia="Times New Roman"/>
+        </w:rPr>
+      </w:pPr>
+      <w:r>
+        <w:rPr>
+          <w:rFonts w:eastAsia="Times New Roman"/>
+        </w:rPr>
+        <w:t>add dedicated userID for attachment later</w:t>
+      </w:r>
+    </w:p>
+    <w:p>
+      <w:pPr>
+        <w:pStyle w:val="ListParagraph"/>
+        <w:numPr>
+          <w:ilvl w:val="0"/>
+          <w:numId w:val="3"/>
+        </w:numPr>
+        <w:spacing w:before="0" w:after="0"/>
+        <w:rPr>
+          <w:rFonts w:eastAsia="Times New Roman"/>
+        </w:rPr>
+      </w:pPr>
+      <w:r>
+        <w:rPr>
+          <w:rFonts w:eastAsia="Times New Roman"/>
+        </w:rPr>
+        <w:t>Ticket không thể resolve bằng admin khi chưa có assignee</w:t>
+      </w:r>
+    </w:p>
+    <w:p>
+      <w:pPr>
+        <w:pStyle w:val="Normal"/>
+        <w:numPr>
+          <w:ilvl w:val="0"/>
+          <w:numId w:val="3"/>
+        </w:numPr>
+        <w:bidi w:val="0"/>
         <w:spacing w:before="0" w:afterAutospacing="1"/>
-        <w:rPr>
-          <w:rFonts w:eastAsia="Times New Roman"/>
-        </w:rPr>
-      </w:pPr>
-      <w:r>
-        <w:rPr>
-          <w:rFonts w:eastAsia="Times New Roman"/>
-        </w:rPr>
-        <w:t>add dedicated userID for attachment later</w:t>
-      </w:r>
-    </w:p>
-    <w:p>
-      <w:pPr>
-        <w:pStyle w:val="Normal"/>
-        <w:numPr>
-          <w:ilvl w:val="0"/>
-          <w:numId w:val="3"/>
-        </w:numPr>
-        <w:bidi w:val="0"/>
-        <w:spacing w:beforeAutospacing="1" w:afterAutospacing="1"/>
         <w:rPr>
           <w:rFonts w:eastAsia="Times New Roman"/>
         </w:rPr>
@@ -3349,7 +3354,7 @@
       <w:jc w:val="start"/>
     </w:pPr>
     <w:rPr>
-      <w:rFonts w:ascii="Times New Roman" w:hAnsi="Times New Roman" w:cs="Gulim" w:eastAsia="Gulim"/>
+      <w:rFonts w:ascii="Times New Roman" w:hAnsi="Times New Roman" w:eastAsia="Gulim" w:cs="Gulim"/>
       <w:color w:val="auto"/>
       <w:kern w:val="0"/>
       <w:sz w:val="24"/>
@@ -3883,6 +3888,7 @@
         <w:ilvl w:val="0"/>
         <w:numId w:val="2"/>
       </w:numPr>
+      <w:bidi w:val="0"/>
       <w:spacing w:lineRule="auto" w:line="259" w:before="0" w:after="160"/>
       <w:ind w:start="240"/>
     </w:pPr>

</xml_diff>

<commit_message>
Add statistic, setting and change password form
</commit_message>
<xml_diff>
--- a/specification_breakdown.docx
+++ b/specification_breakdown.docx
@@ -1714,13 +1714,7 @@
         <w:rPr>
           <w:rFonts w:eastAsia="Times New Roman"/>
         </w:rPr>
-        <w:t xml:space="preserve">- </w:t>
-      </w:r>
-      <w:r>
-        <w:rPr>
-          <w:rFonts w:eastAsia="Times New Roman"/>
-        </w:rPr>
-        <w:t>Nhóm cho bộ phận</w:t>
+        <w:t>- Nhóm cho bộ phận</w:t>
       </w:r>
     </w:p>
     <w:p>
@@ -2396,6 +2390,68 @@
           <w:rFonts w:eastAsia="Times New Roman"/>
         </w:rPr>
         <w:t>Chuyển sang sử dụng PGSimpleDataSource, mở đơn data source, sử dụng chỉ với mục đích demo</w:t>
+      </w:r>
+    </w:p>
+    <w:p>
+      <w:pPr>
+        <w:pStyle w:val="Normal"/>
+        <w:bidi w:val="0"/>
+        <w:spacing w:beforeAutospacing="1" w:afterAutospacing="1"/>
+        <w:rPr>
+          <w:rFonts w:eastAsia="Times New Roman"/>
+        </w:rPr>
+      </w:pPr>
+      <w:r>
+        <w:rPr>
+          <w:rFonts w:eastAsia="Times New Roman"/>
+        </w:rPr>
+        <w:t>Rechart cung cấp dịch vụ tạo ra các bảng thống kê trực quan dữ liệu</w:t>
+      </w:r>
+    </w:p>
+    <w:p>
+      <w:pPr>
+        <w:pStyle w:val="Normal"/>
+        <w:bidi w:val="0"/>
+        <w:spacing w:beforeAutospacing="1" w:afterAutospacing="1"/>
+        <w:rPr>
+          <w:rFonts w:eastAsia="Times New Roman"/>
+        </w:rPr>
+      </w:pPr>
+      <w:r>
+        <w:rPr>
+          <w:rFonts w:eastAsia="Times New Roman"/>
+        </w:rPr>
+        <w:t>Rechart được sử dụng vì thư viện nằm trong danh sách các thư viện phổ biến nhất cho chức năng tạo bảng cho React js</w:t>
+      </w:r>
+    </w:p>
+    <w:p>
+      <w:pPr>
+        <w:pStyle w:val="Normal"/>
+        <w:bidi w:val="0"/>
+        <w:spacing w:beforeAutospacing="1" w:afterAutospacing="1"/>
+        <w:rPr>
+          <w:rFonts w:eastAsia="Times New Roman"/>
+        </w:rPr>
+      </w:pPr>
+      <w:r>
+        <w:rPr>
+          <w:rFonts w:eastAsia="Times New Roman"/>
+        </w:rPr>
+        <w:t>Rechart sử dụng D3 và SVG nên có thể không tương thích với di động</w:t>
+      </w:r>
+    </w:p>
+    <w:p>
+      <w:pPr>
+        <w:pStyle w:val="Normal"/>
+        <w:spacing w:beforeAutospacing="1" w:afterAutospacing="1"/>
+        <w:rPr>
+          <w:rFonts w:eastAsia="Times New Roman"/>
+        </w:rPr>
+      </w:pPr>
+      <w:r>
+        <w:rPr>
+          <w:rFonts w:eastAsia="Times New Roman"/>
+        </w:rPr>
       </w:r>
     </w:p>
     <w:p>

</xml_diff>